<commit_message>
Elv: ms permanovas concluidas
</commit_message>
<xml_diff>
--- a/docs/ms_rebio23-part.docx
+++ b/docs/ms_rebio23-part.docx
@@ -83,7 +83,7 @@
         <w:pStyle w:val="Date"/>
       </w:pPr>
       <w:r>
-        <w:t xml:space="preserve">2026-10-04</w:t>
+        <w:t xml:space="preserve">2026-10-06</w:t>
       </w:r>
     </w:p>
     <w:p>
@@ -634,16 +634,7 @@
         <w:t xml:space="preserve">(Lê et al. 2008)</w:t>
       </w:r>
       <w:r>
-        <w:t xml:space="preserve">, with all variables centered and standardized to unit variance before analysis. The water quality parameters temperature and dissolved oxygen, and all nutrients were used to characterize differences between streams but were not used in the PCA because they were not measured for both seasons. A Permutational Multivariate Analysis of Variance (PERMANOVA, 999 permutations) was performed to test whether the overall set of environmental variables measured differed across the seasons and streams</w:t>
-      </w:r>
-      <w:r>
-        <w:t xml:space="preserve"> </w:t>
-      </w:r>
-      <w:r>
-        <w:t xml:space="preserve">(Anderson and Walsh 2013, Freiry et al. 2020)</w:t>
-      </w:r>
-      <w:r>
-        <w:t xml:space="preserve">.</w:t>
+        <w:t xml:space="preserve">, with all variables centered and standardized to unit variance before analysis. The water quality parameters temperature and dissolved oxygen, and all nutrients were used to characterize differences between streams but were not used in the PCA because they were not measured for both seasons.A Permutational Multivariate Analysis of Variance (PERMANOVA, 999 permutations) was performed to test whether the overall set of environmental variables measured differed across the seasons and streams .</w:t>
       </w:r>
     </w:p>
     <w:p>
@@ -651,7 +642,7 @@
         <w:pStyle w:val="TextBody"/>
       </w:pPr>
       <w:r>
-        <w:t xml:space="preserve">To compare the diversity of zooplanktonic taxa between streams, the Chao1 estimated richness (± SE) and the curves of rarefied and extrapolated richness were generated (95% upper and lower confidence intervals) using individual-based rarefaction curves</w:t>
+        <w:t xml:space="preserve">To compare the diversity of zooplankton taxa between streams, the Chao1 estimated richness (± SE) and the curves of rarefied and extrapolated richness were generated (95% upper and lower confidence intervals) using individual-based rarefaction curves</w:t>
       </w:r>
       <w:r>
         <w:t xml:space="preserve"> </w:t>
@@ -660,7 +651,60 @@
         <w:t xml:space="preserve">(Gotelli and Colwell 2001, Freiry et al. 2020)</w:t>
       </w:r>
       <w:r>
-        <w:t xml:space="preserve">.</w:t>
+        <w:t xml:space="preserve">. Community composition and environmental variables were compared among hydrological periods and streams using Permutational Multivariate Analysis of Variance (PERMANOVA), based on a Bray–Curtis dissimilarity matrix</w:t>
+      </w:r>
+      <w:r>
+        <w:t xml:space="preserve"> </w:t>
+      </w:r>
+      <w:r>
+        <w:t xml:space="preserve">(Anderson and Walsh 2013, Freiry et al. 2020)</w:t>
+      </w:r>
+      <w:r>
+        <w:t xml:space="preserve">. The model included the fixed factors Season, Stream and their interaction. The significance of the terms was assessed using 999 random permutations and the</w:t>
+      </w:r>
+      <w:r>
+        <w:t xml:space="preserve"> </w:t>
+      </w:r>
+      <w:r>
+        <w:rPr>
+          <w:i/>
+          <w:iCs/>
+        </w:rPr>
+        <w:t xml:space="preserve">pseudo</w:t>
+      </w:r>
+      <w:r>
+        <w:t xml:space="preserve">-F statistic (Anderson, 2001). Homogeneity of multivariate dispersion among groups was assessed based on the distance of each sampling unit from the centroid of its respective group in multivariate space, using the</w:t>
+      </w:r>
+      <w:r>
+        <w:t xml:space="preserve"> </w:t>
+      </w:r>
+      <w:r>
+        <w:rPr>
+          <w:i/>
+          <w:iCs/>
+        </w:rPr>
+        <w:t xml:space="preserve">betadisper</w:t>
+      </w:r>
+      <w:r>
+        <w:t xml:space="preserve"> </w:t>
+      </w:r>
+      <w:r>
+        <w:t xml:space="preserve">function from the</w:t>
+      </w:r>
+      <w:r>
+        <w:t xml:space="preserve"> </w:t>
+      </w:r>
+      <w:r>
+        <w:rPr>
+          <w:rStyle w:val="VerbatimChar"/>
+        </w:rPr>
+        <w:t xml:space="preserve">vegan</w:t>
+      </w:r>
+      <w:r>
+        <w:t xml:space="preserve"> </w:t>
+      </w:r>
+      <w:r>
+        <w:t xml:space="preserve">package (Anderson et al., 2006).</w:t>
       </w:r>
     </w:p>
     <w:p>
@@ -695,7 +739,16 @@
         <w:t xml:space="preserve">(Rocha et al. 2012)</w:t>
       </w:r>
       <w:r>
-        <w:t xml:space="preserve">. To focus on spatial variation across sampling sites, habitat density data were pooled for this analysis. To assess how well the UPGMA dendrograms represented the original Bray-Curtis dissimilarities among sampling sites, the Cophenetic Correlation Coefficient (CC) was calculated</w:t>
+        <w:t xml:space="preserve">. To focus on spatial variation across sampling sites, habitat density data were pooled for this analysis.</w:t>
+      </w:r>
+      <w:r>
+        <w:t xml:space="preserve"> </w:t>
+      </w:r>
+      <w:r>
+        <w:t xml:space="preserve"> </w:t>
+      </w:r>
+      <w:r>
+        <w:t xml:space="preserve">To assess how well the UPGMA dendrograms represented the original Bray-Curtis dissimilarities among sampling sites, the Cophenetic Correlation Coefficient (CC) was calculated</w:t>
       </w:r>
       <w:r>
         <w:t xml:space="preserve"> </w:t>
@@ -747,31 +800,16 @@
         <w:t xml:space="preserve"> </w:t>
       </w:r>
       <w:r>
-        <w:t xml:space="preserve">. The cophenetic distance matrix was then correlated with the corresponding original Bray-Curtis dissimilarity matrix using Pearson’s product-moment correlation coefficient [</w:t>
-      </w:r>
-      <w:r>
-        <w:t xml:space="preserve">Farris (1969)</w:t>
-      </w:r>
-      <w:r>
-        <w:t xml:space="preserve">;</w:t>
+        <w:t xml:space="preserve">. The cophenetic distance matrix was then correlated with the corresponding original Bray-Curtis dissimilarity matrix using Pearson’s product-moment correlation coefficient</w:t>
       </w:r>
       <w:r>
         <w:t xml:space="preserve"> </w:t>
       </w:r>
       <w:r>
-        <w:t xml:space="preserve">Silva and Dias (2013)</w:t>
-      </w:r>
-      <w:r>
-        <w:t xml:space="preserve">;</w:t>
-      </w:r>
-      <w:r>
-        <w:t xml:space="preserve"> </w:t>
-      </w:r>
-      <w:r>
-        <w:t xml:space="preserve">Sokal and Rohlf (1962)</w:t>
-      </w:r>
-      <w:r>
-        <w:t xml:space="preserve">]. To evaluate the strength of the hierarchical clustering structure obtained from the UPGMA dendrograms, the Agglomerative Coefficient (AC) was calculated for each season using the</w:t>
+        <w:t xml:space="preserve">(Sokal and Rohlf 1962, Farris 1969, Silva and Dias 2013)</w:t>
+      </w:r>
+      <w:r>
+        <w:t xml:space="preserve">. To evaluate the strength of the hierarchical clustering structure obtained from the UPGMA dendrograms, the Agglomerative Coefficient (AC) was calculated for each season using the</w:t>
       </w:r>
       <w:r>
         <w:t xml:space="preserve"> </w:t>
@@ -1297,6 +1335,13 @@
         <w:t xml:space="preserve">). The first two principal components explained 38.6% of the total variance, with the first axis accounting for 23.2%. In relation to the environmental variables of water quality, the Barro Branco stream was more associated with higher elevations, the predominance of muddy substrate and a narrower array of underwater structures, mostly algae, macrophytes, leaf litter and woody debris. The Caiana stream showed a wider range of variables affecting it’s waters, being associated with higher pH, turbidity and depths, as well as a predominance of sandy substrates and, to a lesser degree, root masses. Water velocity was also important for this stream. PERMANOVA showed significant differences in the environmental variables between the two study streams (</w:t>
       </w:r>
       <m:oMath>
+        <m:r>
+          <m:rPr>
+            <m:nor/>
+            <m:sty m:val="i"/>
+          </m:rPr>
+          <m:t>pseudo</m:t>
+        </m:r>
         <m:sSub>
           <m:e>
             <m:r>
@@ -1304,7 +1349,7 @@
                 <m:nor/>
                 <m:sty m:val="p"/>
               </m:rPr>
-              <m:t>F</m:t>
+              <m:t>-F</m:t>
             </m:r>
           </m:e>
           <m:sub>
@@ -1318,7 +1363,7 @@
               <m:t>,</m:t>
             </m:r>
             <m:r>
-              <m:t>88</m:t>
+              <m:t>86</m:t>
             </m:r>
           </m:sub>
         </m:sSub>
@@ -1329,7 +1374,7 @@
           <m:t>=</m:t>
         </m:r>
         <m:r>
-          <m:t>7.8</m:t>
+          <m:t>8.3</m:t>
         </m:r>
         <m:r>
           <m:rPr>
@@ -1356,7 +1401,7 @@
           <m:t>=</m:t>
         </m:r>
         <m:r>
-          <m:t>0.08</m:t>
+          <m:t>0.082</m:t>
         </m:r>
         <m:r>
           <m:rPr>
@@ -1378,9 +1423,16 @@
         </m:r>
       </m:oMath>
       <w:r>
-        <w:t xml:space="preserve">). Dry and wet seasons did not show clear segregation in the PCA, even though PERMANOVA indicated significance of differences between seasons (</w:t>
+        <w:t xml:space="preserve">). Even though dry and wet seasons did not show clear segregation in the PCA plot, PERMANOVA indicated significance of differences (</w:t>
       </w:r>
       <m:oMath>
+        <m:r>
+          <m:rPr>
+            <m:nor/>
+            <m:sty m:val="i"/>
+          </m:rPr>
+          <m:t>pseudo</m:t>
+        </m:r>
         <m:sSub>
           <m:e>
             <m:r>
@@ -1388,7 +1440,7 @@
                 <m:nor/>
                 <m:sty m:val="p"/>
               </m:rPr>
-              <m:t>F</m:t>
+              <m:t>-F</m:t>
             </m:r>
           </m:e>
           <m:sub>
@@ -1402,7 +1454,7 @@
               <m:t>,</m:t>
             </m:r>
             <m:r>
-              <m:t>88</m:t>
+              <m:t>86</m:t>
             </m:r>
           </m:sub>
         </m:sSub>
@@ -1413,7 +1465,7 @@
           <m:t>=</m:t>
         </m:r>
         <m:r>
-          <m:t>3.8</m:t>
+          <m:t>4.2</m:t>
         </m:r>
         <m:r>
           <m:rPr>
@@ -1440,7 +1492,7 @@
           <m:t>=</m:t>
         </m:r>
         <m:r>
-          <m:t>0.04</m:t>
+          <m:t>0.042</m:t>
         </m:r>
         <m:r>
           <m:rPr>
@@ -1458,11 +1510,102 @@
           <m:t>=</m:t>
         </m:r>
         <m:r>
-          <m:t>0.008</m:t>
+          <m:t>0.006</m:t>
         </m:r>
       </m:oMath>
       <w:r>
-        <w:t xml:space="preserve">).</w:t>
+        <w:t xml:space="preserve">). A significant Season × Stream interaction was also detected (</w:t>
+      </w:r>
+      <m:oMath>
+        <m:r>
+          <m:rPr>
+            <m:nor/>
+            <m:sty m:val="i"/>
+          </m:rPr>
+          <m:t>pseudo</m:t>
+        </m:r>
+        <m:sSub>
+          <m:e>
+            <m:r>
+              <m:rPr>
+                <m:nor/>
+                <m:sty m:val="p"/>
+              </m:rPr>
+              <m:t>-F</m:t>
+            </m:r>
+          </m:e>
+          <m:sub>
+            <m:r>
+              <m:t>1</m:t>
+            </m:r>
+            <m:r>
+              <m:rPr>
+                <m:sty m:val="p"/>
+              </m:rPr>
+              <m:t>,</m:t>
+            </m:r>
+            <m:r>
+              <m:t>86</m:t>
+            </m:r>
+          </m:sub>
+        </m:sSub>
+        <m:r>
+          <m:rPr>
+            <m:sty m:val="p"/>
+          </m:rPr>
+          <m:t>=</m:t>
+        </m:r>
+        <m:r>
+          <m:t>2.8</m:t>
+        </m:r>
+        <m:r>
+          <m:rPr>
+            <m:sty m:val="p"/>
+          </m:rPr>
+          <m:t>,</m:t>
+        </m:r>
+        <m:sSup>
+          <m:e>
+            <m:r>
+              <m:t>R</m:t>
+            </m:r>
+          </m:e>
+          <m:sup>
+            <m:r>
+              <m:t>2</m:t>
+            </m:r>
+          </m:sup>
+        </m:sSup>
+        <m:r>
+          <m:rPr>
+            <m:sty m:val="p"/>
+          </m:rPr>
+          <m:t>=</m:t>
+        </m:r>
+        <m:r>
+          <m:t>0.028</m:t>
+        </m:r>
+        <m:r>
+          <m:rPr>
+            <m:sty m:val="p"/>
+          </m:rPr>
+          <m:t>,</m:t>
+        </m:r>
+        <m:r>
+          <m:t>p</m:t>
+        </m:r>
+        <m:r>
+          <m:rPr>
+            <m:sty m:val="p"/>
+          </m:rPr>
+          <m:t>=</m:t>
+        </m:r>
+        <m:r>
+          <m:t>0.032</m:t>
+        </m:r>
+      </m:oMath>
+      <w:r>
+        <w:t xml:space="preserve">), indicating that the effect of hydrological period on the environmental variables differed between Barro Branco and Caiana. The complete model explained 15.1% of the variation, whereas 84.9% remained unexplained by the factors included in the model.</w:t>
       </w:r>
     </w:p>
     <w:p>
@@ -1481,7 +1624,7 @@
         </w:r>
       </w:hyperlink>
       <w:r>
-        <w:t xml:space="preserve">), ammonia ranged from 49.2 to 243.7 µg L⁻¹. The Caiana stream tended to have greater values, but overall no clear trend can be observed when comparing both streams. Nitrite and nitrate, on the other hand, show clearly a greater concentrations at the Caiana stream, nitrate varying from 166.4 to 2003.0 µg L⁻¹, compared with the maximum of 18.8 µg L⁻¹ at the Barro Branco stream. Nitrite was too low to be detectable at the Barro Branco stream. The same pattern was observed for orthophosphate concentrations, being barely detectable at Barro Branco stream, and varying from 4.0 to 32.0 µg L⁻¹ at the Caiana stream. Total phosphorus, however, tended to have higher concentrations at Barro Branco stream, reaching 50.1 µg L⁻¹ at Site 3, but with highly variable values (from non detectable to 38.7 µg L⁻¹, as the second highest value).</w:t>
+        <w:t xml:space="preserve">), ammonia ranged from 49.2 to 243.7 µg/L. The Caiana stream tended to have greater values, but overall no clear trend can be observed when comparing both streams. Nitrite and nitrate, on the other hand, show clearly a greater concentrations at the Caiana stream, nitrate varying from 166.4 to 2003.0 µg/L, compared with the maximum of 18.8 µg/L at the Barro Branco stream. Nitrite was too low to be detectable at the Barro Branco stream. The same pattern was observed for orthophosphate concentrations, being barely detectable at Barro Branco stream, and varying from 4.0 to 32.0 µg/L at the Caiana stream. Total phosphorus, however, tended to have higher concentrations at Barro Branco stream, reaching 50.1 µg/L at Site 3, but with highly variable values (from non detectable to 38.7 µg/L, as the second highest value).</w:t>
       </w:r>
     </w:p>
     <w:bookmarkEnd w:id="19"/>
@@ -1593,7 +1736,7 @@
         </w:r>
       </w:hyperlink>
       <w:r>
-        <w:t xml:space="preserve">). Nevertheless, the Chao index estimated an extrapolated richness of 58 (±8.9) species for the Barro Branco stream, compared with 54.2 (± 4.3) species for the Caiana stream.</w:t>
+        <w:t xml:space="preserve">). Nevertheless, given a similar sample size, th Barro Branco stream would have a greater diversity, as shown by the Chao index that estimated an extrapolated richness of 58 (±8.9) species for the Barro Branco stream, compared with 54.2 (± 4.3) species for the Caiana stream.</w:t>
       </w:r>
     </w:p>
     <w:p>
@@ -1601,15 +1744,100 @@
         <w:pStyle w:val="TextBody"/>
       </w:pPr>
       <w:r>
-        <w:t xml:space="preserve">The NMDS ordination diagrams showed that the composition of zooplankton resting stages differed among most of the ponds from the forest (Fig. 4A) and grassland biomes (Fig. 4B). In addition, the PERMANOVA indicated a significant difference in the composition of zooplanktonic taxa between biomes (pseudo-F1, 53 = 1.85, R2 = 0.035; P = 0.03). The outputs of the db-RDAs showed that the water chemistry subset significantly influenced the dissimilarity in the resting stage composition (F = 1.25; R2 = 0.134; P = 0.02), while the subset of habitat structure did not (F = 0.88; R2  0.01; P = 0.88, Fig. 5).</w:t>
-      </w:r>
-    </w:p>
-    <w:p>
-      <w:pPr>
-        <w:pStyle w:val="TextBody"/>
-      </w:pPr>
-      <w:r>
-        <w:t xml:space="preserve">The UPGMA cluster analyses revealed low-to-moderate spatial clustering strength for the zooplankton communities across both periods, as indicated by the Agglomerative Coefficients (</w:t>
+        <w:t xml:space="preserve">Regarding the community composition as shown by the UPGMA (</w:t>
+      </w:r>
+      <w:hyperlink w:anchor="fig-upgma">
+        <w:r>
+          <w:rPr>
+            <w:rStyle w:val="Hyperlink"/>
+          </w:rPr>
+          <w:t xml:space="preserve">Figure 5</w:t>
+        </w:r>
+      </w:hyperlink>
+      <w:r>
+        <w:t xml:space="preserve">), sites did not aggregate to represent the different streams or their hierarchy across seasons.</w:t>
+      </w:r>
+      <w:r>
+        <w:t xml:space="preserve"> </w:t>
+      </w:r>
+      <w:r>
+        <w:t xml:space="preserve">Even though the Cophenetic coefficients showed that the UPGMA dendrograms were a good represenation of the original Bray-Curtis dissimilarities among sampling sites (</w:t>
+      </w:r>
+      <m:oMath>
+        <m:r>
+          <m:t>C</m:t>
+        </m:r>
+        <m:sSub>
+          <m:e>
+            <m:r>
+              <m:t>C</m:t>
+            </m:r>
+          </m:e>
+          <m:sub>
+            <m:r>
+              <m:t>d</m:t>
+            </m:r>
+            <m:r>
+              <m:t>r</m:t>
+            </m:r>
+            <m:r>
+              <m:t>y</m:t>
+            </m:r>
+          </m:sub>
+        </m:sSub>
+        <m:r>
+          <m:rPr>
+            <m:sty m:val="p"/>
+          </m:rPr>
+          <m:t>=</m:t>
+        </m:r>
+        <m:r>
+          <m:t>0.84</m:t>
+        </m:r>
+      </m:oMath>
+      <w:r>
+        <w:t xml:space="preserve"> </w:t>
+      </w:r>
+      <w:r>
+        <w:t xml:space="preserve">and</w:t>
+      </w:r>
+      <w:r>
+        <w:t xml:space="preserve"> </w:t>
+      </w:r>
+      <m:oMath>
+        <m:r>
+          <m:t>C</m:t>
+        </m:r>
+        <m:sSub>
+          <m:e>
+            <m:r>
+              <m:t>C</m:t>
+            </m:r>
+          </m:e>
+          <m:sub>
+            <m:r>
+              <m:t>w</m:t>
+            </m:r>
+            <m:r>
+              <m:t>e</m:t>
+            </m:r>
+            <m:r>
+              <m:t>t</m:t>
+            </m:r>
+          </m:sub>
+        </m:sSub>
+        <m:r>
+          <m:rPr>
+            <m:sty m:val="p"/>
+          </m:rPr>
+          <m:t>=</m:t>
+        </m:r>
+        <m:r>
+          <m:t>0.87</m:t>
+        </m:r>
+      </m:oMath>
+      <w:r>
+        <w:t xml:space="preserve">), the UPGMA cluster analyses revealed low-to-moderate spatial clustering strength for the zooplankton communities across both periods, as indicated by the Agglomerative coefficients (</w:t>
       </w:r>
       <m:oMath>
         <m:r>
@@ -1685,7 +1913,259 @@
         </m:r>
       </m:oMath>
       <w:r>
-        <w:t xml:space="preserve">). While community composition exhibited continuous variation across sites, spatial structuring was slightly more pronounced during the wet season than during the dry season.</w:t>
+        <w:t xml:space="preserve">). The PERMANOVA based on Bray–Curtis dissimilarities showed a significant effect of both hydrological period (</w:t>
+      </w:r>
+      <m:oMath>
+        <m:sSub>
+          <m:e>
+            <m:r>
+              <m:rPr>
+                <m:nor/>
+                <m:sty m:val="p"/>
+              </m:rPr>
+              <m:t>F</m:t>
+            </m:r>
+          </m:e>
+          <m:sub>
+            <m:r>
+              <m:t>1</m:t>
+            </m:r>
+            <m:r>
+              <m:rPr>
+                <m:sty m:val="p"/>
+              </m:rPr>
+              <m:t>,</m:t>
+            </m:r>
+            <m:r>
+              <m:t>86</m:t>
+            </m:r>
+          </m:sub>
+        </m:sSub>
+        <m:r>
+          <m:rPr>
+            <m:sty m:val="p"/>
+          </m:rPr>
+          <m:t>=</m:t>
+        </m:r>
+        <m:r>
+          <m:t>5.3</m:t>
+        </m:r>
+        <m:r>
+          <m:rPr>
+            <m:sty m:val="p"/>
+          </m:rPr>
+          <m:t>,</m:t>
+        </m:r>
+        <m:sSup>
+          <m:e>
+            <m:r>
+              <m:t>R</m:t>
+            </m:r>
+          </m:e>
+          <m:sup>
+            <m:r>
+              <m:t>2</m:t>
+            </m:r>
+          </m:sup>
+        </m:sSup>
+        <m:r>
+          <m:rPr>
+            <m:sty m:val="p"/>
+          </m:rPr>
+          <m:t>=</m:t>
+        </m:r>
+        <m:r>
+          <m:t>0.056</m:t>
+        </m:r>
+        <m:r>
+          <m:rPr>
+            <m:sty m:val="p"/>
+          </m:rPr>
+          <m:t>,</m:t>
+        </m:r>
+        <m:r>
+          <m:t>p</m:t>
+        </m:r>
+        <m:r>
+          <m:rPr>
+            <m:sty m:val="p"/>
+          </m:rPr>
+          <m:t>=</m:t>
+        </m:r>
+        <m:r>
+          <m:t>0.001</m:t>
+        </m:r>
+      </m:oMath>
+      <w:r>
+        <w:t xml:space="preserve">) and stream (</w:t>
+      </w:r>
+      <m:oMath>
+        <m:sSub>
+          <m:e>
+            <m:r>
+              <m:rPr>
+                <m:nor/>
+                <m:sty m:val="p"/>
+              </m:rPr>
+              <m:t>F</m:t>
+            </m:r>
+          </m:e>
+          <m:sub>
+            <m:r>
+              <m:t>1</m:t>
+            </m:r>
+            <m:r>
+              <m:rPr>
+                <m:sty m:val="p"/>
+              </m:rPr>
+              <m:t>,</m:t>
+            </m:r>
+            <m:r>
+              <m:t>86</m:t>
+            </m:r>
+          </m:sub>
+        </m:sSub>
+        <m:r>
+          <m:rPr>
+            <m:sty m:val="p"/>
+          </m:rPr>
+          <m:t>=</m:t>
+        </m:r>
+        <m:r>
+          <m:t>1.8</m:t>
+        </m:r>
+        <m:r>
+          <m:rPr>
+            <m:sty m:val="p"/>
+          </m:rPr>
+          <m:t>,</m:t>
+        </m:r>
+        <m:sSup>
+          <m:e>
+            <m:r>
+              <m:t>R</m:t>
+            </m:r>
+          </m:e>
+          <m:sup>
+            <m:r>
+              <m:t>2</m:t>
+            </m:r>
+          </m:sup>
+        </m:sSup>
+        <m:r>
+          <m:rPr>
+            <m:sty m:val="p"/>
+          </m:rPr>
+          <m:t>=</m:t>
+        </m:r>
+        <m:r>
+          <m:t>0.019</m:t>
+        </m:r>
+        <m:r>
+          <m:rPr>
+            <m:sty m:val="p"/>
+          </m:rPr>
+          <m:t>,</m:t>
+        </m:r>
+        <m:r>
+          <m:t>p</m:t>
+        </m:r>
+        <m:r>
+          <m:rPr>
+            <m:sty m:val="p"/>
+          </m:rPr>
+          <m:t>=</m:t>
+        </m:r>
+        <m:r>
+          <m:t>0.042</m:t>
+        </m:r>
+      </m:oMath>
+      <w:r>
+        <w:t xml:space="preserve">) on community composition. The full model including the Season × Stream interaction was also significant (</w:t>
+      </w:r>
+      <m:oMath>
+        <m:sSub>
+          <m:e>
+            <m:r>
+              <m:rPr>
+                <m:nor/>
+                <m:sty m:val="p"/>
+              </m:rPr>
+              <m:t>F</m:t>
+            </m:r>
+          </m:e>
+          <m:sub>
+            <m:r>
+              <m:t>1</m:t>
+            </m:r>
+            <m:r>
+              <m:rPr>
+                <m:sty m:val="p"/>
+              </m:rPr>
+              <m:t>,</m:t>
+            </m:r>
+            <m:r>
+              <m:t>86</m:t>
+            </m:r>
+          </m:sub>
+        </m:sSub>
+        <m:r>
+          <m:rPr>
+            <m:sty m:val="p"/>
+          </m:rPr>
+          <m:t>=</m:t>
+        </m:r>
+        <m:r>
+          <m:t>2.1</m:t>
+        </m:r>
+        <m:r>
+          <m:rPr>
+            <m:sty m:val="p"/>
+          </m:rPr>
+          <m:t>,</m:t>
+        </m:r>
+        <m:sSup>
+          <m:e>
+            <m:r>
+              <m:t>R</m:t>
+            </m:r>
+          </m:e>
+          <m:sup>
+            <m:r>
+              <m:t>2</m:t>
+            </m:r>
+          </m:sup>
+        </m:sSup>
+        <m:r>
+          <m:rPr>
+            <m:sty m:val="p"/>
+          </m:rPr>
+          <m:t>=</m:t>
+        </m:r>
+        <m:r>
+          <m:t>0.022</m:t>
+        </m:r>
+        <m:r>
+          <m:rPr>
+            <m:sty m:val="p"/>
+          </m:rPr>
+          <m:t>,</m:t>
+        </m:r>
+        <m:r>
+          <m:t>p</m:t>
+        </m:r>
+        <m:r>
+          <m:rPr>
+            <m:sty m:val="p"/>
+          </m:rPr>
+          <m:t>=</m:t>
+        </m:r>
+        <m:r>
+          <m:t>0.031</m:t>
+        </m:r>
+      </m:oMath>
+      <w:r>
+        <w:t xml:space="preserve">), explaining 9.73% of the total variation, with 90.27% of the variation unexplained by the factors included in the model.</w:t>
       </w:r>
     </w:p>
     <w:bookmarkEnd w:id="20"/>
@@ -18344,13 +18824,14 @@
       <w:pPr>
         <w:pStyle w:val="TextBody"/>
       </w:pPr>
-      <w:r>
-        <w:rPr>
-          <w:b/>
-          <w:bCs/>
-        </w:rPr>
-        <w:t xml:space="preserve">?@tbl-spp_gttable</w:t>
-      </w:r>
+      <w:hyperlink w:anchor="tbl-checklist_gttable">
+        <w:r>
+          <w:rPr>
+            <w:rStyle w:val="Hyperlink"/>
+          </w:rPr>
+          <w:t xml:space="preserve">Table 3</w:t>
+        </w:r>
+      </w:hyperlink>
     </w:p>
     <w:tbl>
       <w:tblPr>

</xml_diff>

<commit_message>
Elv: ms iniciando intro e discussão
</commit_message>
<xml_diff>
--- a/docs/ms_rebio23-part.docx
+++ b/docs/ms_rebio23-part.docx
@@ -83,7 +83,7 @@
         <w:pStyle w:val="Date"/>
       </w:pPr>
       <w:r>
-        <w:t xml:space="preserve">2026-10-08</w:t>
+        <w:t xml:space="preserve">2026-10-12</w:t>
       </w:r>
     </w:p>
     <w:p>
@@ -3030,13 +3030,14 @@
       <w:r>
         <w:t xml:space="preserve"> </w:t>
       </w:r>
-      <w:r>
-        <w:rPr>
-          <w:b/>
-          <w:bCs/>
-        </w:rPr>
-        <w:t xml:space="preserve">?@tbl-part_gttables</w:t>
-      </w:r>
+      <w:hyperlink w:anchor="tbl-part_gttable">
+        <w:r>
+          <w:rPr>
+            <w:rStyle w:val="Hyperlink"/>
+          </w:rPr>
+          <w:t xml:space="preserve">Table 4</w:t>
+        </w:r>
+      </w:hyperlink>
       <w:r>
         <w:t xml:space="preserve"> </w:t>
       </w:r>
@@ -3106,13 +3107,14 @@
       <w:r>
         <w:t xml:space="preserve"> </w:t>
       </w:r>
-      <w:r>
-        <w:rPr>
-          <w:b/>
-          <w:bCs/>
-        </w:rPr>
-        <w:t xml:space="preserve">?@tbl-part_gttables</w:t>
-      </w:r>
+      <w:hyperlink w:anchor="tbl-part_gttable">
+        <w:r>
+          <w:rPr>
+            <w:rStyle w:val="Hyperlink"/>
+          </w:rPr>
+          <w:t xml:space="preserve">Table 4</w:t>
+        </w:r>
+      </w:hyperlink>
       <w:r>
         <w:t xml:space="preserve"> </w:t>
       </w:r>
@@ -6394,7 +6396,7 @@
                       <w:rFonts w:ascii="Calibri" w:hAnsi="Calibri"/>
                       <w:sz w:val="20"/>
                     </w:rPr>
-                    <w:t xml:space="default">Water quality</w:t>
+                    <w:t xml:space="default">Physicochemical variables</w:t>
                   </w:r>
                 </w:p>
               </w:tc>
@@ -10548,31 +10550,31 @@
                       <w:rFonts w:ascii="Calibri" w:hAnsi="Calibri"/>
                       <w:sz w:val="20"/>
                     </w:rPr>
-                    <w:t xml:space="default">33 (14-42)</w:t>
-                  </w:r>
-                </w:p>
-              </w:tc>
-              <w:tc>
-                <w:tcPr>
-                  <w:tcBorders>
-                    <w:top w:val="single" w:space="0" w:color="D3D3D3"/>
-                    <w:bottom w:val="single" w:space="0" w:color="D3D3D3"/>
-                    <w:start w:val="single" w:space="0" w:color="D3D3D3"/>
-                    <w:end w:val="single" w:space="0" w:color="D3D3D3"/>
-                  </w:tcBorders>
-                </w:tcPr>
-                <w:p>
-                  <w:pPr>
-                    <w:spacing w:before="0" w:after="60"/>
-                    <w:keepNext/>
-                    <w:jc w:val="start"/>
-                  </w:pPr>
-                  <w:r>
-                    <w:rPr>
-                      <w:rFonts w:ascii="Calibri" w:hAnsi="Calibri"/>
-                      <w:sz w:val="20"/>
-                    </w:rPr>
-                    <w:t xml:space="default">54.4 (15.7-98.7)</w:t>
+                    <w:t xml:space="default">39.1 (27-50.3)</w:t>
+                  </w:r>
+                </w:p>
+              </w:tc>
+              <w:tc>
+                <w:tcPr>
+                  <w:tcBorders>
+                    <w:top w:val="single" w:space="0" w:color="D3D3D3"/>
+                    <w:bottom w:val="single" w:space="0" w:color="D3D3D3"/>
+                    <w:start w:val="single" w:space="0" w:color="D3D3D3"/>
+                    <w:end w:val="single" w:space="0" w:color="D3D3D3"/>
+                  </w:tcBorders>
+                </w:tcPr>
+                <w:p>
+                  <w:pPr>
+                    <w:spacing w:before="0" w:after="60"/>
+                    <w:keepNext/>
+                    <w:jc w:val="start"/>
+                  </w:pPr>
+                  <w:r>
+                    <w:rPr>
+                      <w:rFonts w:ascii="Calibri" w:hAnsi="Calibri"/>
+                      <w:sz w:val="20"/>
+                    </w:rPr>
+                    <w:t xml:space="default">60.3 (25-98.7)</w:t>
                   </w:r>
                 </w:p>
               </w:tc>
@@ -14246,7 +14248,7 @@
                       <w:rFonts w:ascii="Calibri" w:hAnsi="Calibri"/>
                       <w:sz w:val="20"/>
                     </w:rPr>
-                    <w:t xml:space="default">0 (0-0)</w:t>
+                    <w:t xml:space="default">0</w:t>
                   </w:r>
                 </w:p>
               </w:tc>

</xml_diff>

<commit_message>
Elv: ms intro refs
</commit_message>
<xml_diff>
--- a/docs/ms_rebio23-part.docx
+++ b/docs/ms_rebio23-part.docx
@@ -7,7 +7,7 @@
         <w:pStyle w:val="Title"/>
       </w:pPr>
       <w:r>
-        <w:t xml:space="preserve">Contrasting conservation conditions shape the spatial partitioning of zooplankton diversity in Atlantic Forest streams</w:t>
+        <w:t xml:space="preserve">Zooplankton diversity partitioning: implications for stream conservation in the Atlantic Forest</w:t>
       </w:r>
     </w:p>
     <w:p>
@@ -15,7 +15,7 @@
         <w:pStyle w:val="Subtitle"/>
       </w:pPr>
       <w:r>
-        <w:t xml:space="preserve">Contrasting conservation conditions shape the spatial partitioning of zooplankton diversity in Atlantic Forest streams</w:t>
+        <w:t xml:space="preserve">Short title: Zooplankton diversity partitioning in Atlantic Forest streams</w:t>
       </w:r>
       <w:r>
         <w:t xml:space="preserve"> </w:t>
@@ -83,7 +83,7 @@
         <w:pStyle w:val="Date"/>
       </w:pPr>
       <w:r>
-        <w:t xml:space="preserve">2026-10-12</w:t>
+        <w:t xml:space="preserve">2026-10-15</w:t>
       </w:r>
     </w:p>
     <w:p>
@@ -168,16 +168,69 @@
         <w:pStyle w:val="FirstParagraph"/>
       </w:pPr>
       <w:r>
-        <w:t xml:space="preserve">Essas abordagens são baseadas nos conceitos de turnover and nestedness. Species turnover and nestedness are two distinct components used to break down and understand beta diversity—which measures how much species composition changes between different communities or sites</w:t>
+        <w:t xml:space="preserve">The Atlantic Forest, recognized for its exceptional species richness and high level of endemism</w:t>
       </w:r>
       <w:r>
         <w:t xml:space="preserve"> </w:t>
       </w:r>
       <w:r>
-        <w:t xml:space="preserve">(Baselga 2010)</w:t>
-      </w:r>
-      <w:r>
-        <w:t xml:space="preserve">, where, turnover is the replacement of some species by different species from one site to another, while nestedness is the loss or gain of species where poorer sites contain a strict subset of the species found at richer sites.</w:t>
+        <w:t xml:space="preserve">(Fonseca 1985, Myers et al. 2000, Tabarelli et al. 2012)</w:t>
+      </w:r>
+      <w:r>
+        <w:t xml:space="preserve">, is one of the most threatened tropical forests worldwide due to intense anthropogenic pressure, making it a global priority region for biodiversity conservation in South America</w:t>
+      </w:r>
+      <w:r>
+        <w:t xml:space="preserve"> </w:t>
+      </w:r>
+      <w:r>
+        <w:t xml:space="preserve">(Safar et al. 2020, Vancine et al. 2024)</w:t>
+      </w:r>
+      <w:r>
+        <w:t xml:space="preserve">. Originally, its vegetation cover extended over 1.6 million km²; however, centuries of human occupation and resource exploitation have led to severe landscape reduction and fragmentation, compromising the ecological integrity of its remnants and the maintenance of biodiversity</w:t>
+      </w:r>
+      <w:r>
+        <w:t xml:space="preserve"> </w:t>
+      </w:r>
+      <w:r>
+        <w:t xml:space="preserve">(Safar et al. 2020, Vancine et al. 2024)</w:t>
+      </w:r>
+      <w:r>
+        <w:t xml:space="preserve">. Habitat loss driven by deforestation is directly linked to forest fragmentation, which promotes the isolation of remnants, reduces landscape connectivity, and restricts species dispersal</w:t>
+      </w:r>
+      <w:r>
+        <w:t xml:space="preserve"> </w:t>
+      </w:r>
+      <w:r>
+        <w:t xml:space="preserve">(Souza et al. 2025,</w:t>
+      </w:r>
+      <w:r>
+        <w:t xml:space="preserve"> </w:t>
+      </w:r>
+      <w:r>
+        <w:rPr>
+          <w:b/>
+          <w:bCs/>
+        </w:rPr>
+        <w:t xml:space="preserve">tabarelli2010?</w:t>
+      </w:r>
+      <w:r>
+        <w:t xml:space="preserve">,</w:t>
+      </w:r>
+      <w:r>
+        <w:t xml:space="preserve"> </w:t>
+      </w:r>
+      <w:r>
+        <w:rPr>
+          <w:b/>
+          <w:bCs/>
+        </w:rPr>
+        <w:t xml:space="preserve">zaú1998?</w:t>
+      </w:r>
+      <w:r>
+        <w:t xml:space="preserve">)</w:t>
+      </w:r>
+      <w:r>
+        <w:t xml:space="preserve">.</w:t>
       </w:r>
     </w:p>
     <w:p>
@@ -185,7 +238,399 @@
         <w:pStyle w:val="TextBody"/>
       </w:pPr>
       <w:r>
-        <w:t xml:space="preserve">Understanding the spatial structure and distribution of biodiversity across scale remains a central theme in community ecology and conservation planning (Lande 1996, Crist et al. 2003). Total regional species richness (</w:t>
+        <w:t xml:space="preserve">These impacts are not confined to terrestrial environments as they extend to the associated aquatic ecosystems and, most importantly, headwater streams</w:t>
+      </w:r>
+      <w:r>
+        <w:t xml:space="preserve"> </w:t>
+      </w:r>
+      <w:r>
+        <w:t xml:space="preserve">(Meyer et al. 2007)</w:t>
+      </w:r>
+      <w:r>
+        <w:t xml:space="preserve">. Forest fragmentation and land management can generate significant impacts on stream fauna within the Atlantic Forest, as aquatic organisms are highly sensitive to changes in natural water conditions</w:t>
+      </w:r>
+      <w:r>
+        <w:t xml:space="preserve"> </w:t>
+      </w:r>
+      <w:r>
+        <w:t xml:space="preserve">(Gouveia et al. 2017)</w:t>
+      </w:r>
+      <w:r>
+        <w:t xml:space="preserve">. According to</w:t>
+      </w:r>
+      <w:r>
+        <w:t xml:space="preserve"> </w:t>
+      </w:r>
+      <w:r>
+        <w:t xml:space="preserve">Maltchik and Medeiros (2006)</w:t>
+      </w:r>
+      <w:r>
+        <w:t xml:space="preserve">, landscape-level processes—such as disturbance, fragmentation, dispersal, and mosaic structure—exert a direct influence on local populations. Therefore, understanding the ecological processes structuring these communities is essential to evaluate the ecological health of water bodies and to comprehend how diversity is distributed across different spatial scales</w:t>
+      </w:r>
+      <w:r>
+        <w:t xml:space="preserve"> </w:t>
+      </w:r>
+      <w:r>
+        <w:t xml:space="preserve">(Ávila et al. 2011)</w:t>
+      </w:r>
+      <w:r>
+        <w:t xml:space="preserve">. In addition to landscape alterations, stream dynamics are strongly driven by seasonal factors. The Atlantic Forest features a predominantly tropical climate with rainfall distributed throughout the year</w:t>
+      </w:r>
+      <w:r>
+        <w:t xml:space="preserve"> </w:t>
+      </w:r>
+      <w:r>
+        <w:t xml:space="preserve">(Barboza et al. 2024)</w:t>
+      </w:r>
+      <w:r>
+        <w:t xml:space="preserve">. These hydrological fluctuations directly influence Neotropical freshwater environments by modifying physical and chemical conditions</w:t>
+      </w:r>
+      <w:r>
+        <w:t xml:space="preserve"> </w:t>
+      </w:r>
+      <w:r>
+        <w:t xml:space="preserve">(Barboza et al. 2024)</w:t>
+      </w:r>
+      <w:r>
+        <w:t xml:space="preserve">. The shift between dry and rainy seasons alters resource availability, microhabitat structure, and the establishment and persistence of organisms, thereby shaping community composition and dynamics</w:t>
+      </w:r>
+      <w:r>
+        <w:t xml:space="preserve"> </w:t>
+      </w:r>
+      <w:r>
+        <w:t xml:space="preserve">(Ward 1998, Souza et al. 2025,</w:t>
+      </w:r>
+      <w:r>
+        <w:t xml:space="preserve"> </w:t>
+      </w:r>
+      <w:r>
+        <w:rPr>
+          <w:b/>
+          <w:bCs/>
+        </w:rPr>
+        <w:t xml:space="preserve">esteves2011?</w:t>
+      </w:r>
+      <w:r>
+        <w:t xml:space="preserve">)</w:t>
+      </w:r>
+      <w:r>
+        <w:t xml:space="preserve">.</w:t>
+      </w:r>
+    </w:p>
+    <w:p>
+      <w:pPr>
+        <w:pStyle w:val="TextBody"/>
+      </w:pPr>
+      <w:r>
+        <w:t xml:space="preserve">During the dry season, reduced precipitation and lower streamflow stabilize hydrological conditions, which may favor the persistence of local populations. Conversely, the rainy season is characterized by increased rainfall and discharge, intensifying disturbance events, dispersal, and species turnover</w:t>
+      </w:r>
+      <w:r>
+        <w:t xml:space="preserve"> </w:t>
+      </w:r>
+      <w:r>
+        <w:t xml:space="preserve">(Souza et al. 2025,</w:t>
+      </w:r>
+      <w:r>
+        <w:t xml:space="preserve"> </w:t>
+      </w:r>
+      <w:r>
+        <w:rPr>
+          <w:b/>
+          <w:bCs/>
+        </w:rPr>
+        <w:t xml:space="preserve">allan2021?</w:t>
+      </w:r>
+      <w:r>
+        <w:t xml:space="preserve">)</w:t>
+      </w:r>
+      <w:r>
+        <w:t xml:space="preserve">. Consequently, seasonality acts as a major driver of aquatic community organization, making these organisms valuable biological tools for assessing the ecological state of freshwater systems.</w:t>
+      </w:r>
+    </w:p>
+    <w:p>
+      <w:pPr>
+        <w:pStyle w:val="TextBody"/>
+      </w:pPr>
+      <w:r>
+        <w:t xml:space="preserve">Among the biological components of these communities, zooplankton—particularly Rotifera, Cladocera, and Copepoda—play a pivotal role. These organisms exhibit diverse body sizes, morphologies, life histories, and functional roles, serving as excellent bioindicators due to their rapid sensitivity to environmental changes</w:t>
+      </w:r>
+      <w:r>
+        <w:t xml:space="preserve"> </w:t>
+      </w:r>
+      <w:r>
+        <w:t xml:space="preserve">(</w:t>
+      </w:r>
+      <w:r>
+        <w:rPr>
+          <w:b/>
+          <w:bCs/>
+        </w:rPr>
+        <w:t xml:space="preserve">bonecker2012?</w:t>
+      </w:r>
+      <w:r>
+        <w:t xml:space="preserve">,</w:t>
+      </w:r>
+      <w:r>
+        <w:t xml:space="preserve"> </w:t>
+      </w:r>
+      <w:r>
+        <w:rPr>
+          <w:b/>
+          <w:bCs/>
+        </w:rPr>
+        <w:t xml:space="preserve">cardoso2009?</w:t>
+      </w:r>
+      <w:r>
+        <w:t xml:space="preserve">,</w:t>
+      </w:r>
+      <w:r>
+        <w:t xml:space="preserve"> </w:t>
+      </w:r>
+      <w:r>
+        <w:rPr>
+          <w:b/>
+          <w:bCs/>
+        </w:rPr>
+        <w:t xml:space="preserve">esteves2011?</w:t>
+      </w:r>
+      <w:r>
+        <w:t xml:space="preserve">)</w:t>
+      </w:r>
+      <w:r>
+        <w:t xml:space="preserve">. Furthermore, zooplankton constitute a critical food source for fish, aquatic birds, and mammals, acting as an essential trophic bridge that transfers energy from primary producers to higher trophic levels</w:t>
+      </w:r>
+      <w:r>
+        <w:t xml:space="preserve"> </w:t>
+      </w:r>
+      <w:r>
+        <w:t xml:space="preserve">(Souza et al. 2025,</w:t>
+      </w:r>
+      <w:r>
+        <w:t xml:space="preserve"> </w:t>
+      </w:r>
+      <w:r>
+        <w:rPr>
+          <w:b/>
+          <w:bCs/>
+        </w:rPr>
+        <w:t xml:space="preserve">altindag2025?</w:t>
+      </w:r>
+      <w:r>
+        <w:t xml:space="preserve">,</w:t>
+      </w:r>
+      <w:r>
+        <w:t xml:space="preserve"> </w:t>
+      </w:r>
+      <w:r>
+        <w:rPr>
+          <w:b/>
+          <w:bCs/>
+        </w:rPr>
+        <w:t xml:space="preserve">balkic2022?</w:t>
+      </w:r>
+      <w:r>
+        <w:t xml:space="preserve">,</w:t>
+      </w:r>
+      <w:r>
+        <w:t xml:space="preserve"> </w:t>
+      </w:r>
+      <w:r>
+        <w:rPr>
+          <w:b/>
+          <w:bCs/>
+        </w:rPr>
+        <w:t xml:space="preserve">cardoso2009?</w:t>
+      </w:r>
+      <w:r>
+        <w:t xml:space="preserve">,</w:t>
+      </w:r>
+      <w:r>
+        <w:t xml:space="preserve"> </w:t>
+      </w:r>
+      <w:r>
+        <w:rPr>
+          <w:b/>
+          <w:bCs/>
+        </w:rPr>
+        <w:t xml:space="preserve">majeed2023?</w:t>
+      </w:r>
+      <w:r>
+        <w:t xml:space="preserve">,</w:t>
+      </w:r>
+      <w:r>
+        <w:t xml:space="preserve"> </w:t>
+      </w:r>
+      <w:r>
+        <w:rPr>
+          <w:b/>
+          <w:bCs/>
+        </w:rPr>
+        <w:t xml:space="preserve">marcelino2025?</w:t>
+      </w:r>
+      <w:r>
+        <w:t xml:space="preserve">)</w:t>
+      </w:r>
+      <w:r>
+        <w:t xml:space="preserve">.</w:t>
+      </w:r>
+    </w:p>
+    <w:p>
+      <w:pPr>
+        <w:pStyle w:val="TextBody"/>
+      </w:pPr>
+      <w:r>
+        <w:t xml:space="preserve">According to</w:t>
+      </w:r>
+      <w:r>
+        <w:t xml:space="preserve"> </w:t>
+      </w:r>
+      <w:r>
+        <w:t xml:space="preserve">(</w:t>
+      </w:r>
+      <w:r>
+        <w:rPr>
+          <w:b/>
+          <w:bCs/>
+        </w:rPr>
+        <w:t xml:space="preserve">keppeler2004?</w:t>
+      </w:r>
+      <w:r>
+        <w:t xml:space="preserve">)</w:t>
+      </w:r>
+      <w:r>
+        <w:t xml:space="preserve">, the composition and structure of zooplankton communities result from complex interactions among physical, chemical, and biological factors, including seasonal variations. Therefore, shifts in species composition and community turnover often reflect underlying alterations in environmental conditions</w:t>
+      </w:r>
+      <w:r>
+        <w:t xml:space="preserve"> </w:t>
+      </w:r>
+      <w:r>
+        <w:t xml:space="preserve">(</w:t>
+      </w:r>
+      <w:r>
+        <w:rPr>
+          <w:b/>
+          <w:bCs/>
+        </w:rPr>
+        <w:t xml:space="preserve">freiry2020?</w:t>
+      </w:r>
+      <w:r>
+        <w:t xml:space="preserve">,</w:t>
+      </w:r>
+      <w:r>
+        <w:t xml:space="preserve"> </w:t>
+      </w:r>
+      <w:r>
+        <w:rPr>
+          <w:b/>
+          <w:bCs/>
+        </w:rPr>
+        <w:t xml:space="preserve">melo2013?</w:t>
+      </w:r>
+      <w:r>
+        <w:t xml:space="preserve">)</w:t>
+      </w:r>
+      <w:r>
+        <w:t xml:space="preserve">.</w:t>
+      </w:r>
+    </w:p>
+    <w:p>
+      <w:pPr>
+        <w:pStyle w:val="TextBody"/>
+      </w:pPr>
+      <w:r>
+        <w:t xml:space="preserve">In recent decades, researchers have argued that biodiversity assessments should not be reduced to a single diversity index.</w:t>
+      </w:r>
+      <w:r>
+        <w:t xml:space="preserve"> </w:t>
+      </w:r>
+      <w:r>
+        <w:t xml:space="preserve">(</w:t>
+      </w:r>
+      <w:r>
+        <w:rPr>
+          <w:b/>
+          <w:bCs/>
+        </w:rPr>
+        <w:t xml:space="preserve">romanelli2022?</w:t>
+      </w:r>
+      <w:r>
+        <w:t xml:space="preserve">)</w:t>
+      </w:r>
+      <w:r>
+        <w:t xml:space="preserve"> </w:t>
+      </w:r>
+      <w:r>
+        <w:t xml:space="preserve">emphasize that combining multiple statistical diversity approaches with multi-taxon evaluations provides a more comprehensive understanding of environmental ecological health and species responses to anthropogenic stress. Nevertheless, few approaches allow for the assessment of diversity organization across explicit hierarchical spatial scales.</w:t>
+      </w:r>
+    </w:p>
+    <w:p>
+      <w:pPr>
+        <w:pStyle w:val="TextBody"/>
+      </w:pPr>
+      <w:r>
+        <w:t xml:space="preserve">Diversity partitioning stands out in this context. This framework decomposes overall diversity across multiple spatial levels, testing whether observed diversity is higher or lower than expected under null distribution models</w:t>
+      </w:r>
+      <w:r>
+        <w:t xml:space="preserve"> </w:t>
+      </w:r>
+      <w:r>
+        <w:t xml:space="preserve">(</w:t>
+      </w:r>
+      <w:r>
+        <w:rPr>
+          <w:b/>
+          <w:bCs/>
+        </w:rPr>
+        <w:t xml:space="preserve">flach2009?</w:t>
+      </w:r>
+      <w:r>
+        <w:t xml:space="preserve">,</w:t>
+      </w:r>
+      <w:r>
+        <w:t xml:space="preserve"> </w:t>
+      </w:r>
+      <w:r>
+        <w:rPr>
+          <w:b/>
+          <w:bCs/>
+        </w:rPr>
+        <w:t xml:space="preserve">lopes2014?</w:t>
+      </w:r>
+      <w:r>
+        <w:t xml:space="preserve">)</w:t>
+      </w:r>
+      <w:r>
+        <w:t xml:space="preserve">, thereby offering valuable insights into community assembly and underlying ecological drivers.</w:t>
+      </w:r>
+    </w:p>
+    <w:p>
+      <w:pPr>
+        <w:pStyle w:val="TextBody"/>
+      </w:pPr>
+      <w:r>
+        <w:t xml:space="preserve">Among diversity partitioning framework variants, additive partitioning is widely applied in aquatic studies. However,</w:t>
+      </w:r>
+      <w:r>
+        <w:t xml:space="preserve"> </w:t>
+      </w:r>
+      <w:r>
+        <w:t xml:space="preserve">(</w:t>
+      </w:r>
+      <w:r>
+        <w:rPr>
+          <w:b/>
+          <w:bCs/>
+        </w:rPr>
+        <w:t xml:space="preserve">ligeiro2010?</w:t>
+      </w:r>
+      <w:r>
+        <w:t xml:space="preserve">)</w:t>
+      </w:r>
+      <w:r>
+        <w:t xml:space="preserve"> </w:t>
+      </w:r>
+      <w:r>
+        <w:t xml:space="preserve">point out that its application in freshwater systems remains relatively scarce, highlighting a critical knowledge gap regarding alpha and beta diversity distribution. Under the additive partitioning model, total regional diversity (</w:t>
       </w:r>
       <m:oMath>
         <m:r>
@@ -193,7 +638,7 @@
         </m:r>
       </m:oMath>
       <w:r>
-        <w:t xml:space="preserve">-diversity) can be hierarchically partitioned into its additive components: local richness (</w:t>
+        <w:t xml:space="preserve">-diversity) is partitioned into additive alpha (</w:t>
       </w:r>
       <m:oMath>
         <m:r>
@@ -201,7 +646,7 @@
         </m:r>
       </m:oMath>
       <w:r>
-        <w:t xml:space="preserve">-diversity) and species turnover among assemblages (</w:t>
+        <w:t xml:space="preserve">) and beta (</w:t>
       </w:r>
       <m:oMath>
         <m:r>
@@ -209,7 +654,40 @@
         </m:r>
       </m:oMath>
       <w:r>
-        <w:t xml:space="preserve">-diversity) across spatial or temporal scales (Lande 1996). Examining these components allows ecologists to disentangle whether regional diversity is primarily governed by fine-scale local processes or broader spatial heterogeneity (Crist et al. 2003, Tuomisto 2010).Beta diversity (</w:t>
+        <w:t xml:space="preserve">) components</w:t>
+      </w:r>
+      <w:r>
+        <w:t xml:space="preserve"> </w:t>
+      </w:r>
+      <w:r>
+        <w:t xml:space="preserve">(</w:t>
+      </w:r>
+      <w:r>
+        <w:rPr>
+          <w:b/>
+          <w:bCs/>
+        </w:rPr>
+        <w:t xml:space="preserve">crist2003?</w:t>
+      </w:r>
+      <w:r>
+        <w:t xml:space="preserve">)</w:t>
+      </w:r>
+      <w:r>
+        <w:t xml:space="preserve">, where</w:t>
+      </w:r>
+      <w:r>
+        <w:t xml:space="preserve"> </w:t>
+      </w:r>
+      <m:oMath>
+        <m:r>
+          <m:t>α</m:t>
+        </m:r>
+      </m:oMath>
+      <w:r>
+        <w:t xml:space="preserve">-diversity represents the mean local richness and</w:t>
+      </w:r>
+      <w:r>
+        <w:t xml:space="preserve"> </w:t>
       </w:r>
       <m:oMath>
         <m:r>
@@ -217,7 +695,343 @@
         </m:r>
       </m:oMath>
       <w:r>
-        <w:t xml:space="preserve">) itself reflects the variation in species composition among sites and is driven by two distinct ecological phenomena: turnover (species replacement) and nestedness (richness differences) (Baselga 2010). Species turnover occurs when species are replaced by different species along environmental or spatial gradients, usually driven by environmental filtering, competitive exclusion, or dispersal limitation (Baselga 2010, Tuomisto 2010). In contrast, nestedness occurs when communities at species-poor sites are non-random subsets of those at species-rich sites (Baselga 2010). Nested patterns typically stem from deterministic processes such as selective extinction, differential colonization capacity, or habitat fragmentation that sequentially eliminate sensitive taxa while retaining tolerant generalists (Baselga 2010, Gotelli &amp; Ulrich 2012).Evaluating the relative contribution of turnover and nestedness—alongside null models using Standardized Effect Sizes (</w:t>
+        <w:t xml:space="preserve">-diversity reflects spatial turnover or variation in species composition among sampling units</w:t>
+      </w:r>
+      <w:r>
+        <w:t xml:space="preserve"> </w:t>
+      </w:r>
+      <w:r>
+        <w:t xml:space="preserve">(Ávila et al. 2011,</w:t>
+      </w:r>
+      <w:r>
+        <w:t xml:space="preserve"> </w:t>
+      </w:r>
+      <w:r>
+        <w:rPr>
+          <w:b/>
+          <w:bCs/>
+        </w:rPr>
+        <w:t xml:space="preserve">baselga2012?</w:t>
+      </w:r>
+      <w:r>
+        <w:t xml:space="preserve">,</w:t>
+      </w:r>
+      <w:r>
+        <w:t xml:space="preserve"> </w:t>
+      </w:r>
+      <w:r>
+        <w:rPr>
+          <w:b/>
+          <w:bCs/>
+        </w:rPr>
+        <w:t xml:space="preserve">jost2007?</w:t>
+      </w:r>
+      <w:r>
+        <w:t xml:space="preserve">,</w:t>
+      </w:r>
+      <w:r>
+        <w:t xml:space="preserve"> </w:t>
+      </w:r>
+      <w:r>
+        <w:rPr>
+          <w:b/>
+          <w:bCs/>
+        </w:rPr>
+        <w:t xml:space="preserve">ligeiro2010?</w:t>
+      </w:r>
+      <w:r>
+        <w:t xml:space="preserve">,</w:t>
+      </w:r>
+      <w:r>
+        <w:t xml:space="preserve"> </w:t>
+      </w:r>
+      <w:r>
+        <w:rPr>
+          <w:b/>
+          <w:bCs/>
+        </w:rPr>
+        <w:t xml:space="preserve">whittaker1972?</w:t>
+      </w:r>
+      <w:r>
+        <w:t xml:space="preserve">)</w:t>
+      </w:r>
+      <w:r>
+        <w:t xml:space="preserve">.</w:t>
+      </w:r>
+    </w:p>
+    <w:p>
+      <w:pPr>
+        <w:pStyle w:val="TextBody"/>
+      </w:pPr>
+      <w:r>
+        <w:t xml:space="preserve">Additive diversity partitioning provides a robust framework to evaluate how zooplankton communities respond to landscape fragmentation and seasonal dynamics. By decomposing total diversity into hierarchical</w:t>
+      </w:r>
+      <w:r>
+        <w:t xml:space="preserve"> </w:t>
+      </w:r>
+      <m:oMath>
+        <m:r>
+          <m:t>α</m:t>
+        </m:r>
+      </m:oMath>
+      <w:r>
+        <w:t xml:space="preserve"> </w:t>
+      </w:r>
+      <w:r>
+        <w:t xml:space="preserve">and</w:t>
+      </w:r>
+      <w:r>
+        <w:t xml:space="preserve"> </w:t>
+      </w:r>
+      <m:oMath>
+        <m:r>
+          <m:t>β</m:t>
+        </m:r>
+      </m:oMath>
+      <w:r>
+        <w:t xml:space="preserve"> </w:t>
+      </w:r>
+      <w:r>
+        <w:t xml:space="preserve">components, it is possible to quantify spatial contributions to overall diversity and detect species turnover across scales. Ultimately, this study generates key baseline data on the ecological condition of the studied streams and the ecological mechanisms structuring zooplankton communities, contributing to safer conservation strategies in Atlantic Forest remnants.</w:t>
+      </w:r>
+    </w:p>
+    <w:p>
+      <w:pPr>
+        <w:pStyle w:val="TextBody"/>
+      </w:pPr>
+      <w:r>
+        <w:t xml:space="preserve">Therefore, understanding the spatial structure and distribution of biodiversity across scale remains a central theme in community ecology and conservation planning</w:t>
+      </w:r>
+      <w:r>
+        <w:t xml:space="preserve"> </w:t>
+      </w:r>
+      <w:r>
+        <w:t xml:space="preserve">(</w:t>
+      </w:r>
+      <w:r>
+        <w:rPr>
+          <w:b/>
+          <w:bCs/>
+        </w:rPr>
+        <w:t xml:space="preserve">lande1996?</w:t>
+      </w:r>
+      <w:r>
+        <w:t xml:space="preserve">,</w:t>
+      </w:r>
+      <w:r>
+        <w:t xml:space="preserve"> </w:t>
+      </w:r>
+      <w:r>
+        <w:rPr>
+          <w:b/>
+          <w:bCs/>
+        </w:rPr>
+        <w:t xml:space="preserve">crist2003?</w:t>
+      </w:r>
+      <w:r>
+        <w:t xml:space="preserve">)</w:t>
+      </w:r>
+      <w:r>
+        <w:t xml:space="preserve">. These approaches are based on the concepts of species turnover and nestedness, two distinct components used to break down and understand beta diversity – which measures how much species composition changes between different communities or sites</w:t>
+      </w:r>
+      <w:r>
+        <w:t xml:space="preserve"> </w:t>
+      </w:r>
+      <w:r>
+        <w:t xml:space="preserve">(</w:t>
+      </w:r>
+      <w:r>
+        <w:rPr>
+          <w:b/>
+          <w:bCs/>
+        </w:rPr>
+        <w:t xml:space="preserve">baselga2010?</w:t>
+      </w:r>
+      <w:r>
+        <w:t xml:space="preserve">)</w:t>
+      </w:r>
+      <w:r>
+        <w:t xml:space="preserve">. Turnover is the replacement of some species by different species from one site to another, while nestedness is the loss or gain of species where poorer sites contain a strict subset of the species found at richer sites.</w:t>
+      </w:r>
+    </w:p>
+    <w:p>
+      <w:pPr>
+        <w:pStyle w:val="TextBody"/>
+      </w:pPr>
+      <w:r>
+        <w:t xml:space="preserve">Total regional species richness (</w:t>
+      </w:r>
+      <m:oMath>
+        <m:r>
+          <m:t>γ</m:t>
+        </m:r>
+      </m:oMath>
+      <w:r>
+        <w:t xml:space="preserve">-diversity) can be hierarchically partitioned into its additive components: local richness (</w:t>
+      </w:r>
+      <m:oMath>
+        <m:r>
+          <m:t>α</m:t>
+        </m:r>
+      </m:oMath>
+      <w:r>
+        <w:t xml:space="preserve">-diversity) and species turnover among assemblages (</w:t>
+      </w:r>
+      <m:oMath>
+        <m:r>
+          <m:t>β</m:t>
+        </m:r>
+      </m:oMath>
+      <w:r>
+        <w:t xml:space="preserve">-diversity) across spatial or temporal scales</w:t>
+      </w:r>
+      <w:r>
+        <w:t xml:space="preserve"> </w:t>
+      </w:r>
+      <w:r>
+        <w:t xml:space="preserve">(</w:t>
+      </w:r>
+      <w:r>
+        <w:rPr>
+          <w:b/>
+          <w:bCs/>
+        </w:rPr>
+        <w:t xml:space="preserve">lande1996?</w:t>
+      </w:r>
+      <w:r>
+        <w:t xml:space="preserve">)</w:t>
+      </w:r>
+      <w:r>
+        <w:t xml:space="preserve">. Examining these components allows ecologists to disentangle whether regional diversity is primarily governed by fine-scale local processes or broader spatial heterogeneity</w:t>
+      </w:r>
+      <w:r>
+        <w:t xml:space="preserve"> </w:t>
+      </w:r>
+      <w:r>
+        <w:t xml:space="preserve">(</w:t>
+      </w:r>
+      <w:r>
+        <w:rPr>
+          <w:b/>
+          <w:bCs/>
+        </w:rPr>
+        <w:t xml:space="preserve">crist2003?</w:t>
+      </w:r>
+      <w:r>
+        <w:t xml:space="preserve">,</w:t>
+      </w:r>
+      <w:r>
+        <w:t xml:space="preserve"> </w:t>
+      </w:r>
+      <w:r>
+        <w:rPr>
+          <w:b/>
+          <w:bCs/>
+        </w:rPr>
+        <w:t xml:space="preserve">tuomisto2010?</w:t>
+      </w:r>
+      <w:r>
+        <w:t xml:space="preserve">)</w:t>
+      </w:r>
+      <w:r>
+        <w:t xml:space="preserve">. Beta diversity (</w:t>
+      </w:r>
+      <m:oMath>
+        <m:r>
+          <m:t>β</m:t>
+        </m:r>
+      </m:oMath>
+      <w:r>
+        <w:t xml:space="preserve">) itself reflects the variation in species composition among sites and is driven by two distinct ecological phenomena: turnover (species replacement) and nestedness (richness differences)</w:t>
+      </w:r>
+      <w:r>
+        <w:t xml:space="preserve"> </w:t>
+      </w:r>
+      <w:r>
+        <w:t xml:space="preserve">(</w:t>
+      </w:r>
+      <w:r>
+        <w:rPr>
+          <w:b/>
+          <w:bCs/>
+        </w:rPr>
+        <w:t xml:space="preserve">baselga2010?</w:t>
+      </w:r>
+      <w:r>
+        <w:t xml:space="preserve">)</w:t>
+      </w:r>
+      <w:r>
+        <w:t xml:space="preserve">. Species turnover occurs when species are replaced by different species along environmental or spatial gradients, usually driven by environmental filtering, competitive exclusion, or dispersal limitation</w:t>
+      </w:r>
+      <w:r>
+        <w:t xml:space="preserve"> </w:t>
+      </w:r>
+      <w:r>
+        <w:t xml:space="preserve">(</w:t>
+      </w:r>
+      <w:r>
+        <w:rPr>
+          <w:b/>
+          <w:bCs/>
+        </w:rPr>
+        <w:t xml:space="preserve">baselga2010?</w:t>
+      </w:r>
+      <w:r>
+        <w:t xml:space="preserve">,</w:t>
+      </w:r>
+      <w:r>
+        <w:t xml:space="preserve"> </w:t>
+      </w:r>
+      <w:r>
+        <w:rPr>
+          <w:b/>
+          <w:bCs/>
+        </w:rPr>
+        <w:t xml:space="preserve">tuomisto2010?</w:t>
+      </w:r>
+      <w:r>
+        <w:t xml:space="preserve">)</w:t>
+      </w:r>
+      <w:r>
+        <w:t xml:space="preserve">. In contrast, nestedness occurs when communities at species-poor sites are non-random subsets of those at species-rich sites</w:t>
+      </w:r>
+      <w:r>
+        <w:t xml:space="preserve"> </w:t>
+      </w:r>
+      <w:r>
+        <w:t xml:space="preserve">(</w:t>
+      </w:r>
+      <w:r>
+        <w:rPr>
+          <w:b/>
+          <w:bCs/>
+        </w:rPr>
+        <w:t xml:space="preserve">baselga2010?</w:t>
+      </w:r>
+      <w:r>
+        <w:t xml:space="preserve">)</w:t>
+      </w:r>
+      <w:r>
+        <w:t xml:space="preserve">. Nested patterns typically stem from deterministic processes such as selective extinction, differential colonization capacity, or habitat fragmentation that sequentially eliminate sensitive taxa while retaining tolerant generalists</w:t>
+      </w:r>
+      <w:r>
+        <w:t xml:space="preserve"> </w:t>
+      </w:r>
+      <w:r>
+        <w:t xml:space="preserve">(</w:t>
+      </w:r>
+      <w:r>
+        <w:rPr>
+          <w:b/>
+          <w:bCs/>
+        </w:rPr>
+        <w:t xml:space="preserve">baselga2010?</w:t>
+      </w:r>
+      <w:r>
+        <w:t xml:space="preserve">)</w:t>
+      </w:r>
+      <w:r>
+        <w:t xml:space="preserve">. Evaluating the relative contribution of turnover and nestedness—alongside null models using Standardized Effect Sizes (</w:t>
       </w:r>
       <m:oMath>
         <m:r>
@@ -229,7 +1043,39 @@
         </m:r>
       </m:oMath>
       <w:r>
-        <w:t xml:space="preserve">)—provides critical insights into assembly rules and conservation prioritization (Gotelli &amp; McCabe 2002, Baselga 2010). A pattern dominated by turnover (</w:t>
+        <w:t xml:space="preserve">)—provides critical insights into assembly rules and conservation prioritization</w:t>
+      </w:r>
+      <w:r>
+        <w:t xml:space="preserve"> </w:t>
+      </w:r>
+      <w:r>
+        <w:t xml:space="preserve">(</w:t>
+      </w:r>
+      <w:r>
+        <w:rPr>
+          <w:b/>
+          <w:bCs/>
+        </w:rPr>
+        <w:t xml:space="preserve">gotelli2002?</w:t>
+      </w:r>
+      <w:r>
+        <w:t xml:space="preserve">,</w:t>
+      </w:r>
+      <w:r>
+        <w:t xml:space="preserve"> </w:t>
+      </w:r>
+      <w:r>
+        <w:rPr>
+          <w:b/>
+          <w:bCs/>
+        </w:rPr>
+        <w:t xml:space="preserve">baselga2010?</w:t>
+      </w:r>
+      <w:r>
+        <w:t xml:space="preserve">)</w:t>
+      </w:r>
+      <w:r>
+        <w:t xml:space="preserve">. A pattern dominated by turnover (</w:t>
       </w:r>
       <m:oMath>
         <m:r>
@@ -250,7 +1096,45 @@
         </m:r>
       </m:oMath>
       <w:r>
-        <w:t xml:space="preserve">) implies strong ecological differentiation and high beta diversity, signaling that distinct localities host unique biological assemblages (Baselga 2010). From a conservation perspective, high turnover necessitates a network-wide preservation strategy, as multiple sites must be protected to encompass regional biodiversity (Baselga 2010). Conversely, a system dominated by nestedness or fine-scale homogenization (</w:t>
+        <w:t xml:space="preserve">) implies strong ecological differentiation and high beta diversity, signaling that distinct localities host unique biological assemblages</w:t>
+      </w:r>
+      <w:r>
+        <w:t xml:space="preserve"> </w:t>
+      </w:r>
+      <w:r>
+        <w:t xml:space="preserve">(</w:t>
+      </w:r>
+      <w:r>
+        <w:rPr>
+          <w:b/>
+          <w:bCs/>
+        </w:rPr>
+        <w:t xml:space="preserve">baselga2010?</w:t>
+      </w:r>
+      <w:r>
+        <w:t xml:space="preserve">)</w:t>
+      </w:r>
+      <w:r>
+        <w:t xml:space="preserve">. From a conservation perspective, high turnover necessitates a network-wide preservation strategy, as multiple sites must be protected to encompass regional biodiversity</w:t>
+      </w:r>
+      <w:r>
+        <w:t xml:space="preserve"> </w:t>
+      </w:r>
+      <w:r>
+        <w:t xml:space="preserve">(</w:t>
+      </w:r>
+      <w:r>
+        <w:rPr>
+          <w:b/>
+          <w:bCs/>
+        </w:rPr>
+        <w:t xml:space="preserve">baselga2010?</w:t>
+      </w:r>
+      <w:r>
+        <w:t xml:space="preserve">)</w:t>
+      </w:r>
+      <w:r>
+        <w:t xml:space="preserve">. Conversely, a system dominated by nestedness or fine-scale homogenization (</w:t>
       </w:r>
       <m:oMath>
         <m:r>
@@ -271,7 +1155,26 @@
         </m:r>
       </m:oMath>
       <w:r>
-        <w:t xml:space="preserve">) indicates that local assemblages are nested sub-collections of regional species pools. Under a nested regime, management efforts are most effectively concentrated on protecting the largest or highest-quality species-rich sites, which inherently harbor the vast majority of the regional pool (Baselga 2010).</w:t>
+        <w:t xml:space="preserve">) indicates that local assemblages are nested sub-collections of regional species pools. Under a nested regime, management efforts are most effectively concentrated on protecting the largest or highest-quality species-rich sites, which inherently harbor the vast majority of the regional pool</w:t>
+      </w:r>
+      <w:r>
+        <w:t xml:space="preserve"> </w:t>
+      </w:r>
+      <w:r>
+        <w:t xml:space="preserve">(</w:t>
+      </w:r>
+      <w:r>
+        <w:rPr>
+          <w:b/>
+          <w:bCs/>
+        </w:rPr>
+        <w:t xml:space="preserve">baselga2010?</w:t>
+      </w:r>
+      <w:r>
+        <w:t xml:space="preserve">)</w:t>
+      </w:r>
+      <w:r>
+        <w:t xml:space="preserve">.</w:t>
       </w:r>
     </w:p>
     <w:p>
@@ -285,7 +1188,98 @@
         <w:t xml:space="preserve"> </w:t>
       </w:r>
       <w:r>
-        <w:t xml:space="preserve">(Gering et al. 2003, Crist et al. 2003, Veech et al. 2003, Ligeiro et al. 2010, Baselga 2010, 2012, Ávila et al. 2011, Shell and Collier 2018)</w:t>
+        <w:t xml:space="preserve">(Ávila et al. 2011,</w:t>
+      </w:r>
+      <w:r>
+        <w:t xml:space="preserve"> </w:t>
+      </w:r>
+      <w:r>
+        <w:rPr>
+          <w:b/>
+          <w:bCs/>
+        </w:rPr>
+        <w:t xml:space="preserve">ligeiro2010?</w:t>
+      </w:r>
+      <w:r>
+        <w:t xml:space="preserve">,</w:t>
+      </w:r>
+      <w:r>
+        <w:t xml:space="preserve"> </w:t>
+      </w:r>
+      <w:r>
+        <w:rPr>
+          <w:b/>
+          <w:bCs/>
+        </w:rPr>
+        <w:t xml:space="preserve">crist2003?</w:t>
+      </w:r>
+      <w:r>
+        <w:t xml:space="preserve">,</w:t>
+      </w:r>
+      <w:r>
+        <w:t xml:space="preserve"> </w:t>
+      </w:r>
+      <w:r>
+        <w:rPr>
+          <w:b/>
+          <w:bCs/>
+        </w:rPr>
+        <w:t xml:space="preserve">shell2018?</w:t>
+      </w:r>
+      <w:r>
+        <w:t xml:space="preserve">,</w:t>
+      </w:r>
+      <w:r>
+        <w:t xml:space="preserve"> </w:t>
+      </w:r>
+      <w:r>
+        <w:rPr>
+          <w:b/>
+          <w:bCs/>
+        </w:rPr>
+        <w:t xml:space="preserve">baselga2012?</w:t>
+      </w:r>
+      <w:r>
+        <w:t xml:space="preserve">,</w:t>
+      </w:r>
+      <w:r>
+        <w:t xml:space="preserve"> </w:t>
+      </w:r>
+      <w:r>
+        <w:rPr>
+          <w:b/>
+          <w:bCs/>
+        </w:rPr>
+        <w:t xml:space="preserve">baselga2010?</w:t>
+      </w:r>
+      <w:r>
+        <w:t xml:space="preserve">,</w:t>
+      </w:r>
+      <w:r>
+        <w:t xml:space="preserve"> </w:t>
+      </w:r>
+      <w:r>
+        <w:rPr>
+          <w:b/>
+          <w:bCs/>
+        </w:rPr>
+        <w:t xml:space="preserve">gering2003?</w:t>
+      </w:r>
+      <w:r>
+        <w:t xml:space="preserve">,</w:t>
+      </w:r>
+      <w:r>
+        <w:t xml:space="preserve"> </w:t>
+      </w:r>
+      <w:r>
+        <w:rPr>
+          <w:b/>
+          <w:bCs/>
+        </w:rPr>
+        <w:t xml:space="preserve">veech2003?</w:t>
+      </w:r>
+      <w:r>
+        <w:t xml:space="preserve">)</w:t>
       </w:r>
     </w:p>
     <w:bookmarkStart w:id="12" w:name="objectives"/>
@@ -308,7 +1302,17 @@
         <w:t xml:space="preserve"> </w:t>
       </w:r>
       <w:r>
-        <w:t xml:space="preserve">Brasil (2000)</w:t>
+        <w:t xml:space="preserve">(</w:t>
+      </w:r>
+      <w:r>
+        <w:rPr>
+          <w:b/>
+          <w:bCs/>
+        </w:rPr>
+        <w:t xml:space="preserve">brasil2000?</w:t>
+      </w:r>
+      <w:r>
+        <w:t xml:space="preserve">)</w:t>
       </w:r>
       <w:r>
         <w:t xml:space="preserve"> </w:t>
@@ -320,7 +1324,17 @@
         <w:t xml:space="preserve"> </w:t>
       </w:r>
       <w:r>
-        <w:t xml:space="preserve">(MMA 2003)</w:t>
+        <w:t xml:space="preserve">(</w:t>
+      </w:r>
+      <w:r>
+        <w:rPr>
+          <w:b/>
+          <w:bCs/>
+        </w:rPr>
+        <w:t xml:space="preserve">mma2003?</w:t>
+      </w:r>
+      <w:r>
+        <w:t xml:space="preserve">)</w:t>
       </w:r>
       <w:r>
         <w:t xml:space="preserve">, and a second one that flows entirely outside of the protected area. Within this framework, we use hierarchical additive partitioning to evaluate the relative contribution of different spatial and temporal scales to the diversity of zooplankton assemblages. Given the importance of the Atlantic Forest to the biodiversity</w:t>
@@ -329,7 +1343,17 @@
         <w:t xml:space="preserve"> </w:t>
       </w:r>
       <w:r>
-        <w:t xml:space="preserve">(Pereira et al. 2026)</w:t>
+        <w:t xml:space="preserve">(</w:t>
+      </w:r>
+      <w:r>
+        <w:rPr>
+          <w:b/>
+          <w:bCs/>
+        </w:rPr>
+        <w:t xml:space="preserve">pereira2026?</w:t>
+      </w:r>
+      <w:r>
+        <w:t xml:space="preserve">)</w:t>
       </w:r>
       <w:r>
         <w:t xml:space="preserve"> </w:t>
@@ -341,7 +1365,17 @@
         <w:t xml:space="preserve"> </w:t>
       </w:r>
       <w:r>
-        <w:t xml:space="preserve">(Silva and Casteleti 2003)</w:t>
+        <w:t xml:space="preserve">(</w:t>
+      </w:r>
+      <w:r>
+        <w:rPr>
+          <w:b/>
+          <w:bCs/>
+        </w:rPr>
+        <w:t xml:space="preserve">silva2003?</w:t>
+      </w:r>
+      <w:r>
+        <w:t xml:space="preserve">)</w:t>
       </w:r>
       <w:r>
         <w:t xml:space="preserve">, we aim with this study, (1) to infer environmental degradation from species turnover</w:t>
@@ -350,7 +1384,17 @@
         <w:t xml:space="preserve"> </w:t>
       </w:r>
       <w:r>
-        <w:t xml:space="preserve">(Baselga 2010)</w:t>
+        <w:t xml:space="preserve">(</w:t>
+      </w:r>
+      <w:r>
+        <w:rPr>
+          <w:b/>
+          <w:bCs/>
+        </w:rPr>
+        <w:t xml:space="preserve">baselga2010?</w:t>
+      </w:r>
+      <w:r>
+        <w:t xml:space="preserve">)</w:t>
       </w:r>
       <w:r>
         <w:t xml:space="preserve"> </w:t>
@@ -399,7 +1443,17 @@
         <w:t xml:space="preserve"> </w:t>
       </w:r>
       <w:r>
-        <w:t xml:space="preserve">(Heinrichs et al. 2017)</w:t>
+        <w:t xml:space="preserve">(</w:t>
+      </w:r>
+      <w:r>
+        <w:rPr>
+          <w:b/>
+          <w:bCs/>
+        </w:rPr>
+        <w:t xml:space="preserve">heinrichs2017?</w:t>
+      </w:r>
+      <w:r>
+        <w:t xml:space="preserve">)</w:t>
       </w:r>
       <w:r>
         <w:t xml:space="preserve">. Other than these, small scale agricultural activities, fishing, and the modification of the natural vegetation for livestock are important anthropogenic pressures that affect the buffer zone of the REBIO</w:t>
@@ -408,7 +1462,30 @@
         <w:t xml:space="preserve"> </w:t>
       </w:r>
       <w:r>
-        <w:t xml:space="preserve">(Arruda et al. 2013, MMA 2026)</w:t>
+        <w:t xml:space="preserve">(</w:t>
+      </w:r>
+      <w:r>
+        <w:rPr>
+          <w:b/>
+          <w:bCs/>
+        </w:rPr>
+        <w:t xml:space="preserve">arruda2013?</w:t>
+      </w:r>
+      <w:r>
+        <w:t xml:space="preserve">,</w:t>
+      </w:r>
+      <w:r>
+        <w:t xml:space="preserve"> </w:t>
+      </w:r>
+      <w:r>
+        <w:rPr>
+          <w:b/>
+          <w:bCs/>
+        </w:rPr>
+        <w:t xml:space="preserve">mma2026?</w:t>
+      </w:r>
+      <w:r>
+        <w:t xml:space="preserve">)</w:t>
       </w:r>
       <w:r>
         <w:t xml:space="preserve">. Other common uses of the soil in the area are, coconut plantations, orchards and subsistence agriculture. These land uses represent important sources of pollution, either through agrochemicals runoff or direct and indirect domestic effluents (such as septic tanks). These nonpoint source pollutants contaminate underground water and create a spatial gradient of environmental disturbance</w:t>
@@ -417,7 +1494,17 @@
         <w:t xml:space="preserve"> </w:t>
       </w:r>
       <w:r>
-        <w:t xml:space="preserve">(Mehla et al. 2026)</w:t>
+        <w:t xml:space="preserve">(</w:t>
+      </w:r>
+      <w:r>
+        <w:rPr>
+          <w:b/>
+          <w:bCs/>
+        </w:rPr>
+        <w:t xml:space="preserve">mehla2026?</w:t>
+      </w:r>
+      <w:r>
+        <w:t xml:space="preserve">)</w:t>
       </w:r>
       <w:r>
         <w:t xml:space="preserve">. Therefore, the mainly rural nature of the land use associated with the management of vegetation, will cause direct impact to aquatic systems, by the siltation of streams and contamination of groundwater. The hydrographic network of the study region is composed predominantly of small catchments containing first- and second-order streams</w:t>
@@ -426,7 +1513,20 @@
         <w:t xml:space="preserve"> </w:t>
       </w:r>
       <w:r>
-        <w:t xml:space="preserve">(Strahler 1957 classification)</w:t>
+        <w:t xml:space="preserve">(</w:t>
+      </w:r>
+      <w:r>
+        <w:rPr>
+          <w:b/>
+          <w:bCs/>
+        </w:rPr>
+        <w:t xml:space="preserve">strahler1957?</w:t>
+      </w:r>
+      <w:r>
+        <w:t xml:space="preserve"> </w:t>
+      </w:r>
+      <w:r>
+        <w:t xml:space="preserve">classification)</w:t>
       </w:r>
       <w:r>
         <w:t xml:space="preserve"> </w:t>
@@ -457,7 +1557,17 @@
         <w:t xml:space="preserve"> </w:t>
       </w:r>
       <w:r>
-        <w:t xml:space="preserve">(Peel et al. 2007)</w:t>
+        <w:t xml:space="preserve">(</w:t>
+      </w:r>
+      <w:r>
+        <w:rPr>
+          <w:b/>
+          <w:bCs/>
+        </w:rPr>
+        <w:t xml:space="preserve">peel2007?</w:t>
+      </w:r>
+      <w:r>
+        <w:t xml:space="preserve">)</w:t>
       </w:r>
       <w:r>
         <w:t xml:space="preserve">, characterized by a mean annual temperature of approximately 25 °C, with maximum temperatures occurring mainly between February and March, during the dry period, as well as by low annual thermal amplitude. Annual precipitation ranges from 1,400 to 1,800 mm, concentrated between March and July, whereas the lowest rainfall levels occur between September and December. In the study area, rainfall is concentrated between March and July, beginning in autumn and extending into winter. This pattern is attributed to the influence of cold air masses from the South Atlantic ocean that affect the region. The hydrographic network is composed of small headwater streams fed by rain</w:t>
@@ -494,7 +1604,17 @@
         <w:t xml:space="preserve"> </w:t>
       </w:r>
       <w:r>
-        <w:t xml:space="preserve">(Frissell et al. 1986)</w:t>
+        <w:t xml:space="preserve">(</w:t>
+      </w:r>
+      <w:r>
+        <w:rPr>
+          <w:b/>
+          <w:bCs/>
+        </w:rPr>
+        <w:t xml:space="preserve">frissell1986?</w:t>
+      </w:r>
+      <w:r>
+        <w:t xml:space="preserve">)</w:t>
       </w:r>
       <w:r>
         <w:t xml:space="preserve">. We also considered a further spatial scale being the upper reaches (portion of the Barro Branco stream within the conservation unit and the Caiana stream before its confluence with the Pipina stream) and the lower reaches (portion of the Barro Branco stream outside the conservation unit and the Caiana stream after its confluence with the Pipina stream) (</w:t>
@@ -544,7 +1664,17 @@
         <w:t xml:space="preserve"> </w:t>
       </w:r>
       <w:r>
-        <w:t xml:space="preserve">Pusey et al. (2004)</w:t>
+        <w:t xml:space="preserve">(</w:t>
+      </w:r>
+      <w:r>
+        <w:rPr>
+          <w:b/>
+          <w:bCs/>
+        </w:rPr>
+        <w:t xml:space="preserve">pusey2004?</w:t>
+      </w:r>
+      <w:r>
+        <w:t xml:space="preserve">)</w:t>
       </w:r>
       <w:r>
         <w:t xml:space="preserve"> </w:t>
@@ -556,7 +1686,17 @@
         <w:t xml:space="preserve"> </w:t>
       </w:r>
       <w:r>
-        <w:t xml:space="preserve">Mugodo et al. (2006)</w:t>
+        <w:t xml:space="preserve">(</w:t>
+      </w:r>
+      <w:r>
+        <w:rPr>
+          <w:b/>
+          <w:bCs/>
+        </w:rPr>
+        <w:t xml:space="preserve">mugodo2006?</w:t>
+      </w:r>
+      <w:r>
+        <w:t xml:space="preserve">)</w:t>
       </w:r>
       <w:r>
         <w:t xml:space="preserve">: physicochemical water quality, stream site morphology, substrate composition, and marginal habitat structure. Water quality was characterized using physical and chemical measurements obtained with portable instruments, including water temperature (°C) and dissolved oxygen concentration (mg/L). Turbidity was subsequently measured in the laboratory with a turbidimeter using water samples collected at each sampling site. Current velocity (m/s) was estimated using the float method, as described by</w:t>
@@ -565,7 +1705,17 @@
         <w:t xml:space="preserve"> </w:t>
       </w:r>
       <w:r>
-        <w:t xml:space="preserve">Maitland (1990)</w:t>
+        <w:t xml:space="preserve">(</w:t>
+      </w:r>
+      <w:r>
+        <w:rPr>
+          <w:b/>
+          <w:bCs/>
+        </w:rPr>
+        <w:t xml:space="preserve">maitland1990?</w:t>
+      </w:r>
+      <w:r>
+        <w:t xml:space="preserve">)</w:t>
       </w:r>
       <w:r>
         <w:t xml:space="preserve">. Morphological characteristics were assessed from three randomly selected transects at each site, where stream width (cm) and water depth (cm) were measured. Bank slope was classified into four categories according to its inclination: 1, ≤ 20°; 2, &gt; 20–30°; 3, &gt; 30–50°; and 4, &gt; 50°. Broader-scale landscape characteristics, including elevation and stream length, were obtained from handheld GPS records and satellite imagery. Substrate composition and the physical structure of marginal habitats were evaluated from 9 to 12 quadrats (1 m²) distributed along the terrestrial-aquatic interface at each sampling site. Within each quadrat, the proportional cover of different substrate categories was visually estimated, including mud, sand, cobbles, fine and coarse gravel and rocks. The same quadrats were used to characterize littoral and submerged habitat features. Recorded habitat components included macrophytes, marginal grasses, leaf litter, attached and filamentous algae, overhanging and submerged vegetation, small and large woody debris, and root masses</w:t>
@@ -591,7 +1741,17 @@
         <w:t xml:space="preserve"> </w:t>
       </w:r>
       <w:r>
-        <w:t xml:space="preserve">(1998)</w:t>
+        <w:t xml:space="preserve">(</w:t>
+      </w:r>
+      <w:r>
+        <w:rPr>
+          <w:b/>
+          <w:bCs/>
+        </w:rPr>
+        <w:t xml:space="preserve">apha1998?</w:t>
+      </w:r>
+      <w:r>
+        <w:t xml:space="preserve">)</w:t>
       </w:r>
       <w:r>
         <w:t xml:space="preserve"> </w:t>
@@ -603,7 +1763,17 @@
         <w:t xml:space="preserve"> </w:t>
       </w:r>
       <w:r>
-        <w:t xml:space="preserve">Mackereth et al. (1978)</w:t>
+        <w:t xml:space="preserve">(</w:t>
+      </w:r>
+      <w:r>
+        <w:rPr>
+          <w:b/>
+          <w:bCs/>
+        </w:rPr>
+        <w:t xml:space="preserve">mackereth1978?</w:t>
+      </w:r>
+      <w:r>
+        <w:t xml:space="preserve">)</w:t>
       </w:r>
       <w:r>
         <w:t xml:space="preserve">.</w:t>
@@ -630,7 +1800,17 @@
         <w:t xml:space="preserve"> </w:t>
       </w:r>
       <w:r>
-        <w:t xml:space="preserve">(EPA 2020)</w:t>
+        <w:t xml:space="preserve">(</w:t>
+      </w:r>
+      <w:r>
+        <w:rPr>
+          <w:b/>
+          <w:bCs/>
+        </w:rPr>
+        <w:t xml:space="preserve">epa2020?</w:t>
+      </w:r>
+      <w:r>
+        <w:t xml:space="preserve">)</w:t>
       </w:r>
       <w:r>
         <w:t xml:space="preserve">. Sucrose was added to the preserved sample to prevent female cladocerans from losing eggs and to minimize carapace distortion</w:t>
@@ -639,7 +1819,17 @@
         <w:t xml:space="preserve"> </w:t>
       </w:r>
       <w:r>
-        <w:t xml:space="preserve">(Haney and Hall 1973)</w:t>
+        <w:t xml:space="preserve">(</w:t>
+      </w:r>
+      <w:r>
+        <w:rPr>
+          <w:b/>
+          <w:bCs/>
+        </w:rPr>
+        <w:t xml:space="preserve">haney1973?</w:t>
+      </w:r>
+      <w:r>
+        <w:t xml:space="preserve">)</w:t>
       </w:r>
       <w:r>
         <w:t xml:space="preserve">. In the laboratory, samples had their zooplankton identified and counted using a Sedgewick–Rafter counting chamber. The analyses focused on representatives of Rotifera, Cladocera, and Copepoda. Taxonomic identification was based on specialized literature and confirmed by specialists. To evaluate whether the sampling effort adequately represented the zooplankton assemblage, species accumulation curves were calculated</w:t>
@@ -648,7 +1838,30 @@
         <w:t xml:space="preserve"> </w:t>
       </w:r>
       <w:r>
-        <w:t xml:space="preserve">(Melo et al. 2014, Lucena et al. 2015)</w:t>
+        <w:t xml:space="preserve">(</w:t>
+      </w:r>
+      <w:r>
+        <w:rPr>
+          <w:b/>
+          <w:bCs/>
+        </w:rPr>
+        <w:t xml:space="preserve">lucena2015?</w:t>
+      </w:r>
+      <w:r>
+        <w:t xml:space="preserve">,</w:t>
+      </w:r>
+      <w:r>
+        <w:t xml:space="preserve"> </w:t>
+      </w:r>
+      <w:r>
+        <w:rPr>
+          <w:b/>
+          <w:bCs/>
+        </w:rPr>
+        <w:t xml:space="preserve">melo2014?</w:t>
+      </w:r>
+      <w:r>
+        <w:t xml:space="preserve">)</w:t>
       </w:r>
       <w:r>
         <w:t xml:space="preserve">.</w:t>
@@ -675,7 +1888,17 @@
         <w:t xml:space="preserve"> </w:t>
       </w:r>
       <w:r>
-        <w:t xml:space="preserve">(Legendre and Legendre 1998)</w:t>
+        <w:t xml:space="preserve">(</w:t>
+      </w:r>
+      <w:r>
+        <w:rPr>
+          <w:b/>
+          <w:bCs/>
+        </w:rPr>
+        <w:t xml:space="preserve">legendre1998?</w:t>
+      </w:r>
+      <w:r>
+        <w:t xml:space="preserve">)</w:t>
       </w:r>
       <w:r>
         <w:t xml:space="preserve">.</w:t>
@@ -692,7 +1915,17 @@
         <w:t xml:space="preserve"> </w:t>
       </w:r>
       <w:r>
-        <w:t xml:space="preserve">(Sokal and Rohlf 1995)</w:t>
+        <w:t xml:space="preserve">(</w:t>
+      </w:r>
+      <w:r>
+        <w:rPr>
+          <w:b/>
+          <w:bCs/>
+        </w:rPr>
+        <w:t xml:space="preserve">sokal1995?</w:t>
+      </w:r>
+      <w:r>
+        <w:t xml:space="preserve">)</w:t>
       </w:r>
       <w:r>
         <w:t xml:space="preserve">. Variables describing sediment composition and marginal habitat structure, expressed as percentages, were relativized by their column totals and subsequently subjected to the arcsine square-root transformation</w:t>
@@ -701,7 +1934,17 @@
         <w:t xml:space="preserve"> </w:t>
       </w:r>
       <w:r>
-        <w:t xml:space="preserve">(McCune and Grace 2002)</w:t>
+        <w:t xml:space="preserve">(</w:t>
+      </w:r>
+      <w:r>
+        <w:rPr>
+          <w:b/>
+          <w:bCs/>
+        </w:rPr>
+        <w:t xml:space="preserve">mccune2002?</w:t>
+      </w:r>
+      <w:r>
+        <w:t xml:space="preserve">)</w:t>
       </w:r>
       <w:r>
         <w:t xml:space="preserve">. PCA was conducted in R using the</w:t>
@@ -725,7 +1968,17 @@
         <w:t xml:space="preserve"> </w:t>
       </w:r>
       <w:r>
-        <w:t xml:space="preserve">(Lê et al. 2008)</w:t>
+        <w:t xml:space="preserve">(</w:t>
+      </w:r>
+      <w:r>
+        <w:rPr>
+          <w:b/>
+          <w:bCs/>
+        </w:rPr>
+        <w:t xml:space="preserve">lê2008?</w:t>
+      </w:r>
+      <w:r>
+        <w:t xml:space="preserve">)</w:t>
       </w:r>
       <w:r>
         <w:t xml:space="preserve">, with all variables centered and standardized to unit variance before analysis. The water quality parameters temperature and dissolved oxygen, and all nutrients were used to characterize differences between streams but were not used in the PCA because they were not measured for both seasons.A Permutational Multivariate Analysis of Variance (PERMANOVA, 999 permutations) was performed to test whether the overall set of environmental variables measured differed across the seasons and streams .</w:t>
@@ -742,7 +1995,30 @@
         <w:t xml:space="preserve"> </w:t>
       </w:r>
       <w:r>
-        <w:t xml:space="preserve">(Gotelli and Colwell 2001, Freiry et al. 2020)</w:t>
+        <w:t xml:space="preserve">(</w:t>
+      </w:r>
+      <w:r>
+        <w:rPr>
+          <w:b/>
+          <w:bCs/>
+        </w:rPr>
+        <w:t xml:space="preserve">gotelli2001?</w:t>
+      </w:r>
+      <w:r>
+        <w:t xml:space="preserve">,</w:t>
+      </w:r>
+      <w:r>
+        <w:t xml:space="preserve"> </w:t>
+      </w:r>
+      <w:r>
+        <w:rPr>
+          <w:b/>
+          <w:bCs/>
+        </w:rPr>
+        <w:t xml:space="preserve">freiry2020?</w:t>
+      </w:r>
+      <w:r>
+        <w:t xml:space="preserve">)</w:t>
       </w:r>
       <w:r>
         <w:t xml:space="preserve">. Community composition and environmental variables were compared among hydrological periods and streams using Permutational Multivariate Analysis of Variance (PERMANOVA), based on a Bray–Curtis dissimilarity matrix</w:t>
@@ -751,7 +2027,30 @@
         <w:t xml:space="preserve"> </w:t>
       </w:r>
       <w:r>
-        <w:t xml:space="preserve">(Anderson and Walsh 2013, Freiry et al. 2020)</w:t>
+        <w:t xml:space="preserve">(</w:t>
+      </w:r>
+      <w:r>
+        <w:rPr>
+          <w:b/>
+          <w:bCs/>
+        </w:rPr>
+        <w:t xml:space="preserve">freiry2020?</w:t>
+      </w:r>
+      <w:r>
+        <w:t xml:space="preserve">,</w:t>
+      </w:r>
+      <w:r>
+        <w:t xml:space="preserve"> </w:t>
+      </w:r>
+      <w:r>
+        <w:rPr>
+          <w:b/>
+          <w:bCs/>
+        </w:rPr>
+        <w:t xml:space="preserve">anderson2013?</w:t>
+      </w:r>
+      <w:r>
+        <w:t xml:space="preserve">)</w:t>
       </w:r>
       <w:r>
         <w:t xml:space="preserve">. The model included the fixed factors Season, Stream and their interaction. The significance of the terms was assessed using 999 random permutations and the</w:t>
@@ -812,7 +2111,20 @@
         <w:t xml:space="preserve"> </w:t>
       </w:r>
       <w:r>
-        <w:t xml:space="preserve">(Belbin and McDonald 1993, Ávila et al. 2011)</w:t>
+        <w:t xml:space="preserve">(Ávila et al. 2011,</w:t>
+      </w:r>
+      <w:r>
+        <w:t xml:space="preserve"> </w:t>
+      </w:r>
+      <w:r>
+        <w:rPr>
+          <w:b/>
+          <w:bCs/>
+        </w:rPr>
+        <w:t xml:space="preserve">belbin1993?</w:t>
+      </w:r>
+      <w:r>
+        <w:t xml:space="preserve">)</w:t>
       </w:r>
       <w:r>
         <w:t xml:space="preserve">, based on Bray-Curtis dissimilarities calculated from the zooplankton density matrix</w:t>
@@ -830,7 +2142,17 @@
         <w:t xml:space="preserve"> </w:t>
       </w:r>
       <w:r>
-        <w:t xml:space="preserve">(Rocha et al. 2012)</w:t>
+        <w:t xml:space="preserve">(</w:t>
+      </w:r>
+      <w:r>
+        <w:rPr>
+          <w:b/>
+          <w:bCs/>
+        </w:rPr>
+        <w:t xml:space="preserve">rocha2012?</w:t>
+      </w:r>
+      <w:r>
+        <w:t xml:space="preserve">)</w:t>
       </w:r>
       <w:r>
         <w:t xml:space="preserve">. To focus on spatial variation across sampling sites, habitat density data were pooled for this analysis.</w:t>
@@ -848,7 +2170,43 @@
         <w:t xml:space="preserve"> </w:t>
       </w:r>
       <w:r>
-        <w:t xml:space="preserve">(Sokal and Rohlf 1962, Sneath and Sokal 1973, Saraçli et al. 2013)</w:t>
+        <w:t xml:space="preserve">(</w:t>
+      </w:r>
+      <w:r>
+        <w:rPr>
+          <w:b/>
+          <w:bCs/>
+        </w:rPr>
+        <w:t xml:space="preserve">sneath1973?</w:t>
+      </w:r>
+      <w:r>
+        <w:t xml:space="preserve">,</w:t>
+      </w:r>
+      <w:r>
+        <w:t xml:space="preserve"> </w:t>
+      </w:r>
+      <w:r>
+        <w:rPr>
+          <w:b/>
+          <w:bCs/>
+        </w:rPr>
+        <w:t xml:space="preserve">sokal1962?</w:t>
+      </w:r>
+      <w:r>
+        <w:t xml:space="preserve">,</w:t>
+      </w:r>
+      <w:r>
+        <w:t xml:space="preserve"> </w:t>
+      </w:r>
+      <w:r>
+        <w:rPr>
+          <w:b/>
+          <w:bCs/>
+        </w:rPr>
+        <w:t xml:space="preserve">saraçli2013?</w:t>
+      </w:r>
+      <w:r>
+        <w:t xml:space="preserve">)</w:t>
       </w:r>
       <w:r>
         <w:t xml:space="preserve">, where a cophenetic matrix was constructed from each seasonal dendrogram using the</w:t>
@@ -888,7 +2246,17 @@
         <w:t xml:space="preserve"> </w:t>
       </w:r>
       <w:r>
-        <w:t xml:space="preserve">(Oksanen et al. 2020)</w:t>
+        <w:t xml:space="preserve">(</w:t>
+      </w:r>
+      <w:r>
+        <w:rPr>
+          <w:b/>
+          <w:bCs/>
+        </w:rPr>
+        <w:t xml:space="preserve">oksanen2020?</w:t>
+      </w:r>
+      <w:r>
+        <w:t xml:space="preserve">)</w:t>
       </w:r>
       <w:r>
         <w:t xml:space="preserve"> </w:t>
@@ -900,7 +2268,43 @@
         <w:t xml:space="preserve"> </w:t>
       </w:r>
       <w:r>
-        <w:t xml:space="preserve">(Sokal and Rohlf 1962, Farris 1969, Silva and Dias 2013)</w:t>
+        <w:t xml:space="preserve">(</w:t>
+      </w:r>
+      <w:r>
+        <w:rPr>
+          <w:b/>
+          <w:bCs/>
+        </w:rPr>
+        <w:t xml:space="preserve">farris1969?</w:t>
+      </w:r>
+      <w:r>
+        <w:t xml:space="preserve">,</w:t>
+      </w:r>
+      <w:r>
+        <w:t xml:space="preserve"> </w:t>
+      </w:r>
+      <w:r>
+        <w:rPr>
+          <w:b/>
+          <w:bCs/>
+        </w:rPr>
+        <w:t xml:space="preserve">silva2013?</w:t>
+      </w:r>
+      <w:r>
+        <w:t xml:space="preserve">,</w:t>
+      </w:r>
+      <w:r>
+        <w:t xml:space="preserve"> </w:t>
+      </w:r>
+      <w:r>
+        <w:rPr>
+          <w:b/>
+          <w:bCs/>
+        </w:rPr>
+        <w:t xml:space="preserve">sokal1962?</w:t>
+      </w:r>
+      <w:r>
+        <w:t xml:space="preserve">)</w:t>
       </w:r>
       <w:r>
         <w:t xml:space="preserve">. To evaluate the strength of the hierarchical clustering structure obtained from the UPGMA dendrograms, the Agglomerative Coefficient (AC) was calculated for each season using the</w:t>
@@ -940,7 +2344,30 @@
         <w:t xml:space="preserve"> </w:t>
       </w:r>
       <w:r>
-        <w:t xml:space="preserve">(Kaufman and Rousseeuw 1990, Maechler et al. 2026)</w:t>
+        <w:t xml:space="preserve">(</w:t>
+      </w:r>
+      <w:r>
+        <w:rPr>
+          <w:b/>
+          <w:bCs/>
+        </w:rPr>
+        <w:t xml:space="preserve">maechler2026?</w:t>
+      </w:r>
+      <w:r>
+        <w:t xml:space="preserve">,</w:t>
+      </w:r>
+      <w:r>
+        <w:t xml:space="preserve"> </w:t>
+      </w:r>
+      <w:r>
+        <w:rPr>
+          <w:b/>
+          <w:bCs/>
+        </w:rPr>
+        <w:t xml:space="preserve">kaufman1990?</w:t>
+      </w:r>
+      <w:r>
+        <w:t xml:space="preserve">)</w:t>
       </w:r>
       <w:r>
         <w:t xml:space="preserve">. The AC ranges from 0 to 1, where values closer to 1 indicate a strong, well-defined clustering structure and values near 0 reflect weak or indistinct grouping.</w:t>
@@ -973,7 +2400,30 @@
         <w:t xml:space="preserve"> </w:t>
       </w:r>
       <w:r>
-        <w:t xml:space="preserve">(Lande 1996, Crist et al. 2003)</w:t>
+        <w:t xml:space="preserve">(</w:t>
+      </w:r>
+      <w:r>
+        <w:rPr>
+          <w:b/>
+          <w:bCs/>
+        </w:rPr>
+        <w:t xml:space="preserve">lande1996?</w:t>
+      </w:r>
+      <w:r>
+        <w:t xml:space="preserve">,</w:t>
+      </w:r>
+      <w:r>
+        <w:t xml:space="preserve"> </w:t>
+      </w:r>
+      <w:r>
+        <w:rPr>
+          <w:b/>
+          <w:bCs/>
+        </w:rPr>
+        <w:t xml:space="preserve">crist2003?</w:t>
+      </w:r>
+      <w:r>
+        <w:t xml:space="preserve">)</w:t>
       </w:r>
       <w:r>
         <w:t xml:space="preserve">. The hierarchical structure included three spatial scales. The finest scales consisted of the habitat samples within each site (n = 3), and of each site (n = 6, for the Barro Branco stream, and n = 9, for the Caiana stream). The intermediate scales corresponded to the upper and lower stream sections (n = 2), whereas the broadest scale represented differences among the two streams. Accordingly, the total diversity (</w:t>
@@ -1058,7 +2508,30 @@
         <w:t xml:space="preserve"> </w:t>
       </w:r>
       <w:r>
-        <w:t xml:space="preserve">(Crist et al. 2003, Farias et al. 2020)</w:t>
+        <w:t xml:space="preserve">(</w:t>
+      </w:r>
+      <w:r>
+        <w:rPr>
+          <w:b/>
+          <w:bCs/>
+        </w:rPr>
+        <w:t xml:space="preserve">crist2003?</w:t>
+      </w:r>
+      <w:r>
+        <w:t xml:space="preserve">,</w:t>
+      </w:r>
+      <w:r>
+        <w:t xml:space="preserve"> </w:t>
+      </w:r>
+      <w:r>
+        <w:rPr>
+          <w:b/>
+          <w:bCs/>
+        </w:rPr>
+        <w:t xml:space="preserve">farias2020?</w:t>
+      </w:r>
+      <w:r>
+        <w:t xml:space="preserve">)</w:t>
       </w:r>
       <w:r>
         <w:t xml:space="preserve">. To investigate seasonal variation in the hierarchical structure of diversity, additive partitioning was performed separately for each season and for each stream</w:t>
@@ -1067,7 +2540,30 @@
         <w:t xml:space="preserve"> </w:t>
       </w:r>
       <w:r>
-        <w:t xml:space="preserve">(Melo and Medeiros 2013, Farias et al. 2020)</w:t>
+        <w:t xml:space="preserve">(</w:t>
+      </w:r>
+      <w:r>
+        <w:rPr>
+          <w:b/>
+          <w:bCs/>
+        </w:rPr>
+        <w:t xml:space="preserve">farias2020?</w:t>
+      </w:r>
+      <w:r>
+        <w:t xml:space="preserve">,</w:t>
+      </w:r>
+      <w:r>
+        <w:t xml:space="preserve"> </w:t>
+      </w:r>
+      <w:r>
+        <w:rPr>
+          <w:b/>
+          <w:bCs/>
+        </w:rPr>
+        <w:t xml:space="preserve">melo2013?</w:t>
+      </w:r>
+      <w:r>
+        <w:t xml:space="preserve">)</w:t>
       </w:r>
       <w:r>
         <w:t xml:space="preserve">.</w:t>
@@ -1084,7 +2580,33 @@
         <w:t xml:space="preserve"> </w:t>
       </w:r>
       <w:r>
-        <w:t xml:space="preserve">(see Freiry et al. 2020, Melo and Medeiros 2013)</w:t>
+        <w:t xml:space="preserve">(see</w:t>
+      </w:r>
+      <w:r>
+        <w:t xml:space="preserve"> </w:t>
+      </w:r>
+      <w:r>
+        <w:rPr>
+          <w:b/>
+          <w:bCs/>
+        </w:rPr>
+        <w:t xml:space="preserve">freiry2020?</w:t>
+      </w:r>
+      <w:r>
+        <w:t xml:space="preserve">,</w:t>
+      </w:r>
+      <w:r>
+        <w:t xml:space="preserve"> </w:t>
+      </w:r>
+      <w:r>
+        <w:rPr>
+          <w:b/>
+          <w:bCs/>
+        </w:rPr>
+        <w:t xml:space="preserve">melo2013?</w:t>
+      </w:r>
+      <w:r>
+        <w:t xml:space="preserve">)</w:t>
       </w:r>
       <w:r>
         <w:t xml:space="preserve">. The randomization process was repeated 999 times to obtain null distributions of the</w:t>
@@ -1121,7 +2643,17 @@
         <w:t xml:space="preserve"> </w:t>
       </w:r>
       <w:r>
-        <w:t xml:space="preserve">(Crist et al. 2003)</w:t>
+        <w:t xml:space="preserve">(</w:t>
+      </w:r>
+      <w:r>
+        <w:rPr>
+          <w:b/>
+          <w:bCs/>
+        </w:rPr>
+        <w:t xml:space="preserve">crist2003?</w:t>
+      </w:r>
+      <w:r>
+        <w:t xml:space="preserve">)</w:t>
       </w:r>
       <w:r>
         <w:t xml:space="preserve">. The probabilities obtained from randomization tests were interpreted as</w:t>
@@ -1297,7 +2829,56 @@
         <w:t xml:space="preserve"> </w:t>
       </w:r>
       <w:r>
-        <w:t xml:space="preserve">(Veech et al. 2002, Gering et al. 2003, Crist et al. 2003, Freiry et al. 2020)</w:t>
+        <w:t xml:space="preserve">(</w:t>
+      </w:r>
+      <w:r>
+        <w:rPr>
+          <w:b/>
+          <w:bCs/>
+        </w:rPr>
+        <w:t xml:space="preserve">crist2003?</w:t>
+      </w:r>
+      <w:r>
+        <w:t xml:space="preserve">,</w:t>
+      </w:r>
+      <w:r>
+        <w:t xml:space="preserve"> </w:t>
+      </w:r>
+      <w:r>
+        <w:rPr>
+          <w:b/>
+          <w:bCs/>
+        </w:rPr>
+        <w:t xml:space="preserve">freiry2020?</w:t>
+      </w:r>
+      <w:r>
+        <w:t xml:space="preserve">,</w:t>
+      </w:r>
+      <w:r>
+        <w:t xml:space="preserve"> </w:t>
+      </w:r>
+      <w:r>
+        <w:rPr>
+          <w:b/>
+          <w:bCs/>
+        </w:rPr>
+        <w:t xml:space="preserve">gering2003?</w:t>
+      </w:r>
+      <w:r>
+        <w:t xml:space="preserve">,</w:t>
+      </w:r>
+      <w:r>
+        <w:t xml:space="preserve"> </w:t>
+      </w:r>
+      <w:r>
+        <w:rPr>
+          <w:b/>
+          <w:bCs/>
+        </w:rPr>
+        <w:t xml:space="preserve">veech2002?</w:t>
+      </w:r>
+      <w:r>
+        <w:t xml:space="preserve">)</w:t>
       </w:r>
       <w:r>
         <w:t xml:space="preserve">. The results of the analysis were subject to a Monte Carlo permutation test (999 permutations) for validation. The additive partitioning of the diversity was carried out with the function</w:t>
@@ -1331,7 +2912,17 @@
         <w:t xml:space="preserve"> </w:t>
       </w:r>
       <w:r>
-        <w:t xml:space="preserve">(Oksanen et al. n.d.)</w:t>
+        <w:t xml:space="preserve">(</w:t>
+      </w:r>
+      <w:r>
+        <w:rPr>
+          <w:b/>
+          <w:bCs/>
+        </w:rPr>
+        <w:t xml:space="preserve">oksanen?</w:t>
+      </w:r>
+      <w:r>
+        <w:t xml:space="preserve">)</w:t>
       </w:r>
       <w:r>
         <w:t xml:space="preserve">. All analyses were conducted in the statistical environment R</w:t>
@@ -1340,7 +2931,17 @@
         <w:t xml:space="preserve"> </w:t>
       </w:r>
       <w:r>
-        <w:t xml:space="preserve">(R Core Team 2017)</w:t>
+        <w:t xml:space="preserve">(</w:t>
+      </w:r>
+      <w:r>
+        <w:rPr>
+          <w:b/>
+          <w:bCs/>
+        </w:rPr>
+        <w:t xml:space="preserve">rcoreteam2017?</w:t>
+      </w:r>
+      <w:r>
+        <w:t xml:space="preserve">)</w:t>
       </w:r>
       <w:r>
         <w:t xml:space="preserve">.</w:t>
@@ -3287,14 +4888,24 @@
         <w:t xml:space="preserve"> </w:t>
       </w:r>
       <w:r>
-        <w:t xml:space="preserve">(CNPq 2026)</w:t>
+        <w:t xml:space="preserve">(</w:t>
+      </w:r>
+      <w:r>
+        <w:rPr>
+          <w:b/>
+          <w:bCs/>
+        </w:rPr>
+        <w:t xml:space="preserve">cnpq2026?</w:t>
+      </w:r>
+      <w:r>
+        <w:t xml:space="preserve">)</w:t>
       </w:r>
       <w:r>
         <w:t xml:space="preserve">.</w:t>
       </w:r>
     </w:p>
     <w:bookmarkEnd w:id="25"/>
-    <w:bookmarkStart w:id="127" w:name="references"/>
+    <w:bookmarkStart w:id="53" w:name="references"/>
     <w:p>
       <w:pPr>
         <w:pStyle w:val="Heading1"/>
@@ -3303,91 +4914,19 @@
         <w:t xml:space="preserve">References</w:t>
       </w:r>
     </w:p>
-    <w:bookmarkStart w:id="126" w:name="refs"/>
-    <w:bookmarkStart w:id="27" w:name="ref-anderson2013"/>
+    <w:bookmarkStart w:id="52" w:name="refs"/>
+    <w:bookmarkStart w:id="27" w:name="ref-ávila2011"/>
     <w:p>
       <w:pPr>
         <w:pStyle w:val="Bibliography"/>
       </w:pPr>
       <w:r>
-        <w:t xml:space="preserve">Anderson, M. J., and D. C. I. Walsh. 2013.</w:t>
+        <w:t xml:space="preserve">Ávila, A. C., C. Stenert, and L. Maltchik. 2011.</w:t>
       </w:r>
       <w:r>
         <w:t xml:space="preserve"> </w:t>
       </w:r>
       <w:hyperlink r:id="rId26">
-        <w:r>
-          <w:rPr>
-            <w:rStyle w:val="Hyperlink"/>
-          </w:rPr>
-          <w:t xml:space="preserve">PERMANOVA, ANOSIM, and the mantel test in the face of heterogeneous dispersions: What null hypothesis are you testing?</w:t>
-        </w:r>
-      </w:hyperlink>
-      <w:r>
-        <w:t xml:space="preserve"> Ecological Monographs 83:557574.</w:t>
-      </w:r>
-    </w:p>
-    <w:bookmarkEnd w:id="27"/>
-    <w:bookmarkStart w:id="29" w:name="ref-apha1998"/>
-    <w:p>
-      <w:pPr>
-        <w:pStyle w:val="Bibliography"/>
-      </w:pPr>
-      <w:r>
-        <w:t xml:space="preserve">APHA. 1998.</w:t>
-      </w:r>
-      <w:r>
-        <w:t xml:space="preserve"> </w:t>
-      </w:r>
-      <w:hyperlink r:id="rId28">
-        <w:r>
-          <w:rPr>
-            <w:rStyle w:val="Hyperlink"/>
-          </w:rPr>
-          <w:t xml:space="preserve">Standard methods for the examination of water and wastewater</w:t>
-        </w:r>
-      </w:hyperlink>
-      <w:r>
-        <w:t xml:space="preserve">. Washington, DC.</w:t>
-      </w:r>
-    </w:p>
-    <w:bookmarkEnd w:id="29"/>
-    <w:bookmarkStart w:id="31" w:name="ref-arruda2013"/>
-    <w:p>
-      <w:pPr>
-        <w:pStyle w:val="Bibliography"/>
-      </w:pPr>
-      <w:r>
-        <w:t xml:space="preserve">Arruda, D. B., B. P. Cunha, and K. M. C. Rêgo. 2013.</w:t>
-      </w:r>
-      <w:r>
-        <w:t xml:space="preserve"> </w:t>
-      </w:r>
-      <w:hyperlink r:id="rId30">
-        <w:r>
-          <w:rPr>
-            <w:rStyle w:val="Hyperlink"/>
-          </w:rPr>
-          <w:t xml:space="preserve">Conflitos entre REBIO Guaribas e comunidades locais: (in)justiça ambiental e ecologia política</w:t>
-        </w:r>
-      </w:hyperlink>
-      <w:r>
-        <w:t xml:space="preserve">. Revista Direitos Emergentes na Sociedade Global 2:280–304.</w:t>
-      </w:r>
-    </w:p>
-    <w:bookmarkEnd w:id="31"/>
-    <w:bookmarkStart w:id="33" w:name="ref-ávila2011"/>
-    <w:p>
-      <w:pPr>
-        <w:pStyle w:val="Bibliography"/>
-      </w:pPr>
-      <w:r>
-        <w:t xml:space="preserve">Ávila, A. C., C. Stenert, and L. Maltchik. 2011.</w:t>
-      </w:r>
-      <w:r>
-        <w:t xml:space="preserve"> </w:t>
-      </w:r>
-      <w:hyperlink r:id="rId32">
         <w:r>
           <w:rPr>
             <w:rStyle w:val="Hyperlink"/>
@@ -3399,136 +4938,43 @@
         <w:t xml:space="preserve">. Wetlands 31:459–469.</w:t>
       </w:r>
     </w:p>
-    <w:bookmarkEnd w:id="33"/>
-    <w:bookmarkStart w:id="35" w:name="ref-baselga2010"/>
+    <w:bookmarkEnd w:id="27"/>
+    <w:bookmarkStart w:id="29" w:name="ref-barboza2024"/>
     <w:p>
       <w:pPr>
         <w:pStyle w:val="Bibliography"/>
       </w:pPr>
       <w:r>
-        <w:t xml:space="preserve">Baselga, A. 2010.</w:t>
+        <w:t xml:space="preserve">Barboza, A. C. G., V. Tagliacollo, and G. B. Jacobucci. 2024.</w:t>
       </w:r>
       <w:r>
         <w:t xml:space="preserve"> </w:t>
       </w:r>
-      <w:hyperlink r:id="rId34">
+      <w:hyperlink r:id="rId28">
         <w:r>
           <w:rPr>
             <w:rStyle w:val="Hyperlink"/>
           </w:rPr>
-          <w:t xml:space="preserve">Partitioning the turnover and nestedness components of beta diversity</w:t>
+          <w:t xml:space="preserve">Influence of seasonal hydrological regimes on benthic macroinvertebrates in two the brazilian biodiversity hotspots</w:t>
         </w:r>
       </w:hyperlink>
       <w:r>
-        <w:t xml:space="preserve">. Global Ecology and Biogeography 19:134–143.</w:t>
+        <w:t xml:space="preserve">. Limnologica 106:126170.</w:t>
       </w:r>
     </w:p>
-    <w:bookmarkEnd w:id="35"/>
-    <w:bookmarkStart w:id="37" w:name="ref-baselga2012"/>
+    <w:bookmarkEnd w:id="29"/>
+    <w:bookmarkStart w:id="31" w:name="ref-credit2026"/>
     <w:p>
       <w:pPr>
         <w:pStyle w:val="Bibliography"/>
       </w:pPr>
       <w:r>
-        <w:t xml:space="preserve">Baselga, A. 2012.</w:t>
+        <w:t xml:space="preserve">CRediT. 2026.</w:t>
       </w:r>
       <w:r>
         <w:t xml:space="preserve"> </w:t>
       </w:r>
-      <w:hyperlink r:id="rId36">
-        <w:r>
-          <w:rPr>
-            <w:rStyle w:val="Hyperlink"/>
-          </w:rPr>
-          <w:t xml:space="preserve">The relationship between species replacement, dissimilarity derived from nestedness, and nestedness</w:t>
-        </w:r>
-      </w:hyperlink>
-      <w:r>
-        <w:t xml:space="preserve">. Global Ecology and Biogeography 21:1223–1232.</w:t>
-      </w:r>
-    </w:p>
-    <w:bookmarkEnd w:id="37"/>
-    <w:bookmarkStart w:id="39" w:name="ref-belbin1993"/>
-    <w:p>
-      <w:pPr>
-        <w:pStyle w:val="Bibliography"/>
-      </w:pPr>
-      <w:r>
-        <w:t xml:space="preserve">Belbin, L., and C. McDonald. 1993.</w:t>
-      </w:r>
-      <w:r>
-        <w:t xml:space="preserve"> </w:t>
-      </w:r>
-      <w:hyperlink r:id="rId38">
-        <w:r>
-          <w:rPr>
-            <w:rStyle w:val="Hyperlink"/>
-          </w:rPr>
-          <w:t xml:space="preserve">Comparing three classification strategies for use in ecology</w:t>
-        </w:r>
-      </w:hyperlink>
-      <w:r>
-        <w:t xml:space="preserve">. Journal of Vegetation Science 4:341–348.</w:t>
-      </w:r>
-    </w:p>
-    <w:bookmarkEnd w:id="39"/>
-    <w:bookmarkStart w:id="41" w:name="ref-brasil2000"/>
-    <w:p>
-      <w:pPr>
-        <w:pStyle w:val="Bibliography"/>
-      </w:pPr>
-      <w:r>
-        <w:t xml:space="preserve">Brasil. 2000.</w:t>
-      </w:r>
-      <w:r>
-        <w:t xml:space="preserve"> </w:t>
-      </w:r>
-      <w:hyperlink r:id="rId40">
-        <w:r>
-          <w:rPr>
-            <w:rStyle w:val="Hyperlink"/>
-          </w:rPr>
-          <w:t xml:space="preserve">Lei no 9.985, de 18 de julho de 2000. Regulamenta o art. 225, § 1o, incisos i, II, III e VII da constituição federal, institui o sistema nacional de unidades de conservação da natureza e dá outras providências.</w:t>
-        </w:r>
-      </w:hyperlink>
-    </w:p>
-    <w:bookmarkEnd w:id="41"/>
-    <w:bookmarkStart w:id="43" w:name="ref-cnpq2026"/>
-    <w:p>
-      <w:pPr>
-        <w:pStyle w:val="Bibliography"/>
-      </w:pPr>
-      <w:r>
-        <w:t xml:space="preserve">CNPq. 2026.</w:t>
-      </w:r>
-      <w:r>
-        <w:t xml:space="preserve"> </w:t>
-      </w:r>
-      <w:hyperlink r:id="rId42">
-        <w:r>
-          <w:rPr>
-            <w:rStyle w:val="Hyperlink"/>
-          </w:rPr>
-          <w:t xml:space="preserve">Portaria 2664/2026 de 6 de março de 2026 - política de integridade na atividade científica do CNPq</w:t>
-        </w:r>
-      </w:hyperlink>
-      <w:r>
-        <w:t xml:space="preserve">.</w:t>
-      </w:r>
-    </w:p>
-    <w:bookmarkEnd w:id="43"/>
-    <w:bookmarkStart w:id="45" w:name="ref-credit2026"/>
-    <w:p>
-      <w:pPr>
-        <w:pStyle w:val="Bibliography"/>
-      </w:pPr>
-      <w:r>
-        <w:t xml:space="preserve">CRediT. 2026.</w:t>
-      </w:r>
-      <w:r>
-        <w:t xml:space="preserve"> </w:t>
-      </w:r>
-      <w:hyperlink r:id="rId44">
+      <w:hyperlink r:id="rId30">
         <w:r>
           <w:rPr>
             <w:rStyle w:val="Hyperlink"/>
@@ -3537,220 +4983,46 @@
         </w:r>
       </w:hyperlink>
       <w:r>
-        <w:t xml:space="preserve">.</w:t>
+        <w:t xml:space="preserve">. NISO/CRediT Standing Committee.</w:t>
       </w:r>
     </w:p>
-    <w:bookmarkEnd w:id="45"/>
-    <w:bookmarkStart w:id="47" w:name="ref-crist2003"/>
+    <w:bookmarkEnd w:id="31"/>
+    <w:bookmarkStart w:id="33" w:name="ref-fonseca1985"/>
     <w:p>
       <w:pPr>
         <w:pStyle w:val="Bibliography"/>
       </w:pPr>
       <w:r>
-        <w:t xml:space="preserve">Crist, Thomas O., Joseph A. Veech, Jon C. Gering, and Keith S. Summerville. 2003.</w:t>
+        <w:t xml:space="preserve">Fonseca, G. A. B. 1985.</w:t>
       </w:r>
       <w:r>
         <w:t xml:space="preserve"> </w:t>
       </w:r>
-      <w:hyperlink r:id="rId46">
+      <w:hyperlink r:id="rId32">
         <w:r>
           <w:rPr>
             <w:rStyle w:val="Hyperlink"/>
           </w:rPr>
-          <w:t xml:space="preserve">Partitioning species diversity across landscapes and regions: A hierarchical analysis of α, β, and γ diversity</w:t>
+          <w:t xml:space="preserve">The vanishing brazilian atlantic forest</w:t>
         </w:r>
       </w:hyperlink>
       <w:r>
-        <w:t xml:space="preserve">. The American Naturalist 162:734–743.</w:t>
+        <w:t xml:space="preserve">. Biological Conservation 34:17–34.</w:t>
       </w:r>
     </w:p>
-    <w:bookmarkEnd w:id="47"/>
-    <w:bookmarkStart w:id="49" w:name="ref-epa2020"/>
+    <w:bookmarkEnd w:id="33"/>
+    <w:bookmarkStart w:id="35" w:name="ref-gouveia2017"/>
     <w:p>
       <w:pPr>
         <w:pStyle w:val="Bibliography"/>
       </w:pPr>
       <w:r>
-        <w:t xml:space="preserve">EPA. 2020.</w:t>
+        <w:t xml:space="preserve">Gouveia, R. S. D., G. L. D. A. Lira, T. P. Anselmo Ramos, and E. S. F. Medeiros. 2017.</w:t>
       </w:r>
       <w:r>
         <w:t xml:space="preserve"> </w:t>
       </w:r>
-      <w:hyperlink r:id="rId48">
-        <w:r>
-          <w:rPr>
-            <w:rStyle w:val="Hyperlink"/>
-          </w:rPr>
-          <w:t xml:space="preserve">Standard operating procedure for zooplankton sample collection and preservation</w:t>
-        </w:r>
-      </w:hyperlink>
-      <w:r>
-        <w:t xml:space="preserve">.</w:t>
-      </w:r>
-    </w:p>
-    <w:bookmarkEnd w:id="49"/>
-    <w:bookmarkStart w:id="51" w:name="ref-farias2020"/>
-    <w:p>
-      <w:pPr>
-        <w:pStyle w:val="Bibliography"/>
-      </w:pPr>
-      <w:r>
-        <w:t xml:space="preserve">Farias, R. L., C. Stenert, L. Maltchik, and E. S. F. Medeiros. 2020.</w:t>
-      </w:r>
-      <w:r>
-        <w:t xml:space="preserve"> </w:t>
-      </w:r>
-      <w:hyperlink r:id="rId50">
-        <w:r>
-          <w:rPr>
-            <w:rStyle w:val="Hyperlink"/>
-          </w:rPr>
-          <w:t xml:space="preserve">Partitioning of macroinvertebrate assemblages across temporary pools in an intermittent dryland river</w:t>
-        </w:r>
-      </w:hyperlink>
-      <w:r>
-        <w:t xml:space="preserve">. Inland Waters 10:480–492.</w:t>
-      </w:r>
-    </w:p>
-    <w:bookmarkEnd w:id="51"/>
-    <w:bookmarkStart w:id="53" w:name="ref-farris1969"/>
-    <w:p>
-      <w:pPr>
-        <w:pStyle w:val="Bibliography"/>
-      </w:pPr>
-      <w:r>
-        <w:t xml:space="preserve">Farris, J. S. 1969.</w:t>
-      </w:r>
-      <w:r>
-        <w:t xml:space="preserve"> </w:t>
-      </w:r>
-      <w:hyperlink r:id="rId52">
-        <w:r>
-          <w:rPr>
-            <w:rStyle w:val="Hyperlink"/>
-          </w:rPr>
-          <w:t xml:space="preserve">On the cophenetic correlation coefficient</w:t>
-        </w:r>
-      </w:hyperlink>
-      <w:r>
-        <w:t xml:space="preserve">. Systematic Zoology 18:279.</w:t>
-      </w:r>
-    </w:p>
-    <w:bookmarkEnd w:id="53"/>
-    <w:bookmarkStart w:id="55" w:name="ref-freiry2020"/>
-    <w:p>
-      <w:pPr>
-        <w:pStyle w:val="Bibliography"/>
-      </w:pPr>
-      <w:r>
-        <w:t xml:space="preserve">Freiry, R. F., V. Weber, C. C. Bonecker, F. A. Lansac-Tôha, M. M. Pires, C. Stenert, and L. Maltchik. 2020.</w:t>
-      </w:r>
-      <w:r>
-        <w:t xml:space="preserve"> </w:t>
-      </w:r>
-      <w:hyperlink r:id="rId54">
-        <w:r>
-          <w:rPr>
-            <w:rStyle w:val="Hyperlink"/>
-          </w:rPr>
-          <w:t xml:space="preserve">Additive partitioning of the diversity of the dormant zooplankton communities in intermittent ponds along a forest</w:t>
-        </w:r>
-        <w:r>
-          <w:rPr>
-            <w:rStyle w:val="Hyperlink"/>
-          </w:rPr>
-          <w:t xml:space="preserve">grassland transition</w:t>
-        </w:r>
-      </w:hyperlink>
-      <w:r>
-        <w:t xml:space="preserve">. Hydrobiologia 847:1327–1342.</w:t>
-      </w:r>
-    </w:p>
-    <w:bookmarkEnd w:id="55"/>
-    <w:bookmarkStart w:id="57" w:name="ref-frissell1986"/>
-    <w:p>
-      <w:pPr>
-        <w:pStyle w:val="Bibliography"/>
-      </w:pPr>
-      <w:r>
-        <w:t xml:space="preserve">Frissell, C. A., W. J. Liss, C. E. Warren, and M. D. Hurley. 1986.</w:t>
-      </w:r>
-      <w:r>
-        <w:t xml:space="preserve"> </w:t>
-      </w:r>
-      <w:hyperlink r:id="rId56">
-        <w:r>
-          <w:rPr>
-            <w:rStyle w:val="Hyperlink"/>
-          </w:rPr>
-          <w:t xml:space="preserve">A hierarchical framework for stream habitat classification: Viewing streams in a watershed context</w:t>
-        </w:r>
-      </w:hyperlink>
-      <w:r>
-        <w:t xml:space="preserve">. Environmental Management 10:199–214.</w:t>
-      </w:r>
-    </w:p>
-    <w:bookmarkEnd w:id="57"/>
-    <w:bookmarkStart w:id="59" w:name="ref-gering2003"/>
-    <w:p>
-      <w:pPr>
-        <w:pStyle w:val="Bibliography"/>
-      </w:pPr>
-      <w:r>
-        <w:t xml:space="preserve">Gering, J. C., T. O. Crist, and J. A. Veech. 2003.</w:t>
-      </w:r>
-      <w:r>
-        <w:t xml:space="preserve"> </w:t>
-      </w:r>
-      <w:hyperlink r:id="rId58">
-        <w:r>
-          <w:rPr>
-            <w:rStyle w:val="Hyperlink"/>
-          </w:rPr>
-          <w:t xml:space="preserve">Additive partitioning of species diversity across multiple spatial scales: Implications for regional conservation of biodiversity</w:t>
-        </w:r>
-      </w:hyperlink>
-      <w:r>
-        <w:t xml:space="preserve">. Conservation Biology 17:488–499.</w:t>
-      </w:r>
-    </w:p>
-    <w:bookmarkEnd w:id="59"/>
-    <w:bookmarkStart w:id="61" w:name="ref-gotelli2001"/>
-    <w:p>
-      <w:pPr>
-        <w:pStyle w:val="Bibliography"/>
-      </w:pPr>
-      <w:r>
-        <w:t xml:space="preserve">Gotelli, N. J., and R. K. Colwell. 2001.</w:t>
-      </w:r>
-      <w:r>
-        <w:t xml:space="preserve"> </w:t>
-      </w:r>
-      <w:hyperlink r:id="rId60">
-        <w:r>
-          <w:rPr>
-            <w:rStyle w:val="Hyperlink"/>
-          </w:rPr>
-          <w:t xml:space="preserve">Quantifying biodiversity: Procedures and pitfalls in the measurement and comparison of species richness</w:t>
-        </w:r>
-      </w:hyperlink>
-      <w:r>
-        <w:t xml:space="preserve">. Ecology Letters 4:379–391.</w:t>
-      </w:r>
-    </w:p>
-    <w:bookmarkEnd w:id="61"/>
-    <w:bookmarkStart w:id="63" w:name="ref-gouveia2017"/>
-    <w:p>
-      <w:pPr>
-        <w:pStyle w:val="Bibliography"/>
-      </w:pPr>
-      <w:r>
-        <w:t xml:space="preserve">Gouveia, R. S. D., G. L. D. A. Lira, T. P. A. Ramos, and E. S. F. Medeiros. 2017.</w:t>
-      </w:r>
-      <w:r>
-        <w:t xml:space="preserve"> </w:t>
-      </w:r>
-      <w:hyperlink r:id="rId62">
+      <w:hyperlink r:id="rId34">
         <w:r>
           <w:rPr>
             <w:rStyle w:val="Hyperlink"/>
@@ -3762,24 +5034,24 @@
         <w:t xml:space="preserve">. Check List 13:581–590.</w:t>
       </w:r>
     </w:p>
-    <w:bookmarkEnd w:id="63"/>
-    <w:bookmarkStart w:id="65" w:name="ref-haney1973"/>
+    <w:bookmarkEnd w:id="35"/>
+    <w:bookmarkStart w:id="37" w:name="ref-maltchik2006"/>
     <w:p>
       <w:pPr>
         <w:pStyle w:val="Bibliography"/>
       </w:pPr>
       <w:r>
-        <w:t xml:space="preserve">Haney, J. F., and D. J. Hall. 1973.</w:t>
+        <w:t xml:space="preserve">Maltchik, L., and E. S. F. Medeiros. 2006.</w:t>
       </w:r>
       <w:r>
         <w:t xml:space="preserve"> </w:t>
       </w:r>
-      <w:hyperlink r:id="rId64">
+      <w:hyperlink r:id="rId36">
         <w:r>
           <w:rPr>
             <w:rStyle w:val="Hyperlink"/>
           </w:rPr>
-          <w:t xml:space="preserve">Sugar</w:t>
+          <w:t xml:space="preserve">Conservation importance of semi</w:t>
         </w:r>
         <w:r>
           <w:rPr>
@@ -3791,21 +5063,131 @@
           <w:rPr>
             <w:rStyle w:val="Hyperlink"/>
           </w:rPr>
-          <w:t xml:space="preserve">coated</w:t>
+          <w:t xml:space="preserve">arid streams in north</w:t>
         </w:r>
         <w:r>
           <w:rPr>
             <w:rStyle w:val="Hyperlink"/>
           </w:rPr>
-          <w:t xml:space="preserve"> </w:t>
+          <w:t xml:space="preserve">-</w:t>
         </w:r>
         <w:r>
           <w:rPr>
             <w:rStyle w:val="Hyperlink"/>
-            <w:i/>
-            <w:iCs/>
           </w:rPr>
-          <w:t xml:space="preserve">Daphnia</w:t>
+          <w:t xml:space="preserve">eastern brazil: Implications of hydrological disturbance and species diversity</w:t>
+        </w:r>
+      </w:hyperlink>
+      <w:r>
+        <w:t xml:space="preserve">. Aquatic Conservation: Marine and Freshwater Ecosystems 16:665–677.</w:t>
+      </w:r>
+    </w:p>
+    <w:bookmarkEnd w:id="37"/>
+    <w:bookmarkStart w:id="38" w:name="ref-medeiros2008"/>
+    <w:p>
+      <w:pPr>
+        <w:pStyle w:val="Bibliography"/>
+      </w:pPr>
+      <w:r>
+        <w:t xml:space="preserve">Medeiros, E. S. F., M. J. Silva, and R. T. C. Ramos. 2008. Application of catchment- and local-scale variables for aquatic habitat characterization and assessment in the brazilian semi-arid region. Neotropical Biology and Conservation 3:13–20.</w:t>
+      </w:r>
+    </w:p>
+    <w:bookmarkEnd w:id="38"/>
+    <w:bookmarkStart w:id="40" w:name="ref-meyer2007"/>
+    <w:p>
+      <w:pPr>
+        <w:pStyle w:val="Bibliography"/>
+      </w:pPr>
+      <w:r>
+        <w:t xml:space="preserve">Meyer, J. L., D. L. Strayer, J. B. Wallace, S. L. Eggert, G. S. Helfman, and N. E. Leonard. 2007.</w:t>
+      </w:r>
+      <w:r>
+        <w:t xml:space="preserve"> </w:t>
+      </w:r>
+      <w:hyperlink r:id="rId39">
+        <w:r>
+          <w:rPr>
+            <w:rStyle w:val="Hyperlink"/>
+          </w:rPr>
+          <w:t xml:space="preserve">The contribution of headwater streams to biodiversity in river networks</w:t>
+        </w:r>
+      </w:hyperlink>
+      <w:r>
+        <w:t xml:space="preserve">. Journal of the American Water Resources Association 43:86–103.</w:t>
+      </w:r>
+    </w:p>
+    <w:bookmarkEnd w:id="40"/>
+    <w:bookmarkStart w:id="42" w:name="ref-myers2000"/>
+    <w:p>
+      <w:pPr>
+        <w:pStyle w:val="Bibliography"/>
+      </w:pPr>
+      <w:r>
+        <w:t xml:space="preserve">Myers, N., R. A. Mittermeier, C. G. Mittermeier, G. A. B. Fonseca, and J. Kent. 2000.</w:t>
+      </w:r>
+      <w:r>
+        <w:t xml:space="preserve"> </w:t>
+      </w:r>
+      <w:hyperlink r:id="rId41">
+        <w:r>
+          <w:rPr>
+            <w:rStyle w:val="Hyperlink"/>
+          </w:rPr>
+          <w:t xml:space="preserve">Biodiversity hotspots for conservation priorities</w:t>
+        </w:r>
+      </w:hyperlink>
+      <w:r>
+        <w:t xml:space="preserve">. Nature 403:853–858.</w:t>
+      </w:r>
+    </w:p>
+    <w:bookmarkEnd w:id="42"/>
+    <w:bookmarkStart w:id="44" w:name="ref-safar2020"/>
+    <w:p>
+      <w:pPr>
+        <w:pStyle w:val="Bibliography"/>
+      </w:pPr>
+      <w:r>
+        <w:t xml:space="preserve">Safar, N. V. H., L. F. S. Magnago, and C. E. G. R. Schaefer. 2020.</w:t>
+      </w:r>
+      <w:r>
+        <w:t xml:space="preserve"> </w:t>
+      </w:r>
+      <w:hyperlink r:id="rId43">
+        <w:r>
+          <w:rPr>
+            <w:rStyle w:val="Hyperlink"/>
+          </w:rPr>
+          <w:t xml:space="preserve">Resilience of lowland atlantic forests in a highly fragmented landscape: Insights on the temporal scale of landscape restoration</w:t>
+        </w:r>
+      </w:hyperlink>
+      <w:r>
+        <w:t xml:space="preserve">. Forest Ecology and Management 470-471:118183.</w:t>
+      </w:r>
+    </w:p>
+    <w:bookmarkEnd w:id="44"/>
+    <w:bookmarkStart w:id="46" w:name="ref-souza2025"/>
+    <w:p>
+      <w:pPr>
+        <w:pStyle w:val="Bibliography"/>
+      </w:pPr>
+      <w:r>
+        <w:t xml:space="preserve">Souza, M. E. T., N. G. Santos, L. J. Chiarelli, and M. S. M. C. Noll. 2025.</w:t>
+      </w:r>
+      <w:r>
+        <w:t xml:space="preserve"> </w:t>
+      </w:r>
+      <w:hyperlink r:id="rId45">
+        <w:r>
+          <w:rPr>
+            <w:rStyle w:val="Hyperlink"/>
+          </w:rPr>
+          <w:t xml:space="preserve">Seasonal variation of the zooplankton communities</w:t>
+        </w:r>
+        <w:r>
+          <w:rPr>
+            <w:rStyle w:val="Hyperlink"/>
+          </w:rPr>
+          <w:t xml:space="preserve">’</w:t>
         </w:r>
         <w:r>
           <w:rPr>
@@ -3817,777 +5199,75 @@
           <w:rPr>
             <w:rStyle w:val="Hyperlink"/>
           </w:rPr>
-          <w:t xml:space="preserve">: A preservation technique for Cladocera1</w:t>
+          <w:t xml:space="preserve">diversity in ponds of the atlantic forest</w:t>
         </w:r>
       </w:hyperlink>
       <w:r>
-        <w:t xml:space="preserve">. Limnology and Oceanography 18:331–333.</w:t>
+        <w:t xml:space="preserve">. Acta Limnologica Brasiliensia 37:e105.</w:t>
       </w:r>
     </w:p>
-    <w:bookmarkEnd w:id="65"/>
-    <w:bookmarkStart w:id="67" w:name="ref-heinrichs2017"/>
+    <w:bookmarkEnd w:id="46"/>
+    <w:bookmarkStart w:id="47" w:name="ref-tabarelli2012"/>
     <w:p>
       <w:pPr>
         <w:pStyle w:val="Bibliography"/>
       </w:pPr>
       <w:r>
-        <w:t xml:space="preserve">Heinrichs, R., R. Otto, A. Magalhães, and G. C. Meirelles. 2017.</w:t>
+        <w:t xml:space="preserve">Tabarelli, M., A. V. Aguiar, and M. C. Ribeiro. 2012. A conversão da Floresta Atlântica em paisagens antrópicas: lições para a conservação da diversidade biológica das florestas tropicais. Interciencia 37:88–92.</w:t>
+      </w:r>
+    </w:p>
+    <w:bookmarkEnd w:id="47"/>
+    <w:bookmarkStart w:id="49" w:name="ref-vancine2024"/>
+    <w:p>
+      <w:pPr>
+        <w:pStyle w:val="Bibliography"/>
+      </w:pPr>
+      <w:r>
+        <w:t xml:space="preserve">Vancine, M. H., R. L. Muylaert, B. B. Niebuhr, J. E. D. F. Oshima, V. Tonetti, R. Bernardo, C. De Angelo, M. R. Rosa, C. H. Grohmann, and M. C. Ribeiro. 2024.</w:t>
       </w:r>
       <w:r>
         <w:t xml:space="preserve"> </w:t>
       </w:r>
-      <w:hyperlink r:id="rId66">
+      <w:hyperlink r:id="rId48">
         <w:r>
           <w:rPr>
             <w:rStyle w:val="Hyperlink"/>
           </w:rPr>
-          <w:t xml:space="preserve">Importance of sugarcane in brazilian and world bioeconomy</w:t>
+          <w:t xml:space="preserve">The atlantic forest of south america: Spatiotemporal dynamics of the vegetation and implications for conservation</w:t>
         </w:r>
       </w:hyperlink>
       <w:r>
-        <w:t xml:space="preserve">. Pages 205–217</w:t>
-      </w:r>
-      <w:r>
-        <w:t xml:space="preserve"> </w:t>
-      </w:r>
-      <w:r>
-        <w:rPr>
-          <w:i/>
-          <w:iCs/>
-        </w:rPr>
-        <w:t xml:space="preserve">in</w:t>
-      </w:r>
-      <w:r>
-        <w:t xml:space="preserve"> </w:t>
-      </w:r>
-      <w:r>
-        <w:t xml:space="preserve">S. Dabbert, I. Lewandowski, J. Weiss, and A. Pyka, editors. Springer International Publishing, Cham, Switzerland.</w:t>
+        <w:t xml:space="preserve">. Biological Conservation 291:110499.</w:t>
       </w:r>
     </w:p>
-    <w:bookmarkEnd w:id="67"/>
-    <w:bookmarkStart w:id="69" w:name="ref-kaufman1990"/>
+    <w:bookmarkEnd w:id="49"/>
+    <w:bookmarkStart w:id="51" w:name="ref-ward1998"/>
     <w:p>
       <w:pPr>
         <w:pStyle w:val="Bibliography"/>
       </w:pPr>
       <w:r>
-        <w:t xml:space="preserve">Kaufman, L., and P. J. Rousseeuw. 1990.</w:t>
+        <w:t xml:space="preserve">Ward, J. V. 1998.</w:t>
       </w:r>
       <w:r>
         <w:t xml:space="preserve"> </w:t>
       </w:r>
-      <w:hyperlink r:id="rId68">
+      <w:hyperlink r:id="rId50">
         <w:r>
           <w:rPr>
             <w:rStyle w:val="Hyperlink"/>
           </w:rPr>
-          <w:t xml:space="preserve">Agglomerative nesting (program AGNES)</w:t>
+          <w:t xml:space="preserve">Riverine landscapes: Biodiversity patterns, disturbance regimes, and aquatic conservation</w:t>
         </w:r>
       </w:hyperlink>
       <w:r>
-        <w:t xml:space="preserve">. Pages 199–252. First edition. Wiley.</w:t>
+        <w:t xml:space="preserve">. Biological Conservation 83:269–278.</w:t>
       </w:r>
     </w:p>
-    <w:bookmarkEnd w:id="69"/>
-    <w:bookmarkStart w:id="71" w:name="ref-lande1996"/>
-    <w:p>
-      <w:pPr>
-        <w:pStyle w:val="Bibliography"/>
-      </w:pPr>
-      <w:r>
-        <w:t xml:space="preserve">Lande, R. 1996.</w:t>
-      </w:r>
-      <w:r>
-        <w:t xml:space="preserve"> </w:t>
-      </w:r>
-      <w:hyperlink r:id="rId70">
-        <w:r>
-          <w:rPr>
-            <w:rStyle w:val="Hyperlink"/>
-          </w:rPr>
-          <w:t xml:space="preserve">Statistics and partitioning of species diversity, and similarity among multiple communities</w:t>
-        </w:r>
-      </w:hyperlink>
-      <w:r>
-        <w:t xml:space="preserve">. Oikos 76:5.</w:t>
-      </w:r>
-    </w:p>
-    <w:bookmarkEnd w:id="71"/>
-    <w:bookmarkStart w:id="72" w:name="ref-lê2008"/>
-    <w:p>
-      <w:pPr>
-        <w:pStyle w:val="Bibliography"/>
-      </w:pPr>
-      <w:r>
-        <w:t xml:space="preserve">Lê, S., J. Josse, and F. Husson. 2008. FactoMineR: An r package for multivariate analysis. Journal of Statistical Software 25:1–18.</w:t>
-      </w:r>
-    </w:p>
-    <w:bookmarkEnd w:id="72"/>
-    <w:bookmarkStart w:id="73" w:name="ref-legendre1998"/>
-    <w:p>
-      <w:pPr>
-        <w:pStyle w:val="Bibliography"/>
-      </w:pPr>
-      <w:r>
-        <w:t xml:space="preserve">Legendre, P., and L. Legendre. 1998. Numerical ecology. 2nd English ed. Amsterdam, The Netherlands ; New York ; Oxford.</w:t>
-      </w:r>
-    </w:p>
-    <w:bookmarkEnd w:id="73"/>
-    <w:bookmarkStart w:id="75" w:name="ref-ligeiro2010"/>
-    <w:p>
-      <w:pPr>
-        <w:pStyle w:val="Bibliography"/>
-      </w:pPr>
-      <w:r>
-        <w:t xml:space="preserve">Ligeiro, R., A. S. Melo, and M. Callisto. 2010.</w:t>
-      </w:r>
-      <w:r>
-        <w:t xml:space="preserve"> </w:t>
-      </w:r>
-      <w:hyperlink r:id="rId74">
-        <w:r>
-          <w:rPr>
-            <w:rStyle w:val="Hyperlink"/>
-          </w:rPr>
-          <w:t xml:space="preserve">Spatial scale and the diversity of macroinvertebrates in a neotropical catchment</w:t>
-        </w:r>
-      </w:hyperlink>
-      <w:r>
-        <w:t xml:space="preserve">. Freshwater Biology 2010:424–435.</w:t>
-      </w:r>
-    </w:p>
-    <w:bookmarkEnd w:id="75"/>
-    <w:bookmarkStart w:id="77" w:name="ref-lucena2015"/>
-    <w:p>
-      <w:pPr>
-        <w:pStyle w:val="Bibliography"/>
-      </w:pPr>
-      <w:r>
-        <w:t xml:space="preserve">Lucena, L. C. A., T. X. Melo, and E. S. F. Medeiros. 2015.</w:t>
-      </w:r>
-      <w:r>
-        <w:t xml:space="preserve"> </w:t>
-      </w:r>
-      <w:hyperlink r:id="rId76">
-        <w:r>
-          <w:rPr>
-            <w:rStyle w:val="Hyperlink"/>
-          </w:rPr>
-          <w:t xml:space="preserve">Zooplankton community of parnaíba river, northeastern brazil</w:t>
-        </w:r>
-      </w:hyperlink>
-      <w:r>
-        <w:t xml:space="preserve">. Acta Limnologica Brasiliensia 27:118–129.</w:t>
-      </w:r>
-    </w:p>
-    <w:bookmarkEnd w:id="77"/>
-    <w:bookmarkStart w:id="78" w:name="ref-mackereth1978"/>
-    <w:p>
-      <w:pPr>
-        <w:pStyle w:val="Bibliography"/>
-      </w:pPr>
-      <w:r>
-        <w:t xml:space="preserve">Mackereth, F. J. H., J. Heron, and J. F. Talling. 1978. Water analysis: Some revised methods for limnologists.(scientific publication n. 36) freshwater biological association. Cumbria and Dorset, England.</w:t>
-      </w:r>
-    </w:p>
-    <w:bookmarkEnd w:id="78"/>
-    <w:bookmarkStart w:id="80" w:name="ref-maechler2026"/>
-    <w:p>
-      <w:pPr>
-        <w:pStyle w:val="Bibliography"/>
-      </w:pPr>
-      <w:r>
-        <w:t xml:space="preserve">Maechler, M., P. Rousseeuw, A. Struyf, M. Hubert, and K. Hornik. 2026.</w:t>
-      </w:r>
-      <w:r>
-        <w:t xml:space="preserve"> </w:t>
-      </w:r>
-      <w:hyperlink r:id="rId79">
-        <w:r>
-          <w:rPr>
-            <w:rStyle w:val="Hyperlink"/>
-          </w:rPr>
-          <w:t xml:space="preserve">Cluster: Cluster analysis basics and extensions</w:t>
-        </w:r>
-      </w:hyperlink>
-      <w:r>
-        <w:t xml:space="preserve">.</w:t>
-      </w:r>
-    </w:p>
-    <w:bookmarkEnd w:id="80"/>
-    <w:bookmarkStart w:id="82" w:name="ref-maitland1990"/>
-    <w:p>
-      <w:pPr>
-        <w:pStyle w:val="Bibliography"/>
-      </w:pPr>
-      <w:r>
-        <w:t xml:space="preserve">Maitland, P. S. 1990.</w:t>
-      </w:r>
-      <w:r>
-        <w:t xml:space="preserve"> </w:t>
-      </w:r>
-      <w:hyperlink r:id="rId81">
-        <w:r>
-          <w:rPr>
-            <w:rStyle w:val="Hyperlink"/>
-          </w:rPr>
-          <w:t xml:space="preserve">Biology of fresh waters</w:t>
-        </w:r>
-      </w:hyperlink>
-      <w:r>
-        <w:t xml:space="preserve">. First edition. Springer Netherlands, Dordrecht.</w:t>
-      </w:r>
-    </w:p>
-    <w:bookmarkEnd w:id="82"/>
-    <w:bookmarkStart w:id="83" w:name="ref-mccune2002"/>
-    <w:p>
-      <w:pPr>
-        <w:pStyle w:val="Bibliography"/>
-      </w:pPr>
-      <w:r>
-        <w:t xml:space="preserve">McCune, B., and J. B. Grace. 2002. Analysis of ecological communities. MjM Software Design, Gleneden Beach, Oregon, U.S.A.</w:t>
-      </w:r>
-    </w:p>
-    <w:bookmarkEnd w:id="83"/>
-    <w:bookmarkStart w:id="85" w:name="ref-medeiros2008"/>
-    <w:p>
-      <w:pPr>
-        <w:pStyle w:val="Bibliography"/>
-      </w:pPr>
-      <w:r>
-        <w:t xml:space="preserve">Medeiros, E. S. F., M. J. Silva, and R. T. C. Ramos. 2008.</w:t>
-      </w:r>
-      <w:r>
-        <w:t xml:space="preserve"> </w:t>
-      </w:r>
-      <w:hyperlink r:id="rId84">
-        <w:r>
-          <w:rPr>
-            <w:rStyle w:val="Hyperlink"/>
-          </w:rPr>
-          <w:t xml:space="preserve">Application of catchment- and local-scale variables for aquatic habitat characterization and assessment in the Brazilian semi-arid region</w:t>
-        </w:r>
-      </w:hyperlink>
-      <w:r>
-        <w:t xml:space="preserve">. Neotropical Biology and Conservation 3:13–20.</w:t>
-      </w:r>
-    </w:p>
-    <w:bookmarkEnd w:id="85"/>
-    <w:bookmarkStart w:id="87" w:name="ref-mehla2026"/>
-    <w:p>
-      <w:pPr>
-        <w:pStyle w:val="Bibliography"/>
-      </w:pPr>
-      <w:r>
-        <w:t xml:space="preserve">Mehla, M. K., J. Jeong, G. Cho, J. E. Wolfe, and E. Kan. 2026.</w:t>
-      </w:r>
-      <w:r>
-        <w:t xml:space="preserve"> </w:t>
-      </w:r>
-      <w:hyperlink r:id="rId86">
-        <w:r>
-          <w:rPr>
-            <w:rStyle w:val="Hyperlink"/>
-          </w:rPr>
-          <w:t xml:space="preserve">How agricultural field management modulates downstream transport of antibiotics, bacteria and nutrients in runoff water using edge-of-field monitoring</w:t>
-        </w:r>
-      </w:hyperlink>
-      <w:r>
-        <w:t xml:space="preserve">. Water Research 307:126704.</w:t>
-      </w:r>
-    </w:p>
-    <w:bookmarkEnd w:id="87"/>
-    <w:bookmarkStart w:id="89" w:name="ref-melo2014"/>
-    <w:p>
-      <w:pPr>
-        <w:pStyle w:val="Bibliography"/>
-      </w:pPr>
-      <w:r>
-        <w:t xml:space="preserve">Melo, T. X. D., L. D. J. S. Lourenço, and E. S. F. Medeiros. 2014.</w:t>
-      </w:r>
-      <w:r>
-        <w:t xml:space="preserve"> </w:t>
-      </w:r>
-      <w:hyperlink r:id="rId88">
-        <w:r>
-          <w:rPr>
-            <w:rStyle w:val="Hyperlink"/>
-          </w:rPr>
-          <w:t xml:space="preserve">Checklist of zooplankton from the upper ipanema river (pernambuco), an intermittent river in semi-arid brazil</w:t>
-        </w:r>
-      </w:hyperlink>
-      <w:r>
-        <w:t xml:space="preserve">. Check List 10:524–528.</w:t>
-      </w:r>
-    </w:p>
-    <w:bookmarkEnd w:id="89"/>
-    <w:bookmarkStart w:id="91" w:name="ref-melo2013"/>
-    <w:p>
-      <w:pPr>
-        <w:pStyle w:val="Bibliography"/>
-      </w:pPr>
-      <w:r>
-        <w:t xml:space="preserve">Melo, T. X., and E. S. F. Medeiros. 2013.</w:t>
-      </w:r>
-      <w:r>
-        <w:t xml:space="preserve"> </w:t>
-      </w:r>
-      <w:hyperlink r:id="rId90">
-        <w:r>
-          <w:rPr>
-            <w:rStyle w:val="Hyperlink"/>
-          </w:rPr>
-          <w:t xml:space="preserve">Spatial distribution of zooplankton diversity across temporary pools in a semiarid intermittent river</w:t>
-        </w:r>
-      </w:hyperlink>
-      <w:r>
-        <w:t xml:space="preserve">. International Journal of Biodiversity 2013:1–13.</w:t>
-      </w:r>
-    </w:p>
-    <w:bookmarkEnd w:id="91"/>
-    <w:bookmarkStart w:id="92" w:name="ref-mma2003"/>
-    <w:p>
-      <w:pPr>
-        <w:pStyle w:val="Bibliography"/>
-      </w:pPr>
-      <w:r>
-        <w:t xml:space="preserve">MMA. 2003. Plano de Manejo da Reserva Biológica Guaribas. [S.I.].</w:t>
-      </w:r>
-    </w:p>
-    <w:bookmarkEnd w:id="92"/>
-    <w:bookmarkStart w:id="94" w:name="ref-mma2026"/>
-    <w:p>
-      <w:pPr>
-        <w:pStyle w:val="Bibliography"/>
-      </w:pPr>
-      <w:r>
-        <w:t xml:space="preserve">MMA. 2026.</w:t>
-      </w:r>
-      <w:r>
-        <w:t xml:space="preserve"> </w:t>
-      </w:r>
-      <w:hyperlink r:id="rId93">
-        <w:r>
-          <w:rPr>
-            <w:rStyle w:val="Hyperlink"/>
-          </w:rPr>
-          <w:t xml:space="preserve">Plano de manejo integrado do fogo 2026-2030. Reserva biológica guaribas</w:t>
-        </w:r>
-      </w:hyperlink>
-      <w:r>
-        <w:t xml:space="preserve">. Page 56. Mamanguape, PB.</w:t>
-      </w:r>
-    </w:p>
-    <w:bookmarkEnd w:id="94"/>
-    <w:bookmarkStart w:id="96" w:name="ref-mugodo2006"/>
-    <w:p>
-      <w:pPr>
-        <w:pStyle w:val="Bibliography"/>
-      </w:pPr>
-      <w:r>
-        <w:t xml:space="preserve">Mugodo, J., M. J. Kennard, P. Liston, S. Nichols, S. Linke, R. H. Norris, and M. Lintermans. 2006.</w:t>
-      </w:r>
-      <w:r>
-        <w:t xml:space="preserve"> </w:t>
-      </w:r>
-      <w:hyperlink r:id="rId95">
-        <w:r>
-          <w:rPr>
-            <w:rStyle w:val="Hyperlink"/>
-          </w:rPr>
-          <w:t xml:space="preserve">Local stream habitat variables predicted from catchment scale characteristics are useful for predicting fish distribution</w:t>
-        </w:r>
-      </w:hyperlink>
-      <w:r>
-        <w:t xml:space="preserve">. Hydrobiologia 572:59–70.</w:t>
-      </w:r>
-    </w:p>
-    <w:bookmarkEnd w:id="96"/>
-    <w:bookmarkStart w:id="97" w:name="ref-oksanen2020"/>
-    <w:p>
-      <w:pPr>
-        <w:pStyle w:val="Bibliography"/>
-      </w:pPr>
-      <w:r>
-        <w:t xml:space="preserve">Oksanen, J., F. G. Blanchet, R. Kindt, P. Legendre, P. Minchin, B. O’Hara, G. Simpson, P. Solymos, H. Stevens, and H. Wagner. 2020. Vegan: Community ecology package. R Package Version 2.2-1 2:1–2.</w:t>
-      </w:r>
-    </w:p>
-    <w:bookmarkEnd w:id="97"/>
-    <w:bookmarkStart w:id="99" w:name="ref-oksanen"/>
-    <w:p>
-      <w:pPr>
-        <w:pStyle w:val="Bibliography"/>
-      </w:pPr>
-      <w:r>
-        <w:t xml:space="preserve">Oksanen, J., G. L. Simpson, F. G. Blanchet, R. Kindt, P. Legendre, P. R. Minchin, R. B. O’Hara, P. Solymos, M. H. H. Stevens, E. Szoecs, H. Wagner, M. Barbour, M. Bedward, B. Bolker, D. Borcard, T. Borman, G. Carvalho, M. Chirico, M. Caceres, S. Durand, H. B. A. Evangelista, R. FitzJohn, M. Friendly, B. Furneaux, G. Hannigan, M. O. Hill, L. Lahti, C. Martino, D. McGlinn, M.-H. Ouellette, E. Ribeiro Cunha, T. Smith, A. Stier, C. J. F. T. Braak, and J. Weedon. (n.d.).</w:t>
-      </w:r>
-      <w:r>
-        <w:t xml:space="preserve"> </w:t>
-      </w:r>
-      <w:hyperlink r:id="rId98">
-        <w:r>
-          <w:rPr>
-            <w:rStyle w:val="Hyperlink"/>
-          </w:rPr>
-          <w:t xml:space="preserve">Vegan: Community ecology package</w:t>
-        </w:r>
-      </w:hyperlink>
-      <w:r>
-        <w:t xml:space="preserve">.</w:t>
-      </w:r>
-    </w:p>
-    <w:bookmarkEnd w:id="99"/>
-    <w:bookmarkStart w:id="101" w:name="ref-peel2007"/>
-    <w:p>
-      <w:pPr>
-        <w:pStyle w:val="Bibliography"/>
-      </w:pPr>
-      <w:r>
-        <w:t xml:space="preserve">Peel, M. C., B. L. Finlayson, and T. A. McMahon. 2007.</w:t>
-      </w:r>
-      <w:r>
-        <w:t xml:space="preserve"> </w:t>
-      </w:r>
-      <w:hyperlink r:id="rId100">
-        <w:r>
-          <w:rPr>
-            <w:rStyle w:val="Hyperlink"/>
-          </w:rPr>
-          <w:t xml:space="preserve">Updated world map of the köppen-geiger climate classification</w:t>
-        </w:r>
-      </w:hyperlink>
-      <w:r>
-        <w:t xml:space="preserve">. Hydrology and Earth System Sciences 11:1633–1644.</w:t>
-      </w:r>
-    </w:p>
-    <w:bookmarkEnd w:id="101"/>
-    <w:bookmarkStart w:id="103" w:name="ref-pereira2026"/>
-    <w:p>
-      <w:pPr>
-        <w:pStyle w:val="Bibliography"/>
-      </w:pPr>
-      <w:r>
-        <w:t xml:space="preserve">Pereira, K. M. G., N. G. Cordeiro, L. P. Z. L. Suzuki, and E. van den Berg. 2026.</w:t>
-      </w:r>
-      <w:r>
-        <w:t xml:space="preserve"> </w:t>
-      </w:r>
-      <w:hyperlink r:id="rId102">
-        <w:r>
-          <w:rPr>
-            <w:rStyle w:val="Hyperlink"/>
-          </w:rPr>
-          <w:t xml:space="preserve">How important are small fragments for restoration in the central portion of the atlantic forest?</w:t>
-        </w:r>
-      </w:hyperlink>
-      <w:r>
-        <w:t xml:space="preserve"> Biological Conservation 321:Article 111958.</w:t>
-      </w:r>
-    </w:p>
-    <w:bookmarkEnd w:id="103"/>
-    <w:bookmarkStart w:id="104" w:name="ref-pusey2004"/>
-    <w:p>
-      <w:pPr>
-        <w:pStyle w:val="Bibliography"/>
-      </w:pPr>
-      <w:r>
-        <w:t xml:space="preserve">Pusey, B., M. J. Kennard, and A. Arthington. 2004. Study area, data collection, analysis and presentation. Pages 26–48</w:t>
-      </w:r>
-      <w:r>
-        <w:t xml:space="preserve"> </w:t>
-      </w:r>
-      <w:r>
-        <w:rPr>
-          <w:i/>
-          <w:iCs/>
-        </w:rPr>
-        <w:t xml:space="preserve">in</w:t>
-      </w:r>
-      <w:r>
-        <w:t xml:space="preserve"> </w:t>
-      </w:r>
-      <w:r>
-        <w:t xml:space="preserve">B. Pusey, M. J. Kennard, and A. Arthington, editors. CSIRO Publishing, Melbourne, Australia. 682 pp.</w:t>
-      </w:r>
-    </w:p>
-    <w:bookmarkEnd w:id="104"/>
-    <w:bookmarkStart w:id="106" w:name="ref-rcoreteam2017"/>
-    <w:p>
-      <w:pPr>
-        <w:pStyle w:val="Bibliography"/>
-      </w:pPr>
-      <w:r>
-        <w:t xml:space="preserve">R Core Team. 2017.</w:t>
-      </w:r>
-      <w:r>
-        <w:t xml:space="preserve"> </w:t>
-      </w:r>
-      <w:hyperlink r:id="rId105">
-        <w:r>
-          <w:rPr>
-            <w:rStyle w:val="Hyperlink"/>
-          </w:rPr>
-          <w:t xml:space="preserve">R: A language and environment for statistical computing</w:t>
-        </w:r>
-      </w:hyperlink>
-      <w:r>
-        <w:t xml:space="preserve">.</w:t>
-      </w:r>
-    </w:p>
-    <w:bookmarkEnd w:id="106"/>
-    <w:bookmarkStart w:id="108" w:name="ref-rocha2012"/>
-    <w:p>
-      <w:pPr>
-        <w:pStyle w:val="Bibliography"/>
-      </w:pPr>
-      <w:r>
-        <w:t xml:space="preserve">Rocha, L. G., E. S. F. Medeiros, and H. T. A. Andrade. 2012.</w:t>
-      </w:r>
-      <w:r>
-        <w:t xml:space="preserve"> </w:t>
-      </w:r>
-      <w:hyperlink r:id="rId107">
-        <w:r>
-          <w:rPr>
-            <w:rStyle w:val="Hyperlink"/>
-          </w:rPr>
-          <w:t xml:space="preserve">Influence of flow variability on macroinvertebrate assemblages in an intermittent stream of semi-arid brazil</w:t>
-        </w:r>
-      </w:hyperlink>
-      <w:r>
-        <w:t xml:space="preserve">. Journal of Arid Environments 85:33–40.</w:t>
-      </w:r>
-    </w:p>
-    <w:bookmarkEnd w:id="108"/>
-    <w:bookmarkStart w:id="110" w:name="ref-saraçli2013"/>
-    <w:p>
-      <w:pPr>
-        <w:pStyle w:val="Bibliography"/>
-      </w:pPr>
-      <w:r>
-        <w:t xml:space="preserve">Saraçli, S., N. Doğan, and İ. Doğan. 2013.</w:t>
-      </w:r>
-      <w:r>
-        <w:t xml:space="preserve"> </w:t>
-      </w:r>
-      <w:hyperlink r:id="rId109">
-        <w:r>
-          <w:rPr>
-            <w:rStyle w:val="Hyperlink"/>
-          </w:rPr>
-          <w:t xml:space="preserve">Comparison of hierarchical cluster analysis methods by cophenetic correlation</w:t>
-        </w:r>
-      </w:hyperlink>
-      <w:r>
-        <w:t xml:space="preserve">. Journal of Inequalities and Applications 2013:203.</w:t>
-      </w:r>
-    </w:p>
-    <w:bookmarkEnd w:id="110"/>
-    <w:bookmarkStart w:id="112" w:name="ref-shell2018"/>
-    <w:p>
-      <w:pPr>
-        <w:pStyle w:val="Bibliography"/>
-      </w:pPr>
-      <w:r>
-        <w:t xml:space="preserve">Shell, T. M., and K. J. Collier. 2018.</w:t>
-      </w:r>
-      <w:r>
-        <w:t xml:space="preserve"> </w:t>
-      </w:r>
-      <w:hyperlink r:id="rId111">
-        <w:r>
-          <w:rPr>
-            <w:rStyle w:val="Hyperlink"/>
-          </w:rPr>
-          <w:t xml:space="preserve">Partitioning of macroinvertebrate communities in a large new zealand river highlights the role of multiple shore</w:t>
-        </w:r>
-        <w:r>
-          <w:rPr>
-            <w:rStyle w:val="Hyperlink"/>
-          </w:rPr>
-          <w:t xml:space="preserve">-</w:t>
-        </w:r>
-        <w:r>
-          <w:rPr>
-            <w:rStyle w:val="Hyperlink"/>
-          </w:rPr>
-          <w:t xml:space="preserve">zone habitat types</w:t>
-        </w:r>
-      </w:hyperlink>
-      <w:r>
-        <w:t xml:space="preserve">. River Research and Applications 34:993–1002.</w:t>
-      </w:r>
-    </w:p>
-    <w:bookmarkEnd w:id="112"/>
-    <w:bookmarkStart w:id="114" w:name="ref-silva2013"/>
-    <w:p>
-      <w:pPr>
-        <w:pStyle w:val="Bibliography"/>
-      </w:pPr>
-      <w:r>
-        <w:t xml:space="preserve">Silva, A. R., and C. T. S. Dias. 2013.</w:t>
-      </w:r>
-      <w:r>
-        <w:t xml:space="preserve"> </w:t>
-      </w:r>
-      <w:hyperlink r:id="rId113">
-        <w:r>
-          <w:rPr>
-            <w:rStyle w:val="Hyperlink"/>
-          </w:rPr>
-          <w:t xml:space="preserve">A cophenetic correlation coefficient for tocher’s method</w:t>
-        </w:r>
-      </w:hyperlink>
-      <w:r>
-        <w:t xml:space="preserve">. Pesquisa Agropecuária Brasileira 48:589–596.</w:t>
-      </w:r>
-    </w:p>
-    <w:bookmarkEnd w:id="114"/>
-    <w:bookmarkStart w:id="115" w:name="ref-silva2003"/>
-    <w:p>
-      <w:pPr>
-        <w:pStyle w:val="Bibliography"/>
-      </w:pPr>
-      <w:r>
-        <w:t xml:space="preserve">Silva, J. M. C., and C. H. M. Casteleti. 2003. Status of the biodiversity of the atlantic forest of brazil. Pages 43–59</w:t>
-      </w:r>
-      <w:r>
-        <w:t xml:space="preserve"> </w:t>
-      </w:r>
-      <w:r>
-        <w:rPr>
-          <w:i/>
-          <w:iCs/>
-        </w:rPr>
-        <w:t xml:space="preserve">in</w:t>
-      </w:r>
-      <w:r>
-        <w:t xml:space="preserve"> </w:t>
-      </w:r>
-      <w:r>
-        <w:t xml:space="preserve">C. Galindo-Leal and I. G. Câmara, editors. CABS; Island Press, Washington, DC.</w:t>
-      </w:r>
-    </w:p>
-    <w:bookmarkEnd w:id="115"/>
-    <w:bookmarkStart w:id="116" w:name="ref-sneath1973"/>
-    <w:p>
-      <w:pPr>
-        <w:pStyle w:val="Bibliography"/>
-      </w:pPr>
-      <w:r>
-        <w:t xml:space="preserve">Sneath, P. H. A., and R. R. Sokal. 1973. Numerical taxonomy: The principles and practice of numerical classification. First edition. W H Freeman &amp; Co.</w:t>
-      </w:r>
-    </w:p>
-    <w:bookmarkEnd w:id="116"/>
-    <w:bookmarkStart w:id="118" w:name="ref-sokal1962"/>
-    <w:p>
-      <w:pPr>
-        <w:pStyle w:val="Bibliography"/>
-      </w:pPr>
-      <w:r>
-        <w:t xml:space="preserve">Sokal, R. R., and F. J. Rohlf. 1962.</w:t>
-      </w:r>
-      <w:r>
-        <w:t xml:space="preserve"> </w:t>
-      </w:r>
-      <w:hyperlink r:id="rId117">
-        <w:r>
-          <w:rPr>
-            <w:rStyle w:val="Hyperlink"/>
-          </w:rPr>
-          <w:t xml:space="preserve">The comparison of dendrograms by objective methods</w:t>
-        </w:r>
-      </w:hyperlink>
-      <w:r>
-        <w:t xml:space="preserve">. Taxon 11:33–40.</w:t>
-      </w:r>
-    </w:p>
-    <w:bookmarkEnd w:id="118"/>
-    <w:bookmarkStart w:id="119" w:name="ref-sokal1995"/>
-    <w:p>
-      <w:pPr>
-        <w:pStyle w:val="Bibliography"/>
-      </w:pPr>
-      <w:r>
-        <w:t xml:space="preserve">Sokal, R. R., and F. J. Rohlf. 1995. Biometry: The principles and practice of statistics in biological research. Third edition. W.H. Freeman; Company, New York.</w:t>
-      </w:r>
-    </w:p>
-    <w:bookmarkEnd w:id="119"/>
-    <w:bookmarkStart w:id="121" w:name="ref-strahler1957"/>
-    <w:p>
-      <w:pPr>
-        <w:pStyle w:val="Bibliography"/>
-      </w:pPr>
-      <w:r>
-        <w:t xml:space="preserve">Strahler, A. N. 1957.</w:t>
-      </w:r>
-      <w:r>
-        <w:t xml:space="preserve"> </w:t>
-      </w:r>
-      <w:hyperlink r:id="rId120">
-        <w:r>
-          <w:rPr>
-            <w:rStyle w:val="Hyperlink"/>
-          </w:rPr>
-          <w:t xml:space="preserve">Quantitative analysis of watershed geomorphology</w:t>
-        </w:r>
-      </w:hyperlink>
-      <w:r>
-        <w:t xml:space="preserve">. Eos, Transactions American Geophysical Union 38:913–920.</w:t>
-      </w:r>
-    </w:p>
-    <w:bookmarkEnd w:id="121"/>
-    <w:bookmarkStart w:id="123" w:name="ref-veech2003"/>
-    <w:p>
-      <w:pPr>
-        <w:pStyle w:val="Bibliography"/>
-      </w:pPr>
-      <w:r>
-        <w:t xml:space="preserve">Veech, J. A., T. O. Crist, and K. S. Summerville. 2003.</w:t>
-      </w:r>
-      <w:r>
-        <w:t xml:space="preserve"> </w:t>
-      </w:r>
-      <w:hyperlink r:id="rId122">
-        <w:r>
-          <w:rPr>
-            <w:rStyle w:val="Hyperlink"/>
-          </w:rPr>
-          <w:t xml:space="preserve">Intraspecific aggregation decreases local species diversity of arthropods</w:t>
-        </w:r>
-      </w:hyperlink>
-      <w:r>
-        <w:t xml:space="preserve">. Ecology 84:3376–3383.</w:t>
-      </w:r>
-    </w:p>
-    <w:bookmarkEnd w:id="123"/>
-    <w:bookmarkStart w:id="125" w:name="ref-veech2002"/>
-    <w:p>
-      <w:pPr>
-        <w:pStyle w:val="Bibliography"/>
-      </w:pPr>
-      <w:r>
-        <w:t xml:space="preserve">Veech, J. A., K. S. Summerville, T. O. Crist, and J. C. Gering. 2002.</w:t>
-      </w:r>
-      <w:r>
-        <w:t xml:space="preserve"> </w:t>
-      </w:r>
-      <w:hyperlink r:id="rId124">
-        <w:r>
-          <w:rPr>
-            <w:rStyle w:val="Hyperlink"/>
-          </w:rPr>
-          <w:t xml:space="preserve">The additive partitioning of species diversity: Recent revival of an old idea</w:t>
-        </w:r>
-      </w:hyperlink>
-      <w:r>
-        <w:t xml:space="preserve">. Oikos 99:3–9.</w:t>
-      </w:r>
-    </w:p>
-    <w:bookmarkEnd w:id="125"/>
-    <w:bookmarkEnd w:id="126"/>
-    <w:bookmarkEnd w:id="127"/>
-    <w:bookmarkStart w:id="162" w:name="figures-and-tables"/>
+    <w:bookmarkEnd w:id="51"/>
+    <w:bookmarkEnd w:id="52"/>
+    <w:bookmarkEnd w:id="53"/>
+    <w:bookmarkStart w:id="88" w:name="figures-and-tables"/>
     <w:p>
       <w:pPr>
         <w:pStyle w:val="Heading1"/>
@@ -4908,7 +5588,7 @@
         <w:t xml:space="preserve">(Stream): Diversity turnover between streams.</w:t>
       </w:r>
     </w:p>
-    <w:bookmarkStart w:id="156" w:name="figures"/>
+    <w:bookmarkStart w:id="82" w:name="figures"/>
     <w:p>
       <w:pPr>
         <w:pStyle w:val="Heading2"/>
@@ -4943,7 +5623,7 @@
       <w:tr>
         <w:tc>
           <w:tcPr/>
-          <w:bookmarkStart w:id="131" w:name="fig-mapa"/>
+          <w:bookmarkStart w:id="57" w:name="fig-mapa"/>
           <w:p>
             <w:pPr>
               <w:pStyle w:val="Compact"/>
@@ -4954,18 +5634,18 @@
                 <wp:inline>
                   <wp:extent cx="5943600" cy="4202583"/>
                   <wp:effectExtent b="0" l="0" r="0" t="0"/>
-                  <wp:docPr descr="" title="" id="129" name="Picture"/>
+                  <wp:docPr descr="" title="" id="55" name="Picture"/>
                   <a:graphic>
                     <a:graphicData uri="http://schemas.openxmlformats.org/drawingml/2006/picture">
                       <pic:pic>
                         <pic:nvPicPr>
-                          <pic:cNvPr descr="imagens/Uso%20de%20Solo%20Rebio_en.png" id="130" name="Picture"/>
+                          <pic:cNvPr descr="imagens/Uso%20de%20Solo%20Rebio_en.png" id="56" name="Picture"/>
                           <pic:cNvPicPr>
                             <a:picLocks noChangeArrowheads="1" noChangeAspect="1"/>
                           </pic:cNvPicPr>
                         </pic:nvPicPr>
                         <pic:blipFill>
-                          <a:blip r:embed="rId128"/>
+                          <a:blip r:embed="rId54"/>
                           <a:stretch>
                             <a:fillRect/>
                           </a:stretch>
@@ -5005,7 +5685,7 @@
               <w:t xml:space="preserve">Figure 1: Study area</w:t>
             </w:r>
           </w:p>
-          <w:bookmarkEnd w:id="131"/>
+          <w:bookmarkEnd w:id="57"/>
         </w:tc>
       </w:tr>
     </w:tbl>
@@ -5035,7 +5715,7 @@
       <w:tr>
         <w:tc>
           <w:tcPr/>
-          <w:bookmarkStart w:id="135" w:name="fig-hab_PCA_rio"/>
+          <w:bookmarkStart w:id="61" w:name="fig-hab_PCA_rio"/>
           <w:p>
             <w:pPr>
               <w:pStyle w:val="Compact"/>
@@ -5046,18 +5726,18 @@
                 <wp:inline>
                   <wp:extent cx="5943600" cy="4953000"/>
                   <wp:effectExtent b="0" l="0" r="0" t="0"/>
-                  <wp:docPr descr="" title="" id="133" name="Picture"/>
+                  <wp:docPr descr="" title="" id="59" name="Picture"/>
                   <a:graphic>
                     <a:graphicData uri="http://schemas.openxmlformats.org/drawingml/2006/picture">
                       <pic:pic>
                         <pic:nvPicPr>
-                          <pic:cNvPr descr="res/fig-hab_PCA_rio.png" id="134" name="Picture"/>
+                          <pic:cNvPr descr="res/fig-hab_PCA_rio.png" id="60" name="Picture"/>
                           <pic:cNvPicPr>
                             <a:picLocks noChangeArrowheads="1" noChangeAspect="1"/>
                           </pic:cNvPicPr>
                         </pic:nvPicPr>
                         <pic:blipFill>
-                          <a:blip r:embed="rId132"/>
+                          <a:blip r:embed="rId58"/>
                           <a:stretch>
                             <a:fillRect/>
                           </a:stretch>
@@ -5097,7 +5777,7 @@
               <w:t xml:space="preserve">Figure 2: Principal Component Analysis, streams</w:t>
             </w:r>
           </w:p>
-          <w:bookmarkEnd w:id="135"/>
+          <w:bookmarkEnd w:id="61"/>
         </w:tc>
       </w:tr>
     </w:tbl>
@@ -5127,7 +5807,7 @@
       <w:tr>
         <w:tc>
           <w:tcPr/>
-          <w:bookmarkStart w:id="139" w:name="fig-hab_PCA_periodo"/>
+          <w:bookmarkStart w:id="65" w:name="fig-hab_PCA_periodo"/>
           <w:p>
             <w:pPr>
               <w:pStyle w:val="Compact"/>
@@ -5138,18 +5818,18 @@
                 <wp:inline>
                   <wp:extent cx="5943600" cy="4953000"/>
                   <wp:effectExtent b="0" l="0" r="0" t="0"/>
-                  <wp:docPr descr="" title="" id="137" name="Picture"/>
+                  <wp:docPr descr="" title="" id="63" name="Picture"/>
                   <a:graphic>
                     <a:graphicData uri="http://schemas.openxmlformats.org/drawingml/2006/picture">
                       <pic:pic>
                         <pic:nvPicPr>
-                          <pic:cNvPr descr="res/fig-hab_PCA_periodo.png" id="138" name="Picture"/>
+                          <pic:cNvPr descr="res/fig-hab_PCA_periodo.png" id="64" name="Picture"/>
                           <pic:cNvPicPr>
                             <a:picLocks noChangeArrowheads="1" noChangeAspect="1"/>
                           </pic:cNvPicPr>
                         </pic:nvPicPr>
                         <pic:blipFill>
-                          <a:blip r:embed="rId136"/>
+                          <a:blip r:embed="rId62"/>
                           <a:stretch>
                             <a:fillRect/>
                           </a:stretch>
@@ -5189,7 +5869,7 @@
               <w:t xml:space="preserve">Figure 3: Principal Component Analysis, seasons</w:t>
             </w:r>
           </w:p>
-          <w:bookmarkEnd w:id="139"/>
+          <w:bookmarkEnd w:id="65"/>
         </w:tc>
       </w:tr>
     </w:tbl>
@@ -5219,7 +5899,7 @@
       <w:tr>
         <w:tc>
           <w:tcPr/>
-          <w:bookmarkStart w:id="143" w:name="fig-rare1"/>
+          <w:bookmarkStart w:id="69" w:name="fig-rare1"/>
           <w:p>
             <w:pPr>
               <w:pStyle w:val="Compact"/>
@@ -5230,18 +5910,18 @@
                 <wp:inline>
                   <wp:extent cx="5943600" cy="4457699"/>
                   <wp:effectExtent b="0" l="0" r="0" t="0"/>
-                  <wp:docPr descr="" title="" id="141" name="Picture"/>
+                  <wp:docPr descr="" title="" id="67" name="Picture"/>
                   <a:graphic>
                     <a:graphicData uri="http://schemas.openxmlformats.org/drawingml/2006/picture">
                       <pic:pic>
                         <pic:nvPicPr>
-                          <pic:cNvPr descr="res/fig-rare1.png" id="142" name="Picture"/>
+                          <pic:cNvPr descr="res/fig-rare1.png" id="68" name="Picture"/>
                           <pic:cNvPicPr>
                             <a:picLocks noChangeArrowheads="1" noChangeAspect="1"/>
                           </pic:cNvPicPr>
                         </pic:nvPicPr>
                         <pic:blipFill>
-                          <a:blip r:embed="rId140"/>
+                          <a:blip r:embed="rId66"/>
                           <a:stretch>
                             <a:fillRect/>
                           </a:stretch>
@@ -5281,7 +5961,7 @@
               <w:t xml:space="preserve">Figure 4: Accumulation curves</w:t>
             </w:r>
           </w:p>
-          <w:bookmarkEnd w:id="143"/>
+          <w:bookmarkEnd w:id="69"/>
         </w:tc>
       </w:tr>
     </w:tbl>
@@ -5311,7 +5991,7 @@
       <w:tr>
         <w:tc>
           <w:tcPr/>
-          <w:bookmarkStart w:id="147" w:name="fig-upgma"/>
+          <w:bookmarkStart w:id="73" w:name="fig-upgma"/>
           <w:p>
             <w:pPr>
               <w:pStyle w:val="Compact"/>
@@ -5322,18 +6002,18 @@
                 <wp:inline>
                   <wp:extent cx="5943600" cy="4862945"/>
                   <wp:effectExtent b="0" l="0" r="0" t="0"/>
-                  <wp:docPr descr="" title="" id="145" name="Picture"/>
+                  <wp:docPr descr="" title="" id="71" name="Picture"/>
                   <a:graphic>
                     <a:graphicData uri="http://schemas.openxmlformats.org/drawingml/2006/picture">
                       <pic:pic>
                         <pic:nvPicPr>
-                          <pic:cNvPr descr="res/fig-upgma.png" id="146" name="Picture"/>
+                          <pic:cNvPr descr="res/fig-upgma.png" id="72" name="Picture"/>
                           <pic:cNvPicPr>
                             <a:picLocks noChangeArrowheads="1" noChangeAspect="1"/>
                           </pic:cNvPicPr>
                         </pic:nvPicPr>
                         <pic:blipFill>
-                          <a:blip r:embed="rId144"/>
+                          <a:blip r:embed="rId70"/>
                           <a:stretch>
                             <a:fillRect/>
                           </a:stretch>
@@ -5373,7 +6053,7 @@
               <w:t xml:space="preserve">Figure 5: UPGMA Classification</w:t>
             </w:r>
           </w:p>
-          <w:bookmarkEnd w:id="147"/>
+          <w:bookmarkEnd w:id="73"/>
         </w:tc>
       </w:tr>
     </w:tbl>
@@ -5403,7 +6083,7 @@
       <w:tr>
         <w:tc>
           <w:tcPr/>
-          <w:bookmarkStart w:id="151" w:name="fig-particao_cs"/>
+          <w:bookmarkStart w:id="77" w:name="fig-particao_cs"/>
           <w:p>
             <w:pPr>
               <w:pStyle w:val="Compact"/>
@@ -5414,18 +6094,18 @@
                 <wp:inline>
                   <wp:extent cx="3669832" cy="7339665"/>
                   <wp:effectExtent b="0" l="0" r="0" t="0"/>
-                  <wp:docPr descr="" title="" id="149" name="Picture"/>
+                  <wp:docPr descr="" title="" id="75" name="Picture"/>
                   <a:graphic>
                     <a:graphicData uri="http://schemas.openxmlformats.org/drawingml/2006/picture">
                       <pic:pic>
                         <pic:nvPicPr>
-                          <pic:cNvPr descr="res/fig-painel_pt.cs.png" id="150" name="Picture"/>
+                          <pic:cNvPr descr="res/fig-painel_pt.cs.png" id="76" name="Picture"/>
                           <pic:cNvPicPr>
                             <a:picLocks noChangeArrowheads="1" noChangeAspect="1"/>
                           </pic:cNvPicPr>
                         </pic:nvPicPr>
                         <pic:blipFill>
-                          <a:blip r:embed="rId148"/>
+                          <a:blip r:embed="rId74"/>
                           <a:stretch>
                             <a:fillRect/>
                           </a:stretch>
@@ -5465,7 +6145,7 @@
               <w:t xml:space="preserve">Figure 6: Partitioning plots season</w:t>
             </w:r>
           </w:p>
-          <w:bookmarkEnd w:id="151"/>
+          <w:bookmarkEnd w:id="77"/>
         </w:tc>
       </w:tr>
     </w:tbl>
@@ -5495,7 +6175,7 @@
       <w:tr>
         <w:tc>
           <w:tcPr/>
-          <w:bookmarkStart w:id="155" w:name="fig-particao_rios"/>
+          <w:bookmarkStart w:id="81" w:name="fig-particao_rios"/>
           <w:p>
             <w:pPr>
               <w:pStyle w:val="Compact"/>
@@ -5506,18 +6186,18 @@
                 <wp:inline>
                   <wp:extent cx="5943600" cy="6792685"/>
                   <wp:effectExtent b="0" l="0" r="0" t="0"/>
-                  <wp:docPr descr="" title="" id="153" name="Picture"/>
+                  <wp:docPr descr="" title="" id="79" name="Picture"/>
                   <a:graphic>
                     <a:graphicData uri="http://schemas.openxmlformats.org/drawingml/2006/picture">
                       <pic:pic>
                         <pic:nvPicPr>
-                          <pic:cNvPr descr="res/fig-painel_pt.rios.png" id="154" name="Picture"/>
+                          <pic:cNvPr descr="res/fig-painel_pt.rios.png" id="80" name="Picture"/>
                           <pic:cNvPicPr>
                             <a:picLocks noChangeArrowheads="1" noChangeAspect="1"/>
                           </pic:cNvPicPr>
                         </pic:nvPicPr>
                         <pic:blipFill>
-                          <a:blip r:embed="rId152"/>
+                          <a:blip r:embed="rId78"/>
                           <a:stretch>
                             <a:fillRect/>
                           </a:stretch>
@@ -5557,12 +6237,12 @@
               <w:t xml:space="preserve">Figure 7: Partitioning plots stream</w:t>
             </w:r>
           </w:p>
-          <w:bookmarkEnd w:id="155"/>
+          <w:bookmarkEnd w:id="81"/>
         </w:tc>
       </w:tr>
     </w:tbl>
-    <w:bookmarkEnd w:id="156"/>
-    <w:bookmarkStart w:id="161" w:name="tables"/>
+    <w:bookmarkEnd w:id="82"/>
+    <w:bookmarkStart w:id="87" w:name="tables"/>
     <w:p>
       <w:pPr>
         <w:pStyle w:val="Heading2"/>
@@ -5597,7 +6277,7 @@
       <w:tr>
         <w:tc>
           <w:tcPr/>
-          <w:bookmarkStart w:id="157" w:name="tbl-hab_gttable"/>
+          <w:bookmarkStart w:id="83" w:name="tbl-hab_gttable"/>
           <w:p>
             <w:pPr>
               <w:jc w:val="center"/>
@@ -17265,7 +17945,7 @@
               </w:tc>
             </w:tr>
           </w:tbl>
-          <w:bookmarkEnd w:id="157"/>
+          <w:bookmarkEnd w:id="83"/>
         </w:tc>
       </w:tr>
     </w:tbl>
@@ -17295,7 +17975,7 @@
       <w:tr>
         <w:tc>
           <w:tcPr/>
-          <w:bookmarkStart w:id="158" w:name="tbl-nutri_gttable"/>
+          <w:bookmarkStart w:id="84" w:name="tbl-nutri_gttable"/>
           <w:p>
             <w:pPr>
               <w:jc w:val="center"/>
@@ -20016,7 +20696,7 @@
               </w:tc>
             </w:tr>
           </w:tbl>
-          <w:bookmarkEnd w:id="158"/>
+          <w:bookmarkEnd w:id="84"/>
         </w:tc>
       </w:tr>
     </w:tbl>
@@ -20046,7 +20726,7 @@
       <w:tr>
         <w:tc>
           <w:tcPr/>
-          <w:bookmarkStart w:id="159" w:name="tbl-checklist_gttable"/>
+          <w:bookmarkStart w:id="85" w:name="tbl-checklist_gttable"/>
           <w:p>
             <w:pPr>
               <w:jc w:val="center"/>
@@ -37790,7 +38470,7 @@
               </w:tc>
             </w:tr>
           </w:tbl>
-          <w:bookmarkEnd w:id="159"/>
+          <w:bookmarkEnd w:id="85"/>
         </w:tc>
       </w:tr>
     </w:tbl>
@@ -37820,7 +38500,7 @@
       <w:tr>
         <w:tc>
           <w:tcPr/>
-          <w:bookmarkStart w:id="160" w:name="tbl-part_gttable"/>
+          <w:bookmarkStart w:id="86" w:name="tbl-part_gttable"/>
           <w:p>
             <w:pPr>
               <w:jc w:val="center"/>
@@ -42680,13 +43360,13 @@
               </w:tc>
             </w:tr>
           </w:tbl>
-          <w:bookmarkEnd w:id="160"/>
+          <w:bookmarkEnd w:id="86"/>
         </w:tc>
       </w:tr>
     </w:tbl>
-    <w:bookmarkEnd w:id="161"/>
-    <w:bookmarkEnd w:id="162"/>
-    <w:bookmarkStart w:id="163" w:name="apendices"/>
+    <w:bookmarkEnd w:id="87"/>
+    <w:bookmarkEnd w:id="88"/>
+    <w:bookmarkStart w:id="89" w:name="apendices"/>
     <w:p>
       <w:pPr>
         <w:pStyle w:val="Heading1"/>
@@ -42695,8 +43375,8 @@
         <w:t xml:space="preserve">Apendices</w:t>
       </w:r>
     </w:p>
-    <w:bookmarkEnd w:id="163"/>
-    <w:bookmarkStart w:id="167" w:name="non-used-figures-and-tables"/>
+    <w:bookmarkEnd w:id="89"/>
+    <w:bookmarkStart w:id="93" w:name="non-used-figures-and-tables"/>
     <w:p>
       <w:pPr>
         <w:pStyle w:val="Heading1"/>
@@ -42746,18 +43426,18 @@
                 <wp:inline>
                   <wp:extent cx="152400" cy="152400"/>
                   <wp:effectExtent b="0" l="0" r="0" t="0"/>
-                  <wp:docPr descr="" title="" id="165" name="Picture"/>
+                  <wp:docPr descr="" title="" id="91" name="Picture"/>
                   <a:graphic>
                     <a:graphicData uri="http://schemas.openxmlformats.org/drawingml/2006/picture">
                       <pic:pic>
                         <pic:nvPicPr>
-                          <pic:cNvPr descr="C:\PROGRA~1\RStudio\RESOUR~1\app\bin\quarto\share\formats\docx\warning.png" id="166" name="Picture"/>
+                          <pic:cNvPr descr="C:\PROGRA~1\RStudio\RESOUR~1\app\bin\quarto\share\formats\docx\warning.png" id="92" name="Picture"/>
                           <pic:cNvPicPr>
                             <a:picLocks noChangeArrowheads="1" noChangeAspect="1"/>
                           </pic:cNvPicPr>
                         </pic:nvPicPr>
                         <pic:blipFill>
-                          <a:blip r:embed="rId164"/>
+                          <a:blip r:embed="rId90"/>
                           <a:stretch>
                             <a:fillRect/>
                           </a:stretch>
@@ -42810,7 +43490,7 @@
         </w:tc>
       </w:tr>
     </w:tbl>
-    <w:bookmarkEnd w:id="167"/>
+    <w:bookmarkEnd w:id="93"/>
     <w:sectPr>
       <w:type w:val="nextPage"/>
       <w:pgSz w:h="15840" w:w="12240"/>

</xml_diff>

<commit_message>
Elv: ms intro com refs, sem conflitos
</commit_message>
<xml_diff>
--- a/docs/ms_rebio23-part.docx
+++ b/docs/ms_rebio23-part.docx
@@ -7,7 +7,7 @@
         <w:pStyle w:val="Title"/>
       </w:pPr>
       <w:r>
-        <w:t xml:space="preserve">Contrasting conservation conditions shape the spatial partitioning of zooplankton diversity in Atlantic Forest streams</w:t>
+        <w:t xml:space="preserve">Zooplankton diversity partitioning: implications for stream conservation in the Atlantic Forest</w:t>
       </w:r>
     </w:p>
     <w:p>
@@ -15,7 +15,7 @@
         <w:pStyle w:val="Subtitle"/>
       </w:pPr>
       <w:r>
-        <w:t xml:space="preserve">Contrasting conservation conditions shape the spatial partitioning of zooplankton diversity in Atlantic Forest streams</w:t>
+        <w:t xml:space="preserve">Short title: Zooplankton diversity partitioning in Atlantic Forest streams</w:t>
       </w:r>
       <w:r>
         <w:t xml:space="preserve"> </w:t>
@@ -83,7 +83,7 @@
         <w:pStyle w:val="Date"/>
       </w:pPr>
       <w:r>
-        <w:t xml:space="preserve">2026-10-12</w:t>
+        <w:t xml:space="preserve">2026-10-15</w:t>
       </w:r>
     </w:p>
     <w:p>
@@ -168,16 +168,46 @@
         <w:pStyle w:val="FirstParagraph"/>
       </w:pPr>
       <w:r>
-        <w:t xml:space="preserve">Essas abordagens são baseadas nos conceitos de turnover and nestedness. Species turnover and nestedness are two distinct components used to break down and understand beta diversity—which measures how much species composition changes between different communities or sites</w:t>
+        <w:t xml:space="preserve">The Atlantic Forest, recognized for its exceptional species richness and high level of endemism</w:t>
       </w:r>
       <w:r>
         <w:t xml:space="preserve"> </w:t>
       </w:r>
       <w:r>
-        <w:t xml:space="preserve">(Baselga 2010)</w:t>
-      </w:r>
-      <w:r>
-        <w:t xml:space="preserve">, where, turnover is the replacement of some species by different species from one site to another, while nestedness is the loss or gain of species where poorer sites contain a strict subset of the species found at richer sites.</w:t>
+        <w:t xml:space="preserve">(Fonseca 1985, Myers et al. 2000, Tabarelli et al. 2012)</w:t>
+      </w:r>
+      <w:r>
+        <w:t xml:space="preserve">, is one of the most threatened tropical forests worldwide due to intense anthropogenic pressure, making it a global priority for biodiversity conservation in South America</w:t>
+      </w:r>
+      <w:r>
+        <w:t xml:space="preserve"> </w:t>
+      </w:r>
+      <w:r>
+        <w:t xml:space="preserve"> </w:t>
+      </w:r>
+      <w:r>
+        <w:t xml:space="preserve">(Safar et al. 2020, Vancine et al. 2024)</w:t>
+      </w:r>
+      <w:r>
+        <w:t xml:space="preserve">. Originally, its vegetation cover extended over 1.6 million km²; however, centuries of human occupation and resource exploitation have led to severe landscape reduction and fragmentation, compromising the ecological integrity of its remnants and the maintenance of biodiversity</w:t>
+      </w:r>
+      <w:r>
+        <w:t xml:space="preserve"> </w:t>
+      </w:r>
+      <w:r>
+        <w:t xml:space="preserve">(Safar et al. 2020, Vancine et al. 2024)</w:t>
+      </w:r>
+      <w:r>
+        <w:t xml:space="preserve">. Habitat loss driven by deforestation is directly linked to forest fragmentation, which promotes the isolation of remnants, reduces landscape connectivity, and restricts species dispersal</w:t>
+      </w:r>
+      <w:r>
+        <w:t xml:space="preserve"> </w:t>
+      </w:r>
+      <w:r>
+        <w:t xml:space="preserve">(Zaú 1998, Tabarelli et al. 2010, Souza et al. 2025)</w:t>
+      </w:r>
+      <w:r>
+        <w:t xml:space="preserve">.</w:t>
       </w:r>
     </w:p>
     <w:p>
@@ -185,7 +215,196 @@
         <w:pStyle w:val="TextBody"/>
       </w:pPr>
       <w:r>
-        <w:t xml:space="preserve">Understanding the spatial structure and distribution of biodiversity across scale remains a central theme in community ecology and conservation planning (Lande 1996, Crist et al. 2003). Total regional species richness (</w:t>
+        <w:t xml:space="preserve">These impacts are not confined to terrestrial environments as they extend to the associated aquatic ecosystems and, most importantly, headwater streams</w:t>
+      </w:r>
+      <w:r>
+        <w:t xml:space="preserve"> </w:t>
+      </w:r>
+      <w:r>
+        <w:t xml:space="preserve">(Meyer et al. 2007)</w:t>
+      </w:r>
+      <w:r>
+        <w:t xml:space="preserve">. Forest fragmentation and land management can generate significant impacts on stream fauna within the Atlantic Forest, as aquatic organisms are highly sensitive to changes in natural water conditions</w:t>
+      </w:r>
+      <w:r>
+        <w:t xml:space="preserve"> </w:t>
+      </w:r>
+      <w:r>
+        <w:t xml:space="preserve">(Gouveia et al. 2017)</w:t>
+      </w:r>
+      <w:r>
+        <w:t xml:space="preserve">. According to</w:t>
+      </w:r>
+      <w:r>
+        <w:t xml:space="preserve"> </w:t>
+      </w:r>
+      <w:r>
+        <w:t xml:space="preserve">Maltchik and Medeiros (2006)</w:t>
+      </w:r>
+      <w:r>
+        <w:t xml:space="preserve">, landscape-level processes—such as disturbance, fragmentation, dispersal, and mosaic structure—exert a direct influence on local populations. Therefore, understanding the ecological processes structuring these communities is essential to evaluate the ecological health of water bodies and to comprehend how diversity is distributed across different spatial scales</w:t>
+      </w:r>
+      <w:r>
+        <w:t xml:space="preserve"> </w:t>
+      </w:r>
+      <w:r>
+        <w:t xml:space="preserve">(Ávila et al. 2011)</w:t>
+      </w:r>
+      <w:r>
+        <w:t xml:space="preserve">. In addition to landscape alterations, stream dynamics are strongly driven by seasonal factors. The Atlantic Forest features a predominantly tropical climate with rainfall distributed throughout the year</w:t>
+      </w:r>
+      <w:r>
+        <w:t xml:space="preserve"> </w:t>
+      </w:r>
+      <w:r>
+        <w:t xml:space="preserve">(Barboza et al. 2024)</w:t>
+      </w:r>
+      <w:r>
+        <w:t xml:space="preserve">. These hydrological fluctuations directly influence Neotropical freshwater environments by modifying physical and chemical conditions</w:t>
+      </w:r>
+      <w:r>
+        <w:t xml:space="preserve"> </w:t>
+      </w:r>
+      <w:r>
+        <w:t xml:space="preserve">(Barboza et al. 2024)</w:t>
+      </w:r>
+      <w:r>
+        <w:t xml:space="preserve">. The shift between dry and rainy seasons alters resource availability, microhabitat structure, and the establishment and persistence of organisms, thereby shaping community composition and dynamics</w:t>
+      </w:r>
+      <w:r>
+        <w:t xml:space="preserve"> </w:t>
+      </w:r>
+      <w:r>
+        <w:t xml:space="preserve">(Ward 1998, Souza et al. 2025)</w:t>
+      </w:r>
+      <w:r>
+        <w:t xml:space="preserve">.</w:t>
+      </w:r>
+    </w:p>
+    <w:p>
+      <w:pPr>
+        <w:pStyle w:val="TextBody"/>
+      </w:pPr>
+      <w:r>
+        <w:t xml:space="preserve">During the dry season, reduced precipitation and lower streamflow stabilize hydrological conditions, which may favor the persistence of local populations. Conversely, the rainy season is characterized by increased rainfall and discharge, intensifying disturbance events, dispersal, and species turnover</w:t>
+      </w:r>
+      <w:r>
+        <w:t xml:space="preserve"> </w:t>
+      </w:r>
+      <w:r>
+        <w:t xml:space="preserve">(Souza et al. 2025)</w:t>
+      </w:r>
+      <w:r>
+        <w:t xml:space="preserve">. Consequently, seasonality acts as a major driver of aquatic community organization, making these organisms valuable biological tools for assessing the ecological state of freshwater systems.</w:t>
+      </w:r>
+    </w:p>
+    <w:p>
+      <w:pPr>
+        <w:pStyle w:val="TextBody"/>
+      </w:pPr>
+      <w:r>
+        <w:t xml:space="preserve">Among the biological components of these communities, zooplankton—particularly Rotifera, Cladocera, and Copepoda—play a pivotal role. These organisms exhibit diverse body sizes, morphologies, life histories, and functional roles, serving as excellent bioindicators due to their rapid sensitivity to environmental changes</w:t>
+      </w:r>
+      <w:r>
+        <w:t xml:space="preserve"> </w:t>
+      </w:r>
+      <w:r>
+        <w:t xml:space="preserve">(Bonecker et al. 2013)</w:t>
+      </w:r>
+      <w:r>
+        <w:t xml:space="preserve">. Furthermore, zooplankton constitute a critical food source for fish, aquatic birds, and mammals, acting as an essential trophic bridge that transfers energy from primary producers to higher trophic levels</w:t>
+      </w:r>
+      <w:r>
+        <w:t xml:space="preserve"> </w:t>
+      </w:r>
+      <w:r>
+        <w:t xml:space="preserve">(Balkić et al. 2022, Marcelino et al. 2025, Souza et al. 2025, Altindağ and Berdi̇ 2025)</w:t>
+      </w:r>
+      <w:r>
+        <w:t xml:space="preserve">.</w:t>
+      </w:r>
+    </w:p>
+    <w:p>
+      <w:pPr>
+        <w:pStyle w:val="TextBody"/>
+      </w:pPr>
+      <w:r>
+        <w:t xml:space="preserve">According to</w:t>
+      </w:r>
+      <w:r>
+        <w:t xml:space="preserve"> </w:t>
+      </w:r>
+      <w:r>
+        <w:t xml:space="preserve">Keppeler and Hardy (2004)</w:t>
+      </w:r>
+      <w:r>
+        <w:t xml:space="preserve">, the composition and structure of zooplankton communities result from complex interactions among physical, chemical, and biological factors, including seasonal variations. Therefore, shifts in species composition and community turnover often reflect underlying alterations in environmental conditions</w:t>
+      </w:r>
+      <w:r>
+        <w:t xml:space="preserve"> </w:t>
+      </w:r>
+      <w:r>
+        <w:t xml:space="preserve">(Melo and Medeiros 2013, Freiry et al. 2020)</w:t>
+      </w:r>
+      <w:r>
+        <w:t xml:space="preserve">.</w:t>
+      </w:r>
+    </w:p>
+    <w:p>
+      <w:pPr>
+        <w:pStyle w:val="TextBody"/>
+      </w:pPr>
+      <w:r>
+        <w:t xml:space="preserve">In recent decades, researchers have argued that biodiversity assessments should not be reduced to a single diversity index.</w:t>
+      </w:r>
+      <w:r>
+        <w:t xml:space="preserve"> </w:t>
+      </w:r>
+      <w:r>
+        <w:t xml:space="preserve">Romanelli et al. (2022)</w:t>
+      </w:r>
+      <w:r>
+        <w:t xml:space="preserve"> </w:t>
+      </w:r>
+      <w:r>
+        <w:t xml:space="preserve">emphasize that combining multiple statistical diversity approaches with multi-taxon evaluations provides a more comprehensive understanding of environmental ecological health and species responses to anthropogenic stress. Nevertheless, few approaches allow for the assessment of diversity organization across explicit hierarchical spatial scales.</w:t>
+      </w:r>
+    </w:p>
+    <w:p>
+      <w:pPr>
+        <w:pStyle w:val="TextBody"/>
+      </w:pPr>
+      <w:r>
+        <w:t xml:space="preserve">Diversity partitioning stands out in this context. This framework decomposes overall diversity across multiple spatial levels, testing whether observed diversity is higher or lower than expected under null distribution models</w:t>
+      </w:r>
+      <w:r>
+        <w:t xml:space="preserve"> </w:t>
+      </w:r>
+      <w:r>
+        <w:t xml:space="preserve">(Lopes et al. 2014)</w:t>
+      </w:r>
+      <w:r>
+        <w:t xml:space="preserve">, thereby offering valuable insights into community assembly and underlying ecological drivers.</w:t>
+      </w:r>
+    </w:p>
+    <w:p>
+      <w:pPr>
+        <w:pStyle w:val="TextBody"/>
+      </w:pPr>
+      <w:r>
+        <w:t xml:space="preserve">Among diversity partitioning framework variants, additive partitioning is widely applied in aquatic studies. However,</w:t>
+      </w:r>
+      <w:r>
+        <w:t xml:space="preserve"> </w:t>
+      </w:r>
+      <w:r>
+        <w:t xml:space="preserve">Ligeiro et al. (2010)</w:t>
+      </w:r>
+      <w:r>
+        <w:t xml:space="preserve"> </w:t>
+      </w:r>
+      <w:r>
+        <w:t xml:space="preserve">point out that its application in freshwater systems remains relatively scarce, highlighting a critical knowledge gap regarding alpha and beta diversity distribution. Under the additive partitioning model, total regional diversity (</w:t>
       </w:r>
       <m:oMath>
         <m:r>
@@ -193,7 +412,7 @@
         </m:r>
       </m:oMath>
       <w:r>
-        <w:t xml:space="preserve">-diversity) can be hierarchically partitioned into its additive components: local richness (</w:t>
+        <w:t xml:space="preserve">-diversity) is partitioned into additive alpha (</w:t>
       </w:r>
       <m:oMath>
         <m:r>
@@ -201,7 +420,7 @@
         </m:r>
       </m:oMath>
       <w:r>
-        <w:t xml:space="preserve">-diversity) and species turnover among assemblages (</w:t>
+        <w:t xml:space="preserve">) and beta (</w:t>
       </w:r>
       <m:oMath>
         <m:r>
@@ -209,7 +428,30 @@
         </m:r>
       </m:oMath>
       <w:r>
-        <w:t xml:space="preserve">-diversity) across spatial or temporal scales (Lande 1996). Examining these components allows ecologists to disentangle whether regional diversity is primarily governed by fine-scale local processes or broader spatial heterogeneity (Crist et al. 2003, Tuomisto 2010).Beta diversity (</w:t>
+        <w:t xml:space="preserve">) components</w:t>
+      </w:r>
+      <w:r>
+        <w:t xml:space="preserve"> </w:t>
+      </w:r>
+      <w:r>
+        <w:t xml:space="preserve">(Crist et al. 2003)</w:t>
+      </w:r>
+      <w:r>
+        <w:t xml:space="preserve">, where</w:t>
+      </w:r>
+      <w:r>
+        <w:t xml:space="preserve"> </w:t>
+      </w:r>
+      <m:oMath>
+        <m:r>
+          <m:t>α</m:t>
+        </m:r>
+      </m:oMath>
+      <w:r>
+        <w:t xml:space="preserve">-diversity represents the mean local richness and</w:t>
+      </w:r>
+      <w:r>
+        <w:t xml:space="preserve"> </w:t>
       </w:r>
       <m:oMath>
         <m:r>
@@ -217,7 +459,172 @@
         </m:r>
       </m:oMath>
       <w:r>
-        <w:t xml:space="preserve">) itself reflects the variation in species composition among sites and is driven by two distinct ecological phenomena: turnover (species replacement) and nestedness (richness differences) (Baselga 2010). Species turnover occurs when species are replaced by different species along environmental or spatial gradients, usually driven by environmental filtering, competitive exclusion, or dispersal limitation (Baselga 2010, Tuomisto 2010). In contrast, nestedness occurs when communities at species-poor sites are non-random subsets of those at species-rich sites (Baselga 2010). Nested patterns typically stem from deterministic processes such as selective extinction, differential colonization capacity, or habitat fragmentation that sequentially eliminate sensitive taxa while retaining tolerant generalists (Baselga 2010, Gotelli &amp; Ulrich 2012).Evaluating the relative contribution of turnover and nestedness—alongside null models using Standardized Effect Sizes (</w:t>
+        <w:t xml:space="preserve">-diversity reflects spatial turnover or variation in species composition among sampling units</w:t>
+      </w:r>
+      <w:r>
+        <w:t xml:space="preserve"> </w:t>
+      </w:r>
+      <w:r>
+        <w:t xml:space="preserve">(Whittaker 1972, Jost 2007, Ligeiro et al. 2010, Ávila et al. 2011, Baselga 2012)</w:t>
+      </w:r>
+      <w:r>
+        <w:t xml:space="preserve">.</w:t>
+      </w:r>
+    </w:p>
+    <w:p>
+      <w:pPr>
+        <w:pStyle w:val="TextBody"/>
+      </w:pPr>
+      <w:r>
+        <w:t xml:space="preserve">Additive diversity partitioning provides a robust framework to evaluate how zooplankton communities respond to landscape fragmentation and seasonal dynamics. By decomposing total diversity into hierarchical</w:t>
+      </w:r>
+      <w:r>
+        <w:t xml:space="preserve"> </w:t>
+      </w:r>
+      <m:oMath>
+        <m:r>
+          <m:t>α</m:t>
+        </m:r>
+      </m:oMath>
+      <w:r>
+        <w:t xml:space="preserve"> </w:t>
+      </w:r>
+      <w:r>
+        <w:t xml:space="preserve">and</w:t>
+      </w:r>
+      <w:r>
+        <w:t xml:space="preserve"> </w:t>
+      </w:r>
+      <m:oMath>
+        <m:r>
+          <m:t>β</m:t>
+        </m:r>
+      </m:oMath>
+      <w:r>
+        <w:t xml:space="preserve"> </w:t>
+      </w:r>
+      <w:r>
+        <w:t xml:space="preserve">components, it is possible to quantify spatial contributions to overall diversity and detect species turnover across scales. Ultimately, this study generates key baseline data on the ecological condition of the studied streams and the ecological mechanisms structuring zooplankton communities, contributing to safer conservation strategies in Atlantic Forest remnants.</w:t>
+      </w:r>
+    </w:p>
+    <w:p>
+      <w:pPr>
+        <w:pStyle w:val="TextBody"/>
+      </w:pPr>
+      <w:r>
+        <w:t xml:space="preserve">Therefore, understanding the spatial structure and distribution of biodiversity across scale remains a central theme in community ecology and conservation planning</w:t>
+      </w:r>
+      <w:r>
+        <w:t xml:space="preserve"> </w:t>
+      </w:r>
+      <w:r>
+        <w:t xml:space="preserve">(Lande 1996, Crist et al. 2003)</w:t>
+      </w:r>
+      <w:r>
+        <w:t xml:space="preserve">. These approaches are based on the concepts of species turnover and nestedness, two distinct components used to break down and understand beta diversity – which measures how much species composition changes between different communities or sites</w:t>
+      </w:r>
+      <w:r>
+        <w:t xml:space="preserve"> </w:t>
+      </w:r>
+      <w:r>
+        <w:t xml:space="preserve">(Baselga 2010)</w:t>
+      </w:r>
+      <w:r>
+        <w:t xml:space="preserve">. Turnover is the replacement of some species by different species from one site to another, while nestedness is the loss or gain of species where poorer sites contain a strict subset of the species found at richer sites.</w:t>
+      </w:r>
+    </w:p>
+    <w:p>
+      <w:pPr>
+        <w:pStyle w:val="TextBody"/>
+      </w:pPr>
+      <w:r>
+        <w:t xml:space="preserve">Total regional species richness (</w:t>
+      </w:r>
+      <m:oMath>
+        <m:r>
+          <m:t>γ</m:t>
+        </m:r>
+      </m:oMath>
+      <w:r>
+        <w:t xml:space="preserve">-diversity) can be hierarchically partitioned into its additive components: local richness (</w:t>
+      </w:r>
+      <m:oMath>
+        <m:r>
+          <m:t>α</m:t>
+        </m:r>
+      </m:oMath>
+      <w:r>
+        <w:t xml:space="preserve">-diversity) and species turnover among assemblages (</w:t>
+      </w:r>
+      <m:oMath>
+        <m:r>
+          <m:t>β</m:t>
+        </m:r>
+      </m:oMath>
+      <w:r>
+        <w:t xml:space="preserve">-diversity) across spatial or temporal scales</w:t>
+      </w:r>
+      <w:r>
+        <w:t xml:space="preserve"> </w:t>
+      </w:r>
+      <w:r>
+        <w:t xml:space="preserve">(Lande 1996)</w:t>
+      </w:r>
+      <w:r>
+        <w:t xml:space="preserve">. Examining these components allows ecologists to disentangle whether regional diversity is primarily governed by fine-scale local processes or broader spatial heterogeneity</w:t>
+      </w:r>
+      <w:r>
+        <w:t xml:space="preserve"> </w:t>
+      </w:r>
+      <w:r>
+        <w:t xml:space="preserve">(Crist et al. 2003, Tuomisto 2010)</w:t>
+      </w:r>
+      <w:r>
+        <w:t xml:space="preserve">. Beta diversity (</w:t>
+      </w:r>
+      <m:oMath>
+        <m:r>
+          <m:t>β</m:t>
+        </m:r>
+      </m:oMath>
+      <w:r>
+        <w:t xml:space="preserve">) itself reflects the variation in species composition among sites and is driven by two distinct ecological phenomena: turnover (species replacement) and nestedness (richness differences)</w:t>
+      </w:r>
+      <w:r>
+        <w:t xml:space="preserve"> </w:t>
+      </w:r>
+      <w:r>
+        <w:t xml:space="preserve">(Baselga 2010)</w:t>
+      </w:r>
+      <w:r>
+        <w:t xml:space="preserve">. Species turnover occurs when species are replaced by different species along environmental or spatial gradients, usually driven by environmental filtering, competitive exclusion, or dispersal limitation</w:t>
+      </w:r>
+      <w:r>
+        <w:t xml:space="preserve"> </w:t>
+      </w:r>
+      <w:r>
+        <w:t xml:space="preserve">(Baselga 2010, Tuomisto 2010)</w:t>
+      </w:r>
+      <w:r>
+        <w:t xml:space="preserve">. In contrast, nestedness occurs when communities at species-poor sites are non-random subsets of those at species-rich sites</w:t>
+      </w:r>
+      <w:r>
+        <w:t xml:space="preserve"> </w:t>
+      </w:r>
+      <w:r>
+        <w:t xml:space="preserve">(Baselga 2010)</w:t>
+      </w:r>
+      <w:r>
+        <w:t xml:space="preserve">. Nested patterns typically stem from deterministic processes such as selective extinction, differential colonization capacity, or habitat fragmentation that sequentially eliminate sensitive taxa while retaining tolerant generalists</w:t>
+      </w:r>
+      <w:r>
+        <w:t xml:space="preserve"> </w:t>
+      </w:r>
+      <w:r>
+        <w:t xml:space="preserve">(Baselga 2010)</w:t>
+      </w:r>
+      <w:r>
+        <w:t xml:space="preserve">. Evaluating the relative contribution of turnover and nestedness—alongside null models using Standardized Effect Sizes (</w:t>
       </w:r>
       <m:oMath>
         <m:r>
@@ -229,7 +636,16 @@
         </m:r>
       </m:oMath>
       <w:r>
-        <w:t xml:space="preserve">)—provides critical insights into assembly rules and conservation prioritization (Gotelli &amp; McCabe 2002, Baselga 2010). A pattern dominated by turnover (</w:t>
+        <w:t xml:space="preserve">)—provides critical insights into assembly rules and conservation prioritization</w:t>
+      </w:r>
+      <w:r>
+        <w:t xml:space="preserve"> </w:t>
+      </w:r>
+      <w:r>
+        <w:t xml:space="preserve">(Gotelli and McCabe 2002, Baselga 2010)</w:t>
+      </w:r>
+      <w:r>
+        <w:t xml:space="preserve">. A pattern dominated by turnover (</w:t>
       </w:r>
       <m:oMath>
         <m:r>
@@ -250,7 +666,25 @@
         </m:r>
       </m:oMath>
       <w:r>
-        <w:t xml:space="preserve">) implies strong ecological differentiation and high beta diversity, signaling that distinct localities host unique biological assemblages (Baselga 2010). From a conservation perspective, high turnover necessitates a network-wide preservation strategy, as multiple sites must be protected to encompass regional biodiversity (Baselga 2010). Conversely, a system dominated by nestedness or fine-scale homogenization (</w:t>
+        <w:t xml:space="preserve">) implies strong ecological differentiation and high beta diversity, signaling that distinct localities host unique biological assemblages</w:t>
+      </w:r>
+      <w:r>
+        <w:t xml:space="preserve"> </w:t>
+      </w:r>
+      <w:r>
+        <w:t xml:space="preserve">(Baselga 2010)</w:t>
+      </w:r>
+      <w:r>
+        <w:t xml:space="preserve">. From a conservation perspective, high turnover necessitates a network-wide preservation strategy, as multiple sites must be protected to encompass regional biodiversity</w:t>
+      </w:r>
+      <w:r>
+        <w:t xml:space="preserve"> </w:t>
+      </w:r>
+      <w:r>
+        <w:t xml:space="preserve">(Baselga 2010)</w:t>
+      </w:r>
+      <w:r>
+        <w:t xml:space="preserve">. Conversely, a system dominated by nestedness or fine-scale homogenization (</w:t>
       </w:r>
       <m:oMath>
         <m:r>
@@ -271,7 +705,16 @@
         </m:r>
       </m:oMath>
       <w:r>
-        <w:t xml:space="preserve">) indicates that local assemblages are nested sub-collections of regional species pools. Under a nested regime, management efforts are most effectively concentrated on protecting the largest or highest-quality species-rich sites, which inherently harbor the vast majority of the regional pool (Baselga 2010).</w:t>
+        <w:t xml:space="preserve">) indicates that local assemblages are nested sub-collections of regional species pools. Under a nested regime, management efforts are most effectively concentrated on protecting the largest or highest-quality species-rich sites, which inherently harbor the vast majority of the regional pool</w:t>
+      </w:r>
+      <w:r>
+        <w:t xml:space="preserve"> </w:t>
+      </w:r>
+      <w:r>
+        <w:t xml:space="preserve">(Baselga 2010)</w:t>
+      </w:r>
+      <w:r>
+        <w:t xml:space="preserve">.</w:t>
       </w:r>
     </w:p>
     <w:p>
@@ -285,7 +728,7 @@
         <w:t xml:space="preserve"> </w:t>
       </w:r>
       <w:r>
-        <w:t xml:space="preserve">(Gering et al. 2003, Crist et al. 2003, Veech et al. 2003, Ligeiro et al. 2010, Baselga 2010, 2012, Ávila et al. 2011, Shell and Collier 2018)</w:t>
+        <w:t xml:space="preserve">(Gering et al. 2003, Crist et al. 2003, Veech et al. 2003, Baselga 2010, 2012, Ligeiro et al. 2010, Ávila et al. 2011, Shell and Collier 2018)</w:t>
       </w:r>
     </w:p>
     <w:bookmarkStart w:id="12" w:name="objectives"/>
@@ -308,7 +751,7 @@
         <w:t xml:space="preserve"> </w:t>
       </w:r>
       <w:r>
-        <w:t xml:space="preserve">Brasil (2000)</w:t>
+        <w:t xml:space="preserve">BRASIL (2000)</w:t>
       </w:r>
       <w:r>
         <w:t xml:space="preserve"> </w:t>
@@ -648,7 +1091,7 @@
         <w:t xml:space="preserve"> </w:t>
       </w:r>
       <w:r>
-        <w:t xml:space="preserve">(Melo et al. 2014, Lucena et al. 2015)</w:t>
+        <w:t xml:space="preserve">(Melo 2014, Lucena et al. 2015)</w:t>
       </w:r>
       <w:r>
         <w:t xml:space="preserve">.</w:t>
@@ -900,7 +1343,7 @@
         <w:t xml:space="preserve"> </w:t>
       </w:r>
       <w:r>
-        <w:t xml:space="preserve">(Sokal and Rohlf 1962, Farris 1969, Silva and Dias 2013)</w:t>
+        <w:t xml:space="preserve">(Sokal and Rohlf 1962, Farris 1969, Silva 2013)</w:t>
       </w:r>
       <w:r>
         <w:t xml:space="preserve">. To evaluate the strength of the hierarchical clustering structure obtained from the UPGMA dendrograms, the Agglomerative Coefficient (AC) was calculated for each season using the</w:t>
@@ -1331,7 +1774,7 @@
         <w:t xml:space="preserve"> </w:t>
       </w:r>
       <w:r>
-        <w:t xml:space="preserve">(Oksanen et al. n.d.)</w:t>
+        <w:t xml:space="preserve">(Oksanen et al. 2020)</w:t>
       </w:r>
       <w:r>
         <w:t xml:space="preserve">. All analyses were conducted in the statistical environment R</w:t>
@@ -1340,7 +1783,7 @@
         <w:t xml:space="preserve"> </w:t>
       </w:r>
       <w:r>
-        <w:t xml:space="preserve">(R Core Team 2017)</w:t>
+        <w:t xml:space="preserve">(R Development Core Team 2017)</w:t>
       </w:r>
       <w:r>
         <w:t xml:space="preserve">.</w:t>
@@ -3294,7 +3737,7 @@
       </w:r>
     </w:p>
     <w:bookmarkEnd w:id="25"/>
-    <w:bookmarkStart w:id="127" w:name="references"/>
+    <w:bookmarkStart w:id="169" w:name="references"/>
     <w:p>
       <w:pPr>
         <w:pStyle w:val="Heading1"/>
@@ -3303,19 +3746,43 @@
         <w:t xml:space="preserve">References</w:t>
       </w:r>
     </w:p>
-    <w:bookmarkStart w:id="126" w:name="refs"/>
-    <w:bookmarkStart w:id="27" w:name="ref-anderson2013"/>
+    <w:bookmarkStart w:id="168" w:name="refs"/>
+    <w:bookmarkStart w:id="27" w:name="ref-altindag2025"/>
     <w:p>
       <w:pPr>
         <w:pStyle w:val="Bibliography"/>
       </w:pPr>
       <w:r>
+        <w:t xml:space="preserve">Altindağ, A., and D. Berdi̇. 2025.</w:t>
+      </w:r>
+      <w:r>
+        <w:t xml:space="preserve"> </w:t>
+      </w:r>
+      <w:hyperlink r:id="rId26">
+        <w:r>
+          <w:rPr>
+            <w:rStyle w:val="Hyperlink"/>
+          </w:rPr>
+          <w:t xml:space="preserve">Rising temperatures, changing waters: The influence of abiotic factors on freshwater zooplankton community</w:t>
+        </w:r>
+      </w:hyperlink>
+      <w:r>
+        <w:t xml:space="preserve">. Desalination and Water Treatment 321:100991.</w:t>
+      </w:r>
+    </w:p>
+    <w:bookmarkEnd w:id="27"/>
+    <w:bookmarkStart w:id="29" w:name="ref-anderson2013"/>
+    <w:p>
+      <w:pPr>
+        <w:pStyle w:val="Bibliography"/>
+      </w:pPr>
+      <w:r>
         <w:t xml:space="preserve">Anderson, M. J., and D. C. I. Walsh. 2013.</w:t>
       </w:r>
       <w:r>
         <w:t xml:space="preserve"> </w:t>
       </w:r>
-      <w:hyperlink r:id="rId26">
+      <w:hyperlink r:id="rId28">
         <w:r>
           <w:rPr>
             <w:rStyle w:val="Hyperlink"/>
@@ -3327,8 +3794,8 @@
         <w:t xml:space="preserve"> Ecological Monographs 83:557574.</w:t>
       </w:r>
     </w:p>
-    <w:bookmarkEnd w:id="27"/>
-    <w:bookmarkStart w:id="29" w:name="ref-apha1998"/>
+    <w:bookmarkEnd w:id="29"/>
+    <w:bookmarkStart w:id="31" w:name="ref-apha1998"/>
     <w:p>
       <w:pPr>
         <w:pStyle w:val="Bibliography"/>
@@ -3339,7 +3806,7 @@
       <w:r>
         <w:t xml:space="preserve"> </w:t>
       </w:r>
-      <w:hyperlink r:id="rId28">
+      <w:hyperlink r:id="rId30">
         <w:r>
           <w:rPr>
             <w:rStyle w:val="Hyperlink"/>
@@ -3351,8 +3818,8 @@
         <w:t xml:space="preserve">. Washington, DC.</w:t>
       </w:r>
     </w:p>
-    <w:bookmarkEnd w:id="29"/>
-    <w:bookmarkStart w:id="31" w:name="ref-arruda2013"/>
+    <w:bookmarkEnd w:id="31"/>
+    <w:bookmarkStart w:id="33" w:name="ref-arruda2013"/>
     <w:p>
       <w:pPr>
         <w:pStyle w:val="Bibliography"/>
@@ -3363,7 +3830,7 @@
       <w:r>
         <w:t xml:space="preserve"> </w:t>
       </w:r>
-      <w:hyperlink r:id="rId30">
+      <w:hyperlink r:id="rId32">
         <w:r>
           <w:rPr>
             <w:rStyle w:val="Hyperlink"/>
@@ -3375,8 +3842,8 @@
         <w:t xml:space="preserve">. Revista Direitos Emergentes na Sociedade Global 2:280–304.</w:t>
       </w:r>
     </w:p>
-    <w:bookmarkEnd w:id="31"/>
-    <w:bookmarkStart w:id="33" w:name="ref-ávila2011"/>
+    <w:bookmarkEnd w:id="33"/>
+    <w:bookmarkStart w:id="35" w:name="ref-ávila2011"/>
     <w:p>
       <w:pPr>
         <w:pStyle w:val="Bibliography"/>
@@ -3387,7 +3854,7 @@
       <w:r>
         <w:t xml:space="preserve"> </w:t>
       </w:r>
-      <w:hyperlink r:id="rId32">
+      <w:hyperlink r:id="rId34">
         <w:r>
           <w:rPr>
             <w:rStyle w:val="Hyperlink"/>
@@ -3399,19 +3866,67 @@
         <w:t xml:space="preserve">. Wetlands 31:459–469.</w:t>
       </w:r>
     </w:p>
-    <w:bookmarkEnd w:id="33"/>
-    <w:bookmarkStart w:id="35" w:name="ref-baselga2010"/>
+    <w:bookmarkEnd w:id="35"/>
+    <w:bookmarkStart w:id="37" w:name="ref-balkic2022"/>
     <w:p>
       <w:pPr>
         <w:pStyle w:val="Bibliography"/>
       </w:pPr>
       <w:r>
+        <w:t xml:space="preserve">Balkić, A. G., T. Ž. Pfeiffer, K. Čmelar, D. Š. Maronić, F. Stević, N. Bek, A. Martinović, and R. Nikolašević. 2022.</w:t>
+      </w:r>
+      <w:r>
+        <w:t xml:space="preserve"> </w:t>
+      </w:r>
+      <w:hyperlink r:id="rId36">
+        <w:r>
+          <w:rPr>
+            <w:rStyle w:val="Hyperlink"/>
+          </w:rPr>
+          <w:t xml:space="preserve">Footprint of the plastisphere on freshwater zooplankton</w:t>
+        </w:r>
+      </w:hyperlink>
+      <w:r>
+        <w:t xml:space="preserve">. Environmental Research 212:113563.</w:t>
+      </w:r>
+    </w:p>
+    <w:bookmarkEnd w:id="37"/>
+    <w:bookmarkStart w:id="39" w:name="ref-barboza2024"/>
+    <w:p>
+      <w:pPr>
+        <w:pStyle w:val="Bibliography"/>
+      </w:pPr>
+      <w:r>
+        <w:t xml:space="preserve">Barboza, A. C. G., V. Tagliacollo, and G. B. Jacobucci. 2024.</w:t>
+      </w:r>
+      <w:r>
+        <w:t xml:space="preserve"> </w:t>
+      </w:r>
+      <w:hyperlink r:id="rId38">
+        <w:r>
+          <w:rPr>
+            <w:rStyle w:val="Hyperlink"/>
+          </w:rPr>
+          <w:t xml:space="preserve">Influence of seasonal hydrological regimes on benthic macroinvertebrates in two the brazilian biodiversity hotspots</w:t>
+        </w:r>
+      </w:hyperlink>
+      <w:r>
+        <w:t xml:space="preserve">. Limnologica 106:126170.</w:t>
+      </w:r>
+    </w:p>
+    <w:bookmarkEnd w:id="39"/>
+    <w:bookmarkStart w:id="41" w:name="ref-baselga2010"/>
+    <w:p>
+      <w:pPr>
+        <w:pStyle w:val="Bibliography"/>
+      </w:pPr>
+      <w:r>
         <w:t xml:space="preserve">Baselga, A. 2010.</w:t>
       </w:r>
       <w:r>
         <w:t xml:space="preserve"> </w:t>
       </w:r>
-      <w:hyperlink r:id="rId34">
+      <w:hyperlink r:id="rId40">
         <w:r>
           <w:rPr>
             <w:rStyle w:val="Hyperlink"/>
@@ -3423,8 +3938,8 @@
         <w:t xml:space="preserve">. Global Ecology and Biogeography 19:134–143.</w:t>
       </w:r>
     </w:p>
-    <w:bookmarkEnd w:id="35"/>
-    <w:bookmarkStart w:id="37" w:name="ref-baselga2012"/>
+    <w:bookmarkEnd w:id="41"/>
+    <w:bookmarkStart w:id="43" w:name="ref-baselga2012"/>
     <w:p>
       <w:pPr>
         <w:pStyle w:val="Bibliography"/>
@@ -3435,7 +3950,7 @@
       <w:r>
         <w:t xml:space="preserve"> </w:t>
       </w:r>
-      <w:hyperlink r:id="rId36">
+      <w:hyperlink r:id="rId42">
         <w:r>
           <w:rPr>
             <w:rStyle w:val="Hyperlink"/>
@@ -3447,8 +3962,8 @@
         <w:t xml:space="preserve">. Global Ecology and Biogeography 21:1223–1232.</w:t>
       </w:r>
     </w:p>
-    <w:bookmarkEnd w:id="37"/>
-    <w:bookmarkStart w:id="39" w:name="ref-belbin1993"/>
+    <w:bookmarkEnd w:id="43"/>
+    <w:bookmarkStart w:id="45" w:name="ref-belbin1993"/>
     <w:p>
       <w:pPr>
         <w:pStyle w:val="Bibliography"/>
@@ -3459,7 +3974,7 @@
       <w:r>
         <w:t xml:space="preserve"> </w:t>
       </w:r>
-      <w:hyperlink r:id="rId38">
+      <w:hyperlink r:id="rId44">
         <w:r>
           <w:rPr>
             <w:rStyle w:val="Hyperlink"/>
@@ -3471,19 +3986,43 @@
         <w:t xml:space="preserve">. Journal of Vegetation Science 4:341–348.</w:t>
       </w:r>
     </w:p>
-    <w:bookmarkEnd w:id="39"/>
-    <w:bookmarkStart w:id="41" w:name="ref-brasil2000"/>
+    <w:bookmarkEnd w:id="45"/>
+    <w:bookmarkStart w:id="47" w:name="ref-bonecker2013"/>
     <w:p>
       <w:pPr>
         <w:pStyle w:val="Bibliography"/>
       </w:pPr>
       <w:r>
-        <w:t xml:space="preserve">Brasil. 2000.</w:t>
+        <w:t xml:space="preserve">Bonecker, C. C., N. R. Simões, C. V. Minte-Vera, F. A. Lansac-Tôha, L. F. M. Velho, and Â. A. Agostinho. 2013.</w:t>
       </w:r>
       <w:r>
         <w:t xml:space="preserve"> </w:t>
       </w:r>
-      <w:hyperlink r:id="rId40">
+      <w:hyperlink r:id="rId46">
+        <w:r>
+          <w:rPr>
+            <w:rStyle w:val="Hyperlink"/>
+          </w:rPr>
+          <w:t xml:space="preserve">Temporal changes in zooplankton species diversity in response to environmental changes in an alluvial valley</w:t>
+        </w:r>
+      </w:hyperlink>
+      <w:r>
+        <w:t xml:space="preserve">. Limnologica 43:114–121.</w:t>
+      </w:r>
+    </w:p>
+    <w:bookmarkEnd w:id="47"/>
+    <w:bookmarkStart w:id="49" w:name="ref-brasil2000"/>
+    <w:p>
+      <w:pPr>
+        <w:pStyle w:val="Bibliography"/>
+      </w:pPr>
+      <w:r>
+        <w:t xml:space="preserve">BRASIL. 2000.</w:t>
+      </w:r>
+      <w:r>
+        <w:t xml:space="preserve"> </w:t>
+      </w:r>
+      <w:hyperlink r:id="rId48">
         <w:r>
           <w:rPr>
             <w:rStyle w:val="Hyperlink"/>
@@ -3492,8 +4031,8 @@
         </w:r>
       </w:hyperlink>
     </w:p>
-    <w:bookmarkEnd w:id="41"/>
-    <w:bookmarkStart w:id="43" w:name="ref-cnpq2026"/>
+    <w:bookmarkEnd w:id="49"/>
+    <w:bookmarkStart w:id="51" w:name="ref-cnpq2026"/>
     <w:p>
       <w:pPr>
         <w:pStyle w:val="Bibliography"/>
@@ -3504,7 +4043,7 @@
       <w:r>
         <w:t xml:space="preserve"> </w:t>
       </w:r>
-      <w:hyperlink r:id="rId42">
+      <w:hyperlink r:id="rId50">
         <w:r>
           <w:rPr>
             <w:rStyle w:val="Hyperlink"/>
@@ -3516,8 +4055,8 @@
         <w:t xml:space="preserve">.</w:t>
       </w:r>
     </w:p>
-    <w:bookmarkEnd w:id="43"/>
-    <w:bookmarkStart w:id="45" w:name="ref-credit2026"/>
+    <w:bookmarkEnd w:id="51"/>
+    <w:bookmarkStart w:id="53" w:name="ref-credit2026"/>
     <w:p>
       <w:pPr>
         <w:pStyle w:val="Bibliography"/>
@@ -3528,7 +4067,7 @@
       <w:r>
         <w:t xml:space="preserve"> </w:t>
       </w:r>
-      <w:hyperlink r:id="rId44">
+      <w:hyperlink r:id="rId52">
         <w:r>
           <w:rPr>
             <w:rStyle w:val="Hyperlink"/>
@@ -3537,11 +4076,11 @@
         </w:r>
       </w:hyperlink>
       <w:r>
-        <w:t xml:space="preserve">.</w:t>
+        <w:t xml:space="preserve">. NISO/CRediT Standing Committee.</w:t>
       </w:r>
     </w:p>
-    <w:bookmarkEnd w:id="45"/>
-    <w:bookmarkStart w:id="47" w:name="ref-crist2003"/>
+    <w:bookmarkEnd w:id="53"/>
+    <w:bookmarkStart w:id="55" w:name="ref-crist2003"/>
     <w:p>
       <w:pPr>
         <w:pStyle w:val="Bibliography"/>
@@ -3552,7 +4091,7 @@
       <w:r>
         <w:t xml:space="preserve"> </w:t>
       </w:r>
-      <w:hyperlink r:id="rId46">
+      <w:hyperlink r:id="rId54">
         <w:r>
           <w:rPr>
             <w:rStyle w:val="Hyperlink"/>
@@ -3564,8 +4103,8 @@
         <w:t xml:space="preserve">. The American Naturalist 162:734–743.</w:t>
       </w:r>
     </w:p>
-    <w:bookmarkEnd w:id="47"/>
-    <w:bookmarkStart w:id="49" w:name="ref-epa2020"/>
+    <w:bookmarkEnd w:id="55"/>
+    <w:bookmarkStart w:id="57" w:name="ref-epa2020"/>
     <w:p>
       <w:pPr>
         <w:pStyle w:val="Bibliography"/>
@@ -3576,7 +4115,7 @@
       <w:r>
         <w:t xml:space="preserve"> </w:t>
       </w:r>
-      <w:hyperlink r:id="rId48">
+      <w:hyperlink r:id="rId56">
         <w:r>
           <w:rPr>
             <w:rStyle w:val="Hyperlink"/>
@@ -3588,8 +4127,8 @@
         <w:t xml:space="preserve">.</w:t>
       </w:r>
     </w:p>
-    <w:bookmarkEnd w:id="49"/>
-    <w:bookmarkStart w:id="51" w:name="ref-farias2020"/>
+    <w:bookmarkEnd w:id="57"/>
+    <w:bookmarkStart w:id="59" w:name="ref-farias2020"/>
     <w:p>
       <w:pPr>
         <w:pStyle w:val="Bibliography"/>
@@ -3600,7 +4139,7 @@
       <w:r>
         <w:t xml:space="preserve"> </w:t>
       </w:r>
-      <w:hyperlink r:id="rId50">
+      <w:hyperlink r:id="rId58">
         <w:r>
           <w:rPr>
             <w:rStyle w:val="Hyperlink"/>
@@ -3612,8 +4151,8 @@
         <w:t xml:space="preserve">. Inland Waters 10:480–492.</w:t>
       </w:r>
     </w:p>
-    <w:bookmarkEnd w:id="51"/>
-    <w:bookmarkStart w:id="53" w:name="ref-farris1969"/>
+    <w:bookmarkEnd w:id="59"/>
+    <w:bookmarkStart w:id="61" w:name="ref-farris1969"/>
     <w:p>
       <w:pPr>
         <w:pStyle w:val="Bibliography"/>
@@ -3624,7 +4163,7 @@
       <w:r>
         <w:t xml:space="preserve"> </w:t>
       </w:r>
-      <w:hyperlink r:id="rId52">
+      <w:hyperlink r:id="rId60">
         <w:r>
           <w:rPr>
             <w:rStyle w:val="Hyperlink"/>
@@ -3636,19 +4175,43 @@
         <w:t xml:space="preserve">. Systematic Zoology 18:279.</w:t>
       </w:r>
     </w:p>
-    <w:bookmarkEnd w:id="53"/>
-    <w:bookmarkStart w:id="55" w:name="ref-freiry2020"/>
+    <w:bookmarkEnd w:id="61"/>
+    <w:bookmarkStart w:id="63" w:name="ref-fonseca1985"/>
     <w:p>
       <w:pPr>
         <w:pStyle w:val="Bibliography"/>
       </w:pPr>
       <w:r>
+        <w:t xml:space="preserve">Fonseca, G. A. B. 1985.</w:t>
+      </w:r>
+      <w:r>
+        <w:t xml:space="preserve"> </w:t>
+      </w:r>
+      <w:hyperlink r:id="rId62">
+        <w:r>
+          <w:rPr>
+            <w:rStyle w:val="Hyperlink"/>
+          </w:rPr>
+          <w:t xml:space="preserve">The vanishing brazilian atlantic forest</w:t>
+        </w:r>
+      </w:hyperlink>
+      <w:r>
+        <w:t xml:space="preserve">. Biological Conservation 34:17–34.</w:t>
+      </w:r>
+    </w:p>
+    <w:bookmarkEnd w:id="63"/>
+    <w:bookmarkStart w:id="65" w:name="ref-freiry2020"/>
+    <w:p>
+      <w:pPr>
+        <w:pStyle w:val="Bibliography"/>
+      </w:pPr>
+      <w:r>
         <w:t xml:space="preserve">Freiry, R. F., V. Weber, C. C. Bonecker, F. A. Lansac-Tôha, M. M. Pires, C. Stenert, and L. Maltchik. 2020.</w:t>
       </w:r>
       <w:r>
         <w:t xml:space="preserve"> </w:t>
       </w:r>
-      <w:hyperlink r:id="rId54">
+      <w:hyperlink r:id="rId64">
         <w:r>
           <w:rPr>
             <w:rStyle w:val="Hyperlink"/>
@@ -3666,8 +4229,8 @@
         <w:t xml:space="preserve">. Hydrobiologia 847:1327–1342.</w:t>
       </w:r>
     </w:p>
-    <w:bookmarkEnd w:id="55"/>
-    <w:bookmarkStart w:id="57" w:name="ref-frissell1986"/>
+    <w:bookmarkEnd w:id="65"/>
+    <w:bookmarkStart w:id="67" w:name="ref-frissell1986"/>
     <w:p>
       <w:pPr>
         <w:pStyle w:val="Bibliography"/>
@@ -3678,7 +4241,7 @@
       <w:r>
         <w:t xml:space="preserve"> </w:t>
       </w:r>
-      <w:hyperlink r:id="rId56">
+      <w:hyperlink r:id="rId66">
         <w:r>
           <w:rPr>
             <w:rStyle w:val="Hyperlink"/>
@@ -3690,8 +4253,8 @@
         <w:t xml:space="preserve">. Environmental Management 10:199–214.</w:t>
       </w:r>
     </w:p>
-    <w:bookmarkEnd w:id="57"/>
-    <w:bookmarkStart w:id="59" w:name="ref-gering2003"/>
+    <w:bookmarkEnd w:id="67"/>
+    <w:bookmarkStart w:id="69" w:name="ref-gering2003"/>
     <w:p>
       <w:pPr>
         <w:pStyle w:val="Bibliography"/>
@@ -3702,7 +4265,7 @@
       <w:r>
         <w:t xml:space="preserve"> </w:t>
       </w:r>
-      <w:hyperlink r:id="rId58">
+      <w:hyperlink r:id="rId68">
         <w:r>
           <w:rPr>
             <w:rStyle w:val="Hyperlink"/>
@@ -3714,8 +4277,8 @@
         <w:t xml:space="preserve">. Conservation Biology 17:488–499.</w:t>
       </w:r>
     </w:p>
-    <w:bookmarkEnd w:id="59"/>
-    <w:bookmarkStart w:id="61" w:name="ref-gotelli2001"/>
+    <w:bookmarkEnd w:id="69"/>
+    <w:bookmarkStart w:id="71" w:name="ref-gotelli2001"/>
     <w:p>
       <w:pPr>
         <w:pStyle w:val="Bibliography"/>
@@ -3726,7 +4289,7 @@
       <w:r>
         <w:t xml:space="preserve"> </w:t>
       </w:r>
-      <w:hyperlink r:id="rId60">
+      <w:hyperlink r:id="rId70">
         <w:r>
           <w:rPr>
             <w:rStyle w:val="Hyperlink"/>
@@ -3738,19 +4301,43 @@
         <w:t xml:space="preserve">. Ecology Letters 4:379–391.</w:t>
       </w:r>
     </w:p>
-    <w:bookmarkEnd w:id="61"/>
-    <w:bookmarkStart w:id="63" w:name="ref-gouveia2017"/>
+    <w:bookmarkEnd w:id="71"/>
+    <w:bookmarkStart w:id="73" w:name="ref-gotelli2002"/>
     <w:p>
       <w:pPr>
         <w:pStyle w:val="Bibliography"/>
       </w:pPr>
       <w:r>
-        <w:t xml:space="preserve">Gouveia, R. S. D., G. L. D. A. Lira, T. P. A. Ramos, and E. S. F. Medeiros. 2017.</w:t>
+        <w:t xml:space="preserve">Gotelli, N. J., and D. J. McCabe. 2002.</w:t>
       </w:r>
       <w:r>
         <w:t xml:space="preserve"> </w:t>
       </w:r>
-      <w:hyperlink r:id="rId62">
+      <w:hyperlink r:id="rId72">
+        <w:r>
+          <w:rPr>
+            <w:rStyle w:val="Hyperlink"/>
+          </w:rPr>
+          <w:t xml:space="preserve">Species co-occurrence: A meta-analysis of j. M. Diamond’s assembly rules model</w:t>
+        </w:r>
+      </w:hyperlink>
+      <w:r>
+        <w:t xml:space="preserve">. Ecology 83:2091–2096.</w:t>
+      </w:r>
+    </w:p>
+    <w:bookmarkEnd w:id="73"/>
+    <w:bookmarkStart w:id="75" w:name="ref-gouveia2017"/>
+    <w:p>
+      <w:pPr>
+        <w:pStyle w:val="Bibliography"/>
+      </w:pPr>
+      <w:r>
+        <w:t xml:space="preserve">Gouveia, R. S. D., G. L. D. A. Lira, T. P. Anselmo Ramos, and E. S. F. Medeiros. 2017.</w:t>
+      </w:r>
+      <w:r>
+        <w:t xml:space="preserve"> </w:t>
+      </w:r>
+      <w:hyperlink r:id="rId74">
         <w:r>
           <w:rPr>
             <w:rStyle w:val="Hyperlink"/>
@@ -3762,24 +4349,320 @@
         <w:t xml:space="preserve">. Check List 13:581–590.</w:t>
       </w:r>
     </w:p>
-    <w:bookmarkEnd w:id="63"/>
-    <w:bookmarkStart w:id="65" w:name="ref-haney1973"/>
+    <w:bookmarkEnd w:id="75"/>
+    <w:bookmarkStart w:id="76" w:name="ref-haney1973"/>
     <w:p>
       <w:pPr>
         <w:pStyle w:val="Bibliography"/>
       </w:pPr>
       <w:r>
-        <w:t xml:space="preserve">Haney, J. F., and D. J. Hall. 1973.</w:t>
+        <w:t xml:space="preserve">Haney, J. F., and D. J. Hall. 1973. Sugar-coated daphnia: A preservation technique for cladocerans. Limnology and Oceanography 18:331–333.</w:t>
+      </w:r>
+    </w:p>
+    <w:bookmarkEnd w:id="76"/>
+    <w:bookmarkStart w:id="78" w:name="ref-heinrichs2017"/>
+    <w:p>
+      <w:pPr>
+        <w:pStyle w:val="Bibliography"/>
+      </w:pPr>
+      <w:r>
+        <w:t xml:space="preserve">Heinrichs, R., R. Otto, A. Magalhães, and G. C. Meirelles. 2017.</w:t>
       </w:r>
       <w:r>
         <w:t xml:space="preserve"> </w:t>
       </w:r>
-      <w:hyperlink r:id="rId64">
+      <w:hyperlink r:id="rId77">
         <w:r>
           <w:rPr>
             <w:rStyle w:val="Hyperlink"/>
           </w:rPr>
-          <w:t xml:space="preserve">Sugar</w:t>
+          <w:t xml:space="preserve">Importance of sugarcane in brazilian and world bioeconomy</w:t>
+        </w:r>
+      </w:hyperlink>
+      <w:r>
+        <w:t xml:space="preserve">. Pages 205–217</w:t>
+      </w:r>
+      <w:r>
+        <w:t xml:space="preserve"> </w:t>
+      </w:r>
+      <w:r>
+        <w:rPr>
+          <w:i/>
+          <w:iCs/>
+        </w:rPr>
+        <w:t xml:space="preserve">in</w:t>
+      </w:r>
+      <w:r>
+        <w:t xml:space="preserve"> </w:t>
+      </w:r>
+      <w:r>
+        <w:t xml:space="preserve">S. Dabbert, I. Lewandowski, J. Weiss, and A. Pyka, editors. Springer International Publishing, Cham, Switzerland.</w:t>
+      </w:r>
+    </w:p>
+    <w:bookmarkEnd w:id="78"/>
+    <w:bookmarkStart w:id="80" w:name="ref-jost2007"/>
+    <w:p>
+      <w:pPr>
+        <w:pStyle w:val="Bibliography"/>
+      </w:pPr>
+      <w:r>
+        <w:t xml:space="preserve">Jost, L. 2007.</w:t>
+      </w:r>
+      <w:r>
+        <w:t xml:space="preserve"> </w:t>
+      </w:r>
+      <w:hyperlink r:id="rId79">
+        <w:r>
+          <w:rPr>
+            <w:rStyle w:val="Hyperlink"/>
+          </w:rPr>
+          <w:t xml:space="preserve">Partitioning diversity into independent alpha and beta components</w:t>
+        </w:r>
+      </w:hyperlink>
+      <w:r>
+        <w:t xml:space="preserve">. Ecology 88:2427–2439.</w:t>
+      </w:r>
+    </w:p>
+    <w:bookmarkEnd w:id="80"/>
+    <w:bookmarkStart w:id="82" w:name="ref-kaufman1990"/>
+    <w:p>
+      <w:pPr>
+        <w:pStyle w:val="Bibliography"/>
+      </w:pPr>
+      <w:r>
+        <w:t xml:space="preserve">Kaufman, L., and P. J. Rousseeuw. 1990.</w:t>
+      </w:r>
+      <w:r>
+        <w:t xml:space="preserve"> </w:t>
+      </w:r>
+      <w:hyperlink r:id="rId81">
+        <w:r>
+          <w:rPr>
+            <w:rStyle w:val="Hyperlink"/>
+          </w:rPr>
+          <w:t xml:space="preserve">Agglomerative nesting (program AGNES)</w:t>
+        </w:r>
+      </w:hyperlink>
+      <w:r>
+        <w:t xml:space="preserve">. Pages 199–252. First edition. Wiley.</w:t>
+      </w:r>
+    </w:p>
+    <w:bookmarkEnd w:id="82"/>
+    <w:bookmarkStart w:id="84" w:name="ref-keppeler2004"/>
+    <w:p>
+      <w:pPr>
+        <w:pStyle w:val="Bibliography"/>
+      </w:pPr>
+      <w:r>
+        <w:t xml:space="preserve">Keppeler, E. C., and E. R. Hardy. 2004.</w:t>
+      </w:r>
+      <w:r>
+        <w:t xml:space="preserve"> </w:t>
+      </w:r>
+      <w:hyperlink r:id="rId83">
+        <w:r>
+          <w:rPr>
+            <w:rStyle w:val="Hyperlink"/>
+          </w:rPr>
+          <w:t xml:space="preserve">Abundance and composition of rotifera in an abandoned meander lake (lago amapá) in rio branco, acre, brazil</w:t>
+        </w:r>
+      </w:hyperlink>
+      <w:r>
+        <w:t xml:space="preserve">. Revista Brasileira de Zoologia 21:233–241.</w:t>
+      </w:r>
+    </w:p>
+    <w:bookmarkEnd w:id="84"/>
+    <w:bookmarkStart w:id="86" w:name="ref-lande1996"/>
+    <w:p>
+      <w:pPr>
+        <w:pStyle w:val="Bibliography"/>
+      </w:pPr>
+      <w:r>
+        <w:t xml:space="preserve">Lande, R. 1996.</w:t>
+      </w:r>
+      <w:r>
+        <w:t xml:space="preserve"> </w:t>
+      </w:r>
+      <w:hyperlink r:id="rId85">
+        <w:r>
+          <w:rPr>
+            <w:rStyle w:val="Hyperlink"/>
+          </w:rPr>
+          <w:t xml:space="preserve">Statistics and partitioning of species diversity, and similarity among multiple communities</w:t>
+        </w:r>
+      </w:hyperlink>
+      <w:r>
+        <w:t xml:space="preserve">. Oikos 76:5.</w:t>
+      </w:r>
+    </w:p>
+    <w:bookmarkEnd w:id="86"/>
+    <w:bookmarkStart w:id="87" w:name="ref-lê2008"/>
+    <w:p>
+      <w:pPr>
+        <w:pStyle w:val="Bibliography"/>
+      </w:pPr>
+      <w:r>
+        <w:t xml:space="preserve">Lê, S., J. Josse, and F. Husson. 2008. FactoMineR: An r package for multivariate analysis. Journal of Statistical Software 25:1–18.</w:t>
+      </w:r>
+    </w:p>
+    <w:bookmarkEnd w:id="87"/>
+    <w:bookmarkStart w:id="88" w:name="ref-legendre1998"/>
+    <w:p>
+      <w:pPr>
+        <w:pStyle w:val="Bibliography"/>
+      </w:pPr>
+      <w:r>
+        <w:t xml:space="preserve">Legendre, P., and L. Legendre. 1998. Numerical ecology. 2nd English ed. Amsterdam, The Netherlands ; New York ; Oxford.</w:t>
+      </w:r>
+    </w:p>
+    <w:bookmarkEnd w:id="88"/>
+    <w:bookmarkStart w:id="90" w:name="ref-ligeiro2010"/>
+    <w:p>
+      <w:pPr>
+        <w:pStyle w:val="Bibliography"/>
+      </w:pPr>
+      <w:r>
+        <w:t xml:space="preserve">Ligeiro, R., A. S. Melo, and M. Callisto. 2010.</w:t>
+      </w:r>
+      <w:r>
+        <w:t xml:space="preserve"> </w:t>
+      </w:r>
+      <w:hyperlink r:id="rId89">
+        <w:r>
+          <w:rPr>
+            <w:rStyle w:val="Hyperlink"/>
+          </w:rPr>
+          <w:t xml:space="preserve">Spatial scale and the diversity of macroinvertebrates in a neotropical catchment</w:t>
+        </w:r>
+      </w:hyperlink>
+      <w:r>
+        <w:t xml:space="preserve">. Freshwater Biology 55:424–435.</w:t>
+      </w:r>
+    </w:p>
+    <w:bookmarkEnd w:id="90"/>
+    <w:bookmarkStart w:id="92" w:name="ref-lopes2014"/>
+    <w:p>
+      <w:pPr>
+        <w:pStyle w:val="Bibliography"/>
+      </w:pPr>
+      <w:r>
+        <w:t xml:space="preserve">Lopes, P. M., L. M. Bini, S. A. J. Declerck, V. F. Farjalla, L. C. G. Vieira, C. C. Bonecker, F. A. Lansac-Toha, F. A. Esteves, and R. L. Bozelli. 2014.</w:t>
+      </w:r>
+      <w:r>
+        <w:t xml:space="preserve"> </w:t>
+      </w:r>
+      <w:hyperlink r:id="rId91">
+        <w:r>
+          <w:rPr>
+            <w:rStyle w:val="Hyperlink"/>
+          </w:rPr>
+          <w:t xml:space="preserve">Correlates of zooplankton beta diversity in tropical lake systems</w:t>
+        </w:r>
+      </w:hyperlink>
+      <w:r>
+        <w:t xml:space="preserve">. PLoS ONE 9:e109581.</w:t>
+      </w:r>
+    </w:p>
+    <w:bookmarkEnd w:id="92"/>
+    <w:bookmarkStart w:id="94" w:name="ref-lucena2015"/>
+    <w:p>
+      <w:pPr>
+        <w:pStyle w:val="Bibliography"/>
+      </w:pPr>
+      <w:r>
+        <w:t xml:space="preserve">Lucena, L. C. A., T. X. Melo, and E. S. F. Medeiros. 2015.</w:t>
+      </w:r>
+      <w:r>
+        <w:t xml:space="preserve"> </w:t>
+      </w:r>
+      <w:hyperlink r:id="rId93">
+        <w:r>
+          <w:rPr>
+            <w:rStyle w:val="Hyperlink"/>
+          </w:rPr>
+          <w:t xml:space="preserve">Zooplankton community of parnaíba river, northeastern brazil</w:t>
+        </w:r>
+      </w:hyperlink>
+      <w:r>
+        <w:t xml:space="preserve">. Acta Limnologica Brasiliensia 27:118–129.</w:t>
+      </w:r>
+    </w:p>
+    <w:bookmarkEnd w:id="94"/>
+    <w:bookmarkStart w:id="95" w:name="ref-mackereth1978"/>
+    <w:p>
+      <w:pPr>
+        <w:pStyle w:val="Bibliography"/>
+      </w:pPr>
+      <w:r>
+        <w:t xml:space="preserve">Mackereth, F. J. H., J. Heron, and J. F. Talling. 1978. Water analysis: Some revised methods for limnologists.(scientific publication n. 36) freshwater biological association. Cumbria and Dorset, England.</w:t>
+      </w:r>
+    </w:p>
+    <w:bookmarkEnd w:id="95"/>
+    <w:bookmarkStart w:id="97" w:name="ref-maechler2026"/>
+    <w:p>
+      <w:pPr>
+        <w:pStyle w:val="Bibliography"/>
+      </w:pPr>
+      <w:r>
+        <w:t xml:space="preserve">Maechler, M., P. Rousseeuw, A. Struyf, M. Hubert, and K. Hornik. 2026.</w:t>
+      </w:r>
+      <w:r>
+        <w:t xml:space="preserve"> </w:t>
+      </w:r>
+      <w:hyperlink r:id="rId96">
+        <w:r>
+          <w:rPr>
+            <w:rStyle w:val="Hyperlink"/>
+          </w:rPr>
+          <w:t xml:space="preserve">Cluster: Cluster analysis basics and extensions</w:t>
+        </w:r>
+      </w:hyperlink>
+      <w:r>
+        <w:t xml:space="preserve">.</w:t>
+      </w:r>
+    </w:p>
+    <w:bookmarkEnd w:id="97"/>
+    <w:bookmarkStart w:id="99" w:name="ref-maitland1990"/>
+    <w:p>
+      <w:pPr>
+        <w:pStyle w:val="Bibliography"/>
+      </w:pPr>
+      <w:r>
+        <w:t xml:space="preserve">Maitland, P. S. 1990.</w:t>
+      </w:r>
+      <w:r>
+        <w:t xml:space="preserve"> </w:t>
+      </w:r>
+      <w:hyperlink r:id="rId98">
+        <w:r>
+          <w:rPr>
+            <w:rStyle w:val="Hyperlink"/>
+          </w:rPr>
+          <w:t xml:space="preserve">Biology of fresh waters</w:t>
+        </w:r>
+      </w:hyperlink>
+      <w:r>
+        <w:t xml:space="preserve">. Second edition. Chapman; Hall, New York.</w:t>
+      </w:r>
+    </w:p>
+    <w:bookmarkEnd w:id="99"/>
+    <w:bookmarkStart w:id="101" w:name="ref-maltchik2006"/>
+    <w:p>
+      <w:pPr>
+        <w:pStyle w:val="Bibliography"/>
+      </w:pPr>
+      <w:r>
+        <w:t xml:space="preserve">Maltchik, L., and E. S. F. Medeiros. 2006.</w:t>
+      </w:r>
+      <w:r>
+        <w:t xml:space="preserve"> </w:t>
+      </w:r>
+      <w:hyperlink r:id="rId100">
+        <w:r>
+          <w:rPr>
+            <w:rStyle w:val="Hyperlink"/>
+          </w:rPr>
+          <w:t xml:space="preserve">Conservation importance of semi</w:t>
         </w:r>
         <w:r>
           <w:rPr>
@@ -3791,300 +4674,82 @@
           <w:rPr>
             <w:rStyle w:val="Hyperlink"/>
           </w:rPr>
-          <w:t xml:space="preserve">coated</w:t>
+          <w:t xml:space="preserve">arid streams in north</w:t>
         </w:r>
         <w:r>
           <w:rPr>
             <w:rStyle w:val="Hyperlink"/>
           </w:rPr>
-          <w:t xml:space="preserve"> </w:t>
-        </w:r>
-        <w:r>
-          <w:rPr>
-            <w:rStyle w:val="Hyperlink"/>
-            <w:i/>
-            <w:iCs/>
-          </w:rPr>
-          <w:t xml:space="preserve">Daphnia</w:t>
+          <w:t xml:space="preserve">-</w:t>
         </w:r>
         <w:r>
           <w:rPr>
             <w:rStyle w:val="Hyperlink"/>
           </w:rPr>
-          <w:t xml:space="preserve"> </w:t>
+          <w:t xml:space="preserve">eastern brazil: Implications of hydrological disturbance and species diversity</w:t>
         </w:r>
+      </w:hyperlink>
+      <w:r>
+        <w:t xml:space="preserve">. Aquatic Conservation: Marine and Freshwater Ecosystems 16:665–677.</w:t>
+      </w:r>
+    </w:p>
+    <w:bookmarkEnd w:id="101"/>
+    <w:bookmarkStart w:id="103" w:name="ref-marcelino2025"/>
+    <w:p>
+      <w:pPr>
+        <w:pStyle w:val="Bibliography"/>
+      </w:pPr>
+      <w:r>
+        <w:t xml:space="preserve">Marcelino, C. N., L. F. Brandão, C. D. M. Correia, A. C. Ferreira, D. K. Petsch, and J. L. Portinho. 2025.</w:t>
+      </w:r>
+      <w:r>
+        <w:t xml:space="preserve"> </w:t>
+      </w:r>
+      <w:hyperlink r:id="rId102">
         <w:r>
           <w:rPr>
             <w:rStyle w:val="Hyperlink"/>
           </w:rPr>
-          <w:t xml:space="preserve">: A preservation technique for Cladocera1</w:t>
+          <w:t xml:space="preserve">Quantification and analysis of emerging threats studies on freshwater zooplankton (copepoda, cladocera and rotifera) in brazil from 2014 to 2023</w:t>
         </w:r>
       </w:hyperlink>
       <w:r>
-        <w:t xml:space="preserve">. Limnology and Oceanography 18:331–333.</w:t>
+        <w:t xml:space="preserve">. Acta Limnologica Brasiliensia 37:e30.</w:t>
       </w:r>
     </w:p>
-    <w:bookmarkEnd w:id="65"/>
-    <w:bookmarkStart w:id="67" w:name="ref-heinrichs2017"/>
+    <w:bookmarkEnd w:id="103"/>
+    <w:bookmarkStart w:id="104" w:name="ref-mccune2002"/>
     <w:p>
       <w:pPr>
         <w:pStyle w:val="Bibliography"/>
       </w:pPr>
       <w:r>
-        <w:t xml:space="preserve">Heinrichs, R., R. Otto, A. Magalhães, and G. C. Meirelles. 2017.</w:t>
-      </w:r>
-      <w:r>
-        <w:t xml:space="preserve"> </w:t>
-      </w:r>
-      <w:hyperlink r:id="rId66">
-        <w:r>
-          <w:rPr>
-            <w:rStyle w:val="Hyperlink"/>
-          </w:rPr>
-          <w:t xml:space="preserve">Importance of sugarcane in brazilian and world bioeconomy</w:t>
-        </w:r>
-      </w:hyperlink>
-      <w:r>
-        <w:t xml:space="preserve">. Pages 205–217</w:t>
-      </w:r>
-      <w:r>
-        <w:t xml:space="preserve"> </w:t>
-      </w:r>
-      <w:r>
-        <w:rPr>
-          <w:i/>
-          <w:iCs/>
-        </w:rPr>
-        <w:t xml:space="preserve">in</w:t>
-      </w:r>
-      <w:r>
-        <w:t xml:space="preserve"> </w:t>
-      </w:r>
-      <w:r>
-        <w:t xml:space="preserve">S. Dabbert, I. Lewandowski, J. Weiss, and A. Pyka, editors. Springer International Publishing, Cham, Switzerland.</w:t>
+        <w:t xml:space="preserve">McCune, B., and J. B. Grace. 2002. Analysis of ecological communities. MjM Software Design, Gleneden Beach, Oregon, U.S.A.</w:t>
       </w:r>
     </w:p>
-    <w:bookmarkEnd w:id="67"/>
-    <w:bookmarkStart w:id="69" w:name="ref-kaufman1990"/>
+    <w:bookmarkEnd w:id="104"/>
+    <w:bookmarkStart w:id="105" w:name="ref-medeiros2008"/>
     <w:p>
       <w:pPr>
         <w:pStyle w:val="Bibliography"/>
       </w:pPr>
       <w:r>
-        <w:t xml:space="preserve">Kaufman, L., and P. J. Rousseeuw. 1990.</w:t>
-      </w:r>
-      <w:r>
-        <w:t xml:space="preserve"> </w:t>
-      </w:r>
-      <w:hyperlink r:id="rId68">
-        <w:r>
-          <w:rPr>
-            <w:rStyle w:val="Hyperlink"/>
-          </w:rPr>
-          <w:t xml:space="preserve">Agglomerative nesting (program AGNES)</w:t>
-        </w:r>
-      </w:hyperlink>
-      <w:r>
-        <w:t xml:space="preserve">. Pages 199–252. First edition. Wiley.</w:t>
+        <w:t xml:space="preserve">Medeiros, E. S. F., M. J. Silva, and R. T. C. Ramos. 2008. Application of catchment- and local-scale variables for aquatic habitat characterization and assessment in the brazilian semi-arid region. Neotropical Biology and Conservation 3:13–20.</w:t>
       </w:r>
     </w:p>
-    <w:bookmarkEnd w:id="69"/>
-    <w:bookmarkStart w:id="71" w:name="ref-lande1996"/>
+    <w:bookmarkEnd w:id="105"/>
+    <w:bookmarkStart w:id="107" w:name="ref-mehla2026"/>
     <w:p>
       <w:pPr>
         <w:pStyle w:val="Bibliography"/>
       </w:pPr>
       <w:r>
-        <w:t xml:space="preserve">Lande, R. 1996.</w:t>
+        <w:t xml:space="preserve">Mehla, M. K., J. Jeong, G. Cho, J. E. Wolfe, and E. Kan. 2026.</w:t>
       </w:r>
       <w:r>
         <w:t xml:space="preserve"> </w:t>
       </w:r>
-      <w:hyperlink r:id="rId70">
-        <w:r>
-          <w:rPr>
-            <w:rStyle w:val="Hyperlink"/>
-          </w:rPr>
-          <w:t xml:space="preserve">Statistics and partitioning of species diversity, and similarity among multiple communities</w:t>
-        </w:r>
-      </w:hyperlink>
-      <w:r>
-        <w:t xml:space="preserve">. Oikos 76:5.</w:t>
-      </w:r>
-    </w:p>
-    <w:bookmarkEnd w:id="71"/>
-    <w:bookmarkStart w:id="72" w:name="ref-lê2008"/>
-    <w:p>
-      <w:pPr>
-        <w:pStyle w:val="Bibliography"/>
-      </w:pPr>
-      <w:r>
-        <w:t xml:space="preserve">Lê, S., J. Josse, and F. Husson. 2008. FactoMineR: An r package for multivariate analysis. Journal of Statistical Software 25:1–18.</w:t>
-      </w:r>
-    </w:p>
-    <w:bookmarkEnd w:id="72"/>
-    <w:bookmarkStart w:id="73" w:name="ref-legendre1998"/>
-    <w:p>
-      <w:pPr>
-        <w:pStyle w:val="Bibliography"/>
-      </w:pPr>
-      <w:r>
-        <w:t xml:space="preserve">Legendre, P., and L. Legendre. 1998. Numerical ecology. 2nd English ed. Amsterdam, The Netherlands ; New York ; Oxford.</w:t>
-      </w:r>
-    </w:p>
-    <w:bookmarkEnd w:id="73"/>
-    <w:bookmarkStart w:id="75" w:name="ref-ligeiro2010"/>
-    <w:p>
-      <w:pPr>
-        <w:pStyle w:val="Bibliography"/>
-      </w:pPr>
-      <w:r>
-        <w:t xml:space="preserve">Ligeiro, R., A. S. Melo, and M. Callisto. 2010.</w:t>
-      </w:r>
-      <w:r>
-        <w:t xml:space="preserve"> </w:t>
-      </w:r>
-      <w:hyperlink r:id="rId74">
-        <w:r>
-          <w:rPr>
-            <w:rStyle w:val="Hyperlink"/>
-          </w:rPr>
-          <w:t xml:space="preserve">Spatial scale and the diversity of macroinvertebrates in a neotropical catchment</w:t>
-        </w:r>
-      </w:hyperlink>
-      <w:r>
-        <w:t xml:space="preserve">. Freshwater Biology 2010:424–435.</w:t>
-      </w:r>
-    </w:p>
-    <w:bookmarkEnd w:id="75"/>
-    <w:bookmarkStart w:id="77" w:name="ref-lucena2015"/>
-    <w:p>
-      <w:pPr>
-        <w:pStyle w:val="Bibliography"/>
-      </w:pPr>
-      <w:r>
-        <w:t xml:space="preserve">Lucena, L. C. A., T. X. Melo, and E. S. F. Medeiros. 2015.</w:t>
-      </w:r>
-      <w:r>
-        <w:t xml:space="preserve"> </w:t>
-      </w:r>
-      <w:hyperlink r:id="rId76">
-        <w:r>
-          <w:rPr>
-            <w:rStyle w:val="Hyperlink"/>
-          </w:rPr>
-          <w:t xml:space="preserve">Zooplankton community of parnaíba river, northeastern brazil</w:t>
-        </w:r>
-      </w:hyperlink>
-      <w:r>
-        <w:t xml:space="preserve">. Acta Limnologica Brasiliensia 27:118–129.</w:t>
-      </w:r>
-    </w:p>
-    <w:bookmarkEnd w:id="77"/>
-    <w:bookmarkStart w:id="78" w:name="ref-mackereth1978"/>
-    <w:p>
-      <w:pPr>
-        <w:pStyle w:val="Bibliography"/>
-      </w:pPr>
-      <w:r>
-        <w:t xml:space="preserve">Mackereth, F. J. H., J. Heron, and J. F. Talling. 1978. Water analysis: Some revised methods for limnologists.(scientific publication n. 36) freshwater biological association. Cumbria and Dorset, England.</w:t>
-      </w:r>
-    </w:p>
-    <w:bookmarkEnd w:id="78"/>
-    <w:bookmarkStart w:id="80" w:name="ref-maechler2026"/>
-    <w:p>
-      <w:pPr>
-        <w:pStyle w:val="Bibliography"/>
-      </w:pPr>
-      <w:r>
-        <w:t xml:space="preserve">Maechler, M., P. Rousseeuw, A. Struyf, M. Hubert, and K. Hornik. 2026.</w:t>
-      </w:r>
-      <w:r>
-        <w:t xml:space="preserve"> </w:t>
-      </w:r>
-      <w:hyperlink r:id="rId79">
-        <w:r>
-          <w:rPr>
-            <w:rStyle w:val="Hyperlink"/>
-          </w:rPr>
-          <w:t xml:space="preserve">Cluster: Cluster analysis basics and extensions</w:t>
-        </w:r>
-      </w:hyperlink>
-      <w:r>
-        <w:t xml:space="preserve">.</w:t>
-      </w:r>
-    </w:p>
-    <w:bookmarkEnd w:id="80"/>
-    <w:bookmarkStart w:id="82" w:name="ref-maitland1990"/>
-    <w:p>
-      <w:pPr>
-        <w:pStyle w:val="Bibliography"/>
-      </w:pPr>
-      <w:r>
-        <w:t xml:space="preserve">Maitland, P. S. 1990.</w:t>
-      </w:r>
-      <w:r>
-        <w:t xml:space="preserve"> </w:t>
-      </w:r>
-      <w:hyperlink r:id="rId81">
-        <w:r>
-          <w:rPr>
-            <w:rStyle w:val="Hyperlink"/>
-          </w:rPr>
-          <w:t xml:space="preserve">Biology of fresh waters</w:t>
-        </w:r>
-      </w:hyperlink>
-      <w:r>
-        <w:t xml:space="preserve">. First edition. Springer Netherlands, Dordrecht.</w:t>
-      </w:r>
-    </w:p>
-    <w:bookmarkEnd w:id="82"/>
-    <w:bookmarkStart w:id="83" w:name="ref-mccune2002"/>
-    <w:p>
-      <w:pPr>
-        <w:pStyle w:val="Bibliography"/>
-      </w:pPr>
-      <w:r>
-        <w:t xml:space="preserve">McCune, B., and J. B. Grace. 2002. Analysis of ecological communities. MjM Software Design, Gleneden Beach, Oregon, U.S.A.</w:t>
-      </w:r>
-    </w:p>
-    <w:bookmarkEnd w:id="83"/>
-    <w:bookmarkStart w:id="85" w:name="ref-medeiros2008"/>
-    <w:p>
-      <w:pPr>
-        <w:pStyle w:val="Bibliography"/>
-      </w:pPr>
-      <w:r>
-        <w:t xml:space="preserve">Medeiros, E. S. F., M. J. Silva, and R. T. C. Ramos. 2008.</w:t>
-      </w:r>
-      <w:r>
-        <w:t xml:space="preserve"> </w:t>
-      </w:r>
-      <w:hyperlink r:id="rId84">
-        <w:r>
-          <w:rPr>
-            <w:rStyle w:val="Hyperlink"/>
-          </w:rPr>
-          <w:t xml:space="preserve">Application of catchment- and local-scale variables for aquatic habitat characterization and assessment in the Brazilian semi-arid region</w:t>
-        </w:r>
-      </w:hyperlink>
-      <w:r>
-        <w:t xml:space="preserve">. Neotropical Biology and Conservation 3:13–20.</w:t>
-      </w:r>
-    </w:p>
-    <w:bookmarkEnd w:id="85"/>
-    <w:bookmarkStart w:id="87" w:name="ref-mehla2026"/>
-    <w:p>
-      <w:pPr>
-        <w:pStyle w:val="Bibliography"/>
-      </w:pPr>
-      <w:r>
-        <w:t xml:space="preserve">Mehla, M. K., J. Jeong, G. Cho, J. E. Wolfe, and E. Kan. 2026.</w:t>
-      </w:r>
-      <w:r>
-        <w:t xml:space="preserve"> </w:t>
-      </w:r>
-      <w:hyperlink r:id="rId86">
+      <w:hyperlink r:id="rId106">
         <w:r>
           <w:rPr>
             <w:rStyle w:val="Hyperlink"/>
@@ -4096,32 +4761,32 @@
         <w:t xml:space="preserve">. Water Research 307:126704.</w:t>
       </w:r>
     </w:p>
-    <w:bookmarkEnd w:id="87"/>
-    <w:bookmarkStart w:id="89" w:name="ref-melo2014"/>
+    <w:bookmarkEnd w:id="107"/>
+    <w:bookmarkStart w:id="109" w:name="ref-melo2014"/>
     <w:p>
       <w:pPr>
         <w:pStyle w:val="Bibliography"/>
       </w:pPr>
       <w:r>
-        <w:t xml:space="preserve">Melo, T. X. D., L. D. J. S. Lourenço, and E. S. F. Medeiros. 2014.</w:t>
+        <w:t xml:space="preserve">Melo, T. X. de. 2014, March 31.</w:t>
       </w:r>
       <w:r>
         <w:t xml:space="preserve"> </w:t>
       </w:r>
-      <w:hyperlink r:id="rId88">
+      <w:hyperlink r:id="rId108">
         <w:r>
           <w:rPr>
             <w:rStyle w:val="Hyperlink"/>
           </w:rPr>
-          <w:t xml:space="preserve">Checklist of zooplankton from the upper ipanema river (pernambuco), an intermittent river in semi-arid brazil</w:t>
+          <w:t xml:space="preserve">Preditores ambientais do zooplâncton em poças temporárias de um rio intermitente</w:t>
         </w:r>
       </w:hyperlink>
       <w:r>
-        <w:t xml:space="preserve">. Check List 10:524–528.</w:t>
+        <w:t xml:space="preserve">. PhD thesis, João Pessoa - PB.</w:t>
       </w:r>
     </w:p>
-    <w:bookmarkEnd w:id="89"/>
-    <w:bookmarkStart w:id="91" w:name="ref-melo2013"/>
+    <w:bookmarkEnd w:id="109"/>
+    <w:bookmarkStart w:id="111" w:name="ref-melo2013"/>
     <w:p>
       <w:pPr>
         <w:pStyle w:val="Bibliography"/>
@@ -4132,7 +4797,7 @@
       <w:r>
         <w:t xml:space="preserve"> </w:t>
       </w:r>
-      <w:hyperlink r:id="rId90">
+      <w:hyperlink r:id="rId110">
         <w:r>
           <w:rPr>
             <w:rStyle w:val="Hyperlink"/>
@@ -4144,29 +4809,64 @@
         <w:t xml:space="preserve">. International Journal of Biodiversity 2013:1–13.</w:t>
       </w:r>
     </w:p>
-    <w:bookmarkEnd w:id="91"/>
-    <w:bookmarkStart w:id="92" w:name="ref-mma2003"/>
+    <w:bookmarkEnd w:id="111"/>
+    <w:bookmarkStart w:id="113" w:name="ref-meyer2007"/>
     <w:p>
       <w:pPr>
         <w:pStyle w:val="Bibliography"/>
       </w:pPr>
       <w:r>
-        <w:t xml:space="preserve">MMA. 2003. Plano de Manejo da Reserva Biológica Guaribas. [S.I.].</w:t>
+        <w:t xml:space="preserve">Meyer, J. L., D. L. Strayer, J. B. Wallace, S. L. Eggert, G. S. Helfman, and N. E. Leonard. 2007.</w:t>
+      </w:r>
+      <w:r>
+        <w:t xml:space="preserve"> </w:t>
+      </w:r>
+      <w:hyperlink r:id="rId112">
+        <w:r>
+          <w:rPr>
+            <w:rStyle w:val="Hyperlink"/>
+          </w:rPr>
+          <w:t xml:space="preserve">The contribution of headwater streams to biodiversity in river networks</w:t>
+        </w:r>
+      </w:hyperlink>
+      <w:r>
+        <w:t xml:space="preserve">. Journal of the American Water Resources Association 43:86–103.</w:t>
       </w:r>
     </w:p>
-    <w:bookmarkEnd w:id="92"/>
-    <w:bookmarkStart w:id="94" w:name="ref-mma2026"/>
+    <w:bookmarkEnd w:id="113"/>
+    <w:bookmarkStart w:id="115" w:name="ref-mma2003"/>
     <w:p>
       <w:pPr>
         <w:pStyle w:val="Bibliography"/>
       </w:pPr>
       <w:r>
+        <w:t xml:space="preserve">MMA. 2003.</w:t>
+      </w:r>
+      <w:r>
+        <w:t xml:space="preserve"> </w:t>
+      </w:r>
+      <w:hyperlink r:id="rId114">
+        <w:r>
+          <w:rPr>
+            <w:rStyle w:val="Hyperlink"/>
+          </w:rPr>
+          <w:t xml:space="preserve">Plano de manejo reserva biológica guaribas. Fase 2.</w:t>
+        </w:r>
+      </w:hyperlink>
+    </w:p>
+    <w:bookmarkEnd w:id="115"/>
+    <w:bookmarkStart w:id="117" w:name="ref-mma2026"/>
+    <w:p>
+      <w:pPr>
+        <w:pStyle w:val="Bibliography"/>
+      </w:pPr>
+      <w:r>
         <w:t xml:space="preserve">MMA. 2026.</w:t>
       </w:r>
       <w:r>
         <w:t xml:space="preserve"> </w:t>
       </w:r>
-      <w:hyperlink r:id="rId93">
+      <w:hyperlink r:id="rId116">
         <w:r>
           <w:rPr>
             <w:rStyle w:val="Hyperlink"/>
@@ -4178,8 +4878,8 @@
         <w:t xml:space="preserve">. Page 56. Mamanguape, PB.</w:t>
       </w:r>
     </w:p>
-    <w:bookmarkEnd w:id="94"/>
-    <w:bookmarkStart w:id="96" w:name="ref-mugodo2006"/>
+    <w:bookmarkEnd w:id="117"/>
+    <w:bookmarkStart w:id="119" w:name="ref-mugodo2006"/>
     <w:p>
       <w:pPr>
         <w:pStyle w:val="Bibliography"/>
@@ -4190,7 +4890,7 @@
       <w:r>
         <w:t xml:space="preserve"> </w:t>
       </w:r>
-      <w:hyperlink r:id="rId95">
+      <w:hyperlink r:id="rId118">
         <w:r>
           <w:rPr>
             <w:rStyle w:val="Hyperlink"/>
@@ -4202,42 +4902,56 @@
         <w:t xml:space="preserve">. Hydrobiologia 572:59–70.</w:t>
       </w:r>
     </w:p>
-    <w:bookmarkEnd w:id="96"/>
-    <w:bookmarkStart w:id="97" w:name="ref-oksanen2020"/>
+    <w:bookmarkEnd w:id="119"/>
+    <w:bookmarkStart w:id="121" w:name="ref-myers2000"/>
     <w:p>
       <w:pPr>
         <w:pStyle w:val="Bibliography"/>
       </w:pPr>
       <w:r>
-        <w:t xml:space="preserve">Oksanen, J., F. G. Blanchet, R. Kindt, P. Legendre, P. Minchin, B. O’Hara, G. Simpson, P. Solymos, H. Stevens, and H. Wagner. 2020. Vegan: Community ecology package. R Package Version 2.2-1 2:1–2.</w:t>
+        <w:t xml:space="preserve">Myers, N., R. A. Mittermeier, C. G. Mittermeier, G. A. B. Fonseca, and J. Kent. 2000.</w:t>
+      </w:r>
+      <w:r>
+        <w:t xml:space="preserve"> </w:t>
+      </w:r>
+      <w:hyperlink r:id="rId120">
+        <w:r>
+          <w:rPr>
+            <w:rStyle w:val="Hyperlink"/>
+          </w:rPr>
+          <w:t xml:space="preserve">Biodiversity hotspots for conservation priorities</w:t>
+        </w:r>
+      </w:hyperlink>
+      <w:r>
+        <w:t xml:space="preserve">. Nature 403:853–858.</w:t>
       </w:r>
     </w:p>
-    <w:bookmarkEnd w:id="97"/>
-    <w:bookmarkStart w:id="99" w:name="ref-oksanen"/>
+    <w:bookmarkEnd w:id="121"/>
+    <w:bookmarkStart w:id="123" w:name="ref-oksanen2020"/>
     <w:p>
       <w:pPr>
         <w:pStyle w:val="Bibliography"/>
       </w:pPr>
       <w:r>
-        <w:t xml:space="preserve">Oksanen, J., G. L. Simpson, F. G. Blanchet, R. Kindt, P. Legendre, P. R. Minchin, R. B. O’Hara, P. Solymos, M. H. H. Stevens, E. Szoecs, H. Wagner, M. Barbour, M. Bedward, B. Bolker, D. Borcard, T. Borman, G. Carvalho, M. Chirico, M. Caceres, S. Durand, H. B. A. Evangelista, R. FitzJohn, M. Friendly, B. Furneaux, G. Hannigan, M. O. Hill, L. Lahti, C. Martino, D. McGlinn, M.-H. Ouellette, E. Ribeiro Cunha, T. Smith, A. Stier, C. J. F. T. Braak, and J. Weedon. (n.d.).</w:t>
+        <w:t xml:space="preserve">Oksanen, J., F. G. Blanchet, M. Friendly, R. Kindt, P. Legendre, D. McGlinn, P. R. Minchin, R. B. O’Hara, G. L. Simpson, P. Solymos, M. H. H. Stevens, E. Szoecs, and H. Wagner. 2020.</w:t>
       </w:r>
       <w:r>
         <w:t xml:space="preserve"> </w:t>
       </w:r>
-      <w:hyperlink r:id="rId98">
+      <w:hyperlink r:id="rId122">
         <w:r>
           <w:rPr>
             <w:rStyle w:val="Hyperlink"/>
           </w:rPr>
-          <w:t xml:space="preserve">Vegan: Community ecology package</w:t>
+          <w:t xml:space="preserve">Vegan: Community ecology package. R package version 2.5-7</w:t>
         </w:r>
       </w:hyperlink>
       <w:r>
-        <w:t xml:space="preserve">.</w:t>
+        <w:t xml:space="preserve">. The Comprehensive R Archive Network Archive.</w:t>
       </w:r>
     </w:p>
-    <w:bookmarkEnd w:id="99"/>
-    <w:bookmarkStart w:id="101" w:name="ref-peel2007"/>
+    <w:bookmarkEnd w:id="123"/>
+    <w:bookmarkStart w:id="125" w:name="ref-peel2007"/>
     <w:p>
       <w:pPr>
         <w:pStyle w:val="Bibliography"/>
@@ -4248,7 +4962,7 @@
       <w:r>
         <w:t xml:space="preserve"> </w:t>
       </w:r>
-      <w:hyperlink r:id="rId100">
+      <w:hyperlink r:id="rId124">
         <w:r>
           <w:rPr>
             <w:rStyle w:val="Hyperlink"/>
@@ -4260,8 +4974,8 @@
         <w:t xml:space="preserve">. Hydrology and Earth System Sciences 11:1633–1644.</w:t>
       </w:r>
     </w:p>
-    <w:bookmarkEnd w:id="101"/>
-    <w:bookmarkStart w:id="103" w:name="ref-pereira2026"/>
+    <w:bookmarkEnd w:id="125"/>
+    <w:bookmarkStart w:id="127" w:name="ref-pereira2026"/>
     <w:p>
       <w:pPr>
         <w:pStyle w:val="Bibliography"/>
@@ -4272,7 +4986,7 @@
       <w:r>
         <w:t xml:space="preserve"> </w:t>
       </w:r>
-      <w:hyperlink r:id="rId102">
+      <w:hyperlink r:id="rId126">
         <w:r>
           <w:rPr>
             <w:rStyle w:val="Hyperlink"/>
@@ -4284,45 +4998,29 @@
         <w:t xml:space="preserve"> Biological Conservation 321:Article 111958.</w:t>
       </w:r>
     </w:p>
-    <w:bookmarkEnd w:id="103"/>
-    <w:bookmarkStart w:id="104" w:name="ref-pusey2004"/>
+    <w:bookmarkEnd w:id="127"/>
+    <w:bookmarkStart w:id="128" w:name="ref-pusey2004"/>
     <w:p>
       <w:pPr>
         <w:pStyle w:val="Bibliography"/>
       </w:pPr>
       <w:r>
-        <w:t xml:space="preserve">Pusey, B., M. J. Kennard, and A. Arthington. 2004. Study area, data collection, analysis and presentation. Pages 26–48</w:t>
-      </w:r>
-      <w:r>
-        <w:t xml:space="preserve"> </w:t>
-      </w:r>
-      <w:r>
-        <w:rPr>
-          <w:i/>
-          <w:iCs/>
-        </w:rPr>
-        <w:t xml:space="preserve">in</w:t>
-      </w:r>
-      <w:r>
-        <w:t xml:space="preserve"> </w:t>
-      </w:r>
-      <w:r>
-        <w:t xml:space="preserve">B. Pusey, M. J. Kennard, and A. Arthington, editors. CSIRO Publishing, Melbourne, Australia. 682 pp.</w:t>
+        <w:t xml:space="preserve">Pusey, B. J., M. J. Kennard, and A. H. Arthington. 2004. Freshwater fishes of north-eastern australia. CSIRO Publishing, Melbourne, Australia.</w:t>
       </w:r>
     </w:p>
-    <w:bookmarkEnd w:id="104"/>
-    <w:bookmarkStart w:id="106" w:name="ref-rcoreteam2017"/>
+    <w:bookmarkEnd w:id="128"/>
+    <w:bookmarkStart w:id="130" w:name="ref-rdevelopmentcoreteam2017"/>
     <w:p>
       <w:pPr>
         <w:pStyle w:val="Bibliography"/>
       </w:pPr>
       <w:r>
-        <w:t xml:space="preserve">R Core Team. 2017.</w:t>
+        <w:t xml:space="preserve">R Development Core Team. 2017.</w:t>
       </w:r>
       <w:r>
         <w:t xml:space="preserve"> </w:t>
       </w:r>
-      <w:hyperlink r:id="rId105">
+      <w:hyperlink r:id="rId129">
         <w:r>
           <w:rPr>
             <w:rStyle w:val="Hyperlink"/>
@@ -4331,11 +5029,11 @@
         </w:r>
       </w:hyperlink>
       <w:r>
-        <w:t xml:space="preserve">.</w:t>
+        <w:t xml:space="preserve">. R Foundation for Statistical Computing, Austria.</w:t>
       </w:r>
     </w:p>
-    <w:bookmarkEnd w:id="106"/>
-    <w:bookmarkStart w:id="108" w:name="ref-rocha2012"/>
+    <w:bookmarkEnd w:id="130"/>
+    <w:bookmarkStart w:id="132" w:name="ref-rocha2012"/>
     <w:p>
       <w:pPr>
         <w:pStyle w:val="Bibliography"/>
@@ -4346,7 +5044,7 @@
       <w:r>
         <w:t xml:space="preserve"> </w:t>
       </w:r>
-      <w:hyperlink r:id="rId107">
+      <w:hyperlink r:id="rId131">
         <w:r>
           <w:rPr>
             <w:rStyle w:val="Hyperlink"/>
@@ -4358,19 +5056,67 @@
         <w:t xml:space="preserve">. Journal of Arid Environments 85:33–40.</w:t>
       </w:r>
     </w:p>
-    <w:bookmarkEnd w:id="108"/>
-    <w:bookmarkStart w:id="110" w:name="ref-saraçli2013"/>
+    <w:bookmarkEnd w:id="132"/>
+    <w:bookmarkStart w:id="134" w:name="ref-romanelli2022"/>
     <w:p>
       <w:pPr>
         <w:pStyle w:val="Bibliography"/>
       </w:pPr>
       <w:r>
+        <w:t xml:space="preserve">Romanelli, J. P., P. Meli, J. P. B. Santos, I. N. Jacob, L. R. Souza, A. V. Rodrigues, D. P. Trevisan, C. Huang, D. R. A. Almeida, L. G. M. Silva, M. L. R. C. Lopes Assad, M. W. Cadotte, and R. R. Rodrigues. 2022.</w:t>
+      </w:r>
+      <w:r>
+        <w:t xml:space="preserve"> </w:t>
+      </w:r>
+      <w:hyperlink r:id="rId133">
+        <w:r>
+          <w:rPr>
+            <w:rStyle w:val="Hyperlink"/>
+          </w:rPr>
+          <w:t xml:space="preserve">Biodiversity responses to restoration across the brazilian atlantic forest</w:t>
+        </w:r>
+      </w:hyperlink>
+      <w:r>
+        <w:t xml:space="preserve">. Science of The Total Environment 821:153403.</w:t>
+      </w:r>
+    </w:p>
+    <w:bookmarkEnd w:id="134"/>
+    <w:bookmarkStart w:id="136" w:name="ref-safar2020"/>
+    <w:p>
+      <w:pPr>
+        <w:pStyle w:val="Bibliography"/>
+      </w:pPr>
+      <w:r>
+        <w:t xml:space="preserve">Safar, N. V. H., L. F. S. Magnago, and C. E. G. R. Schaefer. 2020.</w:t>
+      </w:r>
+      <w:r>
+        <w:t xml:space="preserve"> </w:t>
+      </w:r>
+      <w:hyperlink r:id="rId135">
+        <w:r>
+          <w:rPr>
+            <w:rStyle w:val="Hyperlink"/>
+          </w:rPr>
+          <w:t xml:space="preserve">Resilience of lowland atlantic forests in a highly fragmented landscape: Insights on the temporal scale of landscape restoration</w:t>
+        </w:r>
+      </w:hyperlink>
+      <w:r>
+        <w:t xml:space="preserve">. Forest Ecology and Management 470-471:118183.</w:t>
+      </w:r>
+    </w:p>
+    <w:bookmarkEnd w:id="136"/>
+    <w:bookmarkStart w:id="138" w:name="ref-saraçli2013"/>
+    <w:p>
+      <w:pPr>
+        <w:pStyle w:val="Bibliography"/>
+      </w:pPr>
+      <w:r>
         <w:t xml:space="preserve">Saraçli, S., N. Doğan, and İ. Doğan. 2013.</w:t>
       </w:r>
       <w:r>
         <w:t xml:space="preserve"> </w:t>
       </w:r>
-      <w:hyperlink r:id="rId109">
+      <w:hyperlink r:id="rId137">
         <w:r>
           <w:rPr>
             <w:rStyle w:val="Hyperlink"/>
@@ -4382,8 +5128,8 @@
         <w:t xml:space="preserve">. Journal of Inequalities and Applications 2013:203.</w:t>
       </w:r>
     </w:p>
-    <w:bookmarkEnd w:id="110"/>
-    <w:bookmarkStart w:id="112" w:name="ref-shell2018"/>
+    <w:bookmarkEnd w:id="138"/>
+    <w:bookmarkStart w:id="140" w:name="ref-shell2018"/>
     <w:p>
       <w:pPr>
         <w:pStyle w:val="Bibliography"/>
@@ -4394,7 +5140,7 @@
       <w:r>
         <w:t xml:space="preserve"> </w:t>
       </w:r>
-      <w:hyperlink r:id="rId111">
+      <w:hyperlink r:id="rId139">
         <w:r>
           <w:rPr>
             <w:rStyle w:val="Hyperlink"/>
@@ -4418,32 +5164,8 @@
         <w:t xml:space="preserve">. River Research and Applications 34:993–1002.</w:t>
       </w:r>
     </w:p>
-    <w:bookmarkEnd w:id="112"/>
-    <w:bookmarkStart w:id="114" w:name="ref-silva2013"/>
-    <w:p>
-      <w:pPr>
-        <w:pStyle w:val="Bibliography"/>
-      </w:pPr>
-      <w:r>
-        <w:t xml:space="preserve">Silva, A. R., and C. T. S. Dias. 2013.</w:t>
-      </w:r>
-      <w:r>
-        <w:t xml:space="preserve"> </w:t>
-      </w:r>
-      <w:hyperlink r:id="rId113">
-        <w:r>
-          <w:rPr>
-            <w:rStyle w:val="Hyperlink"/>
-          </w:rPr>
-          <w:t xml:space="preserve">A cophenetic correlation coefficient for tocher’s method</w:t>
-        </w:r>
-      </w:hyperlink>
-      <w:r>
-        <w:t xml:space="preserve">. Pesquisa Agropecuária Brasileira 48:589–596.</w:t>
-      </w:r>
-    </w:p>
-    <w:bookmarkEnd w:id="114"/>
-    <w:bookmarkStart w:id="115" w:name="ref-silva2003"/>
+    <w:bookmarkEnd w:id="140"/>
+    <w:bookmarkStart w:id="141" w:name="ref-silva2003"/>
     <w:p>
       <w:pPr>
         <w:pStyle w:val="Bibliography"/>
@@ -4468,29 +5190,53 @@
         <w:t xml:space="preserve">C. Galindo-Leal and I. G. Câmara, editors. CABS; Island Press, Washington, DC.</w:t>
       </w:r>
     </w:p>
-    <w:bookmarkEnd w:id="115"/>
-    <w:bookmarkStart w:id="116" w:name="ref-sneath1973"/>
+    <w:bookmarkEnd w:id="141"/>
+    <w:bookmarkStart w:id="143" w:name="ref-silva2013"/>
     <w:p>
       <w:pPr>
         <w:pStyle w:val="Bibliography"/>
       </w:pPr>
       <w:r>
-        <w:t xml:space="preserve">Sneath, P. H. A., and R. R. Sokal. 1973. Numerical taxonomy: The principles and practice of numerical classification. First edition. W H Freeman &amp; Co.</w:t>
+        <w:t xml:space="preserve">Silva, L. T. D. da. 2013, February 26.</w:t>
+      </w:r>
+      <w:r>
+        <w:t xml:space="preserve"> </w:t>
+      </w:r>
+      <w:hyperlink r:id="rId142">
+        <w:r>
+          <w:rPr>
+            <w:rStyle w:val="Hyperlink"/>
+          </w:rPr>
+          <w:t xml:space="preserve">Zooplâncton como indicador de estado trófico em reservatórios no semiárido</w:t>
+        </w:r>
+      </w:hyperlink>
+      <w:r>
+        <w:t xml:space="preserve">. PhD thesis.</w:t>
       </w:r>
     </w:p>
-    <w:bookmarkEnd w:id="116"/>
-    <w:bookmarkStart w:id="118" w:name="ref-sokal1962"/>
+    <w:bookmarkEnd w:id="143"/>
+    <w:bookmarkStart w:id="144" w:name="ref-sneath1973"/>
     <w:p>
       <w:pPr>
         <w:pStyle w:val="Bibliography"/>
       </w:pPr>
       <w:r>
+        <w:t xml:space="preserve">Sneath, P. H. A., and R. R. Sokal. 1973. Numerical taxonomy: The principles and practice of numerical classification. First edition. W H Freeman &amp; Co.</w:t>
+      </w:r>
+    </w:p>
+    <w:bookmarkEnd w:id="144"/>
+    <w:bookmarkStart w:id="146" w:name="ref-sokal1962"/>
+    <w:p>
+      <w:pPr>
+        <w:pStyle w:val="Bibliography"/>
+      </w:pPr>
+      <w:r>
         <w:t xml:space="preserve">Sokal, R. R., and F. J. Rohlf. 1962.</w:t>
       </w:r>
       <w:r>
         <w:t xml:space="preserve"> </w:t>
       </w:r>
-      <w:hyperlink r:id="rId117">
+      <w:hyperlink r:id="rId145">
         <w:r>
           <w:rPr>
             <w:rStyle w:val="Hyperlink"/>
@@ -4502,8 +5248,8 @@
         <w:t xml:space="preserve">. Taxon 11:33–40.</w:t>
       </w:r>
     </w:p>
-    <w:bookmarkEnd w:id="118"/>
-    <w:bookmarkStart w:id="119" w:name="ref-sokal1995"/>
+    <w:bookmarkEnd w:id="146"/>
+    <w:bookmarkStart w:id="147" w:name="ref-sokal1995"/>
     <w:p>
       <w:pPr>
         <w:pStyle w:val="Bibliography"/>
@@ -4512,19 +5258,61 @@
         <w:t xml:space="preserve">Sokal, R. R., and F. J. Rohlf. 1995. Biometry: The principles and practice of statistics in biological research. Third edition. W.H. Freeman; Company, New York.</w:t>
       </w:r>
     </w:p>
-    <w:bookmarkEnd w:id="119"/>
-    <w:bookmarkStart w:id="121" w:name="ref-strahler1957"/>
+    <w:bookmarkEnd w:id="147"/>
+    <w:bookmarkStart w:id="149" w:name="ref-souza2025"/>
     <w:p>
       <w:pPr>
         <w:pStyle w:val="Bibliography"/>
       </w:pPr>
       <w:r>
+        <w:t xml:space="preserve">Souza, M. E. T., N. G. Santos, L. J. Chiarelli, and M. S. M. C. Noll. 2025.</w:t>
+      </w:r>
+      <w:r>
+        <w:t xml:space="preserve"> </w:t>
+      </w:r>
+      <w:hyperlink r:id="rId148">
+        <w:r>
+          <w:rPr>
+            <w:rStyle w:val="Hyperlink"/>
+          </w:rPr>
+          <w:t xml:space="preserve">Seasonal variation of the zooplankton communities</w:t>
+        </w:r>
+        <w:r>
+          <w:rPr>
+            <w:rStyle w:val="Hyperlink"/>
+          </w:rPr>
+          <w:t xml:space="preserve">’</w:t>
+        </w:r>
+        <w:r>
+          <w:rPr>
+            <w:rStyle w:val="Hyperlink"/>
+          </w:rPr>
+          <w:t xml:space="preserve"> </w:t>
+        </w:r>
+        <w:r>
+          <w:rPr>
+            <w:rStyle w:val="Hyperlink"/>
+          </w:rPr>
+          <w:t xml:space="preserve">diversity in ponds of the atlantic forest</w:t>
+        </w:r>
+      </w:hyperlink>
+      <w:r>
+        <w:t xml:space="preserve">. Acta Limnologica Brasiliensia 37:e105.</w:t>
+      </w:r>
+    </w:p>
+    <w:bookmarkEnd w:id="149"/>
+    <w:bookmarkStart w:id="151" w:name="ref-strahler1957"/>
+    <w:p>
+      <w:pPr>
+        <w:pStyle w:val="Bibliography"/>
+      </w:pPr>
+      <w:r>
         <w:t xml:space="preserve">Strahler, A. N. 1957.</w:t>
       </w:r>
       <w:r>
         <w:t xml:space="preserve"> </w:t>
       </w:r>
-      <w:hyperlink r:id="rId120">
+      <w:hyperlink r:id="rId150">
         <w:r>
           <w:rPr>
             <w:rStyle w:val="Hyperlink"/>
@@ -4536,19 +5324,101 @@
         <w:t xml:space="preserve">. Eos, Transactions American Geophysical Union 38:913–920.</w:t>
       </w:r>
     </w:p>
-    <w:bookmarkEnd w:id="121"/>
-    <w:bookmarkStart w:id="123" w:name="ref-veech2003"/>
+    <w:bookmarkEnd w:id="151"/>
+    <w:bookmarkStart w:id="152" w:name="ref-tabarelli2012"/>
     <w:p>
       <w:pPr>
         <w:pStyle w:val="Bibliography"/>
       </w:pPr>
       <w:r>
+        <w:t xml:space="preserve">Tabarelli, M., A. V. Aguiar, and M. C. Ribeiro. 2012. A conversão da Floresta Atlântica em paisagens antrópicas: lições para a conservação da diversidade biológica das florestas tropicais. Interciencia 37:88–92.</w:t>
+      </w:r>
+    </w:p>
+    <w:bookmarkEnd w:id="152"/>
+    <w:bookmarkStart w:id="154" w:name="ref-tabarelli2010"/>
+    <w:p>
+      <w:pPr>
+        <w:pStyle w:val="Bibliography"/>
+      </w:pPr>
+      <w:r>
+        <w:t xml:space="preserve">Tabarelli, M., A. V. Aguiar, M. C. Ribeiro, J. P. Metzger, and C. A. Peres. 2010.</w:t>
+      </w:r>
+      <w:r>
+        <w:t xml:space="preserve"> </w:t>
+      </w:r>
+      <w:hyperlink r:id="rId153">
+        <w:r>
+          <w:rPr>
+            <w:rStyle w:val="Hyperlink"/>
+          </w:rPr>
+          <w:t xml:space="preserve">Prospects for biodiversity conservation in the atlantic forest: Lessons from aging human-modified landscapes</w:t>
+        </w:r>
+      </w:hyperlink>
+      <w:r>
+        <w:t xml:space="preserve">. Biological Conservation 143:2328–2340.</w:t>
+      </w:r>
+    </w:p>
+    <w:bookmarkEnd w:id="154"/>
+    <w:bookmarkStart w:id="156" w:name="ref-tuomisto2010"/>
+    <w:p>
+      <w:pPr>
+        <w:pStyle w:val="Bibliography"/>
+      </w:pPr>
+      <w:r>
+        <w:t xml:space="preserve">Tuomisto, H. 2010.</w:t>
+      </w:r>
+      <w:r>
+        <w:t xml:space="preserve"> </w:t>
+      </w:r>
+      <w:hyperlink r:id="rId155">
+        <w:r>
+          <w:rPr>
+            <w:rStyle w:val="Hyperlink"/>
+          </w:rPr>
+          <w:t xml:space="preserve">A diversity of beta diversities: Straightening up a concept gone awry. Part 2. Quantifying beta diversity and related phenomena</w:t>
+        </w:r>
+      </w:hyperlink>
+      <w:r>
+        <w:t xml:space="preserve">. Ecography 33:23–45.</w:t>
+      </w:r>
+    </w:p>
+    <w:bookmarkEnd w:id="156"/>
+    <w:bookmarkStart w:id="158" w:name="ref-vancine2024"/>
+    <w:p>
+      <w:pPr>
+        <w:pStyle w:val="Bibliography"/>
+      </w:pPr>
+      <w:r>
+        <w:t xml:space="preserve">Vancine, M. H., R. L. Muylaert, B. B. Niebuhr, J. E. D. F. Oshima, V. Tonetti, R. Bernardo, C. De Angelo, M. R. Rosa, C. H. Grohmann, and M. C. Ribeiro. 2024.</w:t>
+      </w:r>
+      <w:r>
+        <w:t xml:space="preserve"> </w:t>
+      </w:r>
+      <w:hyperlink r:id="rId157">
+        <w:r>
+          <w:rPr>
+            <w:rStyle w:val="Hyperlink"/>
+          </w:rPr>
+          <w:t xml:space="preserve">The atlantic forest of south america: Spatiotemporal dynamics of the vegetation and implications for conservation</w:t>
+        </w:r>
+      </w:hyperlink>
+      <w:r>
+        <w:t xml:space="preserve">. Biological Conservation 291:110499.</w:t>
+      </w:r>
+    </w:p>
+    <w:bookmarkEnd w:id="158"/>
+    <w:bookmarkStart w:id="160" w:name="ref-veech2003"/>
+    <w:p>
+      <w:pPr>
+        <w:pStyle w:val="Bibliography"/>
+      </w:pPr>
+      <w:r>
         <w:t xml:space="preserve">Veech, J. A., T. O. Crist, and K. S. Summerville. 2003.</w:t>
       </w:r>
       <w:r>
         <w:t xml:space="preserve"> </w:t>
       </w:r>
-      <w:hyperlink r:id="rId122">
+      <w:hyperlink r:id="rId159">
         <w:r>
           <w:rPr>
             <w:rStyle w:val="Hyperlink"/>
@@ -4560,8 +5430,8 @@
         <w:t xml:space="preserve">. Ecology 84:3376–3383.</w:t>
       </w:r>
     </w:p>
-    <w:bookmarkEnd w:id="123"/>
-    <w:bookmarkStart w:id="125" w:name="ref-veech2002"/>
+    <w:bookmarkEnd w:id="160"/>
+    <w:bookmarkStart w:id="162" w:name="ref-veech2002"/>
     <w:p>
       <w:pPr>
         <w:pStyle w:val="Bibliography"/>
@@ -4572,7 +5442,7 @@
       <w:r>
         <w:t xml:space="preserve"> </w:t>
       </w:r>
-      <w:hyperlink r:id="rId124">
+      <w:hyperlink r:id="rId161">
         <w:r>
           <w:rPr>
             <w:rStyle w:val="Hyperlink"/>
@@ -4584,10 +5454,68 @@
         <w:t xml:space="preserve">. Oikos 99:3–9.</w:t>
       </w:r>
     </w:p>
-    <w:bookmarkEnd w:id="125"/>
-    <w:bookmarkEnd w:id="126"/>
-    <w:bookmarkEnd w:id="127"/>
-    <w:bookmarkStart w:id="162" w:name="figures-and-tables"/>
+    <w:bookmarkEnd w:id="162"/>
+    <w:bookmarkStart w:id="164" w:name="ref-ward1998"/>
+    <w:p>
+      <w:pPr>
+        <w:pStyle w:val="Bibliography"/>
+      </w:pPr>
+      <w:r>
+        <w:t xml:space="preserve">Ward, J. V. 1998.</w:t>
+      </w:r>
+      <w:r>
+        <w:t xml:space="preserve"> </w:t>
+      </w:r>
+      <w:hyperlink r:id="rId163">
+        <w:r>
+          <w:rPr>
+            <w:rStyle w:val="Hyperlink"/>
+          </w:rPr>
+          <w:t xml:space="preserve">Riverine landscapes: Biodiversity patterns, disturbance regimes, and aquatic conservation</w:t>
+        </w:r>
+      </w:hyperlink>
+      <w:r>
+        <w:t xml:space="preserve">. Biological Conservation 83:269–278.</w:t>
+      </w:r>
+    </w:p>
+    <w:bookmarkEnd w:id="164"/>
+    <w:bookmarkStart w:id="166" w:name="ref-whittaker1972"/>
+    <w:p>
+      <w:pPr>
+        <w:pStyle w:val="Bibliography"/>
+      </w:pPr>
+      <w:r>
+        <w:t xml:space="preserve">Whittaker, R. H. 1972.</w:t>
+      </w:r>
+      <w:r>
+        <w:t xml:space="preserve"> </w:t>
+      </w:r>
+      <w:hyperlink r:id="rId165">
+        <w:r>
+          <w:rPr>
+            <w:rStyle w:val="Hyperlink"/>
+          </w:rPr>
+          <w:t xml:space="preserve">Evolution and measurement of species diversity</w:t>
+        </w:r>
+      </w:hyperlink>
+      <w:r>
+        <w:t xml:space="preserve">. TAXON 21:213–251.</w:t>
+      </w:r>
+    </w:p>
+    <w:bookmarkEnd w:id="166"/>
+    <w:bookmarkStart w:id="167" w:name="ref-zaú1998"/>
+    <w:p>
+      <w:pPr>
+        <w:pStyle w:val="Bibliography"/>
+      </w:pPr>
+      <w:r>
+        <w:t xml:space="preserve">Zaú, A. S. 1998. Fragmentação da mata atlântica: Aspectos teóricos. Floresta e Ambiente 5:160–170.</w:t>
+      </w:r>
+    </w:p>
+    <w:bookmarkEnd w:id="167"/>
+    <w:bookmarkEnd w:id="168"/>
+    <w:bookmarkEnd w:id="169"/>
+    <w:bookmarkStart w:id="204" w:name="figures-and-tables"/>
     <w:p>
       <w:pPr>
         <w:pStyle w:val="Heading1"/>
@@ -4908,7 +5836,7 @@
         <w:t xml:space="preserve">(Stream): Diversity turnover between streams.</w:t>
       </w:r>
     </w:p>
-    <w:bookmarkStart w:id="156" w:name="figures"/>
+    <w:bookmarkStart w:id="198" w:name="figures"/>
     <w:p>
       <w:pPr>
         <w:pStyle w:val="Heading2"/>
@@ -4943,7 +5871,7 @@
       <w:tr>
         <w:tc>
           <w:tcPr/>
-          <w:bookmarkStart w:id="131" w:name="fig-mapa"/>
+          <w:bookmarkStart w:id="173" w:name="fig-mapa"/>
           <w:p>
             <w:pPr>
               <w:pStyle w:val="Compact"/>
@@ -4954,18 +5882,18 @@
                 <wp:inline>
                   <wp:extent cx="5943600" cy="4202583"/>
                   <wp:effectExtent b="0" l="0" r="0" t="0"/>
-                  <wp:docPr descr="" title="" id="129" name="Picture"/>
+                  <wp:docPr descr="" title="" id="171" name="Picture"/>
                   <a:graphic>
                     <a:graphicData uri="http://schemas.openxmlformats.org/drawingml/2006/picture">
                       <pic:pic>
                         <pic:nvPicPr>
-                          <pic:cNvPr descr="imagens/Uso%20de%20Solo%20Rebio_en.png" id="130" name="Picture"/>
+                          <pic:cNvPr descr="imagens/Uso%20de%20Solo%20Rebio_en.png" id="172" name="Picture"/>
                           <pic:cNvPicPr>
                             <a:picLocks noChangeArrowheads="1" noChangeAspect="1"/>
                           </pic:cNvPicPr>
                         </pic:nvPicPr>
                         <pic:blipFill>
-                          <a:blip r:embed="rId128"/>
+                          <a:blip r:embed="rId170"/>
                           <a:stretch>
                             <a:fillRect/>
                           </a:stretch>
@@ -5005,7 +5933,7 @@
               <w:t xml:space="preserve">Figure 1: Study area</w:t>
             </w:r>
           </w:p>
-          <w:bookmarkEnd w:id="131"/>
+          <w:bookmarkEnd w:id="173"/>
         </w:tc>
       </w:tr>
     </w:tbl>
@@ -5035,7 +5963,7 @@
       <w:tr>
         <w:tc>
           <w:tcPr/>
-          <w:bookmarkStart w:id="135" w:name="fig-hab_PCA_rio"/>
+          <w:bookmarkStart w:id="177" w:name="fig-hab_PCA_rio"/>
           <w:p>
             <w:pPr>
               <w:pStyle w:val="Compact"/>
@@ -5046,18 +5974,18 @@
                 <wp:inline>
                   <wp:extent cx="5943600" cy="4953000"/>
                   <wp:effectExtent b="0" l="0" r="0" t="0"/>
-                  <wp:docPr descr="" title="" id="133" name="Picture"/>
+                  <wp:docPr descr="" title="" id="175" name="Picture"/>
                   <a:graphic>
                     <a:graphicData uri="http://schemas.openxmlformats.org/drawingml/2006/picture">
                       <pic:pic>
                         <pic:nvPicPr>
-                          <pic:cNvPr descr="res/fig-hab_PCA_rio.png" id="134" name="Picture"/>
+                          <pic:cNvPr descr="res/fig-hab_PCA_rio.png" id="176" name="Picture"/>
                           <pic:cNvPicPr>
                             <a:picLocks noChangeArrowheads="1" noChangeAspect="1"/>
                           </pic:cNvPicPr>
                         </pic:nvPicPr>
                         <pic:blipFill>
-                          <a:blip r:embed="rId132"/>
+                          <a:blip r:embed="rId174"/>
                           <a:stretch>
                             <a:fillRect/>
                           </a:stretch>
@@ -5097,7 +6025,7 @@
               <w:t xml:space="preserve">Figure 2: Principal Component Analysis, streams</w:t>
             </w:r>
           </w:p>
-          <w:bookmarkEnd w:id="135"/>
+          <w:bookmarkEnd w:id="177"/>
         </w:tc>
       </w:tr>
     </w:tbl>
@@ -5127,7 +6055,7 @@
       <w:tr>
         <w:tc>
           <w:tcPr/>
-          <w:bookmarkStart w:id="139" w:name="fig-hab_PCA_periodo"/>
+          <w:bookmarkStart w:id="181" w:name="fig-hab_PCA_periodo"/>
           <w:p>
             <w:pPr>
               <w:pStyle w:val="Compact"/>
@@ -5138,18 +6066,18 @@
                 <wp:inline>
                   <wp:extent cx="5943600" cy="4953000"/>
                   <wp:effectExtent b="0" l="0" r="0" t="0"/>
-                  <wp:docPr descr="" title="" id="137" name="Picture"/>
+                  <wp:docPr descr="" title="" id="179" name="Picture"/>
                   <a:graphic>
                     <a:graphicData uri="http://schemas.openxmlformats.org/drawingml/2006/picture">
                       <pic:pic>
                         <pic:nvPicPr>
-                          <pic:cNvPr descr="res/fig-hab_PCA_periodo.png" id="138" name="Picture"/>
+                          <pic:cNvPr descr="res/fig-hab_PCA_periodo.png" id="180" name="Picture"/>
                           <pic:cNvPicPr>
                             <a:picLocks noChangeArrowheads="1" noChangeAspect="1"/>
                           </pic:cNvPicPr>
                         </pic:nvPicPr>
                         <pic:blipFill>
-                          <a:blip r:embed="rId136"/>
+                          <a:blip r:embed="rId178"/>
                           <a:stretch>
                             <a:fillRect/>
                           </a:stretch>
@@ -5189,7 +6117,7 @@
               <w:t xml:space="preserve">Figure 3: Principal Component Analysis, seasons</w:t>
             </w:r>
           </w:p>
-          <w:bookmarkEnd w:id="139"/>
+          <w:bookmarkEnd w:id="181"/>
         </w:tc>
       </w:tr>
     </w:tbl>
@@ -5219,7 +6147,7 @@
       <w:tr>
         <w:tc>
           <w:tcPr/>
-          <w:bookmarkStart w:id="143" w:name="fig-rare1"/>
+          <w:bookmarkStart w:id="185" w:name="fig-rare1"/>
           <w:p>
             <w:pPr>
               <w:pStyle w:val="Compact"/>
@@ -5230,18 +6158,18 @@
                 <wp:inline>
                   <wp:extent cx="5943600" cy="4457699"/>
                   <wp:effectExtent b="0" l="0" r="0" t="0"/>
-                  <wp:docPr descr="" title="" id="141" name="Picture"/>
+                  <wp:docPr descr="" title="" id="183" name="Picture"/>
                   <a:graphic>
                     <a:graphicData uri="http://schemas.openxmlformats.org/drawingml/2006/picture">
                       <pic:pic>
                         <pic:nvPicPr>
-                          <pic:cNvPr descr="res/fig-rare1.png" id="142" name="Picture"/>
+                          <pic:cNvPr descr="res/fig-rare1.png" id="184" name="Picture"/>
                           <pic:cNvPicPr>
                             <a:picLocks noChangeArrowheads="1" noChangeAspect="1"/>
                           </pic:cNvPicPr>
                         </pic:nvPicPr>
                         <pic:blipFill>
-                          <a:blip r:embed="rId140"/>
+                          <a:blip r:embed="rId182"/>
                           <a:stretch>
                             <a:fillRect/>
                           </a:stretch>
@@ -5281,7 +6209,7 @@
               <w:t xml:space="preserve">Figure 4: Accumulation curves</w:t>
             </w:r>
           </w:p>
-          <w:bookmarkEnd w:id="143"/>
+          <w:bookmarkEnd w:id="185"/>
         </w:tc>
       </w:tr>
     </w:tbl>
@@ -5311,7 +6239,7 @@
       <w:tr>
         <w:tc>
           <w:tcPr/>
-          <w:bookmarkStart w:id="147" w:name="fig-upgma"/>
+          <w:bookmarkStart w:id="189" w:name="fig-upgma"/>
           <w:p>
             <w:pPr>
               <w:pStyle w:val="Compact"/>
@@ -5322,18 +6250,18 @@
                 <wp:inline>
                   <wp:extent cx="5943600" cy="4862945"/>
                   <wp:effectExtent b="0" l="0" r="0" t="0"/>
-                  <wp:docPr descr="" title="" id="145" name="Picture"/>
+                  <wp:docPr descr="" title="" id="187" name="Picture"/>
                   <a:graphic>
                     <a:graphicData uri="http://schemas.openxmlformats.org/drawingml/2006/picture">
                       <pic:pic>
                         <pic:nvPicPr>
-                          <pic:cNvPr descr="res/fig-upgma.png" id="146" name="Picture"/>
+                          <pic:cNvPr descr="res/fig-upgma.png" id="188" name="Picture"/>
                           <pic:cNvPicPr>
                             <a:picLocks noChangeArrowheads="1" noChangeAspect="1"/>
                           </pic:cNvPicPr>
                         </pic:nvPicPr>
                         <pic:blipFill>
-                          <a:blip r:embed="rId144"/>
+                          <a:blip r:embed="rId186"/>
                           <a:stretch>
                             <a:fillRect/>
                           </a:stretch>
@@ -5373,7 +6301,7 @@
               <w:t xml:space="preserve">Figure 5: UPGMA Classification</w:t>
             </w:r>
           </w:p>
-          <w:bookmarkEnd w:id="147"/>
+          <w:bookmarkEnd w:id="189"/>
         </w:tc>
       </w:tr>
     </w:tbl>
@@ -5403,7 +6331,7 @@
       <w:tr>
         <w:tc>
           <w:tcPr/>
-          <w:bookmarkStart w:id="151" w:name="fig-particao_cs"/>
+          <w:bookmarkStart w:id="193" w:name="fig-particao_cs"/>
           <w:p>
             <w:pPr>
               <w:pStyle w:val="Compact"/>
@@ -5414,18 +6342,18 @@
                 <wp:inline>
                   <wp:extent cx="3669832" cy="7339665"/>
                   <wp:effectExtent b="0" l="0" r="0" t="0"/>
-                  <wp:docPr descr="" title="" id="149" name="Picture"/>
+                  <wp:docPr descr="" title="" id="191" name="Picture"/>
                   <a:graphic>
                     <a:graphicData uri="http://schemas.openxmlformats.org/drawingml/2006/picture">
                       <pic:pic>
                         <pic:nvPicPr>
-                          <pic:cNvPr descr="res/fig-painel_pt.cs.png" id="150" name="Picture"/>
+                          <pic:cNvPr descr="res/fig-painel_pt.cs.png" id="192" name="Picture"/>
                           <pic:cNvPicPr>
                             <a:picLocks noChangeArrowheads="1" noChangeAspect="1"/>
                           </pic:cNvPicPr>
                         </pic:nvPicPr>
                         <pic:blipFill>
-                          <a:blip r:embed="rId148"/>
+                          <a:blip r:embed="rId190"/>
                           <a:stretch>
                             <a:fillRect/>
                           </a:stretch>
@@ -5465,7 +6393,7 @@
               <w:t xml:space="preserve">Figure 6: Partitioning plots season</w:t>
             </w:r>
           </w:p>
-          <w:bookmarkEnd w:id="151"/>
+          <w:bookmarkEnd w:id="193"/>
         </w:tc>
       </w:tr>
     </w:tbl>
@@ -5495,7 +6423,7 @@
       <w:tr>
         <w:tc>
           <w:tcPr/>
-          <w:bookmarkStart w:id="155" w:name="fig-particao_rios"/>
+          <w:bookmarkStart w:id="197" w:name="fig-particao_rios"/>
           <w:p>
             <w:pPr>
               <w:pStyle w:val="Compact"/>
@@ -5506,18 +6434,18 @@
                 <wp:inline>
                   <wp:extent cx="5943600" cy="6792685"/>
                   <wp:effectExtent b="0" l="0" r="0" t="0"/>
-                  <wp:docPr descr="" title="" id="153" name="Picture"/>
+                  <wp:docPr descr="" title="" id="195" name="Picture"/>
                   <a:graphic>
                     <a:graphicData uri="http://schemas.openxmlformats.org/drawingml/2006/picture">
                       <pic:pic>
                         <pic:nvPicPr>
-                          <pic:cNvPr descr="res/fig-painel_pt.rios.png" id="154" name="Picture"/>
+                          <pic:cNvPr descr="res/fig-painel_pt.rios.png" id="196" name="Picture"/>
                           <pic:cNvPicPr>
                             <a:picLocks noChangeArrowheads="1" noChangeAspect="1"/>
                           </pic:cNvPicPr>
                         </pic:nvPicPr>
                         <pic:blipFill>
-                          <a:blip r:embed="rId152"/>
+                          <a:blip r:embed="rId194"/>
                           <a:stretch>
                             <a:fillRect/>
                           </a:stretch>
@@ -5557,12 +6485,12 @@
               <w:t xml:space="preserve">Figure 7: Partitioning plots stream</w:t>
             </w:r>
           </w:p>
-          <w:bookmarkEnd w:id="155"/>
+          <w:bookmarkEnd w:id="197"/>
         </w:tc>
       </w:tr>
     </w:tbl>
-    <w:bookmarkEnd w:id="156"/>
-    <w:bookmarkStart w:id="161" w:name="tables"/>
+    <w:bookmarkEnd w:id="198"/>
+    <w:bookmarkStart w:id="203" w:name="tables"/>
     <w:p>
       <w:pPr>
         <w:pStyle w:val="Heading2"/>
@@ -5597,7 +6525,7 @@
       <w:tr>
         <w:tc>
           <w:tcPr/>
-          <w:bookmarkStart w:id="157" w:name="tbl-hab_gttable"/>
+          <w:bookmarkStart w:id="199" w:name="tbl-hab_gttable"/>
           <w:p>
             <w:pPr>
               <w:jc w:val="center"/>
@@ -17265,7 +18193,7 @@
               </w:tc>
             </w:tr>
           </w:tbl>
-          <w:bookmarkEnd w:id="157"/>
+          <w:bookmarkEnd w:id="199"/>
         </w:tc>
       </w:tr>
     </w:tbl>
@@ -17295,7 +18223,7 @@
       <w:tr>
         <w:tc>
           <w:tcPr/>
-          <w:bookmarkStart w:id="158" w:name="tbl-nutri_gttable"/>
+          <w:bookmarkStart w:id="200" w:name="tbl-nutri_gttable"/>
           <w:p>
             <w:pPr>
               <w:jc w:val="center"/>
@@ -20016,7 +20944,7 @@
               </w:tc>
             </w:tr>
           </w:tbl>
-          <w:bookmarkEnd w:id="158"/>
+          <w:bookmarkEnd w:id="200"/>
         </w:tc>
       </w:tr>
     </w:tbl>
@@ -20046,7 +20974,7 @@
       <w:tr>
         <w:tc>
           <w:tcPr/>
-          <w:bookmarkStart w:id="159" w:name="tbl-checklist_gttable"/>
+          <w:bookmarkStart w:id="201" w:name="tbl-checklist_gttable"/>
           <w:p>
             <w:pPr>
               <w:jc w:val="center"/>
@@ -37790,7 +38718,7 @@
               </w:tc>
             </w:tr>
           </w:tbl>
-          <w:bookmarkEnd w:id="159"/>
+          <w:bookmarkEnd w:id="201"/>
         </w:tc>
       </w:tr>
     </w:tbl>
@@ -37820,7 +38748,7 @@
       <w:tr>
         <w:tc>
           <w:tcPr/>
-          <w:bookmarkStart w:id="160" w:name="tbl-part_gttable"/>
+          <w:bookmarkStart w:id="202" w:name="tbl-part_gttable"/>
           <w:p>
             <w:pPr>
               <w:jc w:val="center"/>
@@ -42680,13 +43608,13 @@
               </w:tc>
             </w:tr>
           </w:tbl>
-          <w:bookmarkEnd w:id="160"/>
+          <w:bookmarkEnd w:id="202"/>
         </w:tc>
       </w:tr>
     </w:tbl>
-    <w:bookmarkEnd w:id="161"/>
-    <w:bookmarkEnd w:id="162"/>
-    <w:bookmarkStart w:id="163" w:name="apendices"/>
+    <w:bookmarkEnd w:id="203"/>
+    <w:bookmarkEnd w:id="204"/>
+    <w:bookmarkStart w:id="205" w:name="apendices"/>
     <w:p>
       <w:pPr>
         <w:pStyle w:val="Heading1"/>
@@ -42695,8 +43623,8 @@
         <w:t xml:space="preserve">Apendices</w:t>
       </w:r>
     </w:p>
-    <w:bookmarkEnd w:id="163"/>
-    <w:bookmarkStart w:id="167" w:name="non-used-figures-and-tables"/>
+    <w:bookmarkEnd w:id="205"/>
+    <w:bookmarkStart w:id="209" w:name="non-used-figures-and-tables"/>
     <w:p>
       <w:pPr>
         <w:pStyle w:val="Heading1"/>
@@ -42746,18 +43674,18 @@
                 <wp:inline>
                   <wp:extent cx="152400" cy="152400"/>
                   <wp:effectExtent b="0" l="0" r="0" t="0"/>
-                  <wp:docPr descr="" title="" id="165" name="Picture"/>
+                  <wp:docPr descr="" title="" id="207" name="Picture"/>
                   <a:graphic>
                     <a:graphicData uri="http://schemas.openxmlformats.org/drawingml/2006/picture">
                       <pic:pic>
                         <pic:nvPicPr>
-                          <pic:cNvPr descr="C:\PROGRA~1\RStudio\RESOUR~1\app\bin\quarto\share\formats\docx\warning.png" id="166" name="Picture"/>
+                          <pic:cNvPr descr="C:\PROGRA~1\RStudio\RESOUR~1\app\bin\quarto\share\formats\docx\warning.png" id="208" name="Picture"/>
                           <pic:cNvPicPr>
                             <a:picLocks noChangeArrowheads="1" noChangeAspect="1"/>
                           </pic:cNvPicPr>
                         </pic:nvPicPr>
                         <pic:blipFill>
-                          <a:blip r:embed="rId164"/>
+                          <a:blip r:embed="rId206"/>
                           <a:stretch>
                             <a:fillRect/>
                           </a:stretch>
@@ -42810,7 +43738,7 @@
         </w:tc>
       </w:tr>
     </w:tbl>
-    <w:bookmarkEnd w:id="167"/>
+    <w:bookmarkEnd w:id="209"/>
     <w:sectPr>
       <w:type w:val="nextPage"/>
       <w:pgSz w:h="15840" w:w="12240"/>

</xml_diff>

<commit_message>
Elv: ms intro quase
</commit_message>
<xml_diff>
--- a/docs/ms_rebio23-part.docx
+++ b/docs/ms_rebio23-part.docx
@@ -83,7 +83,7 @@
         <w:pStyle w:val="Date"/>
       </w:pPr>
       <w:r>
-        <w:t xml:space="preserve">2026-10-15</w:t>
+        <w:t xml:space="preserve">2026-10-16</w:t>
       </w:r>
     </w:p>
     <w:p>
@@ -168,34 +168,31 @@
         <w:pStyle w:val="FirstParagraph"/>
       </w:pPr>
       <w:r>
-        <w:t xml:space="preserve">The Atlantic Forest, recognized for its exceptional species richness and high level of endemism</w:t>
+        <w:t xml:space="preserve">The Atlantic Forest, recognized for its species richness and high level of endemism, is one of the most threatened tropical forests in the world, making it a global priority for biodiversity conservation</w:t>
       </w:r>
       <w:r>
         <w:t xml:space="preserve"> </w:t>
       </w:r>
       <w:r>
-        <w:t xml:space="preserve">(Fonseca 1985, Myers et al. 2000, Tabarelli et al. 2012)</w:t>
-      </w:r>
-      <w:r>
-        <w:t xml:space="preserve">, is one of the most threatened tropical forests worldwide due to intense anthropogenic pressure, making it a global priority for biodiversity conservation in South America</w:t>
-      </w:r>
-      <w:r>
         <w:t xml:space="preserve"> </w:t>
       </w:r>
       <w:r>
+        <w:t xml:space="preserve">–&gt;</w:t>
+      </w:r>
+      <w:r>
         <w:t xml:space="preserve"> </w:t>
       </w:r>
       <w:r>
-        <w:t xml:space="preserve">(Safar et al. 2020, Vancine et al. 2024)</w:t>
-      </w:r>
-      <w:r>
-        <w:t xml:space="preserve">. Originally, its vegetation cover extended over 1.6 million km²; however, centuries of human occupation and resource exploitation have led to severe landscape reduction and fragmentation, compromising the ecological integrity of its remnants and the maintenance of biodiversity</w:t>
+        <w:t xml:space="preserve">(Fonseca 1985, Myers et al. 2000, Tabarelli et al. 2010)</w:t>
+      </w:r>
+      <w:r>
+        <w:t xml:space="preserve">. Originally, its vegetation cover extended over 1.5 million km², however, centuries of human occupation and resource exploitation have led to severe landscape reduction, compromising the ecological integrity of its remnants and the maintenance of biodiversity</w:t>
       </w:r>
       <w:r>
         <w:t xml:space="preserve"> </w:t>
       </w:r>
       <w:r>
-        <w:t xml:space="preserve">(Safar et al. 2020, Vancine et al. 2024)</w:t>
+        <w:t xml:space="preserve">(Tabarelli et al. 2010, Safar et al. 2020, Vancine et al. 2024)</w:t>
       </w:r>
       <w:r>
         <w:t xml:space="preserve">. Habitat loss driven by deforestation is directly linked to forest fragmentation, which promotes the isolation of remnants, reduces landscape connectivity, and restricts species dispersal</w:t>
@@ -215,13 +212,13 @@
         <w:pStyle w:val="TextBody"/>
       </w:pPr>
       <w:r>
-        <w:t xml:space="preserve">These impacts are not confined to terrestrial environments as they extend to the associated aquatic ecosystems and, most importantly, headwater streams</w:t>
+        <w:t xml:space="preserve">These impacts are not confined to terrestrial environments, they extend to the associated aquatic ecosystems and, most importantly, headwater streams</w:t>
       </w:r>
       <w:r>
         <w:t xml:space="preserve"> </w:t>
       </w:r>
       <w:r>
-        <w:t xml:space="preserve">(Meyer et al. 2007)</w:t>
+        <w:t xml:space="preserve">(Malabarba 2006, Meyer et al. 2007)</w:t>
       </w:r>
       <w:r>
         <w:t xml:space="preserve">. Forest fragmentation and land management can generate significant impacts on stream fauna within the Atlantic Forest, as aquatic organisms are highly sensitive to changes in natural water conditions</w:t>
@@ -230,19 +227,19 @@
         <w:t xml:space="preserve"> </w:t>
       </w:r>
       <w:r>
-        <w:t xml:space="preserve">(Gouveia et al. 2017)</w:t>
-      </w:r>
-      <w:r>
-        <w:t xml:space="preserve">. According to</w:t>
+        <w:t xml:space="preserve">(England and Rosemond 2004)</w:t>
+      </w:r>
+      <w:r>
+        <w:t xml:space="preserve">. Furthermore, landscape-level processes—such as disturbance, fragmentation, dispersal, and mosaic structure—exert a direct influence on local populations</w:t>
       </w:r>
       <w:r>
         <w:t xml:space="preserve"> </w:t>
       </w:r>
       <w:r>
-        <w:t xml:space="preserve">Maltchik and Medeiros (2006)</w:t>
-      </w:r>
-      <w:r>
-        <w:t xml:space="preserve">, landscape-level processes—such as disturbance, fragmentation, dispersal, and mosaic structure—exert a direct influence on local populations. Therefore, understanding the ecological processes structuring these communities is essential to evaluate the ecological health of water bodies and to comprehend how diversity is distributed across different spatial scales</w:t>
+        <w:t xml:space="preserve">(Maltchik and Medeiros 2006, Lôbo et al. 2011)</w:t>
+      </w:r>
+      <w:r>
+        <w:t xml:space="preserve">. Therefore, understanding the ecological processes structuring freshwater communities is essential to comprehend how diversity is distributed across different spatial scales</w:t>
       </w:r>
       <w:r>
         <w:t xml:space="preserve"> </w:t>
@@ -251,34 +248,10 @@
         <w:t xml:space="preserve">(Ávila et al. 2011)</w:t>
       </w:r>
       <w:r>
-        <w:t xml:space="preserve">. In addition to landscape alterations, stream dynamics are strongly driven by seasonal factors. The Atlantic Forest features a predominantly tropical climate with rainfall distributed throughout the year</w:t>
-      </w:r>
-      <w:r>
         <w:t xml:space="preserve"> </w:t>
       </w:r>
       <w:r>
-        <w:t xml:space="preserve">(Barboza et al. 2024)</w:t>
-      </w:r>
-      <w:r>
-        <w:t xml:space="preserve">. These hydrological fluctuations directly influence Neotropical freshwater environments by modifying physical and chemical conditions</w:t>
-      </w:r>
-      <w:r>
-        <w:t xml:space="preserve"> </w:t>
-      </w:r>
-      <w:r>
-        <w:t xml:space="preserve">(Barboza et al. 2024)</w:t>
-      </w:r>
-      <w:r>
-        <w:t xml:space="preserve">. The shift between dry and rainy seasons alters resource availability, microhabitat structure, and the establishment and persistence of organisms, thereby shaping community composition and dynamics</w:t>
-      </w:r>
-      <w:r>
-        <w:t xml:space="preserve"> </w:t>
-      </w:r>
-      <w:r>
-        <w:t xml:space="preserve">(Ward 1998, Souza et al. 2025)</w:t>
-      </w:r>
-      <w:r>
-        <w:t xml:space="preserve">.</w:t>
+        <w:t xml:space="preserve">and to evaluate the ecological health of stream.</w:t>
       </w:r>
     </w:p>
     <w:p>
@@ -286,16 +259,55 @@
         <w:pStyle w:val="TextBody"/>
       </w:pPr>
       <w:r>
-        <w:t xml:space="preserve">During the dry season, reduced precipitation and lower streamflow stabilize hydrological conditions, which may favor the persistence of local populations. Conversely, the rainy season is characterized by increased rainfall and discharge, intensifying disturbance events, dispersal, and species turnover</w:t>
+        <w:t xml:space="preserve">In addition to landscape alterations, stream dynamics are strongly driven by seasonal factors. The Atlantic Forest features a predominantly tropical climate with rainfall distributed throughout the year. These hydrological fluctuations directly influence Neotropical freshwater environments by modifying physical and chemical conditions [</w:t>
+      </w:r>
+      <w:r>
+        <w:t xml:space="preserve">Barboza et al. (2024)</w:t>
+      </w:r>
+      <w:r>
+        <w:t xml:space="preserve">]. The shift between dry and rainy seasons alters resource availability, microhabitat structure, and the establishment and persistence of organisms, thereby shaping community composition and dynamics</w:t>
       </w:r>
       <w:r>
         <w:t xml:space="preserve"> </w:t>
       </w:r>
       <w:r>
+        <w:t xml:space="preserve">(Ward 1998, Souza et al. 2025)</w:t>
+      </w:r>
+      <w:r>
+        <w:t xml:space="preserve">. During the dry season, reduced precipitation and lower streamflow stabilize hydrological conditions, which may favor the persistence of local populations. Conversely, the wet season is characterized by increased rainfall and discharge, intensifying disturbance events, dispersal, and species turnover. Consequently, seasonality acts as a major driver of aquatic community organization, making these organisms valuable biological tools for assessing the ecological state of freshwater systems</w:t>
+      </w:r>
+      <w:r>
+        <w:t xml:space="preserve"> </w:t>
+      </w:r>
+      <w:r>
         <w:t xml:space="preserve">(Souza et al. 2025)</w:t>
       </w:r>
       <w:r>
-        <w:t xml:space="preserve">. Consequently, seasonality acts as a major driver of aquatic community organization, making these organisms valuable biological tools for assessing the ecological state of freshwater systems.</w:t>
+        <w:t xml:space="preserve">, and shifts in species composition and community turnover often reflect underlying alterations in environmental conditions [</w:t>
+      </w:r>
+      <w:r>
+        <w:t xml:space="preserve">Freiry et al. (2020)</w:t>
+      </w:r>
+      <w:r>
+        <w:t xml:space="preserve">;</w:t>
+      </w:r>
+      <w:r>
+        <w:t xml:space="preserve"> </w:t>
+      </w:r>
+      <w:r>
+        <w:t xml:space="preserve">Melo and Medeiros (2013)</w:t>
+      </w:r>
+      <w:r>
+        <w:t xml:space="preserve">;</w:t>
+      </w:r>
+      <w:r>
+        <w:t xml:space="preserve"> </w:t>
+      </w:r>
+      <w:r>
+        <w:t xml:space="preserve">Keppeler and Hardy (2004)</w:t>
+      </w:r>
+      <w:r>
+        <w:t xml:space="preserve">].</w:t>
       </w:r>
     </w:p>
     <w:p>
@@ -303,7 +315,7 @@
         <w:pStyle w:val="TextBody"/>
       </w:pPr>
       <w:r>
-        <w:t xml:space="preserve">Among the biological components of these communities, zooplankton—particularly Rotifera, Cladocera, and Copepoda—play a pivotal role. These organisms exhibit diverse body sizes, morphologies, life histories, and functional roles, serving as excellent bioindicators due to their rapid sensitivity to environmental changes</w:t>
+        <w:t xml:space="preserve">Among the biological components of lotic communities, zooplankton—particularly Rotifera, Cladocera, and Copepoda—play a pivotal role. These organisms exhibit diverse body sizes, morphologies, life histories, and functional roles, serving as excellent bioindicators due to their rapid sensitivity to environmental changes</w:t>
       </w:r>
       <w:r>
         <w:t xml:space="preserve"> </w:t>
@@ -312,16 +324,40 @@
         <w:t xml:space="preserve">(Bonecker et al. 2013)</w:t>
       </w:r>
       <w:r>
-        <w:t xml:space="preserve">. Furthermore, zooplankton constitute a critical food source for fish, aquatic birds, and mammals, acting as an essential trophic bridge that transfers energy from primary producers to higher trophic levels</w:t>
+        <w:t xml:space="preserve">. Furthermore, zooplankton constitute a critical food source for fish and other organisms, an essential trophic bridge that transfers energy from primary producers to higher trophic levels [</w:t>
+      </w:r>
+      <w:r>
+        <w:t xml:space="preserve">Altindağ and Berdi̇ (2025)</w:t>
+      </w:r>
+      <w:r>
+        <w:t xml:space="preserve">;</w:t>
       </w:r>
       <w:r>
         <w:t xml:space="preserve"> </w:t>
       </w:r>
       <w:r>
-        <w:t xml:space="preserve">(Balkić et al. 2022, Marcelino et al. 2025, Souza et al. 2025, Altindağ and Berdi̇ 2025)</w:t>
-      </w:r>
-      <w:r>
-        <w:t xml:space="preserve">.</w:t>
+        <w:t xml:space="preserve">Balkić et al. (2022)</w:t>
+      </w:r>
+      <w:r>
+        <w:t xml:space="preserve">;</w:t>
+      </w:r>
+      <w:r>
+        <w:t xml:space="preserve"> </w:t>
+      </w:r>
+      <w:r>
+        <w:t xml:space="preserve">Marcelino et al. (2025)</w:t>
+      </w:r>
+      <w:r>
+        <w:t xml:space="preserve">;</w:t>
+      </w:r>
+      <w:r>
+        <w:t xml:space="preserve"> </w:t>
+      </w:r>
+      <w:r>
+        <w:t xml:space="preserve">Souza et al. (2025)</w:t>
+      </w:r>
+      <w:r>
+        <w:t xml:space="preserve">].</w:t>
       </w:r>
     </w:p>
     <w:p>
@@ -329,25 +365,28 @@
         <w:pStyle w:val="TextBody"/>
       </w:pPr>
       <w:r>
-        <w:t xml:space="preserve">According to</w:t>
+        <w:t xml:space="preserve">In recent decades, researchers have argued that biodiversity assessments should not be reduced to a single diversity index.</w:t>
       </w:r>
       <w:r>
         <w:t xml:space="preserve"> </w:t>
       </w:r>
       <w:r>
-        <w:t xml:space="preserve">Keppeler and Hardy (2004)</w:t>
-      </w:r>
-      <w:r>
-        <w:t xml:space="preserve">, the composition and structure of zooplankton communities result from complex interactions among physical, chemical, and biological factors, including seasonal variations. Therefore, shifts in species composition and community turnover often reflect underlying alterations in environmental conditions</w:t>
+        <w:t xml:space="preserve">Romanelli et al. (2022)</w:t>
       </w:r>
       <w:r>
         <w:t xml:space="preserve"> </w:t>
       </w:r>
       <w:r>
-        <w:t xml:space="preserve">(Melo and Medeiros 2013, Freiry et al. 2020)</w:t>
-      </w:r>
-      <w:r>
-        <w:t xml:space="preserve">.</w:t>
+        <w:t xml:space="preserve">proposes that a multiple statistical diversity approach with multi-taxon evaluation provides a more comprehensive understanding of environmental ecological health and species responses to anthropogenic stress. Nevertheless, few approaches allow for the assessment of diversity organization across explicit hierarchical spatial scales, such as in streams. Diversity partitioning stands out in this context. This framework decomposes overall diversity across multiple spatial levels, testing whether observed diversity is higher or lower than expected under a null distribution model</w:t>
+      </w:r>
+      <w:r>
+        <w:t xml:space="preserve"> </w:t>
+      </w:r>
+      <w:r>
+        <w:t xml:space="preserve">(Lopes et al. 2014)</w:t>
+      </w:r>
+      <w:r>
+        <w:t xml:space="preserve">, thereby offering valuable insights into community assembly and underlying ecological drivers.</w:t>
       </w:r>
     </w:p>
     <w:p>
@@ -355,56 +394,74 @@
         <w:pStyle w:val="TextBody"/>
       </w:pPr>
       <w:r>
-        <w:t xml:space="preserve">In recent decades, researchers have argued that biodiversity assessments should not be reduced to a single diversity index.</w:t>
+        <w:t xml:space="preserve">Among the diversity partitioning framework, additive partitioning is widely applied in ecological studies, even though,</w:t>
       </w:r>
       <w:r>
         <w:t xml:space="preserve"> </w:t>
       </w:r>
       <w:r>
-        <w:t xml:space="preserve">Romanelli et al. (2022)</w:t>
-      </w:r>
-      <w:r>
         <w:t xml:space="preserve"> </w:t>
       </w:r>
       <w:r>
-        <w:t xml:space="preserve">emphasize that combining multiple statistical diversity approaches with multi-taxon evaluations provides a more comprehensive understanding of environmental ecological health and species responses to anthropogenic stress. Nevertheless, few approaches allow for the assessment of diversity organization across explicit hierarchical spatial scales.</w:t>
-      </w:r>
-    </w:p>
-    <w:p>
-      <w:pPr>
-        <w:pStyle w:val="TextBody"/>
-      </w:pPr>
-      <w:r>
-        <w:t xml:space="preserve">Diversity partitioning stands out in this context. This framework decomposes overall diversity across multiple spatial levels, testing whether observed diversity is higher or lower than expected under null distribution models</w:t>
+        <w:t xml:space="preserve">–&gt;</w:t>
       </w:r>
       <w:r>
         <w:t xml:space="preserve"> </w:t>
       </w:r>
       <w:r>
-        <w:t xml:space="preserve">(Lopes et al. 2014)</w:t>
-      </w:r>
-      <w:r>
-        <w:t xml:space="preserve">, thereby offering valuable insights into community assembly and underlying ecological drivers.</w:t>
-      </w:r>
-    </w:p>
-    <w:p>
-      <w:pPr>
-        <w:pStyle w:val="TextBody"/>
-      </w:pPr>
-      <w:r>
-        <w:t xml:space="preserve">Among diversity partitioning framework variants, additive partitioning is widely applied in aquatic studies. However,</w:t>
+        <w:t xml:space="preserve">Ligeiro et al. (2010)</w:t>
       </w:r>
       <w:r>
         <w:t xml:space="preserve"> </w:t>
       </w:r>
       <w:r>
-        <w:t xml:space="preserve">Ligeiro et al. (2010)</w:t>
+        <w:t xml:space="preserve">point out that its application in freshwater systems remains relatively scarce and highlights a critical knowledge gap regarding alpha and beta diversity distribution in freshwater systems. Additive diversity partitioning has been shown to provide a robust framework to evaluate how freshwater communities respond to landscape fragmentation and/or seasonal dynamics</w:t>
       </w:r>
       <w:r>
         <w:t xml:space="preserve"> </w:t>
       </w:r>
       <w:r>
-        <w:t xml:space="preserve">point out that its application in freshwater systems remains relatively scarce, highlighting a critical knowledge gap regarding alpha and beta diversity distribution. Under the additive partitioning model, total regional diversity (</w:t>
+        <w:t xml:space="preserve">(Akhyar et al. 2026)</w:t>
+      </w:r>
+      <w:r>
+        <w:t xml:space="preserve">. By decomposing total diversity into hierarchical</w:t>
+      </w:r>
+      <w:r>
+        <w:t xml:space="preserve"> </w:t>
+      </w:r>
+      <m:oMath>
+        <m:r>
+          <m:t>α</m:t>
+        </m:r>
+      </m:oMath>
+      <w:r>
+        <w:t xml:space="preserve"> </w:t>
+      </w:r>
+      <w:r>
+        <w:t xml:space="preserve">and</w:t>
+      </w:r>
+      <w:r>
+        <w:t xml:space="preserve"> </w:t>
+      </w:r>
+      <m:oMath>
+        <m:r>
+          <m:t>β</m:t>
+        </m:r>
+      </m:oMath>
+      <w:r>
+        <w:t xml:space="preserve"> </w:t>
+      </w:r>
+      <w:r>
+        <w:t xml:space="preserve">components, it is possible to quantify spatial contributions to overall diversity and detect species turnover across scales</w:t>
+      </w:r>
+      <w:r>
+        <w:t xml:space="preserve"> </w:t>
+      </w:r>
+      <w:r>
+        <w:t xml:space="preserve">(Jost 2007)</w:t>
+      </w:r>
+      <w:r>
+        <w:t xml:space="preserve">. That is, under the additive partitioning model, total regional diversity (</w:t>
       </w:r>
       <m:oMath>
         <m:r>
@@ -469,42 +526,6 @@
       </w:r>
       <w:r>
         <w:t xml:space="preserve">.</w:t>
-      </w:r>
-    </w:p>
-    <w:p>
-      <w:pPr>
-        <w:pStyle w:val="TextBody"/>
-      </w:pPr>
-      <w:r>
-        <w:t xml:space="preserve">Additive diversity partitioning provides a robust framework to evaluate how zooplankton communities respond to landscape fragmentation and seasonal dynamics. By decomposing total diversity into hierarchical</w:t>
-      </w:r>
-      <w:r>
-        <w:t xml:space="preserve"> </w:t>
-      </w:r>
-      <m:oMath>
-        <m:r>
-          <m:t>α</m:t>
-        </m:r>
-      </m:oMath>
-      <w:r>
-        <w:t xml:space="preserve"> </w:t>
-      </w:r>
-      <w:r>
-        <w:t xml:space="preserve">and</w:t>
-      </w:r>
-      <w:r>
-        <w:t xml:space="preserve"> </w:t>
-      </w:r>
-      <m:oMath>
-        <m:r>
-          <m:t>β</m:t>
-        </m:r>
-      </m:oMath>
-      <w:r>
-        <w:t xml:space="preserve"> </w:t>
-      </w:r>
-      <w:r>
-        <w:t xml:space="preserve">components, it is possible to quantify spatial contributions to overall diversity and detect species turnover across scales. Ultimately, this study generates key baseline data on the ecological condition of the studied streams and the ecological mechanisms structuring zooplankton communities, contributing to safer conservation strategies in Atlantic Forest remnants.</w:t>
       </w:r>
     </w:p>
     <w:p>
@@ -808,7 +829,7 @@
         <w:t xml:space="preserve">(Gouveia et al. 2017)</w:t>
       </w:r>
       <w:r>
-        <w:t xml:space="preserve">, we hypothesize that the diversity is not be homogeneously distributed among the different spatial scales but concentrated at the finer levels and seasonal variation will be limited to species composition, but no spacial variation is expected between dry and wet seasons. Some environmental features (reach morphology, habitat structure, and water quality) are also described to explore possible explaining factors for the observed patterns.</w:t>
+        <w:t xml:space="preserve">, we hypothesize that the diversity is not be homogeneously distributed among the different spatial scales but concentrated at the finer levels and seasonal variation will be limited to species composition, but no spacial variation is expected between dry and wet seasons. Some environmental features (reach morphology, habitat structure, and water quality) are also described to explore possible explaining factors for the observed patterns. Ultimately, this study generates key baseline data on the ecological condition of the studied streams and the ecological mechanisms structuring zooplankton communities, contributing to safer conservation strategies in Atlantic Forest remnants.</w:t>
       </w:r>
     </w:p>
     <w:bookmarkEnd w:id="12"/>
@@ -1034,7 +1055,7 @@
         <w:t xml:space="preserve"> </w:t>
       </w:r>
       <w:r>
-        <w:t xml:space="preserve">(1998)</w:t>
+        <w:t xml:space="preserve">(APHA 1998)</w:t>
       </w:r>
       <w:r>
         <w:t xml:space="preserve"> </w:t>
@@ -3737,7 +3758,7 @@
       </w:r>
     </w:p>
     <w:bookmarkEnd w:id="25"/>
-    <w:bookmarkStart w:id="169" w:name="references"/>
+    <w:bookmarkStart w:id="176" w:name="references"/>
     <w:p>
       <w:pPr>
         <w:pStyle w:val="Heading1"/>
@@ -3746,19 +3767,43 @@
         <w:t xml:space="preserve">References</w:t>
       </w:r>
     </w:p>
-    <w:bookmarkStart w:id="168" w:name="refs"/>
-    <w:bookmarkStart w:id="27" w:name="ref-altindag2025"/>
+    <w:bookmarkStart w:id="175" w:name="refs"/>
+    <w:bookmarkStart w:id="27" w:name="ref-akhyar2026"/>
     <w:p>
       <w:pPr>
         <w:pStyle w:val="Bibliography"/>
       </w:pPr>
       <w:r>
+        <w:t xml:space="preserve">Akhyar, A., A. F. Abdullah, and Z. Hassan. 2026.</w:t>
+      </w:r>
+      <w:r>
+        <w:t xml:space="preserve"> </w:t>
+      </w:r>
+      <w:hyperlink r:id="rId26">
+        <w:r>
+          <w:rPr>
+            <w:rStyle w:val="Hyperlink"/>
+          </w:rPr>
+          <w:t xml:space="preserve">Stream connectivity structures fish assemblage beta diversity through turnover and nestedness in tropical tributaries</w:t>
+        </w:r>
+      </w:hyperlink>
+      <w:r>
+        <w:t xml:space="preserve">. Biodiversity and Conservation 35:79.</w:t>
+      </w:r>
+    </w:p>
+    <w:bookmarkEnd w:id="27"/>
+    <w:bookmarkStart w:id="29" w:name="ref-altindag2025"/>
+    <w:p>
+      <w:pPr>
+        <w:pStyle w:val="Bibliography"/>
+      </w:pPr>
+      <w:r>
         <w:t xml:space="preserve">Altindağ, A., and D. Berdi̇. 2025.</w:t>
       </w:r>
       <w:r>
         <w:t xml:space="preserve"> </w:t>
       </w:r>
-      <w:hyperlink r:id="rId26">
+      <w:hyperlink r:id="rId28">
         <w:r>
           <w:rPr>
             <w:rStyle w:val="Hyperlink"/>
@@ -3770,8 +3815,8 @@
         <w:t xml:space="preserve">. Desalination and Water Treatment 321:100991.</w:t>
       </w:r>
     </w:p>
-    <w:bookmarkEnd w:id="27"/>
-    <w:bookmarkStart w:id="29" w:name="ref-anderson2013"/>
+    <w:bookmarkEnd w:id="29"/>
+    <w:bookmarkStart w:id="31" w:name="ref-anderson2013"/>
     <w:p>
       <w:pPr>
         <w:pStyle w:val="Bibliography"/>
@@ -3782,7 +3827,7 @@
       <w:r>
         <w:t xml:space="preserve"> </w:t>
       </w:r>
-      <w:hyperlink r:id="rId28">
+      <w:hyperlink r:id="rId30">
         <w:r>
           <w:rPr>
             <w:rStyle w:val="Hyperlink"/>
@@ -3794,8 +3839,8 @@
         <w:t xml:space="preserve"> Ecological Monographs 83:557574.</w:t>
       </w:r>
     </w:p>
-    <w:bookmarkEnd w:id="29"/>
-    <w:bookmarkStart w:id="31" w:name="ref-apha1998"/>
+    <w:bookmarkEnd w:id="31"/>
+    <w:bookmarkStart w:id="33" w:name="ref-apha1998"/>
     <w:p>
       <w:pPr>
         <w:pStyle w:val="Bibliography"/>
@@ -3806,7 +3851,7 @@
       <w:r>
         <w:t xml:space="preserve"> </w:t>
       </w:r>
-      <w:hyperlink r:id="rId30">
+      <w:hyperlink r:id="rId32">
         <w:r>
           <w:rPr>
             <w:rStyle w:val="Hyperlink"/>
@@ -3815,11 +3860,11 @@
         </w:r>
       </w:hyperlink>
       <w:r>
-        <w:t xml:space="preserve">. Washington, DC.</w:t>
+        <w:t xml:space="preserve">. American Public Health Association, Washington, DC.</w:t>
       </w:r>
     </w:p>
-    <w:bookmarkEnd w:id="31"/>
-    <w:bookmarkStart w:id="33" w:name="ref-arruda2013"/>
+    <w:bookmarkEnd w:id="33"/>
+    <w:bookmarkStart w:id="35" w:name="ref-arruda2013"/>
     <w:p>
       <w:pPr>
         <w:pStyle w:val="Bibliography"/>
@@ -3830,7 +3875,7 @@
       <w:r>
         <w:t xml:space="preserve"> </w:t>
       </w:r>
-      <w:hyperlink r:id="rId32">
+      <w:hyperlink r:id="rId34">
         <w:r>
           <w:rPr>
             <w:rStyle w:val="Hyperlink"/>
@@ -3842,8 +3887,8 @@
         <w:t xml:space="preserve">. Revista Direitos Emergentes na Sociedade Global 2:280–304.</w:t>
       </w:r>
     </w:p>
-    <w:bookmarkEnd w:id="33"/>
-    <w:bookmarkStart w:id="35" w:name="ref-ávila2011"/>
+    <w:bookmarkEnd w:id="35"/>
+    <w:bookmarkStart w:id="37" w:name="ref-ávila2011"/>
     <w:p>
       <w:pPr>
         <w:pStyle w:val="Bibliography"/>
@@ -3854,7 +3899,7 @@
       <w:r>
         <w:t xml:space="preserve"> </w:t>
       </w:r>
-      <w:hyperlink r:id="rId34">
+      <w:hyperlink r:id="rId36">
         <w:r>
           <w:rPr>
             <w:rStyle w:val="Hyperlink"/>
@@ -3866,8 +3911,8 @@
         <w:t xml:space="preserve">. Wetlands 31:459–469.</w:t>
       </w:r>
     </w:p>
-    <w:bookmarkEnd w:id="35"/>
-    <w:bookmarkStart w:id="37" w:name="ref-balkic2022"/>
+    <w:bookmarkEnd w:id="37"/>
+    <w:bookmarkStart w:id="39" w:name="ref-balkic2022"/>
     <w:p>
       <w:pPr>
         <w:pStyle w:val="Bibliography"/>
@@ -3878,7 +3923,7 @@
       <w:r>
         <w:t xml:space="preserve"> </w:t>
       </w:r>
-      <w:hyperlink r:id="rId36">
+      <w:hyperlink r:id="rId38">
         <w:r>
           <w:rPr>
             <w:rStyle w:val="Hyperlink"/>
@@ -3890,8 +3935,8 @@
         <w:t xml:space="preserve">. Environmental Research 212:113563.</w:t>
       </w:r>
     </w:p>
-    <w:bookmarkEnd w:id="37"/>
-    <w:bookmarkStart w:id="39" w:name="ref-barboza2024"/>
+    <w:bookmarkEnd w:id="39"/>
+    <w:bookmarkStart w:id="41" w:name="ref-barboza2024"/>
     <w:p>
       <w:pPr>
         <w:pStyle w:val="Bibliography"/>
@@ -3902,7 +3947,7 @@
       <w:r>
         <w:t xml:space="preserve"> </w:t>
       </w:r>
-      <w:hyperlink r:id="rId38">
+      <w:hyperlink r:id="rId40">
         <w:r>
           <w:rPr>
             <w:rStyle w:val="Hyperlink"/>
@@ -3914,8 +3959,8 @@
         <w:t xml:space="preserve">. Limnologica 106:126170.</w:t>
       </w:r>
     </w:p>
-    <w:bookmarkEnd w:id="39"/>
-    <w:bookmarkStart w:id="41" w:name="ref-baselga2010"/>
+    <w:bookmarkEnd w:id="41"/>
+    <w:bookmarkStart w:id="43" w:name="ref-baselga2010"/>
     <w:p>
       <w:pPr>
         <w:pStyle w:val="Bibliography"/>
@@ -3926,7 +3971,7 @@
       <w:r>
         <w:t xml:space="preserve"> </w:t>
       </w:r>
-      <w:hyperlink r:id="rId40">
+      <w:hyperlink r:id="rId42">
         <w:r>
           <w:rPr>
             <w:rStyle w:val="Hyperlink"/>
@@ -3938,8 +3983,8 @@
         <w:t xml:space="preserve">. Global Ecology and Biogeography 19:134–143.</w:t>
       </w:r>
     </w:p>
-    <w:bookmarkEnd w:id="41"/>
-    <w:bookmarkStart w:id="43" w:name="ref-baselga2012"/>
+    <w:bookmarkEnd w:id="43"/>
+    <w:bookmarkStart w:id="45" w:name="ref-baselga2012"/>
     <w:p>
       <w:pPr>
         <w:pStyle w:val="Bibliography"/>
@@ -3950,7 +3995,7 @@
       <w:r>
         <w:t xml:space="preserve"> </w:t>
       </w:r>
-      <w:hyperlink r:id="rId42">
+      <w:hyperlink r:id="rId44">
         <w:r>
           <w:rPr>
             <w:rStyle w:val="Hyperlink"/>
@@ -3962,8 +4007,8 @@
         <w:t xml:space="preserve">. Global Ecology and Biogeography 21:1223–1232.</w:t>
       </w:r>
     </w:p>
-    <w:bookmarkEnd w:id="43"/>
-    <w:bookmarkStart w:id="45" w:name="ref-belbin1993"/>
+    <w:bookmarkEnd w:id="45"/>
+    <w:bookmarkStart w:id="47" w:name="ref-belbin1993"/>
     <w:p>
       <w:pPr>
         <w:pStyle w:val="Bibliography"/>
@@ -3974,7 +4019,7 @@
       <w:r>
         <w:t xml:space="preserve"> </w:t>
       </w:r>
-      <w:hyperlink r:id="rId44">
+      <w:hyperlink r:id="rId46">
         <w:r>
           <w:rPr>
             <w:rStyle w:val="Hyperlink"/>
@@ -3986,8 +4031,8 @@
         <w:t xml:space="preserve">. Journal of Vegetation Science 4:341–348.</w:t>
       </w:r>
     </w:p>
-    <w:bookmarkEnd w:id="45"/>
-    <w:bookmarkStart w:id="47" w:name="ref-bonecker2013"/>
+    <w:bookmarkEnd w:id="47"/>
+    <w:bookmarkStart w:id="49" w:name="ref-bonecker2013"/>
     <w:p>
       <w:pPr>
         <w:pStyle w:val="Bibliography"/>
@@ -3998,7 +4043,7 @@
       <w:r>
         <w:t xml:space="preserve"> </w:t>
       </w:r>
-      <w:hyperlink r:id="rId46">
+      <w:hyperlink r:id="rId48">
         <w:r>
           <w:rPr>
             <w:rStyle w:val="Hyperlink"/>
@@ -4010,8 +4055,8 @@
         <w:t xml:space="preserve">. Limnologica 43:114–121.</w:t>
       </w:r>
     </w:p>
-    <w:bookmarkEnd w:id="47"/>
-    <w:bookmarkStart w:id="49" w:name="ref-brasil2000"/>
+    <w:bookmarkEnd w:id="49"/>
+    <w:bookmarkStart w:id="51" w:name="ref-brasil2000"/>
     <w:p>
       <w:pPr>
         <w:pStyle w:val="Bibliography"/>
@@ -4022,7 +4067,7 @@
       <w:r>
         <w:t xml:space="preserve"> </w:t>
       </w:r>
-      <w:hyperlink r:id="rId48">
+      <w:hyperlink r:id="rId50">
         <w:r>
           <w:rPr>
             <w:rStyle w:val="Hyperlink"/>
@@ -4031,8 +4076,8 @@
         </w:r>
       </w:hyperlink>
     </w:p>
-    <w:bookmarkEnd w:id="49"/>
-    <w:bookmarkStart w:id="51" w:name="ref-cnpq2026"/>
+    <w:bookmarkEnd w:id="51"/>
+    <w:bookmarkStart w:id="53" w:name="ref-cnpq2026"/>
     <w:p>
       <w:pPr>
         <w:pStyle w:val="Bibliography"/>
@@ -4043,7 +4088,7 @@
       <w:r>
         <w:t xml:space="preserve"> </w:t>
       </w:r>
-      <w:hyperlink r:id="rId50">
+      <w:hyperlink r:id="rId52">
         <w:r>
           <w:rPr>
             <w:rStyle w:val="Hyperlink"/>
@@ -4055,8 +4100,8 @@
         <w:t xml:space="preserve">.</w:t>
       </w:r>
     </w:p>
-    <w:bookmarkEnd w:id="51"/>
-    <w:bookmarkStart w:id="53" w:name="ref-credit2026"/>
+    <w:bookmarkEnd w:id="53"/>
+    <w:bookmarkStart w:id="55" w:name="ref-credit2026"/>
     <w:p>
       <w:pPr>
         <w:pStyle w:val="Bibliography"/>
@@ -4067,7 +4112,7 @@
       <w:r>
         <w:t xml:space="preserve"> </w:t>
       </w:r>
-      <w:hyperlink r:id="rId52">
+      <w:hyperlink r:id="rId54">
         <w:r>
           <w:rPr>
             <w:rStyle w:val="Hyperlink"/>
@@ -4079,8 +4124,8 @@
         <w:t xml:space="preserve">. NISO/CRediT Standing Committee.</w:t>
       </w:r>
     </w:p>
-    <w:bookmarkEnd w:id="53"/>
-    <w:bookmarkStart w:id="55" w:name="ref-crist2003"/>
+    <w:bookmarkEnd w:id="55"/>
+    <w:bookmarkStart w:id="57" w:name="ref-crist2003"/>
     <w:p>
       <w:pPr>
         <w:pStyle w:val="Bibliography"/>
@@ -4091,7 +4136,7 @@
       <w:r>
         <w:t xml:space="preserve"> </w:t>
       </w:r>
-      <w:hyperlink r:id="rId54">
+      <w:hyperlink r:id="rId56">
         <w:r>
           <w:rPr>
             <w:rStyle w:val="Hyperlink"/>
@@ -4103,19 +4148,55 @@
         <w:t xml:space="preserve">. The American Naturalist 162:734–743.</w:t>
       </w:r>
     </w:p>
-    <w:bookmarkEnd w:id="55"/>
-    <w:bookmarkStart w:id="57" w:name="ref-epa2020"/>
+    <w:bookmarkEnd w:id="57"/>
+    <w:bookmarkStart w:id="59" w:name="ref-england2004"/>
     <w:p>
       <w:pPr>
         <w:pStyle w:val="Bibliography"/>
       </w:pPr>
       <w:r>
+        <w:t xml:space="preserve">England, L. E., and A. D. Rosemond. 2004.</w:t>
+      </w:r>
+      <w:r>
+        <w:t xml:space="preserve"> </w:t>
+      </w:r>
+      <w:hyperlink r:id="rId58">
+        <w:r>
+          <w:rPr>
+            <w:rStyle w:val="Hyperlink"/>
+          </w:rPr>
+          <w:t xml:space="preserve">Small reductions in forest cover weaken terrestrial</w:t>
+        </w:r>
+        <w:r>
+          <w:rPr>
+            <w:rStyle w:val="Hyperlink"/>
+          </w:rPr>
+          <w:t xml:space="preserve">-</w:t>
+        </w:r>
+        <w:r>
+          <w:rPr>
+            <w:rStyle w:val="Hyperlink"/>
+          </w:rPr>
+          <w:t xml:space="preserve">aquatic linkages in headwater streams</w:t>
+        </w:r>
+      </w:hyperlink>
+      <w:r>
+        <w:t xml:space="preserve">. Freshwater Biology 49:721–734.</w:t>
+      </w:r>
+    </w:p>
+    <w:bookmarkEnd w:id="59"/>
+    <w:bookmarkStart w:id="61" w:name="ref-epa2020"/>
+    <w:p>
+      <w:pPr>
+        <w:pStyle w:val="Bibliography"/>
+      </w:pPr>
+      <w:r>
         <w:t xml:space="preserve">EPA. 2020.</w:t>
       </w:r>
       <w:r>
         <w:t xml:space="preserve"> </w:t>
       </w:r>
-      <w:hyperlink r:id="rId56">
+      <w:hyperlink r:id="rId60">
         <w:r>
           <w:rPr>
             <w:rStyle w:val="Hyperlink"/>
@@ -4127,8 +4208,8 @@
         <w:t xml:space="preserve">.</w:t>
       </w:r>
     </w:p>
-    <w:bookmarkEnd w:id="57"/>
-    <w:bookmarkStart w:id="59" w:name="ref-farias2020"/>
+    <w:bookmarkEnd w:id="61"/>
+    <w:bookmarkStart w:id="63" w:name="ref-farias2020"/>
     <w:p>
       <w:pPr>
         <w:pStyle w:val="Bibliography"/>
@@ -4139,7 +4220,7 @@
       <w:r>
         <w:t xml:space="preserve"> </w:t>
       </w:r>
-      <w:hyperlink r:id="rId58">
+      <w:hyperlink r:id="rId62">
         <w:r>
           <w:rPr>
             <w:rStyle w:val="Hyperlink"/>
@@ -4151,8 +4232,8 @@
         <w:t xml:space="preserve">. Inland Waters 10:480–492.</w:t>
       </w:r>
     </w:p>
-    <w:bookmarkEnd w:id="59"/>
-    <w:bookmarkStart w:id="61" w:name="ref-farris1969"/>
+    <w:bookmarkEnd w:id="63"/>
+    <w:bookmarkStart w:id="65" w:name="ref-farris1969"/>
     <w:p>
       <w:pPr>
         <w:pStyle w:val="Bibliography"/>
@@ -4163,7 +4244,7 @@
       <w:r>
         <w:t xml:space="preserve"> </w:t>
       </w:r>
-      <w:hyperlink r:id="rId60">
+      <w:hyperlink r:id="rId64">
         <w:r>
           <w:rPr>
             <w:rStyle w:val="Hyperlink"/>
@@ -4175,8 +4256,8 @@
         <w:t xml:space="preserve">. Systematic Zoology 18:279.</w:t>
       </w:r>
     </w:p>
-    <w:bookmarkEnd w:id="61"/>
-    <w:bookmarkStart w:id="63" w:name="ref-fonseca1985"/>
+    <w:bookmarkEnd w:id="65"/>
+    <w:bookmarkStart w:id="67" w:name="ref-fonseca1985"/>
     <w:p>
       <w:pPr>
         <w:pStyle w:val="Bibliography"/>
@@ -4187,7 +4268,7 @@
       <w:r>
         <w:t xml:space="preserve"> </w:t>
       </w:r>
-      <w:hyperlink r:id="rId62">
+      <w:hyperlink r:id="rId66">
         <w:r>
           <w:rPr>
             <w:rStyle w:val="Hyperlink"/>
@@ -4199,8 +4280,8 @@
         <w:t xml:space="preserve">. Biological Conservation 34:17–34.</w:t>
       </w:r>
     </w:p>
-    <w:bookmarkEnd w:id="63"/>
-    <w:bookmarkStart w:id="65" w:name="ref-freiry2020"/>
+    <w:bookmarkEnd w:id="67"/>
+    <w:bookmarkStart w:id="69" w:name="ref-freiry2020"/>
     <w:p>
       <w:pPr>
         <w:pStyle w:val="Bibliography"/>
@@ -4211,7 +4292,7 @@
       <w:r>
         <w:t xml:space="preserve"> </w:t>
       </w:r>
-      <w:hyperlink r:id="rId64">
+      <w:hyperlink r:id="rId68">
         <w:r>
           <w:rPr>
             <w:rStyle w:val="Hyperlink"/>
@@ -4229,8 +4310,8 @@
         <w:t xml:space="preserve">. Hydrobiologia 847:1327–1342.</w:t>
       </w:r>
     </w:p>
-    <w:bookmarkEnd w:id="65"/>
-    <w:bookmarkStart w:id="67" w:name="ref-frissell1986"/>
+    <w:bookmarkEnd w:id="69"/>
+    <w:bookmarkStart w:id="71" w:name="ref-frissell1986"/>
     <w:p>
       <w:pPr>
         <w:pStyle w:val="Bibliography"/>
@@ -4241,7 +4322,7 @@
       <w:r>
         <w:t xml:space="preserve"> </w:t>
       </w:r>
-      <w:hyperlink r:id="rId66">
+      <w:hyperlink r:id="rId70">
         <w:r>
           <w:rPr>
             <w:rStyle w:val="Hyperlink"/>
@@ -4253,8 +4334,8 @@
         <w:t xml:space="preserve">. Environmental Management 10:199–214.</w:t>
       </w:r>
     </w:p>
-    <w:bookmarkEnd w:id="67"/>
-    <w:bookmarkStart w:id="69" w:name="ref-gering2003"/>
+    <w:bookmarkEnd w:id="71"/>
+    <w:bookmarkStart w:id="73" w:name="ref-gering2003"/>
     <w:p>
       <w:pPr>
         <w:pStyle w:val="Bibliography"/>
@@ -4265,7 +4346,7 @@
       <w:r>
         <w:t xml:space="preserve"> </w:t>
       </w:r>
-      <w:hyperlink r:id="rId68">
+      <w:hyperlink r:id="rId72">
         <w:r>
           <w:rPr>
             <w:rStyle w:val="Hyperlink"/>
@@ -4277,8 +4358,8 @@
         <w:t xml:space="preserve">. Conservation Biology 17:488–499.</w:t>
       </w:r>
     </w:p>
-    <w:bookmarkEnd w:id="69"/>
-    <w:bookmarkStart w:id="71" w:name="ref-gotelli2001"/>
+    <w:bookmarkEnd w:id="73"/>
+    <w:bookmarkStart w:id="75" w:name="ref-gotelli2001"/>
     <w:p>
       <w:pPr>
         <w:pStyle w:val="Bibliography"/>
@@ -4289,7 +4370,7 @@
       <w:r>
         <w:t xml:space="preserve"> </w:t>
       </w:r>
-      <w:hyperlink r:id="rId70">
+      <w:hyperlink r:id="rId74">
         <w:r>
           <w:rPr>
             <w:rStyle w:val="Hyperlink"/>
@@ -4301,8 +4382,8 @@
         <w:t xml:space="preserve">. Ecology Letters 4:379–391.</w:t>
       </w:r>
     </w:p>
-    <w:bookmarkEnd w:id="71"/>
-    <w:bookmarkStart w:id="73" w:name="ref-gotelli2002"/>
+    <w:bookmarkEnd w:id="75"/>
+    <w:bookmarkStart w:id="77" w:name="ref-gotelli2002"/>
     <w:p>
       <w:pPr>
         <w:pStyle w:val="Bibliography"/>
@@ -4313,7 +4394,7 @@
       <w:r>
         <w:t xml:space="preserve"> </w:t>
       </w:r>
-      <w:hyperlink r:id="rId72">
+      <w:hyperlink r:id="rId76">
         <w:r>
           <w:rPr>
             <w:rStyle w:val="Hyperlink"/>
@@ -4325,8 +4406,8 @@
         <w:t xml:space="preserve">. Ecology 83:2091–2096.</w:t>
       </w:r>
     </w:p>
-    <w:bookmarkEnd w:id="73"/>
-    <w:bookmarkStart w:id="75" w:name="ref-gouveia2017"/>
+    <w:bookmarkEnd w:id="77"/>
+    <w:bookmarkStart w:id="79" w:name="ref-gouveia2017"/>
     <w:p>
       <w:pPr>
         <w:pStyle w:val="Bibliography"/>
@@ -4337,7 +4418,7 @@
       <w:r>
         <w:t xml:space="preserve"> </w:t>
       </w:r>
-      <w:hyperlink r:id="rId74">
+      <w:hyperlink r:id="rId78">
         <w:r>
           <w:rPr>
             <w:rStyle w:val="Hyperlink"/>
@@ -4349,8 +4430,8 @@
         <w:t xml:space="preserve">. Check List 13:581–590.</w:t>
       </w:r>
     </w:p>
-    <w:bookmarkEnd w:id="75"/>
-    <w:bookmarkStart w:id="76" w:name="ref-haney1973"/>
+    <w:bookmarkEnd w:id="79"/>
+    <w:bookmarkStart w:id="80" w:name="ref-haney1973"/>
     <w:p>
       <w:pPr>
         <w:pStyle w:val="Bibliography"/>
@@ -4359,8 +4440,8 @@
         <w:t xml:space="preserve">Haney, J. F., and D. J. Hall. 1973. Sugar-coated daphnia: A preservation technique for cladocerans. Limnology and Oceanography 18:331–333.</w:t>
       </w:r>
     </w:p>
-    <w:bookmarkEnd w:id="76"/>
-    <w:bookmarkStart w:id="78" w:name="ref-heinrichs2017"/>
+    <w:bookmarkEnd w:id="80"/>
+    <w:bookmarkStart w:id="82" w:name="ref-heinrichs2017"/>
     <w:p>
       <w:pPr>
         <w:pStyle w:val="Bibliography"/>
@@ -4371,7 +4452,7 @@
       <w:r>
         <w:t xml:space="preserve"> </w:t>
       </w:r>
-      <w:hyperlink r:id="rId77">
+      <w:hyperlink r:id="rId81">
         <w:r>
           <w:rPr>
             <w:rStyle w:val="Hyperlink"/>
@@ -4399,8 +4480,8 @@
         <w:t xml:space="preserve">S. Dabbert, I. Lewandowski, J. Weiss, and A. Pyka, editors. Springer International Publishing, Cham, Switzerland.</w:t>
       </w:r>
     </w:p>
-    <w:bookmarkEnd w:id="78"/>
-    <w:bookmarkStart w:id="80" w:name="ref-jost2007"/>
+    <w:bookmarkEnd w:id="82"/>
+    <w:bookmarkStart w:id="84" w:name="ref-jost2007"/>
     <w:p>
       <w:pPr>
         <w:pStyle w:val="Bibliography"/>
@@ -4411,7 +4492,7 @@
       <w:r>
         <w:t xml:space="preserve"> </w:t>
       </w:r>
-      <w:hyperlink r:id="rId79">
+      <w:hyperlink r:id="rId83">
         <w:r>
           <w:rPr>
             <w:rStyle w:val="Hyperlink"/>
@@ -4423,8 +4504,8 @@
         <w:t xml:space="preserve">. Ecology 88:2427–2439.</w:t>
       </w:r>
     </w:p>
-    <w:bookmarkEnd w:id="80"/>
-    <w:bookmarkStart w:id="82" w:name="ref-kaufman1990"/>
+    <w:bookmarkEnd w:id="84"/>
+    <w:bookmarkStart w:id="86" w:name="ref-kaufman1990"/>
     <w:p>
       <w:pPr>
         <w:pStyle w:val="Bibliography"/>
@@ -4435,7 +4516,7 @@
       <w:r>
         <w:t xml:space="preserve"> </w:t>
       </w:r>
-      <w:hyperlink r:id="rId81">
+      <w:hyperlink r:id="rId85">
         <w:r>
           <w:rPr>
             <w:rStyle w:val="Hyperlink"/>
@@ -4447,8 +4528,8 @@
         <w:t xml:space="preserve">. Pages 199–252. First edition. Wiley.</w:t>
       </w:r>
     </w:p>
-    <w:bookmarkEnd w:id="82"/>
-    <w:bookmarkStart w:id="84" w:name="ref-keppeler2004"/>
+    <w:bookmarkEnd w:id="86"/>
+    <w:bookmarkStart w:id="88" w:name="ref-keppeler2004"/>
     <w:p>
       <w:pPr>
         <w:pStyle w:val="Bibliography"/>
@@ -4459,7 +4540,7 @@
       <w:r>
         <w:t xml:space="preserve"> </w:t>
       </w:r>
-      <w:hyperlink r:id="rId83">
+      <w:hyperlink r:id="rId87">
         <w:r>
           <w:rPr>
             <w:rStyle w:val="Hyperlink"/>
@@ -4471,8 +4552,8 @@
         <w:t xml:space="preserve">. Revista Brasileira de Zoologia 21:233–241.</w:t>
       </w:r>
     </w:p>
-    <w:bookmarkEnd w:id="84"/>
-    <w:bookmarkStart w:id="86" w:name="ref-lande1996"/>
+    <w:bookmarkEnd w:id="88"/>
+    <w:bookmarkStart w:id="90" w:name="ref-lande1996"/>
     <w:p>
       <w:pPr>
         <w:pStyle w:val="Bibliography"/>
@@ -4483,7 +4564,7 @@
       <w:r>
         <w:t xml:space="preserve"> </w:t>
       </w:r>
-      <w:hyperlink r:id="rId85">
+      <w:hyperlink r:id="rId89">
         <w:r>
           <w:rPr>
             <w:rStyle w:val="Hyperlink"/>
@@ -4495,8 +4576,8 @@
         <w:t xml:space="preserve">. Oikos 76:5.</w:t>
       </w:r>
     </w:p>
-    <w:bookmarkEnd w:id="86"/>
-    <w:bookmarkStart w:id="87" w:name="ref-lê2008"/>
+    <w:bookmarkEnd w:id="90"/>
+    <w:bookmarkStart w:id="91" w:name="ref-lê2008"/>
     <w:p>
       <w:pPr>
         <w:pStyle w:val="Bibliography"/>
@@ -4505,8 +4586,8 @@
         <w:t xml:space="preserve">Lê, S., J. Josse, and F. Husson. 2008. FactoMineR: An r package for multivariate analysis. Journal of Statistical Software 25:1–18.</w:t>
       </w:r>
     </w:p>
-    <w:bookmarkEnd w:id="87"/>
-    <w:bookmarkStart w:id="88" w:name="ref-legendre1998"/>
+    <w:bookmarkEnd w:id="91"/>
+    <w:bookmarkStart w:id="92" w:name="ref-legendre1998"/>
     <w:p>
       <w:pPr>
         <w:pStyle w:val="Bibliography"/>
@@ -4515,8 +4596,8 @@
         <w:t xml:space="preserve">Legendre, P., and L. Legendre. 1998. Numerical ecology. 2nd English ed. Amsterdam, The Netherlands ; New York ; Oxford.</w:t>
       </w:r>
     </w:p>
-    <w:bookmarkEnd w:id="88"/>
-    <w:bookmarkStart w:id="90" w:name="ref-ligeiro2010"/>
+    <w:bookmarkEnd w:id="92"/>
+    <w:bookmarkStart w:id="94" w:name="ref-ligeiro2010"/>
     <w:p>
       <w:pPr>
         <w:pStyle w:val="Bibliography"/>
@@ -4527,7 +4608,7 @@
       <w:r>
         <w:t xml:space="preserve"> </w:t>
       </w:r>
-      <w:hyperlink r:id="rId89">
+      <w:hyperlink r:id="rId93">
         <w:r>
           <w:rPr>
             <w:rStyle w:val="Hyperlink"/>
@@ -4539,19 +4620,43 @@
         <w:t xml:space="preserve">. Freshwater Biology 55:424–435.</w:t>
       </w:r>
     </w:p>
-    <w:bookmarkEnd w:id="90"/>
-    <w:bookmarkStart w:id="92" w:name="ref-lopes2014"/>
+    <w:bookmarkEnd w:id="94"/>
+    <w:bookmarkStart w:id="96" w:name="ref-lôbo2011"/>
     <w:p>
       <w:pPr>
         <w:pStyle w:val="Bibliography"/>
       </w:pPr>
       <w:r>
+        <w:t xml:space="preserve">Lôbo, D., T. Leão, F. P. L. Melo, A. M. M. Santos, and M. Tabarelli. 2011.</w:t>
+      </w:r>
+      <w:r>
+        <w:t xml:space="preserve"> </w:t>
+      </w:r>
+      <w:hyperlink r:id="rId95">
+        <w:r>
+          <w:rPr>
+            <w:rStyle w:val="Hyperlink"/>
+          </w:rPr>
+          <w:t xml:space="preserve">Forest fragmentation drives atlantic forest of northeastern brazil to biotic homogenization</w:t>
+        </w:r>
+      </w:hyperlink>
+      <w:r>
+        <w:t xml:space="preserve">. Diversity and Distributions 17:287–296.</w:t>
+      </w:r>
+    </w:p>
+    <w:bookmarkEnd w:id="96"/>
+    <w:bookmarkStart w:id="98" w:name="ref-lopes2014"/>
+    <w:p>
+      <w:pPr>
+        <w:pStyle w:val="Bibliography"/>
+      </w:pPr>
+      <w:r>
         <w:t xml:space="preserve">Lopes, P. M., L. M. Bini, S. A. J. Declerck, V. F. Farjalla, L. C. G. Vieira, C. C. Bonecker, F. A. Lansac-Toha, F. A. Esteves, and R. L. Bozelli. 2014.</w:t>
       </w:r>
       <w:r>
         <w:t xml:space="preserve"> </w:t>
       </w:r>
-      <w:hyperlink r:id="rId91">
+      <w:hyperlink r:id="rId97">
         <w:r>
           <w:rPr>
             <w:rStyle w:val="Hyperlink"/>
@@ -4563,8 +4668,8 @@
         <w:t xml:space="preserve">. PLoS ONE 9:e109581.</w:t>
       </w:r>
     </w:p>
-    <w:bookmarkEnd w:id="92"/>
-    <w:bookmarkStart w:id="94" w:name="ref-lucena2015"/>
+    <w:bookmarkEnd w:id="98"/>
+    <w:bookmarkStart w:id="100" w:name="ref-lucena2015"/>
     <w:p>
       <w:pPr>
         <w:pStyle w:val="Bibliography"/>
@@ -4575,7 +4680,7 @@
       <w:r>
         <w:t xml:space="preserve"> </w:t>
       </w:r>
-      <w:hyperlink r:id="rId93">
+      <w:hyperlink r:id="rId99">
         <w:r>
           <w:rPr>
             <w:rStyle w:val="Hyperlink"/>
@@ -4587,8 +4692,8 @@
         <w:t xml:space="preserve">. Acta Limnologica Brasiliensia 27:118–129.</w:t>
       </w:r>
     </w:p>
-    <w:bookmarkEnd w:id="94"/>
-    <w:bookmarkStart w:id="95" w:name="ref-mackereth1978"/>
+    <w:bookmarkEnd w:id="100"/>
+    <w:bookmarkStart w:id="101" w:name="ref-mackereth1978"/>
     <w:p>
       <w:pPr>
         <w:pStyle w:val="Bibliography"/>
@@ -4597,8 +4702,8 @@
         <w:t xml:space="preserve">Mackereth, F. J. H., J. Heron, and J. F. Talling. 1978. Water analysis: Some revised methods for limnologists.(scientific publication n. 36) freshwater biological association. Cumbria and Dorset, England.</w:t>
       </w:r>
     </w:p>
-    <w:bookmarkEnd w:id="95"/>
-    <w:bookmarkStart w:id="97" w:name="ref-maechler2026"/>
+    <w:bookmarkEnd w:id="101"/>
+    <w:bookmarkStart w:id="103" w:name="ref-maechler2026"/>
     <w:p>
       <w:pPr>
         <w:pStyle w:val="Bibliography"/>
@@ -4609,7 +4714,7 @@
       <w:r>
         <w:t xml:space="preserve"> </w:t>
       </w:r>
-      <w:hyperlink r:id="rId96">
+      <w:hyperlink r:id="rId102">
         <w:r>
           <w:rPr>
             <w:rStyle w:val="Hyperlink"/>
@@ -4621,8 +4726,8 @@
         <w:t xml:space="preserve">.</w:t>
       </w:r>
     </w:p>
-    <w:bookmarkEnd w:id="97"/>
-    <w:bookmarkStart w:id="99" w:name="ref-maitland1990"/>
+    <w:bookmarkEnd w:id="103"/>
+    <w:bookmarkStart w:id="105" w:name="ref-maitland1990"/>
     <w:p>
       <w:pPr>
         <w:pStyle w:val="Bibliography"/>
@@ -4633,7 +4738,7 @@
       <w:r>
         <w:t xml:space="preserve"> </w:t>
       </w:r>
-      <w:hyperlink r:id="rId98">
+      <w:hyperlink r:id="rId104">
         <w:r>
           <w:rPr>
             <w:rStyle w:val="Hyperlink"/>
@@ -4645,19 +4750,43 @@
         <w:t xml:space="preserve">. Second edition. Chapman; Hall, New York.</w:t>
       </w:r>
     </w:p>
-    <w:bookmarkEnd w:id="99"/>
-    <w:bookmarkStart w:id="101" w:name="ref-maltchik2006"/>
+    <w:bookmarkEnd w:id="105"/>
+    <w:bookmarkStart w:id="107" w:name="ref-malabarba2006"/>
     <w:p>
       <w:pPr>
         <w:pStyle w:val="Bibliography"/>
       </w:pPr>
       <w:r>
+        <w:t xml:space="preserve">Malabarba, L. R. 2006.</w:t>
+      </w:r>
+      <w:r>
+        <w:t xml:space="preserve"> </w:t>
+      </w:r>
+      <w:hyperlink r:id="rId106">
+        <w:r>
+          <w:rPr>
+            <w:rStyle w:val="Hyperlink"/>
+          </w:rPr>
+          <w:t xml:space="preserve">Peixes de riachos da mata atlântica nas unidades de conservação do vale do rio ribeira de iguape no estado de são paulo</w:t>
+        </w:r>
+      </w:hyperlink>
+      <w:r>
+        <w:t xml:space="preserve">. Neotropical Ichthyology 4:377–377.</w:t>
+      </w:r>
+    </w:p>
+    <w:bookmarkEnd w:id="107"/>
+    <w:bookmarkStart w:id="109" w:name="ref-maltchik2006"/>
+    <w:p>
+      <w:pPr>
+        <w:pStyle w:val="Bibliography"/>
+      </w:pPr>
+      <w:r>
         <w:t xml:space="preserve">Maltchik, L., and E. S. F. Medeiros. 2006.</w:t>
       </w:r>
       <w:r>
         <w:t xml:space="preserve"> </w:t>
       </w:r>
-      <w:hyperlink r:id="rId100">
+      <w:hyperlink r:id="rId108">
         <w:r>
           <w:rPr>
             <w:rStyle w:val="Hyperlink"/>
@@ -4693,8 +4822,8 @@
         <w:t xml:space="preserve">. Aquatic Conservation: Marine and Freshwater Ecosystems 16:665–677.</w:t>
       </w:r>
     </w:p>
-    <w:bookmarkEnd w:id="101"/>
-    <w:bookmarkStart w:id="103" w:name="ref-marcelino2025"/>
+    <w:bookmarkEnd w:id="109"/>
+    <w:bookmarkStart w:id="111" w:name="ref-marcelino2025"/>
     <w:p>
       <w:pPr>
         <w:pStyle w:val="Bibliography"/>
@@ -4705,7 +4834,7 @@
       <w:r>
         <w:t xml:space="preserve"> </w:t>
       </w:r>
-      <w:hyperlink r:id="rId102">
+      <w:hyperlink r:id="rId110">
         <w:r>
           <w:rPr>
             <w:rStyle w:val="Hyperlink"/>
@@ -4717,8 +4846,8 @@
         <w:t xml:space="preserve">. Acta Limnologica Brasiliensia 37:e30.</w:t>
       </w:r>
     </w:p>
-    <w:bookmarkEnd w:id="103"/>
-    <w:bookmarkStart w:id="104" w:name="ref-mccune2002"/>
+    <w:bookmarkEnd w:id="111"/>
+    <w:bookmarkStart w:id="112" w:name="ref-mccune2002"/>
     <w:p>
       <w:pPr>
         <w:pStyle w:val="Bibliography"/>
@@ -4727,8 +4856,8 @@
         <w:t xml:space="preserve">McCune, B., and J. B. Grace. 2002. Analysis of ecological communities. MjM Software Design, Gleneden Beach, Oregon, U.S.A.</w:t>
       </w:r>
     </w:p>
-    <w:bookmarkEnd w:id="104"/>
-    <w:bookmarkStart w:id="105" w:name="ref-medeiros2008"/>
+    <w:bookmarkEnd w:id="112"/>
+    <w:bookmarkStart w:id="113" w:name="ref-medeiros2008"/>
     <w:p>
       <w:pPr>
         <w:pStyle w:val="Bibliography"/>
@@ -4737,8 +4866,8 @@
         <w:t xml:space="preserve">Medeiros, E. S. F., M. J. Silva, and R. T. C. Ramos. 2008. Application of catchment- and local-scale variables for aquatic habitat characterization and assessment in the brazilian semi-arid region. Neotropical Biology and Conservation 3:13–20.</w:t>
       </w:r>
     </w:p>
-    <w:bookmarkEnd w:id="105"/>
-    <w:bookmarkStart w:id="107" w:name="ref-mehla2026"/>
+    <w:bookmarkEnd w:id="113"/>
+    <w:bookmarkStart w:id="115" w:name="ref-mehla2026"/>
     <w:p>
       <w:pPr>
         <w:pStyle w:val="Bibliography"/>
@@ -4749,7 +4878,7 @@
       <w:r>
         <w:t xml:space="preserve"> </w:t>
       </w:r>
-      <w:hyperlink r:id="rId106">
+      <w:hyperlink r:id="rId114">
         <w:r>
           <w:rPr>
             <w:rStyle w:val="Hyperlink"/>
@@ -4761,8 +4890,8 @@
         <w:t xml:space="preserve">. Water Research 307:126704.</w:t>
       </w:r>
     </w:p>
-    <w:bookmarkEnd w:id="107"/>
-    <w:bookmarkStart w:id="109" w:name="ref-melo2014"/>
+    <w:bookmarkEnd w:id="115"/>
+    <w:bookmarkStart w:id="117" w:name="ref-melo2014"/>
     <w:p>
       <w:pPr>
         <w:pStyle w:val="Bibliography"/>
@@ -4773,7 +4902,7 @@
       <w:r>
         <w:t xml:space="preserve"> </w:t>
       </w:r>
-      <w:hyperlink r:id="rId108">
+      <w:hyperlink r:id="rId116">
         <w:r>
           <w:rPr>
             <w:rStyle w:val="Hyperlink"/>
@@ -4785,8 +4914,8 @@
         <w:t xml:space="preserve">. PhD thesis, João Pessoa - PB.</w:t>
       </w:r>
     </w:p>
-    <w:bookmarkEnd w:id="109"/>
-    <w:bookmarkStart w:id="111" w:name="ref-melo2013"/>
+    <w:bookmarkEnd w:id="117"/>
+    <w:bookmarkStart w:id="119" w:name="ref-melo2013"/>
     <w:p>
       <w:pPr>
         <w:pStyle w:val="Bibliography"/>
@@ -4797,7 +4926,7 @@
       <w:r>
         <w:t xml:space="preserve"> </w:t>
       </w:r>
-      <w:hyperlink r:id="rId110">
+      <w:hyperlink r:id="rId118">
         <w:r>
           <w:rPr>
             <w:rStyle w:val="Hyperlink"/>
@@ -4809,8 +4938,8 @@
         <w:t xml:space="preserve">. International Journal of Biodiversity 2013:1–13.</w:t>
       </w:r>
     </w:p>
-    <w:bookmarkEnd w:id="111"/>
-    <w:bookmarkStart w:id="113" w:name="ref-meyer2007"/>
+    <w:bookmarkEnd w:id="119"/>
+    <w:bookmarkStart w:id="121" w:name="ref-meyer2007"/>
     <w:p>
       <w:pPr>
         <w:pStyle w:val="Bibliography"/>
@@ -4821,7 +4950,7 @@
       <w:r>
         <w:t xml:space="preserve"> </w:t>
       </w:r>
-      <w:hyperlink r:id="rId112">
+      <w:hyperlink r:id="rId120">
         <w:r>
           <w:rPr>
             <w:rStyle w:val="Hyperlink"/>
@@ -4833,8 +4962,8 @@
         <w:t xml:space="preserve">. Journal of the American Water Resources Association 43:86–103.</w:t>
       </w:r>
     </w:p>
-    <w:bookmarkEnd w:id="113"/>
-    <w:bookmarkStart w:id="115" w:name="ref-mma2003"/>
+    <w:bookmarkEnd w:id="121"/>
+    <w:bookmarkStart w:id="123" w:name="ref-mma2003"/>
     <w:p>
       <w:pPr>
         <w:pStyle w:val="Bibliography"/>
@@ -4845,7 +4974,7 @@
       <w:r>
         <w:t xml:space="preserve"> </w:t>
       </w:r>
-      <w:hyperlink r:id="rId114">
+      <w:hyperlink r:id="rId122">
         <w:r>
           <w:rPr>
             <w:rStyle w:val="Hyperlink"/>
@@ -4854,8 +4983,8 @@
         </w:r>
       </w:hyperlink>
     </w:p>
-    <w:bookmarkEnd w:id="115"/>
-    <w:bookmarkStart w:id="117" w:name="ref-mma2026"/>
+    <w:bookmarkEnd w:id="123"/>
+    <w:bookmarkStart w:id="125" w:name="ref-mma2026"/>
     <w:p>
       <w:pPr>
         <w:pStyle w:val="Bibliography"/>
@@ -4866,7 +4995,7 @@
       <w:r>
         <w:t xml:space="preserve"> </w:t>
       </w:r>
-      <w:hyperlink r:id="rId116">
+      <w:hyperlink r:id="rId124">
         <w:r>
           <w:rPr>
             <w:rStyle w:val="Hyperlink"/>
@@ -4878,8 +5007,8 @@
         <w:t xml:space="preserve">. Page 56. Mamanguape, PB.</w:t>
       </w:r>
     </w:p>
-    <w:bookmarkEnd w:id="117"/>
-    <w:bookmarkStart w:id="119" w:name="ref-mugodo2006"/>
+    <w:bookmarkEnd w:id="125"/>
+    <w:bookmarkStart w:id="127" w:name="ref-mugodo2006"/>
     <w:p>
       <w:pPr>
         <w:pStyle w:val="Bibliography"/>
@@ -4890,7 +5019,7 @@
       <w:r>
         <w:t xml:space="preserve"> </w:t>
       </w:r>
-      <w:hyperlink r:id="rId118">
+      <w:hyperlink r:id="rId126">
         <w:r>
           <w:rPr>
             <w:rStyle w:val="Hyperlink"/>
@@ -4902,8 +5031,8 @@
         <w:t xml:space="preserve">. Hydrobiologia 572:59–70.</w:t>
       </w:r>
     </w:p>
-    <w:bookmarkEnd w:id="119"/>
-    <w:bookmarkStart w:id="121" w:name="ref-myers2000"/>
+    <w:bookmarkEnd w:id="127"/>
+    <w:bookmarkStart w:id="129" w:name="ref-myers2000"/>
     <w:p>
       <w:pPr>
         <w:pStyle w:val="Bibliography"/>
@@ -4914,7 +5043,7 @@
       <w:r>
         <w:t xml:space="preserve"> </w:t>
       </w:r>
-      <w:hyperlink r:id="rId120">
+      <w:hyperlink r:id="rId128">
         <w:r>
           <w:rPr>
             <w:rStyle w:val="Hyperlink"/>
@@ -4926,8 +5055,8 @@
         <w:t xml:space="preserve">. Nature 403:853–858.</w:t>
       </w:r>
     </w:p>
-    <w:bookmarkEnd w:id="121"/>
-    <w:bookmarkStart w:id="123" w:name="ref-oksanen2020"/>
+    <w:bookmarkEnd w:id="129"/>
+    <w:bookmarkStart w:id="131" w:name="ref-oksanen2020"/>
     <w:p>
       <w:pPr>
         <w:pStyle w:val="Bibliography"/>
@@ -4938,7 +5067,7 @@
       <w:r>
         <w:t xml:space="preserve"> </w:t>
       </w:r>
-      <w:hyperlink r:id="rId122">
+      <w:hyperlink r:id="rId130">
         <w:r>
           <w:rPr>
             <w:rStyle w:val="Hyperlink"/>
@@ -4950,8 +5079,8 @@
         <w:t xml:space="preserve">. The Comprehensive R Archive Network Archive.</w:t>
       </w:r>
     </w:p>
-    <w:bookmarkEnd w:id="123"/>
-    <w:bookmarkStart w:id="125" w:name="ref-peel2007"/>
+    <w:bookmarkEnd w:id="131"/>
+    <w:bookmarkStart w:id="133" w:name="ref-peel2007"/>
     <w:p>
       <w:pPr>
         <w:pStyle w:val="Bibliography"/>
@@ -4962,7 +5091,7 @@
       <w:r>
         <w:t xml:space="preserve"> </w:t>
       </w:r>
-      <w:hyperlink r:id="rId124">
+      <w:hyperlink r:id="rId132">
         <w:r>
           <w:rPr>
             <w:rStyle w:val="Hyperlink"/>
@@ -4974,8 +5103,8 @@
         <w:t xml:space="preserve">. Hydrology and Earth System Sciences 11:1633–1644.</w:t>
       </w:r>
     </w:p>
-    <w:bookmarkEnd w:id="125"/>
-    <w:bookmarkStart w:id="127" w:name="ref-pereira2026"/>
+    <w:bookmarkEnd w:id="133"/>
+    <w:bookmarkStart w:id="135" w:name="ref-pereira2026"/>
     <w:p>
       <w:pPr>
         <w:pStyle w:val="Bibliography"/>
@@ -4986,7 +5115,7 @@
       <w:r>
         <w:t xml:space="preserve"> </w:t>
       </w:r>
-      <w:hyperlink r:id="rId126">
+      <w:hyperlink r:id="rId134">
         <w:r>
           <w:rPr>
             <w:rStyle w:val="Hyperlink"/>
@@ -4998,8 +5127,8 @@
         <w:t xml:space="preserve"> Biological Conservation 321:Article 111958.</w:t>
       </w:r>
     </w:p>
-    <w:bookmarkEnd w:id="127"/>
-    <w:bookmarkStart w:id="128" w:name="ref-pusey2004"/>
+    <w:bookmarkEnd w:id="135"/>
+    <w:bookmarkStart w:id="136" w:name="ref-pusey2004"/>
     <w:p>
       <w:pPr>
         <w:pStyle w:val="Bibliography"/>
@@ -5008,8 +5137,8 @@
         <w:t xml:space="preserve">Pusey, B. J., M. J. Kennard, and A. H. Arthington. 2004. Freshwater fishes of north-eastern australia. CSIRO Publishing, Melbourne, Australia.</w:t>
       </w:r>
     </w:p>
-    <w:bookmarkEnd w:id="128"/>
-    <w:bookmarkStart w:id="130" w:name="ref-rdevelopmentcoreteam2017"/>
+    <w:bookmarkEnd w:id="136"/>
+    <w:bookmarkStart w:id="138" w:name="ref-rdevelopmentcoreteam2017"/>
     <w:p>
       <w:pPr>
         <w:pStyle w:val="Bibliography"/>
@@ -5020,7 +5149,7 @@
       <w:r>
         <w:t xml:space="preserve"> </w:t>
       </w:r>
-      <w:hyperlink r:id="rId129">
+      <w:hyperlink r:id="rId137">
         <w:r>
           <w:rPr>
             <w:rStyle w:val="Hyperlink"/>
@@ -5032,8 +5161,8 @@
         <w:t xml:space="preserve">. R Foundation for Statistical Computing, Austria.</w:t>
       </w:r>
     </w:p>
-    <w:bookmarkEnd w:id="130"/>
-    <w:bookmarkStart w:id="132" w:name="ref-rocha2012"/>
+    <w:bookmarkEnd w:id="138"/>
+    <w:bookmarkStart w:id="140" w:name="ref-rocha2012"/>
     <w:p>
       <w:pPr>
         <w:pStyle w:val="Bibliography"/>
@@ -5044,7 +5173,7 @@
       <w:r>
         <w:t xml:space="preserve"> </w:t>
       </w:r>
-      <w:hyperlink r:id="rId131">
+      <w:hyperlink r:id="rId139">
         <w:r>
           <w:rPr>
             <w:rStyle w:val="Hyperlink"/>
@@ -5056,8 +5185,8 @@
         <w:t xml:space="preserve">. Journal of Arid Environments 85:33–40.</w:t>
       </w:r>
     </w:p>
-    <w:bookmarkEnd w:id="132"/>
-    <w:bookmarkStart w:id="134" w:name="ref-romanelli2022"/>
+    <w:bookmarkEnd w:id="140"/>
+    <w:bookmarkStart w:id="142" w:name="ref-romanelli2022"/>
     <w:p>
       <w:pPr>
         <w:pStyle w:val="Bibliography"/>
@@ -5068,7 +5197,7 @@
       <w:r>
         <w:t xml:space="preserve"> </w:t>
       </w:r>
-      <w:hyperlink r:id="rId133">
+      <w:hyperlink r:id="rId141">
         <w:r>
           <w:rPr>
             <w:rStyle w:val="Hyperlink"/>
@@ -5080,8 +5209,8 @@
         <w:t xml:space="preserve">. Science of The Total Environment 821:153403.</w:t>
       </w:r>
     </w:p>
-    <w:bookmarkEnd w:id="134"/>
-    <w:bookmarkStart w:id="136" w:name="ref-safar2020"/>
+    <w:bookmarkEnd w:id="142"/>
+    <w:bookmarkStart w:id="144" w:name="ref-safar2020"/>
     <w:p>
       <w:pPr>
         <w:pStyle w:val="Bibliography"/>
@@ -5092,7 +5221,7 @@
       <w:r>
         <w:t xml:space="preserve"> </w:t>
       </w:r>
-      <w:hyperlink r:id="rId135">
+      <w:hyperlink r:id="rId143">
         <w:r>
           <w:rPr>
             <w:rStyle w:val="Hyperlink"/>
@@ -5104,8 +5233,8 @@
         <w:t xml:space="preserve">. Forest Ecology and Management 470-471:118183.</w:t>
       </w:r>
     </w:p>
-    <w:bookmarkEnd w:id="136"/>
-    <w:bookmarkStart w:id="138" w:name="ref-saraçli2013"/>
+    <w:bookmarkEnd w:id="144"/>
+    <w:bookmarkStart w:id="146" w:name="ref-saraçli2013"/>
     <w:p>
       <w:pPr>
         <w:pStyle w:val="Bibliography"/>
@@ -5116,7 +5245,7 @@
       <w:r>
         <w:t xml:space="preserve"> </w:t>
       </w:r>
-      <w:hyperlink r:id="rId137">
+      <w:hyperlink r:id="rId145">
         <w:r>
           <w:rPr>
             <w:rStyle w:val="Hyperlink"/>
@@ -5128,8 +5257,8 @@
         <w:t xml:space="preserve">. Journal of Inequalities and Applications 2013:203.</w:t>
       </w:r>
     </w:p>
-    <w:bookmarkEnd w:id="138"/>
-    <w:bookmarkStart w:id="140" w:name="ref-shell2018"/>
+    <w:bookmarkEnd w:id="146"/>
+    <w:bookmarkStart w:id="148" w:name="ref-shell2018"/>
     <w:p>
       <w:pPr>
         <w:pStyle w:val="Bibliography"/>
@@ -5140,7 +5269,7 @@
       <w:r>
         <w:t xml:space="preserve"> </w:t>
       </w:r>
-      <w:hyperlink r:id="rId139">
+      <w:hyperlink r:id="rId147">
         <w:r>
           <w:rPr>
             <w:rStyle w:val="Hyperlink"/>
@@ -5164,8 +5293,8 @@
         <w:t xml:space="preserve">. River Research and Applications 34:993–1002.</w:t>
       </w:r>
     </w:p>
-    <w:bookmarkEnd w:id="140"/>
-    <w:bookmarkStart w:id="141" w:name="ref-silva2003"/>
+    <w:bookmarkEnd w:id="148"/>
+    <w:bookmarkStart w:id="149" w:name="ref-silva2003"/>
     <w:p>
       <w:pPr>
         <w:pStyle w:val="Bibliography"/>
@@ -5190,8 +5319,8 @@
         <w:t xml:space="preserve">C. Galindo-Leal and I. G. Câmara, editors. CABS; Island Press, Washington, DC.</w:t>
       </w:r>
     </w:p>
-    <w:bookmarkEnd w:id="141"/>
-    <w:bookmarkStart w:id="143" w:name="ref-silva2013"/>
+    <w:bookmarkEnd w:id="149"/>
+    <w:bookmarkStart w:id="151" w:name="ref-silva2013"/>
     <w:p>
       <w:pPr>
         <w:pStyle w:val="Bibliography"/>
@@ -5202,7 +5331,7 @@
       <w:r>
         <w:t xml:space="preserve"> </w:t>
       </w:r>
-      <w:hyperlink r:id="rId142">
+      <w:hyperlink r:id="rId150">
         <w:r>
           <w:rPr>
             <w:rStyle w:val="Hyperlink"/>
@@ -5214,8 +5343,8 @@
         <w:t xml:space="preserve">. PhD thesis.</w:t>
       </w:r>
     </w:p>
-    <w:bookmarkEnd w:id="143"/>
-    <w:bookmarkStart w:id="144" w:name="ref-sneath1973"/>
+    <w:bookmarkEnd w:id="151"/>
+    <w:bookmarkStart w:id="152" w:name="ref-sneath1973"/>
     <w:p>
       <w:pPr>
         <w:pStyle w:val="Bibliography"/>
@@ -5224,8 +5353,8 @@
         <w:t xml:space="preserve">Sneath, P. H. A., and R. R. Sokal. 1973. Numerical taxonomy: The principles and practice of numerical classification. First edition. W H Freeman &amp; Co.</w:t>
       </w:r>
     </w:p>
-    <w:bookmarkEnd w:id="144"/>
-    <w:bookmarkStart w:id="146" w:name="ref-sokal1962"/>
+    <w:bookmarkEnd w:id="152"/>
+    <w:bookmarkStart w:id="154" w:name="ref-sokal1962"/>
     <w:p>
       <w:pPr>
         <w:pStyle w:val="Bibliography"/>
@@ -5236,7 +5365,7 @@
       <w:r>
         <w:t xml:space="preserve"> </w:t>
       </w:r>
-      <w:hyperlink r:id="rId145">
+      <w:hyperlink r:id="rId153">
         <w:r>
           <w:rPr>
             <w:rStyle w:val="Hyperlink"/>
@@ -5248,8 +5377,8 @@
         <w:t xml:space="preserve">. Taxon 11:33–40.</w:t>
       </w:r>
     </w:p>
-    <w:bookmarkEnd w:id="146"/>
-    <w:bookmarkStart w:id="147" w:name="ref-sokal1995"/>
+    <w:bookmarkEnd w:id="154"/>
+    <w:bookmarkStart w:id="155" w:name="ref-sokal1995"/>
     <w:p>
       <w:pPr>
         <w:pStyle w:val="Bibliography"/>
@@ -5258,8 +5387,8 @@
         <w:t xml:space="preserve">Sokal, R. R., and F. J. Rohlf. 1995. Biometry: The principles and practice of statistics in biological research. Third edition. W.H. Freeman; Company, New York.</w:t>
       </w:r>
     </w:p>
-    <w:bookmarkEnd w:id="147"/>
-    <w:bookmarkStart w:id="149" w:name="ref-souza2025"/>
+    <w:bookmarkEnd w:id="155"/>
+    <w:bookmarkStart w:id="157" w:name="ref-souza2025"/>
     <w:p>
       <w:pPr>
         <w:pStyle w:val="Bibliography"/>
@@ -5270,7 +5399,7 @@
       <w:r>
         <w:t xml:space="preserve"> </w:t>
       </w:r>
-      <w:hyperlink r:id="rId148">
+      <w:hyperlink r:id="rId156">
         <w:r>
           <w:rPr>
             <w:rStyle w:val="Hyperlink"/>
@@ -5300,8 +5429,8 @@
         <w:t xml:space="preserve">. Acta Limnologica Brasiliensia 37:e105.</w:t>
       </w:r>
     </w:p>
-    <w:bookmarkEnd w:id="149"/>
-    <w:bookmarkStart w:id="151" w:name="ref-strahler1957"/>
+    <w:bookmarkEnd w:id="157"/>
+    <w:bookmarkStart w:id="159" w:name="ref-strahler1957"/>
     <w:p>
       <w:pPr>
         <w:pStyle w:val="Bibliography"/>
@@ -5312,7 +5441,7 @@
       <w:r>
         <w:t xml:space="preserve"> </w:t>
       </w:r>
-      <w:hyperlink r:id="rId150">
+      <w:hyperlink r:id="rId158">
         <w:r>
           <w:rPr>
             <w:rStyle w:val="Hyperlink"/>
@@ -5324,29 +5453,19 @@
         <w:t xml:space="preserve">. Eos, Transactions American Geophysical Union 38:913–920.</w:t>
       </w:r>
     </w:p>
-    <w:bookmarkEnd w:id="151"/>
-    <w:bookmarkStart w:id="152" w:name="ref-tabarelli2012"/>
+    <w:bookmarkEnd w:id="159"/>
+    <w:bookmarkStart w:id="161" w:name="ref-tabarelli2010"/>
     <w:p>
       <w:pPr>
         <w:pStyle w:val="Bibliography"/>
       </w:pPr>
       <w:r>
-        <w:t xml:space="preserve">Tabarelli, M., A. V. Aguiar, and M. C. Ribeiro. 2012. A conversão da Floresta Atlântica em paisagens antrópicas: lições para a conservação da diversidade biológica das florestas tropicais. Interciencia 37:88–92.</w:t>
-      </w:r>
-    </w:p>
-    <w:bookmarkEnd w:id="152"/>
-    <w:bookmarkStart w:id="154" w:name="ref-tabarelli2010"/>
-    <w:p>
-      <w:pPr>
-        <w:pStyle w:val="Bibliography"/>
-      </w:pPr>
-      <w:r>
         <w:t xml:space="preserve">Tabarelli, M., A. V. Aguiar, M. C. Ribeiro, J. P. Metzger, and C. A. Peres. 2010.</w:t>
       </w:r>
       <w:r>
         <w:t xml:space="preserve"> </w:t>
       </w:r>
-      <w:hyperlink r:id="rId153">
+      <w:hyperlink r:id="rId160">
         <w:r>
           <w:rPr>
             <w:rStyle w:val="Hyperlink"/>
@@ -5358,8 +5477,8 @@
         <w:t xml:space="preserve">. Biological Conservation 143:2328–2340.</w:t>
       </w:r>
     </w:p>
-    <w:bookmarkEnd w:id="154"/>
-    <w:bookmarkStart w:id="156" w:name="ref-tuomisto2010"/>
+    <w:bookmarkEnd w:id="161"/>
+    <w:bookmarkStart w:id="163" w:name="ref-tuomisto2010"/>
     <w:p>
       <w:pPr>
         <w:pStyle w:val="Bibliography"/>
@@ -5370,7 +5489,7 @@
       <w:r>
         <w:t xml:space="preserve"> </w:t>
       </w:r>
-      <w:hyperlink r:id="rId155">
+      <w:hyperlink r:id="rId162">
         <w:r>
           <w:rPr>
             <w:rStyle w:val="Hyperlink"/>
@@ -5382,8 +5501,8 @@
         <w:t xml:space="preserve">. Ecography 33:23–45.</w:t>
       </w:r>
     </w:p>
-    <w:bookmarkEnd w:id="156"/>
-    <w:bookmarkStart w:id="158" w:name="ref-vancine2024"/>
+    <w:bookmarkEnd w:id="163"/>
+    <w:bookmarkStart w:id="165" w:name="ref-vancine2024"/>
     <w:p>
       <w:pPr>
         <w:pStyle w:val="Bibliography"/>
@@ -5394,7 +5513,7 @@
       <w:r>
         <w:t xml:space="preserve"> </w:t>
       </w:r>
-      <w:hyperlink r:id="rId157">
+      <w:hyperlink r:id="rId164">
         <w:r>
           <w:rPr>
             <w:rStyle w:val="Hyperlink"/>
@@ -5406,8 +5525,8 @@
         <w:t xml:space="preserve">. Biological Conservation 291:110499.</w:t>
       </w:r>
     </w:p>
-    <w:bookmarkEnd w:id="158"/>
-    <w:bookmarkStart w:id="160" w:name="ref-veech2003"/>
+    <w:bookmarkEnd w:id="165"/>
+    <w:bookmarkStart w:id="167" w:name="ref-veech2003"/>
     <w:p>
       <w:pPr>
         <w:pStyle w:val="Bibliography"/>
@@ -5418,7 +5537,7 @@
       <w:r>
         <w:t xml:space="preserve"> </w:t>
       </w:r>
-      <w:hyperlink r:id="rId159">
+      <w:hyperlink r:id="rId166">
         <w:r>
           <w:rPr>
             <w:rStyle w:val="Hyperlink"/>
@@ -5430,8 +5549,8 @@
         <w:t xml:space="preserve">. Ecology 84:3376–3383.</w:t>
       </w:r>
     </w:p>
-    <w:bookmarkEnd w:id="160"/>
-    <w:bookmarkStart w:id="162" w:name="ref-veech2002"/>
+    <w:bookmarkEnd w:id="167"/>
+    <w:bookmarkStart w:id="169" w:name="ref-veech2002"/>
     <w:p>
       <w:pPr>
         <w:pStyle w:val="Bibliography"/>
@@ -5442,7 +5561,7 @@
       <w:r>
         <w:t xml:space="preserve"> </w:t>
       </w:r>
-      <w:hyperlink r:id="rId161">
+      <w:hyperlink r:id="rId168">
         <w:r>
           <w:rPr>
             <w:rStyle w:val="Hyperlink"/>
@@ -5454,8 +5573,8 @@
         <w:t xml:space="preserve">. Oikos 99:3–9.</w:t>
       </w:r>
     </w:p>
-    <w:bookmarkEnd w:id="162"/>
-    <w:bookmarkStart w:id="164" w:name="ref-ward1998"/>
+    <w:bookmarkEnd w:id="169"/>
+    <w:bookmarkStart w:id="171" w:name="ref-ward1998"/>
     <w:p>
       <w:pPr>
         <w:pStyle w:val="Bibliography"/>
@@ -5466,7 +5585,7 @@
       <w:r>
         <w:t xml:space="preserve"> </w:t>
       </w:r>
-      <w:hyperlink r:id="rId163">
+      <w:hyperlink r:id="rId170">
         <w:r>
           <w:rPr>
             <w:rStyle w:val="Hyperlink"/>
@@ -5478,8 +5597,8 @@
         <w:t xml:space="preserve">. Biological Conservation 83:269–278.</w:t>
       </w:r>
     </w:p>
-    <w:bookmarkEnd w:id="164"/>
-    <w:bookmarkStart w:id="166" w:name="ref-whittaker1972"/>
+    <w:bookmarkEnd w:id="171"/>
+    <w:bookmarkStart w:id="173" w:name="ref-whittaker1972"/>
     <w:p>
       <w:pPr>
         <w:pStyle w:val="Bibliography"/>
@@ -5490,7 +5609,7 @@
       <w:r>
         <w:t xml:space="preserve"> </w:t>
       </w:r>
-      <w:hyperlink r:id="rId165">
+      <w:hyperlink r:id="rId172">
         <w:r>
           <w:rPr>
             <w:rStyle w:val="Hyperlink"/>
@@ -5502,8 +5621,8 @@
         <w:t xml:space="preserve">. TAXON 21:213–251.</w:t>
       </w:r>
     </w:p>
-    <w:bookmarkEnd w:id="166"/>
-    <w:bookmarkStart w:id="167" w:name="ref-zaú1998"/>
+    <w:bookmarkEnd w:id="173"/>
+    <w:bookmarkStart w:id="174" w:name="ref-zaú1998"/>
     <w:p>
       <w:pPr>
         <w:pStyle w:val="Bibliography"/>
@@ -5512,10 +5631,10 @@
         <w:t xml:space="preserve">Zaú, A. S. 1998. Fragmentação da mata atlântica: Aspectos teóricos. Floresta e Ambiente 5:160–170.</w:t>
       </w:r>
     </w:p>
-    <w:bookmarkEnd w:id="167"/>
-    <w:bookmarkEnd w:id="168"/>
-    <w:bookmarkEnd w:id="169"/>
-    <w:bookmarkStart w:id="204" w:name="figures-and-tables"/>
+    <w:bookmarkEnd w:id="174"/>
+    <w:bookmarkEnd w:id="175"/>
+    <w:bookmarkEnd w:id="176"/>
+    <w:bookmarkStart w:id="211" w:name="figures-and-tables"/>
     <w:p>
       <w:pPr>
         <w:pStyle w:val="Heading1"/>
@@ -5836,7 +5955,7 @@
         <w:t xml:space="preserve">(Stream): Diversity turnover between streams.</w:t>
       </w:r>
     </w:p>
-    <w:bookmarkStart w:id="198" w:name="figures"/>
+    <w:bookmarkStart w:id="205" w:name="figures"/>
     <w:p>
       <w:pPr>
         <w:pStyle w:val="Heading2"/>
@@ -5871,7 +5990,7 @@
       <w:tr>
         <w:tc>
           <w:tcPr/>
-          <w:bookmarkStart w:id="173" w:name="fig-mapa"/>
+          <w:bookmarkStart w:id="180" w:name="fig-mapa"/>
           <w:p>
             <w:pPr>
               <w:pStyle w:val="Compact"/>
@@ -5882,18 +6001,18 @@
                 <wp:inline>
                   <wp:extent cx="5943600" cy="4202583"/>
                   <wp:effectExtent b="0" l="0" r="0" t="0"/>
-                  <wp:docPr descr="" title="" id="171" name="Picture"/>
+                  <wp:docPr descr="" title="" id="178" name="Picture"/>
                   <a:graphic>
                     <a:graphicData uri="http://schemas.openxmlformats.org/drawingml/2006/picture">
                       <pic:pic>
                         <pic:nvPicPr>
-                          <pic:cNvPr descr="imagens/Uso%20de%20Solo%20Rebio_en.png" id="172" name="Picture"/>
+                          <pic:cNvPr descr="imagens/Uso%20de%20Solo%20Rebio_en.png" id="179" name="Picture"/>
                           <pic:cNvPicPr>
                             <a:picLocks noChangeArrowheads="1" noChangeAspect="1"/>
                           </pic:cNvPicPr>
                         </pic:nvPicPr>
                         <pic:blipFill>
-                          <a:blip r:embed="rId170"/>
+                          <a:blip r:embed="rId177"/>
                           <a:stretch>
                             <a:fillRect/>
                           </a:stretch>
@@ -5933,7 +6052,7 @@
               <w:t xml:space="preserve">Figure 1: Study area</w:t>
             </w:r>
           </w:p>
-          <w:bookmarkEnd w:id="173"/>
+          <w:bookmarkEnd w:id="180"/>
         </w:tc>
       </w:tr>
     </w:tbl>
@@ -5963,7 +6082,7 @@
       <w:tr>
         <w:tc>
           <w:tcPr/>
-          <w:bookmarkStart w:id="177" w:name="fig-hab_PCA_rio"/>
+          <w:bookmarkStart w:id="184" w:name="fig-hab_PCA_rio"/>
           <w:p>
             <w:pPr>
               <w:pStyle w:val="Compact"/>
@@ -5974,18 +6093,18 @@
                 <wp:inline>
                   <wp:extent cx="5943600" cy="4953000"/>
                   <wp:effectExtent b="0" l="0" r="0" t="0"/>
-                  <wp:docPr descr="" title="" id="175" name="Picture"/>
+                  <wp:docPr descr="" title="" id="182" name="Picture"/>
                   <a:graphic>
                     <a:graphicData uri="http://schemas.openxmlformats.org/drawingml/2006/picture">
                       <pic:pic>
                         <pic:nvPicPr>
-                          <pic:cNvPr descr="res/fig-hab_PCA_rio.png" id="176" name="Picture"/>
+                          <pic:cNvPr descr="res/fig-hab_PCA_rio.png" id="183" name="Picture"/>
                           <pic:cNvPicPr>
                             <a:picLocks noChangeArrowheads="1" noChangeAspect="1"/>
                           </pic:cNvPicPr>
                         </pic:nvPicPr>
                         <pic:blipFill>
-                          <a:blip r:embed="rId174"/>
+                          <a:blip r:embed="rId181"/>
                           <a:stretch>
                             <a:fillRect/>
                           </a:stretch>
@@ -6025,7 +6144,7 @@
               <w:t xml:space="preserve">Figure 2: Principal Component Analysis, streams</w:t>
             </w:r>
           </w:p>
-          <w:bookmarkEnd w:id="177"/>
+          <w:bookmarkEnd w:id="184"/>
         </w:tc>
       </w:tr>
     </w:tbl>
@@ -6055,7 +6174,7 @@
       <w:tr>
         <w:tc>
           <w:tcPr/>
-          <w:bookmarkStart w:id="181" w:name="fig-hab_PCA_periodo"/>
+          <w:bookmarkStart w:id="188" w:name="fig-hab_PCA_periodo"/>
           <w:p>
             <w:pPr>
               <w:pStyle w:val="Compact"/>
@@ -6066,18 +6185,18 @@
                 <wp:inline>
                   <wp:extent cx="5943600" cy="4953000"/>
                   <wp:effectExtent b="0" l="0" r="0" t="0"/>
-                  <wp:docPr descr="" title="" id="179" name="Picture"/>
+                  <wp:docPr descr="" title="" id="186" name="Picture"/>
                   <a:graphic>
                     <a:graphicData uri="http://schemas.openxmlformats.org/drawingml/2006/picture">
                       <pic:pic>
                         <pic:nvPicPr>
-                          <pic:cNvPr descr="res/fig-hab_PCA_periodo.png" id="180" name="Picture"/>
+                          <pic:cNvPr descr="res/fig-hab_PCA_periodo.png" id="187" name="Picture"/>
                           <pic:cNvPicPr>
                             <a:picLocks noChangeArrowheads="1" noChangeAspect="1"/>
                           </pic:cNvPicPr>
                         </pic:nvPicPr>
                         <pic:blipFill>
-                          <a:blip r:embed="rId178"/>
+                          <a:blip r:embed="rId185"/>
                           <a:stretch>
                             <a:fillRect/>
                           </a:stretch>
@@ -6117,7 +6236,7 @@
               <w:t xml:space="preserve">Figure 3: Principal Component Analysis, seasons</w:t>
             </w:r>
           </w:p>
-          <w:bookmarkEnd w:id="181"/>
+          <w:bookmarkEnd w:id="188"/>
         </w:tc>
       </w:tr>
     </w:tbl>
@@ -6147,7 +6266,7 @@
       <w:tr>
         <w:tc>
           <w:tcPr/>
-          <w:bookmarkStart w:id="185" w:name="fig-rare1"/>
+          <w:bookmarkStart w:id="192" w:name="fig-rare1"/>
           <w:p>
             <w:pPr>
               <w:pStyle w:val="Compact"/>
@@ -6158,18 +6277,18 @@
                 <wp:inline>
                   <wp:extent cx="5943600" cy="4457699"/>
                   <wp:effectExtent b="0" l="0" r="0" t="0"/>
-                  <wp:docPr descr="" title="" id="183" name="Picture"/>
+                  <wp:docPr descr="" title="" id="190" name="Picture"/>
                   <a:graphic>
                     <a:graphicData uri="http://schemas.openxmlformats.org/drawingml/2006/picture">
                       <pic:pic>
                         <pic:nvPicPr>
-                          <pic:cNvPr descr="res/fig-rare1.png" id="184" name="Picture"/>
+                          <pic:cNvPr descr="res/fig-rare1.png" id="191" name="Picture"/>
                           <pic:cNvPicPr>
                             <a:picLocks noChangeArrowheads="1" noChangeAspect="1"/>
                           </pic:cNvPicPr>
                         </pic:nvPicPr>
                         <pic:blipFill>
-                          <a:blip r:embed="rId182"/>
+                          <a:blip r:embed="rId189"/>
                           <a:stretch>
                             <a:fillRect/>
                           </a:stretch>
@@ -6209,7 +6328,7 @@
               <w:t xml:space="preserve">Figure 4: Accumulation curves</w:t>
             </w:r>
           </w:p>
-          <w:bookmarkEnd w:id="185"/>
+          <w:bookmarkEnd w:id="192"/>
         </w:tc>
       </w:tr>
     </w:tbl>
@@ -6239,7 +6358,7 @@
       <w:tr>
         <w:tc>
           <w:tcPr/>
-          <w:bookmarkStart w:id="189" w:name="fig-upgma"/>
+          <w:bookmarkStart w:id="196" w:name="fig-upgma"/>
           <w:p>
             <w:pPr>
               <w:pStyle w:val="Compact"/>
@@ -6250,18 +6369,18 @@
                 <wp:inline>
                   <wp:extent cx="5943600" cy="4862945"/>
                   <wp:effectExtent b="0" l="0" r="0" t="0"/>
-                  <wp:docPr descr="" title="" id="187" name="Picture"/>
+                  <wp:docPr descr="" title="" id="194" name="Picture"/>
                   <a:graphic>
                     <a:graphicData uri="http://schemas.openxmlformats.org/drawingml/2006/picture">
                       <pic:pic>
                         <pic:nvPicPr>
-                          <pic:cNvPr descr="res/fig-upgma.png" id="188" name="Picture"/>
+                          <pic:cNvPr descr="res/fig-upgma.png" id="195" name="Picture"/>
                           <pic:cNvPicPr>
                             <a:picLocks noChangeArrowheads="1" noChangeAspect="1"/>
                           </pic:cNvPicPr>
                         </pic:nvPicPr>
                         <pic:blipFill>
-                          <a:blip r:embed="rId186"/>
+                          <a:blip r:embed="rId193"/>
                           <a:stretch>
                             <a:fillRect/>
                           </a:stretch>
@@ -6301,7 +6420,7 @@
               <w:t xml:space="preserve">Figure 5: UPGMA Classification</w:t>
             </w:r>
           </w:p>
-          <w:bookmarkEnd w:id="189"/>
+          <w:bookmarkEnd w:id="196"/>
         </w:tc>
       </w:tr>
     </w:tbl>
@@ -6331,7 +6450,7 @@
       <w:tr>
         <w:tc>
           <w:tcPr/>
-          <w:bookmarkStart w:id="193" w:name="fig-particao_cs"/>
+          <w:bookmarkStart w:id="200" w:name="fig-particao_cs"/>
           <w:p>
             <w:pPr>
               <w:pStyle w:val="Compact"/>
@@ -6342,18 +6461,18 @@
                 <wp:inline>
                   <wp:extent cx="3669832" cy="7339665"/>
                   <wp:effectExtent b="0" l="0" r="0" t="0"/>
-                  <wp:docPr descr="" title="" id="191" name="Picture"/>
+                  <wp:docPr descr="" title="" id="198" name="Picture"/>
                   <a:graphic>
                     <a:graphicData uri="http://schemas.openxmlformats.org/drawingml/2006/picture">
                       <pic:pic>
                         <pic:nvPicPr>
-                          <pic:cNvPr descr="res/fig-painel_pt.cs.png" id="192" name="Picture"/>
+                          <pic:cNvPr descr="res/fig-painel_pt.cs.png" id="199" name="Picture"/>
                           <pic:cNvPicPr>
                             <a:picLocks noChangeArrowheads="1" noChangeAspect="1"/>
                           </pic:cNvPicPr>
                         </pic:nvPicPr>
                         <pic:blipFill>
-                          <a:blip r:embed="rId190"/>
+                          <a:blip r:embed="rId197"/>
                           <a:stretch>
                             <a:fillRect/>
                           </a:stretch>
@@ -6393,7 +6512,7 @@
               <w:t xml:space="preserve">Figure 6: Partitioning plots season</w:t>
             </w:r>
           </w:p>
-          <w:bookmarkEnd w:id="193"/>
+          <w:bookmarkEnd w:id="200"/>
         </w:tc>
       </w:tr>
     </w:tbl>
@@ -6423,7 +6542,7 @@
       <w:tr>
         <w:tc>
           <w:tcPr/>
-          <w:bookmarkStart w:id="197" w:name="fig-particao_rios"/>
+          <w:bookmarkStart w:id="204" w:name="fig-particao_rios"/>
           <w:p>
             <w:pPr>
               <w:pStyle w:val="Compact"/>
@@ -6434,18 +6553,18 @@
                 <wp:inline>
                   <wp:extent cx="5943600" cy="6792685"/>
                   <wp:effectExtent b="0" l="0" r="0" t="0"/>
-                  <wp:docPr descr="" title="" id="195" name="Picture"/>
+                  <wp:docPr descr="" title="" id="202" name="Picture"/>
                   <a:graphic>
                     <a:graphicData uri="http://schemas.openxmlformats.org/drawingml/2006/picture">
                       <pic:pic>
                         <pic:nvPicPr>
-                          <pic:cNvPr descr="res/fig-painel_pt.rios.png" id="196" name="Picture"/>
+                          <pic:cNvPr descr="res/fig-painel_pt.rios.png" id="203" name="Picture"/>
                           <pic:cNvPicPr>
                             <a:picLocks noChangeArrowheads="1" noChangeAspect="1"/>
                           </pic:cNvPicPr>
                         </pic:nvPicPr>
                         <pic:blipFill>
-                          <a:blip r:embed="rId194"/>
+                          <a:blip r:embed="rId201"/>
                           <a:stretch>
                             <a:fillRect/>
                           </a:stretch>
@@ -6485,12 +6604,12 @@
               <w:t xml:space="preserve">Figure 7: Partitioning plots stream</w:t>
             </w:r>
           </w:p>
-          <w:bookmarkEnd w:id="197"/>
+          <w:bookmarkEnd w:id="204"/>
         </w:tc>
       </w:tr>
     </w:tbl>
-    <w:bookmarkEnd w:id="198"/>
-    <w:bookmarkStart w:id="203" w:name="tables"/>
+    <w:bookmarkEnd w:id="205"/>
+    <w:bookmarkStart w:id="210" w:name="tables"/>
     <w:p>
       <w:pPr>
         <w:pStyle w:val="Heading2"/>
@@ -6525,7 +6644,7 @@
       <w:tr>
         <w:tc>
           <w:tcPr/>
-          <w:bookmarkStart w:id="199" w:name="tbl-hab_gttable"/>
+          <w:bookmarkStart w:id="206" w:name="tbl-hab_gttable"/>
           <w:p>
             <w:pPr>
               <w:jc w:val="center"/>
@@ -18193,7 +18312,7 @@
               </w:tc>
             </w:tr>
           </w:tbl>
-          <w:bookmarkEnd w:id="199"/>
+          <w:bookmarkEnd w:id="206"/>
         </w:tc>
       </w:tr>
     </w:tbl>
@@ -18223,7 +18342,7 @@
       <w:tr>
         <w:tc>
           <w:tcPr/>
-          <w:bookmarkStart w:id="200" w:name="tbl-nutri_gttable"/>
+          <w:bookmarkStart w:id="207" w:name="tbl-nutri_gttable"/>
           <w:p>
             <w:pPr>
               <w:jc w:val="center"/>
@@ -20944,7 +21063,7 @@
               </w:tc>
             </w:tr>
           </w:tbl>
-          <w:bookmarkEnd w:id="200"/>
+          <w:bookmarkEnd w:id="207"/>
         </w:tc>
       </w:tr>
     </w:tbl>
@@ -20974,7 +21093,7 @@
       <w:tr>
         <w:tc>
           <w:tcPr/>
-          <w:bookmarkStart w:id="201" w:name="tbl-checklist_gttable"/>
+          <w:bookmarkStart w:id="208" w:name="tbl-checklist_gttable"/>
           <w:p>
             <w:pPr>
               <w:jc w:val="center"/>
@@ -38718,7 +38837,7 @@
               </w:tc>
             </w:tr>
           </w:tbl>
-          <w:bookmarkEnd w:id="201"/>
+          <w:bookmarkEnd w:id="208"/>
         </w:tc>
       </w:tr>
     </w:tbl>
@@ -38748,7 +38867,7 @@
       <w:tr>
         <w:tc>
           <w:tcPr/>
-          <w:bookmarkStart w:id="202" w:name="tbl-part_gttable"/>
+          <w:bookmarkStart w:id="209" w:name="tbl-part_gttable"/>
           <w:p>
             <w:pPr>
               <w:jc w:val="center"/>
@@ -43608,13 +43727,13 @@
               </w:tc>
             </w:tr>
           </w:tbl>
-          <w:bookmarkEnd w:id="202"/>
+          <w:bookmarkEnd w:id="209"/>
         </w:tc>
       </w:tr>
     </w:tbl>
-    <w:bookmarkEnd w:id="203"/>
-    <w:bookmarkEnd w:id="204"/>
-    <w:bookmarkStart w:id="205" w:name="apendices"/>
+    <w:bookmarkEnd w:id="210"/>
+    <w:bookmarkEnd w:id="211"/>
+    <w:bookmarkStart w:id="212" w:name="apendices"/>
     <w:p>
       <w:pPr>
         <w:pStyle w:val="Heading1"/>
@@ -43623,8 +43742,8 @@
         <w:t xml:space="preserve">Apendices</w:t>
       </w:r>
     </w:p>
-    <w:bookmarkEnd w:id="205"/>
-    <w:bookmarkStart w:id="209" w:name="non-used-figures-and-tables"/>
+    <w:bookmarkEnd w:id="212"/>
+    <w:bookmarkStart w:id="216" w:name="non-used-figures-and-tables"/>
     <w:p>
       <w:pPr>
         <w:pStyle w:val="Heading1"/>
@@ -43674,18 +43793,18 @@
                 <wp:inline>
                   <wp:extent cx="152400" cy="152400"/>
                   <wp:effectExtent b="0" l="0" r="0" t="0"/>
-                  <wp:docPr descr="" title="" id="207" name="Picture"/>
+                  <wp:docPr descr="" title="" id="214" name="Picture"/>
                   <a:graphic>
                     <a:graphicData uri="http://schemas.openxmlformats.org/drawingml/2006/picture">
                       <pic:pic>
                         <pic:nvPicPr>
-                          <pic:cNvPr descr="C:\PROGRA~1\RStudio\RESOUR~1\app\bin\quarto\share\formats\docx\warning.png" id="208" name="Picture"/>
+                          <pic:cNvPr descr="C:\PROGRA~1\RStudio\RESOUR~1\app\bin\quarto\share\formats\docx\warning.png" id="215" name="Picture"/>
                           <pic:cNvPicPr>
                             <a:picLocks noChangeArrowheads="1" noChangeAspect="1"/>
                           </pic:cNvPicPr>
                         </pic:nvPicPr>
                         <pic:blipFill>
-                          <a:blip r:embed="rId206"/>
+                          <a:blip r:embed="rId213"/>
                           <a:stretch>
                             <a:fillRect/>
                           </a:stretch>
@@ -43738,7 +43857,7 @@
         </w:tc>
       </w:tr>
     </w:tbl>
-    <w:bookmarkEnd w:id="209"/>
+    <w:bookmarkEnd w:id="216"/>
     <w:sectPr>
       <w:type w:val="nextPage"/>
       <w:pgSz w:h="15840" w:w="12240"/>

</xml_diff>

<commit_message>
Ell: abnt ajustada, inserindo tabela de habitat e códigos conforme manuscrito
</commit_message>
<xml_diff>
--- a/docs/ms_rebio23-part.docx
+++ b/docs/ms_rebio23-part.docx
@@ -83,7 +83,7 @@
         <w:pStyle w:val="Date"/>
       </w:pPr>
       <w:r>
-        <w:t xml:space="preserve">2026-10-18</w:t>
+        <w:t xml:space="preserve">2026-10-16</w:t>
       </w:r>
     </w:p>
     <w:p>
@@ -154,7 +154,7 @@
         </w:p>
       </w:sdtContent>
     </w:sdt>
-    <w:bookmarkStart w:id="12" w:name="introduction"/>
+    <w:bookmarkStart w:id="13" w:name="introduction"/>
     <w:p>
       <w:pPr>
         <w:pStyle w:val="Heading1"/>
@@ -259,43 +259,55 @@
         <w:pStyle w:val="TextBody"/>
       </w:pPr>
       <w:r>
-        <w:t xml:space="preserve">In addition to landscape alterations, stream dynamics are strongly driven by seasonal factors. The Atlantic Forest features a predominantly tropical climate with rainfall distributed throughout the year. These hydrological fluctuations directly influence Neotropical freshwater environments by modifying physical and chemical conditions</w:t>
+        <w:t xml:space="preserve">In addition to landscape alterations, stream dynamics are strongly driven by seasonal factors. The Atlantic Forest features a predominantly tropical climate with rainfall distributed throughout the year. These hydrological fluctuations directly influence Neotropical freshwater environments by modifying physical and chemical conditions [</w:t>
+      </w:r>
+      <w:r>
+        <w:t xml:space="preserve">Barboza et al. (2024)</w:t>
+      </w:r>
+      <w:r>
+        <w:t xml:space="preserve">]. The shift between dry and rainy seasons alters resource availability, microhabitat structure, and the establishment and persistence of organisms, thereby shaping community composition and dynamics</w:t>
       </w:r>
       <w:r>
         <w:t xml:space="preserve"> </w:t>
       </w:r>
       <w:r>
-        <w:t xml:space="preserve">(Barboza et al. 2024)</w:t>
-      </w:r>
-      <w:r>
-        <w:t xml:space="preserve">. The shift between dry and rainy seasons alters resource availability, microhabitat structure, and the establishment and persistence of organisms, thereby shaping community composition and dynamics</w:t>
+        <w:t xml:space="preserve">(Ward 1998, Souza et al. 2025)</w:t>
+      </w:r>
+      <w:r>
+        <w:t xml:space="preserve">. During the dry season, reduced precipitation and lower streamflow stabilize hydrological conditions, which may favor the persistence of local populations. Conversely, the wet season is characterized by increased rainfall and discharge, intensifying disturbance events, dispersal, and species turnover. Consequently, seasonality acts as a major driver of aquatic community organization, making these organisms valuable biological tools for assessing the ecological state of freshwater systems</w:t>
       </w:r>
       <w:r>
         <w:t xml:space="preserve"> </w:t>
       </w:r>
       <w:r>
-        <w:t xml:space="preserve">(Ward 1998, Souza et al. 2025)</w:t>
-      </w:r>
-      <w:r>
-        <w:t xml:space="preserve">. During the dry season, reduced precipitation and lower streamflow stabilize hydrological conditions, which may favor the persistence of local populations. Conversely, the wet season is characterized by increased rainfall and discharge, intensifying disturbance events, dispersal, and species turnover. Consequently, seasonality acts as a major driver of aquatic community organization, making these organisms valuable biological tools for assessing the ecological state of freshwater systems</w:t>
+        <w:t xml:space="preserve">(Souza et al. 2025)</w:t>
+      </w:r>
+      <w:r>
+        <w:t xml:space="preserve">, and shifts in species composition and community turnover often reflect underlying alterations in environmental conditions [</w:t>
+      </w:r>
+      <w:r>
+        <w:t xml:space="preserve">Freiry et al. (2020)</w:t>
+      </w:r>
+      <w:r>
+        <w:t xml:space="preserve">;</w:t>
       </w:r>
       <w:r>
         <w:t xml:space="preserve"> </w:t>
       </w:r>
       <w:r>
-        <w:t xml:space="preserve">(Souza et al. 2025)</w:t>
-      </w:r>
-      <w:r>
-        <w:t xml:space="preserve">, and shifts in species composition and community turnover often reflect underlying alterations in environmental conditions</w:t>
+        <w:t xml:space="preserve">Melo and Medeiros (2013)</w:t>
+      </w:r>
+      <w:r>
+        <w:t xml:space="preserve">;</w:t>
       </w:r>
       <w:r>
         <w:t xml:space="preserve"> </w:t>
       </w:r>
       <w:r>
-        <w:t xml:space="preserve">(Keppeler and Hardy 2004, Melo and Medeiros 2013, Shell and Collier 2018, Freiry et al. 2020)</w:t>
-      </w:r>
-      <w:r>
-        <w:t xml:space="preserve">.</w:t>
+        <w:t xml:space="preserve">Keppeler and Hardy (2004)</w:t>
+      </w:r>
+      <w:r>
+        <w:t xml:space="preserve">].</w:t>
       </w:r>
     </w:p>
     <w:p>
@@ -303,49 +315,49 @@
         <w:pStyle w:val="TextBody"/>
       </w:pPr>
       <w:r>
-        <w:t xml:space="preserve">Within this context, the design of efficient protected areas that incorporate aquatic systems, ought to rely on a robust network of interconnected spatial scales and meaningful observation of species distributions within and surrounding the areas of biological interest</w:t>
+        <w:t xml:space="preserve">Among the biological components of lotic communities, zooplankton—particularly Rotifera, Cladocera, and Copepoda—play a pivotal role. These organisms exhibit diverse body sizes, morphologies, life histories, and functional roles, serving as excellent bioindicators due to their rapid sensitivity to environmental changes</w:t>
       </w:r>
       <w:r>
         <w:t xml:space="preserve"> </w:t>
       </w:r>
       <w:r>
-        <w:t xml:space="preserve">(Maltchik and Medeiros 2006, Herbert et al. 2010, Socolar et al. 2016)</w:t>
-      </w:r>
-      <w:r>
-        <w:t xml:space="preserve">.</w:t>
+        <w:t xml:space="preserve">(Bonecker et al. 2013)</w:t>
+      </w:r>
+      <w:r>
+        <w:t xml:space="preserve">. Furthermore, zooplankton constitute a critical food source for fish and other organisms, an essential trophic bridge that transfers energy from primary producers to higher trophic levels [</w:t>
+      </w:r>
+      <w:r>
+        <w:t xml:space="preserve">Altindağ and Berdi̇ (2025)</w:t>
+      </w:r>
+      <w:r>
+        <w:t xml:space="preserve">;</w:t>
       </w:r>
       <w:r>
         <w:t xml:space="preserve"> </w:t>
       </w:r>
       <w:r>
-        <w:t xml:space="preserve">Essential to this is the choice of relevant species, capable of representing the central elements of the biological components of lotic communities. Zooplankton, particularly Rotifera, Cladocera, and Copepoda, play a pivotal role in stream ecosystems</w:t>
+        <w:t xml:space="preserve">Balkić et al. (2022)</w:t>
+      </w:r>
+      <w:r>
+        <w:t xml:space="preserve">;</w:t>
       </w:r>
       <w:r>
         <w:t xml:space="preserve"> </w:t>
       </w:r>
       <w:r>
-        <w:t xml:space="preserve">(Santos et al. 2024, Amaral et al. 2024)</w:t>
-      </w:r>
-      <w:r>
-        <w:t xml:space="preserve">. These organisms exhibit diverse body sizes, morphologies, life histories, and functional roles, serving as excellent bioindicators due to their rapid sensitivity to environmental changes</w:t>
+        <w:t xml:space="preserve">Marcelino et al. (2025)</w:t>
+      </w:r>
+      <w:r>
+        <w:t xml:space="preserve">;</w:t>
       </w:r>
       <w:r>
         <w:t xml:space="preserve"> </w:t>
       </w:r>
       <w:r>
-        <w:t xml:space="preserve">(Bonecker et al. 2013)</w:t>
-      </w:r>
-      <w:r>
-        <w:t xml:space="preserve">. Furthermore, zooplankton constitute a critical food source for fish and other organisms, an essential trophic bridge that transfers energy from primary producers to higher trophic levels</w:t>
-      </w:r>
-      <w:r>
-        <w:t xml:space="preserve"> </w:t>
-      </w:r>
-      <w:r>
-        <w:t xml:space="preserve">(Balkić et al. 2022, Marcelino et al. 2025, Souza et al. 2025, Altindağ and Berdi̇ 2025)</w:t>
-      </w:r>
-      <w:r>
-        <w:t xml:space="preserve">.</w:t>
+        <w:t xml:space="preserve">Souza et al. (2025)</w:t>
+      </w:r>
+      <w:r>
+        <w:t xml:space="preserve">].</w:t>
       </w:r>
     </w:p>
     <w:p>
@@ -353,7 +365,7 @@
         <w:pStyle w:val="TextBody"/>
       </w:pPr>
       <w:r>
-        <w:t xml:space="preserve">Furthermore, in recent decades, researchers have argued that biodiversity assessments should not be reduced to a single diversity index.</w:t>
+        <w:t xml:space="preserve">In recent decades, researchers have argued that biodiversity assessments should not be reduced to a single diversity index.</w:t>
       </w:r>
       <w:r>
         <w:t xml:space="preserve"> </w:t>
@@ -521,7 +533,7 @@
         <w:pStyle w:val="TextBody"/>
       </w:pPr>
       <w:r>
-        <w:t xml:space="preserve">Therefore, understanding the spatial structure and distribution of biodiversity across scales remains a central theme in community ecology and conservation planning</w:t>
+        <w:t xml:space="preserve">Therefore, understanding the spatial structure and distribution of biodiversity across scale remains a central theme in community ecology and conservation planning</w:t>
       </w:r>
       <w:r>
         <w:t xml:space="preserve"> </w:t>
@@ -536,14 +548,16 @@
         <w:t xml:space="preserve"> </w:t>
       </w:r>
       <w:r>
-        <w:t xml:space="preserve">(Baselga 2010, 2012)</w:t>
-      </w:r>
-      <w:r>
-        <w:t xml:space="preserve">.</w:t>
-      </w:r>
-      <w:r>
-        <w:t xml:space="preserve"> </w:t>
-      </w:r>
+        <w:t xml:space="preserve">(Baselga 2010)</w:t>
+      </w:r>
+      <w:r>
+        <w:t xml:space="preserve">. Turnover is the replacement of some species by different species from one site to another, while nestedness is the loss or gain of species where poorer sites contain a strict subset of the species found at richer sites.</w:t>
+      </w:r>
+    </w:p>
+    <w:p>
+      <w:pPr>
+        <w:pStyle w:val="TextBody"/>
+      </w:pPr>
       <w:r>
         <w:t xml:space="preserve">Total regional species richness (</w:t>
       </w:r>
@@ -587,46 +601,138 @@
         <w:t xml:space="preserve">(Crist et al. 2003, Tuomisto 2010)</w:t>
       </w:r>
       <w:r>
-        <w:t xml:space="preserve">.</w:t>
+        <w:t xml:space="preserve">. Beta diversity (</w:t>
+      </w:r>
+      <m:oMath>
+        <m:r>
+          <m:t>β</m:t>
+        </m:r>
+      </m:oMath>
+      <w:r>
+        <w:t xml:space="preserve">) itself reflects the variation in species composition among sites and is driven by two distinct ecological phenomena: turnover (species replacement) and nestedness (richness differences)</w:t>
       </w:r>
       <w:r>
         <w:t xml:space="preserve"> </w:t>
       </w:r>
       <w:r>
-        <w:t xml:space="preserve">Beta diversity itself reflects the variation in species composition among sites and is driven by two distinct ecological phenomena: turnover (species replacement) and nestedness (richness differences)</w:t>
+        <w:t xml:space="preserve">(Baselga 2010)</w:t>
+      </w:r>
+      <w:r>
+        <w:t xml:space="preserve">. Species turnover occurs when species are replaced by different species along environmental or spatial gradients, usually driven by environmental filtering, competitive exclusion, or dispersal limitation</w:t>
       </w:r>
       <w:r>
         <w:t xml:space="preserve"> </w:t>
       </w:r>
       <w:r>
+        <w:t xml:space="preserve">(Baselga 2010, Tuomisto 2010)</w:t>
+      </w:r>
+      <w:r>
+        <w:t xml:space="preserve">. In contrast, nestedness occurs when communities at species-poor sites are non-random subsets of those at species-rich sites</w:t>
+      </w:r>
+      <w:r>
+        <w:t xml:space="preserve"> </w:t>
+      </w:r>
+      <w:r>
         <w:t xml:space="preserve">(Baselga 2010)</w:t>
       </w:r>
       <w:r>
-        <w:t xml:space="preserve">. Species turnover occurs when species are replaced by different species along environmental or spatial gradients, usually driven by environmental filtering, competitive exclusion, or dispersal limitation</w:t>
+        <w:t xml:space="preserve">. Nested patterns typically stem from deterministic processes such as selective extinction, differential colonization capacity, or habitat fragmentation that sequentially eliminate sensitive taxa while retaining tolerant generalists</w:t>
       </w:r>
       <w:r>
         <w:t xml:space="preserve"> </w:t>
       </w:r>
       <w:r>
-        <w:t xml:space="preserve">(Baselga 2010, Tuomisto 2010)</w:t>
-      </w:r>
-      <w:r>
-        <w:t xml:space="preserve">. In contrast, nestedness occurs when communities at species-poor sites are non-random subsets of those at species-rich sites</w:t>
+        <w:t xml:space="preserve">(Baselga 2010)</w:t>
+      </w:r>
+      <w:r>
+        <w:t xml:space="preserve">. Evaluating the relative contribution of turnover and nestedness—alongside null models using Standardized Effect Sizes (</w:t>
+      </w:r>
+      <m:oMath>
+        <m:r>
+          <m:rPr>
+            <m:nor/>
+            <m:sty m:val="p"/>
+          </m:rPr>
+          <m:t>SES</m:t>
+        </m:r>
+      </m:oMath>
+      <w:r>
+        <w:t xml:space="preserve">)—provides critical insights into assembly rules and conservation prioritization</w:t>
       </w:r>
       <w:r>
         <w:t xml:space="preserve"> </w:t>
       </w:r>
       <w:r>
+        <w:t xml:space="preserve">(Gotelli and McCabe 2002, Baselga 2010)</w:t>
+      </w:r>
+      <w:r>
+        <w:t xml:space="preserve">. A pattern dominated by turnover (</w:t>
+      </w:r>
+      <m:oMath>
+        <m:r>
+          <m:rPr>
+            <m:nor/>
+            <m:sty m:val="p"/>
+          </m:rPr>
+          <m:t>SES</m:t>
+        </m:r>
+        <m:r>
+          <m:rPr>
+            <m:sty m:val="p"/>
+          </m:rPr>
+          <m:t>&gt;</m:t>
+        </m:r>
+        <m:r>
+          <m:t>0</m:t>
+        </m:r>
+      </m:oMath>
+      <w:r>
+        <w:t xml:space="preserve">) implies strong ecological differentiation and high beta diversity, signaling that distinct localities host unique biological assemblages</w:t>
+      </w:r>
+      <w:r>
+        <w:t xml:space="preserve"> </w:t>
+      </w:r>
+      <w:r>
         <w:t xml:space="preserve">(Baselga 2010)</w:t>
       </w:r>
       <w:r>
-        <w:t xml:space="preserve">. Nested patterns typically stem from deterministic processes such as selective extinction, differential colonization capacity, or habitat fragmentation that sequentially eliminate sensitive taxa while retaining tolerant generalists</w:t>
+        <w:t xml:space="preserve">. From a conservation perspective, high turnover necessitates a network-wide preservation strategy, as multiple sites must be protected to encompass regional biodiversity</w:t>
       </w:r>
       <w:r>
         <w:t xml:space="preserve"> </w:t>
       </w:r>
       <w:r>
-        <w:t xml:space="preserve">(Veech et al. 2003, Baselga 2010)</w:t>
+        <w:t xml:space="preserve">(Baselga 2010)</w:t>
+      </w:r>
+      <w:r>
+        <w:t xml:space="preserve">. Conversely, a system dominated by nestedness or fine-scale homogenization (</w:t>
+      </w:r>
+      <m:oMath>
+        <m:r>
+          <m:rPr>
+            <m:nor/>
+            <m:sty m:val="p"/>
+          </m:rPr>
+          <m:t>SES</m:t>
+        </m:r>
+        <m:r>
+          <m:rPr>
+            <m:sty m:val="p"/>
+          </m:rPr>
+          <m:t>&lt;</m:t>
+        </m:r>
+        <m:r>
+          <m:t>0</m:t>
+        </m:r>
+      </m:oMath>
+      <w:r>
+        <w:t xml:space="preserve">) indicates that local assemblages are nested sub-collections of regional species pools. Under a nested regime, management efforts are most effectively concentrated on protecting the largest or highest-quality species-rich sites, which inherently harbor the vast majority of the regional pool</w:t>
+      </w:r>
+      <w:r>
+        <w:t xml:space="preserve"> </w:t>
+      </w:r>
+      <w:r>
+        <w:t xml:space="preserve">(Baselga 2010)</w:t>
       </w:r>
       <w:r>
         <w:t xml:space="preserve">.</w:t>
@@ -637,48 +743,27 @@
         <w:pStyle w:val="TextBody"/>
       </w:pPr>
       <w:r>
-        <w:t xml:space="preserve">Evaluating the relative contribution of turnover and nestedness—alongside null models using Standardized Effect Sizes (SES)—provides critical insights into assembly rules and conservation prioritization</w:t>
+        <w:t xml:space="preserve">CITAR:</w:t>
       </w:r>
       <w:r>
         <w:t xml:space="preserve"> </w:t>
       </w:r>
       <w:r>
-        <w:t xml:space="preserve">(Gotelli and McCabe 2002, Gering et al. 2003)</w:t>
-      </w:r>
-      <w:r>
-        <w:t xml:space="preserve">. A pattern dominated by turnover (SES &gt; 0) implies strong ecological differentiation and high beta diversity, signaling that distinct localities host unique biological assemblages</w:t>
-      </w:r>
-      <w:r>
-        <w:t xml:space="preserve"> </w:t>
-      </w:r>
-      <w:r>
-        <w:t xml:space="preserve">(Baselga 2010)</w:t>
-      </w:r>
-      <w:r>
-        <w:t xml:space="preserve">. From a conservation perspective, high turnover necessitates a network-wide preservation strategy, as multiple sites must be protected to encompass regional biodiversity</w:t>
-      </w:r>
-      <w:r>
-        <w:t xml:space="preserve"> </w:t>
-      </w:r>
-      <w:r>
-        <w:t xml:space="preserve">(Baselga 2010)</w:t>
-      </w:r>
-      <w:r>
-        <w:t xml:space="preserve">. Conversely, a system dominated by nestedness or fine-scale homogenization (SES &lt; 0) indicates that local assemblages are nested sub-collections of regional species pools. Under a nested regime, management efforts are most effectively concentrated on protecting the largest or highest-quality species-rich sites, which inherently harbor the vast majority of the regional pool</w:t>
-      </w:r>
-      <w:r>
-        <w:t xml:space="preserve"> </w:t>
-      </w:r>
-      <w:r>
-        <w:t xml:space="preserve">(Baselga 2010)</w:t>
-      </w:r>
-      <w:r>
-        <w:t xml:space="preserve">.</w:t>
+        <w:t xml:space="preserve">(Gering et al. 2003, Crist et al. 2003, Veech et al. 2003, Baselga 2010, 2012, Ligeiro et al. 2010, Ávila et al. 2011, Shell and Collier 2018)</w:t>
+      </w:r>
+    </w:p>
+    <w:bookmarkStart w:id="12" w:name="objectives"/>
+    <w:p>
+      <w:pPr>
+        <w:pStyle w:val="Heading2"/>
+      </w:pPr>
+      <w:r>
+        <w:t xml:space="preserve">1.1 Objectives</w:t>
       </w:r>
     </w:p>
     <w:p>
       <w:pPr>
-        <w:pStyle w:val="TextBody"/>
+        <w:pStyle w:val="FirstParagraph"/>
       </w:pPr>
       <w:r>
         <w:t xml:space="preserve">This study describes the richness and density of zooplankton, comparatively between two small head water streams subject to different levels of environmental pressures. One originates withing a protected area - Biological Reserve, or REBIO, according to</w:t>
@@ -744,11 +829,12 @@
         <w:t xml:space="preserve">(Gouveia et al. 2017)</w:t>
       </w:r>
       <w:r>
-        <w:t xml:space="preserve">, we hypothesize that the diversity is not be homogeneously distributed among the different spatial scales but concentrated at the finer levels and seasonal variation will be limited to species composition, but no spacial variation is expected between dry and wet seasons. Some environmental features (reach morphology, habitat structure, and water quality) are also described to explore possible explaining factors for the observed patterns. Ultimately, this study intends to generate key baseline data on the ecological condition of the studied streams and the ecological mechanisms structuring zooplankton communities, contributing to optimal conservation strategies in Atlantic Forest streams.</w:t>
+        <w:t xml:space="preserve">, we hypothesize that the diversity is not be homogeneously distributed among the different spatial scales but concentrated at the finer levels and seasonal variation will be limited to species composition, but no spacial variation is expected between dry and wet seasons. Some environmental features (reach morphology, habitat structure, and water quality) are also described to explore possible explaining factors for the observed patterns. Ultimately, this study generates key baseline data on the ecological condition of the studied streams and the ecological mechanisms structuring zooplankton communities, contributing to safer conservation strategies in Atlantic Forest remnants.</w:t>
       </w:r>
     </w:p>
     <w:bookmarkEnd w:id="12"/>
-    <w:bookmarkStart w:id="17" w:name="material-and-methods"/>
+    <w:bookmarkEnd w:id="13"/>
+    <w:bookmarkStart w:id="18" w:name="material-and-methods"/>
     <w:p>
       <w:pPr>
         <w:pStyle w:val="Heading1"/>
@@ -757,7 +843,7 @@
         <w:t xml:space="preserve">2. Material and methods</w:t>
       </w:r>
     </w:p>
-    <w:bookmarkStart w:id="13" w:name="study-area-and-sampling-design"/>
+    <w:bookmarkStart w:id="14" w:name="study-area-and-sampling-design"/>
     <w:p>
       <w:pPr>
         <w:pStyle w:val="Heading2"/>
@@ -889,8 +975,8 @@
         <w:t xml:space="preserve">). Sampling was conducted during the dry (January-February) and wet (June-July) seasons of 2024.</w:t>
       </w:r>
     </w:p>
-    <w:bookmarkEnd w:id="13"/>
-    <w:bookmarkStart w:id="14" w:name="environmental-data-collection"/>
+    <w:bookmarkEnd w:id="14"/>
+    <w:bookmarkStart w:id="15" w:name="environmental-data-collection"/>
     <w:p>
       <w:pPr>
         <w:pStyle w:val="Heading2"/>
@@ -987,8 +1073,8 @@
         <w:t xml:space="preserve">.</w:t>
       </w:r>
     </w:p>
-    <w:bookmarkEnd w:id="14"/>
-    <w:bookmarkStart w:id="15" w:name="zooplankton-sampling"/>
+    <w:bookmarkEnd w:id="15"/>
+    <w:bookmarkStart w:id="16" w:name="zooplankton-sampling"/>
     <w:p>
       <w:pPr>
         <w:pStyle w:val="Heading2"/>
@@ -1032,8 +1118,8 @@
         <w:t xml:space="preserve">.</w:t>
       </w:r>
     </w:p>
-    <w:bookmarkEnd w:id="15"/>
-    <w:bookmarkStart w:id="16" w:name="statistical-analyses"/>
+    <w:bookmarkEnd w:id="16"/>
+    <w:bookmarkStart w:id="17" w:name="statistical-analyses"/>
     <w:p>
       <w:pPr>
         <w:pStyle w:val="Heading2"/>
@@ -1724,9 +1810,9 @@
         <w:t xml:space="preserve">.</w:t>
       </w:r>
     </w:p>
-    <w:bookmarkEnd w:id="16"/>
     <w:bookmarkEnd w:id="17"/>
-    <w:bookmarkStart w:id="18" w:name="results"/>
+    <w:bookmarkEnd w:id="18"/>
+    <w:bookmarkStart w:id="19" w:name="results"/>
     <w:p>
       <w:pPr>
         <w:pStyle w:val="Heading1"/>
@@ -3513,8 +3599,8 @@
         <w:t xml:space="preserve">-values). These positive effect sizes confirm that spatial species turnover among sites is the primary driver structuring zooplankton assemblages within both streams regardless of seasonality.</w:t>
       </w:r>
     </w:p>
-    <w:bookmarkEnd w:id="18"/>
-    <w:bookmarkStart w:id="19" w:name="discussion"/>
+    <w:bookmarkEnd w:id="19"/>
+    <w:bookmarkStart w:id="20" w:name="discussion"/>
     <w:p>
       <w:pPr>
         <w:pStyle w:val="Heading1"/>
@@ -3531,27 +3617,59 @@
         <w:t xml:space="preserve">Depth and width showed greater variations across sites as a result from the fact the streams are barred at some points from roads for local traffic and small dams for water storage. Stream width and depth showed greater variations reflecting the range of habitats along the study streams, from small and narrow streams to wider and deeper manmade reservoirs.</w:t>
       </w:r>
     </w:p>
+    <w:bookmarkEnd w:id="20"/>
+    <w:bookmarkStart w:id="21" w:name="conclusions"/>
     <w:p>
       <w:pPr>
-        <w:pStyle w:val="TextBody"/>
+        <w:pStyle w:val="Heading1"/>
       </w:pPr>
       <w:r>
-        <w:t xml:space="preserve">–&gt;</w:t>
+        <w:t xml:space="preserve">Conclusions</w:t>
+      </w:r>
+    </w:p>
+    <w:bookmarkEnd w:id="21"/>
+    <w:bookmarkStart w:id="22" w:name="acknowledgements"/>
+    <w:p>
+      <w:pPr>
+        <w:pStyle w:val="Heading1"/>
+      </w:pPr>
+      <w:r>
+        <w:t xml:space="preserve">Acknowledgements</w:t>
+      </w:r>
+    </w:p>
+    <w:p>
+      <w:pPr>
+        <w:pStyle w:val="FirstParagraph"/>
+      </w:pPr>
+      <w:r>
+        <w:t xml:space="preserve">We are greatly indebted to the staff of the REBIO Guaribas for field work assistance. LCA is grateful to Programa de Pós-Graduação em Ecologia e Conservação (PPGEC-UEPB) and CAPES for scholarship granted. EGS, MMSM and MVBS are grateful to Programa de Iniciação Científica (PIBIC-UEPB) and CNPq for scholarship granted.</w:t>
+      </w:r>
+    </w:p>
+    <w:bookmarkEnd w:id="22"/>
+    <w:bookmarkStart w:id="23" w:name="authorship-contribution-statement"/>
+    <w:p>
+      <w:pPr>
+        <w:pStyle w:val="Heading1"/>
+      </w:pPr>
+      <w:r>
+        <w:t xml:space="preserve">Authorship contribution statement</w:t>
+      </w:r>
+    </w:p>
+    <w:p>
+      <w:pPr>
+        <w:pStyle w:val="FirstParagraph"/>
+      </w:pPr>
+      <w:r>
+        <w:t xml:space="preserve">Authorship of this paper is based on</w:t>
       </w:r>
       <w:r>
         <w:t xml:space="preserve"> </w:t>
       </w:r>
       <w:r>
-        <w:t xml:space="preserve">Bush et al. (2016)</w:t>
-      </w:r>
-      <w:r>
-        <w:t xml:space="preserve">;</w:t>
-      </w:r>
-      <w:r>
-        <w:t xml:space="preserve"> </w:t>
-      </w:r>
-      <w:r>
-        <w:t xml:space="preserve">Socolar et al. (2016)</w:t>
+        <w:t xml:space="preserve">CRediT (2026)</w:t>
+      </w:r>
+      <w:r>
+        <w:t xml:space="preserve">.</w:t>
       </w:r>
     </w:p>
     <w:p>
@@ -3559,33 +3677,49 @@
         <w:pStyle w:val="TextBody"/>
       </w:pPr>
       <w:r>
-        <w:t xml:space="preserve">To be effective, diversity conservation must be multi-scaled, targeting local and regional processes. See</w:t>
-      </w:r>
-      <w:r>
-        <w:t xml:space="preserve"> </w:t>
-      </w:r>
-      <w:r>
-        <w:t xml:space="preserve">(Wishart and Davies 2003, Cheung and Burrows 2024, Bedrij et al. 2026)</w:t>
+        <w:t xml:space="preserve">Ellen Gomes da Silva: Data curation, Formal analysis, Investigation, Software, Visualization, Writing – original draft.</w:t>
       </w:r>
     </w:p>
-    <w:bookmarkEnd w:id="19"/>
-    <w:bookmarkStart w:id="20" w:name="conclusions"/>
+    <w:p>
+      <w:pPr>
+        <w:pStyle w:val="TextBody"/>
+      </w:pPr>
+      <w:r>
+        <w:t xml:space="preserve">Mayara Mirelly da Silva Monteiro: Data curation, Formal analysis, Investigation.</w:t>
+      </w:r>
+    </w:p>
+    <w:p>
+      <w:pPr>
+        <w:pStyle w:val="TextBody"/>
+      </w:pPr>
+      <w:r>
+        <w:t xml:space="preserve">Ludmilla Cavalcanti Antunes Lucena: Supervision, Validation.</w:t>
+      </w:r>
+    </w:p>
+    <w:p>
+      <w:pPr>
+        <w:pStyle w:val="TextBody"/>
+      </w:pPr>
+      <w:r>
+        <w:t xml:space="preserve">Thais Xavier de Melo: Supervision, Validation.</w:t>
+      </w:r>
+    </w:p>
+    <w:p>
+      <w:pPr>
+        <w:pStyle w:val="TextBody"/>
+      </w:pPr>
+      <w:r>
+        <w:t xml:space="preserve">Elvio Sergio Figueredo Medeiros: Conceptualization, Data Curation, Formal Analysis, Funding Acquisition, Investigation, Methodology, Project Administration, Resources, Software, Supervision, Validation, Visualization, Writing – original draft, Writing – review &amp; editing.</w:t>
+      </w:r>
+    </w:p>
+    <w:bookmarkEnd w:id="23"/>
+    <w:bookmarkStart w:id="24" w:name="ethical-approval"/>
     <w:p>
       <w:pPr>
         <w:pStyle w:val="Heading1"/>
       </w:pPr>
       <w:r>
-        <w:t xml:space="preserve">Conclusions</w:t>
-      </w:r>
-    </w:p>
-    <w:bookmarkEnd w:id="20"/>
-    <w:bookmarkStart w:id="21" w:name="acknowledgements"/>
-    <w:p>
-      <w:pPr>
-        <w:pStyle w:val="Heading1"/>
-      </w:pPr>
-      <w:r>
-        <w:t xml:space="preserve">Acknowledgements</w:t>
+        <w:t xml:space="preserve">Ethical approval</w:t>
       </w:r>
     </w:p>
     <w:p>
@@ -3593,17 +3727,17 @@
         <w:pStyle w:val="FirstParagraph"/>
       </w:pPr>
       <w:r>
-        <w:t xml:space="preserve">We are greatly indebted to the staff of the REBIO Guaribas for field work assistance. LCA is grateful to Programa de Pós-Graduação em Ecologia e Conservação (PPGEC-UEPB) and CAPES for scholarship granted. EGS, MMSM and MVBS are grateful to Programa de Iniciação Científica (PIBIC-UEPB) and CNPq for scholarship granted.</w:t>
+        <w:t xml:space="preserve">Activities inside the REBIO Guaribas were authorized by the Instituto Chico Mendes de Conservação da Biodiversidade (license no. SISBIO-89415-1, SISBIO-89429-2 and SISBIO-89415-2).</w:t>
       </w:r>
     </w:p>
-    <w:bookmarkEnd w:id="21"/>
-    <w:bookmarkStart w:id="22" w:name="authorship-contribution-statement"/>
+    <w:bookmarkEnd w:id="24"/>
+    <w:bookmarkStart w:id="25" w:name="X1f74eb43af444059c7518034463b6c89b1cacf4"/>
     <w:p>
       <w:pPr>
         <w:pStyle w:val="Heading1"/>
       </w:pPr>
       <w:r>
-        <w:t xml:space="preserve">Authorship contribution statement</w:t>
+        <w:t xml:space="preserve">Declaration of generative AI and AI-assisted technologies in the manuscript preparation process</w:t>
       </w:r>
     </w:p>
     <w:p>
@@ -3611,115 +3745,30 @@
         <w:pStyle w:val="FirstParagraph"/>
       </w:pPr>
       <w:r>
-        <w:t xml:space="preserve">Authorship of this paper is based on</w:t>
+        <w:t xml:space="preserve">During the preparation of this manuscript, the authors used ChatGPT (OpenAI) to assist with English language editing and improve the clarity and fluency of the writing. No AI was used for data analysis, interpretation, or generation of scientific conclusions. The authors carefully reviewed and revised all AI-generated suggestions and take full responsibility for the accuracy and content of the final manuscript</w:t>
       </w:r>
       <w:r>
         <w:t xml:space="preserve"> </w:t>
       </w:r>
       <w:r>
-        <w:t xml:space="preserve">CRediT (2026)</w:t>
+        <w:t xml:space="preserve">(CNPq 2026)</w:t>
       </w:r>
       <w:r>
         <w:t xml:space="preserve">.</w:t>
       </w:r>
     </w:p>
-    <w:p>
-      <w:pPr>
-        <w:pStyle w:val="TextBody"/>
-      </w:pPr>
-      <w:r>
-        <w:t xml:space="preserve">Ellen Gomes da Silva: Data curation, Formal analysis, Investigation, Software, Visualization, Writing – original draft.</w:t>
-      </w:r>
-    </w:p>
-    <w:p>
-      <w:pPr>
-        <w:pStyle w:val="TextBody"/>
-      </w:pPr>
-      <w:r>
-        <w:t xml:space="preserve">Mayara Mirelly da Silva Monteiro: Data curation, Formal analysis, Investigation.</w:t>
-      </w:r>
-    </w:p>
-    <w:p>
-      <w:pPr>
-        <w:pStyle w:val="TextBody"/>
-      </w:pPr>
-      <w:r>
-        <w:t xml:space="preserve">Ludmilla Cavalcanti Antunes Lucena: Supervision, Validation.</w:t>
-      </w:r>
-    </w:p>
-    <w:p>
-      <w:pPr>
-        <w:pStyle w:val="TextBody"/>
-      </w:pPr>
-      <w:r>
-        <w:t xml:space="preserve">Thais Xavier de Melo: Supervision, Validation.</w:t>
-      </w:r>
-    </w:p>
-    <w:p>
-      <w:pPr>
-        <w:pStyle w:val="TextBody"/>
-      </w:pPr>
-      <w:r>
-        <w:t xml:space="preserve">Elvio Sergio Figueredo Medeiros: Conceptualization, Data Curation, Formal Analysis, Funding Acquisition, Investigation, Methodology, Project Administration, Resources, Software, Supervision, Validation, Visualization, Writing – original draft, Writing – review &amp; editing.</w:t>
-      </w:r>
-    </w:p>
-    <w:bookmarkEnd w:id="22"/>
-    <w:bookmarkStart w:id="23" w:name="ethical-approval"/>
+    <w:bookmarkEnd w:id="25"/>
+    <w:bookmarkStart w:id="176" w:name="references"/>
     <w:p>
       <w:pPr>
         <w:pStyle w:val="Heading1"/>
       </w:pPr>
       <w:r>
-        <w:t xml:space="preserve">Ethical approval</w:t>
+        <w:t xml:space="preserve">References</w:t>
       </w:r>
     </w:p>
-    <w:p>
-      <w:pPr>
-        <w:pStyle w:val="FirstParagraph"/>
-      </w:pPr>
-      <w:r>
-        <w:t xml:space="preserve">Activities inside the REBIO Guaribas were authorized by the Instituto Chico Mendes de Conservação da Biodiversidade (license no. SISBIO-89415-1, SISBIO-89429-2 and SISBIO-89415-2).</w:t>
-      </w:r>
-    </w:p>
-    <w:bookmarkEnd w:id="23"/>
-    <w:bookmarkStart w:id="24" w:name="X1f74eb43af444059c7518034463b6c89b1cacf4"/>
-    <w:p>
-      <w:pPr>
-        <w:pStyle w:val="Heading1"/>
-      </w:pPr>
-      <w:r>
-        <w:t xml:space="preserve">Declaration of generative AI and AI-assisted technologies in the manuscript preparation process</w:t>
-      </w:r>
-    </w:p>
-    <w:p>
-      <w:pPr>
-        <w:pStyle w:val="FirstParagraph"/>
-      </w:pPr>
-      <w:r>
-        <w:t xml:space="preserve">During the preparation of this manuscript, the authors used ChatGPT (OpenAI) to assist with English language editing and improve the clarity and fluency of the writing. No AI was used for data analysis, interpretation, or generation of scientific conclusions. The authors carefully reviewed and revised all AI-generated suggestions and take full responsibility for the accuracy and content of the final manuscript</w:t>
-      </w:r>
-      <w:r>
-        <w:t xml:space="preserve"> </w:t>
-      </w:r>
-      <w:r>
-        <w:t xml:space="preserve">(CNPq 2026)</w:t>
-      </w:r>
-      <w:r>
-        <w:t xml:space="preserve">.</w:t>
-      </w:r>
-    </w:p>
-    <w:bookmarkEnd w:id="24"/>
-    <w:bookmarkStart w:id="191" w:name="references"/>
-    <w:p>
-      <w:pPr>
-        <w:pStyle w:val="Heading1"/>
-      </w:pPr>
-      <w:r>
-        <w:t xml:space="preserve">References</w:t>
-      </w:r>
-    </w:p>
-    <w:bookmarkStart w:id="190" w:name="refs"/>
-    <w:bookmarkStart w:id="26" w:name="ref-akhyar2026"/>
+    <w:bookmarkStart w:id="175" w:name="refs"/>
+    <w:bookmarkStart w:id="27" w:name="ref-akhyar2026"/>
     <w:p>
       <w:pPr>
         <w:pStyle w:val="Bibliography"/>
@@ -3730,7 +3779,7 @@
       <w:r>
         <w:t xml:space="preserve"> </w:t>
       </w:r>
-      <w:hyperlink r:id="rId25">
+      <w:hyperlink r:id="rId26">
         <w:r>
           <w:rPr>
             <w:rStyle w:val="Hyperlink"/>
@@ -3742,8 +3791,8 @@
         <w:t xml:space="preserve">. Biodiversity and Conservation 35:79.</w:t>
       </w:r>
     </w:p>
-    <w:bookmarkEnd w:id="26"/>
-    <w:bookmarkStart w:id="28" w:name="ref-altindag2025"/>
+    <w:bookmarkEnd w:id="27"/>
+    <w:bookmarkStart w:id="29" w:name="ref-altindag2025"/>
     <w:p>
       <w:pPr>
         <w:pStyle w:val="Bibliography"/>
@@ -3754,7 +3803,7 @@
       <w:r>
         <w:t xml:space="preserve"> </w:t>
       </w:r>
-      <w:hyperlink r:id="rId27">
+      <w:hyperlink r:id="rId28">
         <w:r>
           <w:rPr>
             <w:rStyle w:val="Hyperlink"/>
@@ -3766,43 +3815,19 @@
         <w:t xml:space="preserve">. Desalination and Water Treatment 321:100991.</w:t>
       </w:r>
     </w:p>
-    <w:bookmarkEnd w:id="28"/>
-    <w:bookmarkStart w:id="30" w:name="ref-amaral2024"/>
+    <w:bookmarkEnd w:id="29"/>
+    <w:bookmarkStart w:id="31" w:name="ref-anderson2013"/>
     <w:p>
       <w:pPr>
         <w:pStyle w:val="Bibliography"/>
       </w:pPr>
       <w:r>
-        <w:t xml:space="preserve">Amaral, D. C., F. De Fátima Bomfim, and F. A. Lansac-Tôha. 2024.</w:t>
+        <w:t xml:space="preserve">Anderson, M. J., and D. C. I. Walsh. 2013.</w:t>
       </w:r>
       <w:r>
         <w:t xml:space="preserve"> </w:t>
       </w:r>
-      <w:hyperlink r:id="rId29">
-        <w:r>
-          <w:rPr>
-            <w:rStyle w:val="Hyperlink"/>
-          </w:rPr>
-          <w:t xml:space="preserve">Drivers of zooplankton functional and taxonomic β-diversity in two neotropical floodplains: Implications for conservation</w:t>
-        </w:r>
-      </w:hyperlink>
-      <w:r>
-        <w:t xml:space="preserve">. Biodiversity and Conservation 33:3905–3922.</w:t>
-      </w:r>
-    </w:p>
-    <w:bookmarkEnd w:id="30"/>
-    <w:bookmarkStart w:id="32" w:name="ref-anderson2013"/>
-    <w:p>
-      <w:pPr>
-        <w:pStyle w:val="Bibliography"/>
-      </w:pPr>
-      <w:r>
-        <w:t xml:space="preserve">Anderson, M. J., and D. C. I. Walsh. 2013.</w:t>
-      </w:r>
-      <w:r>
-        <w:t xml:space="preserve"> </w:t>
-      </w:r>
-      <w:hyperlink r:id="rId31">
+      <w:hyperlink r:id="rId30">
         <w:r>
           <w:rPr>
             <w:rStyle w:val="Hyperlink"/>
@@ -3814,8 +3839,8 @@
         <w:t xml:space="preserve"> Ecological Monographs 83:557574.</w:t>
       </w:r>
     </w:p>
-    <w:bookmarkEnd w:id="32"/>
-    <w:bookmarkStart w:id="34" w:name="ref-apha1998"/>
+    <w:bookmarkEnd w:id="31"/>
+    <w:bookmarkStart w:id="33" w:name="ref-apha1998"/>
     <w:p>
       <w:pPr>
         <w:pStyle w:val="Bibliography"/>
@@ -3826,7 +3851,7 @@
       <w:r>
         <w:t xml:space="preserve"> </w:t>
       </w:r>
-      <w:hyperlink r:id="rId33">
+      <w:hyperlink r:id="rId32">
         <w:r>
           <w:rPr>
             <w:rStyle w:val="Hyperlink"/>
@@ -3838,8 +3863,8 @@
         <w:t xml:space="preserve">. American Public Health Association, Washington, DC.</w:t>
       </w:r>
     </w:p>
-    <w:bookmarkEnd w:id="34"/>
-    <w:bookmarkStart w:id="36" w:name="ref-arruda2013"/>
+    <w:bookmarkEnd w:id="33"/>
+    <w:bookmarkStart w:id="35" w:name="ref-arruda2013"/>
     <w:p>
       <w:pPr>
         <w:pStyle w:val="Bibliography"/>
@@ -3850,7 +3875,7 @@
       <w:r>
         <w:t xml:space="preserve"> </w:t>
       </w:r>
-      <w:hyperlink r:id="rId35">
+      <w:hyperlink r:id="rId34">
         <w:r>
           <w:rPr>
             <w:rStyle w:val="Hyperlink"/>
@@ -3862,8 +3887,8 @@
         <w:t xml:space="preserve">. Revista Direitos Emergentes na Sociedade Global 2:280–304.</w:t>
       </w:r>
     </w:p>
-    <w:bookmarkEnd w:id="36"/>
-    <w:bookmarkStart w:id="38" w:name="ref-ávila2011"/>
+    <w:bookmarkEnd w:id="35"/>
+    <w:bookmarkStart w:id="37" w:name="ref-ávila2011"/>
     <w:p>
       <w:pPr>
         <w:pStyle w:val="Bibliography"/>
@@ -3874,7 +3899,7 @@
       <w:r>
         <w:t xml:space="preserve"> </w:t>
       </w:r>
-      <w:hyperlink r:id="rId37">
+      <w:hyperlink r:id="rId36">
         <w:r>
           <w:rPr>
             <w:rStyle w:val="Hyperlink"/>
@@ -3886,8 +3911,8 @@
         <w:t xml:space="preserve">. Wetlands 31:459–469.</w:t>
       </w:r>
     </w:p>
-    <w:bookmarkEnd w:id="38"/>
-    <w:bookmarkStart w:id="40" w:name="ref-balkic2022"/>
+    <w:bookmarkEnd w:id="37"/>
+    <w:bookmarkStart w:id="39" w:name="ref-balkic2022"/>
     <w:p>
       <w:pPr>
         <w:pStyle w:val="Bibliography"/>
@@ -3898,7 +3923,7 @@
       <w:r>
         <w:t xml:space="preserve"> </w:t>
       </w:r>
-      <w:hyperlink r:id="rId39">
+      <w:hyperlink r:id="rId38">
         <w:r>
           <w:rPr>
             <w:rStyle w:val="Hyperlink"/>
@@ -3910,8 +3935,8 @@
         <w:t xml:space="preserve">. Environmental Research 212:113563.</w:t>
       </w:r>
     </w:p>
-    <w:bookmarkEnd w:id="40"/>
-    <w:bookmarkStart w:id="42" w:name="ref-barboza2024"/>
+    <w:bookmarkEnd w:id="39"/>
+    <w:bookmarkStart w:id="41" w:name="ref-barboza2024"/>
     <w:p>
       <w:pPr>
         <w:pStyle w:val="Bibliography"/>
@@ -3922,7 +3947,7 @@
       <w:r>
         <w:t xml:space="preserve"> </w:t>
       </w:r>
-      <w:hyperlink r:id="rId41">
+      <w:hyperlink r:id="rId40">
         <w:r>
           <w:rPr>
             <w:rStyle w:val="Hyperlink"/>
@@ -3934,8 +3959,8 @@
         <w:t xml:space="preserve">. Limnologica 106:126170.</w:t>
       </w:r>
     </w:p>
-    <w:bookmarkEnd w:id="42"/>
-    <w:bookmarkStart w:id="44" w:name="ref-baselga2010"/>
+    <w:bookmarkEnd w:id="41"/>
+    <w:bookmarkStart w:id="43" w:name="ref-baselga2010"/>
     <w:p>
       <w:pPr>
         <w:pStyle w:val="Bibliography"/>
@@ -3946,7 +3971,7 @@
       <w:r>
         <w:t xml:space="preserve"> </w:t>
       </w:r>
-      <w:hyperlink r:id="rId43">
+      <w:hyperlink r:id="rId42">
         <w:r>
           <w:rPr>
             <w:rStyle w:val="Hyperlink"/>
@@ -3958,8 +3983,8 @@
         <w:t xml:space="preserve">. Global Ecology and Biogeography 19:134–143.</w:t>
       </w:r>
     </w:p>
-    <w:bookmarkEnd w:id="44"/>
-    <w:bookmarkStart w:id="46" w:name="ref-baselga2012"/>
+    <w:bookmarkEnd w:id="43"/>
+    <w:bookmarkStart w:id="45" w:name="ref-baselga2012"/>
     <w:p>
       <w:pPr>
         <w:pStyle w:val="Bibliography"/>
@@ -3970,7 +3995,7 @@
       <w:r>
         <w:t xml:space="preserve"> </w:t>
       </w:r>
-      <w:hyperlink r:id="rId45">
+      <w:hyperlink r:id="rId44">
         <w:r>
           <w:rPr>
             <w:rStyle w:val="Hyperlink"/>
@@ -3982,43 +4007,19 @@
         <w:t xml:space="preserve">. Global Ecology and Biogeography 21:1223–1232.</w:t>
       </w:r>
     </w:p>
-    <w:bookmarkEnd w:id="46"/>
-    <w:bookmarkStart w:id="48" w:name="ref-bedrij2026"/>
+    <w:bookmarkEnd w:id="45"/>
+    <w:bookmarkStart w:id="47" w:name="ref-belbin1993"/>
     <w:p>
       <w:pPr>
         <w:pStyle w:val="Bibliography"/>
       </w:pPr>
       <w:r>
-        <w:t xml:space="preserve">Bedrij, N. A., L. Montti, H. A. Keller, L. N. López, and S. J. E. Velazco. 2026.</w:t>
+        <w:t xml:space="preserve">Belbin, L., and C. McDonald. 1993.</w:t>
       </w:r>
       <w:r>
         <w:t xml:space="preserve"> </w:t>
       </w:r>
-      <w:hyperlink r:id="rId47">
-        <w:r>
-          <w:rPr>
-            <w:rStyle w:val="Hyperlink"/>
-          </w:rPr>
-          <w:t xml:space="preserve">Beyond protected areas: The synergistic role of forest territorial planning in safeguarding tree diversity</w:t>
-        </w:r>
-      </w:hyperlink>
-      <w:r>
-        <w:t xml:space="preserve">. Biological Conservation 321:111982.</w:t>
-      </w:r>
-    </w:p>
-    <w:bookmarkEnd w:id="48"/>
-    <w:bookmarkStart w:id="50" w:name="ref-belbin1993"/>
-    <w:p>
-      <w:pPr>
-        <w:pStyle w:val="Bibliography"/>
-      </w:pPr>
-      <w:r>
-        <w:t xml:space="preserve">Belbin, L., and C. McDonald. 1993.</w:t>
-      </w:r>
-      <w:r>
-        <w:t xml:space="preserve"> </w:t>
-      </w:r>
-      <w:hyperlink r:id="rId49">
+      <w:hyperlink r:id="rId46">
         <w:r>
           <w:rPr>
             <w:rStyle w:val="Hyperlink"/>
@@ -4030,8 +4031,8 @@
         <w:t xml:space="preserve">. Journal of Vegetation Science 4:341–348.</w:t>
       </w:r>
     </w:p>
-    <w:bookmarkEnd w:id="50"/>
-    <w:bookmarkStart w:id="52" w:name="ref-bonecker2013"/>
+    <w:bookmarkEnd w:id="47"/>
+    <w:bookmarkStart w:id="49" w:name="ref-bonecker2013"/>
     <w:p>
       <w:pPr>
         <w:pStyle w:val="Bibliography"/>
@@ -4042,7 +4043,7 @@
       <w:r>
         <w:t xml:space="preserve"> </w:t>
       </w:r>
-      <w:hyperlink r:id="rId51">
+      <w:hyperlink r:id="rId48">
         <w:r>
           <w:rPr>
             <w:rStyle w:val="Hyperlink"/>
@@ -4054,8 +4055,8 @@
         <w:t xml:space="preserve">. Limnologica 43:114–121.</w:t>
       </w:r>
     </w:p>
-    <w:bookmarkEnd w:id="52"/>
-    <w:bookmarkStart w:id="54" w:name="ref-brasil2000"/>
+    <w:bookmarkEnd w:id="49"/>
+    <w:bookmarkStart w:id="51" w:name="ref-brasil2000"/>
     <w:p>
       <w:pPr>
         <w:pStyle w:val="Bibliography"/>
@@ -4066,7 +4067,7 @@
       <w:r>
         <w:t xml:space="preserve"> </w:t>
       </w:r>
-      <w:hyperlink r:id="rId53">
+      <w:hyperlink r:id="rId50">
         <w:r>
           <w:rPr>
             <w:rStyle w:val="Hyperlink"/>
@@ -4075,67 +4076,19 @@
         </w:r>
       </w:hyperlink>
     </w:p>
-    <w:bookmarkEnd w:id="54"/>
-    <w:bookmarkStart w:id="56" w:name="ref-bush2016"/>
+    <w:bookmarkEnd w:id="51"/>
+    <w:bookmarkStart w:id="53" w:name="ref-cnpq2026"/>
     <w:p>
       <w:pPr>
         <w:pStyle w:val="Bibliography"/>
       </w:pPr>
       <w:r>
-        <w:t xml:space="preserve">Bush, A., T. Harwood, A. J. Hoskins, K. Mokany, and S. Ferrier. 2016.</w:t>
+        <w:t xml:space="preserve">CNPq. 2026.</w:t>
       </w:r>
       <w:r>
         <w:t xml:space="preserve"> </w:t>
       </w:r>
-      <w:hyperlink r:id="rId55">
-        <w:r>
-          <w:rPr>
-            <w:rStyle w:val="Hyperlink"/>
-          </w:rPr>
-          <w:t xml:space="preserve">Current uses of beta-diversity in biodiversity conservation: A response to socolar et al.</w:t>
-        </w:r>
-      </w:hyperlink>
-      <w:r>
-        <w:t xml:space="preserve"> Trends in Ecology &amp; Evolution 31:337–338.</w:t>
-      </w:r>
-    </w:p>
-    <w:bookmarkEnd w:id="56"/>
-    <w:bookmarkStart w:id="58" w:name="ref-cheung2024"/>
-    <w:p>
-      <w:pPr>
-        <w:pStyle w:val="Bibliography"/>
-      </w:pPr>
-      <w:r>
-        <w:t xml:space="preserve">Cheung, W. C. D., and R. M. Burrows. 2024.</w:t>
-      </w:r>
-      <w:r>
-        <w:t xml:space="preserve"> </w:t>
-      </w:r>
-      <w:hyperlink r:id="rId57">
-        <w:r>
-          <w:rPr>
-            <w:rStyle w:val="Hyperlink"/>
-          </w:rPr>
-          <w:t xml:space="preserve">Structural and functional indicators in freshwater ecosystem monitoring programs</w:t>
-        </w:r>
-      </w:hyperlink>
-      <w:r>
-        <w:t xml:space="preserve">. Ecological Management &amp; Restoration 25:3–13.</w:t>
-      </w:r>
-    </w:p>
-    <w:bookmarkEnd w:id="58"/>
-    <w:bookmarkStart w:id="60" w:name="ref-cnpq2026"/>
-    <w:p>
-      <w:pPr>
-        <w:pStyle w:val="Bibliography"/>
-      </w:pPr>
-      <w:r>
-        <w:t xml:space="preserve">CNPq. 2026.</w:t>
-      </w:r>
-      <w:r>
-        <w:t xml:space="preserve"> </w:t>
-      </w:r>
-      <w:hyperlink r:id="rId59">
+      <w:hyperlink r:id="rId52">
         <w:r>
           <w:rPr>
             <w:rStyle w:val="Hyperlink"/>
@@ -4147,8 +4100,8 @@
         <w:t xml:space="preserve">.</w:t>
       </w:r>
     </w:p>
-    <w:bookmarkEnd w:id="60"/>
-    <w:bookmarkStart w:id="62" w:name="ref-credit2026"/>
+    <w:bookmarkEnd w:id="53"/>
+    <w:bookmarkStart w:id="55" w:name="ref-credit2026"/>
     <w:p>
       <w:pPr>
         <w:pStyle w:val="Bibliography"/>
@@ -4159,7 +4112,7 @@
       <w:r>
         <w:t xml:space="preserve"> </w:t>
       </w:r>
-      <w:hyperlink r:id="rId61">
+      <w:hyperlink r:id="rId54">
         <w:r>
           <w:rPr>
             <w:rStyle w:val="Hyperlink"/>
@@ -4171,8 +4124,8 @@
         <w:t xml:space="preserve">. NISO/CRediT Standing Committee.</w:t>
       </w:r>
     </w:p>
-    <w:bookmarkEnd w:id="62"/>
-    <w:bookmarkStart w:id="64" w:name="ref-crist2003"/>
+    <w:bookmarkEnd w:id="55"/>
+    <w:bookmarkStart w:id="57" w:name="ref-crist2003"/>
     <w:p>
       <w:pPr>
         <w:pStyle w:val="Bibliography"/>
@@ -4183,7 +4136,7 @@
       <w:r>
         <w:t xml:space="preserve"> </w:t>
       </w:r>
-      <w:hyperlink r:id="rId63">
+      <w:hyperlink r:id="rId56">
         <w:r>
           <w:rPr>
             <w:rStyle w:val="Hyperlink"/>
@@ -4195,8 +4148,8 @@
         <w:t xml:space="preserve">. The American Naturalist 162:734–743.</w:t>
       </w:r>
     </w:p>
-    <w:bookmarkEnd w:id="64"/>
-    <w:bookmarkStart w:id="66" w:name="ref-england2004"/>
+    <w:bookmarkEnd w:id="57"/>
+    <w:bookmarkStart w:id="59" w:name="ref-england2004"/>
     <w:p>
       <w:pPr>
         <w:pStyle w:val="Bibliography"/>
@@ -4207,7 +4160,7 @@
       <w:r>
         <w:t xml:space="preserve"> </w:t>
       </w:r>
-      <w:hyperlink r:id="rId65">
+      <w:hyperlink r:id="rId58">
         <w:r>
           <w:rPr>
             <w:rStyle w:val="Hyperlink"/>
@@ -4231,8 +4184,8 @@
         <w:t xml:space="preserve">. Freshwater Biology 49:721–734.</w:t>
       </w:r>
     </w:p>
-    <w:bookmarkEnd w:id="66"/>
-    <w:bookmarkStart w:id="68" w:name="ref-epa2020"/>
+    <w:bookmarkEnd w:id="59"/>
+    <w:bookmarkStart w:id="61" w:name="ref-epa2020"/>
     <w:p>
       <w:pPr>
         <w:pStyle w:val="Bibliography"/>
@@ -4243,7 +4196,7 @@
       <w:r>
         <w:t xml:space="preserve"> </w:t>
       </w:r>
-      <w:hyperlink r:id="rId67">
+      <w:hyperlink r:id="rId60">
         <w:r>
           <w:rPr>
             <w:rStyle w:val="Hyperlink"/>
@@ -4255,8 +4208,8 @@
         <w:t xml:space="preserve">.</w:t>
       </w:r>
     </w:p>
-    <w:bookmarkEnd w:id="68"/>
-    <w:bookmarkStart w:id="70" w:name="ref-farias2020"/>
+    <w:bookmarkEnd w:id="61"/>
+    <w:bookmarkStart w:id="63" w:name="ref-farias2020"/>
     <w:p>
       <w:pPr>
         <w:pStyle w:val="Bibliography"/>
@@ -4267,7 +4220,7 @@
       <w:r>
         <w:t xml:space="preserve"> </w:t>
       </w:r>
-      <w:hyperlink r:id="rId69">
+      <w:hyperlink r:id="rId62">
         <w:r>
           <w:rPr>
             <w:rStyle w:val="Hyperlink"/>
@@ -4279,8 +4232,8 @@
         <w:t xml:space="preserve">. Inland Waters 10:480–492.</w:t>
       </w:r>
     </w:p>
-    <w:bookmarkEnd w:id="70"/>
-    <w:bookmarkStart w:id="72" w:name="ref-farris1969"/>
+    <w:bookmarkEnd w:id="63"/>
+    <w:bookmarkStart w:id="65" w:name="ref-farris1969"/>
     <w:p>
       <w:pPr>
         <w:pStyle w:val="Bibliography"/>
@@ -4291,7 +4244,7 @@
       <w:r>
         <w:t xml:space="preserve"> </w:t>
       </w:r>
-      <w:hyperlink r:id="rId71">
+      <w:hyperlink r:id="rId64">
         <w:r>
           <w:rPr>
             <w:rStyle w:val="Hyperlink"/>
@@ -4303,8 +4256,8 @@
         <w:t xml:space="preserve">. Systematic Zoology 18:279.</w:t>
       </w:r>
     </w:p>
-    <w:bookmarkEnd w:id="72"/>
-    <w:bookmarkStart w:id="74" w:name="ref-fonseca1985"/>
+    <w:bookmarkEnd w:id="65"/>
+    <w:bookmarkStart w:id="67" w:name="ref-fonseca1985"/>
     <w:p>
       <w:pPr>
         <w:pStyle w:val="Bibliography"/>
@@ -4315,7 +4268,7 @@
       <w:r>
         <w:t xml:space="preserve"> </w:t>
       </w:r>
-      <w:hyperlink r:id="rId73">
+      <w:hyperlink r:id="rId66">
         <w:r>
           <w:rPr>
             <w:rStyle w:val="Hyperlink"/>
@@ -4327,8 +4280,8 @@
         <w:t xml:space="preserve">. Biological Conservation 34:17–34.</w:t>
       </w:r>
     </w:p>
-    <w:bookmarkEnd w:id="74"/>
-    <w:bookmarkStart w:id="76" w:name="ref-freiry2020"/>
+    <w:bookmarkEnd w:id="67"/>
+    <w:bookmarkStart w:id="69" w:name="ref-freiry2020"/>
     <w:p>
       <w:pPr>
         <w:pStyle w:val="Bibliography"/>
@@ -4339,7 +4292,7 @@
       <w:r>
         <w:t xml:space="preserve"> </w:t>
       </w:r>
-      <w:hyperlink r:id="rId75">
+      <w:hyperlink r:id="rId68">
         <w:r>
           <w:rPr>
             <w:rStyle w:val="Hyperlink"/>
@@ -4357,8 +4310,8 @@
         <w:t xml:space="preserve">. Hydrobiologia 847:1327–1342.</w:t>
       </w:r>
     </w:p>
-    <w:bookmarkEnd w:id="76"/>
-    <w:bookmarkStart w:id="78" w:name="ref-frissell1986"/>
+    <w:bookmarkEnd w:id="69"/>
+    <w:bookmarkStart w:id="71" w:name="ref-frissell1986"/>
     <w:p>
       <w:pPr>
         <w:pStyle w:val="Bibliography"/>
@@ -4369,7 +4322,7 @@
       <w:r>
         <w:t xml:space="preserve"> </w:t>
       </w:r>
-      <w:hyperlink r:id="rId77">
+      <w:hyperlink r:id="rId70">
         <w:r>
           <w:rPr>
             <w:rStyle w:val="Hyperlink"/>
@@ -4381,8 +4334,8 @@
         <w:t xml:space="preserve">. Environmental Management 10:199–214.</w:t>
       </w:r>
     </w:p>
-    <w:bookmarkEnd w:id="78"/>
-    <w:bookmarkStart w:id="80" w:name="ref-gering2003"/>
+    <w:bookmarkEnd w:id="71"/>
+    <w:bookmarkStart w:id="73" w:name="ref-gering2003"/>
     <w:p>
       <w:pPr>
         <w:pStyle w:val="Bibliography"/>
@@ -4393,7 +4346,7 @@
       <w:r>
         <w:t xml:space="preserve"> </w:t>
       </w:r>
-      <w:hyperlink r:id="rId79">
+      <w:hyperlink r:id="rId72">
         <w:r>
           <w:rPr>
             <w:rStyle w:val="Hyperlink"/>
@@ -4405,8 +4358,8 @@
         <w:t xml:space="preserve">. Conservation Biology 17:488–499.</w:t>
       </w:r>
     </w:p>
-    <w:bookmarkEnd w:id="80"/>
-    <w:bookmarkStart w:id="82" w:name="ref-gotelli2001"/>
+    <w:bookmarkEnd w:id="73"/>
+    <w:bookmarkStart w:id="75" w:name="ref-gotelli2001"/>
     <w:p>
       <w:pPr>
         <w:pStyle w:val="Bibliography"/>
@@ -4417,7 +4370,7 @@
       <w:r>
         <w:t xml:space="preserve"> </w:t>
       </w:r>
-      <w:hyperlink r:id="rId81">
+      <w:hyperlink r:id="rId74">
         <w:r>
           <w:rPr>
             <w:rStyle w:val="Hyperlink"/>
@@ -4429,8 +4382,8 @@
         <w:t xml:space="preserve">. Ecology Letters 4:379–391.</w:t>
       </w:r>
     </w:p>
-    <w:bookmarkEnd w:id="82"/>
-    <w:bookmarkStart w:id="84" w:name="ref-gotelli2002"/>
+    <w:bookmarkEnd w:id="75"/>
+    <w:bookmarkStart w:id="77" w:name="ref-gotelli2002"/>
     <w:p>
       <w:pPr>
         <w:pStyle w:val="Bibliography"/>
@@ -4441,7 +4394,7 @@
       <w:r>
         <w:t xml:space="preserve"> </w:t>
       </w:r>
-      <w:hyperlink r:id="rId83">
+      <w:hyperlink r:id="rId76">
         <w:r>
           <w:rPr>
             <w:rStyle w:val="Hyperlink"/>
@@ -4453,8 +4406,8 @@
         <w:t xml:space="preserve">. Ecology 83:2091–2096.</w:t>
       </w:r>
     </w:p>
-    <w:bookmarkEnd w:id="84"/>
-    <w:bookmarkStart w:id="86" w:name="ref-gouveia2017"/>
+    <w:bookmarkEnd w:id="77"/>
+    <w:bookmarkStart w:id="79" w:name="ref-gouveia2017"/>
     <w:p>
       <w:pPr>
         <w:pStyle w:val="Bibliography"/>
@@ -4465,7 +4418,7 @@
       <w:r>
         <w:t xml:space="preserve"> </w:t>
       </w:r>
-      <w:hyperlink r:id="rId85">
+      <w:hyperlink r:id="rId78">
         <w:r>
           <w:rPr>
             <w:rStyle w:val="Hyperlink"/>
@@ -4477,8 +4430,8 @@
         <w:t xml:space="preserve">. Check List 13:581–590.</w:t>
       </w:r>
     </w:p>
-    <w:bookmarkEnd w:id="86"/>
-    <w:bookmarkStart w:id="87" w:name="ref-haney1973"/>
+    <w:bookmarkEnd w:id="79"/>
+    <w:bookmarkStart w:id="80" w:name="ref-haney1973"/>
     <w:p>
       <w:pPr>
         <w:pStyle w:val="Bibliography"/>
@@ -4487,8 +4440,8 @@
         <w:t xml:space="preserve">Haney, J. F., and D. J. Hall. 1973. Sugar-coated daphnia: A preservation technique for cladocerans. Limnology and Oceanography 18:331–333.</w:t>
       </w:r>
     </w:p>
-    <w:bookmarkEnd w:id="87"/>
-    <w:bookmarkStart w:id="89" w:name="ref-heinrichs2017"/>
+    <w:bookmarkEnd w:id="80"/>
+    <w:bookmarkStart w:id="82" w:name="ref-heinrichs2017"/>
     <w:p>
       <w:pPr>
         <w:pStyle w:val="Bibliography"/>
@@ -4499,7 +4452,7 @@
       <w:r>
         <w:t xml:space="preserve"> </w:t>
       </w:r>
-      <w:hyperlink r:id="rId88">
+      <w:hyperlink r:id="rId81">
         <w:r>
           <w:rPr>
             <w:rStyle w:val="Hyperlink"/>
@@ -4527,43 +4480,19 @@
         <w:t xml:space="preserve">S. Dabbert, I. Lewandowski, J. Weiss, and A. Pyka, editors. Springer International Publishing, Cham, Switzerland.</w:t>
       </w:r>
     </w:p>
-    <w:bookmarkEnd w:id="89"/>
-    <w:bookmarkStart w:id="91" w:name="ref-herbert2010"/>
+    <w:bookmarkEnd w:id="82"/>
+    <w:bookmarkStart w:id="84" w:name="ref-jost2007"/>
     <w:p>
       <w:pPr>
         <w:pStyle w:val="Bibliography"/>
       </w:pPr>
       <w:r>
-        <w:t xml:space="preserve">Herbert, M. E., P. B. Mcintyre, P. J. Doran, J. D. Allan, and R. Abell. 2010.</w:t>
+        <w:t xml:space="preserve">Jost, L. 2007.</w:t>
       </w:r>
       <w:r>
         <w:t xml:space="preserve"> </w:t>
       </w:r>
-      <w:hyperlink r:id="rId90">
-        <w:r>
-          <w:rPr>
-            <w:rStyle w:val="Hyperlink"/>
-          </w:rPr>
-          <w:t xml:space="preserve">Terrestrial reserve networks do not adequately represent aquatic ecosystems</w:t>
-        </w:r>
-      </w:hyperlink>
-      <w:r>
-        <w:t xml:space="preserve">. Conservation Biology 24:1002–1011.</w:t>
-      </w:r>
-    </w:p>
-    <w:bookmarkEnd w:id="91"/>
-    <w:bookmarkStart w:id="93" w:name="ref-jost2007"/>
-    <w:p>
-      <w:pPr>
-        <w:pStyle w:val="Bibliography"/>
-      </w:pPr>
-      <w:r>
-        <w:t xml:space="preserve">Jost, L. 2007.</w:t>
-      </w:r>
-      <w:r>
-        <w:t xml:space="preserve"> </w:t>
-      </w:r>
-      <w:hyperlink r:id="rId92">
+      <w:hyperlink r:id="rId83">
         <w:r>
           <w:rPr>
             <w:rStyle w:val="Hyperlink"/>
@@ -4575,8 +4504,8 @@
         <w:t xml:space="preserve">. Ecology 88:2427–2439.</w:t>
       </w:r>
     </w:p>
-    <w:bookmarkEnd w:id="93"/>
-    <w:bookmarkStart w:id="95" w:name="ref-kaufman1990"/>
+    <w:bookmarkEnd w:id="84"/>
+    <w:bookmarkStart w:id="86" w:name="ref-kaufman1990"/>
     <w:p>
       <w:pPr>
         <w:pStyle w:val="Bibliography"/>
@@ -4587,7 +4516,7 @@
       <w:r>
         <w:t xml:space="preserve"> </w:t>
       </w:r>
-      <w:hyperlink r:id="rId94">
+      <w:hyperlink r:id="rId85">
         <w:r>
           <w:rPr>
             <w:rStyle w:val="Hyperlink"/>
@@ -4599,8 +4528,8 @@
         <w:t xml:space="preserve">. Pages 199–252. First edition. Wiley.</w:t>
       </w:r>
     </w:p>
-    <w:bookmarkEnd w:id="95"/>
-    <w:bookmarkStart w:id="97" w:name="ref-keppeler2004"/>
+    <w:bookmarkEnd w:id="86"/>
+    <w:bookmarkStart w:id="88" w:name="ref-keppeler2004"/>
     <w:p>
       <w:pPr>
         <w:pStyle w:val="Bibliography"/>
@@ -4611,7 +4540,7 @@
       <w:r>
         <w:t xml:space="preserve"> </w:t>
       </w:r>
-      <w:hyperlink r:id="rId96">
+      <w:hyperlink r:id="rId87">
         <w:r>
           <w:rPr>
             <w:rStyle w:val="Hyperlink"/>
@@ -4623,8 +4552,8 @@
         <w:t xml:space="preserve">. Revista Brasileira de Zoologia 21:233–241.</w:t>
       </w:r>
     </w:p>
-    <w:bookmarkEnd w:id="97"/>
-    <w:bookmarkStart w:id="99" w:name="ref-lande1996"/>
+    <w:bookmarkEnd w:id="88"/>
+    <w:bookmarkStart w:id="90" w:name="ref-lande1996"/>
     <w:p>
       <w:pPr>
         <w:pStyle w:val="Bibliography"/>
@@ -4635,7 +4564,7 @@
       <w:r>
         <w:t xml:space="preserve"> </w:t>
       </w:r>
-      <w:hyperlink r:id="rId98">
+      <w:hyperlink r:id="rId89">
         <w:r>
           <w:rPr>
             <w:rStyle w:val="Hyperlink"/>
@@ -4647,8 +4576,8 @@
         <w:t xml:space="preserve">. Oikos 76:5.</w:t>
       </w:r>
     </w:p>
-    <w:bookmarkEnd w:id="99"/>
-    <w:bookmarkStart w:id="100" w:name="ref-lê2008"/>
+    <w:bookmarkEnd w:id="90"/>
+    <w:bookmarkStart w:id="91" w:name="ref-lê2008"/>
     <w:p>
       <w:pPr>
         <w:pStyle w:val="Bibliography"/>
@@ -4657,8 +4586,8 @@
         <w:t xml:space="preserve">Lê, S., J. Josse, and F. Husson. 2008. FactoMineR: An r package for multivariate analysis. Journal of Statistical Software 25:1–18.</w:t>
       </w:r>
     </w:p>
-    <w:bookmarkEnd w:id="100"/>
-    <w:bookmarkStart w:id="101" w:name="ref-legendre1998"/>
+    <w:bookmarkEnd w:id="91"/>
+    <w:bookmarkStart w:id="92" w:name="ref-legendre1998"/>
     <w:p>
       <w:pPr>
         <w:pStyle w:val="Bibliography"/>
@@ -4667,8 +4596,8 @@
         <w:t xml:space="preserve">Legendre, P., and L. Legendre. 1998. Numerical ecology. 2nd English ed. Amsterdam, The Netherlands ; New York ; Oxford.</w:t>
       </w:r>
     </w:p>
-    <w:bookmarkEnd w:id="101"/>
-    <w:bookmarkStart w:id="103" w:name="ref-ligeiro2010"/>
+    <w:bookmarkEnd w:id="92"/>
+    <w:bookmarkStart w:id="94" w:name="ref-ligeiro2010"/>
     <w:p>
       <w:pPr>
         <w:pStyle w:val="Bibliography"/>
@@ -4679,7 +4608,7 @@
       <w:r>
         <w:t xml:space="preserve"> </w:t>
       </w:r>
-      <w:hyperlink r:id="rId102">
+      <w:hyperlink r:id="rId93">
         <w:r>
           <w:rPr>
             <w:rStyle w:val="Hyperlink"/>
@@ -4691,8 +4620,8 @@
         <w:t xml:space="preserve">. Freshwater Biology 55:424–435.</w:t>
       </w:r>
     </w:p>
-    <w:bookmarkEnd w:id="103"/>
-    <w:bookmarkStart w:id="105" w:name="ref-lôbo2011"/>
+    <w:bookmarkEnd w:id="94"/>
+    <w:bookmarkStart w:id="96" w:name="ref-lôbo2011"/>
     <w:p>
       <w:pPr>
         <w:pStyle w:val="Bibliography"/>
@@ -4703,7 +4632,7 @@
       <w:r>
         <w:t xml:space="preserve"> </w:t>
       </w:r>
-      <w:hyperlink r:id="rId104">
+      <w:hyperlink r:id="rId95">
         <w:r>
           <w:rPr>
             <w:rStyle w:val="Hyperlink"/>
@@ -4715,8 +4644,8 @@
         <w:t xml:space="preserve">. Diversity and Distributions 17:287–296.</w:t>
       </w:r>
     </w:p>
-    <w:bookmarkEnd w:id="105"/>
-    <w:bookmarkStart w:id="107" w:name="ref-lopes2014"/>
+    <w:bookmarkEnd w:id="96"/>
+    <w:bookmarkStart w:id="98" w:name="ref-lopes2014"/>
     <w:p>
       <w:pPr>
         <w:pStyle w:val="Bibliography"/>
@@ -4727,7 +4656,7 @@
       <w:r>
         <w:t xml:space="preserve"> </w:t>
       </w:r>
-      <w:hyperlink r:id="rId106">
+      <w:hyperlink r:id="rId97">
         <w:r>
           <w:rPr>
             <w:rStyle w:val="Hyperlink"/>
@@ -4739,8 +4668,8 @@
         <w:t xml:space="preserve">. PLoS ONE 9:e109581.</w:t>
       </w:r>
     </w:p>
-    <w:bookmarkEnd w:id="107"/>
-    <w:bookmarkStart w:id="109" w:name="ref-lucena2015"/>
+    <w:bookmarkEnd w:id="98"/>
+    <w:bookmarkStart w:id="100" w:name="ref-lucena2015"/>
     <w:p>
       <w:pPr>
         <w:pStyle w:val="Bibliography"/>
@@ -4751,7 +4680,7 @@
       <w:r>
         <w:t xml:space="preserve"> </w:t>
       </w:r>
-      <w:hyperlink r:id="rId108">
+      <w:hyperlink r:id="rId99">
         <w:r>
           <w:rPr>
             <w:rStyle w:val="Hyperlink"/>
@@ -4763,8 +4692,8 @@
         <w:t xml:space="preserve">. Acta Limnologica Brasiliensia 27:118–129.</w:t>
       </w:r>
     </w:p>
-    <w:bookmarkEnd w:id="109"/>
-    <w:bookmarkStart w:id="110" w:name="ref-mackereth1978"/>
+    <w:bookmarkEnd w:id="100"/>
+    <w:bookmarkStart w:id="101" w:name="ref-mackereth1978"/>
     <w:p>
       <w:pPr>
         <w:pStyle w:val="Bibliography"/>
@@ -4773,8 +4702,8 @@
         <w:t xml:space="preserve">Mackereth, F. J. H., J. Heron, and J. F. Talling. 1978. Water analysis: Some revised methods for limnologists.(scientific publication n. 36) freshwater biological association. Cumbria and Dorset, England.</w:t>
       </w:r>
     </w:p>
-    <w:bookmarkEnd w:id="110"/>
-    <w:bookmarkStart w:id="112" w:name="ref-maechler2026"/>
+    <w:bookmarkEnd w:id="101"/>
+    <w:bookmarkStart w:id="103" w:name="ref-maechler2026"/>
     <w:p>
       <w:pPr>
         <w:pStyle w:val="Bibliography"/>
@@ -4785,7 +4714,7 @@
       <w:r>
         <w:t xml:space="preserve"> </w:t>
       </w:r>
-      <w:hyperlink r:id="rId111">
+      <w:hyperlink r:id="rId102">
         <w:r>
           <w:rPr>
             <w:rStyle w:val="Hyperlink"/>
@@ -4797,8 +4726,8 @@
         <w:t xml:space="preserve">.</w:t>
       </w:r>
     </w:p>
-    <w:bookmarkEnd w:id="112"/>
-    <w:bookmarkStart w:id="114" w:name="ref-maitland1990"/>
+    <w:bookmarkEnd w:id="103"/>
+    <w:bookmarkStart w:id="105" w:name="ref-maitland1990"/>
     <w:p>
       <w:pPr>
         <w:pStyle w:val="Bibliography"/>
@@ -4809,7 +4738,7 @@
       <w:r>
         <w:t xml:space="preserve"> </w:t>
       </w:r>
-      <w:hyperlink r:id="rId113">
+      <w:hyperlink r:id="rId104">
         <w:r>
           <w:rPr>
             <w:rStyle w:val="Hyperlink"/>
@@ -4821,8 +4750,8 @@
         <w:t xml:space="preserve">. Second edition. Chapman; Hall, New York.</w:t>
       </w:r>
     </w:p>
-    <w:bookmarkEnd w:id="114"/>
-    <w:bookmarkStart w:id="116" w:name="ref-malabarba2006"/>
+    <w:bookmarkEnd w:id="105"/>
+    <w:bookmarkStart w:id="107" w:name="ref-malabarba2006"/>
     <w:p>
       <w:pPr>
         <w:pStyle w:val="Bibliography"/>
@@ -4833,7 +4762,7 @@
       <w:r>
         <w:t xml:space="preserve"> </w:t>
       </w:r>
-      <w:hyperlink r:id="rId115">
+      <w:hyperlink r:id="rId106">
         <w:r>
           <w:rPr>
             <w:rStyle w:val="Hyperlink"/>
@@ -4845,8 +4774,8 @@
         <w:t xml:space="preserve">. Neotropical Ichthyology 4:377–377.</w:t>
       </w:r>
     </w:p>
-    <w:bookmarkEnd w:id="116"/>
-    <w:bookmarkStart w:id="118" w:name="ref-maltchik2006"/>
+    <w:bookmarkEnd w:id="107"/>
+    <w:bookmarkStart w:id="109" w:name="ref-maltchik2006"/>
     <w:p>
       <w:pPr>
         <w:pStyle w:val="Bibliography"/>
@@ -4857,7 +4786,7 @@
       <w:r>
         <w:t xml:space="preserve"> </w:t>
       </w:r>
-      <w:hyperlink r:id="rId117">
+      <w:hyperlink r:id="rId108">
         <w:r>
           <w:rPr>
             <w:rStyle w:val="Hyperlink"/>
@@ -4893,8 +4822,8 @@
         <w:t xml:space="preserve">. Aquatic Conservation: Marine and Freshwater Ecosystems 16:665–677.</w:t>
       </w:r>
     </w:p>
-    <w:bookmarkEnd w:id="118"/>
-    <w:bookmarkStart w:id="120" w:name="ref-marcelino2025"/>
+    <w:bookmarkEnd w:id="109"/>
+    <w:bookmarkStart w:id="111" w:name="ref-marcelino2025"/>
     <w:p>
       <w:pPr>
         <w:pStyle w:val="Bibliography"/>
@@ -4905,7 +4834,7 @@
       <w:r>
         <w:t xml:space="preserve"> </w:t>
       </w:r>
-      <w:hyperlink r:id="rId119">
+      <w:hyperlink r:id="rId110">
         <w:r>
           <w:rPr>
             <w:rStyle w:val="Hyperlink"/>
@@ -4917,8 +4846,8 @@
         <w:t xml:space="preserve">. Acta Limnologica Brasiliensia 37:e30.</w:t>
       </w:r>
     </w:p>
-    <w:bookmarkEnd w:id="120"/>
-    <w:bookmarkStart w:id="121" w:name="ref-mccune2002"/>
+    <w:bookmarkEnd w:id="111"/>
+    <w:bookmarkStart w:id="112" w:name="ref-mccune2002"/>
     <w:p>
       <w:pPr>
         <w:pStyle w:val="Bibliography"/>
@@ -4927,8 +4856,8 @@
         <w:t xml:space="preserve">McCune, B., and J. B. Grace. 2002. Analysis of ecological communities. MjM Software Design, Gleneden Beach, Oregon, U.S.A.</w:t>
       </w:r>
     </w:p>
-    <w:bookmarkEnd w:id="121"/>
-    <w:bookmarkStart w:id="122" w:name="ref-medeiros2008"/>
+    <w:bookmarkEnd w:id="112"/>
+    <w:bookmarkStart w:id="113" w:name="ref-medeiros2008"/>
     <w:p>
       <w:pPr>
         <w:pStyle w:val="Bibliography"/>
@@ -4937,8 +4866,8 @@
         <w:t xml:space="preserve">Medeiros, E. S. F., M. J. Silva, and R. T. C. Ramos. 2008. Application of catchment- and local-scale variables for aquatic habitat characterization and assessment in the brazilian semi-arid region. Neotropical Biology and Conservation 3:13–20.</w:t>
       </w:r>
     </w:p>
-    <w:bookmarkEnd w:id="122"/>
-    <w:bookmarkStart w:id="124" w:name="ref-mehla2026"/>
+    <w:bookmarkEnd w:id="113"/>
+    <w:bookmarkStart w:id="115" w:name="ref-mehla2026"/>
     <w:p>
       <w:pPr>
         <w:pStyle w:val="Bibliography"/>
@@ -4949,7 +4878,7 @@
       <w:r>
         <w:t xml:space="preserve"> </w:t>
       </w:r>
-      <w:hyperlink r:id="rId123">
+      <w:hyperlink r:id="rId114">
         <w:r>
           <w:rPr>
             <w:rStyle w:val="Hyperlink"/>
@@ -4961,8 +4890,8 @@
         <w:t xml:space="preserve">. Water Research 307:126704.</w:t>
       </w:r>
     </w:p>
-    <w:bookmarkEnd w:id="124"/>
-    <w:bookmarkStart w:id="126" w:name="ref-melo2014"/>
+    <w:bookmarkEnd w:id="115"/>
+    <w:bookmarkStart w:id="117" w:name="ref-melo2014"/>
     <w:p>
       <w:pPr>
         <w:pStyle w:val="Bibliography"/>
@@ -4973,7 +4902,7 @@
       <w:r>
         <w:t xml:space="preserve"> </w:t>
       </w:r>
-      <w:hyperlink r:id="rId125">
+      <w:hyperlink r:id="rId116">
         <w:r>
           <w:rPr>
             <w:rStyle w:val="Hyperlink"/>
@@ -4985,8 +4914,8 @@
         <w:t xml:space="preserve">. PhD thesis, João Pessoa - PB.</w:t>
       </w:r>
     </w:p>
-    <w:bookmarkEnd w:id="126"/>
-    <w:bookmarkStart w:id="128" w:name="ref-melo2013"/>
+    <w:bookmarkEnd w:id="117"/>
+    <w:bookmarkStart w:id="119" w:name="ref-melo2013"/>
     <w:p>
       <w:pPr>
         <w:pStyle w:val="Bibliography"/>
@@ -4997,7 +4926,7 @@
       <w:r>
         <w:t xml:space="preserve"> </w:t>
       </w:r>
-      <w:hyperlink r:id="rId127">
+      <w:hyperlink r:id="rId118">
         <w:r>
           <w:rPr>
             <w:rStyle w:val="Hyperlink"/>
@@ -5009,8 +4938,8 @@
         <w:t xml:space="preserve">. International Journal of Biodiversity 2013:1–13.</w:t>
       </w:r>
     </w:p>
-    <w:bookmarkEnd w:id="128"/>
-    <w:bookmarkStart w:id="130" w:name="ref-meyer2007"/>
+    <w:bookmarkEnd w:id="119"/>
+    <w:bookmarkStart w:id="121" w:name="ref-meyer2007"/>
     <w:p>
       <w:pPr>
         <w:pStyle w:val="Bibliography"/>
@@ -5021,7 +4950,7 @@
       <w:r>
         <w:t xml:space="preserve"> </w:t>
       </w:r>
-      <w:hyperlink r:id="rId129">
+      <w:hyperlink r:id="rId120">
         <w:r>
           <w:rPr>
             <w:rStyle w:val="Hyperlink"/>
@@ -5033,8 +4962,8 @@
         <w:t xml:space="preserve">. Journal of the American Water Resources Association 43:86–103.</w:t>
       </w:r>
     </w:p>
-    <w:bookmarkEnd w:id="130"/>
-    <w:bookmarkStart w:id="132" w:name="ref-mma2003"/>
+    <w:bookmarkEnd w:id="121"/>
+    <w:bookmarkStart w:id="123" w:name="ref-mma2003"/>
     <w:p>
       <w:pPr>
         <w:pStyle w:val="Bibliography"/>
@@ -5045,7 +4974,7 @@
       <w:r>
         <w:t xml:space="preserve"> </w:t>
       </w:r>
-      <w:hyperlink r:id="rId131">
+      <w:hyperlink r:id="rId122">
         <w:r>
           <w:rPr>
             <w:rStyle w:val="Hyperlink"/>
@@ -5054,8 +4983,8 @@
         </w:r>
       </w:hyperlink>
     </w:p>
-    <w:bookmarkEnd w:id="132"/>
-    <w:bookmarkStart w:id="134" w:name="ref-mma2026"/>
+    <w:bookmarkEnd w:id="123"/>
+    <w:bookmarkStart w:id="125" w:name="ref-mma2026"/>
     <w:p>
       <w:pPr>
         <w:pStyle w:val="Bibliography"/>
@@ -5066,7 +4995,7 @@
       <w:r>
         <w:t xml:space="preserve"> </w:t>
       </w:r>
-      <w:hyperlink r:id="rId133">
+      <w:hyperlink r:id="rId124">
         <w:r>
           <w:rPr>
             <w:rStyle w:val="Hyperlink"/>
@@ -5078,8 +5007,8 @@
         <w:t xml:space="preserve">. Page 56. Mamanguape, PB.</w:t>
       </w:r>
     </w:p>
-    <w:bookmarkEnd w:id="134"/>
-    <w:bookmarkStart w:id="136" w:name="ref-mugodo2006"/>
+    <w:bookmarkEnd w:id="125"/>
+    <w:bookmarkStart w:id="127" w:name="ref-mugodo2006"/>
     <w:p>
       <w:pPr>
         <w:pStyle w:val="Bibliography"/>
@@ -5090,7 +5019,7 @@
       <w:r>
         <w:t xml:space="preserve"> </w:t>
       </w:r>
-      <w:hyperlink r:id="rId135">
+      <w:hyperlink r:id="rId126">
         <w:r>
           <w:rPr>
             <w:rStyle w:val="Hyperlink"/>
@@ -5102,8 +5031,8 @@
         <w:t xml:space="preserve">. Hydrobiologia 572:59–70.</w:t>
       </w:r>
     </w:p>
-    <w:bookmarkEnd w:id="136"/>
-    <w:bookmarkStart w:id="138" w:name="ref-myers2000"/>
+    <w:bookmarkEnd w:id="127"/>
+    <w:bookmarkStart w:id="129" w:name="ref-myers2000"/>
     <w:p>
       <w:pPr>
         <w:pStyle w:val="Bibliography"/>
@@ -5114,7 +5043,7 @@
       <w:r>
         <w:t xml:space="preserve"> </w:t>
       </w:r>
-      <w:hyperlink r:id="rId137">
+      <w:hyperlink r:id="rId128">
         <w:r>
           <w:rPr>
             <w:rStyle w:val="Hyperlink"/>
@@ -5126,8 +5055,8 @@
         <w:t xml:space="preserve">. Nature 403:853–858.</w:t>
       </w:r>
     </w:p>
-    <w:bookmarkEnd w:id="138"/>
-    <w:bookmarkStart w:id="140" w:name="ref-oksanen2020"/>
+    <w:bookmarkEnd w:id="129"/>
+    <w:bookmarkStart w:id="131" w:name="ref-oksanen2020"/>
     <w:p>
       <w:pPr>
         <w:pStyle w:val="Bibliography"/>
@@ -5138,7 +5067,7 @@
       <w:r>
         <w:t xml:space="preserve"> </w:t>
       </w:r>
-      <w:hyperlink r:id="rId139">
+      <w:hyperlink r:id="rId130">
         <w:r>
           <w:rPr>
             <w:rStyle w:val="Hyperlink"/>
@@ -5150,8 +5079,8 @@
         <w:t xml:space="preserve">. The Comprehensive R Archive Network Archive.</w:t>
       </w:r>
     </w:p>
-    <w:bookmarkEnd w:id="140"/>
-    <w:bookmarkStart w:id="142" w:name="ref-peel2007"/>
+    <w:bookmarkEnd w:id="131"/>
+    <w:bookmarkStart w:id="133" w:name="ref-peel2007"/>
     <w:p>
       <w:pPr>
         <w:pStyle w:val="Bibliography"/>
@@ -5162,7 +5091,7 @@
       <w:r>
         <w:t xml:space="preserve"> </w:t>
       </w:r>
-      <w:hyperlink r:id="rId141">
+      <w:hyperlink r:id="rId132">
         <w:r>
           <w:rPr>
             <w:rStyle w:val="Hyperlink"/>
@@ -5174,8 +5103,8 @@
         <w:t xml:space="preserve">. Hydrology and Earth System Sciences 11:1633–1644.</w:t>
       </w:r>
     </w:p>
-    <w:bookmarkEnd w:id="142"/>
-    <w:bookmarkStart w:id="144" w:name="ref-pereira2026"/>
+    <w:bookmarkEnd w:id="133"/>
+    <w:bookmarkStart w:id="135" w:name="ref-pereira2026"/>
     <w:p>
       <w:pPr>
         <w:pStyle w:val="Bibliography"/>
@@ -5186,7 +5115,7 @@
       <w:r>
         <w:t xml:space="preserve"> </w:t>
       </w:r>
-      <w:hyperlink r:id="rId143">
+      <w:hyperlink r:id="rId134">
         <w:r>
           <w:rPr>
             <w:rStyle w:val="Hyperlink"/>
@@ -5198,8 +5127,8 @@
         <w:t xml:space="preserve"> Biological Conservation 321:Article 111958.</w:t>
       </w:r>
     </w:p>
-    <w:bookmarkEnd w:id="144"/>
-    <w:bookmarkStart w:id="145" w:name="ref-pusey2004"/>
+    <w:bookmarkEnd w:id="135"/>
+    <w:bookmarkStart w:id="136" w:name="ref-pusey2004"/>
     <w:p>
       <w:pPr>
         <w:pStyle w:val="Bibliography"/>
@@ -5208,8 +5137,8 @@
         <w:t xml:space="preserve">Pusey, B. J., M. J. Kennard, and A. H. Arthington. 2004. Freshwater fishes of north-eastern australia. CSIRO Publishing, Melbourne, Australia.</w:t>
       </w:r>
     </w:p>
-    <w:bookmarkEnd w:id="145"/>
-    <w:bookmarkStart w:id="147" w:name="ref-rdevelopmentcoreteam2017"/>
+    <w:bookmarkEnd w:id="136"/>
+    <w:bookmarkStart w:id="138" w:name="ref-rdevelopmentcoreteam2017"/>
     <w:p>
       <w:pPr>
         <w:pStyle w:val="Bibliography"/>
@@ -5220,7 +5149,7 @@
       <w:r>
         <w:t xml:space="preserve"> </w:t>
       </w:r>
-      <w:hyperlink r:id="rId146">
+      <w:hyperlink r:id="rId137">
         <w:r>
           <w:rPr>
             <w:rStyle w:val="Hyperlink"/>
@@ -5232,8 +5161,8 @@
         <w:t xml:space="preserve">. R Foundation for Statistical Computing, Austria.</w:t>
       </w:r>
     </w:p>
-    <w:bookmarkEnd w:id="147"/>
-    <w:bookmarkStart w:id="149" w:name="ref-rocha2012"/>
+    <w:bookmarkEnd w:id="138"/>
+    <w:bookmarkStart w:id="140" w:name="ref-rocha2012"/>
     <w:p>
       <w:pPr>
         <w:pStyle w:val="Bibliography"/>
@@ -5244,7 +5173,7 @@
       <w:r>
         <w:t xml:space="preserve"> </w:t>
       </w:r>
-      <w:hyperlink r:id="rId148">
+      <w:hyperlink r:id="rId139">
         <w:r>
           <w:rPr>
             <w:rStyle w:val="Hyperlink"/>
@@ -5256,8 +5185,8 @@
         <w:t xml:space="preserve">. Journal of Arid Environments 85:33–40.</w:t>
       </w:r>
     </w:p>
-    <w:bookmarkEnd w:id="149"/>
-    <w:bookmarkStart w:id="151" w:name="ref-romanelli2022"/>
+    <w:bookmarkEnd w:id="140"/>
+    <w:bookmarkStart w:id="142" w:name="ref-romanelli2022"/>
     <w:p>
       <w:pPr>
         <w:pStyle w:val="Bibliography"/>
@@ -5268,7 +5197,7 @@
       <w:r>
         <w:t xml:space="preserve"> </w:t>
       </w:r>
-      <w:hyperlink r:id="rId150">
+      <w:hyperlink r:id="rId141">
         <w:r>
           <w:rPr>
             <w:rStyle w:val="Hyperlink"/>
@@ -5280,8 +5209,8 @@
         <w:t xml:space="preserve">. Science of The Total Environment 821:153403.</w:t>
       </w:r>
     </w:p>
-    <w:bookmarkEnd w:id="151"/>
-    <w:bookmarkStart w:id="153" w:name="ref-safar2020"/>
+    <w:bookmarkEnd w:id="142"/>
+    <w:bookmarkStart w:id="144" w:name="ref-safar2020"/>
     <w:p>
       <w:pPr>
         <w:pStyle w:val="Bibliography"/>
@@ -5292,7 +5221,7 @@
       <w:r>
         <w:t xml:space="preserve"> </w:t>
       </w:r>
-      <w:hyperlink r:id="rId152">
+      <w:hyperlink r:id="rId143">
         <w:r>
           <w:rPr>
             <w:rStyle w:val="Hyperlink"/>
@@ -5304,43 +5233,19 @@
         <w:t xml:space="preserve">. Forest Ecology and Management 470-471:118183.</w:t>
       </w:r>
     </w:p>
-    <w:bookmarkEnd w:id="153"/>
-    <w:bookmarkStart w:id="155" w:name="ref-santos2024"/>
+    <w:bookmarkEnd w:id="144"/>
+    <w:bookmarkStart w:id="146" w:name="ref-saraçli2013"/>
     <w:p>
       <w:pPr>
         <w:pStyle w:val="Bibliography"/>
       </w:pPr>
       <w:r>
-        <w:t xml:space="preserve">Santos, G. S., L. P. Diniz, E. E. C. Silva, T. L. T. Paula, P. C. S. Gomes, R. X. Calvi, B. L. Delfim, N. R. Simões, and E. M. Eskinazi-Sant’Anna. 2024.</w:t>
+        <w:t xml:space="preserve">Saraçli, S., N. Doğan, and İ. Doğan. 2013.</w:t>
       </w:r>
       <w:r>
         <w:t xml:space="preserve"> </w:t>
       </w:r>
-      <w:hyperlink r:id="rId154">
-        <w:r>
-          <w:rPr>
-            <w:rStyle w:val="Hyperlink"/>
-          </w:rPr>
-          <w:t xml:space="preserve">What drives zooplankton taxonomic and functional β diversity? A review of brazilian rivers</w:t>
-        </w:r>
-      </w:hyperlink>
-      <w:r>
-        <w:t xml:space="preserve">. Hydrobiologia 851:1305–1318.</w:t>
-      </w:r>
-    </w:p>
-    <w:bookmarkEnd w:id="155"/>
-    <w:bookmarkStart w:id="157" w:name="ref-saraçli2013"/>
-    <w:p>
-      <w:pPr>
-        <w:pStyle w:val="Bibliography"/>
-      </w:pPr>
-      <w:r>
-        <w:t xml:space="preserve">Saraçli, S., N. Doğan, and İ. Doğan. 2013.</w:t>
-      </w:r>
-      <w:r>
-        <w:t xml:space="preserve"> </w:t>
-      </w:r>
-      <w:hyperlink r:id="rId156">
+      <w:hyperlink r:id="rId145">
         <w:r>
           <w:rPr>
             <w:rStyle w:val="Hyperlink"/>
@@ -5352,8 +5257,8 @@
         <w:t xml:space="preserve">. Journal of Inequalities and Applications 2013:203.</w:t>
       </w:r>
     </w:p>
-    <w:bookmarkEnd w:id="157"/>
-    <w:bookmarkStart w:id="159" w:name="ref-shell2018"/>
+    <w:bookmarkEnd w:id="146"/>
+    <w:bookmarkStart w:id="148" w:name="ref-shell2018"/>
     <w:p>
       <w:pPr>
         <w:pStyle w:val="Bibliography"/>
@@ -5364,7 +5269,7 @@
       <w:r>
         <w:t xml:space="preserve"> </w:t>
       </w:r>
-      <w:hyperlink r:id="rId158">
+      <w:hyperlink r:id="rId147">
         <w:r>
           <w:rPr>
             <w:rStyle w:val="Hyperlink"/>
@@ -5388,8 +5293,8 @@
         <w:t xml:space="preserve">. River Research and Applications 34:993–1002.</w:t>
       </w:r>
     </w:p>
-    <w:bookmarkEnd w:id="159"/>
-    <w:bookmarkStart w:id="160" w:name="ref-silva2003"/>
+    <w:bookmarkEnd w:id="148"/>
+    <w:bookmarkStart w:id="149" w:name="ref-silva2003"/>
     <w:p>
       <w:pPr>
         <w:pStyle w:val="Bibliography"/>
@@ -5414,8 +5319,8 @@
         <w:t xml:space="preserve">C. Galindo-Leal and I. G. Câmara, editors. CABS; Island Press, Washington, DC.</w:t>
       </w:r>
     </w:p>
-    <w:bookmarkEnd w:id="160"/>
-    <w:bookmarkStart w:id="162" w:name="ref-silva2013"/>
+    <w:bookmarkEnd w:id="149"/>
+    <w:bookmarkStart w:id="151" w:name="ref-silva2013"/>
     <w:p>
       <w:pPr>
         <w:pStyle w:val="Bibliography"/>
@@ -5426,7 +5331,7 @@
       <w:r>
         <w:t xml:space="preserve"> </w:t>
       </w:r>
-      <w:hyperlink r:id="rId161">
+      <w:hyperlink r:id="rId150">
         <w:r>
           <w:rPr>
             <w:rStyle w:val="Hyperlink"/>
@@ -5438,8 +5343,8 @@
         <w:t xml:space="preserve">. PhD thesis.</w:t>
       </w:r>
     </w:p>
-    <w:bookmarkEnd w:id="162"/>
-    <w:bookmarkStart w:id="163" w:name="ref-sneath1973"/>
+    <w:bookmarkEnd w:id="151"/>
+    <w:bookmarkStart w:id="152" w:name="ref-sneath1973"/>
     <w:p>
       <w:pPr>
         <w:pStyle w:val="Bibliography"/>
@@ -5448,43 +5353,19 @@
         <w:t xml:space="preserve">Sneath, P. H. A., and R. R. Sokal. 1973. Numerical taxonomy: The principles and practice of numerical classification. First edition. W H Freeman &amp; Co.</w:t>
       </w:r>
     </w:p>
-    <w:bookmarkEnd w:id="163"/>
-    <w:bookmarkStart w:id="165" w:name="ref-socolar2016"/>
+    <w:bookmarkEnd w:id="152"/>
+    <w:bookmarkStart w:id="154" w:name="ref-sokal1962"/>
     <w:p>
       <w:pPr>
         <w:pStyle w:val="Bibliography"/>
       </w:pPr>
       <w:r>
-        <w:t xml:space="preserve">Socolar, J. B., J. J. Gilroy, W. E. Kunin, and D. P. Edwards. 2016.</w:t>
+        <w:t xml:space="preserve">Sokal, R. R., and F. J. Rohlf. 1962.</w:t>
       </w:r>
       <w:r>
         <w:t xml:space="preserve"> </w:t>
       </w:r>
-      <w:hyperlink r:id="rId164">
-        <w:r>
-          <w:rPr>
-            <w:rStyle w:val="Hyperlink"/>
-          </w:rPr>
-          <w:t xml:space="preserve">How should beta-diversity inform biodiversity conservation?</w:t>
-        </w:r>
-      </w:hyperlink>
-      <w:r>
-        <w:t xml:space="preserve"> Trends in Ecology &amp; Evolution 31:67–80.</w:t>
-      </w:r>
-    </w:p>
-    <w:bookmarkEnd w:id="165"/>
-    <w:bookmarkStart w:id="167" w:name="ref-sokal1962"/>
-    <w:p>
-      <w:pPr>
-        <w:pStyle w:val="Bibliography"/>
-      </w:pPr>
-      <w:r>
-        <w:t xml:space="preserve">Sokal, R. R., and F. J. Rohlf. 1962.</w:t>
-      </w:r>
-      <w:r>
-        <w:t xml:space="preserve"> </w:t>
-      </w:r>
-      <w:hyperlink r:id="rId166">
+      <w:hyperlink r:id="rId153">
         <w:r>
           <w:rPr>
             <w:rStyle w:val="Hyperlink"/>
@@ -5496,8 +5377,8 @@
         <w:t xml:space="preserve">. Taxon 11:33–40.</w:t>
       </w:r>
     </w:p>
-    <w:bookmarkEnd w:id="167"/>
-    <w:bookmarkStart w:id="168" w:name="ref-sokal1995"/>
+    <w:bookmarkEnd w:id="154"/>
+    <w:bookmarkStart w:id="155" w:name="ref-sokal1995"/>
     <w:p>
       <w:pPr>
         <w:pStyle w:val="Bibliography"/>
@@ -5506,8 +5387,8 @@
         <w:t xml:space="preserve">Sokal, R. R., and F. J. Rohlf. 1995. Biometry: The principles and practice of statistics in biological research. Third edition. W.H. Freeman; Company, New York.</w:t>
       </w:r>
     </w:p>
-    <w:bookmarkEnd w:id="168"/>
-    <w:bookmarkStart w:id="170" w:name="ref-souza2025"/>
+    <w:bookmarkEnd w:id="155"/>
+    <w:bookmarkStart w:id="157" w:name="ref-souza2025"/>
     <w:p>
       <w:pPr>
         <w:pStyle w:val="Bibliography"/>
@@ -5518,7 +5399,7 @@
       <w:r>
         <w:t xml:space="preserve"> </w:t>
       </w:r>
-      <w:hyperlink r:id="rId169">
+      <w:hyperlink r:id="rId156">
         <w:r>
           <w:rPr>
             <w:rStyle w:val="Hyperlink"/>
@@ -5548,8 +5429,8 @@
         <w:t xml:space="preserve">. Acta Limnologica Brasiliensia 37:e105.</w:t>
       </w:r>
     </w:p>
-    <w:bookmarkEnd w:id="170"/>
-    <w:bookmarkStart w:id="172" w:name="ref-strahler1957"/>
+    <w:bookmarkEnd w:id="157"/>
+    <w:bookmarkStart w:id="159" w:name="ref-strahler1957"/>
     <w:p>
       <w:pPr>
         <w:pStyle w:val="Bibliography"/>
@@ -5560,7 +5441,7 @@
       <w:r>
         <w:t xml:space="preserve"> </w:t>
       </w:r>
-      <w:hyperlink r:id="rId171">
+      <w:hyperlink r:id="rId158">
         <w:r>
           <w:rPr>
             <w:rStyle w:val="Hyperlink"/>
@@ -5572,8 +5453,8 @@
         <w:t xml:space="preserve">. Eos, Transactions American Geophysical Union 38:913–920.</w:t>
       </w:r>
     </w:p>
-    <w:bookmarkEnd w:id="172"/>
-    <w:bookmarkStart w:id="174" w:name="ref-tabarelli2010"/>
+    <w:bookmarkEnd w:id="159"/>
+    <w:bookmarkStart w:id="161" w:name="ref-tabarelli2010"/>
     <w:p>
       <w:pPr>
         <w:pStyle w:val="Bibliography"/>
@@ -5584,7 +5465,7 @@
       <w:r>
         <w:t xml:space="preserve"> </w:t>
       </w:r>
-      <w:hyperlink r:id="rId173">
+      <w:hyperlink r:id="rId160">
         <w:r>
           <w:rPr>
             <w:rStyle w:val="Hyperlink"/>
@@ -5596,8 +5477,8 @@
         <w:t xml:space="preserve">. Biological Conservation 143:2328–2340.</w:t>
       </w:r>
     </w:p>
-    <w:bookmarkEnd w:id="174"/>
-    <w:bookmarkStart w:id="176" w:name="ref-tuomisto2010"/>
+    <w:bookmarkEnd w:id="161"/>
+    <w:bookmarkStart w:id="163" w:name="ref-tuomisto2010"/>
     <w:p>
       <w:pPr>
         <w:pStyle w:val="Bibliography"/>
@@ -5608,7 +5489,7 @@
       <w:r>
         <w:t xml:space="preserve"> </w:t>
       </w:r>
-      <w:hyperlink r:id="rId175">
+      <w:hyperlink r:id="rId162">
         <w:r>
           <w:rPr>
             <w:rStyle w:val="Hyperlink"/>
@@ -5620,8 +5501,8 @@
         <w:t xml:space="preserve">. Ecography 33:23–45.</w:t>
       </w:r>
     </w:p>
-    <w:bookmarkEnd w:id="176"/>
-    <w:bookmarkStart w:id="178" w:name="ref-vancine2024"/>
+    <w:bookmarkEnd w:id="163"/>
+    <w:bookmarkStart w:id="165" w:name="ref-vancine2024"/>
     <w:p>
       <w:pPr>
         <w:pStyle w:val="Bibliography"/>
@@ -5632,7 +5513,7 @@
       <w:r>
         <w:t xml:space="preserve"> </w:t>
       </w:r>
-      <w:hyperlink r:id="rId177">
+      <w:hyperlink r:id="rId164">
         <w:r>
           <w:rPr>
             <w:rStyle w:val="Hyperlink"/>
@@ -5644,8 +5525,8 @@
         <w:t xml:space="preserve">. Biological Conservation 291:110499.</w:t>
       </w:r>
     </w:p>
-    <w:bookmarkEnd w:id="178"/>
-    <w:bookmarkStart w:id="180" w:name="ref-veech2003"/>
+    <w:bookmarkEnd w:id="165"/>
+    <w:bookmarkStart w:id="167" w:name="ref-veech2003"/>
     <w:p>
       <w:pPr>
         <w:pStyle w:val="Bibliography"/>
@@ -5656,7 +5537,7 @@
       <w:r>
         <w:t xml:space="preserve"> </w:t>
       </w:r>
-      <w:hyperlink r:id="rId179">
+      <w:hyperlink r:id="rId166">
         <w:r>
           <w:rPr>
             <w:rStyle w:val="Hyperlink"/>
@@ -5668,8 +5549,8 @@
         <w:t xml:space="preserve">. Ecology 84:3376–3383.</w:t>
       </w:r>
     </w:p>
-    <w:bookmarkEnd w:id="180"/>
-    <w:bookmarkStart w:id="182" w:name="ref-veech2002"/>
+    <w:bookmarkEnd w:id="167"/>
+    <w:bookmarkStart w:id="169" w:name="ref-veech2002"/>
     <w:p>
       <w:pPr>
         <w:pStyle w:val="Bibliography"/>
@@ -5680,7 +5561,7 @@
       <w:r>
         <w:t xml:space="preserve"> </w:t>
       </w:r>
-      <w:hyperlink r:id="rId181">
+      <w:hyperlink r:id="rId168">
         <w:r>
           <w:rPr>
             <w:rStyle w:val="Hyperlink"/>
@@ -5692,8 +5573,8 @@
         <w:t xml:space="preserve">. Oikos 99:3–9.</w:t>
       </w:r>
     </w:p>
-    <w:bookmarkEnd w:id="182"/>
-    <w:bookmarkStart w:id="184" w:name="ref-ward1998"/>
+    <w:bookmarkEnd w:id="169"/>
+    <w:bookmarkStart w:id="171" w:name="ref-ward1998"/>
     <w:p>
       <w:pPr>
         <w:pStyle w:val="Bibliography"/>
@@ -5704,7 +5585,7 @@
       <w:r>
         <w:t xml:space="preserve"> </w:t>
       </w:r>
-      <w:hyperlink r:id="rId183">
+      <w:hyperlink r:id="rId170">
         <w:r>
           <w:rPr>
             <w:rStyle w:val="Hyperlink"/>
@@ -5716,8 +5597,8 @@
         <w:t xml:space="preserve">. Biological Conservation 83:269–278.</w:t>
       </w:r>
     </w:p>
-    <w:bookmarkEnd w:id="184"/>
-    <w:bookmarkStart w:id="186" w:name="ref-whittaker1972"/>
+    <w:bookmarkEnd w:id="171"/>
+    <w:bookmarkStart w:id="173" w:name="ref-whittaker1972"/>
     <w:p>
       <w:pPr>
         <w:pStyle w:val="Bibliography"/>
@@ -5728,7 +5609,7 @@
       <w:r>
         <w:t xml:space="preserve"> </w:t>
       </w:r>
-      <w:hyperlink r:id="rId185">
+      <w:hyperlink r:id="rId172">
         <w:r>
           <w:rPr>
             <w:rStyle w:val="Hyperlink"/>
@@ -5740,44 +5621,20 @@
         <w:t xml:space="preserve">. TAXON 21:213–251.</w:t>
       </w:r>
     </w:p>
-    <w:bookmarkEnd w:id="186"/>
-    <w:bookmarkStart w:id="188" w:name="ref-wishart2003"/>
+    <w:bookmarkEnd w:id="173"/>
+    <w:bookmarkStart w:id="174" w:name="ref-zaú1998"/>
     <w:p>
       <w:pPr>
         <w:pStyle w:val="Bibliography"/>
       </w:pPr>
       <w:r>
-        <w:t xml:space="preserve">Wishart, M. J., and B. R. Davies. 2003.</w:t>
-      </w:r>
-      <w:r>
-        <w:t xml:space="preserve"> </w:t>
-      </w:r>
-      <w:hyperlink r:id="rId187">
-        <w:r>
-          <w:rPr>
-            <w:rStyle w:val="Hyperlink"/>
-          </w:rPr>
-          <w:t xml:space="preserve">Beyond catchment considerations in the conservation of lotic biodiversity</w:t>
-        </w:r>
-      </w:hyperlink>
-      <w:r>
-        <w:t xml:space="preserve">. Aquatic Conservation: Marine and Freshwater Ecosystems 13:429–437.</w:t>
+        <w:t xml:space="preserve">Zaú, A. S. 1998. Fragmentação da mata atlântica: Aspectos teóricos. Floresta e Ambiente 5:160–170.</w:t>
       </w:r>
     </w:p>
-    <w:bookmarkEnd w:id="188"/>
-    <w:bookmarkStart w:id="189" w:name="ref-zaú1998"/>
-    <w:p>
-      <w:pPr>
-        <w:pStyle w:val="Bibliography"/>
-      </w:pPr>
-      <w:r>
-        <w:t xml:space="preserve">Zaú, A. S. 1998. Fragmentação da mata atlântica: Aspectos teóricos. Floresta e Ambiente 5:160–170.</w:t>
-      </w:r>
-    </w:p>
-    <w:bookmarkEnd w:id="189"/>
-    <w:bookmarkEnd w:id="190"/>
-    <w:bookmarkEnd w:id="191"/>
-    <w:bookmarkStart w:id="226" w:name="figures-and-tables"/>
+    <w:bookmarkEnd w:id="174"/>
+    <w:bookmarkEnd w:id="175"/>
+    <w:bookmarkEnd w:id="176"/>
+    <w:bookmarkStart w:id="211" w:name="figures-and-tables"/>
     <w:p>
       <w:pPr>
         <w:pStyle w:val="Heading1"/>
@@ -6098,7 +5955,7 @@
         <w:t xml:space="preserve">(Stream): Diversity turnover between streams.</w:t>
       </w:r>
     </w:p>
-    <w:bookmarkStart w:id="220" w:name="figures"/>
+    <w:bookmarkStart w:id="205" w:name="figures"/>
     <w:p>
       <w:pPr>
         <w:pStyle w:val="Heading2"/>
@@ -6133,7 +5990,7 @@
       <w:tr>
         <w:tc>
           <w:tcPr/>
-          <w:bookmarkStart w:id="195" w:name="fig-mapa"/>
+          <w:bookmarkStart w:id="180" w:name="fig-mapa"/>
           <w:p>
             <w:pPr>
               <w:pStyle w:val="Compact"/>
@@ -6144,18 +6001,18 @@
                 <wp:inline>
                   <wp:extent cx="5943600" cy="4202583"/>
                   <wp:effectExtent b="0" l="0" r="0" t="0"/>
-                  <wp:docPr descr="" title="" id="193" name="Picture"/>
+                  <wp:docPr descr="" title="" id="178" name="Picture"/>
                   <a:graphic>
                     <a:graphicData uri="http://schemas.openxmlformats.org/drawingml/2006/picture">
                       <pic:pic>
                         <pic:nvPicPr>
-                          <pic:cNvPr descr="imagens/Uso%20de%20Solo%20Rebio_en.png" id="194" name="Picture"/>
+                          <pic:cNvPr descr="imagens/Uso%20de%20Solo%20Rebio_en.png" id="179" name="Picture"/>
                           <pic:cNvPicPr>
                             <a:picLocks noChangeArrowheads="1" noChangeAspect="1"/>
                           </pic:cNvPicPr>
                         </pic:nvPicPr>
                         <pic:blipFill>
-                          <a:blip r:embed="rId192"/>
+                          <a:blip r:embed="rId177"/>
                           <a:stretch>
                             <a:fillRect/>
                           </a:stretch>
@@ -6195,7 +6052,7 @@
               <w:t xml:space="preserve">Figure 1: Study area</w:t>
             </w:r>
           </w:p>
-          <w:bookmarkEnd w:id="195"/>
+          <w:bookmarkEnd w:id="180"/>
         </w:tc>
       </w:tr>
     </w:tbl>
@@ -6225,7 +6082,7 @@
       <w:tr>
         <w:tc>
           <w:tcPr/>
-          <w:bookmarkStart w:id="199" w:name="fig-hab_PCA_rio"/>
+          <w:bookmarkStart w:id="184" w:name="fig-hab_PCA_rio"/>
           <w:p>
             <w:pPr>
               <w:pStyle w:val="Compact"/>
@@ -6236,18 +6093,18 @@
                 <wp:inline>
                   <wp:extent cx="5943600" cy="4953000"/>
                   <wp:effectExtent b="0" l="0" r="0" t="0"/>
-                  <wp:docPr descr="" title="" id="197" name="Picture"/>
+                  <wp:docPr descr="" title="" id="182" name="Picture"/>
                   <a:graphic>
                     <a:graphicData uri="http://schemas.openxmlformats.org/drawingml/2006/picture">
                       <pic:pic>
                         <pic:nvPicPr>
-                          <pic:cNvPr descr="res_ms/fig-hab_PCA_rio.png" id="198" name="Picture"/>
+                          <pic:cNvPr descr="res/fig-hab_PCA_rio.png" id="183" name="Picture"/>
                           <pic:cNvPicPr>
                             <a:picLocks noChangeArrowheads="1" noChangeAspect="1"/>
                           </pic:cNvPicPr>
                         </pic:nvPicPr>
                         <pic:blipFill>
-                          <a:blip r:embed="rId196"/>
+                          <a:blip r:embed="rId181"/>
                           <a:stretch>
                             <a:fillRect/>
                           </a:stretch>
@@ -6287,7 +6144,7 @@
               <w:t xml:space="preserve">Figure 2: Principal Component Analysis, streams</w:t>
             </w:r>
           </w:p>
-          <w:bookmarkEnd w:id="199"/>
+          <w:bookmarkEnd w:id="184"/>
         </w:tc>
       </w:tr>
     </w:tbl>
@@ -6317,7 +6174,7 @@
       <w:tr>
         <w:tc>
           <w:tcPr/>
-          <w:bookmarkStart w:id="203" w:name="fig-hab_PCA_periodo"/>
+          <w:bookmarkStart w:id="188" w:name="fig-hab_PCA_periodo"/>
           <w:p>
             <w:pPr>
               <w:pStyle w:val="Compact"/>
@@ -6328,18 +6185,18 @@
                 <wp:inline>
                   <wp:extent cx="5943600" cy="4953000"/>
                   <wp:effectExtent b="0" l="0" r="0" t="0"/>
-                  <wp:docPr descr="" title="" id="201" name="Picture"/>
+                  <wp:docPr descr="" title="" id="186" name="Picture"/>
                   <a:graphic>
                     <a:graphicData uri="http://schemas.openxmlformats.org/drawingml/2006/picture">
                       <pic:pic>
                         <pic:nvPicPr>
-                          <pic:cNvPr descr="res_ms/fig-hab_PCA_periodo.png" id="202" name="Picture"/>
+                          <pic:cNvPr descr="res/fig-hab_PCA_periodo.png" id="187" name="Picture"/>
                           <pic:cNvPicPr>
                             <a:picLocks noChangeArrowheads="1" noChangeAspect="1"/>
                           </pic:cNvPicPr>
                         </pic:nvPicPr>
                         <pic:blipFill>
-                          <a:blip r:embed="rId200"/>
+                          <a:blip r:embed="rId185"/>
                           <a:stretch>
                             <a:fillRect/>
                           </a:stretch>
@@ -6379,7 +6236,7 @@
               <w:t xml:space="preserve">Figure 3: Principal Component Analysis, seasons</w:t>
             </w:r>
           </w:p>
-          <w:bookmarkEnd w:id="203"/>
+          <w:bookmarkEnd w:id="188"/>
         </w:tc>
       </w:tr>
     </w:tbl>
@@ -6409,7 +6266,7 @@
       <w:tr>
         <w:tc>
           <w:tcPr/>
-          <w:bookmarkStart w:id="207" w:name="fig-rare1"/>
+          <w:bookmarkStart w:id="192" w:name="fig-rare1"/>
           <w:p>
             <w:pPr>
               <w:pStyle w:val="Compact"/>
@@ -6420,18 +6277,18 @@
                 <wp:inline>
                   <wp:extent cx="5943600" cy="4457699"/>
                   <wp:effectExtent b="0" l="0" r="0" t="0"/>
-                  <wp:docPr descr="" title="" id="205" name="Picture"/>
+                  <wp:docPr descr="" title="" id="190" name="Picture"/>
                   <a:graphic>
                     <a:graphicData uri="http://schemas.openxmlformats.org/drawingml/2006/picture">
                       <pic:pic>
                         <pic:nvPicPr>
-                          <pic:cNvPr descr="res_ms/fig-rare1.png" id="206" name="Picture"/>
+                          <pic:cNvPr descr="res/fig-rare1.png" id="191" name="Picture"/>
                           <pic:cNvPicPr>
                             <a:picLocks noChangeArrowheads="1" noChangeAspect="1"/>
                           </pic:cNvPicPr>
                         </pic:nvPicPr>
                         <pic:blipFill>
-                          <a:blip r:embed="rId204"/>
+                          <a:blip r:embed="rId189"/>
                           <a:stretch>
                             <a:fillRect/>
                           </a:stretch>
@@ -6471,7 +6328,7 @@
               <w:t xml:space="preserve">Figure 4: Accumulation curves</w:t>
             </w:r>
           </w:p>
-          <w:bookmarkEnd w:id="207"/>
+          <w:bookmarkEnd w:id="192"/>
         </w:tc>
       </w:tr>
     </w:tbl>
@@ -6501,7 +6358,7 @@
       <w:tr>
         <w:tc>
           <w:tcPr/>
-          <w:bookmarkStart w:id="211" w:name="fig-upgma"/>
+          <w:bookmarkStart w:id="196" w:name="fig-upgma"/>
           <w:p>
             <w:pPr>
               <w:pStyle w:val="Compact"/>
@@ -6512,18 +6369,18 @@
                 <wp:inline>
                   <wp:extent cx="5943600" cy="4862945"/>
                   <wp:effectExtent b="0" l="0" r="0" t="0"/>
-                  <wp:docPr descr="" title="" id="209" name="Picture"/>
+                  <wp:docPr descr="" title="" id="194" name="Picture"/>
                   <a:graphic>
                     <a:graphicData uri="http://schemas.openxmlformats.org/drawingml/2006/picture">
                       <pic:pic>
                         <pic:nvPicPr>
-                          <pic:cNvPr descr="res_ms/fig-upgma.png" id="210" name="Picture"/>
+                          <pic:cNvPr descr="res/fig-upgma.png" id="195" name="Picture"/>
                           <pic:cNvPicPr>
                             <a:picLocks noChangeArrowheads="1" noChangeAspect="1"/>
                           </pic:cNvPicPr>
                         </pic:nvPicPr>
                         <pic:blipFill>
-                          <a:blip r:embed="rId208"/>
+                          <a:blip r:embed="rId193"/>
                           <a:stretch>
                             <a:fillRect/>
                           </a:stretch>
@@ -6563,7 +6420,7 @@
               <w:t xml:space="preserve">Figure 5: UPGMA Classification</w:t>
             </w:r>
           </w:p>
-          <w:bookmarkEnd w:id="211"/>
+          <w:bookmarkEnd w:id="196"/>
         </w:tc>
       </w:tr>
     </w:tbl>
@@ -6593,7 +6450,7 @@
       <w:tr>
         <w:tc>
           <w:tcPr/>
-          <w:bookmarkStart w:id="215" w:name="fig-particao_cs"/>
+          <w:bookmarkStart w:id="200" w:name="fig-particao_cs"/>
           <w:p>
             <w:pPr>
               <w:pStyle w:val="Compact"/>
@@ -6604,18 +6461,18 @@
                 <wp:inline>
                   <wp:extent cx="3669832" cy="7339665"/>
                   <wp:effectExtent b="0" l="0" r="0" t="0"/>
-                  <wp:docPr descr="" title="" id="213" name="Picture"/>
+                  <wp:docPr descr="" title="" id="198" name="Picture"/>
                   <a:graphic>
                     <a:graphicData uri="http://schemas.openxmlformats.org/drawingml/2006/picture">
                       <pic:pic>
                         <pic:nvPicPr>
-                          <pic:cNvPr descr="res_ms/fig-painel_pt.cs.png" id="214" name="Picture"/>
+                          <pic:cNvPr descr="res/fig-painel_pt.cs.png" id="199" name="Picture"/>
                           <pic:cNvPicPr>
                             <a:picLocks noChangeArrowheads="1" noChangeAspect="1"/>
                           </pic:cNvPicPr>
                         </pic:nvPicPr>
                         <pic:blipFill>
-                          <a:blip r:embed="rId212"/>
+                          <a:blip r:embed="rId197"/>
                           <a:stretch>
                             <a:fillRect/>
                           </a:stretch>
@@ -6655,7 +6512,7 @@
               <w:t xml:space="preserve">Figure 6: Partitioning plots season</w:t>
             </w:r>
           </w:p>
-          <w:bookmarkEnd w:id="215"/>
+          <w:bookmarkEnd w:id="200"/>
         </w:tc>
       </w:tr>
     </w:tbl>
@@ -6685,7 +6542,7 @@
       <w:tr>
         <w:tc>
           <w:tcPr/>
-          <w:bookmarkStart w:id="219" w:name="fig-particao_rios"/>
+          <w:bookmarkStart w:id="204" w:name="fig-particao_rios"/>
           <w:p>
             <w:pPr>
               <w:pStyle w:val="Compact"/>
@@ -6696,18 +6553,18 @@
                 <wp:inline>
                   <wp:extent cx="5943600" cy="6792685"/>
                   <wp:effectExtent b="0" l="0" r="0" t="0"/>
-                  <wp:docPr descr="" title="" id="217" name="Picture"/>
+                  <wp:docPr descr="" title="" id="202" name="Picture"/>
                   <a:graphic>
                     <a:graphicData uri="http://schemas.openxmlformats.org/drawingml/2006/picture">
                       <pic:pic>
                         <pic:nvPicPr>
-                          <pic:cNvPr descr="res_ms/fig-painel_pt.rios.png" id="218" name="Picture"/>
+                          <pic:cNvPr descr="res/fig-painel_pt.rios.png" id="203" name="Picture"/>
                           <pic:cNvPicPr>
                             <a:picLocks noChangeArrowheads="1" noChangeAspect="1"/>
                           </pic:cNvPicPr>
                         </pic:nvPicPr>
                         <pic:blipFill>
-                          <a:blip r:embed="rId216"/>
+                          <a:blip r:embed="rId201"/>
                           <a:stretch>
                             <a:fillRect/>
                           </a:stretch>
@@ -6747,12 +6604,12 @@
               <w:t xml:space="preserve">Figure 7: Partitioning plots stream</w:t>
             </w:r>
           </w:p>
-          <w:bookmarkEnd w:id="219"/>
+          <w:bookmarkEnd w:id="204"/>
         </w:tc>
       </w:tr>
     </w:tbl>
-    <w:bookmarkEnd w:id="220"/>
-    <w:bookmarkStart w:id="225" w:name="tables"/>
+    <w:bookmarkEnd w:id="205"/>
+    <w:bookmarkStart w:id="210" w:name="tables"/>
     <w:p>
       <w:pPr>
         <w:pStyle w:val="Heading2"/>
@@ -6787,7 +6644,7 @@
       <w:tr>
         <w:tc>
           <w:tcPr/>
-          <w:bookmarkStart w:id="221" w:name="tbl-hab_gttable"/>
+          <w:bookmarkStart w:id="206" w:name="tbl-hab_gttable"/>
           <w:p>
             <w:pPr>
               <w:jc w:val="center"/>
@@ -18455,7 +18312,7 @@
               </w:tc>
             </w:tr>
           </w:tbl>
-          <w:bookmarkEnd w:id="221"/>
+          <w:bookmarkEnd w:id="206"/>
         </w:tc>
       </w:tr>
     </w:tbl>
@@ -18485,7 +18342,7 @@
       <w:tr>
         <w:tc>
           <w:tcPr/>
-          <w:bookmarkStart w:id="222" w:name="tbl-nutri_gttable"/>
+          <w:bookmarkStart w:id="207" w:name="tbl-nutri_gttable"/>
           <w:p>
             <w:pPr>
               <w:jc w:val="center"/>
@@ -21206,7 +21063,7 @@
               </w:tc>
             </w:tr>
           </w:tbl>
-          <w:bookmarkEnd w:id="222"/>
+          <w:bookmarkEnd w:id="207"/>
         </w:tc>
       </w:tr>
     </w:tbl>
@@ -21236,7 +21093,7 @@
       <w:tr>
         <w:tc>
           <w:tcPr/>
-          <w:bookmarkStart w:id="223" w:name="tbl-checklist_gttable"/>
+          <w:bookmarkStart w:id="208" w:name="tbl-checklist_gttable"/>
           <w:p>
             <w:pPr>
               <w:jc w:val="center"/>
@@ -38980,7 +38837,7 @@
               </w:tc>
             </w:tr>
           </w:tbl>
-          <w:bookmarkEnd w:id="223"/>
+          <w:bookmarkEnd w:id="208"/>
         </w:tc>
       </w:tr>
     </w:tbl>
@@ -39010,7 +38867,7 @@
       <w:tr>
         <w:tc>
           <w:tcPr/>
-          <w:bookmarkStart w:id="224" w:name="tbl-part_gttable"/>
+          <w:bookmarkStart w:id="209" w:name="tbl-part_gttable"/>
           <w:p>
             <w:pPr>
               <w:jc w:val="center"/>
@@ -43870,13 +43727,13 @@
               </w:tc>
             </w:tr>
           </w:tbl>
-          <w:bookmarkEnd w:id="224"/>
+          <w:bookmarkEnd w:id="209"/>
         </w:tc>
       </w:tr>
     </w:tbl>
-    <w:bookmarkEnd w:id="225"/>
-    <w:bookmarkEnd w:id="226"/>
-    <w:bookmarkStart w:id="227" w:name="apendices"/>
+    <w:bookmarkEnd w:id="210"/>
+    <w:bookmarkEnd w:id="211"/>
+    <w:bookmarkStart w:id="212" w:name="apendices"/>
     <w:p>
       <w:pPr>
         <w:pStyle w:val="Heading1"/>
@@ -43885,8 +43742,8 @@
         <w:t xml:space="preserve">Apendices</w:t>
       </w:r>
     </w:p>
-    <w:bookmarkEnd w:id="227"/>
-    <w:bookmarkStart w:id="231" w:name="non-used-figures-and-tables"/>
+    <w:bookmarkEnd w:id="212"/>
+    <w:bookmarkStart w:id="216" w:name="non-used-figures-and-tables"/>
     <w:p>
       <w:pPr>
         <w:pStyle w:val="Heading1"/>
@@ -43936,18 +43793,18 @@
                 <wp:inline>
                   <wp:extent cx="152400" cy="152400"/>
                   <wp:effectExtent b="0" l="0" r="0" t="0"/>
-                  <wp:docPr descr="" title="" id="229" name="Picture"/>
+                  <wp:docPr descr="" title="" id="214" name="Picture"/>
                   <a:graphic>
                     <a:graphicData uri="http://schemas.openxmlformats.org/drawingml/2006/picture">
                       <pic:pic>
                         <pic:nvPicPr>
-                          <pic:cNvPr descr="C:\PROGRA~1\RStudio\RESOUR~1\app\bin\quarto\share\formats\docx\warning.png" id="230" name="Picture"/>
+                          <pic:cNvPr descr="C:\PROGRA~1\RStudio\RESOUR~1\app\bin\quarto\share\formats\docx\warning.png" id="215" name="Picture"/>
                           <pic:cNvPicPr>
                             <a:picLocks noChangeArrowheads="1" noChangeAspect="1"/>
                           </pic:cNvPicPr>
                         </pic:nvPicPr>
                         <pic:blipFill>
-                          <a:blip r:embed="rId228"/>
+                          <a:blip r:embed="rId213"/>
                           <a:stretch>
                             <a:fillRect/>
                           </a:stretch>
@@ -44000,7 +43857,7 @@
         </w:tc>
       </w:tr>
     </w:tbl>
-    <w:bookmarkEnd w:id="231"/>
+    <w:bookmarkEnd w:id="216"/>
     <w:sectPr>
       <w:type w:val="nextPage"/>
       <w:pgSz w:h="15840" w:w="12240"/>

</xml_diff>

<commit_message>
Elv: ms intro encerrada
</commit_message>
<xml_diff>
--- a/docs/ms_rebio23-part.docx
+++ b/docs/ms_rebio23-part.docx
@@ -83,7 +83,7 @@
         <w:pStyle w:val="Date"/>
       </w:pPr>
       <w:r>
-        <w:t xml:space="preserve">2026-10-16</w:t>
+        <w:t xml:space="preserve">2026-10-18</w:t>
       </w:r>
     </w:p>
     <w:p>
@@ -154,7 +154,7 @@
         </w:p>
       </w:sdtContent>
     </w:sdt>
-    <w:bookmarkStart w:id="13" w:name="introduction"/>
+    <w:bookmarkStart w:id="12" w:name="introduction"/>
     <w:p>
       <w:pPr>
         <w:pStyle w:val="Heading1"/>
@@ -259,18 +259,21 @@
         <w:pStyle w:val="TextBody"/>
       </w:pPr>
       <w:r>
-        <w:t xml:space="preserve">In addition to landscape alterations, stream dynamics are strongly driven by seasonal factors. The Atlantic Forest features a predominantly tropical climate with rainfall distributed throughout the year. These hydrological fluctuations directly influence Neotropical freshwater environments by modifying physical and chemical conditions [</w:t>
-      </w:r>
-      <w:r>
-        <w:t xml:space="preserve">Barboza et al. (2024)</w:t>
-      </w:r>
-      <w:r>
-        <w:t xml:space="preserve">]. The shift between dry and rainy seasons alters resource availability, microhabitat structure, and the establishment and persistence of organisms, thereby shaping community composition and dynamics</w:t>
+        <w:t xml:space="preserve">In addition to landscape alterations, stream dynamics are strongly driven by seasonal factors. The Atlantic Forest features a predominantly tropical climate with rainfall distributed throughout the year. These hydrological fluctuations directly influence Neotropical freshwater environments by modifying physical and chemical conditions</w:t>
       </w:r>
       <w:r>
         <w:t xml:space="preserve"> </w:t>
       </w:r>
       <w:r>
+        <w:t xml:space="preserve">(Barboza et al. 2024)</w:t>
+      </w:r>
+      <w:r>
+        <w:t xml:space="preserve">. The shift between dry and rainy seasons alters resource availability, microhabitat structure, and the establishment and persistence of organisms, thereby shaping community composition and dynamics</w:t>
+      </w:r>
+      <w:r>
+        <w:t xml:space="preserve"> </w:t>
+      </w:r>
+      <w:r>
         <w:t xml:space="preserve">(Ward 1998, Souza et al. 2025)</w:t>
       </w:r>
       <w:r>
@@ -283,31 +286,16 @@
         <w:t xml:space="preserve">(Souza et al. 2025)</w:t>
       </w:r>
       <w:r>
-        <w:t xml:space="preserve">, and shifts in species composition and community turnover often reflect underlying alterations in environmental conditions [</w:t>
-      </w:r>
-      <w:r>
-        <w:t xml:space="preserve">Freiry et al. (2020)</w:t>
-      </w:r>
-      <w:r>
-        <w:t xml:space="preserve">;</w:t>
+        <w:t xml:space="preserve">, and shifts in species composition and community turnover often reflect underlying alterations in environmental conditions</w:t>
       </w:r>
       <w:r>
         <w:t xml:space="preserve"> </w:t>
       </w:r>
       <w:r>
-        <w:t xml:space="preserve">Melo and Medeiros (2013)</w:t>
-      </w:r>
-      <w:r>
-        <w:t xml:space="preserve">;</w:t>
-      </w:r>
-      <w:r>
-        <w:t xml:space="preserve"> </w:t>
-      </w:r>
-      <w:r>
-        <w:t xml:space="preserve">Keppeler and Hardy (2004)</w:t>
-      </w:r>
-      <w:r>
-        <w:t xml:space="preserve">].</w:t>
+        <w:t xml:space="preserve">(Keppeler and Hardy 2004, Melo and Medeiros 2013, Shell and Collier 2018, Freiry et al. 2020)</w:t>
+      </w:r>
+      <w:r>
+        <w:t xml:space="preserve">.</w:t>
       </w:r>
     </w:p>
     <w:p>
@@ -315,49 +303,49 @@
         <w:pStyle w:val="TextBody"/>
       </w:pPr>
       <w:r>
-        <w:t xml:space="preserve">Among the biological components of lotic communities, zooplankton—particularly Rotifera, Cladocera, and Copepoda—play a pivotal role. These organisms exhibit diverse body sizes, morphologies, life histories, and functional roles, serving as excellent bioindicators due to their rapid sensitivity to environmental changes</w:t>
+        <w:t xml:space="preserve">Within this context, the design of efficient protected areas that incorporate aquatic systems, ought to rely on a robust network of interconnected spatial scales and meaningful observation of species distributions within and surrounding the areas of biological interest</w:t>
       </w:r>
       <w:r>
         <w:t xml:space="preserve"> </w:t>
       </w:r>
       <w:r>
+        <w:t xml:space="preserve">(Maltchik and Medeiros 2006, Herbert et al. 2010, Socolar et al. 2016)</w:t>
+      </w:r>
+      <w:r>
+        <w:t xml:space="preserve">.</w:t>
+      </w:r>
+      <w:r>
+        <w:t xml:space="preserve"> </w:t>
+      </w:r>
+      <w:r>
+        <w:t xml:space="preserve">Essential to this is the choice of relevant species, capable of representing the central elements of the biological components of lotic communities. Zooplankton, particularly Rotifera, Cladocera, and Copepoda, play a pivotal role in stream ecosystems</w:t>
+      </w:r>
+      <w:r>
+        <w:t xml:space="preserve"> </w:t>
+      </w:r>
+      <w:r>
+        <w:t xml:space="preserve">(Santos et al. 2024, Amaral et al. 2024)</w:t>
+      </w:r>
+      <w:r>
+        <w:t xml:space="preserve">. These organisms exhibit diverse body sizes, morphologies, life histories, and functional roles, serving as excellent bioindicators due to their rapid sensitivity to environmental changes</w:t>
+      </w:r>
+      <w:r>
+        <w:t xml:space="preserve"> </w:t>
+      </w:r>
+      <w:r>
         <w:t xml:space="preserve">(Bonecker et al. 2013)</w:t>
       </w:r>
       <w:r>
-        <w:t xml:space="preserve">. Furthermore, zooplankton constitute a critical food source for fish and other organisms, an essential trophic bridge that transfers energy from primary producers to higher trophic levels [</w:t>
-      </w:r>
-      <w:r>
-        <w:t xml:space="preserve">Altindağ and Berdi̇ (2025)</w:t>
-      </w:r>
-      <w:r>
-        <w:t xml:space="preserve">;</w:t>
+        <w:t xml:space="preserve">. Furthermore, zooplankton constitute a critical food source for fish and other organisms, an essential trophic bridge that transfers energy from primary producers to higher trophic levels</w:t>
       </w:r>
       <w:r>
         <w:t xml:space="preserve"> </w:t>
       </w:r>
       <w:r>
-        <w:t xml:space="preserve">Balkić et al. (2022)</w:t>
-      </w:r>
-      <w:r>
-        <w:t xml:space="preserve">;</w:t>
-      </w:r>
-      <w:r>
-        <w:t xml:space="preserve"> </w:t>
-      </w:r>
-      <w:r>
-        <w:t xml:space="preserve">Marcelino et al. (2025)</w:t>
-      </w:r>
-      <w:r>
-        <w:t xml:space="preserve">;</w:t>
-      </w:r>
-      <w:r>
-        <w:t xml:space="preserve"> </w:t>
-      </w:r>
-      <w:r>
-        <w:t xml:space="preserve">Souza et al. (2025)</w:t>
-      </w:r>
-      <w:r>
-        <w:t xml:space="preserve">].</w:t>
+        <w:t xml:space="preserve">(Balkić et al. 2022, Marcelino et al. 2025, Souza et al. 2025, Altindağ and Berdi̇ 2025)</w:t>
+      </w:r>
+      <w:r>
+        <w:t xml:space="preserve">.</w:t>
       </w:r>
     </w:p>
     <w:p>
@@ -365,7 +353,7 @@
         <w:pStyle w:val="TextBody"/>
       </w:pPr>
       <w:r>
-        <w:t xml:space="preserve">In recent decades, researchers have argued that biodiversity assessments should not be reduced to a single diversity index.</w:t>
+        <w:t xml:space="preserve">Furthermore, in recent decades, researchers have argued that biodiversity assessments should not be reduced to a single diversity index.</w:t>
       </w:r>
       <w:r>
         <w:t xml:space="preserve"> </w:t>
@@ -533,7 +521,7 @@
         <w:pStyle w:val="TextBody"/>
       </w:pPr>
       <w:r>
-        <w:t xml:space="preserve">Therefore, understanding the spatial structure and distribution of biodiversity across scale remains a central theme in community ecology and conservation planning</w:t>
+        <w:t xml:space="preserve">Therefore, understanding the spatial structure and distribution of biodiversity across scales remains a central theme in community ecology and conservation planning</w:t>
       </w:r>
       <w:r>
         <w:t xml:space="preserve"> </w:t>
@@ -548,10 +536,100 @@
         <w:t xml:space="preserve"> </w:t>
       </w:r>
       <w:r>
+        <w:t xml:space="preserve">(Baselga 2010, 2012)</w:t>
+      </w:r>
+      <w:r>
+        <w:t xml:space="preserve">.</w:t>
+      </w:r>
+      <w:r>
+        <w:t xml:space="preserve"> </w:t>
+      </w:r>
+      <w:r>
+        <w:t xml:space="preserve">Total regional species richness (</w:t>
+      </w:r>
+      <m:oMath>
+        <m:r>
+          <m:t>γ</m:t>
+        </m:r>
+      </m:oMath>
+      <w:r>
+        <w:t xml:space="preserve">-diversity) can be hierarchically partitioned into its additive components: local richness (</w:t>
+      </w:r>
+      <m:oMath>
+        <m:r>
+          <m:t>α</m:t>
+        </m:r>
+      </m:oMath>
+      <w:r>
+        <w:t xml:space="preserve">-diversity) and species turnover among assemblages (</w:t>
+      </w:r>
+      <m:oMath>
+        <m:r>
+          <m:t>β</m:t>
+        </m:r>
+      </m:oMath>
+      <w:r>
+        <w:t xml:space="preserve">-diversity) across spatial or temporal scales</w:t>
+      </w:r>
+      <w:r>
+        <w:t xml:space="preserve"> </w:t>
+      </w:r>
+      <w:r>
+        <w:t xml:space="preserve">(Lande 1996)</w:t>
+      </w:r>
+      <w:r>
+        <w:t xml:space="preserve">. Examining these components allows ecologists to disentangle whether regional diversity is primarily governed by fine-scale local processes or broader spatial heterogeneity</w:t>
+      </w:r>
+      <w:r>
+        <w:t xml:space="preserve"> </w:t>
+      </w:r>
+      <w:r>
+        <w:t xml:space="preserve">(Crist et al. 2003, Tuomisto 2010)</w:t>
+      </w:r>
+      <w:r>
+        <w:t xml:space="preserve">.</w:t>
+      </w:r>
+      <w:r>
+        <w:t xml:space="preserve"> </w:t>
+      </w:r>
+      <w:r>
+        <w:t xml:space="preserve">Beta diversity itself reflects the variation in species composition among sites and is driven by two distinct ecological phenomena: turnover (species replacement) and nestedness (richness differences)</w:t>
+      </w:r>
+      <w:r>
+        <w:t xml:space="preserve"> </w:t>
+      </w:r>
+      <w:r>
         <w:t xml:space="preserve">(Baselga 2010)</w:t>
       </w:r>
       <w:r>
-        <w:t xml:space="preserve">. Turnover is the replacement of some species by different species from one site to another, while nestedness is the loss or gain of species where poorer sites contain a strict subset of the species found at richer sites.</w:t>
+        <w:t xml:space="preserve">. Species turnover occurs when species are replaced by different species along environmental or spatial gradients, usually driven by environmental filtering, competitive exclusion, or dispersal limitation</w:t>
+      </w:r>
+      <w:r>
+        <w:t xml:space="preserve"> </w:t>
+      </w:r>
+      <w:r>
+        <w:t xml:space="preserve">(Baselga 2010, Tuomisto 2010)</w:t>
+      </w:r>
+      <w:r>
+        <w:t xml:space="preserve">. In contrast, nestedness occurs when communities at species-poor sites are non-random subsets of those at species-rich sites</w:t>
+      </w:r>
+      <w:r>
+        <w:t xml:space="preserve"> </w:t>
+      </w:r>
+      <w:r>
+        <w:t xml:space="preserve">(Baselga 2010)</w:t>
+      </w:r>
+      <w:r>
+        <w:t xml:space="preserve">. Nested patterns typically stem from deterministic processes such as selective extinction, differential colonization capacity, or habitat fragmentation that sequentially eliminate sensitive taxa while retaining tolerant generalists</w:t>
+      </w:r>
+      <w:r>
+        <w:t xml:space="preserve"> </w:t>
+      </w:r>
+      <w:r>
+        <w:t xml:space="preserve">(Veech et al. 2003, Baselga 2010)</w:t>
+      </w:r>
+      <w:r>
+        <w:t xml:space="preserve">.</w:t>
       </w:r>
     </w:p>
     <w:p>
@@ -559,57 +637,25 @@
         <w:pStyle w:val="TextBody"/>
       </w:pPr>
       <w:r>
-        <w:t xml:space="preserve">Total regional species richness (</w:t>
-      </w:r>
-      <m:oMath>
-        <m:r>
-          <m:t>γ</m:t>
-        </m:r>
-      </m:oMath>
-      <w:r>
-        <w:t xml:space="preserve">-diversity) can be hierarchically partitioned into its additive components: local richness (</w:t>
-      </w:r>
-      <m:oMath>
-        <m:r>
-          <m:t>α</m:t>
-        </m:r>
-      </m:oMath>
-      <w:r>
-        <w:t xml:space="preserve">-diversity) and species turnover among assemblages (</w:t>
-      </w:r>
-      <m:oMath>
-        <m:r>
-          <m:t>β</m:t>
-        </m:r>
-      </m:oMath>
-      <w:r>
-        <w:t xml:space="preserve">-diversity) across spatial or temporal scales</w:t>
+        <w:t xml:space="preserve">Evaluating the relative contribution of turnover and nestedness—alongside null models using Standardized Effect Sizes (SES)—provides critical insights into assembly rules and conservation prioritization</w:t>
       </w:r>
       <w:r>
         <w:t xml:space="preserve"> </w:t>
       </w:r>
       <w:r>
-        <w:t xml:space="preserve">(Lande 1996)</w:t>
-      </w:r>
-      <w:r>
-        <w:t xml:space="preserve">. Examining these components allows ecologists to disentangle whether regional diversity is primarily governed by fine-scale local processes or broader spatial heterogeneity</w:t>
+        <w:t xml:space="preserve">(Gotelli and McCabe 2002, Gering et al. 2003)</w:t>
+      </w:r>
+      <w:r>
+        <w:t xml:space="preserve">. A pattern dominated by turnover (SES &gt; 0) implies strong ecological differentiation and high beta diversity, signaling that distinct localities host unique biological assemblages</w:t>
       </w:r>
       <w:r>
         <w:t xml:space="preserve"> </w:t>
       </w:r>
       <w:r>
-        <w:t xml:space="preserve">(Crist et al. 2003, Tuomisto 2010)</w:t>
-      </w:r>
-      <w:r>
-        <w:t xml:space="preserve">. Beta diversity (</w:t>
-      </w:r>
-      <m:oMath>
-        <m:r>
-          <m:t>β</m:t>
-        </m:r>
-      </m:oMath>
-      <w:r>
-        <w:t xml:space="preserve">) itself reflects the variation in species composition among sites and is driven by two distinct ecological phenomena: turnover (species replacement) and nestedness (richness differences)</w:t>
+        <w:t xml:space="preserve">(Baselga 2010)</w:t>
+      </w:r>
+      <w:r>
+        <w:t xml:space="preserve">. From a conservation perspective, high turnover necessitates a network-wide preservation strategy, as multiple sites must be protected to encompass regional biodiversity</w:t>
       </w:r>
       <w:r>
         <w:t xml:space="preserve"> </w:t>
@@ -618,115 +664,7 @@
         <w:t xml:space="preserve">(Baselga 2010)</w:t>
       </w:r>
       <w:r>
-        <w:t xml:space="preserve">. Species turnover occurs when species are replaced by different species along environmental or spatial gradients, usually driven by environmental filtering, competitive exclusion, or dispersal limitation</w:t>
-      </w:r>
-      <w:r>
-        <w:t xml:space="preserve"> </w:t>
-      </w:r>
-      <w:r>
-        <w:t xml:space="preserve">(Baselga 2010, Tuomisto 2010)</w:t>
-      </w:r>
-      <w:r>
-        <w:t xml:space="preserve">. In contrast, nestedness occurs when communities at species-poor sites are non-random subsets of those at species-rich sites</w:t>
-      </w:r>
-      <w:r>
-        <w:t xml:space="preserve"> </w:t>
-      </w:r>
-      <w:r>
-        <w:t xml:space="preserve">(Baselga 2010)</w:t>
-      </w:r>
-      <w:r>
-        <w:t xml:space="preserve">. Nested patterns typically stem from deterministic processes such as selective extinction, differential colonization capacity, or habitat fragmentation that sequentially eliminate sensitive taxa while retaining tolerant generalists</w:t>
-      </w:r>
-      <w:r>
-        <w:t xml:space="preserve"> </w:t>
-      </w:r>
-      <w:r>
-        <w:t xml:space="preserve">(Baselga 2010)</w:t>
-      </w:r>
-      <w:r>
-        <w:t xml:space="preserve">. Evaluating the relative contribution of turnover and nestedness—alongside null models using Standardized Effect Sizes (</w:t>
-      </w:r>
-      <m:oMath>
-        <m:r>
-          <m:rPr>
-            <m:nor/>
-            <m:sty m:val="p"/>
-          </m:rPr>
-          <m:t>SES</m:t>
-        </m:r>
-      </m:oMath>
-      <w:r>
-        <w:t xml:space="preserve">)—provides critical insights into assembly rules and conservation prioritization</w:t>
-      </w:r>
-      <w:r>
-        <w:t xml:space="preserve"> </w:t>
-      </w:r>
-      <w:r>
-        <w:t xml:space="preserve">(Gotelli and McCabe 2002, Baselga 2010)</w:t>
-      </w:r>
-      <w:r>
-        <w:t xml:space="preserve">. A pattern dominated by turnover (</w:t>
-      </w:r>
-      <m:oMath>
-        <m:r>
-          <m:rPr>
-            <m:nor/>
-            <m:sty m:val="p"/>
-          </m:rPr>
-          <m:t>SES</m:t>
-        </m:r>
-        <m:r>
-          <m:rPr>
-            <m:sty m:val="p"/>
-          </m:rPr>
-          <m:t>&gt;</m:t>
-        </m:r>
-        <m:r>
-          <m:t>0</m:t>
-        </m:r>
-      </m:oMath>
-      <w:r>
-        <w:t xml:space="preserve">) implies strong ecological differentiation and high beta diversity, signaling that distinct localities host unique biological assemblages</w:t>
-      </w:r>
-      <w:r>
-        <w:t xml:space="preserve"> </w:t>
-      </w:r>
-      <w:r>
-        <w:t xml:space="preserve">(Baselga 2010)</w:t>
-      </w:r>
-      <w:r>
-        <w:t xml:space="preserve">. From a conservation perspective, high turnover necessitates a network-wide preservation strategy, as multiple sites must be protected to encompass regional biodiversity</w:t>
-      </w:r>
-      <w:r>
-        <w:t xml:space="preserve"> </w:t>
-      </w:r>
-      <w:r>
-        <w:t xml:space="preserve">(Baselga 2010)</w:t>
-      </w:r>
-      <w:r>
-        <w:t xml:space="preserve">. Conversely, a system dominated by nestedness or fine-scale homogenization (</w:t>
-      </w:r>
-      <m:oMath>
-        <m:r>
-          <m:rPr>
-            <m:nor/>
-            <m:sty m:val="p"/>
-          </m:rPr>
-          <m:t>SES</m:t>
-        </m:r>
-        <m:r>
-          <m:rPr>
-            <m:sty m:val="p"/>
-          </m:rPr>
-          <m:t>&lt;</m:t>
-        </m:r>
-        <m:r>
-          <m:t>0</m:t>
-        </m:r>
-      </m:oMath>
-      <w:r>
-        <w:t xml:space="preserve">) indicates that local assemblages are nested sub-collections of regional species pools. Under a nested regime, management efforts are most effectively concentrated on protecting the largest or highest-quality species-rich sites, which inherently harbor the vast majority of the regional pool</w:t>
+        <w:t xml:space="preserve">. Conversely, a system dominated by nestedness or fine-scale homogenization (SES &lt; 0) indicates that local assemblages are nested sub-collections of regional species pools. Under a nested regime, management efforts are most effectively concentrated on protecting the largest or highest-quality species-rich sites, which inherently harbor the vast majority of the regional pool</w:t>
       </w:r>
       <w:r>
         <w:t xml:space="preserve"> </w:t>
@@ -743,98 +681,74 @@
         <w:pStyle w:val="TextBody"/>
       </w:pPr>
       <w:r>
-        <w:t xml:space="preserve">CITAR:</w:t>
+        <w:t xml:space="preserve">This study describes the richness and density of zooplankton, comparatively between two small head water streams subject to different levels of environmental pressures. One originates withing a protected area - Biological Reserve, or REBIO, according to</w:t>
       </w:r>
       <w:r>
         <w:t xml:space="preserve"> </w:t>
       </w:r>
       <w:r>
-        <w:t xml:space="preserve">(Gering et al. 2003, Crist et al. 2003, Veech et al. 2003, Baselga 2010, 2012, Ligeiro et al. 2010, Ávila et al. 2011, Shell and Collier 2018)</w:t>
-      </w:r>
-    </w:p>
-    <w:bookmarkStart w:id="12" w:name="objectives"/>
-    <w:p>
-      <w:pPr>
-        <w:pStyle w:val="Heading2"/>
-      </w:pPr>
-      <w:r>
-        <w:t xml:space="preserve">1.1 Objectives</w:t>
-      </w:r>
-    </w:p>
-    <w:p>
-      <w:pPr>
-        <w:pStyle w:val="FirstParagraph"/>
-      </w:pPr>
-      <w:r>
-        <w:t xml:space="preserve">This study describes the richness and density of zooplankton, comparatively between two small head water streams subject to different levels of environmental pressures. One originates withing a protected area - Biological Reserve, or REBIO, according to</w:t>
+        <w:t xml:space="preserve">BRASIL (2000)</w:t>
       </w:r>
       <w:r>
         <w:t xml:space="preserve"> </w:t>
       </w:r>
       <w:r>
-        <w:t xml:space="preserve">BRASIL (2000)</w:t>
+        <w:t xml:space="preserve">- and its course extends beyond its administrative boundaries</w:t>
       </w:r>
       <w:r>
         <w:t xml:space="preserve"> </w:t>
       </w:r>
       <w:r>
-        <w:t xml:space="preserve">- and its course extends beyond its administrative boundaries</w:t>
+        <w:t xml:space="preserve">(MMA 2003)</w:t>
+      </w:r>
+      <w:r>
+        <w:t xml:space="preserve">, and a second one that flows entirely outside of the protected area. Within this framework, we use hierarchical additive partitioning to evaluate the relative contribution of different spatial and temporal scales to the diversity of zooplankton assemblages. Given the importance of the Atlantic Forest to the biodiversity</w:t>
       </w:r>
       <w:r>
         <w:t xml:space="preserve"> </w:t>
       </w:r>
       <w:r>
-        <w:t xml:space="preserve">(MMA 2003)</w:t>
-      </w:r>
-      <w:r>
-        <w:t xml:space="preserve">, and a second one that flows entirely outside of the protected area. Within this framework, we use hierarchical additive partitioning to evaluate the relative contribution of different spatial and temporal scales to the diversity of zooplankton assemblages. Given the importance of the Atlantic Forest to the biodiversity</w:t>
+        <w:t xml:space="preserve">(Pereira et al. 2026)</w:t>
       </w:r>
       <w:r>
         <w:t xml:space="preserve"> </w:t>
       </w:r>
       <w:r>
-        <w:t xml:space="preserve">(Pereira et al. 2026)</w:t>
+        <w:t xml:space="preserve">and its fragmented stated north of the São Francisco river basin</w:t>
       </w:r>
       <w:r>
         <w:t xml:space="preserve"> </w:t>
       </w:r>
       <w:r>
-        <w:t xml:space="preserve">and its fragmented stated north of the São Francisco river basin</w:t>
+        <w:t xml:space="preserve">(Silva and Casteleti 2003)</w:t>
+      </w:r>
+      <w:r>
+        <w:t xml:space="preserve">, we aim with this study, (1) to infer environmental degradation from species turnover</w:t>
       </w:r>
       <w:r>
         <w:t xml:space="preserve"> </w:t>
       </w:r>
       <w:r>
-        <w:t xml:space="preserve">(Silva and Casteleti 2003)</w:t>
-      </w:r>
-      <w:r>
-        <w:t xml:space="preserve">, we aim with this study, (1) to infer environmental degradation from species turnover</w:t>
+        <w:t xml:space="preserve">(Baselga 2010)</w:t>
       </w:r>
       <w:r>
         <w:t xml:space="preserve"> </w:t>
       </w:r>
       <w:r>
-        <w:t xml:space="preserve">(Baselga 2010)</w:t>
+        <w:t xml:space="preserve">and (2) to associate beta-diversity to the ecological health of sites inside and surrounding a protected area of Atlantic Forest. Given the expected different levels of environmental pressures in the area</w:t>
       </w:r>
       <w:r>
         <w:t xml:space="preserve"> </w:t>
       </w:r>
       <w:r>
-        <w:t xml:space="preserve">and (2) to associate beta-diversity to the ecological health of sites inside and surrounding a protected area of Atlantic Forest. Given the expected different levels of environmental pressures in the area</w:t>
-      </w:r>
-      <w:r>
-        <w:t xml:space="preserve"> </w:t>
-      </w:r>
-      <w:r>
         <w:t xml:space="preserve">(Gouveia et al. 2017)</w:t>
       </w:r>
       <w:r>
-        <w:t xml:space="preserve">, we hypothesize that the diversity is not be homogeneously distributed among the different spatial scales but concentrated at the finer levels and seasonal variation will be limited to species composition, but no spacial variation is expected between dry and wet seasons. Some environmental features (reach morphology, habitat structure, and water quality) are also described to explore possible explaining factors for the observed patterns. Ultimately, this study generates key baseline data on the ecological condition of the studied streams and the ecological mechanisms structuring zooplankton communities, contributing to safer conservation strategies in Atlantic Forest remnants.</w:t>
+        <w:t xml:space="preserve">, we hypothesize that the diversity is not be homogeneously distributed among the different spatial scales but concentrated at the finer levels and seasonal variation will be limited to species composition, but no spacial variation is expected between dry and wet seasons. Some environmental features (reach morphology, habitat structure, and water quality) are also described to explore possible explaining factors for the observed patterns. Ultimately, this study intends to generate key baseline data on the ecological condition of the studied streams and the ecological mechanisms structuring zooplankton communities, contributing to optimal conservation strategies in Atlantic Forest streams.</w:t>
       </w:r>
     </w:p>
     <w:bookmarkEnd w:id="12"/>
-    <w:bookmarkEnd w:id="13"/>
-    <w:bookmarkStart w:id="18" w:name="material-and-methods"/>
+    <w:bookmarkStart w:id="17" w:name="material-and-methods"/>
     <w:p>
       <w:pPr>
         <w:pStyle w:val="Heading1"/>
@@ -843,7 +757,7 @@
         <w:t xml:space="preserve">2. Material and methods</w:t>
       </w:r>
     </w:p>
-    <w:bookmarkStart w:id="14" w:name="study-area-and-sampling-design"/>
+    <w:bookmarkStart w:id="13" w:name="study-area-and-sampling-design"/>
     <w:p>
       <w:pPr>
         <w:pStyle w:val="Heading2"/>
@@ -975,8 +889,8 @@
         <w:t xml:space="preserve">). Sampling was conducted during the dry (January-February) and wet (June-July) seasons of 2024.</w:t>
       </w:r>
     </w:p>
-    <w:bookmarkEnd w:id="14"/>
-    <w:bookmarkStart w:id="15" w:name="environmental-data-collection"/>
+    <w:bookmarkEnd w:id="13"/>
+    <w:bookmarkStart w:id="14" w:name="environmental-data-collection"/>
     <w:p>
       <w:pPr>
         <w:pStyle w:val="Heading2"/>
@@ -1073,8 +987,8 @@
         <w:t xml:space="preserve">.</w:t>
       </w:r>
     </w:p>
-    <w:bookmarkEnd w:id="15"/>
-    <w:bookmarkStart w:id="16" w:name="zooplankton-sampling"/>
+    <w:bookmarkEnd w:id="14"/>
+    <w:bookmarkStart w:id="15" w:name="zooplankton-sampling"/>
     <w:p>
       <w:pPr>
         <w:pStyle w:val="Heading2"/>
@@ -1118,8 +1032,8 @@
         <w:t xml:space="preserve">.</w:t>
       </w:r>
     </w:p>
-    <w:bookmarkEnd w:id="16"/>
-    <w:bookmarkStart w:id="17" w:name="statistical-analyses"/>
+    <w:bookmarkEnd w:id="15"/>
+    <w:bookmarkStart w:id="16" w:name="statistical-analyses"/>
     <w:p>
       <w:pPr>
         <w:pStyle w:val="Heading2"/>
@@ -1810,9 +1724,9 @@
         <w:t xml:space="preserve">.</w:t>
       </w:r>
     </w:p>
+    <w:bookmarkEnd w:id="16"/>
     <w:bookmarkEnd w:id="17"/>
-    <w:bookmarkEnd w:id="18"/>
-    <w:bookmarkStart w:id="19" w:name="results"/>
+    <w:bookmarkStart w:id="18" w:name="results"/>
     <w:p>
       <w:pPr>
         <w:pStyle w:val="Heading1"/>
@@ -3599,8 +3513,8 @@
         <w:t xml:space="preserve">-values). These positive effect sizes confirm that spatial species turnover among sites is the primary driver structuring zooplankton assemblages within both streams regardless of seasonality.</w:t>
       </w:r>
     </w:p>
-    <w:bookmarkEnd w:id="19"/>
-    <w:bookmarkStart w:id="20" w:name="discussion"/>
+    <w:bookmarkEnd w:id="18"/>
+    <w:bookmarkStart w:id="19" w:name="discussion"/>
     <w:p>
       <w:pPr>
         <w:pStyle w:val="Heading1"/>
@@ -3617,8 +3531,45 @@
         <w:t xml:space="preserve">Depth and width showed greater variations across sites as a result from the fact the streams are barred at some points from roads for local traffic and small dams for water storage. Stream width and depth showed greater variations reflecting the range of habitats along the study streams, from small and narrow streams to wider and deeper manmade reservoirs.</w:t>
       </w:r>
     </w:p>
-    <w:bookmarkEnd w:id="20"/>
-    <w:bookmarkStart w:id="21" w:name="conclusions"/>
+    <w:p>
+      <w:pPr>
+        <w:pStyle w:val="TextBody"/>
+      </w:pPr>
+      <w:r>
+        <w:t xml:space="preserve">–&gt;</w:t>
+      </w:r>
+      <w:r>
+        <w:t xml:space="preserve"> </w:t>
+      </w:r>
+      <w:r>
+        <w:t xml:space="preserve">Bush et al. (2016)</w:t>
+      </w:r>
+      <w:r>
+        <w:t xml:space="preserve">;</w:t>
+      </w:r>
+      <w:r>
+        <w:t xml:space="preserve"> </w:t>
+      </w:r>
+      <w:r>
+        <w:t xml:space="preserve">Socolar et al. (2016)</w:t>
+      </w:r>
+    </w:p>
+    <w:p>
+      <w:pPr>
+        <w:pStyle w:val="TextBody"/>
+      </w:pPr>
+      <w:r>
+        <w:t xml:space="preserve">To be effective, diversity conservation must be multi-scaled, targeting local and regional processes. See</w:t>
+      </w:r>
+      <w:r>
+        <w:t xml:space="preserve"> </w:t>
+      </w:r>
+      <w:r>
+        <w:t xml:space="preserve">(Wishart and Davies 2003, Cheung and Burrows 2024, Bedrij et al. 2026)</w:t>
+      </w:r>
+    </w:p>
+    <w:bookmarkEnd w:id="19"/>
+    <w:bookmarkStart w:id="20" w:name="conclusions"/>
     <w:p>
       <w:pPr>
         <w:pStyle w:val="Heading1"/>
@@ -3627,8 +3578,8 @@
         <w:t xml:space="preserve">Conclusions</w:t>
       </w:r>
     </w:p>
-    <w:bookmarkEnd w:id="21"/>
-    <w:bookmarkStart w:id="22" w:name="acknowledgements"/>
+    <w:bookmarkEnd w:id="20"/>
+    <w:bookmarkStart w:id="21" w:name="acknowledgements"/>
     <w:p>
       <w:pPr>
         <w:pStyle w:val="Heading1"/>
@@ -3645,8 +3596,8 @@
         <w:t xml:space="preserve">We are greatly indebted to the staff of the REBIO Guaribas for field work assistance. LCA is grateful to Programa de Pós-Graduação em Ecologia e Conservação (PPGEC-UEPB) and CAPES for scholarship granted. EGS, MMSM and MVBS are grateful to Programa de Iniciação Científica (PIBIC-UEPB) and CNPq for scholarship granted.</w:t>
       </w:r>
     </w:p>
-    <w:bookmarkEnd w:id="22"/>
-    <w:bookmarkStart w:id="23" w:name="authorship-contribution-statement"/>
+    <w:bookmarkEnd w:id="21"/>
+    <w:bookmarkStart w:id="22" w:name="authorship-contribution-statement"/>
     <w:p>
       <w:pPr>
         <w:pStyle w:val="Heading1"/>
@@ -3712,8 +3663,8 @@
         <w:t xml:space="preserve">Elvio Sergio Figueredo Medeiros: Conceptualization, Data Curation, Formal Analysis, Funding Acquisition, Investigation, Methodology, Project Administration, Resources, Software, Supervision, Validation, Visualization, Writing – original draft, Writing – review &amp; editing.</w:t>
       </w:r>
     </w:p>
-    <w:bookmarkEnd w:id="23"/>
-    <w:bookmarkStart w:id="24" w:name="ethical-approval"/>
+    <w:bookmarkEnd w:id="22"/>
+    <w:bookmarkStart w:id="23" w:name="ethical-approval"/>
     <w:p>
       <w:pPr>
         <w:pStyle w:val="Heading1"/>
@@ -3730,8 +3681,8 @@
         <w:t xml:space="preserve">Activities inside the REBIO Guaribas were authorized by the Instituto Chico Mendes de Conservação da Biodiversidade (license no. SISBIO-89415-1, SISBIO-89429-2 and SISBIO-89415-2).</w:t>
       </w:r>
     </w:p>
-    <w:bookmarkEnd w:id="24"/>
-    <w:bookmarkStart w:id="25" w:name="X1f74eb43af444059c7518034463b6c89b1cacf4"/>
+    <w:bookmarkEnd w:id="23"/>
+    <w:bookmarkStart w:id="24" w:name="X1f74eb43af444059c7518034463b6c89b1cacf4"/>
     <w:p>
       <w:pPr>
         <w:pStyle w:val="Heading1"/>
@@ -3757,8 +3708,8 @@
         <w:t xml:space="preserve">.</w:t>
       </w:r>
     </w:p>
-    <w:bookmarkEnd w:id="25"/>
-    <w:bookmarkStart w:id="176" w:name="references"/>
+    <w:bookmarkEnd w:id="24"/>
+    <w:bookmarkStart w:id="191" w:name="references"/>
     <w:p>
       <w:pPr>
         <w:pStyle w:val="Heading1"/>
@@ -3767,8 +3718,8 @@
         <w:t xml:space="preserve">References</w:t>
       </w:r>
     </w:p>
-    <w:bookmarkStart w:id="175" w:name="refs"/>
-    <w:bookmarkStart w:id="27" w:name="ref-akhyar2026"/>
+    <w:bookmarkStart w:id="190" w:name="refs"/>
+    <w:bookmarkStart w:id="26" w:name="ref-akhyar2026"/>
     <w:p>
       <w:pPr>
         <w:pStyle w:val="Bibliography"/>
@@ -3779,7 +3730,7 @@
       <w:r>
         <w:t xml:space="preserve"> </w:t>
       </w:r>
-      <w:hyperlink r:id="rId26">
+      <w:hyperlink r:id="rId25">
         <w:r>
           <w:rPr>
             <w:rStyle w:val="Hyperlink"/>
@@ -3791,8 +3742,8 @@
         <w:t xml:space="preserve">. Biodiversity and Conservation 35:79.</w:t>
       </w:r>
     </w:p>
-    <w:bookmarkEnd w:id="27"/>
-    <w:bookmarkStart w:id="29" w:name="ref-altindag2025"/>
+    <w:bookmarkEnd w:id="26"/>
+    <w:bookmarkStart w:id="28" w:name="ref-altindag2025"/>
     <w:p>
       <w:pPr>
         <w:pStyle w:val="Bibliography"/>
@@ -3803,7 +3754,7 @@
       <w:r>
         <w:t xml:space="preserve"> </w:t>
       </w:r>
-      <w:hyperlink r:id="rId28">
+      <w:hyperlink r:id="rId27">
         <w:r>
           <w:rPr>
             <w:rStyle w:val="Hyperlink"/>
@@ -3815,19 +3766,43 @@
         <w:t xml:space="preserve">. Desalination and Water Treatment 321:100991.</w:t>
       </w:r>
     </w:p>
-    <w:bookmarkEnd w:id="29"/>
-    <w:bookmarkStart w:id="31" w:name="ref-anderson2013"/>
+    <w:bookmarkEnd w:id="28"/>
+    <w:bookmarkStart w:id="30" w:name="ref-amaral2024"/>
     <w:p>
       <w:pPr>
         <w:pStyle w:val="Bibliography"/>
       </w:pPr>
       <w:r>
+        <w:t xml:space="preserve">Amaral, D. C., F. De Fátima Bomfim, and F. A. Lansac-Tôha. 2024.</w:t>
+      </w:r>
+      <w:r>
+        <w:t xml:space="preserve"> </w:t>
+      </w:r>
+      <w:hyperlink r:id="rId29">
+        <w:r>
+          <w:rPr>
+            <w:rStyle w:val="Hyperlink"/>
+          </w:rPr>
+          <w:t xml:space="preserve">Drivers of zooplankton functional and taxonomic β-diversity in two neotropical floodplains: Implications for conservation</w:t>
+        </w:r>
+      </w:hyperlink>
+      <w:r>
+        <w:t xml:space="preserve">. Biodiversity and Conservation 33:3905–3922.</w:t>
+      </w:r>
+    </w:p>
+    <w:bookmarkEnd w:id="30"/>
+    <w:bookmarkStart w:id="32" w:name="ref-anderson2013"/>
+    <w:p>
+      <w:pPr>
+        <w:pStyle w:val="Bibliography"/>
+      </w:pPr>
+      <w:r>
         <w:t xml:space="preserve">Anderson, M. J., and D. C. I. Walsh. 2013.</w:t>
       </w:r>
       <w:r>
         <w:t xml:space="preserve"> </w:t>
       </w:r>
-      <w:hyperlink r:id="rId30">
+      <w:hyperlink r:id="rId31">
         <w:r>
           <w:rPr>
             <w:rStyle w:val="Hyperlink"/>
@@ -3839,8 +3814,8 @@
         <w:t xml:space="preserve"> Ecological Monographs 83:557574.</w:t>
       </w:r>
     </w:p>
-    <w:bookmarkEnd w:id="31"/>
-    <w:bookmarkStart w:id="33" w:name="ref-apha1998"/>
+    <w:bookmarkEnd w:id="32"/>
+    <w:bookmarkStart w:id="34" w:name="ref-apha1998"/>
     <w:p>
       <w:pPr>
         <w:pStyle w:val="Bibliography"/>
@@ -3851,7 +3826,7 @@
       <w:r>
         <w:t xml:space="preserve"> </w:t>
       </w:r>
-      <w:hyperlink r:id="rId32">
+      <w:hyperlink r:id="rId33">
         <w:r>
           <w:rPr>
             <w:rStyle w:val="Hyperlink"/>
@@ -3863,8 +3838,8 @@
         <w:t xml:space="preserve">. American Public Health Association, Washington, DC.</w:t>
       </w:r>
     </w:p>
-    <w:bookmarkEnd w:id="33"/>
-    <w:bookmarkStart w:id="35" w:name="ref-arruda2013"/>
+    <w:bookmarkEnd w:id="34"/>
+    <w:bookmarkStart w:id="36" w:name="ref-arruda2013"/>
     <w:p>
       <w:pPr>
         <w:pStyle w:val="Bibliography"/>
@@ -3875,7 +3850,7 @@
       <w:r>
         <w:t xml:space="preserve"> </w:t>
       </w:r>
-      <w:hyperlink r:id="rId34">
+      <w:hyperlink r:id="rId35">
         <w:r>
           <w:rPr>
             <w:rStyle w:val="Hyperlink"/>
@@ -3887,8 +3862,8 @@
         <w:t xml:space="preserve">. Revista Direitos Emergentes na Sociedade Global 2:280–304.</w:t>
       </w:r>
     </w:p>
-    <w:bookmarkEnd w:id="35"/>
-    <w:bookmarkStart w:id="37" w:name="ref-ávila2011"/>
+    <w:bookmarkEnd w:id="36"/>
+    <w:bookmarkStart w:id="38" w:name="ref-ávila2011"/>
     <w:p>
       <w:pPr>
         <w:pStyle w:val="Bibliography"/>
@@ -3899,7 +3874,7 @@
       <w:r>
         <w:t xml:space="preserve"> </w:t>
       </w:r>
-      <w:hyperlink r:id="rId36">
+      <w:hyperlink r:id="rId37">
         <w:r>
           <w:rPr>
             <w:rStyle w:val="Hyperlink"/>
@@ -3911,8 +3886,8 @@
         <w:t xml:space="preserve">. Wetlands 31:459–469.</w:t>
       </w:r>
     </w:p>
-    <w:bookmarkEnd w:id="37"/>
-    <w:bookmarkStart w:id="39" w:name="ref-balkic2022"/>
+    <w:bookmarkEnd w:id="38"/>
+    <w:bookmarkStart w:id="40" w:name="ref-balkic2022"/>
     <w:p>
       <w:pPr>
         <w:pStyle w:val="Bibliography"/>
@@ -3923,7 +3898,7 @@
       <w:r>
         <w:t xml:space="preserve"> </w:t>
       </w:r>
-      <w:hyperlink r:id="rId38">
+      <w:hyperlink r:id="rId39">
         <w:r>
           <w:rPr>
             <w:rStyle w:val="Hyperlink"/>
@@ -3935,8 +3910,8 @@
         <w:t xml:space="preserve">. Environmental Research 212:113563.</w:t>
       </w:r>
     </w:p>
-    <w:bookmarkEnd w:id="39"/>
-    <w:bookmarkStart w:id="41" w:name="ref-barboza2024"/>
+    <w:bookmarkEnd w:id="40"/>
+    <w:bookmarkStart w:id="42" w:name="ref-barboza2024"/>
     <w:p>
       <w:pPr>
         <w:pStyle w:val="Bibliography"/>
@@ -3947,7 +3922,7 @@
       <w:r>
         <w:t xml:space="preserve"> </w:t>
       </w:r>
-      <w:hyperlink r:id="rId40">
+      <w:hyperlink r:id="rId41">
         <w:r>
           <w:rPr>
             <w:rStyle w:val="Hyperlink"/>
@@ -3959,8 +3934,8 @@
         <w:t xml:space="preserve">. Limnologica 106:126170.</w:t>
       </w:r>
     </w:p>
-    <w:bookmarkEnd w:id="41"/>
-    <w:bookmarkStart w:id="43" w:name="ref-baselga2010"/>
+    <w:bookmarkEnd w:id="42"/>
+    <w:bookmarkStart w:id="44" w:name="ref-baselga2010"/>
     <w:p>
       <w:pPr>
         <w:pStyle w:val="Bibliography"/>
@@ -3971,7 +3946,7 @@
       <w:r>
         <w:t xml:space="preserve"> </w:t>
       </w:r>
-      <w:hyperlink r:id="rId42">
+      <w:hyperlink r:id="rId43">
         <w:r>
           <w:rPr>
             <w:rStyle w:val="Hyperlink"/>
@@ -3983,8 +3958,8 @@
         <w:t xml:space="preserve">. Global Ecology and Biogeography 19:134–143.</w:t>
       </w:r>
     </w:p>
-    <w:bookmarkEnd w:id="43"/>
-    <w:bookmarkStart w:id="45" w:name="ref-baselga2012"/>
+    <w:bookmarkEnd w:id="44"/>
+    <w:bookmarkStart w:id="46" w:name="ref-baselga2012"/>
     <w:p>
       <w:pPr>
         <w:pStyle w:val="Bibliography"/>
@@ -3995,7 +3970,7 @@
       <w:r>
         <w:t xml:space="preserve"> </w:t>
       </w:r>
-      <w:hyperlink r:id="rId44">
+      <w:hyperlink r:id="rId45">
         <w:r>
           <w:rPr>
             <w:rStyle w:val="Hyperlink"/>
@@ -4007,19 +3982,43 @@
         <w:t xml:space="preserve">. Global Ecology and Biogeography 21:1223–1232.</w:t>
       </w:r>
     </w:p>
-    <w:bookmarkEnd w:id="45"/>
-    <w:bookmarkStart w:id="47" w:name="ref-belbin1993"/>
+    <w:bookmarkEnd w:id="46"/>
+    <w:bookmarkStart w:id="48" w:name="ref-bedrij2026"/>
     <w:p>
       <w:pPr>
         <w:pStyle w:val="Bibliography"/>
       </w:pPr>
       <w:r>
+        <w:t xml:space="preserve">Bedrij, N. A., L. Montti, H. A. Keller, L. N. López, and S. J. E. Velazco. 2026.</w:t>
+      </w:r>
+      <w:r>
+        <w:t xml:space="preserve"> </w:t>
+      </w:r>
+      <w:hyperlink r:id="rId47">
+        <w:r>
+          <w:rPr>
+            <w:rStyle w:val="Hyperlink"/>
+          </w:rPr>
+          <w:t xml:space="preserve">Beyond protected areas: The synergistic role of forest territorial planning in safeguarding tree diversity</w:t>
+        </w:r>
+      </w:hyperlink>
+      <w:r>
+        <w:t xml:space="preserve">. Biological Conservation 321:111982.</w:t>
+      </w:r>
+    </w:p>
+    <w:bookmarkEnd w:id="48"/>
+    <w:bookmarkStart w:id="50" w:name="ref-belbin1993"/>
+    <w:p>
+      <w:pPr>
+        <w:pStyle w:val="Bibliography"/>
+      </w:pPr>
+      <w:r>
         <w:t xml:space="preserve">Belbin, L., and C. McDonald. 1993.</w:t>
       </w:r>
       <w:r>
         <w:t xml:space="preserve"> </w:t>
       </w:r>
-      <w:hyperlink r:id="rId46">
+      <w:hyperlink r:id="rId49">
         <w:r>
           <w:rPr>
             <w:rStyle w:val="Hyperlink"/>
@@ -4031,8 +4030,8 @@
         <w:t xml:space="preserve">. Journal of Vegetation Science 4:341–348.</w:t>
       </w:r>
     </w:p>
-    <w:bookmarkEnd w:id="47"/>
-    <w:bookmarkStart w:id="49" w:name="ref-bonecker2013"/>
+    <w:bookmarkEnd w:id="50"/>
+    <w:bookmarkStart w:id="52" w:name="ref-bonecker2013"/>
     <w:p>
       <w:pPr>
         <w:pStyle w:val="Bibliography"/>
@@ -4043,7 +4042,7 @@
       <w:r>
         <w:t xml:space="preserve"> </w:t>
       </w:r>
-      <w:hyperlink r:id="rId48">
+      <w:hyperlink r:id="rId51">
         <w:r>
           <w:rPr>
             <w:rStyle w:val="Hyperlink"/>
@@ -4055,8 +4054,8 @@
         <w:t xml:space="preserve">. Limnologica 43:114–121.</w:t>
       </w:r>
     </w:p>
-    <w:bookmarkEnd w:id="49"/>
-    <w:bookmarkStart w:id="51" w:name="ref-brasil2000"/>
+    <w:bookmarkEnd w:id="52"/>
+    <w:bookmarkStart w:id="54" w:name="ref-brasil2000"/>
     <w:p>
       <w:pPr>
         <w:pStyle w:val="Bibliography"/>
@@ -4067,7 +4066,7 @@
       <w:r>
         <w:t xml:space="preserve"> </w:t>
       </w:r>
-      <w:hyperlink r:id="rId50">
+      <w:hyperlink r:id="rId53">
         <w:r>
           <w:rPr>
             <w:rStyle w:val="Hyperlink"/>
@@ -4076,19 +4075,67 @@
         </w:r>
       </w:hyperlink>
     </w:p>
-    <w:bookmarkEnd w:id="51"/>
-    <w:bookmarkStart w:id="53" w:name="ref-cnpq2026"/>
+    <w:bookmarkEnd w:id="54"/>
+    <w:bookmarkStart w:id="56" w:name="ref-bush2016"/>
     <w:p>
       <w:pPr>
         <w:pStyle w:val="Bibliography"/>
       </w:pPr>
       <w:r>
+        <w:t xml:space="preserve">Bush, A., T. Harwood, A. J. Hoskins, K. Mokany, and S. Ferrier. 2016.</w:t>
+      </w:r>
+      <w:r>
+        <w:t xml:space="preserve"> </w:t>
+      </w:r>
+      <w:hyperlink r:id="rId55">
+        <w:r>
+          <w:rPr>
+            <w:rStyle w:val="Hyperlink"/>
+          </w:rPr>
+          <w:t xml:space="preserve">Current uses of beta-diversity in biodiversity conservation: A response to socolar et al.</w:t>
+        </w:r>
+      </w:hyperlink>
+      <w:r>
+        <w:t xml:space="preserve"> Trends in Ecology &amp; Evolution 31:337–338.</w:t>
+      </w:r>
+    </w:p>
+    <w:bookmarkEnd w:id="56"/>
+    <w:bookmarkStart w:id="58" w:name="ref-cheung2024"/>
+    <w:p>
+      <w:pPr>
+        <w:pStyle w:val="Bibliography"/>
+      </w:pPr>
+      <w:r>
+        <w:t xml:space="preserve">Cheung, W. C. D., and R. M. Burrows. 2024.</w:t>
+      </w:r>
+      <w:r>
+        <w:t xml:space="preserve"> </w:t>
+      </w:r>
+      <w:hyperlink r:id="rId57">
+        <w:r>
+          <w:rPr>
+            <w:rStyle w:val="Hyperlink"/>
+          </w:rPr>
+          <w:t xml:space="preserve">Structural and functional indicators in freshwater ecosystem monitoring programs</w:t>
+        </w:r>
+      </w:hyperlink>
+      <w:r>
+        <w:t xml:space="preserve">. Ecological Management &amp; Restoration 25:3–13.</w:t>
+      </w:r>
+    </w:p>
+    <w:bookmarkEnd w:id="58"/>
+    <w:bookmarkStart w:id="60" w:name="ref-cnpq2026"/>
+    <w:p>
+      <w:pPr>
+        <w:pStyle w:val="Bibliography"/>
+      </w:pPr>
+      <w:r>
         <w:t xml:space="preserve">CNPq. 2026.</w:t>
       </w:r>
       <w:r>
         <w:t xml:space="preserve"> </w:t>
       </w:r>
-      <w:hyperlink r:id="rId52">
+      <w:hyperlink r:id="rId59">
         <w:r>
           <w:rPr>
             <w:rStyle w:val="Hyperlink"/>
@@ -4100,8 +4147,8 @@
         <w:t xml:space="preserve">.</w:t>
       </w:r>
     </w:p>
-    <w:bookmarkEnd w:id="53"/>
-    <w:bookmarkStart w:id="55" w:name="ref-credit2026"/>
+    <w:bookmarkEnd w:id="60"/>
+    <w:bookmarkStart w:id="62" w:name="ref-credit2026"/>
     <w:p>
       <w:pPr>
         <w:pStyle w:val="Bibliography"/>
@@ -4112,7 +4159,7 @@
       <w:r>
         <w:t xml:space="preserve"> </w:t>
       </w:r>
-      <w:hyperlink r:id="rId54">
+      <w:hyperlink r:id="rId61">
         <w:r>
           <w:rPr>
             <w:rStyle w:val="Hyperlink"/>
@@ -4124,8 +4171,8 @@
         <w:t xml:space="preserve">. NISO/CRediT Standing Committee.</w:t>
       </w:r>
     </w:p>
-    <w:bookmarkEnd w:id="55"/>
-    <w:bookmarkStart w:id="57" w:name="ref-crist2003"/>
+    <w:bookmarkEnd w:id="62"/>
+    <w:bookmarkStart w:id="64" w:name="ref-crist2003"/>
     <w:p>
       <w:pPr>
         <w:pStyle w:val="Bibliography"/>
@@ -4136,7 +4183,7 @@
       <w:r>
         <w:t xml:space="preserve"> </w:t>
       </w:r>
-      <w:hyperlink r:id="rId56">
+      <w:hyperlink r:id="rId63">
         <w:r>
           <w:rPr>
             <w:rStyle w:val="Hyperlink"/>
@@ -4148,8 +4195,8 @@
         <w:t xml:space="preserve">. The American Naturalist 162:734–743.</w:t>
       </w:r>
     </w:p>
-    <w:bookmarkEnd w:id="57"/>
-    <w:bookmarkStart w:id="59" w:name="ref-england2004"/>
+    <w:bookmarkEnd w:id="64"/>
+    <w:bookmarkStart w:id="66" w:name="ref-england2004"/>
     <w:p>
       <w:pPr>
         <w:pStyle w:val="Bibliography"/>
@@ -4160,7 +4207,7 @@
       <w:r>
         <w:t xml:space="preserve"> </w:t>
       </w:r>
-      <w:hyperlink r:id="rId58">
+      <w:hyperlink r:id="rId65">
         <w:r>
           <w:rPr>
             <w:rStyle w:val="Hyperlink"/>
@@ -4184,8 +4231,8 @@
         <w:t xml:space="preserve">. Freshwater Biology 49:721–734.</w:t>
       </w:r>
     </w:p>
-    <w:bookmarkEnd w:id="59"/>
-    <w:bookmarkStart w:id="61" w:name="ref-epa2020"/>
+    <w:bookmarkEnd w:id="66"/>
+    <w:bookmarkStart w:id="68" w:name="ref-epa2020"/>
     <w:p>
       <w:pPr>
         <w:pStyle w:val="Bibliography"/>
@@ -4196,7 +4243,7 @@
       <w:r>
         <w:t xml:space="preserve"> </w:t>
       </w:r>
-      <w:hyperlink r:id="rId60">
+      <w:hyperlink r:id="rId67">
         <w:r>
           <w:rPr>
             <w:rStyle w:val="Hyperlink"/>
@@ -4208,8 +4255,8 @@
         <w:t xml:space="preserve">.</w:t>
       </w:r>
     </w:p>
-    <w:bookmarkEnd w:id="61"/>
-    <w:bookmarkStart w:id="63" w:name="ref-farias2020"/>
+    <w:bookmarkEnd w:id="68"/>
+    <w:bookmarkStart w:id="70" w:name="ref-farias2020"/>
     <w:p>
       <w:pPr>
         <w:pStyle w:val="Bibliography"/>
@@ -4220,7 +4267,7 @@
       <w:r>
         <w:t xml:space="preserve"> </w:t>
       </w:r>
-      <w:hyperlink r:id="rId62">
+      <w:hyperlink r:id="rId69">
         <w:r>
           <w:rPr>
             <w:rStyle w:val="Hyperlink"/>
@@ -4232,8 +4279,8 @@
         <w:t xml:space="preserve">. Inland Waters 10:480–492.</w:t>
       </w:r>
     </w:p>
-    <w:bookmarkEnd w:id="63"/>
-    <w:bookmarkStart w:id="65" w:name="ref-farris1969"/>
+    <w:bookmarkEnd w:id="70"/>
+    <w:bookmarkStart w:id="72" w:name="ref-farris1969"/>
     <w:p>
       <w:pPr>
         <w:pStyle w:val="Bibliography"/>
@@ -4244,7 +4291,7 @@
       <w:r>
         <w:t xml:space="preserve"> </w:t>
       </w:r>
-      <w:hyperlink r:id="rId64">
+      <w:hyperlink r:id="rId71">
         <w:r>
           <w:rPr>
             <w:rStyle w:val="Hyperlink"/>
@@ -4256,8 +4303,8 @@
         <w:t xml:space="preserve">. Systematic Zoology 18:279.</w:t>
       </w:r>
     </w:p>
-    <w:bookmarkEnd w:id="65"/>
-    <w:bookmarkStart w:id="67" w:name="ref-fonseca1985"/>
+    <w:bookmarkEnd w:id="72"/>
+    <w:bookmarkStart w:id="74" w:name="ref-fonseca1985"/>
     <w:p>
       <w:pPr>
         <w:pStyle w:val="Bibliography"/>
@@ -4268,7 +4315,7 @@
       <w:r>
         <w:t xml:space="preserve"> </w:t>
       </w:r>
-      <w:hyperlink r:id="rId66">
+      <w:hyperlink r:id="rId73">
         <w:r>
           <w:rPr>
             <w:rStyle w:val="Hyperlink"/>
@@ -4280,8 +4327,8 @@
         <w:t xml:space="preserve">. Biological Conservation 34:17–34.</w:t>
       </w:r>
     </w:p>
-    <w:bookmarkEnd w:id="67"/>
-    <w:bookmarkStart w:id="69" w:name="ref-freiry2020"/>
+    <w:bookmarkEnd w:id="74"/>
+    <w:bookmarkStart w:id="76" w:name="ref-freiry2020"/>
     <w:p>
       <w:pPr>
         <w:pStyle w:val="Bibliography"/>
@@ -4292,7 +4339,7 @@
       <w:r>
         <w:t xml:space="preserve"> </w:t>
       </w:r>
-      <w:hyperlink r:id="rId68">
+      <w:hyperlink r:id="rId75">
         <w:r>
           <w:rPr>
             <w:rStyle w:val="Hyperlink"/>
@@ -4310,8 +4357,8 @@
         <w:t xml:space="preserve">. Hydrobiologia 847:1327–1342.</w:t>
       </w:r>
     </w:p>
-    <w:bookmarkEnd w:id="69"/>
-    <w:bookmarkStart w:id="71" w:name="ref-frissell1986"/>
+    <w:bookmarkEnd w:id="76"/>
+    <w:bookmarkStart w:id="78" w:name="ref-frissell1986"/>
     <w:p>
       <w:pPr>
         <w:pStyle w:val="Bibliography"/>
@@ -4322,7 +4369,7 @@
       <w:r>
         <w:t xml:space="preserve"> </w:t>
       </w:r>
-      <w:hyperlink r:id="rId70">
+      <w:hyperlink r:id="rId77">
         <w:r>
           <w:rPr>
             <w:rStyle w:val="Hyperlink"/>
@@ -4334,8 +4381,8 @@
         <w:t xml:space="preserve">. Environmental Management 10:199–214.</w:t>
       </w:r>
     </w:p>
-    <w:bookmarkEnd w:id="71"/>
-    <w:bookmarkStart w:id="73" w:name="ref-gering2003"/>
+    <w:bookmarkEnd w:id="78"/>
+    <w:bookmarkStart w:id="80" w:name="ref-gering2003"/>
     <w:p>
       <w:pPr>
         <w:pStyle w:val="Bibliography"/>
@@ -4346,7 +4393,7 @@
       <w:r>
         <w:t xml:space="preserve"> </w:t>
       </w:r>
-      <w:hyperlink r:id="rId72">
+      <w:hyperlink r:id="rId79">
         <w:r>
           <w:rPr>
             <w:rStyle w:val="Hyperlink"/>
@@ -4358,8 +4405,8 @@
         <w:t xml:space="preserve">. Conservation Biology 17:488–499.</w:t>
       </w:r>
     </w:p>
-    <w:bookmarkEnd w:id="73"/>
-    <w:bookmarkStart w:id="75" w:name="ref-gotelli2001"/>
+    <w:bookmarkEnd w:id="80"/>
+    <w:bookmarkStart w:id="82" w:name="ref-gotelli2001"/>
     <w:p>
       <w:pPr>
         <w:pStyle w:val="Bibliography"/>
@@ -4370,7 +4417,7 @@
       <w:r>
         <w:t xml:space="preserve"> </w:t>
       </w:r>
-      <w:hyperlink r:id="rId74">
+      <w:hyperlink r:id="rId81">
         <w:r>
           <w:rPr>
             <w:rStyle w:val="Hyperlink"/>
@@ -4382,8 +4429,8 @@
         <w:t xml:space="preserve">. Ecology Letters 4:379–391.</w:t>
       </w:r>
     </w:p>
-    <w:bookmarkEnd w:id="75"/>
-    <w:bookmarkStart w:id="77" w:name="ref-gotelli2002"/>
+    <w:bookmarkEnd w:id="82"/>
+    <w:bookmarkStart w:id="84" w:name="ref-gotelli2002"/>
     <w:p>
       <w:pPr>
         <w:pStyle w:val="Bibliography"/>
@@ -4394,7 +4441,7 @@
       <w:r>
         <w:t xml:space="preserve"> </w:t>
       </w:r>
-      <w:hyperlink r:id="rId76">
+      <w:hyperlink r:id="rId83">
         <w:r>
           <w:rPr>
             <w:rStyle w:val="Hyperlink"/>
@@ -4406,8 +4453,8 @@
         <w:t xml:space="preserve">. Ecology 83:2091–2096.</w:t>
       </w:r>
     </w:p>
-    <w:bookmarkEnd w:id="77"/>
-    <w:bookmarkStart w:id="79" w:name="ref-gouveia2017"/>
+    <w:bookmarkEnd w:id="84"/>
+    <w:bookmarkStart w:id="86" w:name="ref-gouveia2017"/>
     <w:p>
       <w:pPr>
         <w:pStyle w:val="Bibliography"/>
@@ -4418,7 +4465,7 @@
       <w:r>
         <w:t xml:space="preserve"> </w:t>
       </w:r>
-      <w:hyperlink r:id="rId78">
+      <w:hyperlink r:id="rId85">
         <w:r>
           <w:rPr>
             <w:rStyle w:val="Hyperlink"/>
@@ -4430,8 +4477,8 @@
         <w:t xml:space="preserve">. Check List 13:581–590.</w:t>
       </w:r>
     </w:p>
-    <w:bookmarkEnd w:id="79"/>
-    <w:bookmarkStart w:id="80" w:name="ref-haney1973"/>
+    <w:bookmarkEnd w:id="86"/>
+    <w:bookmarkStart w:id="87" w:name="ref-haney1973"/>
     <w:p>
       <w:pPr>
         <w:pStyle w:val="Bibliography"/>
@@ -4440,8 +4487,8 @@
         <w:t xml:space="preserve">Haney, J. F., and D. J. Hall. 1973. Sugar-coated daphnia: A preservation technique for cladocerans. Limnology and Oceanography 18:331–333.</w:t>
       </w:r>
     </w:p>
-    <w:bookmarkEnd w:id="80"/>
-    <w:bookmarkStart w:id="82" w:name="ref-heinrichs2017"/>
+    <w:bookmarkEnd w:id="87"/>
+    <w:bookmarkStart w:id="89" w:name="ref-heinrichs2017"/>
     <w:p>
       <w:pPr>
         <w:pStyle w:val="Bibliography"/>
@@ -4452,7 +4499,7 @@
       <w:r>
         <w:t xml:space="preserve"> </w:t>
       </w:r>
-      <w:hyperlink r:id="rId81">
+      <w:hyperlink r:id="rId88">
         <w:r>
           <w:rPr>
             <w:rStyle w:val="Hyperlink"/>
@@ -4480,19 +4527,43 @@
         <w:t xml:space="preserve">S. Dabbert, I. Lewandowski, J. Weiss, and A. Pyka, editors. Springer International Publishing, Cham, Switzerland.</w:t>
       </w:r>
     </w:p>
-    <w:bookmarkEnd w:id="82"/>
-    <w:bookmarkStart w:id="84" w:name="ref-jost2007"/>
+    <w:bookmarkEnd w:id="89"/>
+    <w:bookmarkStart w:id="91" w:name="ref-herbert2010"/>
     <w:p>
       <w:pPr>
         <w:pStyle w:val="Bibliography"/>
       </w:pPr>
       <w:r>
+        <w:t xml:space="preserve">Herbert, M. E., P. B. Mcintyre, P. J. Doran, J. D. Allan, and R. Abell. 2010.</w:t>
+      </w:r>
+      <w:r>
+        <w:t xml:space="preserve"> </w:t>
+      </w:r>
+      <w:hyperlink r:id="rId90">
+        <w:r>
+          <w:rPr>
+            <w:rStyle w:val="Hyperlink"/>
+          </w:rPr>
+          <w:t xml:space="preserve">Terrestrial reserve networks do not adequately represent aquatic ecosystems</w:t>
+        </w:r>
+      </w:hyperlink>
+      <w:r>
+        <w:t xml:space="preserve">. Conservation Biology 24:1002–1011.</w:t>
+      </w:r>
+    </w:p>
+    <w:bookmarkEnd w:id="91"/>
+    <w:bookmarkStart w:id="93" w:name="ref-jost2007"/>
+    <w:p>
+      <w:pPr>
+        <w:pStyle w:val="Bibliography"/>
+      </w:pPr>
+      <w:r>
         <w:t xml:space="preserve">Jost, L. 2007.</w:t>
       </w:r>
       <w:r>
         <w:t xml:space="preserve"> </w:t>
       </w:r>
-      <w:hyperlink r:id="rId83">
+      <w:hyperlink r:id="rId92">
         <w:r>
           <w:rPr>
             <w:rStyle w:val="Hyperlink"/>
@@ -4504,8 +4575,8 @@
         <w:t xml:space="preserve">. Ecology 88:2427–2439.</w:t>
       </w:r>
     </w:p>
-    <w:bookmarkEnd w:id="84"/>
-    <w:bookmarkStart w:id="86" w:name="ref-kaufman1990"/>
+    <w:bookmarkEnd w:id="93"/>
+    <w:bookmarkStart w:id="95" w:name="ref-kaufman1990"/>
     <w:p>
       <w:pPr>
         <w:pStyle w:val="Bibliography"/>
@@ -4516,7 +4587,7 @@
       <w:r>
         <w:t xml:space="preserve"> </w:t>
       </w:r>
-      <w:hyperlink r:id="rId85">
+      <w:hyperlink r:id="rId94">
         <w:r>
           <w:rPr>
             <w:rStyle w:val="Hyperlink"/>
@@ -4528,8 +4599,8 @@
         <w:t xml:space="preserve">. Pages 199–252. First edition. Wiley.</w:t>
       </w:r>
     </w:p>
-    <w:bookmarkEnd w:id="86"/>
-    <w:bookmarkStart w:id="88" w:name="ref-keppeler2004"/>
+    <w:bookmarkEnd w:id="95"/>
+    <w:bookmarkStart w:id="97" w:name="ref-keppeler2004"/>
     <w:p>
       <w:pPr>
         <w:pStyle w:val="Bibliography"/>
@@ -4540,7 +4611,7 @@
       <w:r>
         <w:t xml:space="preserve"> </w:t>
       </w:r>
-      <w:hyperlink r:id="rId87">
+      <w:hyperlink r:id="rId96">
         <w:r>
           <w:rPr>
             <w:rStyle w:val="Hyperlink"/>
@@ -4552,8 +4623,8 @@
         <w:t xml:space="preserve">. Revista Brasileira de Zoologia 21:233–241.</w:t>
       </w:r>
     </w:p>
-    <w:bookmarkEnd w:id="88"/>
-    <w:bookmarkStart w:id="90" w:name="ref-lande1996"/>
+    <w:bookmarkEnd w:id="97"/>
+    <w:bookmarkStart w:id="99" w:name="ref-lande1996"/>
     <w:p>
       <w:pPr>
         <w:pStyle w:val="Bibliography"/>
@@ -4564,7 +4635,7 @@
       <w:r>
         <w:t xml:space="preserve"> </w:t>
       </w:r>
-      <w:hyperlink r:id="rId89">
+      <w:hyperlink r:id="rId98">
         <w:r>
           <w:rPr>
             <w:rStyle w:val="Hyperlink"/>
@@ -4576,8 +4647,8 @@
         <w:t xml:space="preserve">. Oikos 76:5.</w:t>
       </w:r>
     </w:p>
-    <w:bookmarkEnd w:id="90"/>
-    <w:bookmarkStart w:id="91" w:name="ref-lê2008"/>
+    <w:bookmarkEnd w:id="99"/>
+    <w:bookmarkStart w:id="100" w:name="ref-lê2008"/>
     <w:p>
       <w:pPr>
         <w:pStyle w:val="Bibliography"/>
@@ -4586,8 +4657,8 @@
         <w:t xml:space="preserve">Lê, S., J. Josse, and F. Husson. 2008. FactoMineR: An r package for multivariate analysis. Journal of Statistical Software 25:1–18.</w:t>
       </w:r>
     </w:p>
-    <w:bookmarkEnd w:id="91"/>
-    <w:bookmarkStart w:id="92" w:name="ref-legendre1998"/>
+    <w:bookmarkEnd w:id="100"/>
+    <w:bookmarkStart w:id="101" w:name="ref-legendre1998"/>
     <w:p>
       <w:pPr>
         <w:pStyle w:val="Bibliography"/>
@@ -4596,8 +4667,8 @@
         <w:t xml:space="preserve">Legendre, P., and L. Legendre. 1998. Numerical ecology. 2nd English ed. Amsterdam, The Netherlands ; New York ; Oxford.</w:t>
       </w:r>
     </w:p>
-    <w:bookmarkEnd w:id="92"/>
-    <w:bookmarkStart w:id="94" w:name="ref-ligeiro2010"/>
+    <w:bookmarkEnd w:id="101"/>
+    <w:bookmarkStart w:id="103" w:name="ref-ligeiro2010"/>
     <w:p>
       <w:pPr>
         <w:pStyle w:val="Bibliography"/>
@@ -4608,7 +4679,7 @@
       <w:r>
         <w:t xml:space="preserve"> </w:t>
       </w:r>
-      <w:hyperlink r:id="rId93">
+      <w:hyperlink r:id="rId102">
         <w:r>
           <w:rPr>
             <w:rStyle w:val="Hyperlink"/>
@@ -4620,8 +4691,8 @@
         <w:t xml:space="preserve">. Freshwater Biology 55:424–435.</w:t>
       </w:r>
     </w:p>
-    <w:bookmarkEnd w:id="94"/>
-    <w:bookmarkStart w:id="96" w:name="ref-lôbo2011"/>
+    <w:bookmarkEnd w:id="103"/>
+    <w:bookmarkStart w:id="105" w:name="ref-lôbo2011"/>
     <w:p>
       <w:pPr>
         <w:pStyle w:val="Bibliography"/>
@@ -4632,7 +4703,7 @@
       <w:r>
         <w:t xml:space="preserve"> </w:t>
       </w:r>
-      <w:hyperlink r:id="rId95">
+      <w:hyperlink r:id="rId104">
         <w:r>
           <w:rPr>
             <w:rStyle w:val="Hyperlink"/>
@@ -4644,8 +4715,8 @@
         <w:t xml:space="preserve">. Diversity and Distributions 17:287–296.</w:t>
       </w:r>
     </w:p>
-    <w:bookmarkEnd w:id="96"/>
-    <w:bookmarkStart w:id="98" w:name="ref-lopes2014"/>
+    <w:bookmarkEnd w:id="105"/>
+    <w:bookmarkStart w:id="107" w:name="ref-lopes2014"/>
     <w:p>
       <w:pPr>
         <w:pStyle w:val="Bibliography"/>
@@ -4656,7 +4727,7 @@
       <w:r>
         <w:t xml:space="preserve"> </w:t>
       </w:r>
-      <w:hyperlink r:id="rId97">
+      <w:hyperlink r:id="rId106">
         <w:r>
           <w:rPr>
             <w:rStyle w:val="Hyperlink"/>
@@ -4668,8 +4739,8 @@
         <w:t xml:space="preserve">. PLoS ONE 9:e109581.</w:t>
       </w:r>
     </w:p>
-    <w:bookmarkEnd w:id="98"/>
-    <w:bookmarkStart w:id="100" w:name="ref-lucena2015"/>
+    <w:bookmarkEnd w:id="107"/>
+    <w:bookmarkStart w:id="109" w:name="ref-lucena2015"/>
     <w:p>
       <w:pPr>
         <w:pStyle w:val="Bibliography"/>
@@ -4680,7 +4751,7 @@
       <w:r>
         <w:t xml:space="preserve"> </w:t>
       </w:r>
-      <w:hyperlink r:id="rId99">
+      <w:hyperlink r:id="rId108">
         <w:r>
           <w:rPr>
             <w:rStyle w:val="Hyperlink"/>
@@ -4692,8 +4763,8 @@
         <w:t xml:space="preserve">. Acta Limnologica Brasiliensia 27:118–129.</w:t>
       </w:r>
     </w:p>
-    <w:bookmarkEnd w:id="100"/>
-    <w:bookmarkStart w:id="101" w:name="ref-mackereth1978"/>
+    <w:bookmarkEnd w:id="109"/>
+    <w:bookmarkStart w:id="110" w:name="ref-mackereth1978"/>
     <w:p>
       <w:pPr>
         <w:pStyle w:val="Bibliography"/>
@@ -4702,8 +4773,8 @@
         <w:t xml:space="preserve">Mackereth, F. J. H., J. Heron, and J. F. Talling. 1978. Water analysis: Some revised methods for limnologists.(scientific publication n. 36) freshwater biological association. Cumbria and Dorset, England.</w:t>
       </w:r>
     </w:p>
-    <w:bookmarkEnd w:id="101"/>
-    <w:bookmarkStart w:id="103" w:name="ref-maechler2026"/>
+    <w:bookmarkEnd w:id="110"/>
+    <w:bookmarkStart w:id="112" w:name="ref-maechler2026"/>
     <w:p>
       <w:pPr>
         <w:pStyle w:val="Bibliography"/>
@@ -4714,7 +4785,7 @@
       <w:r>
         <w:t xml:space="preserve"> </w:t>
       </w:r>
-      <w:hyperlink r:id="rId102">
+      <w:hyperlink r:id="rId111">
         <w:r>
           <w:rPr>
             <w:rStyle w:val="Hyperlink"/>
@@ -4726,8 +4797,8 @@
         <w:t xml:space="preserve">.</w:t>
       </w:r>
     </w:p>
-    <w:bookmarkEnd w:id="103"/>
-    <w:bookmarkStart w:id="105" w:name="ref-maitland1990"/>
+    <w:bookmarkEnd w:id="112"/>
+    <w:bookmarkStart w:id="114" w:name="ref-maitland1990"/>
     <w:p>
       <w:pPr>
         <w:pStyle w:val="Bibliography"/>
@@ -4738,7 +4809,7 @@
       <w:r>
         <w:t xml:space="preserve"> </w:t>
       </w:r>
-      <w:hyperlink r:id="rId104">
+      <w:hyperlink r:id="rId113">
         <w:r>
           <w:rPr>
             <w:rStyle w:val="Hyperlink"/>
@@ -4750,8 +4821,8 @@
         <w:t xml:space="preserve">. Second edition. Chapman; Hall, New York.</w:t>
       </w:r>
     </w:p>
-    <w:bookmarkEnd w:id="105"/>
-    <w:bookmarkStart w:id="107" w:name="ref-malabarba2006"/>
+    <w:bookmarkEnd w:id="114"/>
+    <w:bookmarkStart w:id="116" w:name="ref-malabarba2006"/>
     <w:p>
       <w:pPr>
         <w:pStyle w:val="Bibliography"/>
@@ -4762,7 +4833,7 @@
       <w:r>
         <w:t xml:space="preserve"> </w:t>
       </w:r>
-      <w:hyperlink r:id="rId106">
+      <w:hyperlink r:id="rId115">
         <w:r>
           <w:rPr>
             <w:rStyle w:val="Hyperlink"/>
@@ -4774,8 +4845,8 @@
         <w:t xml:space="preserve">. Neotropical Ichthyology 4:377–377.</w:t>
       </w:r>
     </w:p>
-    <w:bookmarkEnd w:id="107"/>
-    <w:bookmarkStart w:id="109" w:name="ref-maltchik2006"/>
+    <w:bookmarkEnd w:id="116"/>
+    <w:bookmarkStart w:id="118" w:name="ref-maltchik2006"/>
     <w:p>
       <w:pPr>
         <w:pStyle w:val="Bibliography"/>
@@ -4786,7 +4857,7 @@
       <w:r>
         <w:t xml:space="preserve"> </w:t>
       </w:r>
-      <w:hyperlink r:id="rId108">
+      <w:hyperlink r:id="rId117">
         <w:r>
           <w:rPr>
             <w:rStyle w:val="Hyperlink"/>
@@ -4822,8 +4893,8 @@
         <w:t xml:space="preserve">. Aquatic Conservation: Marine and Freshwater Ecosystems 16:665–677.</w:t>
       </w:r>
     </w:p>
-    <w:bookmarkEnd w:id="109"/>
-    <w:bookmarkStart w:id="111" w:name="ref-marcelino2025"/>
+    <w:bookmarkEnd w:id="118"/>
+    <w:bookmarkStart w:id="120" w:name="ref-marcelino2025"/>
     <w:p>
       <w:pPr>
         <w:pStyle w:val="Bibliography"/>
@@ -4834,7 +4905,7 @@
       <w:r>
         <w:t xml:space="preserve"> </w:t>
       </w:r>
-      <w:hyperlink r:id="rId110">
+      <w:hyperlink r:id="rId119">
         <w:r>
           <w:rPr>
             <w:rStyle w:val="Hyperlink"/>
@@ -4846,8 +4917,8 @@
         <w:t xml:space="preserve">. Acta Limnologica Brasiliensia 37:e30.</w:t>
       </w:r>
     </w:p>
-    <w:bookmarkEnd w:id="111"/>
-    <w:bookmarkStart w:id="112" w:name="ref-mccune2002"/>
+    <w:bookmarkEnd w:id="120"/>
+    <w:bookmarkStart w:id="121" w:name="ref-mccune2002"/>
     <w:p>
       <w:pPr>
         <w:pStyle w:val="Bibliography"/>
@@ -4856,8 +4927,8 @@
         <w:t xml:space="preserve">McCune, B., and J. B. Grace. 2002. Analysis of ecological communities. MjM Software Design, Gleneden Beach, Oregon, U.S.A.</w:t>
       </w:r>
     </w:p>
-    <w:bookmarkEnd w:id="112"/>
-    <w:bookmarkStart w:id="113" w:name="ref-medeiros2008"/>
+    <w:bookmarkEnd w:id="121"/>
+    <w:bookmarkStart w:id="122" w:name="ref-medeiros2008"/>
     <w:p>
       <w:pPr>
         <w:pStyle w:val="Bibliography"/>
@@ -4866,8 +4937,8 @@
         <w:t xml:space="preserve">Medeiros, E. S. F., M. J. Silva, and R. T. C. Ramos. 2008. Application of catchment- and local-scale variables for aquatic habitat characterization and assessment in the brazilian semi-arid region. Neotropical Biology and Conservation 3:13–20.</w:t>
       </w:r>
     </w:p>
-    <w:bookmarkEnd w:id="113"/>
-    <w:bookmarkStart w:id="115" w:name="ref-mehla2026"/>
+    <w:bookmarkEnd w:id="122"/>
+    <w:bookmarkStart w:id="124" w:name="ref-mehla2026"/>
     <w:p>
       <w:pPr>
         <w:pStyle w:val="Bibliography"/>
@@ -4878,7 +4949,7 @@
       <w:r>
         <w:t xml:space="preserve"> </w:t>
       </w:r>
-      <w:hyperlink r:id="rId114">
+      <w:hyperlink r:id="rId123">
         <w:r>
           <w:rPr>
             <w:rStyle w:val="Hyperlink"/>
@@ -4890,8 +4961,8 @@
         <w:t xml:space="preserve">. Water Research 307:126704.</w:t>
       </w:r>
     </w:p>
-    <w:bookmarkEnd w:id="115"/>
-    <w:bookmarkStart w:id="117" w:name="ref-melo2014"/>
+    <w:bookmarkEnd w:id="124"/>
+    <w:bookmarkStart w:id="126" w:name="ref-melo2014"/>
     <w:p>
       <w:pPr>
         <w:pStyle w:val="Bibliography"/>
@@ -4902,7 +4973,7 @@
       <w:r>
         <w:t xml:space="preserve"> </w:t>
       </w:r>
-      <w:hyperlink r:id="rId116">
+      <w:hyperlink r:id="rId125">
         <w:r>
           <w:rPr>
             <w:rStyle w:val="Hyperlink"/>
@@ -4914,8 +4985,8 @@
         <w:t xml:space="preserve">. PhD thesis, João Pessoa - PB.</w:t>
       </w:r>
     </w:p>
-    <w:bookmarkEnd w:id="117"/>
-    <w:bookmarkStart w:id="119" w:name="ref-melo2013"/>
+    <w:bookmarkEnd w:id="126"/>
+    <w:bookmarkStart w:id="128" w:name="ref-melo2013"/>
     <w:p>
       <w:pPr>
         <w:pStyle w:val="Bibliography"/>
@@ -4926,7 +4997,7 @@
       <w:r>
         <w:t xml:space="preserve"> </w:t>
       </w:r>
-      <w:hyperlink r:id="rId118">
+      <w:hyperlink r:id="rId127">
         <w:r>
           <w:rPr>
             <w:rStyle w:val="Hyperlink"/>
@@ -4938,8 +5009,8 @@
         <w:t xml:space="preserve">. International Journal of Biodiversity 2013:1–13.</w:t>
       </w:r>
     </w:p>
-    <w:bookmarkEnd w:id="119"/>
-    <w:bookmarkStart w:id="121" w:name="ref-meyer2007"/>
+    <w:bookmarkEnd w:id="128"/>
+    <w:bookmarkStart w:id="130" w:name="ref-meyer2007"/>
     <w:p>
       <w:pPr>
         <w:pStyle w:val="Bibliography"/>
@@ -4950,7 +5021,7 @@
       <w:r>
         <w:t xml:space="preserve"> </w:t>
       </w:r>
-      <w:hyperlink r:id="rId120">
+      <w:hyperlink r:id="rId129">
         <w:r>
           <w:rPr>
             <w:rStyle w:val="Hyperlink"/>
@@ -4962,8 +5033,8 @@
         <w:t xml:space="preserve">. Journal of the American Water Resources Association 43:86–103.</w:t>
       </w:r>
     </w:p>
-    <w:bookmarkEnd w:id="121"/>
-    <w:bookmarkStart w:id="123" w:name="ref-mma2003"/>
+    <w:bookmarkEnd w:id="130"/>
+    <w:bookmarkStart w:id="132" w:name="ref-mma2003"/>
     <w:p>
       <w:pPr>
         <w:pStyle w:val="Bibliography"/>
@@ -4974,7 +5045,7 @@
       <w:r>
         <w:t xml:space="preserve"> </w:t>
       </w:r>
-      <w:hyperlink r:id="rId122">
+      <w:hyperlink r:id="rId131">
         <w:r>
           <w:rPr>
             <w:rStyle w:val="Hyperlink"/>
@@ -4983,8 +5054,8 @@
         </w:r>
       </w:hyperlink>
     </w:p>
-    <w:bookmarkEnd w:id="123"/>
-    <w:bookmarkStart w:id="125" w:name="ref-mma2026"/>
+    <w:bookmarkEnd w:id="132"/>
+    <w:bookmarkStart w:id="134" w:name="ref-mma2026"/>
     <w:p>
       <w:pPr>
         <w:pStyle w:val="Bibliography"/>
@@ -4995,7 +5066,7 @@
       <w:r>
         <w:t xml:space="preserve"> </w:t>
       </w:r>
-      <w:hyperlink r:id="rId124">
+      <w:hyperlink r:id="rId133">
         <w:r>
           <w:rPr>
             <w:rStyle w:val="Hyperlink"/>
@@ -5007,8 +5078,8 @@
         <w:t xml:space="preserve">. Page 56. Mamanguape, PB.</w:t>
       </w:r>
     </w:p>
-    <w:bookmarkEnd w:id="125"/>
-    <w:bookmarkStart w:id="127" w:name="ref-mugodo2006"/>
+    <w:bookmarkEnd w:id="134"/>
+    <w:bookmarkStart w:id="136" w:name="ref-mugodo2006"/>
     <w:p>
       <w:pPr>
         <w:pStyle w:val="Bibliography"/>
@@ -5019,7 +5090,7 @@
       <w:r>
         <w:t xml:space="preserve"> </w:t>
       </w:r>
-      <w:hyperlink r:id="rId126">
+      <w:hyperlink r:id="rId135">
         <w:r>
           <w:rPr>
             <w:rStyle w:val="Hyperlink"/>
@@ -5031,8 +5102,8 @@
         <w:t xml:space="preserve">. Hydrobiologia 572:59–70.</w:t>
       </w:r>
     </w:p>
-    <w:bookmarkEnd w:id="127"/>
-    <w:bookmarkStart w:id="129" w:name="ref-myers2000"/>
+    <w:bookmarkEnd w:id="136"/>
+    <w:bookmarkStart w:id="138" w:name="ref-myers2000"/>
     <w:p>
       <w:pPr>
         <w:pStyle w:val="Bibliography"/>
@@ -5043,7 +5114,7 @@
       <w:r>
         <w:t xml:space="preserve"> </w:t>
       </w:r>
-      <w:hyperlink r:id="rId128">
+      <w:hyperlink r:id="rId137">
         <w:r>
           <w:rPr>
             <w:rStyle w:val="Hyperlink"/>
@@ -5055,8 +5126,8 @@
         <w:t xml:space="preserve">. Nature 403:853–858.</w:t>
       </w:r>
     </w:p>
-    <w:bookmarkEnd w:id="129"/>
-    <w:bookmarkStart w:id="131" w:name="ref-oksanen2020"/>
+    <w:bookmarkEnd w:id="138"/>
+    <w:bookmarkStart w:id="140" w:name="ref-oksanen2020"/>
     <w:p>
       <w:pPr>
         <w:pStyle w:val="Bibliography"/>
@@ -5067,7 +5138,7 @@
       <w:r>
         <w:t xml:space="preserve"> </w:t>
       </w:r>
-      <w:hyperlink r:id="rId130">
+      <w:hyperlink r:id="rId139">
         <w:r>
           <w:rPr>
             <w:rStyle w:val="Hyperlink"/>
@@ -5079,8 +5150,8 @@
         <w:t xml:space="preserve">. The Comprehensive R Archive Network Archive.</w:t>
       </w:r>
     </w:p>
-    <w:bookmarkEnd w:id="131"/>
-    <w:bookmarkStart w:id="133" w:name="ref-peel2007"/>
+    <w:bookmarkEnd w:id="140"/>
+    <w:bookmarkStart w:id="142" w:name="ref-peel2007"/>
     <w:p>
       <w:pPr>
         <w:pStyle w:val="Bibliography"/>
@@ -5091,7 +5162,7 @@
       <w:r>
         <w:t xml:space="preserve"> </w:t>
       </w:r>
-      <w:hyperlink r:id="rId132">
+      <w:hyperlink r:id="rId141">
         <w:r>
           <w:rPr>
             <w:rStyle w:val="Hyperlink"/>
@@ -5103,8 +5174,8 @@
         <w:t xml:space="preserve">. Hydrology and Earth System Sciences 11:1633–1644.</w:t>
       </w:r>
     </w:p>
-    <w:bookmarkEnd w:id="133"/>
-    <w:bookmarkStart w:id="135" w:name="ref-pereira2026"/>
+    <w:bookmarkEnd w:id="142"/>
+    <w:bookmarkStart w:id="144" w:name="ref-pereira2026"/>
     <w:p>
       <w:pPr>
         <w:pStyle w:val="Bibliography"/>
@@ -5115,7 +5186,7 @@
       <w:r>
         <w:t xml:space="preserve"> </w:t>
       </w:r>
-      <w:hyperlink r:id="rId134">
+      <w:hyperlink r:id="rId143">
         <w:r>
           <w:rPr>
             <w:rStyle w:val="Hyperlink"/>
@@ -5127,8 +5198,8 @@
         <w:t xml:space="preserve"> Biological Conservation 321:Article 111958.</w:t>
       </w:r>
     </w:p>
-    <w:bookmarkEnd w:id="135"/>
-    <w:bookmarkStart w:id="136" w:name="ref-pusey2004"/>
+    <w:bookmarkEnd w:id="144"/>
+    <w:bookmarkStart w:id="145" w:name="ref-pusey2004"/>
     <w:p>
       <w:pPr>
         <w:pStyle w:val="Bibliography"/>
@@ -5137,8 +5208,8 @@
         <w:t xml:space="preserve">Pusey, B. J., M. J. Kennard, and A. H. Arthington. 2004. Freshwater fishes of north-eastern australia. CSIRO Publishing, Melbourne, Australia.</w:t>
       </w:r>
     </w:p>
-    <w:bookmarkEnd w:id="136"/>
-    <w:bookmarkStart w:id="138" w:name="ref-rdevelopmentcoreteam2017"/>
+    <w:bookmarkEnd w:id="145"/>
+    <w:bookmarkStart w:id="147" w:name="ref-rdevelopmentcoreteam2017"/>
     <w:p>
       <w:pPr>
         <w:pStyle w:val="Bibliography"/>
@@ -5149,7 +5220,7 @@
       <w:r>
         <w:t xml:space="preserve"> </w:t>
       </w:r>
-      <w:hyperlink r:id="rId137">
+      <w:hyperlink r:id="rId146">
         <w:r>
           <w:rPr>
             <w:rStyle w:val="Hyperlink"/>
@@ -5161,8 +5232,8 @@
         <w:t xml:space="preserve">. R Foundation for Statistical Computing, Austria.</w:t>
       </w:r>
     </w:p>
-    <w:bookmarkEnd w:id="138"/>
-    <w:bookmarkStart w:id="140" w:name="ref-rocha2012"/>
+    <w:bookmarkEnd w:id="147"/>
+    <w:bookmarkStart w:id="149" w:name="ref-rocha2012"/>
     <w:p>
       <w:pPr>
         <w:pStyle w:val="Bibliography"/>
@@ -5173,7 +5244,7 @@
       <w:r>
         <w:t xml:space="preserve"> </w:t>
       </w:r>
-      <w:hyperlink r:id="rId139">
+      <w:hyperlink r:id="rId148">
         <w:r>
           <w:rPr>
             <w:rStyle w:val="Hyperlink"/>
@@ -5185,8 +5256,8 @@
         <w:t xml:space="preserve">. Journal of Arid Environments 85:33–40.</w:t>
       </w:r>
     </w:p>
-    <w:bookmarkEnd w:id="140"/>
-    <w:bookmarkStart w:id="142" w:name="ref-romanelli2022"/>
+    <w:bookmarkEnd w:id="149"/>
+    <w:bookmarkStart w:id="151" w:name="ref-romanelli2022"/>
     <w:p>
       <w:pPr>
         <w:pStyle w:val="Bibliography"/>
@@ -5197,7 +5268,7 @@
       <w:r>
         <w:t xml:space="preserve"> </w:t>
       </w:r>
-      <w:hyperlink r:id="rId141">
+      <w:hyperlink r:id="rId150">
         <w:r>
           <w:rPr>
             <w:rStyle w:val="Hyperlink"/>
@@ -5209,8 +5280,8 @@
         <w:t xml:space="preserve">. Science of The Total Environment 821:153403.</w:t>
       </w:r>
     </w:p>
-    <w:bookmarkEnd w:id="142"/>
-    <w:bookmarkStart w:id="144" w:name="ref-safar2020"/>
+    <w:bookmarkEnd w:id="151"/>
+    <w:bookmarkStart w:id="153" w:name="ref-safar2020"/>
     <w:p>
       <w:pPr>
         <w:pStyle w:val="Bibliography"/>
@@ -5221,7 +5292,7 @@
       <w:r>
         <w:t xml:space="preserve"> </w:t>
       </w:r>
-      <w:hyperlink r:id="rId143">
+      <w:hyperlink r:id="rId152">
         <w:r>
           <w:rPr>
             <w:rStyle w:val="Hyperlink"/>
@@ -5233,19 +5304,43 @@
         <w:t xml:space="preserve">. Forest Ecology and Management 470-471:118183.</w:t>
       </w:r>
     </w:p>
-    <w:bookmarkEnd w:id="144"/>
-    <w:bookmarkStart w:id="146" w:name="ref-saraçli2013"/>
+    <w:bookmarkEnd w:id="153"/>
+    <w:bookmarkStart w:id="155" w:name="ref-santos2024"/>
     <w:p>
       <w:pPr>
         <w:pStyle w:val="Bibliography"/>
       </w:pPr>
       <w:r>
+        <w:t xml:space="preserve">Santos, G. S., L. P. Diniz, E. E. C. Silva, T. L. T. Paula, P. C. S. Gomes, R. X. Calvi, B. L. Delfim, N. R. Simões, and E. M. Eskinazi-Sant’Anna. 2024.</w:t>
+      </w:r>
+      <w:r>
+        <w:t xml:space="preserve"> </w:t>
+      </w:r>
+      <w:hyperlink r:id="rId154">
+        <w:r>
+          <w:rPr>
+            <w:rStyle w:val="Hyperlink"/>
+          </w:rPr>
+          <w:t xml:space="preserve">What drives zooplankton taxonomic and functional β diversity? A review of brazilian rivers</w:t>
+        </w:r>
+      </w:hyperlink>
+      <w:r>
+        <w:t xml:space="preserve">. Hydrobiologia 851:1305–1318.</w:t>
+      </w:r>
+    </w:p>
+    <w:bookmarkEnd w:id="155"/>
+    <w:bookmarkStart w:id="157" w:name="ref-saraçli2013"/>
+    <w:p>
+      <w:pPr>
+        <w:pStyle w:val="Bibliography"/>
+      </w:pPr>
+      <w:r>
         <w:t xml:space="preserve">Saraçli, S., N. Doğan, and İ. Doğan. 2013.</w:t>
       </w:r>
       <w:r>
         <w:t xml:space="preserve"> </w:t>
       </w:r>
-      <w:hyperlink r:id="rId145">
+      <w:hyperlink r:id="rId156">
         <w:r>
           <w:rPr>
             <w:rStyle w:val="Hyperlink"/>
@@ -5257,8 +5352,8 @@
         <w:t xml:space="preserve">. Journal of Inequalities and Applications 2013:203.</w:t>
       </w:r>
     </w:p>
-    <w:bookmarkEnd w:id="146"/>
-    <w:bookmarkStart w:id="148" w:name="ref-shell2018"/>
+    <w:bookmarkEnd w:id="157"/>
+    <w:bookmarkStart w:id="159" w:name="ref-shell2018"/>
     <w:p>
       <w:pPr>
         <w:pStyle w:val="Bibliography"/>
@@ -5269,7 +5364,7 @@
       <w:r>
         <w:t xml:space="preserve"> </w:t>
       </w:r>
-      <w:hyperlink r:id="rId147">
+      <w:hyperlink r:id="rId158">
         <w:r>
           <w:rPr>
             <w:rStyle w:val="Hyperlink"/>
@@ -5293,8 +5388,8 @@
         <w:t xml:space="preserve">. River Research and Applications 34:993–1002.</w:t>
       </w:r>
     </w:p>
-    <w:bookmarkEnd w:id="148"/>
-    <w:bookmarkStart w:id="149" w:name="ref-silva2003"/>
+    <w:bookmarkEnd w:id="159"/>
+    <w:bookmarkStart w:id="160" w:name="ref-silva2003"/>
     <w:p>
       <w:pPr>
         <w:pStyle w:val="Bibliography"/>
@@ -5319,8 +5414,8 @@
         <w:t xml:space="preserve">C. Galindo-Leal and I. G. Câmara, editors. CABS; Island Press, Washington, DC.</w:t>
       </w:r>
     </w:p>
-    <w:bookmarkEnd w:id="149"/>
-    <w:bookmarkStart w:id="151" w:name="ref-silva2013"/>
+    <w:bookmarkEnd w:id="160"/>
+    <w:bookmarkStart w:id="162" w:name="ref-silva2013"/>
     <w:p>
       <w:pPr>
         <w:pStyle w:val="Bibliography"/>
@@ -5331,7 +5426,7 @@
       <w:r>
         <w:t xml:space="preserve"> </w:t>
       </w:r>
-      <w:hyperlink r:id="rId150">
+      <w:hyperlink r:id="rId161">
         <w:r>
           <w:rPr>
             <w:rStyle w:val="Hyperlink"/>
@@ -5343,8 +5438,8 @@
         <w:t xml:space="preserve">. PhD thesis.</w:t>
       </w:r>
     </w:p>
-    <w:bookmarkEnd w:id="151"/>
-    <w:bookmarkStart w:id="152" w:name="ref-sneath1973"/>
+    <w:bookmarkEnd w:id="162"/>
+    <w:bookmarkStart w:id="163" w:name="ref-sneath1973"/>
     <w:p>
       <w:pPr>
         <w:pStyle w:val="Bibliography"/>
@@ -5353,19 +5448,43 @@
         <w:t xml:space="preserve">Sneath, P. H. A., and R. R. Sokal. 1973. Numerical taxonomy: The principles and practice of numerical classification. First edition. W H Freeman &amp; Co.</w:t>
       </w:r>
     </w:p>
-    <w:bookmarkEnd w:id="152"/>
-    <w:bookmarkStart w:id="154" w:name="ref-sokal1962"/>
+    <w:bookmarkEnd w:id="163"/>
+    <w:bookmarkStart w:id="165" w:name="ref-socolar2016"/>
     <w:p>
       <w:pPr>
         <w:pStyle w:val="Bibliography"/>
       </w:pPr>
       <w:r>
+        <w:t xml:space="preserve">Socolar, J. B., J. J. Gilroy, W. E. Kunin, and D. P. Edwards. 2016.</w:t>
+      </w:r>
+      <w:r>
+        <w:t xml:space="preserve"> </w:t>
+      </w:r>
+      <w:hyperlink r:id="rId164">
+        <w:r>
+          <w:rPr>
+            <w:rStyle w:val="Hyperlink"/>
+          </w:rPr>
+          <w:t xml:space="preserve">How should beta-diversity inform biodiversity conservation?</w:t>
+        </w:r>
+      </w:hyperlink>
+      <w:r>
+        <w:t xml:space="preserve"> Trends in Ecology &amp; Evolution 31:67–80.</w:t>
+      </w:r>
+    </w:p>
+    <w:bookmarkEnd w:id="165"/>
+    <w:bookmarkStart w:id="167" w:name="ref-sokal1962"/>
+    <w:p>
+      <w:pPr>
+        <w:pStyle w:val="Bibliography"/>
+      </w:pPr>
+      <w:r>
         <w:t xml:space="preserve">Sokal, R. R., and F. J. Rohlf. 1962.</w:t>
       </w:r>
       <w:r>
         <w:t xml:space="preserve"> </w:t>
       </w:r>
-      <w:hyperlink r:id="rId153">
+      <w:hyperlink r:id="rId166">
         <w:r>
           <w:rPr>
             <w:rStyle w:val="Hyperlink"/>
@@ -5377,8 +5496,8 @@
         <w:t xml:space="preserve">. Taxon 11:33–40.</w:t>
       </w:r>
     </w:p>
-    <w:bookmarkEnd w:id="154"/>
-    <w:bookmarkStart w:id="155" w:name="ref-sokal1995"/>
+    <w:bookmarkEnd w:id="167"/>
+    <w:bookmarkStart w:id="168" w:name="ref-sokal1995"/>
     <w:p>
       <w:pPr>
         <w:pStyle w:val="Bibliography"/>
@@ -5387,8 +5506,8 @@
         <w:t xml:space="preserve">Sokal, R. R., and F. J. Rohlf. 1995. Biometry: The principles and practice of statistics in biological research. Third edition. W.H. Freeman; Company, New York.</w:t>
       </w:r>
     </w:p>
-    <w:bookmarkEnd w:id="155"/>
-    <w:bookmarkStart w:id="157" w:name="ref-souza2025"/>
+    <w:bookmarkEnd w:id="168"/>
+    <w:bookmarkStart w:id="170" w:name="ref-souza2025"/>
     <w:p>
       <w:pPr>
         <w:pStyle w:val="Bibliography"/>
@@ -5399,7 +5518,7 @@
       <w:r>
         <w:t xml:space="preserve"> </w:t>
       </w:r>
-      <w:hyperlink r:id="rId156">
+      <w:hyperlink r:id="rId169">
         <w:r>
           <w:rPr>
             <w:rStyle w:val="Hyperlink"/>
@@ -5429,8 +5548,8 @@
         <w:t xml:space="preserve">. Acta Limnologica Brasiliensia 37:e105.</w:t>
       </w:r>
     </w:p>
-    <w:bookmarkEnd w:id="157"/>
-    <w:bookmarkStart w:id="159" w:name="ref-strahler1957"/>
+    <w:bookmarkEnd w:id="170"/>
+    <w:bookmarkStart w:id="172" w:name="ref-strahler1957"/>
     <w:p>
       <w:pPr>
         <w:pStyle w:val="Bibliography"/>
@@ -5441,7 +5560,7 @@
       <w:r>
         <w:t xml:space="preserve"> </w:t>
       </w:r>
-      <w:hyperlink r:id="rId158">
+      <w:hyperlink r:id="rId171">
         <w:r>
           <w:rPr>
             <w:rStyle w:val="Hyperlink"/>
@@ -5453,8 +5572,8 @@
         <w:t xml:space="preserve">. Eos, Transactions American Geophysical Union 38:913–920.</w:t>
       </w:r>
     </w:p>
-    <w:bookmarkEnd w:id="159"/>
-    <w:bookmarkStart w:id="161" w:name="ref-tabarelli2010"/>
+    <w:bookmarkEnd w:id="172"/>
+    <w:bookmarkStart w:id="174" w:name="ref-tabarelli2010"/>
     <w:p>
       <w:pPr>
         <w:pStyle w:val="Bibliography"/>
@@ -5465,7 +5584,7 @@
       <w:r>
         <w:t xml:space="preserve"> </w:t>
       </w:r>
-      <w:hyperlink r:id="rId160">
+      <w:hyperlink r:id="rId173">
         <w:r>
           <w:rPr>
             <w:rStyle w:val="Hyperlink"/>
@@ -5477,8 +5596,8 @@
         <w:t xml:space="preserve">. Biological Conservation 143:2328–2340.</w:t>
       </w:r>
     </w:p>
-    <w:bookmarkEnd w:id="161"/>
-    <w:bookmarkStart w:id="163" w:name="ref-tuomisto2010"/>
+    <w:bookmarkEnd w:id="174"/>
+    <w:bookmarkStart w:id="176" w:name="ref-tuomisto2010"/>
     <w:p>
       <w:pPr>
         <w:pStyle w:val="Bibliography"/>
@@ -5489,7 +5608,7 @@
       <w:r>
         <w:t xml:space="preserve"> </w:t>
       </w:r>
-      <w:hyperlink r:id="rId162">
+      <w:hyperlink r:id="rId175">
         <w:r>
           <w:rPr>
             <w:rStyle w:val="Hyperlink"/>
@@ -5501,8 +5620,8 @@
         <w:t xml:space="preserve">. Ecography 33:23–45.</w:t>
       </w:r>
     </w:p>
-    <w:bookmarkEnd w:id="163"/>
-    <w:bookmarkStart w:id="165" w:name="ref-vancine2024"/>
+    <w:bookmarkEnd w:id="176"/>
+    <w:bookmarkStart w:id="178" w:name="ref-vancine2024"/>
     <w:p>
       <w:pPr>
         <w:pStyle w:val="Bibliography"/>
@@ -5513,7 +5632,7 @@
       <w:r>
         <w:t xml:space="preserve"> </w:t>
       </w:r>
-      <w:hyperlink r:id="rId164">
+      <w:hyperlink r:id="rId177">
         <w:r>
           <w:rPr>
             <w:rStyle w:val="Hyperlink"/>
@@ -5525,8 +5644,8 @@
         <w:t xml:space="preserve">. Biological Conservation 291:110499.</w:t>
       </w:r>
     </w:p>
-    <w:bookmarkEnd w:id="165"/>
-    <w:bookmarkStart w:id="167" w:name="ref-veech2003"/>
+    <w:bookmarkEnd w:id="178"/>
+    <w:bookmarkStart w:id="180" w:name="ref-veech2003"/>
     <w:p>
       <w:pPr>
         <w:pStyle w:val="Bibliography"/>
@@ -5537,7 +5656,7 @@
       <w:r>
         <w:t xml:space="preserve"> </w:t>
       </w:r>
-      <w:hyperlink r:id="rId166">
+      <w:hyperlink r:id="rId179">
         <w:r>
           <w:rPr>
             <w:rStyle w:val="Hyperlink"/>
@@ -5549,8 +5668,8 @@
         <w:t xml:space="preserve">. Ecology 84:3376–3383.</w:t>
       </w:r>
     </w:p>
-    <w:bookmarkEnd w:id="167"/>
-    <w:bookmarkStart w:id="169" w:name="ref-veech2002"/>
+    <w:bookmarkEnd w:id="180"/>
+    <w:bookmarkStart w:id="182" w:name="ref-veech2002"/>
     <w:p>
       <w:pPr>
         <w:pStyle w:val="Bibliography"/>
@@ -5561,7 +5680,7 @@
       <w:r>
         <w:t xml:space="preserve"> </w:t>
       </w:r>
-      <w:hyperlink r:id="rId168">
+      <w:hyperlink r:id="rId181">
         <w:r>
           <w:rPr>
             <w:rStyle w:val="Hyperlink"/>
@@ -5573,8 +5692,8 @@
         <w:t xml:space="preserve">. Oikos 99:3–9.</w:t>
       </w:r>
     </w:p>
-    <w:bookmarkEnd w:id="169"/>
-    <w:bookmarkStart w:id="171" w:name="ref-ward1998"/>
+    <w:bookmarkEnd w:id="182"/>
+    <w:bookmarkStart w:id="184" w:name="ref-ward1998"/>
     <w:p>
       <w:pPr>
         <w:pStyle w:val="Bibliography"/>
@@ -5585,7 +5704,7 @@
       <w:r>
         <w:t xml:space="preserve"> </w:t>
       </w:r>
-      <w:hyperlink r:id="rId170">
+      <w:hyperlink r:id="rId183">
         <w:r>
           <w:rPr>
             <w:rStyle w:val="Hyperlink"/>
@@ -5597,8 +5716,8 @@
         <w:t xml:space="preserve">. Biological Conservation 83:269–278.</w:t>
       </w:r>
     </w:p>
-    <w:bookmarkEnd w:id="171"/>
-    <w:bookmarkStart w:id="173" w:name="ref-whittaker1972"/>
+    <w:bookmarkEnd w:id="184"/>
+    <w:bookmarkStart w:id="186" w:name="ref-whittaker1972"/>
     <w:p>
       <w:pPr>
         <w:pStyle w:val="Bibliography"/>
@@ -5609,7 +5728,7 @@
       <w:r>
         <w:t xml:space="preserve"> </w:t>
       </w:r>
-      <w:hyperlink r:id="rId172">
+      <w:hyperlink r:id="rId185">
         <w:r>
           <w:rPr>
             <w:rStyle w:val="Hyperlink"/>
@@ -5621,20 +5740,44 @@
         <w:t xml:space="preserve">. TAXON 21:213–251.</w:t>
       </w:r>
     </w:p>
-    <w:bookmarkEnd w:id="173"/>
-    <w:bookmarkStart w:id="174" w:name="ref-zaú1998"/>
+    <w:bookmarkEnd w:id="186"/>
+    <w:bookmarkStart w:id="188" w:name="ref-wishart2003"/>
     <w:p>
       <w:pPr>
         <w:pStyle w:val="Bibliography"/>
       </w:pPr>
       <w:r>
+        <w:t xml:space="preserve">Wishart, M. J., and B. R. Davies. 2003.</w:t>
+      </w:r>
+      <w:r>
+        <w:t xml:space="preserve"> </w:t>
+      </w:r>
+      <w:hyperlink r:id="rId187">
+        <w:r>
+          <w:rPr>
+            <w:rStyle w:val="Hyperlink"/>
+          </w:rPr>
+          <w:t xml:space="preserve">Beyond catchment considerations in the conservation of lotic biodiversity</w:t>
+        </w:r>
+      </w:hyperlink>
+      <w:r>
+        <w:t xml:space="preserve">. Aquatic Conservation: Marine and Freshwater Ecosystems 13:429–437.</w:t>
+      </w:r>
+    </w:p>
+    <w:bookmarkEnd w:id="188"/>
+    <w:bookmarkStart w:id="189" w:name="ref-zaú1998"/>
+    <w:p>
+      <w:pPr>
+        <w:pStyle w:val="Bibliography"/>
+      </w:pPr>
+      <w:r>
         <w:t xml:space="preserve">Zaú, A. S. 1998. Fragmentação da mata atlântica: Aspectos teóricos. Floresta e Ambiente 5:160–170.</w:t>
       </w:r>
     </w:p>
-    <w:bookmarkEnd w:id="174"/>
-    <w:bookmarkEnd w:id="175"/>
-    <w:bookmarkEnd w:id="176"/>
-    <w:bookmarkStart w:id="211" w:name="figures-and-tables"/>
+    <w:bookmarkEnd w:id="189"/>
+    <w:bookmarkEnd w:id="190"/>
+    <w:bookmarkEnd w:id="191"/>
+    <w:bookmarkStart w:id="226" w:name="figures-and-tables"/>
     <w:p>
       <w:pPr>
         <w:pStyle w:val="Heading1"/>
@@ -5955,7 +6098,7 @@
         <w:t xml:space="preserve">(Stream): Diversity turnover between streams.</w:t>
       </w:r>
     </w:p>
-    <w:bookmarkStart w:id="205" w:name="figures"/>
+    <w:bookmarkStart w:id="220" w:name="figures"/>
     <w:p>
       <w:pPr>
         <w:pStyle w:val="Heading2"/>
@@ -5990,7 +6133,7 @@
       <w:tr>
         <w:tc>
           <w:tcPr/>
-          <w:bookmarkStart w:id="180" w:name="fig-mapa"/>
+          <w:bookmarkStart w:id="195" w:name="fig-mapa"/>
           <w:p>
             <w:pPr>
               <w:pStyle w:val="Compact"/>
@@ -6001,18 +6144,18 @@
                 <wp:inline>
                   <wp:extent cx="5943600" cy="4202583"/>
                   <wp:effectExtent b="0" l="0" r="0" t="0"/>
-                  <wp:docPr descr="" title="" id="178" name="Picture"/>
+                  <wp:docPr descr="" title="" id="193" name="Picture"/>
                   <a:graphic>
                     <a:graphicData uri="http://schemas.openxmlformats.org/drawingml/2006/picture">
                       <pic:pic>
                         <pic:nvPicPr>
-                          <pic:cNvPr descr="imagens/Uso%20de%20Solo%20Rebio_en.png" id="179" name="Picture"/>
+                          <pic:cNvPr descr="imagens/Uso%20de%20Solo%20Rebio_en.png" id="194" name="Picture"/>
                           <pic:cNvPicPr>
                             <a:picLocks noChangeArrowheads="1" noChangeAspect="1"/>
                           </pic:cNvPicPr>
                         </pic:nvPicPr>
                         <pic:blipFill>
-                          <a:blip r:embed="rId177"/>
+                          <a:blip r:embed="rId192"/>
                           <a:stretch>
                             <a:fillRect/>
                           </a:stretch>
@@ -6052,7 +6195,7 @@
               <w:t xml:space="preserve">Figure 1: Study area</w:t>
             </w:r>
           </w:p>
-          <w:bookmarkEnd w:id="180"/>
+          <w:bookmarkEnd w:id="195"/>
         </w:tc>
       </w:tr>
     </w:tbl>
@@ -6082,7 +6225,7 @@
       <w:tr>
         <w:tc>
           <w:tcPr/>
-          <w:bookmarkStart w:id="184" w:name="fig-hab_PCA_rio"/>
+          <w:bookmarkStart w:id="199" w:name="fig-hab_PCA_rio"/>
           <w:p>
             <w:pPr>
               <w:pStyle w:val="Compact"/>
@@ -6093,18 +6236,18 @@
                 <wp:inline>
                   <wp:extent cx="5943600" cy="4953000"/>
                   <wp:effectExtent b="0" l="0" r="0" t="0"/>
-                  <wp:docPr descr="" title="" id="182" name="Picture"/>
+                  <wp:docPr descr="" title="" id="197" name="Picture"/>
                   <a:graphic>
                     <a:graphicData uri="http://schemas.openxmlformats.org/drawingml/2006/picture">
                       <pic:pic>
                         <pic:nvPicPr>
-                          <pic:cNvPr descr="res/fig-hab_PCA_rio.png" id="183" name="Picture"/>
+                          <pic:cNvPr descr="res_ms/fig-hab_PCA_rio.png" id="198" name="Picture"/>
                           <pic:cNvPicPr>
                             <a:picLocks noChangeArrowheads="1" noChangeAspect="1"/>
                           </pic:cNvPicPr>
                         </pic:nvPicPr>
                         <pic:blipFill>
-                          <a:blip r:embed="rId181"/>
+                          <a:blip r:embed="rId196"/>
                           <a:stretch>
                             <a:fillRect/>
                           </a:stretch>
@@ -6144,7 +6287,7 @@
               <w:t xml:space="preserve">Figure 2: Principal Component Analysis, streams</w:t>
             </w:r>
           </w:p>
-          <w:bookmarkEnd w:id="184"/>
+          <w:bookmarkEnd w:id="199"/>
         </w:tc>
       </w:tr>
     </w:tbl>
@@ -6174,7 +6317,7 @@
       <w:tr>
         <w:tc>
           <w:tcPr/>
-          <w:bookmarkStart w:id="188" w:name="fig-hab_PCA_periodo"/>
+          <w:bookmarkStart w:id="203" w:name="fig-hab_PCA_periodo"/>
           <w:p>
             <w:pPr>
               <w:pStyle w:val="Compact"/>
@@ -6185,18 +6328,18 @@
                 <wp:inline>
                   <wp:extent cx="5943600" cy="4953000"/>
                   <wp:effectExtent b="0" l="0" r="0" t="0"/>
-                  <wp:docPr descr="" title="" id="186" name="Picture"/>
+                  <wp:docPr descr="" title="" id="201" name="Picture"/>
                   <a:graphic>
                     <a:graphicData uri="http://schemas.openxmlformats.org/drawingml/2006/picture">
                       <pic:pic>
                         <pic:nvPicPr>
-                          <pic:cNvPr descr="res/fig-hab_PCA_periodo.png" id="187" name="Picture"/>
+                          <pic:cNvPr descr="res_ms/fig-hab_PCA_periodo.png" id="202" name="Picture"/>
                           <pic:cNvPicPr>
                             <a:picLocks noChangeArrowheads="1" noChangeAspect="1"/>
                           </pic:cNvPicPr>
                         </pic:nvPicPr>
                         <pic:blipFill>
-                          <a:blip r:embed="rId185"/>
+                          <a:blip r:embed="rId200"/>
                           <a:stretch>
                             <a:fillRect/>
                           </a:stretch>
@@ -6236,7 +6379,7 @@
               <w:t xml:space="preserve">Figure 3: Principal Component Analysis, seasons</w:t>
             </w:r>
           </w:p>
-          <w:bookmarkEnd w:id="188"/>
+          <w:bookmarkEnd w:id="203"/>
         </w:tc>
       </w:tr>
     </w:tbl>
@@ -6266,7 +6409,7 @@
       <w:tr>
         <w:tc>
           <w:tcPr/>
-          <w:bookmarkStart w:id="192" w:name="fig-rare1"/>
+          <w:bookmarkStart w:id="207" w:name="fig-rare1"/>
           <w:p>
             <w:pPr>
               <w:pStyle w:val="Compact"/>
@@ -6277,18 +6420,18 @@
                 <wp:inline>
                   <wp:extent cx="5943600" cy="4457699"/>
                   <wp:effectExtent b="0" l="0" r="0" t="0"/>
-                  <wp:docPr descr="" title="" id="190" name="Picture"/>
+                  <wp:docPr descr="" title="" id="205" name="Picture"/>
                   <a:graphic>
                     <a:graphicData uri="http://schemas.openxmlformats.org/drawingml/2006/picture">
                       <pic:pic>
                         <pic:nvPicPr>
-                          <pic:cNvPr descr="res/fig-rare1.png" id="191" name="Picture"/>
+                          <pic:cNvPr descr="res_ms/fig-rare1.png" id="206" name="Picture"/>
                           <pic:cNvPicPr>
                             <a:picLocks noChangeArrowheads="1" noChangeAspect="1"/>
                           </pic:cNvPicPr>
                         </pic:nvPicPr>
                         <pic:blipFill>
-                          <a:blip r:embed="rId189"/>
+                          <a:blip r:embed="rId204"/>
                           <a:stretch>
                             <a:fillRect/>
                           </a:stretch>
@@ -6328,7 +6471,7 @@
               <w:t xml:space="preserve">Figure 4: Accumulation curves</w:t>
             </w:r>
           </w:p>
-          <w:bookmarkEnd w:id="192"/>
+          <w:bookmarkEnd w:id="207"/>
         </w:tc>
       </w:tr>
     </w:tbl>
@@ -6358,7 +6501,7 @@
       <w:tr>
         <w:tc>
           <w:tcPr/>
-          <w:bookmarkStart w:id="196" w:name="fig-upgma"/>
+          <w:bookmarkStart w:id="211" w:name="fig-upgma"/>
           <w:p>
             <w:pPr>
               <w:pStyle w:val="Compact"/>
@@ -6369,18 +6512,18 @@
                 <wp:inline>
                   <wp:extent cx="5943600" cy="4862945"/>
                   <wp:effectExtent b="0" l="0" r="0" t="0"/>
-                  <wp:docPr descr="" title="" id="194" name="Picture"/>
+                  <wp:docPr descr="" title="" id="209" name="Picture"/>
                   <a:graphic>
                     <a:graphicData uri="http://schemas.openxmlformats.org/drawingml/2006/picture">
                       <pic:pic>
                         <pic:nvPicPr>
-                          <pic:cNvPr descr="res/fig-upgma.png" id="195" name="Picture"/>
+                          <pic:cNvPr descr="res_ms/fig-upgma.png" id="210" name="Picture"/>
                           <pic:cNvPicPr>
                             <a:picLocks noChangeArrowheads="1" noChangeAspect="1"/>
                           </pic:cNvPicPr>
                         </pic:nvPicPr>
                         <pic:blipFill>
-                          <a:blip r:embed="rId193"/>
+                          <a:blip r:embed="rId208"/>
                           <a:stretch>
                             <a:fillRect/>
                           </a:stretch>
@@ -6420,7 +6563,7 @@
               <w:t xml:space="preserve">Figure 5: UPGMA Classification</w:t>
             </w:r>
           </w:p>
-          <w:bookmarkEnd w:id="196"/>
+          <w:bookmarkEnd w:id="211"/>
         </w:tc>
       </w:tr>
     </w:tbl>
@@ -6450,7 +6593,7 @@
       <w:tr>
         <w:tc>
           <w:tcPr/>
-          <w:bookmarkStart w:id="200" w:name="fig-particao_cs"/>
+          <w:bookmarkStart w:id="215" w:name="fig-particao_cs"/>
           <w:p>
             <w:pPr>
               <w:pStyle w:val="Compact"/>
@@ -6461,18 +6604,18 @@
                 <wp:inline>
                   <wp:extent cx="3669832" cy="7339665"/>
                   <wp:effectExtent b="0" l="0" r="0" t="0"/>
-                  <wp:docPr descr="" title="" id="198" name="Picture"/>
+                  <wp:docPr descr="" title="" id="213" name="Picture"/>
                   <a:graphic>
                     <a:graphicData uri="http://schemas.openxmlformats.org/drawingml/2006/picture">
                       <pic:pic>
                         <pic:nvPicPr>
-                          <pic:cNvPr descr="res/fig-painel_pt.cs.png" id="199" name="Picture"/>
+                          <pic:cNvPr descr="res_ms/fig-painel_pt.cs.png" id="214" name="Picture"/>
                           <pic:cNvPicPr>
                             <a:picLocks noChangeArrowheads="1" noChangeAspect="1"/>
                           </pic:cNvPicPr>
                         </pic:nvPicPr>
                         <pic:blipFill>
-                          <a:blip r:embed="rId197"/>
+                          <a:blip r:embed="rId212"/>
                           <a:stretch>
                             <a:fillRect/>
                           </a:stretch>
@@ -6512,7 +6655,7 @@
               <w:t xml:space="preserve">Figure 6: Partitioning plots season</w:t>
             </w:r>
           </w:p>
-          <w:bookmarkEnd w:id="200"/>
+          <w:bookmarkEnd w:id="215"/>
         </w:tc>
       </w:tr>
     </w:tbl>
@@ -6542,7 +6685,7 @@
       <w:tr>
         <w:tc>
           <w:tcPr/>
-          <w:bookmarkStart w:id="204" w:name="fig-particao_rios"/>
+          <w:bookmarkStart w:id="219" w:name="fig-particao_rios"/>
           <w:p>
             <w:pPr>
               <w:pStyle w:val="Compact"/>
@@ -6553,18 +6696,18 @@
                 <wp:inline>
                   <wp:extent cx="5943600" cy="6792685"/>
                   <wp:effectExtent b="0" l="0" r="0" t="0"/>
-                  <wp:docPr descr="" title="" id="202" name="Picture"/>
+                  <wp:docPr descr="" title="" id="217" name="Picture"/>
                   <a:graphic>
                     <a:graphicData uri="http://schemas.openxmlformats.org/drawingml/2006/picture">
                       <pic:pic>
                         <pic:nvPicPr>
-                          <pic:cNvPr descr="res/fig-painel_pt.rios.png" id="203" name="Picture"/>
+                          <pic:cNvPr descr="res_ms/fig-painel_pt.rios.png" id="218" name="Picture"/>
                           <pic:cNvPicPr>
                             <a:picLocks noChangeArrowheads="1" noChangeAspect="1"/>
                           </pic:cNvPicPr>
                         </pic:nvPicPr>
                         <pic:blipFill>
-                          <a:blip r:embed="rId201"/>
+                          <a:blip r:embed="rId216"/>
                           <a:stretch>
                             <a:fillRect/>
                           </a:stretch>
@@ -6604,12 +6747,12 @@
               <w:t xml:space="preserve">Figure 7: Partitioning plots stream</w:t>
             </w:r>
           </w:p>
-          <w:bookmarkEnd w:id="204"/>
+          <w:bookmarkEnd w:id="219"/>
         </w:tc>
       </w:tr>
     </w:tbl>
-    <w:bookmarkEnd w:id="205"/>
-    <w:bookmarkStart w:id="210" w:name="tables"/>
+    <w:bookmarkEnd w:id="220"/>
+    <w:bookmarkStart w:id="225" w:name="tables"/>
     <w:p>
       <w:pPr>
         <w:pStyle w:val="Heading2"/>
@@ -6644,7 +6787,7 @@
       <w:tr>
         <w:tc>
           <w:tcPr/>
-          <w:bookmarkStart w:id="206" w:name="tbl-hab_gttable"/>
+          <w:bookmarkStart w:id="221" w:name="tbl-hab_gttable"/>
           <w:p>
             <w:pPr>
               <w:jc w:val="center"/>
@@ -18312,7 +18455,7 @@
               </w:tc>
             </w:tr>
           </w:tbl>
-          <w:bookmarkEnd w:id="206"/>
+          <w:bookmarkEnd w:id="221"/>
         </w:tc>
       </w:tr>
     </w:tbl>
@@ -18342,7 +18485,7 @@
       <w:tr>
         <w:tc>
           <w:tcPr/>
-          <w:bookmarkStart w:id="207" w:name="tbl-nutri_gttable"/>
+          <w:bookmarkStart w:id="222" w:name="tbl-nutri_gttable"/>
           <w:p>
             <w:pPr>
               <w:jc w:val="center"/>
@@ -21063,7 +21206,7 @@
               </w:tc>
             </w:tr>
           </w:tbl>
-          <w:bookmarkEnd w:id="207"/>
+          <w:bookmarkEnd w:id="222"/>
         </w:tc>
       </w:tr>
     </w:tbl>
@@ -21093,7 +21236,7 @@
       <w:tr>
         <w:tc>
           <w:tcPr/>
-          <w:bookmarkStart w:id="208" w:name="tbl-checklist_gttable"/>
+          <w:bookmarkStart w:id="223" w:name="tbl-checklist_gttable"/>
           <w:p>
             <w:pPr>
               <w:jc w:val="center"/>
@@ -38837,7 +38980,7 @@
               </w:tc>
             </w:tr>
           </w:tbl>
-          <w:bookmarkEnd w:id="208"/>
+          <w:bookmarkEnd w:id="223"/>
         </w:tc>
       </w:tr>
     </w:tbl>
@@ -38867,7 +39010,7 @@
       <w:tr>
         <w:tc>
           <w:tcPr/>
-          <w:bookmarkStart w:id="209" w:name="tbl-part_gttable"/>
+          <w:bookmarkStart w:id="224" w:name="tbl-part_gttable"/>
           <w:p>
             <w:pPr>
               <w:jc w:val="center"/>
@@ -43727,13 +43870,13 @@
               </w:tc>
             </w:tr>
           </w:tbl>
-          <w:bookmarkEnd w:id="209"/>
+          <w:bookmarkEnd w:id="224"/>
         </w:tc>
       </w:tr>
     </w:tbl>
-    <w:bookmarkEnd w:id="210"/>
-    <w:bookmarkEnd w:id="211"/>
-    <w:bookmarkStart w:id="212" w:name="apendices"/>
+    <w:bookmarkEnd w:id="225"/>
+    <w:bookmarkEnd w:id="226"/>
+    <w:bookmarkStart w:id="227" w:name="apendices"/>
     <w:p>
       <w:pPr>
         <w:pStyle w:val="Heading1"/>
@@ -43742,8 +43885,8 @@
         <w:t xml:space="preserve">Apendices</w:t>
       </w:r>
     </w:p>
-    <w:bookmarkEnd w:id="212"/>
-    <w:bookmarkStart w:id="216" w:name="non-used-figures-and-tables"/>
+    <w:bookmarkEnd w:id="227"/>
+    <w:bookmarkStart w:id="231" w:name="non-used-figures-and-tables"/>
     <w:p>
       <w:pPr>
         <w:pStyle w:val="Heading1"/>
@@ -43793,18 +43936,18 @@
                 <wp:inline>
                   <wp:extent cx="152400" cy="152400"/>
                   <wp:effectExtent b="0" l="0" r="0" t="0"/>
-                  <wp:docPr descr="" title="" id="214" name="Picture"/>
+                  <wp:docPr descr="" title="" id="229" name="Picture"/>
                   <a:graphic>
                     <a:graphicData uri="http://schemas.openxmlformats.org/drawingml/2006/picture">
                       <pic:pic>
                         <pic:nvPicPr>
-                          <pic:cNvPr descr="C:\PROGRA~1\RStudio\RESOUR~1\app\bin\quarto\share\formats\docx\warning.png" id="215" name="Picture"/>
+                          <pic:cNvPr descr="C:\PROGRA~1\RStudio\RESOUR~1\app\bin\quarto\share\formats\docx\warning.png" id="230" name="Picture"/>
                           <pic:cNvPicPr>
                             <a:picLocks noChangeArrowheads="1" noChangeAspect="1"/>
                           </pic:cNvPicPr>
                         </pic:nvPicPr>
                         <pic:blipFill>
-                          <a:blip r:embed="rId213"/>
+                          <a:blip r:embed="rId228"/>
                           <a:stretch>
                             <a:fillRect/>
                           </a:stretch>
@@ -43857,7 +44000,7 @@
         </w:tc>
       </w:tr>
     </w:tbl>
-    <w:bookmarkEnd w:id="216"/>
+    <w:bookmarkEnd w:id="231"/>
     <w:sectPr>
       <w:type w:val="nextPage"/>
       <w:pgSz w:h="15840" w:w="12240"/>

</xml_diff>

<commit_message>
Ell: Organizando algumas figuras e códigos. Adicionando rarefação
</commit_message>
<xml_diff>
--- a/docs/ms_rebio23-part.docx
+++ b/docs/ms_rebio23-part.docx
@@ -83,7 +83,7 @@
         <w:pStyle w:val="Date"/>
       </w:pPr>
       <w:r>
-        <w:t xml:space="preserve">2026-10-16</w:t>
+        <w:t xml:space="preserve">2026-10-18</w:t>
       </w:r>
     </w:p>
     <w:p>
@@ -154,7 +154,7 @@
         </w:p>
       </w:sdtContent>
     </w:sdt>
-    <w:bookmarkStart w:id="13" w:name="introduction"/>
+    <w:bookmarkStart w:id="12" w:name="introduction"/>
     <w:p>
       <w:pPr>
         <w:pStyle w:val="Heading1"/>
@@ -259,18 +259,21 @@
         <w:pStyle w:val="TextBody"/>
       </w:pPr>
       <w:r>
-        <w:t xml:space="preserve">In addition to landscape alterations, stream dynamics are strongly driven by seasonal factors. The Atlantic Forest features a predominantly tropical climate with rainfall distributed throughout the year. These hydrological fluctuations directly influence Neotropical freshwater environments by modifying physical and chemical conditions [</w:t>
-      </w:r>
-      <w:r>
-        <w:t xml:space="preserve">Barboza et al. (2024)</w:t>
-      </w:r>
-      <w:r>
-        <w:t xml:space="preserve">]. The shift between dry and rainy seasons alters resource availability, microhabitat structure, and the establishment and persistence of organisms, thereby shaping community composition and dynamics</w:t>
+        <w:t xml:space="preserve">In addition to landscape alterations, stream dynamics are strongly driven by seasonal factors. The Atlantic Forest features a predominantly tropical climate with rainfall distributed throughout the year. These hydrological fluctuations directly influence Neotropical freshwater environments by modifying physical and chemical conditions</w:t>
       </w:r>
       <w:r>
         <w:t xml:space="preserve"> </w:t>
       </w:r>
       <w:r>
+        <w:t xml:space="preserve">(Barboza et al. 2024)</w:t>
+      </w:r>
+      <w:r>
+        <w:t xml:space="preserve">. The shift between dry and rainy seasons alters resource availability, microhabitat structure, and the establishment and persistence of organisms, thereby shaping community composition and dynamics</w:t>
+      </w:r>
+      <w:r>
+        <w:t xml:space="preserve"> </w:t>
+      </w:r>
+      <w:r>
         <w:t xml:space="preserve">(Ward 1998, Souza et al. 2025)</w:t>
       </w:r>
       <w:r>
@@ -283,31 +286,16 @@
         <w:t xml:space="preserve">(Souza et al. 2025)</w:t>
       </w:r>
       <w:r>
-        <w:t xml:space="preserve">, and shifts in species composition and community turnover often reflect underlying alterations in environmental conditions [</w:t>
-      </w:r>
-      <w:r>
-        <w:t xml:space="preserve">Freiry et al. (2020)</w:t>
-      </w:r>
-      <w:r>
-        <w:t xml:space="preserve">;</w:t>
+        <w:t xml:space="preserve">, and shifts in species composition and community turnover often reflect underlying alterations in environmental conditions</w:t>
       </w:r>
       <w:r>
         <w:t xml:space="preserve"> </w:t>
       </w:r>
       <w:r>
-        <w:t xml:space="preserve">Melo and Medeiros (2013)</w:t>
-      </w:r>
-      <w:r>
-        <w:t xml:space="preserve">;</w:t>
-      </w:r>
-      <w:r>
-        <w:t xml:space="preserve"> </w:t>
-      </w:r>
-      <w:r>
-        <w:t xml:space="preserve">Keppeler and Hardy (2004)</w:t>
-      </w:r>
-      <w:r>
-        <w:t xml:space="preserve">].</w:t>
+        <w:t xml:space="preserve">(Keppeler and Hardy 2004, Melo and Medeiros 2013, Shell and Collier 2018, Freiry et al. 2020)</w:t>
+      </w:r>
+      <w:r>
+        <w:t xml:space="preserve">.</w:t>
       </w:r>
     </w:p>
     <w:p>
@@ -315,49 +303,49 @@
         <w:pStyle w:val="TextBody"/>
       </w:pPr>
       <w:r>
-        <w:t xml:space="preserve">Among the biological components of lotic communities, zooplankton—particularly Rotifera, Cladocera, and Copepoda—play a pivotal role. These organisms exhibit diverse body sizes, morphologies, life histories, and functional roles, serving as excellent bioindicators due to their rapid sensitivity to environmental changes</w:t>
+        <w:t xml:space="preserve">Within this context, the design of efficient protected areas that incorporate aquatic systems, ought to rely on a robust network of interconnected spatial scales and meaningful observation of species distributions within and surrounding the areas of biological interest</w:t>
       </w:r>
       <w:r>
         <w:t xml:space="preserve"> </w:t>
       </w:r>
       <w:r>
+        <w:t xml:space="preserve">(Maltchik and Medeiros 2006, Herbert et al. 2010, Socolar et al. 2016)</w:t>
+      </w:r>
+      <w:r>
+        <w:t xml:space="preserve">.</w:t>
+      </w:r>
+      <w:r>
+        <w:t xml:space="preserve"> </w:t>
+      </w:r>
+      <w:r>
+        <w:t xml:space="preserve">Essential to this is the choice of relevant species, capable of representing the central elements of the biological components of lotic communities. Zooplankton, particularly Rotifera, Cladocera, and Copepoda, play a pivotal role in stream ecosystems</w:t>
+      </w:r>
+      <w:r>
+        <w:t xml:space="preserve"> </w:t>
+      </w:r>
+      <w:r>
+        <w:t xml:space="preserve">(Santos et al. 2024, Amaral et al. 2024)</w:t>
+      </w:r>
+      <w:r>
+        <w:t xml:space="preserve">. These organisms exhibit diverse body sizes, morphologies, life histories, and functional roles, serving as excellent bioindicators due to their rapid sensitivity to environmental changes</w:t>
+      </w:r>
+      <w:r>
+        <w:t xml:space="preserve"> </w:t>
+      </w:r>
+      <w:r>
         <w:t xml:space="preserve">(Bonecker et al. 2013)</w:t>
       </w:r>
       <w:r>
-        <w:t xml:space="preserve">. Furthermore, zooplankton constitute a critical food source for fish and other organisms, an essential trophic bridge that transfers energy from primary producers to higher trophic levels [</w:t>
-      </w:r>
-      <w:r>
-        <w:t xml:space="preserve">Altindağ and Berdi̇ (2025)</w:t>
-      </w:r>
-      <w:r>
-        <w:t xml:space="preserve">;</w:t>
+        <w:t xml:space="preserve">. Furthermore, zooplankton constitute a critical food source for fish and other organisms, an essential trophic bridge that transfers energy from primary producers to higher trophic levels</w:t>
       </w:r>
       <w:r>
         <w:t xml:space="preserve"> </w:t>
       </w:r>
       <w:r>
-        <w:t xml:space="preserve">Balkić et al. (2022)</w:t>
-      </w:r>
-      <w:r>
-        <w:t xml:space="preserve">;</w:t>
-      </w:r>
-      <w:r>
-        <w:t xml:space="preserve"> </w:t>
-      </w:r>
-      <w:r>
-        <w:t xml:space="preserve">Marcelino et al. (2025)</w:t>
-      </w:r>
-      <w:r>
-        <w:t xml:space="preserve">;</w:t>
-      </w:r>
-      <w:r>
-        <w:t xml:space="preserve"> </w:t>
-      </w:r>
-      <w:r>
-        <w:t xml:space="preserve">Souza et al. (2025)</w:t>
-      </w:r>
-      <w:r>
-        <w:t xml:space="preserve">].</w:t>
+        <w:t xml:space="preserve">(Balkić et al. 2022, Marcelino et al. 2025, Souza et al. 2025, Altindağ and Berdi̇ 2025)</w:t>
+      </w:r>
+      <w:r>
+        <w:t xml:space="preserve">.</w:t>
       </w:r>
     </w:p>
     <w:p>
@@ -365,7 +353,7 @@
         <w:pStyle w:val="TextBody"/>
       </w:pPr>
       <w:r>
-        <w:t xml:space="preserve">In recent decades, researchers have argued that biodiversity assessments should not be reduced to a single diversity index.</w:t>
+        <w:t xml:space="preserve">Furthermore, in recent decades, researchers have argued that biodiversity assessments should not be reduced to a single diversity index.</w:t>
       </w:r>
       <w:r>
         <w:t xml:space="preserve"> </w:t>
@@ -533,7 +521,7 @@
         <w:pStyle w:val="TextBody"/>
       </w:pPr>
       <w:r>
-        <w:t xml:space="preserve">Therefore, understanding the spatial structure and distribution of biodiversity across scale remains a central theme in community ecology and conservation planning</w:t>
+        <w:t xml:space="preserve">Therefore, understanding the spatial structure and distribution of biodiversity across scales remains a central theme in community ecology and conservation planning</w:t>
       </w:r>
       <w:r>
         <w:t xml:space="preserve"> </w:t>
@@ -548,10 +536,100 @@
         <w:t xml:space="preserve"> </w:t>
       </w:r>
       <w:r>
+        <w:t xml:space="preserve">(Baselga 2010, 2012)</w:t>
+      </w:r>
+      <w:r>
+        <w:t xml:space="preserve">.</w:t>
+      </w:r>
+      <w:r>
+        <w:t xml:space="preserve"> </w:t>
+      </w:r>
+      <w:r>
+        <w:t xml:space="preserve">Total regional species richness (</w:t>
+      </w:r>
+      <m:oMath>
+        <m:r>
+          <m:t>γ</m:t>
+        </m:r>
+      </m:oMath>
+      <w:r>
+        <w:t xml:space="preserve">-diversity) can be hierarchically partitioned into its additive components: local richness (</w:t>
+      </w:r>
+      <m:oMath>
+        <m:r>
+          <m:t>α</m:t>
+        </m:r>
+      </m:oMath>
+      <w:r>
+        <w:t xml:space="preserve">-diversity) and species turnover among assemblages (</w:t>
+      </w:r>
+      <m:oMath>
+        <m:r>
+          <m:t>β</m:t>
+        </m:r>
+      </m:oMath>
+      <w:r>
+        <w:t xml:space="preserve">-diversity) across spatial or temporal scales</w:t>
+      </w:r>
+      <w:r>
+        <w:t xml:space="preserve"> </w:t>
+      </w:r>
+      <w:r>
+        <w:t xml:space="preserve">(Lande 1996)</w:t>
+      </w:r>
+      <w:r>
+        <w:t xml:space="preserve">. Examining these components allows ecologists to disentangle whether regional diversity is primarily governed by fine-scale local processes or broader spatial heterogeneity</w:t>
+      </w:r>
+      <w:r>
+        <w:t xml:space="preserve"> </w:t>
+      </w:r>
+      <w:r>
+        <w:t xml:space="preserve">(Crist et al. 2003, Tuomisto 2010)</w:t>
+      </w:r>
+      <w:r>
+        <w:t xml:space="preserve">.</w:t>
+      </w:r>
+      <w:r>
+        <w:t xml:space="preserve"> </w:t>
+      </w:r>
+      <w:r>
+        <w:t xml:space="preserve">Beta diversity itself reflects the variation in species composition among sites and is driven by two distinct ecological phenomena: turnover (species replacement) and nestedness (richness differences)</w:t>
+      </w:r>
+      <w:r>
+        <w:t xml:space="preserve"> </w:t>
+      </w:r>
+      <w:r>
         <w:t xml:space="preserve">(Baselga 2010)</w:t>
       </w:r>
       <w:r>
-        <w:t xml:space="preserve">. Turnover is the replacement of some species by different species from one site to another, while nestedness is the loss or gain of species where poorer sites contain a strict subset of the species found at richer sites.</w:t>
+        <w:t xml:space="preserve">. Species turnover occurs when species are replaced by different species along environmental or spatial gradients, usually driven by environmental filtering, competitive exclusion, or dispersal limitation</w:t>
+      </w:r>
+      <w:r>
+        <w:t xml:space="preserve"> </w:t>
+      </w:r>
+      <w:r>
+        <w:t xml:space="preserve">(Baselga 2010, Tuomisto 2010)</w:t>
+      </w:r>
+      <w:r>
+        <w:t xml:space="preserve">. In contrast, nestedness occurs when communities at species-poor sites are non-random subsets of those at species-rich sites</w:t>
+      </w:r>
+      <w:r>
+        <w:t xml:space="preserve"> </w:t>
+      </w:r>
+      <w:r>
+        <w:t xml:space="preserve">(Baselga 2010)</w:t>
+      </w:r>
+      <w:r>
+        <w:t xml:space="preserve">. Nested patterns typically stem from deterministic processes such as selective extinction, differential colonization capacity, or habitat fragmentation that sequentially eliminate sensitive taxa while retaining tolerant generalists</w:t>
+      </w:r>
+      <w:r>
+        <w:t xml:space="preserve"> </w:t>
+      </w:r>
+      <w:r>
+        <w:t xml:space="preserve">(Veech et al. 2003, Baselga 2010)</w:t>
+      </w:r>
+      <w:r>
+        <w:t xml:space="preserve">.</w:t>
       </w:r>
     </w:p>
     <w:p>
@@ -559,57 +637,25 @@
         <w:pStyle w:val="TextBody"/>
       </w:pPr>
       <w:r>
-        <w:t xml:space="preserve">Total regional species richness (</w:t>
-      </w:r>
-      <m:oMath>
-        <m:r>
-          <m:t>γ</m:t>
-        </m:r>
-      </m:oMath>
-      <w:r>
-        <w:t xml:space="preserve">-diversity) can be hierarchically partitioned into its additive components: local richness (</w:t>
-      </w:r>
-      <m:oMath>
-        <m:r>
-          <m:t>α</m:t>
-        </m:r>
-      </m:oMath>
-      <w:r>
-        <w:t xml:space="preserve">-diversity) and species turnover among assemblages (</w:t>
-      </w:r>
-      <m:oMath>
-        <m:r>
-          <m:t>β</m:t>
-        </m:r>
-      </m:oMath>
-      <w:r>
-        <w:t xml:space="preserve">-diversity) across spatial or temporal scales</w:t>
+        <w:t xml:space="preserve">Evaluating the relative contribution of turnover and nestedness—alongside null models using Standardized Effect Sizes (SES)—provides critical insights into assembly rules and conservation prioritization</w:t>
       </w:r>
       <w:r>
         <w:t xml:space="preserve"> </w:t>
       </w:r>
       <w:r>
-        <w:t xml:space="preserve">(Lande 1996)</w:t>
-      </w:r>
-      <w:r>
-        <w:t xml:space="preserve">. Examining these components allows ecologists to disentangle whether regional diversity is primarily governed by fine-scale local processes or broader spatial heterogeneity</w:t>
+        <w:t xml:space="preserve">(Gotelli and McCabe 2002, Gering et al. 2003)</w:t>
+      </w:r>
+      <w:r>
+        <w:t xml:space="preserve">. A pattern dominated by turnover (SES &gt; 0) implies strong ecological differentiation and high beta diversity, signaling that distinct localities host unique biological assemblages</w:t>
       </w:r>
       <w:r>
         <w:t xml:space="preserve"> </w:t>
       </w:r>
       <w:r>
-        <w:t xml:space="preserve">(Crist et al. 2003, Tuomisto 2010)</w:t>
-      </w:r>
-      <w:r>
-        <w:t xml:space="preserve">. Beta diversity (</w:t>
-      </w:r>
-      <m:oMath>
-        <m:r>
-          <m:t>β</m:t>
-        </m:r>
-      </m:oMath>
-      <w:r>
-        <w:t xml:space="preserve">) itself reflects the variation in species composition among sites and is driven by two distinct ecological phenomena: turnover (species replacement) and nestedness (richness differences)</w:t>
+        <w:t xml:space="preserve">(Baselga 2010)</w:t>
+      </w:r>
+      <w:r>
+        <w:t xml:space="preserve">. From a conservation perspective, high turnover necessitates a network-wide preservation strategy, as multiple sites must be protected to encompass regional biodiversity</w:t>
       </w:r>
       <w:r>
         <w:t xml:space="preserve"> </w:t>
@@ -618,115 +664,7 @@
         <w:t xml:space="preserve">(Baselga 2010)</w:t>
       </w:r>
       <w:r>
-        <w:t xml:space="preserve">. Species turnover occurs when species are replaced by different species along environmental or spatial gradients, usually driven by environmental filtering, competitive exclusion, or dispersal limitation</w:t>
-      </w:r>
-      <w:r>
-        <w:t xml:space="preserve"> </w:t>
-      </w:r>
-      <w:r>
-        <w:t xml:space="preserve">(Baselga 2010, Tuomisto 2010)</w:t>
-      </w:r>
-      <w:r>
-        <w:t xml:space="preserve">. In contrast, nestedness occurs when communities at species-poor sites are non-random subsets of those at species-rich sites</w:t>
-      </w:r>
-      <w:r>
-        <w:t xml:space="preserve"> </w:t>
-      </w:r>
-      <w:r>
-        <w:t xml:space="preserve">(Baselga 2010)</w:t>
-      </w:r>
-      <w:r>
-        <w:t xml:space="preserve">. Nested patterns typically stem from deterministic processes such as selective extinction, differential colonization capacity, or habitat fragmentation that sequentially eliminate sensitive taxa while retaining tolerant generalists</w:t>
-      </w:r>
-      <w:r>
-        <w:t xml:space="preserve"> </w:t>
-      </w:r>
-      <w:r>
-        <w:t xml:space="preserve">(Baselga 2010)</w:t>
-      </w:r>
-      <w:r>
-        <w:t xml:space="preserve">. Evaluating the relative contribution of turnover and nestedness—alongside null models using Standardized Effect Sizes (</w:t>
-      </w:r>
-      <m:oMath>
-        <m:r>
-          <m:rPr>
-            <m:nor/>
-            <m:sty m:val="p"/>
-          </m:rPr>
-          <m:t>SES</m:t>
-        </m:r>
-      </m:oMath>
-      <w:r>
-        <w:t xml:space="preserve">)—provides critical insights into assembly rules and conservation prioritization</w:t>
-      </w:r>
-      <w:r>
-        <w:t xml:space="preserve"> </w:t>
-      </w:r>
-      <w:r>
-        <w:t xml:space="preserve">(Gotelli and McCabe 2002, Baselga 2010)</w:t>
-      </w:r>
-      <w:r>
-        <w:t xml:space="preserve">. A pattern dominated by turnover (</w:t>
-      </w:r>
-      <m:oMath>
-        <m:r>
-          <m:rPr>
-            <m:nor/>
-            <m:sty m:val="p"/>
-          </m:rPr>
-          <m:t>SES</m:t>
-        </m:r>
-        <m:r>
-          <m:rPr>
-            <m:sty m:val="p"/>
-          </m:rPr>
-          <m:t>&gt;</m:t>
-        </m:r>
-        <m:r>
-          <m:t>0</m:t>
-        </m:r>
-      </m:oMath>
-      <w:r>
-        <w:t xml:space="preserve">) implies strong ecological differentiation and high beta diversity, signaling that distinct localities host unique biological assemblages</w:t>
-      </w:r>
-      <w:r>
-        <w:t xml:space="preserve"> </w:t>
-      </w:r>
-      <w:r>
-        <w:t xml:space="preserve">(Baselga 2010)</w:t>
-      </w:r>
-      <w:r>
-        <w:t xml:space="preserve">. From a conservation perspective, high turnover necessitates a network-wide preservation strategy, as multiple sites must be protected to encompass regional biodiversity</w:t>
-      </w:r>
-      <w:r>
-        <w:t xml:space="preserve"> </w:t>
-      </w:r>
-      <w:r>
-        <w:t xml:space="preserve">(Baselga 2010)</w:t>
-      </w:r>
-      <w:r>
-        <w:t xml:space="preserve">. Conversely, a system dominated by nestedness or fine-scale homogenization (</w:t>
-      </w:r>
-      <m:oMath>
-        <m:r>
-          <m:rPr>
-            <m:nor/>
-            <m:sty m:val="p"/>
-          </m:rPr>
-          <m:t>SES</m:t>
-        </m:r>
-        <m:r>
-          <m:rPr>
-            <m:sty m:val="p"/>
-          </m:rPr>
-          <m:t>&lt;</m:t>
-        </m:r>
-        <m:r>
-          <m:t>0</m:t>
-        </m:r>
-      </m:oMath>
-      <w:r>
-        <w:t xml:space="preserve">) indicates that local assemblages are nested sub-collections of regional species pools. Under a nested regime, management efforts are most effectively concentrated on protecting the largest or highest-quality species-rich sites, which inherently harbor the vast majority of the regional pool</w:t>
+        <w:t xml:space="preserve">. Conversely, a system dominated by nestedness or fine-scale homogenization (SES &lt; 0) indicates that local assemblages are nested sub-collections of regional species pools. Under a nested regime, management efforts are most effectively concentrated on protecting the largest or highest-quality species-rich sites, which inherently harbor the vast majority of the regional pool</w:t>
       </w:r>
       <w:r>
         <w:t xml:space="preserve"> </w:t>
@@ -743,98 +681,74 @@
         <w:pStyle w:val="TextBody"/>
       </w:pPr>
       <w:r>
-        <w:t xml:space="preserve">CITAR:</w:t>
+        <w:t xml:space="preserve">This study describes the richness and density of zooplankton, comparatively between two small head water streams subject to different levels of environmental pressures. One originates withing a protected area - Biological Reserve, or REBIO, according to</w:t>
       </w:r>
       <w:r>
         <w:t xml:space="preserve"> </w:t>
       </w:r>
       <w:r>
-        <w:t xml:space="preserve">(Gering et al. 2003, Crist et al. 2003, Veech et al. 2003, Baselga 2010, 2012, Ligeiro et al. 2010, Ávila et al. 2011, Shell and Collier 2018)</w:t>
-      </w:r>
-    </w:p>
-    <w:bookmarkStart w:id="12" w:name="objectives"/>
-    <w:p>
-      <w:pPr>
-        <w:pStyle w:val="Heading2"/>
-      </w:pPr>
-      <w:r>
-        <w:t xml:space="preserve">1.1 Objectives</w:t>
-      </w:r>
-    </w:p>
-    <w:p>
-      <w:pPr>
-        <w:pStyle w:val="FirstParagraph"/>
-      </w:pPr>
-      <w:r>
-        <w:t xml:space="preserve">This study describes the richness and density of zooplankton, comparatively between two small head water streams subject to different levels of environmental pressures. One originates withing a protected area - Biological Reserve, or REBIO, according to</w:t>
+        <w:t xml:space="preserve">BRASIL (2000)</w:t>
       </w:r>
       <w:r>
         <w:t xml:space="preserve"> </w:t>
       </w:r>
       <w:r>
-        <w:t xml:space="preserve">BRASIL (2000)</w:t>
+        <w:t xml:space="preserve">- and its course extends beyond its administrative boundaries</w:t>
       </w:r>
       <w:r>
         <w:t xml:space="preserve"> </w:t>
       </w:r>
       <w:r>
-        <w:t xml:space="preserve">- and its course extends beyond its administrative boundaries</w:t>
+        <w:t xml:space="preserve">(MMA 2003)</w:t>
+      </w:r>
+      <w:r>
+        <w:t xml:space="preserve">, and a second one that flows entirely outside of the protected area. Within this framework, we use hierarchical additive partitioning to evaluate the relative contribution of different spatial and temporal scales to the diversity of zooplankton assemblages. Given the importance of the Atlantic Forest to the biodiversity</w:t>
       </w:r>
       <w:r>
         <w:t xml:space="preserve"> </w:t>
       </w:r>
       <w:r>
-        <w:t xml:space="preserve">(MMA 2003)</w:t>
-      </w:r>
-      <w:r>
-        <w:t xml:space="preserve">, and a second one that flows entirely outside of the protected area. Within this framework, we use hierarchical additive partitioning to evaluate the relative contribution of different spatial and temporal scales to the diversity of zooplankton assemblages. Given the importance of the Atlantic Forest to the biodiversity</w:t>
+        <w:t xml:space="preserve">(Pereira et al. 2026)</w:t>
       </w:r>
       <w:r>
         <w:t xml:space="preserve"> </w:t>
       </w:r>
       <w:r>
-        <w:t xml:space="preserve">(Pereira et al. 2026)</w:t>
+        <w:t xml:space="preserve">and its fragmented stated north of the São Francisco river basin</w:t>
       </w:r>
       <w:r>
         <w:t xml:space="preserve"> </w:t>
       </w:r>
       <w:r>
-        <w:t xml:space="preserve">and its fragmented stated north of the São Francisco river basin</w:t>
+        <w:t xml:space="preserve">(Silva and Casteleti 2003)</w:t>
+      </w:r>
+      <w:r>
+        <w:t xml:space="preserve">, we aim with this study, (1) to infer environmental degradation from species turnover</w:t>
       </w:r>
       <w:r>
         <w:t xml:space="preserve"> </w:t>
       </w:r>
       <w:r>
-        <w:t xml:space="preserve">(Silva and Casteleti 2003)</w:t>
-      </w:r>
-      <w:r>
-        <w:t xml:space="preserve">, we aim with this study, (1) to infer environmental degradation from species turnover</w:t>
+        <w:t xml:space="preserve">(Baselga 2010)</w:t>
       </w:r>
       <w:r>
         <w:t xml:space="preserve"> </w:t>
       </w:r>
       <w:r>
-        <w:t xml:space="preserve">(Baselga 2010)</w:t>
+        <w:t xml:space="preserve">and (2) to associate beta-diversity to the ecological health of sites inside and surrounding a protected area of Atlantic Forest. Given the expected different levels of environmental pressures in the area</w:t>
       </w:r>
       <w:r>
         <w:t xml:space="preserve"> </w:t>
       </w:r>
       <w:r>
-        <w:t xml:space="preserve">and (2) to associate beta-diversity to the ecological health of sites inside and surrounding a protected area of Atlantic Forest. Given the expected different levels of environmental pressures in the area</w:t>
-      </w:r>
-      <w:r>
-        <w:t xml:space="preserve"> </w:t>
-      </w:r>
-      <w:r>
         <w:t xml:space="preserve">(Gouveia et al. 2017)</w:t>
       </w:r>
       <w:r>
-        <w:t xml:space="preserve">, we hypothesize that the diversity is not be homogeneously distributed among the different spatial scales but concentrated at the finer levels and seasonal variation will be limited to species composition, but no spacial variation is expected between dry and wet seasons. Some environmental features (reach morphology, habitat structure, and water quality) are also described to explore possible explaining factors for the observed patterns. Ultimately, this study generates key baseline data on the ecological condition of the studied streams and the ecological mechanisms structuring zooplankton communities, contributing to safer conservation strategies in Atlantic Forest remnants.</w:t>
+        <w:t xml:space="preserve">, we hypothesize that the diversity is not be homogeneously distributed among the different spatial scales but concentrated at the finer levels and seasonal variation will be limited to species composition, but no spacial variation is expected between dry and wet seasons. Some environmental features (reach morphology, habitat structure, and water quality) are also described to explore possible explaining factors for the observed patterns. Ultimately, this study intends to generate key baseline data on the ecological condition of the studied streams and the ecological mechanisms structuring zooplankton communities, contributing to optimal conservation strategies in Atlantic Forest streams.</w:t>
       </w:r>
     </w:p>
     <w:bookmarkEnd w:id="12"/>
-    <w:bookmarkEnd w:id="13"/>
-    <w:bookmarkStart w:id="18" w:name="material-and-methods"/>
+    <w:bookmarkStart w:id="17" w:name="material-and-methods"/>
     <w:p>
       <w:pPr>
         <w:pStyle w:val="Heading1"/>
@@ -843,7 +757,7 @@
         <w:t xml:space="preserve">2. Material and methods</w:t>
       </w:r>
     </w:p>
-    <w:bookmarkStart w:id="14" w:name="study-area-and-sampling-design"/>
+    <w:bookmarkStart w:id="13" w:name="study-area-and-sampling-design"/>
     <w:p>
       <w:pPr>
         <w:pStyle w:val="Heading2"/>
@@ -975,8 +889,8 @@
         <w:t xml:space="preserve">). Sampling was conducted during the dry (January-February) and wet (June-July) seasons of 2024.</w:t>
       </w:r>
     </w:p>
-    <w:bookmarkEnd w:id="14"/>
-    <w:bookmarkStart w:id="15" w:name="environmental-data-collection"/>
+    <w:bookmarkEnd w:id="13"/>
+    <w:bookmarkStart w:id="14" w:name="environmental-data-collection"/>
     <w:p>
       <w:pPr>
         <w:pStyle w:val="Heading2"/>
@@ -1073,8 +987,8 @@
         <w:t xml:space="preserve">.</w:t>
       </w:r>
     </w:p>
-    <w:bookmarkEnd w:id="15"/>
-    <w:bookmarkStart w:id="16" w:name="zooplankton-sampling"/>
+    <w:bookmarkEnd w:id="14"/>
+    <w:bookmarkStart w:id="15" w:name="zooplankton-sampling"/>
     <w:p>
       <w:pPr>
         <w:pStyle w:val="Heading2"/>
@@ -1118,8 +1032,8 @@
         <w:t xml:space="preserve">.</w:t>
       </w:r>
     </w:p>
-    <w:bookmarkEnd w:id="16"/>
-    <w:bookmarkStart w:id="17" w:name="statistical-analyses"/>
+    <w:bookmarkEnd w:id="15"/>
+    <w:bookmarkStart w:id="16" w:name="statistical-analyses"/>
     <w:p>
       <w:pPr>
         <w:pStyle w:val="Heading2"/>
@@ -1810,9 +1724,9 @@
         <w:t xml:space="preserve">.</w:t>
       </w:r>
     </w:p>
+    <w:bookmarkEnd w:id="16"/>
     <w:bookmarkEnd w:id="17"/>
-    <w:bookmarkEnd w:id="18"/>
-    <w:bookmarkStart w:id="19" w:name="results"/>
+    <w:bookmarkStart w:id="18" w:name="results"/>
     <w:p>
       <w:pPr>
         <w:pStyle w:val="Heading1"/>
@@ -3599,8 +3513,8 @@
         <w:t xml:space="preserve">-values). These positive effect sizes confirm that spatial species turnover among sites is the primary driver structuring zooplankton assemblages within both streams regardless of seasonality.</w:t>
       </w:r>
     </w:p>
-    <w:bookmarkEnd w:id="19"/>
-    <w:bookmarkStart w:id="20" w:name="discussion"/>
+    <w:bookmarkEnd w:id="18"/>
+    <w:bookmarkStart w:id="19" w:name="discussion"/>
     <w:p>
       <w:pPr>
         <w:pStyle w:val="Heading1"/>
@@ -3617,8 +3531,45 @@
         <w:t xml:space="preserve">Depth and width showed greater variations across sites as a result from the fact the streams are barred at some points from roads for local traffic and small dams for water storage. Stream width and depth showed greater variations reflecting the range of habitats along the study streams, from small and narrow streams to wider and deeper manmade reservoirs.</w:t>
       </w:r>
     </w:p>
-    <w:bookmarkEnd w:id="20"/>
-    <w:bookmarkStart w:id="21" w:name="conclusions"/>
+    <w:p>
+      <w:pPr>
+        <w:pStyle w:val="TextBody"/>
+      </w:pPr>
+      <w:r>
+        <w:t xml:space="preserve">–&gt;</w:t>
+      </w:r>
+      <w:r>
+        <w:t xml:space="preserve"> </w:t>
+      </w:r>
+      <w:r>
+        <w:t xml:space="preserve">Bush et al. (2016)</w:t>
+      </w:r>
+      <w:r>
+        <w:t xml:space="preserve">;</w:t>
+      </w:r>
+      <w:r>
+        <w:t xml:space="preserve"> </w:t>
+      </w:r>
+      <w:r>
+        <w:t xml:space="preserve">Socolar et al. (2016)</w:t>
+      </w:r>
+    </w:p>
+    <w:p>
+      <w:pPr>
+        <w:pStyle w:val="TextBody"/>
+      </w:pPr>
+      <w:r>
+        <w:t xml:space="preserve">To be effective, diversity conservation must be multi-scaled, targeting local and regional processes. See</w:t>
+      </w:r>
+      <w:r>
+        <w:t xml:space="preserve"> </w:t>
+      </w:r>
+      <w:r>
+        <w:t xml:space="preserve">(Wishart and Davies 2003, Cheung and Burrows 2024, Bedrij et al. 2026)</w:t>
+      </w:r>
+    </w:p>
+    <w:bookmarkEnd w:id="19"/>
+    <w:bookmarkStart w:id="20" w:name="conclusions"/>
     <w:p>
       <w:pPr>
         <w:pStyle w:val="Heading1"/>
@@ -3627,8 +3578,8 @@
         <w:t xml:space="preserve">Conclusions</w:t>
       </w:r>
     </w:p>
-    <w:bookmarkEnd w:id="21"/>
-    <w:bookmarkStart w:id="22" w:name="acknowledgements"/>
+    <w:bookmarkEnd w:id="20"/>
+    <w:bookmarkStart w:id="21" w:name="acknowledgements"/>
     <w:p>
       <w:pPr>
         <w:pStyle w:val="Heading1"/>
@@ -3645,8 +3596,8 @@
         <w:t xml:space="preserve">We are greatly indebted to the staff of the REBIO Guaribas for field work assistance. LCA is grateful to Programa de Pós-Graduação em Ecologia e Conservação (PPGEC-UEPB) and CAPES for scholarship granted. EGS, MMSM and MVBS are grateful to Programa de Iniciação Científica (PIBIC-UEPB) and CNPq for scholarship granted.</w:t>
       </w:r>
     </w:p>
-    <w:bookmarkEnd w:id="22"/>
-    <w:bookmarkStart w:id="23" w:name="authorship-contribution-statement"/>
+    <w:bookmarkEnd w:id="21"/>
+    <w:bookmarkStart w:id="22" w:name="authorship-contribution-statement"/>
     <w:p>
       <w:pPr>
         <w:pStyle w:val="Heading1"/>
@@ -3712,8 +3663,8 @@
         <w:t xml:space="preserve">Elvio Sergio Figueredo Medeiros: Conceptualization, Data Curation, Formal Analysis, Funding Acquisition, Investigation, Methodology, Project Administration, Resources, Software, Supervision, Validation, Visualization, Writing – original draft, Writing – review &amp; editing.</w:t>
       </w:r>
     </w:p>
-    <w:bookmarkEnd w:id="23"/>
-    <w:bookmarkStart w:id="24" w:name="ethical-approval"/>
+    <w:bookmarkEnd w:id="22"/>
+    <w:bookmarkStart w:id="23" w:name="ethical-approval"/>
     <w:p>
       <w:pPr>
         <w:pStyle w:val="Heading1"/>
@@ -3730,8 +3681,8 @@
         <w:t xml:space="preserve">Activities inside the REBIO Guaribas were authorized by the Instituto Chico Mendes de Conservação da Biodiversidade (license no. SISBIO-89415-1, SISBIO-89429-2 and SISBIO-89415-2).</w:t>
       </w:r>
     </w:p>
-    <w:bookmarkEnd w:id="24"/>
-    <w:bookmarkStart w:id="25" w:name="X1f74eb43af444059c7518034463b6c89b1cacf4"/>
+    <w:bookmarkEnd w:id="23"/>
+    <w:bookmarkStart w:id="24" w:name="X1f74eb43af444059c7518034463b6c89b1cacf4"/>
     <w:p>
       <w:pPr>
         <w:pStyle w:val="Heading1"/>
@@ -3757,8 +3708,8 @@
         <w:t xml:space="preserve">.</w:t>
       </w:r>
     </w:p>
-    <w:bookmarkEnd w:id="25"/>
-    <w:bookmarkStart w:id="176" w:name="references"/>
+    <w:bookmarkEnd w:id="24"/>
+    <w:bookmarkStart w:id="191" w:name="references"/>
     <w:p>
       <w:pPr>
         <w:pStyle w:val="Heading1"/>
@@ -3767,8 +3718,8 @@
         <w:t xml:space="preserve">References</w:t>
       </w:r>
     </w:p>
-    <w:bookmarkStart w:id="175" w:name="refs"/>
-    <w:bookmarkStart w:id="27" w:name="ref-akhyar2026"/>
+    <w:bookmarkStart w:id="190" w:name="refs"/>
+    <w:bookmarkStart w:id="26" w:name="ref-akhyar2026"/>
     <w:p>
       <w:pPr>
         <w:pStyle w:val="Bibliography"/>
@@ -3779,7 +3730,7 @@
       <w:r>
         <w:t xml:space="preserve"> </w:t>
       </w:r>
-      <w:hyperlink r:id="rId26">
+      <w:hyperlink r:id="rId25">
         <w:r>
           <w:rPr>
             <w:rStyle w:val="Hyperlink"/>
@@ -3791,8 +3742,8 @@
         <w:t xml:space="preserve">. Biodiversity and Conservation 35:79.</w:t>
       </w:r>
     </w:p>
-    <w:bookmarkEnd w:id="27"/>
-    <w:bookmarkStart w:id="29" w:name="ref-altindag2025"/>
+    <w:bookmarkEnd w:id="26"/>
+    <w:bookmarkStart w:id="28" w:name="ref-altindag2025"/>
     <w:p>
       <w:pPr>
         <w:pStyle w:val="Bibliography"/>
@@ -3803,7 +3754,7 @@
       <w:r>
         <w:t xml:space="preserve"> </w:t>
       </w:r>
-      <w:hyperlink r:id="rId28">
+      <w:hyperlink r:id="rId27">
         <w:r>
           <w:rPr>
             <w:rStyle w:val="Hyperlink"/>
@@ -3815,19 +3766,43 @@
         <w:t xml:space="preserve">. Desalination and Water Treatment 321:100991.</w:t>
       </w:r>
     </w:p>
-    <w:bookmarkEnd w:id="29"/>
-    <w:bookmarkStart w:id="31" w:name="ref-anderson2013"/>
+    <w:bookmarkEnd w:id="28"/>
+    <w:bookmarkStart w:id="30" w:name="ref-amaral2024"/>
     <w:p>
       <w:pPr>
         <w:pStyle w:val="Bibliography"/>
       </w:pPr>
       <w:r>
+        <w:t xml:space="preserve">Amaral, D. C., F. De Fátima Bomfim, and F. A. Lansac-Tôha. 2024.</w:t>
+      </w:r>
+      <w:r>
+        <w:t xml:space="preserve"> </w:t>
+      </w:r>
+      <w:hyperlink r:id="rId29">
+        <w:r>
+          <w:rPr>
+            <w:rStyle w:val="Hyperlink"/>
+          </w:rPr>
+          <w:t xml:space="preserve">Drivers of zooplankton functional and taxonomic β-diversity in two neotropical floodplains: Implications for conservation</w:t>
+        </w:r>
+      </w:hyperlink>
+      <w:r>
+        <w:t xml:space="preserve">. Biodiversity and Conservation 33:3905–3922.</w:t>
+      </w:r>
+    </w:p>
+    <w:bookmarkEnd w:id="30"/>
+    <w:bookmarkStart w:id="32" w:name="ref-anderson2013"/>
+    <w:p>
+      <w:pPr>
+        <w:pStyle w:val="Bibliography"/>
+      </w:pPr>
+      <w:r>
         <w:t xml:space="preserve">Anderson, M. J., and D. C. I. Walsh. 2013.</w:t>
       </w:r>
       <w:r>
         <w:t xml:space="preserve"> </w:t>
       </w:r>
-      <w:hyperlink r:id="rId30">
+      <w:hyperlink r:id="rId31">
         <w:r>
           <w:rPr>
             <w:rStyle w:val="Hyperlink"/>
@@ -3839,8 +3814,8 @@
         <w:t xml:space="preserve"> Ecological Monographs 83:557574.</w:t>
       </w:r>
     </w:p>
-    <w:bookmarkEnd w:id="31"/>
-    <w:bookmarkStart w:id="33" w:name="ref-apha1998"/>
+    <w:bookmarkEnd w:id="32"/>
+    <w:bookmarkStart w:id="34" w:name="ref-apha1998"/>
     <w:p>
       <w:pPr>
         <w:pStyle w:val="Bibliography"/>
@@ -3851,7 +3826,7 @@
       <w:r>
         <w:t xml:space="preserve"> </w:t>
       </w:r>
-      <w:hyperlink r:id="rId32">
+      <w:hyperlink r:id="rId33">
         <w:r>
           <w:rPr>
             <w:rStyle w:val="Hyperlink"/>
@@ -3863,8 +3838,8 @@
         <w:t xml:space="preserve">. American Public Health Association, Washington, DC.</w:t>
       </w:r>
     </w:p>
-    <w:bookmarkEnd w:id="33"/>
-    <w:bookmarkStart w:id="35" w:name="ref-arruda2013"/>
+    <w:bookmarkEnd w:id="34"/>
+    <w:bookmarkStart w:id="36" w:name="ref-arruda2013"/>
     <w:p>
       <w:pPr>
         <w:pStyle w:val="Bibliography"/>
@@ -3875,7 +3850,7 @@
       <w:r>
         <w:t xml:space="preserve"> </w:t>
       </w:r>
-      <w:hyperlink r:id="rId34">
+      <w:hyperlink r:id="rId35">
         <w:r>
           <w:rPr>
             <w:rStyle w:val="Hyperlink"/>
@@ -3887,8 +3862,8 @@
         <w:t xml:space="preserve">. Revista Direitos Emergentes na Sociedade Global 2:280–304.</w:t>
       </w:r>
     </w:p>
-    <w:bookmarkEnd w:id="35"/>
-    <w:bookmarkStart w:id="37" w:name="ref-ávila2011"/>
+    <w:bookmarkEnd w:id="36"/>
+    <w:bookmarkStart w:id="38" w:name="ref-ávila2011"/>
     <w:p>
       <w:pPr>
         <w:pStyle w:val="Bibliography"/>
@@ -3899,7 +3874,7 @@
       <w:r>
         <w:t xml:space="preserve"> </w:t>
       </w:r>
-      <w:hyperlink r:id="rId36">
+      <w:hyperlink r:id="rId37">
         <w:r>
           <w:rPr>
             <w:rStyle w:val="Hyperlink"/>
@@ -3911,8 +3886,8 @@
         <w:t xml:space="preserve">. Wetlands 31:459–469.</w:t>
       </w:r>
     </w:p>
-    <w:bookmarkEnd w:id="37"/>
-    <w:bookmarkStart w:id="39" w:name="ref-balkic2022"/>
+    <w:bookmarkEnd w:id="38"/>
+    <w:bookmarkStart w:id="40" w:name="ref-balkic2022"/>
     <w:p>
       <w:pPr>
         <w:pStyle w:val="Bibliography"/>
@@ -3923,7 +3898,7 @@
       <w:r>
         <w:t xml:space="preserve"> </w:t>
       </w:r>
-      <w:hyperlink r:id="rId38">
+      <w:hyperlink r:id="rId39">
         <w:r>
           <w:rPr>
             <w:rStyle w:val="Hyperlink"/>
@@ -3935,8 +3910,8 @@
         <w:t xml:space="preserve">. Environmental Research 212:113563.</w:t>
       </w:r>
     </w:p>
-    <w:bookmarkEnd w:id="39"/>
-    <w:bookmarkStart w:id="41" w:name="ref-barboza2024"/>
+    <w:bookmarkEnd w:id="40"/>
+    <w:bookmarkStart w:id="42" w:name="ref-barboza2024"/>
     <w:p>
       <w:pPr>
         <w:pStyle w:val="Bibliography"/>
@@ -3947,7 +3922,7 @@
       <w:r>
         <w:t xml:space="preserve"> </w:t>
       </w:r>
-      <w:hyperlink r:id="rId40">
+      <w:hyperlink r:id="rId41">
         <w:r>
           <w:rPr>
             <w:rStyle w:val="Hyperlink"/>
@@ -3959,8 +3934,8 @@
         <w:t xml:space="preserve">. Limnologica 106:126170.</w:t>
       </w:r>
     </w:p>
-    <w:bookmarkEnd w:id="41"/>
-    <w:bookmarkStart w:id="43" w:name="ref-baselga2010"/>
+    <w:bookmarkEnd w:id="42"/>
+    <w:bookmarkStart w:id="44" w:name="ref-baselga2010"/>
     <w:p>
       <w:pPr>
         <w:pStyle w:val="Bibliography"/>
@@ -3971,7 +3946,7 @@
       <w:r>
         <w:t xml:space="preserve"> </w:t>
       </w:r>
-      <w:hyperlink r:id="rId42">
+      <w:hyperlink r:id="rId43">
         <w:r>
           <w:rPr>
             <w:rStyle w:val="Hyperlink"/>
@@ -3983,8 +3958,8 @@
         <w:t xml:space="preserve">. Global Ecology and Biogeography 19:134–143.</w:t>
       </w:r>
     </w:p>
-    <w:bookmarkEnd w:id="43"/>
-    <w:bookmarkStart w:id="45" w:name="ref-baselga2012"/>
+    <w:bookmarkEnd w:id="44"/>
+    <w:bookmarkStart w:id="46" w:name="ref-baselga2012"/>
     <w:p>
       <w:pPr>
         <w:pStyle w:val="Bibliography"/>
@@ -3995,7 +3970,7 @@
       <w:r>
         <w:t xml:space="preserve"> </w:t>
       </w:r>
-      <w:hyperlink r:id="rId44">
+      <w:hyperlink r:id="rId45">
         <w:r>
           <w:rPr>
             <w:rStyle w:val="Hyperlink"/>
@@ -4007,19 +3982,43 @@
         <w:t xml:space="preserve">. Global Ecology and Biogeography 21:1223–1232.</w:t>
       </w:r>
     </w:p>
-    <w:bookmarkEnd w:id="45"/>
-    <w:bookmarkStart w:id="47" w:name="ref-belbin1993"/>
+    <w:bookmarkEnd w:id="46"/>
+    <w:bookmarkStart w:id="48" w:name="ref-bedrij2026"/>
     <w:p>
       <w:pPr>
         <w:pStyle w:val="Bibliography"/>
       </w:pPr>
       <w:r>
+        <w:t xml:space="preserve">Bedrij, N. A., L. Montti, H. A. Keller, L. N. López, and S. J. E. Velazco. 2026.</w:t>
+      </w:r>
+      <w:r>
+        <w:t xml:space="preserve"> </w:t>
+      </w:r>
+      <w:hyperlink r:id="rId47">
+        <w:r>
+          <w:rPr>
+            <w:rStyle w:val="Hyperlink"/>
+          </w:rPr>
+          <w:t xml:space="preserve">Beyond protected areas: The synergistic role of forest territorial planning in safeguarding tree diversity</w:t>
+        </w:r>
+      </w:hyperlink>
+      <w:r>
+        <w:t xml:space="preserve">. Biological Conservation 321:111982.</w:t>
+      </w:r>
+    </w:p>
+    <w:bookmarkEnd w:id="48"/>
+    <w:bookmarkStart w:id="50" w:name="ref-belbin1993"/>
+    <w:p>
+      <w:pPr>
+        <w:pStyle w:val="Bibliography"/>
+      </w:pPr>
+      <w:r>
         <w:t xml:space="preserve">Belbin, L., and C. McDonald. 1993.</w:t>
       </w:r>
       <w:r>
         <w:t xml:space="preserve"> </w:t>
       </w:r>
-      <w:hyperlink r:id="rId46">
+      <w:hyperlink r:id="rId49">
         <w:r>
           <w:rPr>
             <w:rStyle w:val="Hyperlink"/>
@@ -4031,8 +4030,8 @@
         <w:t xml:space="preserve">. Journal of Vegetation Science 4:341–348.</w:t>
       </w:r>
     </w:p>
-    <w:bookmarkEnd w:id="47"/>
-    <w:bookmarkStart w:id="49" w:name="ref-bonecker2013"/>
+    <w:bookmarkEnd w:id="50"/>
+    <w:bookmarkStart w:id="52" w:name="ref-bonecker2013"/>
     <w:p>
       <w:pPr>
         <w:pStyle w:val="Bibliography"/>
@@ -4043,7 +4042,7 @@
       <w:r>
         <w:t xml:space="preserve"> </w:t>
       </w:r>
-      <w:hyperlink r:id="rId48">
+      <w:hyperlink r:id="rId51">
         <w:r>
           <w:rPr>
             <w:rStyle w:val="Hyperlink"/>
@@ -4055,8 +4054,8 @@
         <w:t xml:space="preserve">. Limnologica 43:114–121.</w:t>
       </w:r>
     </w:p>
-    <w:bookmarkEnd w:id="49"/>
-    <w:bookmarkStart w:id="51" w:name="ref-brasil2000"/>
+    <w:bookmarkEnd w:id="52"/>
+    <w:bookmarkStart w:id="54" w:name="ref-brasil2000"/>
     <w:p>
       <w:pPr>
         <w:pStyle w:val="Bibliography"/>
@@ -4067,7 +4066,7 @@
       <w:r>
         <w:t xml:space="preserve"> </w:t>
       </w:r>
-      <w:hyperlink r:id="rId50">
+      <w:hyperlink r:id="rId53">
         <w:r>
           <w:rPr>
             <w:rStyle w:val="Hyperlink"/>
@@ -4076,19 +4075,67 @@
         </w:r>
       </w:hyperlink>
     </w:p>
-    <w:bookmarkEnd w:id="51"/>
-    <w:bookmarkStart w:id="53" w:name="ref-cnpq2026"/>
+    <w:bookmarkEnd w:id="54"/>
+    <w:bookmarkStart w:id="56" w:name="ref-bush2016"/>
     <w:p>
       <w:pPr>
         <w:pStyle w:val="Bibliography"/>
       </w:pPr>
       <w:r>
+        <w:t xml:space="preserve">Bush, A., T. Harwood, A. J. Hoskins, K. Mokany, and S. Ferrier. 2016.</w:t>
+      </w:r>
+      <w:r>
+        <w:t xml:space="preserve"> </w:t>
+      </w:r>
+      <w:hyperlink r:id="rId55">
+        <w:r>
+          <w:rPr>
+            <w:rStyle w:val="Hyperlink"/>
+          </w:rPr>
+          <w:t xml:space="preserve">Current uses of beta-diversity in biodiversity conservation: A response to socolar et al.</w:t>
+        </w:r>
+      </w:hyperlink>
+      <w:r>
+        <w:t xml:space="preserve"> Trends in Ecology &amp; Evolution 31:337–338.</w:t>
+      </w:r>
+    </w:p>
+    <w:bookmarkEnd w:id="56"/>
+    <w:bookmarkStart w:id="58" w:name="ref-cheung2024"/>
+    <w:p>
+      <w:pPr>
+        <w:pStyle w:val="Bibliography"/>
+      </w:pPr>
+      <w:r>
+        <w:t xml:space="preserve">Cheung, W. C. D., and R. M. Burrows. 2024.</w:t>
+      </w:r>
+      <w:r>
+        <w:t xml:space="preserve"> </w:t>
+      </w:r>
+      <w:hyperlink r:id="rId57">
+        <w:r>
+          <w:rPr>
+            <w:rStyle w:val="Hyperlink"/>
+          </w:rPr>
+          <w:t xml:space="preserve">Structural and functional indicators in freshwater ecosystem monitoring programs</w:t>
+        </w:r>
+      </w:hyperlink>
+      <w:r>
+        <w:t xml:space="preserve">. Ecological Management &amp; Restoration 25:3–13.</w:t>
+      </w:r>
+    </w:p>
+    <w:bookmarkEnd w:id="58"/>
+    <w:bookmarkStart w:id="60" w:name="ref-cnpq2026"/>
+    <w:p>
+      <w:pPr>
+        <w:pStyle w:val="Bibliography"/>
+      </w:pPr>
+      <w:r>
         <w:t xml:space="preserve">CNPq. 2026.</w:t>
       </w:r>
       <w:r>
         <w:t xml:space="preserve"> </w:t>
       </w:r>
-      <w:hyperlink r:id="rId52">
+      <w:hyperlink r:id="rId59">
         <w:r>
           <w:rPr>
             <w:rStyle w:val="Hyperlink"/>
@@ -4100,8 +4147,8 @@
         <w:t xml:space="preserve">.</w:t>
       </w:r>
     </w:p>
-    <w:bookmarkEnd w:id="53"/>
-    <w:bookmarkStart w:id="55" w:name="ref-credit2026"/>
+    <w:bookmarkEnd w:id="60"/>
+    <w:bookmarkStart w:id="62" w:name="ref-credit2026"/>
     <w:p>
       <w:pPr>
         <w:pStyle w:val="Bibliography"/>
@@ -4112,7 +4159,7 @@
       <w:r>
         <w:t xml:space="preserve"> </w:t>
       </w:r>
-      <w:hyperlink r:id="rId54">
+      <w:hyperlink r:id="rId61">
         <w:r>
           <w:rPr>
             <w:rStyle w:val="Hyperlink"/>
@@ -4124,8 +4171,8 @@
         <w:t xml:space="preserve">. NISO/CRediT Standing Committee.</w:t>
       </w:r>
     </w:p>
-    <w:bookmarkEnd w:id="55"/>
-    <w:bookmarkStart w:id="57" w:name="ref-crist2003"/>
+    <w:bookmarkEnd w:id="62"/>
+    <w:bookmarkStart w:id="64" w:name="ref-crist2003"/>
     <w:p>
       <w:pPr>
         <w:pStyle w:val="Bibliography"/>
@@ -4136,7 +4183,7 @@
       <w:r>
         <w:t xml:space="preserve"> </w:t>
       </w:r>
-      <w:hyperlink r:id="rId56">
+      <w:hyperlink r:id="rId63">
         <w:r>
           <w:rPr>
             <w:rStyle w:val="Hyperlink"/>
@@ -4148,8 +4195,8 @@
         <w:t xml:space="preserve">. The American Naturalist 162:734–743.</w:t>
       </w:r>
     </w:p>
-    <w:bookmarkEnd w:id="57"/>
-    <w:bookmarkStart w:id="59" w:name="ref-england2004"/>
+    <w:bookmarkEnd w:id="64"/>
+    <w:bookmarkStart w:id="66" w:name="ref-england2004"/>
     <w:p>
       <w:pPr>
         <w:pStyle w:val="Bibliography"/>
@@ -4160,7 +4207,7 @@
       <w:r>
         <w:t xml:space="preserve"> </w:t>
       </w:r>
-      <w:hyperlink r:id="rId58">
+      <w:hyperlink r:id="rId65">
         <w:r>
           <w:rPr>
             <w:rStyle w:val="Hyperlink"/>
@@ -4184,8 +4231,8 @@
         <w:t xml:space="preserve">. Freshwater Biology 49:721–734.</w:t>
       </w:r>
     </w:p>
-    <w:bookmarkEnd w:id="59"/>
-    <w:bookmarkStart w:id="61" w:name="ref-epa2020"/>
+    <w:bookmarkEnd w:id="66"/>
+    <w:bookmarkStart w:id="68" w:name="ref-epa2020"/>
     <w:p>
       <w:pPr>
         <w:pStyle w:val="Bibliography"/>
@@ -4196,7 +4243,7 @@
       <w:r>
         <w:t xml:space="preserve"> </w:t>
       </w:r>
-      <w:hyperlink r:id="rId60">
+      <w:hyperlink r:id="rId67">
         <w:r>
           <w:rPr>
             <w:rStyle w:val="Hyperlink"/>
@@ -4208,8 +4255,8 @@
         <w:t xml:space="preserve">.</w:t>
       </w:r>
     </w:p>
-    <w:bookmarkEnd w:id="61"/>
-    <w:bookmarkStart w:id="63" w:name="ref-farias2020"/>
+    <w:bookmarkEnd w:id="68"/>
+    <w:bookmarkStart w:id="70" w:name="ref-farias2020"/>
     <w:p>
       <w:pPr>
         <w:pStyle w:val="Bibliography"/>
@@ -4220,7 +4267,7 @@
       <w:r>
         <w:t xml:space="preserve"> </w:t>
       </w:r>
-      <w:hyperlink r:id="rId62">
+      <w:hyperlink r:id="rId69">
         <w:r>
           <w:rPr>
             <w:rStyle w:val="Hyperlink"/>
@@ -4232,8 +4279,8 @@
         <w:t xml:space="preserve">. Inland Waters 10:480–492.</w:t>
       </w:r>
     </w:p>
-    <w:bookmarkEnd w:id="63"/>
-    <w:bookmarkStart w:id="65" w:name="ref-farris1969"/>
+    <w:bookmarkEnd w:id="70"/>
+    <w:bookmarkStart w:id="72" w:name="ref-farris1969"/>
     <w:p>
       <w:pPr>
         <w:pStyle w:val="Bibliography"/>
@@ -4244,7 +4291,7 @@
       <w:r>
         <w:t xml:space="preserve"> </w:t>
       </w:r>
-      <w:hyperlink r:id="rId64">
+      <w:hyperlink r:id="rId71">
         <w:r>
           <w:rPr>
             <w:rStyle w:val="Hyperlink"/>
@@ -4256,8 +4303,8 @@
         <w:t xml:space="preserve">. Systematic Zoology 18:279.</w:t>
       </w:r>
     </w:p>
-    <w:bookmarkEnd w:id="65"/>
-    <w:bookmarkStart w:id="67" w:name="ref-fonseca1985"/>
+    <w:bookmarkEnd w:id="72"/>
+    <w:bookmarkStart w:id="74" w:name="ref-fonseca1985"/>
     <w:p>
       <w:pPr>
         <w:pStyle w:val="Bibliography"/>
@@ -4268,7 +4315,7 @@
       <w:r>
         <w:t xml:space="preserve"> </w:t>
       </w:r>
-      <w:hyperlink r:id="rId66">
+      <w:hyperlink r:id="rId73">
         <w:r>
           <w:rPr>
             <w:rStyle w:val="Hyperlink"/>
@@ -4280,8 +4327,8 @@
         <w:t xml:space="preserve">. Biological Conservation 34:17–34.</w:t>
       </w:r>
     </w:p>
-    <w:bookmarkEnd w:id="67"/>
-    <w:bookmarkStart w:id="69" w:name="ref-freiry2020"/>
+    <w:bookmarkEnd w:id="74"/>
+    <w:bookmarkStart w:id="76" w:name="ref-freiry2020"/>
     <w:p>
       <w:pPr>
         <w:pStyle w:val="Bibliography"/>
@@ -4292,7 +4339,7 @@
       <w:r>
         <w:t xml:space="preserve"> </w:t>
       </w:r>
-      <w:hyperlink r:id="rId68">
+      <w:hyperlink r:id="rId75">
         <w:r>
           <w:rPr>
             <w:rStyle w:val="Hyperlink"/>
@@ -4310,8 +4357,8 @@
         <w:t xml:space="preserve">. Hydrobiologia 847:1327–1342.</w:t>
       </w:r>
     </w:p>
-    <w:bookmarkEnd w:id="69"/>
-    <w:bookmarkStart w:id="71" w:name="ref-frissell1986"/>
+    <w:bookmarkEnd w:id="76"/>
+    <w:bookmarkStart w:id="78" w:name="ref-frissell1986"/>
     <w:p>
       <w:pPr>
         <w:pStyle w:val="Bibliography"/>
@@ -4322,7 +4369,7 @@
       <w:r>
         <w:t xml:space="preserve"> </w:t>
       </w:r>
-      <w:hyperlink r:id="rId70">
+      <w:hyperlink r:id="rId77">
         <w:r>
           <w:rPr>
             <w:rStyle w:val="Hyperlink"/>
@@ -4334,8 +4381,8 @@
         <w:t xml:space="preserve">. Environmental Management 10:199–214.</w:t>
       </w:r>
     </w:p>
-    <w:bookmarkEnd w:id="71"/>
-    <w:bookmarkStart w:id="73" w:name="ref-gering2003"/>
+    <w:bookmarkEnd w:id="78"/>
+    <w:bookmarkStart w:id="80" w:name="ref-gering2003"/>
     <w:p>
       <w:pPr>
         <w:pStyle w:val="Bibliography"/>
@@ -4346,7 +4393,7 @@
       <w:r>
         <w:t xml:space="preserve"> </w:t>
       </w:r>
-      <w:hyperlink r:id="rId72">
+      <w:hyperlink r:id="rId79">
         <w:r>
           <w:rPr>
             <w:rStyle w:val="Hyperlink"/>
@@ -4358,8 +4405,8 @@
         <w:t xml:space="preserve">. Conservation Biology 17:488–499.</w:t>
       </w:r>
     </w:p>
-    <w:bookmarkEnd w:id="73"/>
-    <w:bookmarkStart w:id="75" w:name="ref-gotelli2001"/>
+    <w:bookmarkEnd w:id="80"/>
+    <w:bookmarkStart w:id="82" w:name="ref-gotelli2001"/>
     <w:p>
       <w:pPr>
         <w:pStyle w:val="Bibliography"/>
@@ -4370,7 +4417,7 @@
       <w:r>
         <w:t xml:space="preserve"> </w:t>
       </w:r>
-      <w:hyperlink r:id="rId74">
+      <w:hyperlink r:id="rId81">
         <w:r>
           <w:rPr>
             <w:rStyle w:val="Hyperlink"/>
@@ -4382,8 +4429,8 @@
         <w:t xml:space="preserve">. Ecology Letters 4:379–391.</w:t>
       </w:r>
     </w:p>
-    <w:bookmarkEnd w:id="75"/>
-    <w:bookmarkStart w:id="77" w:name="ref-gotelli2002"/>
+    <w:bookmarkEnd w:id="82"/>
+    <w:bookmarkStart w:id="84" w:name="ref-gotelli2002"/>
     <w:p>
       <w:pPr>
         <w:pStyle w:val="Bibliography"/>
@@ -4394,7 +4441,7 @@
       <w:r>
         <w:t xml:space="preserve"> </w:t>
       </w:r>
-      <w:hyperlink r:id="rId76">
+      <w:hyperlink r:id="rId83">
         <w:r>
           <w:rPr>
             <w:rStyle w:val="Hyperlink"/>
@@ -4406,8 +4453,8 @@
         <w:t xml:space="preserve">. Ecology 83:2091–2096.</w:t>
       </w:r>
     </w:p>
-    <w:bookmarkEnd w:id="77"/>
-    <w:bookmarkStart w:id="79" w:name="ref-gouveia2017"/>
+    <w:bookmarkEnd w:id="84"/>
+    <w:bookmarkStart w:id="86" w:name="ref-gouveia2017"/>
     <w:p>
       <w:pPr>
         <w:pStyle w:val="Bibliography"/>
@@ -4418,7 +4465,7 @@
       <w:r>
         <w:t xml:space="preserve"> </w:t>
       </w:r>
-      <w:hyperlink r:id="rId78">
+      <w:hyperlink r:id="rId85">
         <w:r>
           <w:rPr>
             <w:rStyle w:val="Hyperlink"/>
@@ -4430,8 +4477,8 @@
         <w:t xml:space="preserve">. Check List 13:581–590.</w:t>
       </w:r>
     </w:p>
-    <w:bookmarkEnd w:id="79"/>
-    <w:bookmarkStart w:id="80" w:name="ref-haney1973"/>
+    <w:bookmarkEnd w:id="86"/>
+    <w:bookmarkStart w:id="87" w:name="ref-haney1973"/>
     <w:p>
       <w:pPr>
         <w:pStyle w:val="Bibliography"/>
@@ -4440,8 +4487,8 @@
         <w:t xml:space="preserve">Haney, J. F., and D. J. Hall. 1973. Sugar-coated daphnia: A preservation technique for cladocerans. Limnology and Oceanography 18:331–333.</w:t>
       </w:r>
     </w:p>
-    <w:bookmarkEnd w:id="80"/>
-    <w:bookmarkStart w:id="82" w:name="ref-heinrichs2017"/>
+    <w:bookmarkEnd w:id="87"/>
+    <w:bookmarkStart w:id="89" w:name="ref-heinrichs2017"/>
     <w:p>
       <w:pPr>
         <w:pStyle w:val="Bibliography"/>
@@ -4452,7 +4499,7 @@
       <w:r>
         <w:t xml:space="preserve"> </w:t>
       </w:r>
-      <w:hyperlink r:id="rId81">
+      <w:hyperlink r:id="rId88">
         <w:r>
           <w:rPr>
             <w:rStyle w:val="Hyperlink"/>
@@ -4480,19 +4527,43 @@
         <w:t xml:space="preserve">S. Dabbert, I. Lewandowski, J. Weiss, and A. Pyka, editors. Springer International Publishing, Cham, Switzerland.</w:t>
       </w:r>
     </w:p>
-    <w:bookmarkEnd w:id="82"/>
-    <w:bookmarkStart w:id="84" w:name="ref-jost2007"/>
+    <w:bookmarkEnd w:id="89"/>
+    <w:bookmarkStart w:id="91" w:name="ref-herbert2010"/>
     <w:p>
       <w:pPr>
         <w:pStyle w:val="Bibliography"/>
       </w:pPr>
       <w:r>
+        <w:t xml:space="preserve">Herbert, M. E., P. B. Mcintyre, P. J. Doran, J. D. Allan, and R. Abell. 2010.</w:t>
+      </w:r>
+      <w:r>
+        <w:t xml:space="preserve"> </w:t>
+      </w:r>
+      <w:hyperlink r:id="rId90">
+        <w:r>
+          <w:rPr>
+            <w:rStyle w:val="Hyperlink"/>
+          </w:rPr>
+          <w:t xml:space="preserve">Terrestrial reserve networks do not adequately represent aquatic ecosystems</w:t>
+        </w:r>
+      </w:hyperlink>
+      <w:r>
+        <w:t xml:space="preserve">. Conservation Biology 24:1002–1011.</w:t>
+      </w:r>
+    </w:p>
+    <w:bookmarkEnd w:id="91"/>
+    <w:bookmarkStart w:id="93" w:name="ref-jost2007"/>
+    <w:p>
+      <w:pPr>
+        <w:pStyle w:val="Bibliography"/>
+      </w:pPr>
+      <w:r>
         <w:t xml:space="preserve">Jost, L. 2007.</w:t>
       </w:r>
       <w:r>
         <w:t xml:space="preserve"> </w:t>
       </w:r>
-      <w:hyperlink r:id="rId83">
+      <w:hyperlink r:id="rId92">
         <w:r>
           <w:rPr>
             <w:rStyle w:val="Hyperlink"/>
@@ -4504,8 +4575,8 @@
         <w:t xml:space="preserve">. Ecology 88:2427–2439.</w:t>
       </w:r>
     </w:p>
-    <w:bookmarkEnd w:id="84"/>
-    <w:bookmarkStart w:id="86" w:name="ref-kaufman1990"/>
+    <w:bookmarkEnd w:id="93"/>
+    <w:bookmarkStart w:id="95" w:name="ref-kaufman1990"/>
     <w:p>
       <w:pPr>
         <w:pStyle w:val="Bibliography"/>
@@ -4516,7 +4587,7 @@
       <w:r>
         <w:t xml:space="preserve"> </w:t>
       </w:r>
-      <w:hyperlink r:id="rId85">
+      <w:hyperlink r:id="rId94">
         <w:r>
           <w:rPr>
             <w:rStyle w:val="Hyperlink"/>
@@ -4528,8 +4599,8 @@
         <w:t xml:space="preserve">. Pages 199–252. First edition. Wiley.</w:t>
       </w:r>
     </w:p>
-    <w:bookmarkEnd w:id="86"/>
-    <w:bookmarkStart w:id="88" w:name="ref-keppeler2004"/>
+    <w:bookmarkEnd w:id="95"/>
+    <w:bookmarkStart w:id="97" w:name="ref-keppeler2004"/>
     <w:p>
       <w:pPr>
         <w:pStyle w:val="Bibliography"/>
@@ -4540,7 +4611,7 @@
       <w:r>
         <w:t xml:space="preserve"> </w:t>
       </w:r>
-      <w:hyperlink r:id="rId87">
+      <w:hyperlink r:id="rId96">
         <w:r>
           <w:rPr>
             <w:rStyle w:val="Hyperlink"/>
@@ -4552,8 +4623,8 @@
         <w:t xml:space="preserve">. Revista Brasileira de Zoologia 21:233–241.</w:t>
       </w:r>
     </w:p>
-    <w:bookmarkEnd w:id="88"/>
-    <w:bookmarkStart w:id="90" w:name="ref-lande1996"/>
+    <w:bookmarkEnd w:id="97"/>
+    <w:bookmarkStart w:id="99" w:name="ref-lande1996"/>
     <w:p>
       <w:pPr>
         <w:pStyle w:val="Bibliography"/>
@@ -4564,7 +4635,7 @@
       <w:r>
         <w:t xml:space="preserve"> </w:t>
       </w:r>
-      <w:hyperlink r:id="rId89">
+      <w:hyperlink r:id="rId98">
         <w:r>
           <w:rPr>
             <w:rStyle w:val="Hyperlink"/>
@@ -4576,8 +4647,8 @@
         <w:t xml:space="preserve">. Oikos 76:5.</w:t>
       </w:r>
     </w:p>
-    <w:bookmarkEnd w:id="90"/>
-    <w:bookmarkStart w:id="91" w:name="ref-lê2008"/>
+    <w:bookmarkEnd w:id="99"/>
+    <w:bookmarkStart w:id="100" w:name="ref-lê2008"/>
     <w:p>
       <w:pPr>
         <w:pStyle w:val="Bibliography"/>
@@ -4586,8 +4657,8 @@
         <w:t xml:space="preserve">Lê, S., J. Josse, and F. Husson. 2008. FactoMineR: An r package for multivariate analysis. Journal of Statistical Software 25:1–18.</w:t>
       </w:r>
     </w:p>
-    <w:bookmarkEnd w:id="91"/>
-    <w:bookmarkStart w:id="92" w:name="ref-legendre1998"/>
+    <w:bookmarkEnd w:id="100"/>
+    <w:bookmarkStart w:id="101" w:name="ref-legendre1998"/>
     <w:p>
       <w:pPr>
         <w:pStyle w:val="Bibliography"/>
@@ -4596,8 +4667,8 @@
         <w:t xml:space="preserve">Legendre, P., and L. Legendre. 1998. Numerical ecology. 2nd English ed. Amsterdam, The Netherlands ; New York ; Oxford.</w:t>
       </w:r>
     </w:p>
-    <w:bookmarkEnd w:id="92"/>
-    <w:bookmarkStart w:id="94" w:name="ref-ligeiro2010"/>
+    <w:bookmarkEnd w:id="101"/>
+    <w:bookmarkStart w:id="103" w:name="ref-ligeiro2010"/>
     <w:p>
       <w:pPr>
         <w:pStyle w:val="Bibliography"/>
@@ -4608,7 +4679,7 @@
       <w:r>
         <w:t xml:space="preserve"> </w:t>
       </w:r>
-      <w:hyperlink r:id="rId93">
+      <w:hyperlink r:id="rId102">
         <w:r>
           <w:rPr>
             <w:rStyle w:val="Hyperlink"/>
@@ -4620,8 +4691,8 @@
         <w:t xml:space="preserve">. Freshwater Biology 55:424–435.</w:t>
       </w:r>
     </w:p>
-    <w:bookmarkEnd w:id="94"/>
-    <w:bookmarkStart w:id="96" w:name="ref-lôbo2011"/>
+    <w:bookmarkEnd w:id="103"/>
+    <w:bookmarkStart w:id="105" w:name="ref-lôbo2011"/>
     <w:p>
       <w:pPr>
         <w:pStyle w:val="Bibliography"/>
@@ -4632,7 +4703,7 @@
       <w:r>
         <w:t xml:space="preserve"> </w:t>
       </w:r>
-      <w:hyperlink r:id="rId95">
+      <w:hyperlink r:id="rId104">
         <w:r>
           <w:rPr>
             <w:rStyle w:val="Hyperlink"/>
@@ -4644,8 +4715,8 @@
         <w:t xml:space="preserve">. Diversity and Distributions 17:287–296.</w:t>
       </w:r>
     </w:p>
-    <w:bookmarkEnd w:id="96"/>
-    <w:bookmarkStart w:id="98" w:name="ref-lopes2014"/>
+    <w:bookmarkEnd w:id="105"/>
+    <w:bookmarkStart w:id="107" w:name="ref-lopes2014"/>
     <w:p>
       <w:pPr>
         <w:pStyle w:val="Bibliography"/>
@@ -4656,7 +4727,7 @@
       <w:r>
         <w:t xml:space="preserve"> </w:t>
       </w:r>
-      <w:hyperlink r:id="rId97">
+      <w:hyperlink r:id="rId106">
         <w:r>
           <w:rPr>
             <w:rStyle w:val="Hyperlink"/>
@@ -4668,8 +4739,8 @@
         <w:t xml:space="preserve">. PLoS ONE 9:e109581.</w:t>
       </w:r>
     </w:p>
-    <w:bookmarkEnd w:id="98"/>
-    <w:bookmarkStart w:id="100" w:name="ref-lucena2015"/>
+    <w:bookmarkEnd w:id="107"/>
+    <w:bookmarkStart w:id="109" w:name="ref-lucena2015"/>
     <w:p>
       <w:pPr>
         <w:pStyle w:val="Bibliography"/>
@@ -4680,7 +4751,7 @@
       <w:r>
         <w:t xml:space="preserve"> </w:t>
       </w:r>
-      <w:hyperlink r:id="rId99">
+      <w:hyperlink r:id="rId108">
         <w:r>
           <w:rPr>
             <w:rStyle w:val="Hyperlink"/>
@@ -4692,8 +4763,8 @@
         <w:t xml:space="preserve">. Acta Limnologica Brasiliensia 27:118–129.</w:t>
       </w:r>
     </w:p>
-    <w:bookmarkEnd w:id="100"/>
-    <w:bookmarkStart w:id="101" w:name="ref-mackereth1978"/>
+    <w:bookmarkEnd w:id="109"/>
+    <w:bookmarkStart w:id="110" w:name="ref-mackereth1978"/>
     <w:p>
       <w:pPr>
         <w:pStyle w:val="Bibliography"/>
@@ -4702,8 +4773,8 @@
         <w:t xml:space="preserve">Mackereth, F. J. H., J. Heron, and J. F. Talling. 1978. Water analysis: Some revised methods for limnologists.(scientific publication n. 36) freshwater biological association. Cumbria and Dorset, England.</w:t>
       </w:r>
     </w:p>
-    <w:bookmarkEnd w:id="101"/>
-    <w:bookmarkStart w:id="103" w:name="ref-maechler2026"/>
+    <w:bookmarkEnd w:id="110"/>
+    <w:bookmarkStart w:id="112" w:name="ref-maechler2026"/>
     <w:p>
       <w:pPr>
         <w:pStyle w:val="Bibliography"/>
@@ -4714,7 +4785,7 @@
       <w:r>
         <w:t xml:space="preserve"> </w:t>
       </w:r>
-      <w:hyperlink r:id="rId102">
+      <w:hyperlink r:id="rId111">
         <w:r>
           <w:rPr>
             <w:rStyle w:val="Hyperlink"/>
@@ -4726,8 +4797,8 @@
         <w:t xml:space="preserve">.</w:t>
       </w:r>
     </w:p>
-    <w:bookmarkEnd w:id="103"/>
-    <w:bookmarkStart w:id="105" w:name="ref-maitland1990"/>
+    <w:bookmarkEnd w:id="112"/>
+    <w:bookmarkStart w:id="114" w:name="ref-maitland1990"/>
     <w:p>
       <w:pPr>
         <w:pStyle w:val="Bibliography"/>
@@ -4738,7 +4809,7 @@
       <w:r>
         <w:t xml:space="preserve"> </w:t>
       </w:r>
-      <w:hyperlink r:id="rId104">
+      <w:hyperlink r:id="rId113">
         <w:r>
           <w:rPr>
             <w:rStyle w:val="Hyperlink"/>
@@ -4750,8 +4821,8 @@
         <w:t xml:space="preserve">. Second edition. Chapman; Hall, New York.</w:t>
       </w:r>
     </w:p>
-    <w:bookmarkEnd w:id="105"/>
-    <w:bookmarkStart w:id="107" w:name="ref-malabarba2006"/>
+    <w:bookmarkEnd w:id="114"/>
+    <w:bookmarkStart w:id="116" w:name="ref-malabarba2006"/>
     <w:p>
       <w:pPr>
         <w:pStyle w:val="Bibliography"/>
@@ -4762,7 +4833,7 @@
       <w:r>
         <w:t xml:space="preserve"> </w:t>
       </w:r>
-      <w:hyperlink r:id="rId106">
+      <w:hyperlink r:id="rId115">
         <w:r>
           <w:rPr>
             <w:rStyle w:val="Hyperlink"/>
@@ -4774,8 +4845,8 @@
         <w:t xml:space="preserve">. Neotropical Ichthyology 4:377–377.</w:t>
       </w:r>
     </w:p>
-    <w:bookmarkEnd w:id="107"/>
-    <w:bookmarkStart w:id="109" w:name="ref-maltchik2006"/>
+    <w:bookmarkEnd w:id="116"/>
+    <w:bookmarkStart w:id="118" w:name="ref-maltchik2006"/>
     <w:p>
       <w:pPr>
         <w:pStyle w:val="Bibliography"/>
@@ -4786,7 +4857,7 @@
       <w:r>
         <w:t xml:space="preserve"> </w:t>
       </w:r>
-      <w:hyperlink r:id="rId108">
+      <w:hyperlink r:id="rId117">
         <w:r>
           <w:rPr>
             <w:rStyle w:val="Hyperlink"/>
@@ -4822,8 +4893,8 @@
         <w:t xml:space="preserve">. Aquatic Conservation: Marine and Freshwater Ecosystems 16:665–677.</w:t>
       </w:r>
     </w:p>
-    <w:bookmarkEnd w:id="109"/>
-    <w:bookmarkStart w:id="111" w:name="ref-marcelino2025"/>
+    <w:bookmarkEnd w:id="118"/>
+    <w:bookmarkStart w:id="120" w:name="ref-marcelino2025"/>
     <w:p>
       <w:pPr>
         <w:pStyle w:val="Bibliography"/>
@@ -4834,7 +4905,7 @@
       <w:r>
         <w:t xml:space="preserve"> </w:t>
       </w:r>
-      <w:hyperlink r:id="rId110">
+      <w:hyperlink r:id="rId119">
         <w:r>
           <w:rPr>
             <w:rStyle w:val="Hyperlink"/>
@@ -4846,8 +4917,8 @@
         <w:t xml:space="preserve">. Acta Limnologica Brasiliensia 37:e30.</w:t>
       </w:r>
     </w:p>
-    <w:bookmarkEnd w:id="111"/>
-    <w:bookmarkStart w:id="112" w:name="ref-mccune2002"/>
+    <w:bookmarkEnd w:id="120"/>
+    <w:bookmarkStart w:id="121" w:name="ref-mccune2002"/>
     <w:p>
       <w:pPr>
         <w:pStyle w:val="Bibliography"/>
@@ -4856,8 +4927,8 @@
         <w:t xml:space="preserve">McCune, B., and J. B. Grace. 2002. Analysis of ecological communities. MjM Software Design, Gleneden Beach, Oregon, U.S.A.</w:t>
       </w:r>
     </w:p>
-    <w:bookmarkEnd w:id="112"/>
-    <w:bookmarkStart w:id="113" w:name="ref-medeiros2008"/>
+    <w:bookmarkEnd w:id="121"/>
+    <w:bookmarkStart w:id="122" w:name="ref-medeiros2008"/>
     <w:p>
       <w:pPr>
         <w:pStyle w:val="Bibliography"/>
@@ -4866,8 +4937,8 @@
         <w:t xml:space="preserve">Medeiros, E. S. F., M. J. Silva, and R. T. C. Ramos. 2008. Application of catchment- and local-scale variables for aquatic habitat characterization and assessment in the brazilian semi-arid region. Neotropical Biology and Conservation 3:13–20.</w:t>
       </w:r>
     </w:p>
-    <w:bookmarkEnd w:id="113"/>
-    <w:bookmarkStart w:id="115" w:name="ref-mehla2026"/>
+    <w:bookmarkEnd w:id="122"/>
+    <w:bookmarkStart w:id="124" w:name="ref-mehla2026"/>
     <w:p>
       <w:pPr>
         <w:pStyle w:val="Bibliography"/>
@@ -4878,7 +4949,7 @@
       <w:r>
         <w:t xml:space="preserve"> </w:t>
       </w:r>
-      <w:hyperlink r:id="rId114">
+      <w:hyperlink r:id="rId123">
         <w:r>
           <w:rPr>
             <w:rStyle w:val="Hyperlink"/>
@@ -4890,8 +4961,8 @@
         <w:t xml:space="preserve">. Water Research 307:126704.</w:t>
       </w:r>
     </w:p>
-    <w:bookmarkEnd w:id="115"/>
-    <w:bookmarkStart w:id="117" w:name="ref-melo2014"/>
+    <w:bookmarkEnd w:id="124"/>
+    <w:bookmarkStart w:id="126" w:name="ref-melo2014"/>
     <w:p>
       <w:pPr>
         <w:pStyle w:val="Bibliography"/>
@@ -4902,7 +4973,7 @@
       <w:r>
         <w:t xml:space="preserve"> </w:t>
       </w:r>
-      <w:hyperlink r:id="rId116">
+      <w:hyperlink r:id="rId125">
         <w:r>
           <w:rPr>
             <w:rStyle w:val="Hyperlink"/>
@@ -4914,8 +4985,8 @@
         <w:t xml:space="preserve">. PhD thesis, João Pessoa - PB.</w:t>
       </w:r>
     </w:p>
-    <w:bookmarkEnd w:id="117"/>
-    <w:bookmarkStart w:id="119" w:name="ref-melo2013"/>
+    <w:bookmarkEnd w:id="126"/>
+    <w:bookmarkStart w:id="128" w:name="ref-melo2013"/>
     <w:p>
       <w:pPr>
         <w:pStyle w:val="Bibliography"/>
@@ -4926,7 +4997,7 @@
       <w:r>
         <w:t xml:space="preserve"> </w:t>
       </w:r>
-      <w:hyperlink r:id="rId118">
+      <w:hyperlink r:id="rId127">
         <w:r>
           <w:rPr>
             <w:rStyle w:val="Hyperlink"/>
@@ -4938,8 +5009,8 @@
         <w:t xml:space="preserve">. International Journal of Biodiversity 2013:1–13.</w:t>
       </w:r>
     </w:p>
-    <w:bookmarkEnd w:id="119"/>
-    <w:bookmarkStart w:id="121" w:name="ref-meyer2007"/>
+    <w:bookmarkEnd w:id="128"/>
+    <w:bookmarkStart w:id="130" w:name="ref-meyer2007"/>
     <w:p>
       <w:pPr>
         <w:pStyle w:val="Bibliography"/>
@@ -4950,7 +5021,7 @@
       <w:r>
         <w:t xml:space="preserve"> </w:t>
       </w:r>
-      <w:hyperlink r:id="rId120">
+      <w:hyperlink r:id="rId129">
         <w:r>
           <w:rPr>
             <w:rStyle w:val="Hyperlink"/>
@@ -4962,8 +5033,8 @@
         <w:t xml:space="preserve">. Journal of the American Water Resources Association 43:86–103.</w:t>
       </w:r>
     </w:p>
-    <w:bookmarkEnd w:id="121"/>
-    <w:bookmarkStart w:id="123" w:name="ref-mma2003"/>
+    <w:bookmarkEnd w:id="130"/>
+    <w:bookmarkStart w:id="132" w:name="ref-mma2003"/>
     <w:p>
       <w:pPr>
         <w:pStyle w:val="Bibliography"/>
@@ -4974,7 +5045,7 @@
       <w:r>
         <w:t xml:space="preserve"> </w:t>
       </w:r>
-      <w:hyperlink r:id="rId122">
+      <w:hyperlink r:id="rId131">
         <w:r>
           <w:rPr>
             <w:rStyle w:val="Hyperlink"/>
@@ -4983,8 +5054,8 @@
         </w:r>
       </w:hyperlink>
     </w:p>
-    <w:bookmarkEnd w:id="123"/>
-    <w:bookmarkStart w:id="125" w:name="ref-mma2026"/>
+    <w:bookmarkEnd w:id="132"/>
+    <w:bookmarkStart w:id="134" w:name="ref-mma2026"/>
     <w:p>
       <w:pPr>
         <w:pStyle w:val="Bibliography"/>
@@ -4995,7 +5066,7 @@
       <w:r>
         <w:t xml:space="preserve"> </w:t>
       </w:r>
-      <w:hyperlink r:id="rId124">
+      <w:hyperlink r:id="rId133">
         <w:r>
           <w:rPr>
             <w:rStyle w:val="Hyperlink"/>
@@ -5007,8 +5078,8 @@
         <w:t xml:space="preserve">. Page 56. Mamanguape, PB.</w:t>
       </w:r>
     </w:p>
-    <w:bookmarkEnd w:id="125"/>
-    <w:bookmarkStart w:id="127" w:name="ref-mugodo2006"/>
+    <w:bookmarkEnd w:id="134"/>
+    <w:bookmarkStart w:id="136" w:name="ref-mugodo2006"/>
     <w:p>
       <w:pPr>
         <w:pStyle w:val="Bibliography"/>
@@ -5019,7 +5090,7 @@
       <w:r>
         <w:t xml:space="preserve"> </w:t>
       </w:r>
-      <w:hyperlink r:id="rId126">
+      <w:hyperlink r:id="rId135">
         <w:r>
           <w:rPr>
             <w:rStyle w:val="Hyperlink"/>
@@ -5031,8 +5102,8 @@
         <w:t xml:space="preserve">. Hydrobiologia 572:59–70.</w:t>
       </w:r>
     </w:p>
-    <w:bookmarkEnd w:id="127"/>
-    <w:bookmarkStart w:id="129" w:name="ref-myers2000"/>
+    <w:bookmarkEnd w:id="136"/>
+    <w:bookmarkStart w:id="138" w:name="ref-myers2000"/>
     <w:p>
       <w:pPr>
         <w:pStyle w:val="Bibliography"/>
@@ -5043,7 +5114,7 @@
       <w:r>
         <w:t xml:space="preserve"> </w:t>
       </w:r>
-      <w:hyperlink r:id="rId128">
+      <w:hyperlink r:id="rId137">
         <w:r>
           <w:rPr>
             <w:rStyle w:val="Hyperlink"/>
@@ -5055,8 +5126,8 @@
         <w:t xml:space="preserve">. Nature 403:853–858.</w:t>
       </w:r>
     </w:p>
-    <w:bookmarkEnd w:id="129"/>
-    <w:bookmarkStart w:id="131" w:name="ref-oksanen2020"/>
+    <w:bookmarkEnd w:id="138"/>
+    <w:bookmarkStart w:id="140" w:name="ref-oksanen2020"/>
     <w:p>
       <w:pPr>
         <w:pStyle w:val="Bibliography"/>
@@ -5067,7 +5138,7 @@
       <w:r>
         <w:t xml:space="preserve"> </w:t>
       </w:r>
-      <w:hyperlink r:id="rId130">
+      <w:hyperlink r:id="rId139">
         <w:r>
           <w:rPr>
             <w:rStyle w:val="Hyperlink"/>
@@ -5079,8 +5150,8 @@
         <w:t xml:space="preserve">. The Comprehensive R Archive Network Archive.</w:t>
       </w:r>
     </w:p>
-    <w:bookmarkEnd w:id="131"/>
-    <w:bookmarkStart w:id="133" w:name="ref-peel2007"/>
+    <w:bookmarkEnd w:id="140"/>
+    <w:bookmarkStart w:id="142" w:name="ref-peel2007"/>
     <w:p>
       <w:pPr>
         <w:pStyle w:val="Bibliography"/>
@@ -5091,7 +5162,7 @@
       <w:r>
         <w:t xml:space="preserve"> </w:t>
       </w:r>
-      <w:hyperlink r:id="rId132">
+      <w:hyperlink r:id="rId141">
         <w:r>
           <w:rPr>
             <w:rStyle w:val="Hyperlink"/>
@@ -5103,8 +5174,8 @@
         <w:t xml:space="preserve">. Hydrology and Earth System Sciences 11:1633–1644.</w:t>
       </w:r>
     </w:p>
-    <w:bookmarkEnd w:id="133"/>
-    <w:bookmarkStart w:id="135" w:name="ref-pereira2026"/>
+    <w:bookmarkEnd w:id="142"/>
+    <w:bookmarkStart w:id="144" w:name="ref-pereira2026"/>
     <w:p>
       <w:pPr>
         <w:pStyle w:val="Bibliography"/>
@@ -5115,7 +5186,7 @@
       <w:r>
         <w:t xml:space="preserve"> </w:t>
       </w:r>
-      <w:hyperlink r:id="rId134">
+      <w:hyperlink r:id="rId143">
         <w:r>
           <w:rPr>
             <w:rStyle w:val="Hyperlink"/>
@@ -5127,8 +5198,8 @@
         <w:t xml:space="preserve"> Biological Conservation 321:Article 111958.</w:t>
       </w:r>
     </w:p>
-    <w:bookmarkEnd w:id="135"/>
-    <w:bookmarkStart w:id="136" w:name="ref-pusey2004"/>
+    <w:bookmarkEnd w:id="144"/>
+    <w:bookmarkStart w:id="145" w:name="ref-pusey2004"/>
     <w:p>
       <w:pPr>
         <w:pStyle w:val="Bibliography"/>
@@ -5137,8 +5208,8 @@
         <w:t xml:space="preserve">Pusey, B. J., M. J. Kennard, and A. H. Arthington. 2004. Freshwater fishes of north-eastern australia. CSIRO Publishing, Melbourne, Australia.</w:t>
       </w:r>
     </w:p>
-    <w:bookmarkEnd w:id="136"/>
-    <w:bookmarkStart w:id="138" w:name="ref-rdevelopmentcoreteam2017"/>
+    <w:bookmarkEnd w:id="145"/>
+    <w:bookmarkStart w:id="147" w:name="ref-rdevelopmentcoreteam2017"/>
     <w:p>
       <w:pPr>
         <w:pStyle w:val="Bibliography"/>
@@ -5149,7 +5220,7 @@
       <w:r>
         <w:t xml:space="preserve"> </w:t>
       </w:r>
-      <w:hyperlink r:id="rId137">
+      <w:hyperlink r:id="rId146">
         <w:r>
           <w:rPr>
             <w:rStyle w:val="Hyperlink"/>
@@ -5161,8 +5232,8 @@
         <w:t xml:space="preserve">. R Foundation for Statistical Computing, Austria.</w:t>
       </w:r>
     </w:p>
-    <w:bookmarkEnd w:id="138"/>
-    <w:bookmarkStart w:id="140" w:name="ref-rocha2012"/>
+    <w:bookmarkEnd w:id="147"/>
+    <w:bookmarkStart w:id="149" w:name="ref-rocha2012"/>
     <w:p>
       <w:pPr>
         <w:pStyle w:val="Bibliography"/>
@@ -5173,7 +5244,7 @@
       <w:r>
         <w:t xml:space="preserve"> </w:t>
       </w:r>
-      <w:hyperlink r:id="rId139">
+      <w:hyperlink r:id="rId148">
         <w:r>
           <w:rPr>
             <w:rStyle w:val="Hyperlink"/>
@@ -5185,8 +5256,8 @@
         <w:t xml:space="preserve">. Journal of Arid Environments 85:33–40.</w:t>
       </w:r>
     </w:p>
-    <w:bookmarkEnd w:id="140"/>
-    <w:bookmarkStart w:id="142" w:name="ref-romanelli2022"/>
+    <w:bookmarkEnd w:id="149"/>
+    <w:bookmarkStart w:id="151" w:name="ref-romanelli2022"/>
     <w:p>
       <w:pPr>
         <w:pStyle w:val="Bibliography"/>
@@ -5197,7 +5268,7 @@
       <w:r>
         <w:t xml:space="preserve"> </w:t>
       </w:r>
-      <w:hyperlink r:id="rId141">
+      <w:hyperlink r:id="rId150">
         <w:r>
           <w:rPr>
             <w:rStyle w:val="Hyperlink"/>
@@ -5209,8 +5280,8 @@
         <w:t xml:space="preserve">. Science of The Total Environment 821:153403.</w:t>
       </w:r>
     </w:p>
-    <w:bookmarkEnd w:id="142"/>
-    <w:bookmarkStart w:id="144" w:name="ref-safar2020"/>
+    <w:bookmarkEnd w:id="151"/>
+    <w:bookmarkStart w:id="153" w:name="ref-safar2020"/>
     <w:p>
       <w:pPr>
         <w:pStyle w:val="Bibliography"/>
@@ -5221,7 +5292,7 @@
       <w:r>
         <w:t xml:space="preserve"> </w:t>
       </w:r>
-      <w:hyperlink r:id="rId143">
+      <w:hyperlink r:id="rId152">
         <w:r>
           <w:rPr>
             <w:rStyle w:val="Hyperlink"/>
@@ -5233,19 +5304,43 @@
         <w:t xml:space="preserve">. Forest Ecology and Management 470-471:118183.</w:t>
       </w:r>
     </w:p>
-    <w:bookmarkEnd w:id="144"/>
-    <w:bookmarkStart w:id="146" w:name="ref-saraçli2013"/>
+    <w:bookmarkEnd w:id="153"/>
+    <w:bookmarkStart w:id="155" w:name="ref-santos2024"/>
     <w:p>
       <w:pPr>
         <w:pStyle w:val="Bibliography"/>
       </w:pPr>
       <w:r>
+        <w:t xml:space="preserve">Santos, G. S., L. P. Diniz, E. E. C. Silva, T. L. T. Paula, P. C. S. Gomes, R. X. Calvi, B. L. Delfim, N. R. Simões, and E. M. Eskinazi-Sant’Anna. 2024.</w:t>
+      </w:r>
+      <w:r>
+        <w:t xml:space="preserve"> </w:t>
+      </w:r>
+      <w:hyperlink r:id="rId154">
+        <w:r>
+          <w:rPr>
+            <w:rStyle w:val="Hyperlink"/>
+          </w:rPr>
+          <w:t xml:space="preserve">What drives zooplankton taxonomic and functional β diversity? A review of brazilian rivers</w:t>
+        </w:r>
+      </w:hyperlink>
+      <w:r>
+        <w:t xml:space="preserve">. Hydrobiologia 851:1305–1318.</w:t>
+      </w:r>
+    </w:p>
+    <w:bookmarkEnd w:id="155"/>
+    <w:bookmarkStart w:id="157" w:name="ref-saraçli2013"/>
+    <w:p>
+      <w:pPr>
+        <w:pStyle w:val="Bibliography"/>
+      </w:pPr>
+      <w:r>
         <w:t xml:space="preserve">Saraçli, S., N. Doğan, and İ. Doğan. 2013.</w:t>
       </w:r>
       <w:r>
         <w:t xml:space="preserve"> </w:t>
       </w:r>
-      <w:hyperlink r:id="rId145">
+      <w:hyperlink r:id="rId156">
         <w:r>
           <w:rPr>
             <w:rStyle w:val="Hyperlink"/>
@@ -5257,8 +5352,8 @@
         <w:t xml:space="preserve">. Journal of Inequalities and Applications 2013:203.</w:t>
       </w:r>
     </w:p>
-    <w:bookmarkEnd w:id="146"/>
-    <w:bookmarkStart w:id="148" w:name="ref-shell2018"/>
+    <w:bookmarkEnd w:id="157"/>
+    <w:bookmarkStart w:id="159" w:name="ref-shell2018"/>
     <w:p>
       <w:pPr>
         <w:pStyle w:val="Bibliography"/>
@@ -5269,7 +5364,7 @@
       <w:r>
         <w:t xml:space="preserve"> </w:t>
       </w:r>
-      <w:hyperlink r:id="rId147">
+      <w:hyperlink r:id="rId158">
         <w:r>
           <w:rPr>
             <w:rStyle w:val="Hyperlink"/>
@@ -5293,8 +5388,8 @@
         <w:t xml:space="preserve">. River Research and Applications 34:993–1002.</w:t>
       </w:r>
     </w:p>
-    <w:bookmarkEnd w:id="148"/>
-    <w:bookmarkStart w:id="149" w:name="ref-silva2003"/>
+    <w:bookmarkEnd w:id="159"/>
+    <w:bookmarkStart w:id="160" w:name="ref-silva2003"/>
     <w:p>
       <w:pPr>
         <w:pStyle w:val="Bibliography"/>
@@ -5319,8 +5414,8 @@
         <w:t xml:space="preserve">C. Galindo-Leal and I. G. Câmara, editors. CABS; Island Press, Washington, DC.</w:t>
       </w:r>
     </w:p>
-    <w:bookmarkEnd w:id="149"/>
-    <w:bookmarkStart w:id="151" w:name="ref-silva2013"/>
+    <w:bookmarkEnd w:id="160"/>
+    <w:bookmarkStart w:id="162" w:name="ref-silva2013"/>
     <w:p>
       <w:pPr>
         <w:pStyle w:val="Bibliography"/>
@@ -5331,7 +5426,7 @@
       <w:r>
         <w:t xml:space="preserve"> </w:t>
       </w:r>
-      <w:hyperlink r:id="rId150">
+      <w:hyperlink r:id="rId161">
         <w:r>
           <w:rPr>
             <w:rStyle w:val="Hyperlink"/>
@@ -5343,8 +5438,8 @@
         <w:t xml:space="preserve">. PhD thesis.</w:t>
       </w:r>
     </w:p>
-    <w:bookmarkEnd w:id="151"/>
-    <w:bookmarkStart w:id="152" w:name="ref-sneath1973"/>
+    <w:bookmarkEnd w:id="162"/>
+    <w:bookmarkStart w:id="163" w:name="ref-sneath1973"/>
     <w:p>
       <w:pPr>
         <w:pStyle w:val="Bibliography"/>
@@ -5353,19 +5448,43 @@
         <w:t xml:space="preserve">Sneath, P. H. A., and R. R. Sokal. 1973. Numerical taxonomy: The principles and practice of numerical classification. First edition. W H Freeman &amp; Co.</w:t>
       </w:r>
     </w:p>
-    <w:bookmarkEnd w:id="152"/>
-    <w:bookmarkStart w:id="154" w:name="ref-sokal1962"/>
+    <w:bookmarkEnd w:id="163"/>
+    <w:bookmarkStart w:id="165" w:name="ref-socolar2016"/>
     <w:p>
       <w:pPr>
         <w:pStyle w:val="Bibliography"/>
       </w:pPr>
       <w:r>
+        <w:t xml:space="preserve">Socolar, J. B., J. J. Gilroy, W. E. Kunin, and D. P. Edwards. 2016.</w:t>
+      </w:r>
+      <w:r>
+        <w:t xml:space="preserve"> </w:t>
+      </w:r>
+      <w:hyperlink r:id="rId164">
+        <w:r>
+          <w:rPr>
+            <w:rStyle w:val="Hyperlink"/>
+          </w:rPr>
+          <w:t xml:space="preserve">How should beta-diversity inform biodiversity conservation?</w:t>
+        </w:r>
+      </w:hyperlink>
+      <w:r>
+        <w:t xml:space="preserve"> Trends in Ecology &amp; Evolution 31:67–80.</w:t>
+      </w:r>
+    </w:p>
+    <w:bookmarkEnd w:id="165"/>
+    <w:bookmarkStart w:id="167" w:name="ref-sokal1962"/>
+    <w:p>
+      <w:pPr>
+        <w:pStyle w:val="Bibliography"/>
+      </w:pPr>
+      <w:r>
         <w:t xml:space="preserve">Sokal, R. R., and F. J. Rohlf. 1962.</w:t>
       </w:r>
       <w:r>
         <w:t xml:space="preserve"> </w:t>
       </w:r>
-      <w:hyperlink r:id="rId153">
+      <w:hyperlink r:id="rId166">
         <w:r>
           <w:rPr>
             <w:rStyle w:val="Hyperlink"/>
@@ -5377,8 +5496,8 @@
         <w:t xml:space="preserve">. Taxon 11:33–40.</w:t>
       </w:r>
     </w:p>
-    <w:bookmarkEnd w:id="154"/>
-    <w:bookmarkStart w:id="155" w:name="ref-sokal1995"/>
+    <w:bookmarkEnd w:id="167"/>
+    <w:bookmarkStart w:id="168" w:name="ref-sokal1995"/>
     <w:p>
       <w:pPr>
         <w:pStyle w:val="Bibliography"/>
@@ -5387,8 +5506,8 @@
         <w:t xml:space="preserve">Sokal, R. R., and F. J. Rohlf. 1995. Biometry: The principles and practice of statistics in biological research. Third edition. W.H. Freeman; Company, New York.</w:t>
       </w:r>
     </w:p>
-    <w:bookmarkEnd w:id="155"/>
-    <w:bookmarkStart w:id="157" w:name="ref-souza2025"/>
+    <w:bookmarkEnd w:id="168"/>
+    <w:bookmarkStart w:id="170" w:name="ref-souza2025"/>
     <w:p>
       <w:pPr>
         <w:pStyle w:val="Bibliography"/>
@@ -5399,7 +5518,7 @@
       <w:r>
         <w:t xml:space="preserve"> </w:t>
       </w:r>
-      <w:hyperlink r:id="rId156">
+      <w:hyperlink r:id="rId169">
         <w:r>
           <w:rPr>
             <w:rStyle w:val="Hyperlink"/>
@@ -5429,8 +5548,8 @@
         <w:t xml:space="preserve">. Acta Limnologica Brasiliensia 37:e105.</w:t>
       </w:r>
     </w:p>
-    <w:bookmarkEnd w:id="157"/>
-    <w:bookmarkStart w:id="159" w:name="ref-strahler1957"/>
+    <w:bookmarkEnd w:id="170"/>
+    <w:bookmarkStart w:id="172" w:name="ref-strahler1957"/>
     <w:p>
       <w:pPr>
         <w:pStyle w:val="Bibliography"/>
@@ -5441,7 +5560,7 @@
       <w:r>
         <w:t xml:space="preserve"> </w:t>
       </w:r>
-      <w:hyperlink r:id="rId158">
+      <w:hyperlink r:id="rId171">
         <w:r>
           <w:rPr>
             <w:rStyle w:val="Hyperlink"/>
@@ -5453,8 +5572,8 @@
         <w:t xml:space="preserve">. Eos, Transactions American Geophysical Union 38:913–920.</w:t>
       </w:r>
     </w:p>
-    <w:bookmarkEnd w:id="159"/>
-    <w:bookmarkStart w:id="161" w:name="ref-tabarelli2010"/>
+    <w:bookmarkEnd w:id="172"/>
+    <w:bookmarkStart w:id="174" w:name="ref-tabarelli2010"/>
     <w:p>
       <w:pPr>
         <w:pStyle w:val="Bibliography"/>
@@ -5465,7 +5584,7 @@
       <w:r>
         <w:t xml:space="preserve"> </w:t>
       </w:r>
-      <w:hyperlink r:id="rId160">
+      <w:hyperlink r:id="rId173">
         <w:r>
           <w:rPr>
             <w:rStyle w:val="Hyperlink"/>
@@ -5477,8 +5596,8 @@
         <w:t xml:space="preserve">. Biological Conservation 143:2328–2340.</w:t>
       </w:r>
     </w:p>
-    <w:bookmarkEnd w:id="161"/>
-    <w:bookmarkStart w:id="163" w:name="ref-tuomisto2010"/>
+    <w:bookmarkEnd w:id="174"/>
+    <w:bookmarkStart w:id="176" w:name="ref-tuomisto2010"/>
     <w:p>
       <w:pPr>
         <w:pStyle w:val="Bibliography"/>
@@ -5489,7 +5608,7 @@
       <w:r>
         <w:t xml:space="preserve"> </w:t>
       </w:r>
-      <w:hyperlink r:id="rId162">
+      <w:hyperlink r:id="rId175">
         <w:r>
           <w:rPr>
             <w:rStyle w:val="Hyperlink"/>
@@ -5501,8 +5620,8 @@
         <w:t xml:space="preserve">. Ecography 33:23–45.</w:t>
       </w:r>
     </w:p>
-    <w:bookmarkEnd w:id="163"/>
-    <w:bookmarkStart w:id="165" w:name="ref-vancine2024"/>
+    <w:bookmarkEnd w:id="176"/>
+    <w:bookmarkStart w:id="178" w:name="ref-vancine2024"/>
     <w:p>
       <w:pPr>
         <w:pStyle w:val="Bibliography"/>
@@ -5513,7 +5632,7 @@
       <w:r>
         <w:t xml:space="preserve"> </w:t>
       </w:r>
-      <w:hyperlink r:id="rId164">
+      <w:hyperlink r:id="rId177">
         <w:r>
           <w:rPr>
             <w:rStyle w:val="Hyperlink"/>
@@ -5525,8 +5644,8 @@
         <w:t xml:space="preserve">. Biological Conservation 291:110499.</w:t>
       </w:r>
     </w:p>
-    <w:bookmarkEnd w:id="165"/>
-    <w:bookmarkStart w:id="167" w:name="ref-veech2003"/>
+    <w:bookmarkEnd w:id="178"/>
+    <w:bookmarkStart w:id="180" w:name="ref-veech2003"/>
     <w:p>
       <w:pPr>
         <w:pStyle w:val="Bibliography"/>
@@ -5537,7 +5656,7 @@
       <w:r>
         <w:t xml:space="preserve"> </w:t>
       </w:r>
-      <w:hyperlink r:id="rId166">
+      <w:hyperlink r:id="rId179">
         <w:r>
           <w:rPr>
             <w:rStyle w:val="Hyperlink"/>
@@ -5549,8 +5668,8 @@
         <w:t xml:space="preserve">. Ecology 84:3376–3383.</w:t>
       </w:r>
     </w:p>
-    <w:bookmarkEnd w:id="167"/>
-    <w:bookmarkStart w:id="169" w:name="ref-veech2002"/>
+    <w:bookmarkEnd w:id="180"/>
+    <w:bookmarkStart w:id="182" w:name="ref-veech2002"/>
     <w:p>
       <w:pPr>
         <w:pStyle w:val="Bibliography"/>
@@ -5561,7 +5680,7 @@
       <w:r>
         <w:t xml:space="preserve"> </w:t>
       </w:r>
-      <w:hyperlink r:id="rId168">
+      <w:hyperlink r:id="rId181">
         <w:r>
           <w:rPr>
             <w:rStyle w:val="Hyperlink"/>
@@ -5573,8 +5692,8 @@
         <w:t xml:space="preserve">. Oikos 99:3–9.</w:t>
       </w:r>
     </w:p>
-    <w:bookmarkEnd w:id="169"/>
-    <w:bookmarkStart w:id="171" w:name="ref-ward1998"/>
+    <w:bookmarkEnd w:id="182"/>
+    <w:bookmarkStart w:id="184" w:name="ref-ward1998"/>
     <w:p>
       <w:pPr>
         <w:pStyle w:val="Bibliography"/>
@@ -5585,7 +5704,7 @@
       <w:r>
         <w:t xml:space="preserve"> </w:t>
       </w:r>
-      <w:hyperlink r:id="rId170">
+      <w:hyperlink r:id="rId183">
         <w:r>
           <w:rPr>
             <w:rStyle w:val="Hyperlink"/>
@@ -5597,8 +5716,8 @@
         <w:t xml:space="preserve">. Biological Conservation 83:269–278.</w:t>
       </w:r>
     </w:p>
-    <w:bookmarkEnd w:id="171"/>
-    <w:bookmarkStart w:id="173" w:name="ref-whittaker1972"/>
+    <w:bookmarkEnd w:id="184"/>
+    <w:bookmarkStart w:id="186" w:name="ref-whittaker1972"/>
     <w:p>
       <w:pPr>
         <w:pStyle w:val="Bibliography"/>
@@ -5609,7 +5728,7 @@
       <w:r>
         <w:t xml:space="preserve"> </w:t>
       </w:r>
-      <w:hyperlink r:id="rId172">
+      <w:hyperlink r:id="rId185">
         <w:r>
           <w:rPr>
             <w:rStyle w:val="Hyperlink"/>
@@ -5621,20 +5740,44 @@
         <w:t xml:space="preserve">. TAXON 21:213–251.</w:t>
       </w:r>
     </w:p>
-    <w:bookmarkEnd w:id="173"/>
-    <w:bookmarkStart w:id="174" w:name="ref-zaú1998"/>
+    <w:bookmarkEnd w:id="186"/>
+    <w:bookmarkStart w:id="188" w:name="ref-wishart2003"/>
     <w:p>
       <w:pPr>
         <w:pStyle w:val="Bibliography"/>
       </w:pPr>
       <w:r>
+        <w:t xml:space="preserve">Wishart, M. J., and B. R. Davies. 2003.</w:t>
+      </w:r>
+      <w:r>
+        <w:t xml:space="preserve"> </w:t>
+      </w:r>
+      <w:hyperlink r:id="rId187">
+        <w:r>
+          <w:rPr>
+            <w:rStyle w:val="Hyperlink"/>
+          </w:rPr>
+          <w:t xml:space="preserve">Beyond catchment considerations in the conservation of lotic biodiversity</w:t>
+        </w:r>
+      </w:hyperlink>
+      <w:r>
+        <w:t xml:space="preserve">. Aquatic Conservation: Marine and Freshwater Ecosystems 13:429–437.</w:t>
+      </w:r>
+    </w:p>
+    <w:bookmarkEnd w:id="188"/>
+    <w:bookmarkStart w:id="189" w:name="ref-zaú1998"/>
+    <w:p>
+      <w:pPr>
+        <w:pStyle w:val="Bibliography"/>
+      </w:pPr>
+      <w:r>
         <w:t xml:space="preserve">Zaú, A. S. 1998. Fragmentação da mata atlântica: Aspectos teóricos. Floresta e Ambiente 5:160–170.</w:t>
       </w:r>
     </w:p>
-    <w:bookmarkEnd w:id="174"/>
-    <w:bookmarkEnd w:id="175"/>
-    <w:bookmarkEnd w:id="176"/>
-    <w:bookmarkStart w:id="211" w:name="figures-and-tables"/>
+    <w:bookmarkEnd w:id="189"/>
+    <w:bookmarkEnd w:id="190"/>
+    <w:bookmarkEnd w:id="191"/>
+    <w:bookmarkStart w:id="226" w:name="figures-and-tables"/>
     <w:p>
       <w:pPr>
         <w:pStyle w:val="Heading1"/>
@@ -5955,7 +6098,7 @@
         <w:t xml:space="preserve">(Stream): Diversity turnover between streams.</w:t>
       </w:r>
     </w:p>
-    <w:bookmarkStart w:id="205" w:name="figures"/>
+    <w:bookmarkStart w:id="220" w:name="figures"/>
     <w:p>
       <w:pPr>
         <w:pStyle w:val="Heading2"/>
@@ -5990,7 +6133,7 @@
       <w:tr>
         <w:tc>
           <w:tcPr/>
-          <w:bookmarkStart w:id="180" w:name="fig-mapa"/>
+          <w:bookmarkStart w:id="195" w:name="fig-mapa"/>
           <w:p>
             <w:pPr>
               <w:pStyle w:val="Compact"/>
@@ -6001,18 +6144,18 @@
                 <wp:inline>
                   <wp:extent cx="5943600" cy="4202583"/>
                   <wp:effectExtent b="0" l="0" r="0" t="0"/>
-                  <wp:docPr descr="" title="" id="178" name="Picture"/>
+                  <wp:docPr descr="" title="" id="193" name="Picture"/>
                   <a:graphic>
                     <a:graphicData uri="http://schemas.openxmlformats.org/drawingml/2006/picture">
                       <pic:pic>
                         <pic:nvPicPr>
-                          <pic:cNvPr descr="imagens/Uso%20de%20Solo%20Rebio_en.png" id="179" name="Picture"/>
+                          <pic:cNvPr descr="imagens/Uso%20de%20Solo%20Rebio_en.png" id="194" name="Picture"/>
                           <pic:cNvPicPr>
                             <a:picLocks noChangeArrowheads="1" noChangeAspect="1"/>
                           </pic:cNvPicPr>
                         </pic:nvPicPr>
                         <pic:blipFill>
-                          <a:blip r:embed="rId177"/>
+                          <a:blip r:embed="rId192"/>
                           <a:stretch>
                             <a:fillRect/>
                           </a:stretch>
@@ -6052,7 +6195,7 @@
               <w:t xml:space="preserve">Figure 1: Study area</w:t>
             </w:r>
           </w:p>
-          <w:bookmarkEnd w:id="180"/>
+          <w:bookmarkEnd w:id="195"/>
         </w:tc>
       </w:tr>
     </w:tbl>
@@ -6082,7 +6225,7 @@
       <w:tr>
         <w:tc>
           <w:tcPr/>
-          <w:bookmarkStart w:id="184" w:name="fig-hab_PCA_rio"/>
+          <w:bookmarkStart w:id="199" w:name="fig-hab_PCA_rio"/>
           <w:p>
             <w:pPr>
               <w:pStyle w:val="Compact"/>
@@ -6093,18 +6236,18 @@
                 <wp:inline>
                   <wp:extent cx="5943600" cy="4953000"/>
                   <wp:effectExtent b="0" l="0" r="0" t="0"/>
-                  <wp:docPr descr="" title="" id="182" name="Picture"/>
+                  <wp:docPr descr="" title="" id="197" name="Picture"/>
                   <a:graphic>
                     <a:graphicData uri="http://schemas.openxmlformats.org/drawingml/2006/picture">
                       <pic:pic>
                         <pic:nvPicPr>
-                          <pic:cNvPr descr="res/fig-hab_PCA_rio.png" id="183" name="Picture"/>
+                          <pic:cNvPr descr="res_ms/fig-hab_PCA_rio.png" id="198" name="Picture"/>
                           <pic:cNvPicPr>
                             <a:picLocks noChangeArrowheads="1" noChangeAspect="1"/>
                           </pic:cNvPicPr>
                         </pic:nvPicPr>
                         <pic:blipFill>
-                          <a:blip r:embed="rId181"/>
+                          <a:blip r:embed="rId196"/>
                           <a:stretch>
                             <a:fillRect/>
                           </a:stretch>
@@ -6144,7 +6287,7 @@
               <w:t xml:space="preserve">Figure 2: Principal Component Analysis, streams</w:t>
             </w:r>
           </w:p>
-          <w:bookmarkEnd w:id="184"/>
+          <w:bookmarkEnd w:id="199"/>
         </w:tc>
       </w:tr>
     </w:tbl>
@@ -6174,7 +6317,7 @@
       <w:tr>
         <w:tc>
           <w:tcPr/>
-          <w:bookmarkStart w:id="188" w:name="fig-hab_PCA_periodo"/>
+          <w:bookmarkStart w:id="203" w:name="fig-hab_PCA_periodo"/>
           <w:p>
             <w:pPr>
               <w:pStyle w:val="Compact"/>
@@ -6185,18 +6328,18 @@
                 <wp:inline>
                   <wp:extent cx="5943600" cy="4953000"/>
                   <wp:effectExtent b="0" l="0" r="0" t="0"/>
-                  <wp:docPr descr="" title="" id="186" name="Picture"/>
+                  <wp:docPr descr="" title="" id="201" name="Picture"/>
                   <a:graphic>
                     <a:graphicData uri="http://schemas.openxmlformats.org/drawingml/2006/picture">
                       <pic:pic>
                         <pic:nvPicPr>
-                          <pic:cNvPr descr="res/fig-hab_PCA_periodo.png" id="187" name="Picture"/>
+                          <pic:cNvPr descr="res_ms/fig-hab_PCA_periodo.png" id="202" name="Picture"/>
                           <pic:cNvPicPr>
                             <a:picLocks noChangeArrowheads="1" noChangeAspect="1"/>
                           </pic:cNvPicPr>
                         </pic:nvPicPr>
                         <pic:blipFill>
-                          <a:blip r:embed="rId185"/>
+                          <a:blip r:embed="rId200"/>
                           <a:stretch>
                             <a:fillRect/>
                           </a:stretch>
@@ -6236,7 +6379,7 @@
               <w:t xml:space="preserve">Figure 3: Principal Component Analysis, seasons</w:t>
             </w:r>
           </w:p>
-          <w:bookmarkEnd w:id="188"/>
+          <w:bookmarkEnd w:id="203"/>
         </w:tc>
       </w:tr>
     </w:tbl>
@@ -6266,7 +6409,7 @@
       <w:tr>
         <w:tc>
           <w:tcPr/>
-          <w:bookmarkStart w:id="192" w:name="fig-rare1"/>
+          <w:bookmarkStart w:id="207" w:name="fig-rare1"/>
           <w:p>
             <w:pPr>
               <w:pStyle w:val="Compact"/>
@@ -6277,18 +6420,18 @@
                 <wp:inline>
                   <wp:extent cx="5943600" cy="4457699"/>
                   <wp:effectExtent b="0" l="0" r="0" t="0"/>
-                  <wp:docPr descr="" title="" id="190" name="Picture"/>
+                  <wp:docPr descr="" title="" id="205" name="Picture"/>
                   <a:graphic>
                     <a:graphicData uri="http://schemas.openxmlformats.org/drawingml/2006/picture">
                       <pic:pic>
                         <pic:nvPicPr>
-                          <pic:cNvPr descr="res/fig-rare1.png" id="191" name="Picture"/>
+                          <pic:cNvPr descr="res_ms/fig-rare1.png" id="206" name="Picture"/>
                           <pic:cNvPicPr>
                             <a:picLocks noChangeArrowheads="1" noChangeAspect="1"/>
                           </pic:cNvPicPr>
                         </pic:nvPicPr>
                         <pic:blipFill>
-                          <a:blip r:embed="rId189"/>
+                          <a:blip r:embed="rId204"/>
                           <a:stretch>
                             <a:fillRect/>
                           </a:stretch>
@@ -6328,7 +6471,7 @@
               <w:t xml:space="preserve">Figure 4: Accumulation curves</w:t>
             </w:r>
           </w:p>
-          <w:bookmarkEnd w:id="192"/>
+          <w:bookmarkEnd w:id="207"/>
         </w:tc>
       </w:tr>
     </w:tbl>
@@ -6358,7 +6501,7 @@
       <w:tr>
         <w:tc>
           <w:tcPr/>
-          <w:bookmarkStart w:id="196" w:name="fig-upgma"/>
+          <w:bookmarkStart w:id="211" w:name="fig-upgma"/>
           <w:p>
             <w:pPr>
               <w:pStyle w:val="Compact"/>
@@ -6369,18 +6512,18 @@
                 <wp:inline>
                   <wp:extent cx="5943600" cy="4862945"/>
                   <wp:effectExtent b="0" l="0" r="0" t="0"/>
-                  <wp:docPr descr="" title="" id="194" name="Picture"/>
+                  <wp:docPr descr="" title="" id="209" name="Picture"/>
                   <a:graphic>
                     <a:graphicData uri="http://schemas.openxmlformats.org/drawingml/2006/picture">
                       <pic:pic>
                         <pic:nvPicPr>
-                          <pic:cNvPr descr="res/fig-upgma.png" id="195" name="Picture"/>
+                          <pic:cNvPr descr="res_ms/fig-upgma.png" id="210" name="Picture"/>
                           <pic:cNvPicPr>
                             <a:picLocks noChangeArrowheads="1" noChangeAspect="1"/>
                           </pic:cNvPicPr>
                         </pic:nvPicPr>
                         <pic:blipFill>
-                          <a:blip r:embed="rId193"/>
+                          <a:blip r:embed="rId208"/>
                           <a:stretch>
                             <a:fillRect/>
                           </a:stretch>
@@ -6420,7 +6563,7 @@
               <w:t xml:space="preserve">Figure 5: UPGMA Classification</w:t>
             </w:r>
           </w:p>
-          <w:bookmarkEnd w:id="196"/>
+          <w:bookmarkEnd w:id="211"/>
         </w:tc>
       </w:tr>
     </w:tbl>
@@ -6450,7 +6593,7 @@
       <w:tr>
         <w:tc>
           <w:tcPr/>
-          <w:bookmarkStart w:id="200" w:name="fig-particao_cs"/>
+          <w:bookmarkStart w:id="215" w:name="fig-particao_cs"/>
           <w:p>
             <w:pPr>
               <w:pStyle w:val="Compact"/>
@@ -6461,18 +6604,18 @@
                 <wp:inline>
                   <wp:extent cx="3669832" cy="7339665"/>
                   <wp:effectExtent b="0" l="0" r="0" t="0"/>
-                  <wp:docPr descr="" title="" id="198" name="Picture"/>
+                  <wp:docPr descr="" title="" id="213" name="Picture"/>
                   <a:graphic>
                     <a:graphicData uri="http://schemas.openxmlformats.org/drawingml/2006/picture">
                       <pic:pic>
                         <pic:nvPicPr>
-                          <pic:cNvPr descr="res/fig-painel_pt.cs.png" id="199" name="Picture"/>
+                          <pic:cNvPr descr="res_ms/fig-painel_pt.cs.png" id="214" name="Picture"/>
                           <pic:cNvPicPr>
                             <a:picLocks noChangeArrowheads="1" noChangeAspect="1"/>
                           </pic:cNvPicPr>
                         </pic:nvPicPr>
                         <pic:blipFill>
-                          <a:blip r:embed="rId197"/>
+                          <a:blip r:embed="rId212"/>
                           <a:stretch>
                             <a:fillRect/>
                           </a:stretch>
@@ -6512,7 +6655,7 @@
               <w:t xml:space="preserve">Figure 6: Partitioning plots season</w:t>
             </w:r>
           </w:p>
-          <w:bookmarkEnd w:id="200"/>
+          <w:bookmarkEnd w:id="215"/>
         </w:tc>
       </w:tr>
     </w:tbl>
@@ -6542,7 +6685,7 @@
       <w:tr>
         <w:tc>
           <w:tcPr/>
-          <w:bookmarkStart w:id="204" w:name="fig-particao_rios"/>
+          <w:bookmarkStart w:id="219" w:name="fig-particao_rios"/>
           <w:p>
             <w:pPr>
               <w:pStyle w:val="Compact"/>
@@ -6553,18 +6696,18 @@
                 <wp:inline>
                   <wp:extent cx="5943600" cy="6792685"/>
                   <wp:effectExtent b="0" l="0" r="0" t="0"/>
-                  <wp:docPr descr="" title="" id="202" name="Picture"/>
+                  <wp:docPr descr="" title="" id="217" name="Picture"/>
                   <a:graphic>
                     <a:graphicData uri="http://schemas.openxmlformats.org/drawingml/2006/picture">
                       <pic:pic>
                         <pic:nvPicPr>
-                          <pic:cNvPr descr="res/fig-painel_pt.rios.png" id="203" name="Picture"/>
+                          <pic:cNvPr descr="res_ms/fig-painel_pt.rios.png" id="218" name="Picture"/>
                           <pic:cNvPicPr>
                             <a:picLocks noChangeArrowheads="1" noChangeAspect="1"/>
                           </pic:cNvPicPr>
                         </pic:nvPicPr>
                         <pic:blipFill>
-                          <a:blip r:embed="rId201"/>
+                          <a:blip r:embed="rId216"/>
                           <a:stretch>
                             <a:fillRect/>
                           </a:stretch>
@@ -6604,12 +6747,12 @@
               <w:t xml:space="preserve">Figure 7: Partitioning plots stream</w:t>
             </w:r>
           </w:p>
-          <w:bookmarkEnd w:id="204"/>
+          <w:bookmarkEnd w:id="219"/>
         </w:tc>
       </w:tr>
     </w:tbl>
-    <w:bookmarkEnd w:id="205"/>
-    <w:bookmarkStart w:id="210" w:name="tables"/>
+    <w:bookmarkEnd w:id="220"/>
+    <w:bookmarkStart w:id="225" w:name="tables"/>
     <w:p>
       <w:pPr>
         <w:pStyle w:val="Heading2"/>
@@ -6644,7 +6787,7 @@
       <w:tr>
         <w:tc>
           <w:tcPr/>
-          <w:bookmarkStart w:id="206" w:name="tbl-hab_gttable"/>
+          <w:bookmarkStart w:id="221" w:name="tbl-hab_gttable"/>
           <w:p>
             <w:pPr>
               <w:jc w:val="center"/>
@@ -18312,7 +18455,7 @@
               </w:tc>
             </w:tr>
           </w:tbl>
-          <w:bookmarkEnd w:id="206"/>
+          <w:bookmarkEnd w:id="221"/>
         </w:tc>
       </w:tr>
     </w:tbl>
@@ -18342,7 +18485,7 @@
       <w:tr>
         <w:tc>
           <w:tcPr/>
-          <w:bookmarkStart w:id="207" w:name="tbl-nutri_gttable"/>
+          <w:bookmarkStart w:id="222" w:name="tbl-nutri_gttable"/>
           <w:p>
             <w:pPr>
               <w:jc w:val="center"/>
@@ -21063,7 +21206,7 @@
               </w:tc>
             </w:tr>
           </w:tbl>
-          <w:bookmarkEnd w:id="207"/>
+          <w:bookmarkEnd w:id="222"/>
         </w:tc>
       </w:tr>
     </w:tbl>
@@ -21093,7 +21236,7 @@
       <w:tr>
         <w:tc>
           <w:tcPr/>
-          <w:bookmarkStart w:id="208" w:name="tbl-checklist_gttable"/>
+          <w:bookmarkStart w:id="223" w:name="tbl-checklist_gttable"/>
           <w:p>
             <w:pPr>
               <w:jc w:val="center"/>
@@ -38837,7 +38980,7 @@
               </w:tc>
             </w:tr>
           </w:tbl>
-          <w:bookmarkEnd w:id="208"/>
+          <w:bookmarkEnd w:id="223"/>
         </w:tc>
       </w:tr>
     </w:tbl>
@@ -38867,7 +39010,7 @@
       <w:tr>
         <w:tc>
           <w:tcPr/>
-          <w:bookmarkStart w:id="209" w:name="tbl-part_gttable"/>
+          <w:bookmarkStart w:id="224" w:name="tbl-part_gttable"/>
           <w:p>
             <w:pPr>
               <w:jc w:val="center"/>
@@ -43727,13 +43870,13 @@
               </w:tc>
             </w:tr>
           </w:tbl>
-          <w:bookmarkEnd w:id="209"/>
+          <w:bookmarkEnd w:id="224"/>
         </w:tc>
       </w:tr>
     </w:tbl>
-    <w:bookmarkEnd w:id="210"/>
-    <w:bookmarkEnd w:id="211"/>
-    <w:bookmarkStart w:id="212" w:name="apendices"/>
+    <w:bookmarkEnd w:id="225"/>
+    <w:bookmarkEnd w:id="226"/>
+    <w:bookmarkStart w:id="227" w:name="apendices"/>
     <w:p>
       <w:pPr>
         <w:pStyle w:val="Heading1"/>
@@ -43742,8 +43885,8 @@
         <w:t xml:space="preserve">Apendices</w:t>
       </w:r>
     </w:p>
-    <w:bookmarkEnd w:id="212"/>
-    <w:bookmarkStart w:id="216" w:name="non-used-figures-and-tables"/>
+    <w:bookmarkEnd w:id="227"/>
+    <w:bookmarkStart w:id="231" w:name="non-used-figures-and-tables"/>
     <w:p>
       <w:pPr>
         <w:pStyle w:val="Heading1"/>
@@ -43793,18 +43936,18 @@
                 <wp:inline>
                   <wp:extent cx="152400" cy="152400"/>
                   <wp:effectExtent b="0" l="0" r="0" t="0"/>
-                  <wp:docPr descr="" title="" id="214" name="Picture"/>
+                  <wp:docPr descr="" title="" id="229" name="Picture"/>
                   <a:graphic>
                     <a:graphicData uri="http://schemas.openxmlformats.org/drawingml/2006/picture">
                       <pic:pic>
                         <pic:nvPicPr>
-                          <pic:cNvPr descr="C:\PROGRA~1\RStudio\RESOUR~1\app\bin\quarto\share\formats\docx\warning.png" id="215" name="Picture"/>
+                          <pic:cNvPr descr="C:\PROGRA~1\RStudio\RESOUR~1\app\bin\quarto\share\formats\docx\warning.png" id="230" name="Picture"/>
                           <pic:cNvPicPr>
                             <a:picLocks noChangeArrowheads="1" noChangeAspect="1"/>
                           </pic:cNvPicPr>
                         </pic:nvPicPr>
                         <pic:blipFill>
-                          <a:blip r:embed="rId213"/>
+                          <a:blip r:embed="rId228"/>
                           <a:stretch>
                             <a:fillRect/>
                           </a:stretch>
@@ -43857,7 +44000,7 @@
         </w:tc>
       </w:tr>
     </w:tbl>
-    <w:bookmarkEnd w:id="216"/>
+    <w:bookmarkEnd w:id="231"/>
     <w:sectPr>
       <w:type w:val="nextPage"/>
       <w:pgSz w:h="15840" w:w="12240"/>

</xml_diff>